<commit_message>
Added Dept lib and Auditorium in C6 report
</commit_message>
<xml_diff>
--- a/C6/C6 Documentation/ADA NBA C6 05 06 26  .docx
+++ b/C6/C6 Documentation/ADA NBA C6 05 06 26  .docx
@@ -3063,8 +3063,6 @@
               </w:rPr>
               <w:t>Cushioned Chairs and CCTV cameras</w:t>
             </w:r>
-            <w:bookmarkStart w:id="0" w:name="_GoBack"/>
-            <w:bookmarkEnd w:id="0"/>
           </w:p>
         </w:tc>
         <w:tc>
@@ -4319,23 +4317,7 @@
                 <w:sz w:val="24"/>
                 <w:szCs w:val="24"/>
               </w:rPr>
-              <w:t>Photocell, Vernier</w:t>
-            </w:r>
-            <w:r>
-              <w:rPr>
-                <w:rFonts w:ascii="Times New Roman" w:hAnsi="Times New Roman" w:cs="Times New Roman"/>
-                <w:sz w:val="24"/>
-                <w:szCs w:val="24"/>
-              </w:rPr>
-              <w:t xml:space="preserve"> </w:t>
-            </w:r>
-            <w:r>
-              <w:rPr>
-                <w:rFonts w:ascii="Times New Roman" w:hAnsi="Times New Roman" w:cs="Times New Roman"/>
-                <w:sz w:val="24"/>
-                <w:szCs w:val="24"/>
-              </w:rPr>
-              <w:t>calliper</w:t>
+              <w:t>Photocell, Vernier calliper</w:t>
             </w:r>
             <w:r>
               <w:rPr>
@@ -12545,6 +12527,16 @@
                 <w:lang w:eastAsia="en-IN" w:bidi="mr-IN"/>
               </w:rPr>
             </w:pPr>
+            <w:r>
+              <w:rPr>
+                <w:rFonts w:ascii="Times New Roman" w:eastAsia="Times New Roman" w:hAnsi="Times New Roman" w:cs="Times New Roman"/>
+                <w:color w:val="1F1F1F"/>
+                <w:sz w:val="24"/>
+                <w:szCs w:val="24"/>
+                <w:lang w:eastAsia="en-IN" w:bidi="mr-IN"/>
+              </w:rPr>
+              <w:t>Collection of subject-specific textbooks, reference books, project reports,</w:t>
+            </w:r>
           </w:p>
         </w:tc>
         <w:tc>
@@ -12571,6 +12563,16 @@
                 <w:lang w:eastAsia="en-IN" w:bidi="mr-IN"/>
               </w:rPr>
             </w:pPr>
+            <w:r>
+              <w:rPr>
+                <w:rFonts w:ascii="Times New Roman" w:eastAsia="Times New Roman" w:hAnsi="Times New Roman" w:cs="Times New Roman"/>
+                <w:color w:val="1F1F1F"/>
+                <w:sz w:val="24"/>
+                <w:szCs w:val="24"/>
+                <w:lang w:eastAsia="en-IN" w:bidi="mr-IN"/>
+              </w:rPr>
+              <w:t>To provide localized, specialized academic resources for quick reference.</w:t>
+            </w:r>
           </w:p>
         </w:tc>
         <w:tc>
@@ -12597,6 +12599,56 @@
                 <w:lang w:eastAsia="en-IN" w:bidi="mr-IN"/>
               </w:rPr>
             </w:pPr>
+            <w:r>
+              <w:rPr>
+                <w:rFonts w:ascii="Times New Roman" w:eastAsia="Times New Roman" w:hAnsi="Times New Roman" w:cs="Times New Roman"/>
+                <w:color w:val="1F1F1F"/>
+                <w:sz w:val="24"/>
+                <w:szCs w:val="24"/>
+                <w:lang w:eastAsia="en-IN" w:bidi="mr-IN"/>
+              </w:rPr>
+              <w:t xml:space="preserve">Used by students for </w:t>
+            </w:r>
+            <w:r>
+              <w:rPr>
+                <w:rFonts w:ascii="Times New Roman" w:eastAsia="Times New Roman" w:hAnsi="Times New Roman" w:cs="Times New Roman"/>
+                <w:color w:val="1F1F1F"/>
+                <w:sz w:val="24"/>
+                <w:szCs w:val="24"/>
+                <w:lang w:eastAsia="en-IN" w:bidi="mr-IN"/>
+              </w:rPr>
+              <w:t>references</w:t>
+            </w:r>
+            <w:r>
+              <w:rPr>
+                <w:rFonts w:ascii="Times New Roman" w:eastAsia="Times New Roman" w:hAnsi="Times New Roman" w:cs="Times New Roman"/>
+                <w:color w:val="1F1F1F"/>
+                <w:sz w:val="24"/>
+                <w:szCs w:val="24"/>
+                <w:lang w:eastAsia="en-IN" w:bidi="mr-IN"/>
+              </w:rPr>
+              <w:t xml:space="preserve"> to</w:t>
+            </w:r>
+            <w:r>
+              <w:rPr>
+                <w:rFonts w:ascii="Times New Roman" w:eastAsia="Times New Roman" w:hAnsi="Times New Roman" w:cs="Times New Roman"/>
+                <w:color w:val="1F1F1F"/>
+                <w:sz w:val="24"/>
+                <w:szCs w:val="24"/>
+                <w:lang w:eastAsia="en-IN" w:bidi="mr-IN"/>
+              </w:rPr>
+              <w:t xml:space="preserve"> </w:t>
+            </w:r>
+            <w:r>
+              <w:rPr>
+                <w:rFonts w:ascii="Times New Roman" w:eastAsia="Times New Roman" w:hAnsi="Times New Roman" w:cs="Times New Roman"/>
+                <w:color w:val="1F1F1F"/>
+                <w:sz w:val="24"/>
+                <w:szCs w:val="24"/>
+                <w:lang w:eastAsia="en-IN" w:bidi="mr-IN"/>
+              </w:rPr>
+              <w:t xml:space="preserve"> Project reports</w:t>
+            </w:r>
           </w:p>
         </w:tc>
         <w:tc>
@@ -12623,6 +12675,16 @@
                 <w:lang w:eastAsia="en-IN" w:bidi="mr-IN"/>
               </w:rPr>
             </w:pPr>
+            <w:r>
+              <w:rPr>
+                <w:rFonts w:ascii="Times New Roman" w:eastAsia="Times New Roman" w:hAnsi="Times New Roman" w:cs="Times New Roman"/>
+                <w:color w:val="1F1F1F"/>
+                <w:sz w:val="24"/>
+                <w:szCs w:val="24"/>
+                <w:lang w:eastAsia="en-IN" w:bidi="mr-IN"/>
+              </w:rPr>
+              <w:t>In-depth subject knowledge and literature review skills.</w:t>
+            </w:r>
           </w:p>
         </w:tc>
         <w:tc>
@@ -12649,6 +12711,16 @@
                 <w:lang w:eastAsia="en-IN" w:bidi="mr-IN"/>
               </w:rPr>
             </w:pPr>
+            <w:r>
+              <w:rPr>
+                <w:rFonts w:ascii="Times New Roman" w:eastAsia="Times New Roman" w:hAnsi="Times New Roman" w:cs="Times New Roman"/>
+                <w:color w:val="1F1F1F"/>
+                <w:sz w:val="24"/>
+                <w:szCs w:val="24"/>
+                <w:lang w:eastAsia="en-IN" w:bidi="mr-IN"/>
+              </w:rPr>
+              <w:t>PO 1, PO 2, PSO 1</w:t>
+            </w:r>
           </w:p>
         </w:tc>
       </w:tr>
@@ -12722,6 +12794,7 @@
                 <w:color w:val="1F1F1F"/>
                 <w:sz w:val="24"/>
                 <w:szCs w:val="24"/>
+                <w:highlight w:val="yellow"/>
                 <w:lang w:eastAsia="en-IN" w:bidi="mr-IN"/>
               </w:rPr>
               <w:t>Seminar Hall (MB-CAD-CAM Lab.)</w:t>
@@ -12980,6 +13053,16 @@
                 <w:lang w:eastAsia="en-IN" w:bidi="mr-IN"/>
               </w:rPr>
             </w:pPr>
+            <w:r>
+              <w:rPr>
+                <w:rFonts w:ascii="Times New Roman" w:eastAsia="Times New Roman" w:hAnsi="Times New Roman" w:cs="Times New Roman"/>
+                <w:color w:val="1F1F1F"/>
+                <w:sz w:val="24"/>
+                <w:szCs w:val="24"/>
+                <w:lang w:eastAsia="en-IN" w:bidi="mr-IN"/>
+              </w:rPr>
+              <w:t xml:space="preserve">Large capacity hall </w:t>
+            </w:r>
           </w:p>
         </w:tc>
         <w:tc>
@@ -13006,6 +13089,27 @@
                 <w:lang w:eastAsia="en-IN" w:bidi="mr-IN"/>
               </w:rPr>
             </w:pPr>
+            <w:r>
+              <w:rPr>
+                <w:rFonts w:ascii="Times New Roman" w:eastAsia="Times New Roman" w:hAnsi="Times New Roman" w:cs="Times New Roman"/>
+                <w:color w:val="1F1F1F"/>
+                <w:sz w:val="24"/>
+                <w:szCs w:val="24"/>
+                <w:lang w:eastAsia="en-IN" w:bidi="mr-IN"/>
+              </w:rPr>
+              <w:t xml:space="preserve">To host large-scale events, guest lectures, </w:t>
+            </w:r>
+            <w:r>
+              <w:rPr>
+                <w:rFonts w:ascii="Times New Roman" w:eastAsia="Times New Roman" w:hAnsi="Times New Roman" w:cs="Times New Roman"/>
+                <w:color w:val="1F1F1F"/>
+                <w:sz w:val="24"/>
+                <w:szCs w:val="24"/>
+                <w:lang w:eastAsia="en-IN" w:bidi="mr-IN"/>
+              </w:rPr>
+              <w:lastRenderedPageBreak/>
+              <w:t>and industry interaction programs.</w:t>
+            </w:r>
           </w:p>
         </w:tc>
         <w:tc>
@@ -13032,6 +13136,17 @@
                 <w:lang w:eastAsia="en-IN" w:bidi="mr-IN"/>
               </w:rPr>
             </w:pPr>
+            <w:r>
+              <w:rPr>
+                <w:rFonts w:ascii="Times New Roman" w:eastAsia="Times New Roman" w:hAnsi="Times New Roman" w:cs="Times New Roman"/>
+                <w:color w:val="1F1F1F"/>
+                <w:sz w:val="24"/>
+                <w:szCs w:val="24"/>
+                <w:lang w:eastAsia="en-IN" w:bidi="mr-IN"/>
+              </w:rPr>
+              <w:lastRenderedPageBreak/>
+              <w:t>Guest lectures, seminars, cultural events, and annual functions.</w:t>
+            </w:r>
           </w:p>
         </w:tc>
         <w:tc>
@@ -13058,6 +13173,39 @@
                 <w:lang w:eastAsia="en-IN" w:bidi="mr-IN"/>
               </w:rPr>
             </w:pPr>
+            <w:r>
+              <w:rPr>
+                <w:rFonts w:ascii="Times New Roman" w:eastAsia="Times New Roman" w:hAnsi="Times New Roman" w:cs="Times New Roman"/>
+                <w:color w:val="1F1F1F"/>
+                <w:sz w:val="24"/>
+                <w:szCs w:val="24"/>
+                <w:lang w:eastAsia="en-IN" w:bidi="mr-IN"/>
+              </w:rPr>
+              <w:t xml:space="preserve">Communication skills, professional networking, and </w:t>
+            </w:r>
+            <w:r>
+              <w:rPr>
+                <w:rFonts w:ascii="Times New Roman" w:eastAsia="Times New Roman" w:hAnsi="Times New Roman" w:cs="Times New Roman"/>
+                <w:color w:val="1F1F1F"/>
+                <w:sz w:val="24"/>
+                <w:szCs w:val="24"/>
+                <w:lang w:eastAsia="en-IN" w:bidi="mr-IN"/>
+              </w:rPr>
+              <w:lastRenderedPageBreak/>
+              <w:t>organizational behaviour</w:t>
+            </w:r>
+            <w:bookmarkStart w:id="0" w:name="_GoBack"/>
+            <w:bookmarkEnd w:id="0"/>
+            <w:r>
+              <w:rPr>
+                <w:rFonts w:ascii="Times New Roman" w:eastAsia="Times New Roman" w:hAnsi="Times New Roman" w:cs="Times New Roman"/>
+                <w:color w:val="1F1F1F"/>
+                <w:sz w:val="24"/>
+                <w:szCs w:val="24"/>
+                <w:lang w:eastAsia="en-IN" w:bidi="mr-IN"/>
+              </w:rPr>
+              <w:t>.</w:t>
+            </w:r>
           </w:p>
         </w:tc>
         <w:tc>
@@ -13084,6 +13232,17 @@
                 <w:lang w:eastAsia="en-IN" w:bidi="mr-IN"/>
               </w:rPr>
             </w:pPr>
+            <w:r>
+              <w:rPr>
+                <w:rFonts w:ascii="Times New Roman" w:eastAsia="Times New Roman" w:hAnsi="Times New Roman" w:cs="Times New Roman"/>
+                <w:color w:val="1F1F1F"/>
+                <w:sz w:val="24"/>
+                <w:szCs w:val="24"/>
+                <w:lang w:eastAsia="en-IN" w:bidi="mr-IN"/>
+              </w:rPr>
+              <w:lastRenderedPageBreak/>
+              <w:t>PO 6, PO 7</w:t>
+            </w:r>
           </w:p>
         </w:tc>
       </w:tr>
@@ -13123,6 +13282,7 @@
                 <w:szCs w:val="24"/>
                 <w:lang w:eastAsia="en-IN" w:bidi="mr-IN"/>
               </w:rPr>
+              <w:lastRenderedPageBreak/>
               <w:t>5</w:t>
             </w:r>
           </w:p>
@@ -13231,18 +13391,7 @@
                 <w:szCs w:val="24"/>
                 <w:lang w:eastAsia="en-IN" w:bidi="mr-IN"/>
               </w:rPr>
-              <w:t xml:space="preserve">To supplement technical curriculum with </w:t>
-            </w:r>
-            <w:r>
-              <w:rPr>
-                <w:rFonts w:ascii="Times New Roman" w:eastAsia="Times New Roman" w:hAnsi="Times New Roman" w:cs="Times New Roman"/>
-                <w:color w:val="1F1F1F"/>
-                <w:sz w:val="24"/>
-                <w:szCs w:val="24"/>
-                <w:lang w:eastAsia="en-IN" w:bidi="mr-IN"/>
-              </w:rPr>
-              <w:lastRenderedPageBreak/>
-              <w:t>current industry trends</w:t>
+              <w:t>To supplement technical curriculum with current industry trends</w:t>
             </w:r>
           </w:p>
         </w:tc>
@@ -13278,19 +13427,7 @@
                 <w:szCs w:val="24"/>
                 <w:lang w:eastAsia="en-IN" w:bidi="mr-IN"/>
               </w:rPr>
-              <w:lastRenderedPageBreak/>
-              <w:t xml:space="preserve">Information Collection for Self-Learning Activity, Development of </w:t>
-            </w:r>
-            <w:r>
-              <w:rPr>
-                <w:rFonts w:ascii="Times New Roman" w:eastAsia="Times New Roman" w:hAnsi="Times New Roman" w:cs="Times New Roman"/>
-                <w:color w:val="1F1F1F"/>
-                <w:sz w:val="24"/>
-                <w:szCs w:val="24"/>
-                <w:lang w:eastAsia="en-IN" w:bidi="mr-IN"/>
-              </w:rPr>
-              <w:lastRenderedPageBreak/>
-              <w:t>projects and seminar preparation</w:t>
+              <w:t>Information Collection for Self-Learning Activity, Development of projects and seminar preparation</w:t>
             </w:r>
           </w:p>
         </w:tc>
@@ -13326,7 +13463,6 @@
                 <w:szCs w:val="24"/>
                 <w:lang w:eastAsia="en-IN" w:bidi="mr-IN"/>
               </w:rPr>
-              <w:lastRenderedPageBreak/>
               <w:t>Lifelong learning and advanced technical research</w:t>
             </w:r>
           </w:p>
@@ -13405,7 +13541,6 @@
                 <w:szCs w:val="24"/>
                 <w:lang w:eastAsia="en-IN" w:bidi="mr-IN"/>
               </w:rPr>
-              <w:lastRenderedPageBreak/>
               <w:t>6</w:t>
             </w:r>
           </w:p>
@@ -14885,7 +15020,18 @@
                 <w:szCs w:val="24"/>
                 <w:lang w:eastAsia="en-IN" w:bidi="mr-IN"/>
               </w:rPr>
-              <w:t>To ensure lab security and equipment protection</w:t>
+              <w:t xml:space="preserve">To ensure lab security and equipment </w:t>
+            </w:r>
+            <w:r>
+              <w:rPr>
+                <w:rFonts w:ascii="Times New Roman" w:eastAsia="Times New Roman" w:hAnsi="Times New Roman" w:cs="Times New Roman"/>
+                <w:color w:val="1F1F1F"/>
+                <w:sz w:val="24"/>
+                <w:szCs w:val="24"/>
+                <w:lang w:eastAsia="en-IN" w:bidi="mr-IN"/>
+              </w:rPr>
+              <w:lastRenderedPageBreak/>
+              <w:t>protection</w:t>
             </w:r>
           </w:p>
         </w:tc>
@@ -14922,6 +15068,7 @@
                 <w:szCs w:val="24"/>
                 <w:lang w:eastAsia="en-IN" w:bidi="mr-IN"/>
               </w:rPr>
+              <w:lastRenderedPageBreak/>
               <w:t>Monitoring sensitive lab environments</w:t>
             </w:r>
           </w:p>
@@ -15038,6 +15185,7 @@
                 <w:szCs w:val="24"/>
                 <w:lang w:eastAsia="en-IN" w:bidi="mr-IN"/>
               </w:rPr>
+              <w:lastRenderedPageBreak/>
               <w:t>12</w:t>
             </w:r>
           </w:p>
@@ -15315,7 +15463,6 @@
           <w:sz w:val="24"/>
           <w:szCs w:val="24"/>
         </w:rPr>
-        <w:lastRenderedPageBreak/>
         <w:t>1. Maintenance Strategy</w:t>
       </w:r>
     </w:p>
@@ -15652,6 +15799,7 @@
           <w:b/>
           <w:bCs/>
         </w:rPr>
+        <w:lastRenderedPageBreak/>
         <w:t>Connectivity and Resources:</w:t>
       </w:r>
       <w:r>
@@ -15876,7 +16024,6 @@
                 <w:color w:val="000000"/>
                 <w:lang w:val="en-US" w:eastAsia="en-IN" w:bidi="mr-IN"/>
               </w:rPr>
-              <w:lastRenderedPageBreak/>
               <w:t>Sr. No</w:t>
             </w:r>
           </w:p>
@@ -17315,7 +17462,17 @@
                 <w:sz w:val="24"/>
                 <w:szCs w:val="24"/>
               </w:rPr>
-              <w:t>Language Lab equipped with model software and expert language teachers.</w:t>
+              <w:t xml:space="preserve">Language Lab equipped with model software and expert </w:t>
+            </w:r>
+            <w:r>
+              <w:rPr>
+                <w:rFonts w:ascii="Times New Roman" w:hAnsi="Times New Roman" w:cs="Times New Roman"/>
+                <w:color w:val="000000"/>
+                <w:sz w:val="24"/>
+                <w:szCs w:val="24"/>
+              </w:rPr>
+              <w:lastRenderedPageBreak/>
+              <w:t>language teachers.</w:t>
             </w:r>
           </w:p>
         </w:tc>
@@ -17349,7 +17506,18 @@
                 <w:sz w:val="24"/>
                 <w:szCs w:val="24"/>
               </w:rPr>
-              <w:t>To enable students to express themselves in basic language Skills like Listening, Speaking, Reading and Writing</w:t>
+              <w:lastRenderedPageBreak/>
+              <w:t xml:space="preserve">To enable students to express themselves in basic language Skills like </w:t>
+            </w:r>
+            <w:r>
+              <w:rPr>
+                <w:rFonts w:ascii="Times New Roman" w:hAnsi="Times New Roman" w:cs="Times New Roman"/>
+                <w:color w:val="000000"/>
+                <w:sz w:val="24"/>
+                <w:szCs w:val="24"/>
+              </w:rPr>
+              <w:lastRenderedPageBreak/>
+              <w:t>Listening, Speaking, Reading and Writing</w:t>
             </w:r>
           </w:p>
         </w:tc>
@@ -17510,6 +17678,7 @@
                 <w:sz w:val="24"/>
                 <w:szCs w:val="24"/>
               </w:rPr>
+              <w:lastRenderedPageBreak/>
               <w:t>3</w:t>
             </w:r>
           </w:p>
@@ -17632,6 +17801,7 @@
                 <w:sz w:val="24"/>
                 <w:szCs w:val="24"/>
               </w:rPr>
+              <w:lastRenderedPageBreak/>
               <w:t>4</w:t>
             </w:r>
           </w:p>
@@ -18052,7 +18222,7 @@
           <w:rPr>
             <w:noProof/>
           </w:rPr>
-          <w:t>3</w:t>
+          <w:t>9</w:t>
         </w:r>
         <w:r>
           <w:rPr>
@@ -21290,7 +21460,7 @@
 </file>
 
 <file path=customXml/itemProps1.xml><?xml version="1.0" encoding="utf-8"?>
-<ds:datastoreItem xmlns:ds="http://schemas.openxmlformats.org/officeDocument/2006/customXml" ds:itemID="{66811EBE-6CE6-4BBC-A3F8-BD06A008869F}">
+<ds:datastoreItem xmlns:ds="http://schemas.openxmlformats.org/officeDocument/2006/customXml" ds:itemID="{AA195C5D-E2D7-44A1-808A-13D0EAAA34B5}">
   <ds:schemaRefs>
     <ds:schemaRef ds:uri="http://schemas.openxmlformats.org/officeDocument/2006/bibliography"/>
   </ds:schemaRefs>

</xml_diff>

<commit_message>
Added in C6, lang Lab details, Dept Lib, Seminar, Auditoriam changes in 6.5
</commit_message>
<xml_diff>
--- a/C6/C6 Documentation/ADA NBA C6 05 06 26  .docx
+++ b/C6/C6 Documentation/ADA NBA C6 05 06 26  .docx
@@ -1023,7 +1023,16 @@
                 <w:szCs w:val="24"/>
                 <w:lang w:eastAsia="en-IN" w:bidi="mr-IN"/>
               </w:rPr>
-              <w:t>Class Room - 2</w:t>
+              <w:t xml:space="preserve">Class Room - </w:t>
+            </w:r>
+            <w:r>
+              <w:rPr>
+                <w:rFonts w:ascii="Times New Roman" w:eastAsia="Times New Roman" w:hAnsi="Times New Roman" w:cs="Times New Roman"/>
+                <w:sz w:val="24"/>
+                <w:szCs w:val="24"/>
+                <w:lang w:eastAsia="en-IN" w:bidi="mr-IN"/>
+              </w:rPr>
+              <w:t>109</w:t>
             </w:r>
             <w:r>
               <w:rPr>
@@ -2091,6 +2100,7 @@
     </w:p>
     <w:p>
       <w:pPr>
+        <w:jc w:val="both"/>
         <w:rPr>
           <w:rFonts w:ascii="Times New Roman" w:hAnsi="Times New Roman"/>
           <w:sz w:val="24"/>
@@ -2772,9 +2782,9 @@
         <w:tblLook w:val="04A0" w:firstRow="1" w:lastRow="0" w:firstColumn="1" w:lastColumn="0" w:noHBand="0" w:noVBand="1"/>
       </w:tblPr>
       <w:tblGrid>
-        <w:gridCol w:w="534"/>
-        <w:gridCol w:w="2693"/>
-        <w:gridCol w:w="3265"/>
+        <w:gridCol w:w="535"/>
+        <w:gridCol w:w="2544"/>
+        <w:gridCol w:w="3413"/>
         <w:gridCol w:w="1413"/>
         <w:gridCol w:w="1503"/>
       </w:tblGrid>
@@ -2814,7 +2824,7 @@
         </w:tc>
         <w:tc>
           <w:tcPr>
-            <w:tcW w:w="1431" w:type="pct"/>
+            <w:tcW w:w="1352" w:type="pct"/>
             <w:shd w:val="clear" w:color="auto" w:fill="EEECE1" w:themeFill="background2"/>
             <w:vAlign w:val="center"/>
           </w:tcPr>
@@ -2851,7 +2861,7 @@
         </w:tc>
         <w:tc>
           <w:tcPr>
-            <w:tcW w:w="1735" w:type="pct"/>
+            <w:tcW w:w="1814" w:type="pct"/>
             <w:shd w:val="clear" w:color="auto" w:fill="EEECE1" w:themeFill="background2"/>
             <w:vAlign w:val="center"/>
           </w:tcPr>
@@ -2995,7 +3005,7 @@
         </w:tc>
         <w:tc>
           <w:tcPr>
-            <w:tcW w:w="1431" w:type="pct"/>
+            <w:tcW w:w="1352" w:type="pct"/>
             <w:vAlign w:val="center"/>
           </w:tcPr>
           <w:p>
@@ -3023,7 +3033,7 @@
         </w:tc>
         <w:tc>
           <w:tcPr>
-            <w:tcW w:w="1735" w:type="pct"/>
+            <w:tcW w:w="1814" w:type="pct"/>
             <w:vAlign w:val="center"/>
           </w:tcPr>
           <w:p>
@@ -3185,7 +3195,7 @@
         </w:tc>
         <w:tc>
           <w:tcPr>
-            <w:tcW w:w="1431" w:type="pct"/>
+            <w:tcW w:w="1352" w:type="pct"/>
             <w:vAlign w:val="center"/>
           </w:tcPr>
           <w:p>
@@ -3213,7 +3223,7 @@
         </w:tc>
         <w:tc>
           <w:tcPr>
-            <w:tcW w:w="1735" w:type="pct"/>
+            <w:tcW w:w="1814" w:type="pct"/>
             <w:vAlign w:val="center"/>
           </w:tcPr>
           <w:p>
@@ -3359,7 +3369,7 @@
         </w:tc>
         <w:tc>
           <w:tcPr>
-            <w:tcW w:w="1431" w:type="pct"/>
+            <w:tcW w:w="1352" w:type="pct"/>
             <w:vAlign w:val="center"/>
           </w:tcPr>
           <w:p>
@@ -3387,7 +3397,7 @@
         </w:tc>
         <w:tc>
           <w:tcPr>
-            <w:tcW w:w="1735" w:type="pct"/>
+            <w:tcW w:w="1814" w:type="pct"/>
             <w:vAlign w:val="center"/>
           </w:tcPr>
           <w:p>
@@ -3528,7 +3538,7 @@
         </w:tc>
         <w:tc>
           <w:tcPr>
-            <w:tcW w:w="1431" w:type="pct"/>
+            <w:tcW w:w="1352" w:type="pct"/>
             <w:vAlign w:val="center"/>
           </w:tcPr>
           <w:p>
@@ -3556,7 +3566,7 @@
         </w:tc>
         <w:tc>
           <w:tcPr>
-            <w:tcW w:w="1735" w:type="pct"/>
+            <w:tcW w:w="1814" w:type="pct"/>
             <w:vAlign w:val="center"/>
           </w:tcPr>
           <w:p>
@@ -3697,7 +3707,7 @@
         </w:tc>
         <w:tc>
           <w:tcPr>
-            <w:tcW w:w="1431" w:type="pct"/>
+            <w:tcW w:w="1352" w:type="pct"/>
             <w:vAlign w:val="center"/>
           </w:tcPr>
           <w:p>
@@ -3725,7 +3735,7 @@
         </w:tc>
         <w:tc>
           <w:tcPr>
-            <w:tcW w:w="1735" w:type="pct"/>
+            <w:tcW w:w="1814" w:type="pct"/>
             <w:vAlign w:val="center"/>
           </w:tcPr>
           <w:p>
@@ -3858,7 +3868,7 @@
       </w:tr>
       <w:tr>
         <w:trPr>
-          <w:trHeight w:val="836"/>
+          <w:trHeight w:val="728"/>
         </w:trPr>
         <w:tc>
           <w:tcPr>
@@ -3890,7 +3900,7 @@
         </w:tc>
         <w:tc>
           <w:tcPr>
-            <w:tcW w:w="1431" w:type="pct"/>
+            <w:tcW w:w="1352" w:type="pct"/>
             <w:vAlign w:val="center"/>
           </w:tcPr>
           <w:p>
@@ -3918,7 +3928,7 @@
         </w:tc>
         <w:tc>
           <w:tcPr>
-            <w:tcW w:w="1735" w:type="pct"/>
+            <w:tcW w:w="1814" w:type="pct"/>
             <w:vAlign w:val="center"/>
           </w:tcPr>
           <w:p>
@@ -4035,6 +4045,9 @@
         </w:tc>
       </w:tr>
       <w:tr>
+        <w:trPr>
+          <w:trHeight w:val="1214"/>
+        </w:trPr>
         <w:tc>
           <w:tcPr>
             <w:tcW w:w="284" w:type="pct"/>
@@ -4065,7 +4078,7 @@
         </w:tc>
         <w:tc>
           <w:tcPr>
-            <w:tcW w:w="1431" w:type="pct"/>
+            <w:tcW w:w="1352" w:type="pct"/>
             <w:vAlign w:val="center"/>
           </w:tcPr>
           <w:p>
@@ -4093,7 +4106,7 @@
         </w:tc>
         <w:tc>
           <w:tcPr>
-            <w:tcW w:w="1735" w:type="pct"/>
+            <w:tcW w:w="1814" w:type="pct"/>
             <w:vAlign w:val="center"/>
           </w:tcPr>
           <w:p>
@@ -4184,10 +4197,58 @@
                 <w:szCs w:val="24"/>
               </w:rPr>
             </w:pPr>
+            <w:r>
+              <w:rPr>
+                <w:rFonts w:ascii="Times New Roman" w:hAnsi="Times New Roman" w:cs="Times New Roman"/>
+                <w:bCs/>
+                <w:sz w:val="20"/>
+                <w:szCs w:val="20"/>
+              </w:rPr>
+              <w:t>CPU, CAT6 cable,</w:t>
+            </w:r>
+            <w:r>
+              <w:rPr>
+                <w:rFonts w:ascii="Times New Roman" w:hAnsi="Times New Roman" w:cs="Times New Roman"/>
+                <w:bCs/>
+                <w:sz w:val="20"/>
+                <w:szCs w:val="20"/>
+              </w:rPr>
+              <w:t>RJ-45 Male Female,</w:t>
+            </w:r>
+            <w:r>
+              <w:rPr>
+                <w:rFonts w:ascii="Times New Roman" w:hAnsi="Times New Roman" w:cs="Times New Roman"/>
+                <w:bCs/>
+                <w:sz w:val="20"/>
+                <w:szCs w:val="20"/>
+              </w:rPr>
+              <w:t xml:space="preserve"> Crimping tool,</w:t>
+            </w:r>
+            <w:r>
+              <w:rPr>
+                <w:rFonts w:ascii="Times New Roman" w:hAnsi="Times New Roman" w:cs="Times New Roman"/>
+                <w:bCs/>
+                <w:sz w:val="20"/>
+                <w:szCs w:val="20"/>
+              </w:rPr>
+              <w:t xml:space="preserve"> </w:t>
+            </w:r>
+            <w:r>
+              <w:rPr>
+                <w:rFonts w:ascii="Times New Roman" w:hAnsi="Times New Roman" w:cs="Times New Roman"/>
+                <w:bCs/>
+                <w:sz w:val="20"/>
+                <w:szCs w:val="20"/>
+              </w:rPr>
+              <w:t>Motherboard</w:t>
+            </w:r>
           </w:p>
         </w:tc>
       </w:tr>
       <w:tr>
+        <w:trPr>
+          <w:trHeight w:val="980"/>
+        </w:trPr>
         <w:tc>
           <w:tcPr>
             <w:tcW w:w="284" w:type="pct"/>
@@ -4218,7 +4279,7 @@
         </w:tc>
         <w:tc>
           <w:tcPr>
-            <w:tcW w:w="1431" w:type="pct"/>
+            <w:tcW w:w="1352" w:type="pct"/>
             <w:vAlign w:val="center"/>
           </w:tcPr>
           <w:p>
@@ -4247,7 +4308,7 @@
         </w:tc>
         <w:tc>
           <w:tcPr>
-            <w:tcW w:w="1735" w:type="pct"/>
+            <w:tcW w:w="1814" w:type="pct"/>
             <w:vAlign w:val="center"/>
           </w:tcPr>
           <w:p>
@@ -4436,7 +4497,7 @@
         </w:tc>
         <w:tc>
           <w:tcPr>
-            <w:tcW w:w="1431" w:type="pct"/>
+            <w:tcW w:w="1352" w:type="pct"/>
             <w:vAlign w:val="center"/>
           </w:tcPr>
           <w:p>
@@ -4466,7 +4527,7 @@
         </w:tc>
         <w:tc>
           <w:tcPr>
-            <w:tcW w:w="1735" w:type="pct"/>
+            <w:tcW w:w="1814" w:type="pct"/>
             <w:vAlign w:val="center"/>
           </w:tcPr>
           <w:p>
@@ -4622,7 +4683,7 @@
         </w:tc>
         <w:tc>
           <w:tcPr>
-            <w:tcW w:w="1431" w:type="pct"/>
+            <w:tcW w:w="1352" w:type="pct"/>
             <w:vAlign w:val="center"/>
           </w:tcPr>
           <w:p>
@@ -4652,7 +4713,7 @@
         </w:tc>
         <w:tc>
           <w:tcPr>
-            <w:tcW w:w="1735" w:type="pct"/>
+            <w:tcW w:w="1814" w:type="pct"/>
             <w:vAlign w:val="center"/>
           </w:tcPr>
           <w:p>
@@ -4773,7 +4834,7 @@
         </w:tc>
         <w:tc>
           <w:tcPr>
-            <w:tcW w:w="1431" w:type="pct"/>
+            <w:tcW w:w="1352" w:type="pct"/>
             <w:vAlign w:val="center"/>
           </w:tcPr>
           <w:p>
@@ -4826,7 +4887,7 @@
         </w:tc>
         <w:tc>
           <w:tcPr>
-            <w:tcW w:w="1735" w:type="pct"/>
+            <w:tcW w:w="1814" w:type="pct"/>
             <w:vAlign w:val="center"/>
           </w:tcPr>
           <w:p>
@@ -4939,7 +5000,7 @@
         </w:tc>
         <w:tc>
           <w:tcPr>
-            <w:tcW w:w="1431" w:type="pct"/>
+            <w:tcW w:w="1352" w:type="pct"/>
             <w:vAlign w:val="center"/>
           </w:tcPr>
           <w:p>
@@ -4991,7 +5052,7 @@
         </w:tc>
         <w:tc>
           <w:tcPr>
-            <w:tcW w:w="1735" w:type="pct"/>
+            <w:tcW w:w="1814" w:type="pct"/>
             <w:vAlign w:val="center"/>
           </w:tcPr>
           <w:p>
@@ -5007,6 +5068,390 @@
                 <w:szCs w:val="24"/>
               </w:rPr>
             </w:pPr>
+            <w:r>
+              <w:rPr>
+                <w:rFonts w:ascii="Times New Roman" w:hAnsi="Times New Roman" w:cs="Times New Roman"/>
+                <w:sz w:val="24"/>
+                <w:szCs w:val="24"/>
+              </w:rPr>
+              <w:t>C</w:t>
+            </w:r>
+            <w:r>
+              <w:rPr>
+                <w:rFonts w:ascii="Times New Roman" w:hAnsi="Times New Roman" w:cs="Times New Roman"/>
+                <w:sz w:val="24"/>
+                <w:szCs w:val="24"/>
+              </w:rPr>
+              <w:t xml:space="preserve">athode </w:t>
+            </w:r>
+            <w:r>
+              <w:rPr>
+                <w:rFonts w:ascii="Times New Roman" w:hAnsi="Times New Roman" w:cs="Times New Roman"/>
+                <w:sz w:val="24"/>
+                <w:szCs w:val="24"/>
+              </w:rPr>
+              <w:t>R</w:t>
+            </w:r>
+            <w:r>
+              <w:rPr>
+                <w:rFonts w:ascii="Times New Roman" w:hAnsi="Times New Roman" w:cs="Times New Roman"/>
+                <w:sz w:val="24"/>
+                <w:szCs w:val="24"/>
+              </w:rPr>
+              <w:t xml:space="preserve">ay </w:t>
+            </w:r>
+            <w:r>
+              <w:rPr>
+                <w:rFonts w:ascii="Times New Roman" w:hAnsi="Times New Roman" w:cs="Times New Roman"/>
+                <w:sz w:val="24"/>
+                <w:szCs w:val="24"/>
+              </w:rPr>
+              <w:t>Oscilloscope , D</w:t>
+            </w:r>
+            <w:r>
+              <w:rPr>
+                <w:rFonts w:ascii="Times New Roman" w:hAnsi="Times New Roman" w:cs="Times New Roman"/>
+                <w:sz w:val="24"/>
+                <w:szCs w:val="24"/>
+              </w:rPr>
+              <w:t xml:space="preserve">igital </w:t>
+            </w:r>
+            <w:r>
+              <w:rPr>
+                <w:rFonts w:ascii="Times New Roman" w:hAnsi="Times New Roman" w:cs="Times New Roman"/>
+                <w:sz w:val="24"/>
+                <w:szCs w:val="24"/>
+              </w:rPr>
+              <w:t>Storage Oscilloscope, F</w:t>
+            </w:r>
+            <w:r>
+              <w:rPr>
+                <w:rFonts w:ascii="Times New Roman" w:hAnsi="Times New Roman" w:cs="Times New Roman"/>
+                <w:sz w:val="24"/>
+                <w:szCs w:val="24"/>
+              </w:rPr>
+              <w:t xml:space="preserve">unction </w:t>
+            </w:r>
+            <w:r>
+              <w:rPr>
+                <w:rFonts w:ascii="Times New Roman" w:hAnsi="Times New Roman" w:cs="Times New Roman"/>
+                <w:sz w:val="24"/>
+                <w:szCs w:val="24"/>
+              </w:rPr>
+              <w:t>G</w:t>
+            </w:r>
+            <w:r>
+              <w:rPr>
+                <w:rFonts w:ascii="Times New Roman" w:hAnsi="Times New Roman" w:cs="Times New Roman"/>
+                <w:sz w:val="24"/>
+                <w:szCs w:val="24"/>
+              </w:rPr>
+              <w:t>enerator, D</w:t>
+            </w:r>
+            <w:r>
+              <w:rPr>
+                <w:rFonts w:ascii="Times New Roman" w:hAnsi="Times New Roman" w:cs="Times New Roman"/>
+                <w:sz w:val="24"/>
+                <w:szCs w:val="24"/>
+              </w:rPr>
+              <w:t>igital/</w:t>
+            </w:r>
+            <w:r>
+              <w:rPr>
+                <w:rFonts w:ascii="Times New Roman" w:hAnsi="Times New Roman" w:cs="Times New Roman"/>
+                <w:sz w:val="24"/>
+                <w:szCs w:val="24"/>
+              </w:rPr>
+              <w:t>A</w:t>
+            </w:r>
+            <w:r>
+              <w:rPr>
+                <w:rFonts w:ascii="Times New Roman" w:hAnsi="Times New Roman" w:cs="Times New Roman"/>
+                <w:sz w:val="24"/>
+                <w:szCs w:val="24"/>
+              </w:rPr>
+              <w:t xml:space="preserve">nalog </w:t>
+            </w:r>
+            <w:r>
+              <w:rPr>
+                <w:rFonts w:ascii="Times New Roman" w:hAnsi="Times New Roman" w:cs="Times New Roman"/>
+                <w:sz w:val="24"/>
+                <w:szCs w:val="24"/>
+              </w:rPr>
+              <w:t>IC</w:t>
+            </w:r>
+            <w:r>
+              <w:rPr>
+                <w:rFonts w:ascii="Times New Roman" w:hAnsi="Times New Roman" w:cs="Times New Roman"/>
+                <w:sz w:val="24"/>
+                <w:szCs w:val="24"/>
+              </w:rPr>
+              <w:t xml:space="preserve"> tester, </w:t>
+            </w:r>
+            <w:r>
+              <w:rPr>
+                <w:rFonts w:ascii="Times New Roman" w:hAnsi="Times New Roman" w:cs="Times New Roman"/>
+                <w:sz w:val="24"/>
+                <w:szCs w:val="24"/>
+              </w:rPr>
+              <w:t>H</w:t>
+            </w:r>
+            <w:r>
+              <w:rPr>
+                <w:rFonts w:ascii="Times New Roman" w:hAnsi="Times New Roman" w:cs="Times New Roman"/>
+                <w:sz w:val="24"/>
+                <w:szCs w:val="24"/>
+              </w:rPr>
+              <w:t xml:space="preserve">alf </w:t>
+            </w:r>
+            <w:r>
+              <w:rPr>
+                <w:rFonts w:ascii="Times New Roman" w:hAnsi="Times New Roman" w:cs="Times New Roman"/>
+                <w:sz w:val="24"/>
+                <w:szCs w:val="24"/>
+              </w:rPr>
+              <w:t>A</w:t>
+            </w:r>
+            <w:r>
+              <w:rPr>
+                <w:rFonts w:ascii="Times New Roman" w:hAnsi="Times New Roman" w:cs="Times New Roman"/>
+                <w:sz w:val="24"/>
+                <w:szCs w:val="24"/>
+              </w:rPr>
+              <w:t>dder</w:t>
+            </w:r>
+            <w:r>
+              <w:rPr>
+                <w:rFonts w:ascii="Times New Roman" w:hAnsi="Times New Roman" w:cs="Times New Roman"/>
+                <w:sz w:val="24"/>
+                <w:szCs w:val="24"/>
+              </w:rPr>
+              <w:t>,</w:t>
+            </w:r>
+            <w:r>
+              <w:rPr>
+                <w:rFonts w:ascii="Times New Roman" w:hAnsi="Times New Roman" w:cs="Times New Roman"/>
+                <w:sz w:val="24"/>
+                <w:szCs w:val="24"/>
+              </w:rPr>
+              <w:t xml:space="preserve"> </w:t>
+            </w:r>
+            <w:r>
+              <w:rPr>
+                <w:rFonts w:ascii="Times New Roman" w:hAnsi="Times New Roman" w:cs="Times New Roman"/>
+                <w:sz w:val="24"/>
+                <w:szCs w:val="24"/>
+              </w:rPr>
+              <w:t>F</w:t>
+            </w:r>
+            <w:r>
+              <w:rPr>
+                <w:rFonts w:ascii="Times New Roman" w:hAnsi="Times New Roman" w:cs="Times New Roman"/>
+                <w:sz w:val="24"/>
+                <w:szCs w:val="24"/>
+              </w:rPr>
+              <w:t xml:space="preserve">ull </w:t>
+            </w:r>
+            <w:r>
+              <w:rPr>
+                <w:rFonts w:ascii="Times New Roman" w:hAnsi="Times New Roman" w:cs="Times New Roman"/>
+                <w:sz w:val="24"/>
+                <w:szCs w:val="24"/>
+              </w:rPr>
+              <w:t>A</w:t>
+            </w:r>
+            <w:r>
+              <w:rPr>
+                <w:rFonts w:ascii="Times New Roman" w:hAnsi="Times New Roman" w:cs="Times New Roman"/>
+                <w:sz w:val="24"/>
+                <w:szCs w:val="24"/>
+              </w:rPr>
+              <w:t xml:space="preserve">dder, </w:t>
+            </w:r>
+            <w:r>
+              <w:rPr>
+                <w:rFonts w:ascii="Times New Roman" w:hAnsi="Times New Roman" w:cs="Times New Roman"/>
+                <w:sz w:val="24"/>
+                <w:szCs w:val="24"/>
+              </w:rPr>
+              <w:t>M</w:t>
+            </w:r>
+            <w:r>
+              <w:rPr>
+                <w:rFonts w:ascii="Times New Roman" w:hAnsi="Times New Roman" w:cs="Times New Roman"/>
+                <w:sz w:val="24"/>
+                <w:szCs w:val="24"/>
+              </w:rPr>
+              <w:t>ul</w:t>
+            </w:r>
+            <w:r>
+              <w:rPr>
+                <w:rFonts w:ascii="Times New Roman" w:hAnsi="Times New Roman" w:cs="Times New Roman"/>
+                <w:sz w:val="24"/>
+                <w:szCs w:val="24"/>
+              </w:rPr>
+              <w:t>ti</w:t>
+            </w:r>
+            <w:r>
+              <w:rPr>
+                <w:rFonts w:ascii="Times New Roman" w:hAnsi="Times New Roman" w:cs="Times New Roman"/>
+                <w:sz w:val="24"/>
+                <w:szCs w:val="24"/>
+              </w:rPr>
+              <w:t xml:space="preserve">plexer and </w:t>
+            </w:r>
+            <w:r>
+              <w:rPr>
+                <w:rFonts w:ascii="Times New Roman" w:hAnsi="Times New Roman" w:cs="Times New Roman"/>
+                <w:sz w:val="24"/>
+                <w:szCs w:val="24"/>
+              </w:rPr>
+              <w:t>De-m</w:t>
+            </w:r>
+            <w:r>
+              <w:rPr>
+                <w:rFonts w:ascii="Times New Roman" w:hAnsi="Times New Roman" w:cs="Times New Roman"/>
+                <w:sz w:val="24"/>
+                <w:szCs w:val="24"/>
+              </w:rPr>
+              <w:t>ul</w:t>
+            </w:r>
+            <w:r>
+              <w:rPr>
+                <w:rFonts w:ascii="Times New Roman" w:hAnsi="Times New Roman" w:cs="Times New Roman"/>
+                <w:sz w:val="24"/>
+                <w:szCs w:val="24"/>
+              </w:rPr>
+              <w:t>ti</w:t>
+            </w:r>
+            <w:r>
+              <w:rPr>
+                <w:rFonts w:ascii="Times New Roman" w:hAnsi="Times New Roman" w:cs="Times New Roman"/>
+                <w:sz w:val="24"/>
+                <w:szCs w:val="24"/>
+              </w:rPr>
+              <w:t>plexer</w:t>
+            </w:r>
+            <w:r>
+              <w:rPr>
+                <w:rFonts w:ascii="Times New Roman" w:hAnsi="Times New Roman" w:cs="Times New Roman"/>
+                <w:sz w:val="24"/>
+                <w:szCs w:val="24"/>
+              </w:rPr>
+              <w:t xml:space="preserve">, </w:t>
+            </w:r>
+            <w:r>
+              <w:rPr>
+                <w:rFonts w:ascii="Times New Roman" w:hAnsi="Times New Roman" w:cs="Times New Roman"/>
+                <w:sz w:val="24"/>
+                <w:szCs w:val="24"/>
+              </w:rPr>
+              <w:t>C</w:t>
+            </w:r>
+            <w:r>
+              <w:rPr>
+                <w:rFonts w:ascii="Times New Roman" w:hAnsi="Times New Roman" w:cs="Times New Roman"/>
+                <w:sz w:val="24"/>
+                <w:szCs w:val="24"/>
+              </w:rPr>
+              <w:t>ounter</w:t>
+            </w:r>
+            <w:r>
+              <w:rPr>
+                <w:rFonts w:ascii="Times New Roman" w:hAnsi="Times New Roman" w:cs="Times New Roman"/>
+                <w:sz w:val="24"/>
+                <w:szCs w:val="24"/>
+              </w:rPr>
+              <w:t>, E</w:t>
+            </w:r>
+            <w:r>
+              <w:rPr>
+                <w:rFonts w:ascii="Times New Roman" w:hAnsi="Times New Roman" w:cs="Times New Roman"/>
+                <w:sz w:val="24"/>
+                <w:szCs w:val="24"/>
+              </w:rPr>
+              <w:t>lectronic</w:t>
+            </w:r>
+            <w:r>
+              <w:rPr>
+                <w:rFonts w:ascii="Times New Roman" w:hAnsi="Times New Roman" w:cs="Times New Roman"/>
+                <w:sz w:val="24"/>
+                <w:szCs w:val="24"/>
+              </w:rPr>
+              <w:t xml:space="preserve"> </w:t>
+            </w:r>
+            <w:r>
+              <w:rPr>
+                <w:rFonts w:ascii="Times New Roman" w:hAnsi="Times New Roman" w:cs="Times New Roman"/>
+                <w:sz w:val="24"/>
+                <w:szCs w:val="24"/>
+              </w:rPr>
+              <w:t>W</w:t>
+            </w:r>
+            <w:r>
+              <w:rPr>
+                <w:rFonts w:ascii="Times New Roman" w:hAnsi="Times New Roman" w:cs="Times New Roman"/>
+                <w:sz w:val="24"/>
+                <w:szCs w:val="24"/>
+              </w:rPr>
+              <w:t xml:space="preserve">ork </w:t>
+            </w:r>
+            <w:r>
+              <w:rPr>
+                <w:rFonts w:ascii="Times New Roman" w:hAnsi="Times New Roman" w:cs="Times New Roman"/>
+                <w:sz w:val="24"/>
+                <w:szCs w:val="24"/>
+              </w:rPr>
+              <w:t>B</w:t>
+            </w:r>
+            <w:r>
+              <w:rPr>
+                <w:rFonts w:ascii="Times New Roman" w:hAnsi="Times New Roman" w:cs="Times New Roman"/>
+                <w:sz w:val="24"/>
+                <w:szCs w:val="24"/>
+              </w:rPr>
+              <w:t xml:space="preserve">ench, </w:t>
+            </w:r>
+            <w:r>
+              <w:rPr>
+                <w:rFonts w:ascii="Times New Roman" w:hAnsi="Times New Roman" w:cs="Times New Roman"/>
+                <w:sz w:val="24"/>
+                <w:szCs w:val="24"/>
+              </w:rPr>
+              <w:t>Bread</w:t>
+            </w:r>
+            <w:r>
+              <w:rPr>
+                <w:rFonts w:ascii="Times New Roman" w:hAnsi="Times New Roman" w:cs="Times New Roman"/>
+                <w:sz w:val="24"/>
+                <w:szCs w:val="24"/>
+              </w:rPr>
+              <w:t xml:space="preserve">boards and </w:t>
+            </w:r>
+            <w:r>
+              <w:rPr>
+                <w:rFonts w:ascii="Times New Roman" w:hAnsi="Times New Roman" w:cs="Times New Roman"/>
+                <w:sz w:val="24"/>
+                <w:szCs w:val="24"/>
+              </w:rPr>
+              <w:t>V</w:t>
+            </w:r>
+            <w:r>
+              <w:rPr>
+                <w:rFonts w:ascii="Times New Roman" w:hAnsi="Times New Roman" w:cs="Times New Roman"/>
+                <w:sz w:val="24"/>
+                <w:szCs w:val="24"/>
+              </w:rPr>
+              <w:t xml:space="preserve">arious </w:t>
+            </w:r>
+            <w:r>
+              <w:rPr>
+                <w:rFonts w:ascii="Times New Roman" w:hAnsi="Times New Roman" w:cs="Times New Roman"/>
+                <w:sz w:val="24"/>
+                <w:szCs w:val="24"/>
+              </w:rPr>
+              <w:t>ICs</w:t>
+            </w:r>
           </w:p>
         </w:tc>
         <w:tc>
@@ -5592,18 +6037,8 @@
           <w:sz w:val="24"/>
           <w:szCs w:val="24"/>
         </w:rPr>
-        <w:t xml:space="preserve"> S </w:t>
-      </w:r>
-      <w:proofErr w:type="spellStart"/>
-      <w:r>
-        <w:rPr>
-          <w:rFonts w:ascii="Times New Roman" w:hAnsi="Times New Roman" w:cs="Times New Roman"/>
-          <w:sz w:val="24"/>
-          <w:szCs w:val="24"/>
-        </w:rPr>
-        <w:t>Gund</w:t>
-      </w:r>
-      <w:proofErr w:type="spellEnd"/>
+        <w:t xml:space="preserve"> S Gund</w:t>
+      </w:r>
       <w:r>
         <w:rPr>
           <w:rFonts w:ascii="Times New Roman" w:hAnsi="Times New Roman" w:cs="Times New Roman"/>
@@ -5782,18 +6217,21 @@
     <w:tbl>
       <w:tblPr>
         <w:tblStyle w:val="TableGrid"/>
-        <w:tblW w:w="9282" w:type="dxa"/>
+        <w:tblW w:w="9763" w:type="dxa"/>
         <w:tblLayout w:type="fixed"/>
         <w:tblLook w:val="04A0" w:firstRow="1" w:lastRow="0" w:firstColumn="1" w:lastColumn="0" w:noHBand="0" w:noVBand="1"/>
       </w:tblPr>
       <w:tblGrid>
-        <w:gridCol w:w="4572"/>
-        <w:gridCol w:w="4710"/>
+        <w:gridCol w:w="4809"/>
+        <w:gridCol w:w="4954"/>
       </w:tblGrid>
       <w:tr>
-        <w:tc>
-          <w:tcPr>
-            <w:tcW w:w="4572" w:type="dxa"/>
+        <w:trPr>
+          <w:trHeight w:val="2576"/>
+        </w:trPr>
+        <w:tc>
+          <w:tcPr>
+            <w:tcW w:w="4809" w:type="dxa"/>
             <w:vAlign w:val="center"/>
           </w:tcPr>
           <w:p>
@@ -5817,8 +6255,9 @@
                 <w:szCs w:val="24"/>
                 <w:lang w:eastAsia="en-IN" w:bidi="mr-IN"/>
               </w:rPr>
+              <w:lastRenderedPageBreak/>
               <w:drawing>
-                <wp:inline distT="0" distB="0" distL="0" distR="0">
+                <wp:inline distT="0" distB="0" distL="0" distR="0" wp14:anchorId="6A466E21" wp14:editId="2AFBE306">
                   <wp:extent cx="2768600" cy="2768600"/>
                   <wp:effectExtent l="0" t="0" r="0" b="0"/>
                   <wp:docPr id="1" name="Picture 1"/>
@@ -5863,7 +6302,7 @@
         </w:tc>
         <w:tc>
           <w:tcPr>
-            <w:tcW w:w="4710" w:type="dxa"/>
+            <w:tcW w:w="4954" w:type="dxa"/>
           </w:tcPr>
           <w:p>
             <w:pPr>
@@ -5886,7 +6325,7 @@
                 <w:lang w:eastAsia="en-IN" w:bidi="mr-IN"/>
               </w:rPr>
               <w:drawing>
-                <wp:inline distT="0" distB="0" distL="0" distR="0">
+                <wp:inline distT="0" distB="0" distL="0" distR="0" wp14:anchorId="1C411A66" wp14:editId="089E7DE5">
                   <wp:extent cx="2851150" cy="2755900"/>
                   <wp:effectExtent l="0" t="0" r="6350" b="6350"/>
                   <wp:docPr id="4" name="Picture 4"/>
@@ -5931,9 +6370,12 @@
         </w:tc>
       </w:tr>
       <w:tr>
-        <w:tc>
-          <w:tcPr>
-            <w:tcW w:w="4572" w:type="dxa"/>
+        <w:trPr>
+          <w:trHeight w:val="2186"/>
+        </w:trPr>
+        <w:tc>
+          <w:tcPr>
+            <w:tcW w:w="4809" w:type="dxa"/>
             <w:vAlign w:val="center"/>
           </w:tcPr>
           <w:p>
@@ -6014,7 +6456,6 @@
                 <w:color w:val="1F1F1F"/>
                 <w:lang w:eastAsia="en-IN" w:bidi="mr-IN"/>
               </w:rPr>
-              <w:lastRenderedPageBreak/>
               <w:t>Air-Conditioning System</w:t>
             </w:r>
           </w:p>
@@ -6126,7 +6567,7 @@
         </w:tc>
         <w:tc>
           <w:tcPr>
-            <w:tcW w:w="4710" w:type="dxa"/>
+            <w:tcW w:w="4954" w:type="dxa"/>
           </w:tcPr>
           <w:p>
             <w:pPr>
@@ -6145,7 +6586,6 @@
               <w:rPr>
                 <w:rFonts w:ascii="Times New Roman" w:hAnsi="Times New Roman" w:cs="Times New Roman"/>
               </w:rPr>
-              <w:lastRenderedPageBreak/>
               <w:t>Biometric Attendance System for Students</w:t>
             </w:r>
           </w:p>
@@ -6186,7 +6626,6 @@
               <w:rPr>
                 <w:rFonts w:ascii="Times New Roman" w:hAnsi="Times New Roman" w:cs="Times New Roman"/>
               </w:rPr>
-              <w:lastRenderedPageBreak/>
               <w:t>CCTV Surveillance System</w:t>
             </w:r>
           </w:p>
@@ -6289,9 +6728,12 @@
         </w:tc>
       </w:tr>
       <w:tr>
-        <w:tc>
-          <w:tcPr>
-            <w:tcW w:w="4572" w:type="dxa"/>
+        <w:trPr>
+          <w:trHeight w:val="4148"/>
+        </w:trPr>
+        <w:tc>
+          <w:tcPr>
+            <w:tcW w:w="4809" w:type="dxa"/>
             <w:vAlign w:val="center"/>
           </w:tcPr>
           <w:p>
@@ -6314,11 +6756,10 @@
                 <w:szCs w:val="24"/>
                 <w:lang w:eastAsia="en-IN" w:bidi="mr-IN"/>
               </w:rPr>
-              <w:lastRenderedPageBreak/>
               <w:drawing>
-                <wp:inline distT="0" distB="0" distL="0" distR="0" wp14:anchorId="2923294F" wp14:editId="44F48581">
-                  <wp:extent cx="2787649" cy="2279650"/>
-                  <wp:effectExtent l="0" t="0" r="0" b="6350"/>
+                <wp:inline distT="0" distB="0" distL="0" distR="0" wp14:anchorId="7A2C506D" wp14:editId="11165698">
+                  <wp:extent cx="2790497" cy="2396358"/>
+                  <wp:effectExtent l="0" t="0" r="0" b="4445"/>
                   <wp:docPr id="2" name="Picture 2"/>
                   <wp:cNvGraphicFramePr>
                     <a:graphicFrameLocks xmlns:a="http://schemas.openxmlformats.org/drawingml/2006/main" noChangeAspect="1"/>
@@ -6345,7 +6786,7 @@
                         <pic:spPr>
                           <a:xfrm>
                             <a:off x="0" y="0"/>
-                            <a:ext cx="2791407" cy="2282723"/>
+                            <a:ext cx="2791407" cy="2397139"/>
                           </a:xfrm>
                           <a:prstGeom prst="rect">
                             <a:avLst/>
@@ -6361,7 +6802,7 @@
         </w:tc>
         <w:tc>
           <w:tcPr>
-            <w:tcW w:w="4710" w:type="dxa"/>
+            <w:tcW w:w="4954" w:type="dxa"/>
           </w:tcPr>
           <w:p>
             <w:pPr>
@@ -6382,9 +6823,9 @@
                 <w:lang w:eastAsia="en-IN" w:bidi="mr-IN"/>
               </w:rPr>
               <w:drawing>
-                <wp:inline distT="0" distB="0" distL="0" distR="0" wp14:anchorId="73B27C7A" wp14:editId="215E53A0">
-                  <wp:extent cx="2927350" cy="2284457"/>
-                  <wp:effectExtent l="0" t="0" r="6350" b="1905"/>
+                <wp:inline distT="0" distB="0" distL="0" distR="0" wp14:anchorId="2104B566" wp14:editId="4CAFDC07">
+                  <wp:extent cx="2929328" cy="2506717"/>
+                  <wp:effectExtent l="0" t="0" r="4445" b="8255"/>
                   <wp:docPr id="3" name="Picture 3"/>
                   <wp:cNvGraphicFramePr>
                     <a:graphicFrameLocks xmlns:a="http://schemas.openxmlformats.org/drawingml/2006/main" noChangeAspect="1"/>
@@ -6411,7 +6852,7 @@
                         <pic:spPr>
                           <a:xfrm>
                             <a:off x="0" y="0"/>
-                            <a:ext cx="2929908" cy="2286453"/>
+                            <a:ext cx="2929908" cy="2507214"/>
                           </a:xfrm>
                           <a:prstGeom prst="rect">
                             <a:avLst/>
@@ -6427,9 +6868,12 @@
         </w:tc>
       </w:tr>
       <w:tr>
-        <w:tc>
-          <w:tcPr>
-            <w:tcW w:w="4572" w:type="dxa"/>
+        <w:trPr>
+          <w:trHeight w:val="2447"/>
+        </w:trPr>
+        <w:tc>
+          <w:tcPr>
+            <w:tcW w:w="4809" w:type="dxa"/>
             <w:vAlign w:val="center"/>
           </w:tcPr>
           <w:p>
@@ -6440,6 +6884,8 @@
                 <w:b/>
                 <w:bCs/>
                 <w:color w:val="1F1F1F"/>
+                <w:sz w:val="24"/>
+                <w:szCs w:val="24"/>
                 <w:lang w:eastAsia="en-IN" w:bidi="mr-IN"/>
               </w:rPr>
             </w:pPr>
@@ -6449,6 +6895,8 @@
                 <w:b/>
                 <w:bCs/>
                 <w:color w:val="1F1F1F"/>
+                <w:sz w:val="24"/>
+                <w:szCs w:val="24"/>
                 <w:lang w:eastAsia="en-IN" w:bidi="mr-IN"/>
               </w:rPr>
               <w:t>Android App Development Laboratory</w:t>
@@ -6592,7 +7040,7 @@
         </w:tc>
         <w:tc>
           <w:tcPr>
-            <w:tcW w:w="4710" w:type="dxa"/>
+            <w:tcW w:w="4954" w:type="dxa"/>
           </w:tcPr>
           <w:p>
             <w:pPr>
@@ -6741,9 +7189,12 @@
         </w:tc>
       </w:tr>
       <w:tr>
-        <w:tc>
-          <w:tcPr>
-            <w:tcW w:w="4572" w:type="dxa"/>
+        <w:trPr>
+          <w:trHeight w:val="4670"/>
+        </w:trPr>
+        <w:tc>
+          <w:tcPr>
+            <w:tcW w:w="4809" w:type="dxa"/>
             <w:vAlign w:val="center"/>
           </w:tcPr>
           <w:p>
@@ -6766,9 +7217,10 @@
                 <w:szCs w:val="24"/>
                 <w:lang w:eastAsia="en-IN" w:bidi="mr-IN"/>
               </w:rPr>
+              <w:lastRenderedPageBreak/>
               <w:drawing>
-                <wp:inline distT="0" distB="0" distL="0" distR="0">
-                  <wp:extent cx="2766060" cy="2766060"/>
+                <wp:inline distT="0" distB="0" distL="0" distR="0" wp14:anchorId="2A48AB97" wp14:editId="40EB9426">
+                  <wp:extent cx="2770495" cy="2879677"/>
                   <wp:effectExtent l="0" t="0" r="0" b="0"/>
                   <wp:docPr id="5" name="Picture 5"/>
                   <wp:cNvGraphicFramePr>
@@ -6796,7 +7248,7 @@
                         <pic:spPr>
                           <a:xfrm>
                             <a:off x="0" y="0"/>
-                            <a:ext cx="2766060" cy="2766060"/>
+                            <a:ext cx="2766060" cy="2875067"/>
                           </a:xfrm>
                           <a:prstGeom prst="rect">
                             <a:avLst/>
@@ -6812,7 +7264,7 @@
         </w:tc>
         <w:tc>
           <w:tcPr>
-            <w:tcW w:w="4710" w:type="dxa"/>
+            <w:tcW w:w="4954" w:type="dxa"/>
           </w:tcPr>
           <w:p>
             <w:pPr>
@@ -6833,9 +7285,9 @@
                 <w:lang w:eastAsia="en-IN" w:bidi="mr-IN"/>
               </w:rPr>
               <w:drawing>
-                <wp:inline distT="0" distB="0" distL="0" distR="0">
-                  <wp:extent cx="2853690" cy="2853690"/>
-                  <wp:effectExtent l="0" t="0" r="3810" b="3810"/>
+                <wp:inline distT="0" distB="0" distL="0" distR="0" wp14:anchorId="289F5CE8" wp14:editId="04BC07BA">
+                  <wp:extent cx="2852382" cy="2879678"/>
+                  <wp:effectExtent l="0" t="0" r="5715" b="0"/>
                   <wp:docPr id="6" name="Picture 6"/>
                   <wp:cNvGraphicFramePr>
                     <a:graphicFrameLocks xmlns:a="http://schemas.openxmlformats.org/drawingml/2006/main" noChangeAspect="1"/>
@@ -6862,7 +7314,7 @@
                         <pic:spPr>
                           <a:xfrm>
                             <a:off x="0" y="0"/>
-                            <a:ext cx="2853690" cy="2853690"/>
+                            <a:ext cx="2853690" cy="2880999"/>
                           </a:xfrm>
                           <a:prstGeom prst="rect">
                             <a:avLst/>
@@ -6878,9 +7330,12 @@
         </w:tc>
       </w:tr>
       <w:tr>
-        <w:tc>
-          <w:tcPr>
-            <w:tcW w:w="4572" w:type="dxa"/>
+        <w:trPr>
+          <w:trHeight w:val="1961"/>
+        </w:trPr>
+        <w:tc>
+          <w:tcPr>
+            <w:tcW w:w="4809" w:type="dxa"/>
             <w:vAlign w:val="center"/>
           </w:tcPr>
           <w:p>
@@ -7073,7 +7528,7 @@
         </w:tc>
         <w:tc>
           <w:tcPr>
-            <w:tcW w:w="4710" w:type="dxa"/>
+            <w:tcW w:w="4954" w:type="dxa"/>
           </w:tcPr>
           <w:p>
             <w:pPr>
@@ -7242,9 +7697,12 @@
         </w:tc>
       </w:tr>
       <w:tr>
-        <w:tc>
-          <w:tcPr>
-            <w:tcW w:w="4572" w:type="dxa"/>
+        <w:trPr>
+          <w:trHeight w:val="85"/>
+        </w:trPr>
+        <w:tc>
+          <w:tcPr>
+            <w:tcW w:w="4809" w:type="dxa"/>
             <w:vAlign w:val="center"/>
           </w:tcPr>
           <w:p>
@@ -7267,9 +7725,8 @@
                 <w:szCs w:val="24"/>
                 <w:lang w:eastAsia="en-IN" w:bidi="mr-IN"/>
               </w:rPr>
-              <w:lastRenderedPageBreak/>
               <w:drawing>
-                <wp:inline distT="0" distB="0" distL="0" distR="0">
+                <wp:inline distT="0" distB="0" distL="0" distR="0" wp14:anchorId="13B8399B" wp14:editId="1D869D9E">
                   <wp:extent cx="2766060" cy="2766060"/>
                   <wp:effectExtent l="0" t="0" r="0" b="0"/>
                   <wp:docPr id="7" name="Picture 7"/>
@@ -7314,7 +7771,7 @@
         </w:tc>
         <w:tc>
           <w:tcPr>
-            <w:tcW w:w="4710" w:type="dxa"/>
+            <w:tcW w:w="4954" w:type="dxa"/>
           </w:tcPr>
           <w:p>
             <w:pPr>
@@ -7335,7 +7792,7 @@
                 <w:lang w:eastAsia="en-IN" w:bidi="mr-IN"/>
               </w:rPr>
               <w:drawing>
-                <wp:inline distT="0" distB="0" distL="0" distR="0">
+                <wp:inline distT="0" distB="0" distL="0" distR="0" wp14:anchorId="5059739D" wp14:editId="12B5373D">
                   <wp:extent cx="2853690" cy="2853690"/>
                   <wp:effectExtent l="0" t="0" r="3810" b="3810"/>
                   <wp:docPr id="8" name="Picture 8"/>
@@ -7380,9 +7837,12 @@
         </w:tc>
       </w:tr>
       <w:tr>
-        <w:tc>
-          <w:tcPr>
-            <w:tcW w:w="4572" w:type="dxa"/>
+        <w:trPr>
+          <w:trHeight w:val="85"/>
+        </w:trPr>
+        <w:tc>
+          <w:tcPr>
+            <w:tcW w:w="4809" w:type="dxa"/>
             <w:vAlign w:val="center"/>
           </w:tcPr>
           <w:p>
@@ -7565,7 +8025,7 @@
         </w:tc>
         <w:tc>
           <w:tcPr>
-            <w:tcW w:w="4710" w:type="dxa"/>
+            <w:tcW w:w="4954" w:type="dxa"/>
           </w:tcPr>
           <w:p>
             <w:pPr>
@@ -7746,9 +8206,12 @@
         </w:tc>
       </w:tr>
       <w:tr>
-        <w:tc>
-          <w:tcPr>
-            <w:tcW w:w="4572" w:type="dxa"/>
+        <w:trPr>
+          <w:trHeight w:val="85"/>
+        </w:trPr>
+        <w:tc>
+          <w:tcPr>
+            <w:tcW w:w="4809" w:type="dxa"/>
             <w:vAlign w:val="center"/>
           </w:tcPr>
           <w:p>
@@ -7771,8 +8234,9 @@
                 <w:szCs w:val="24"/>
                 <w:lang w:eastAsia="en-IN" w:bidi="mr-IN"/>
               </w:rPr>
+              <w:lastRenderedPageBreak/>
               <w:drawing>
-                <wp:inline distT="0" distB="0" distL="0" distR="0">
+                <wp:inline distT="0" distB="0" distL="0" distR="0" wp14:anchorId="2F7D63D3" wp14:editId="786B6D9D">
                   <wp:extent cx="2766060" cy="2766060"/>
                   <wp:effectExtent l="0" t="0" r="0" b="0"/>
                   <wp:docPr id="9" name="Picture 9"/>
@@ -7817,7 +8281,7 @@
         </w:tc>
         <w:tc>
           <w:tcPr>
-            <w:tcW w:w="4710" w:type="dxa"/>
+            <w:tcW w:w="4954" w:type="dxa"/>
           </w:tcPr>
           <w:p>
             <w:pPr>
@@ -7838,7 +8302,7 @@
                 <w:lang w:eastAsia="en-IN" w:bidi="mr-IN"/>
               </w:rPr>
               <w:drawing>
-                <wp:inline distT="0" distB="0" distL="0" distR="0">
+                <wp:inline distT="0" distB="0" distL="0" distR="0" wp14:anchorId="4C5929AE" wp14:editId="13A0C59D">
                   <wp:extent cx="2853690" cy="2853690"/>
                   <wp:effectExtent l="0" t="0" r="3810" b="3810"/>
                   <wp:docPr id="10" name="Picture 10"/>
@@ -7883,9 +8347,12 @@
         </w:tc>
       </w:tr>
       <w:tr>
-        <w:tc>
-          <w:tcPr>
-            <w:tcW w:w="4572" w:type="dxa"/>
+        <w:trPr>
+          <w:trHeight w:val="85"/>
+        </w:trPr>
+        <w:tc>
+          <w:tcPr>
+            <w:tcW w:w="4809" w:type="dxa"/>
             <w:vAlign w:val="center"/>
           </w:tcPr>
           <w:p>
@@ -8062,7 +8529,7 @@
         </w:tc>
         <w:tc>
           <w:tcPr>
-            <w:tcW w:w="4710" w:type="dxa"/>
+            <w:tcW w:w="4954" w:type="dxa"/>
           </w:tcPr>
           <w:p>
             <w:pPr>
@@ -8231,9 +8698,12 @@
         </w:tc>
       </w:tr>
       <w:tr>
-        <w:tc>
-          <w:tcPr>
-            <w:tcW w:w="4572" w:type="dxa"/>
+        <w:trPr>
+          <w:trHeight w:val="85"/>
+        </w:trPr>
+        <w:tc>
+          <w:tcPr>
+            <w:tcW w:w="4809" w:type="dxa"/>
             <w:vAlign w:val="center"/>
           </w:tcPr>
           <w:p>
@@ -8256,9 +8726,8 @@
                 <w:szCs w:val="24"/>
                 <w:lang w:eastAsia="en-IN" w:bidi="mr-IN"/>
               </w:rPr>
-              <w:lastRenderedPageBreak/>
               <w:drawing>
-                <wp:inline distT="0" distB="0" distL="0" distR="0">
+                <wp:inline distT="0" distB="0" distL="0" distR="0" wp14:anchorId="00E0AB4F" wp14:editId="4618A1AF">
                   <wp:extent cx="2766060" cy="2766060"/>
                   <wp:effectExtent l="0" t="0" r="0" b="0"/>
                   <wp:docPr id="11" name="Picture 11"/>
@@ -8303,7 +8772,7 @@
         </w:tc>
         <w:tc>
           <w:tcPr>
-            <w:tcW w:w="4710" w:type="dxa"/>
+            <w:tcW w:w="4954" w:type="dxa"/>
           </w:tcPr>
           <w:p>
             <w:pPr>
@@ -8324,7 +8793,7 @@
                 <w:lang w:eastAsia="en-IN" w:bidi="mr-IN"/>
               </w:rPr>
               <w:drawing>
-                <wp:inline distT="0" distB="0" distL="0" distR="0">
+                <wp:inline distT="0" distB="0" distL="0" distR="0" wp14:anchorId="39FF81F4" wp14:editId="1A29489B">
                   <wp:extent cx="2853690" cy="2853690"/>
                   <wp:effectExtent l="0" t="0" r="3810" b="3810"/>
                   <wp:docPr id="12" name="Picture 12"/>
@@ -8369,9 +8838,12 @@
         </w:tc>
       </w:tr>
       <w:tr>
-        <w:tc>
-          <w:tcPr>
-            <w:tcW w:w="4572" w:type="dxa"/>
+        <w:trPr>
+          <w:trHeight w:val="85"/>
+        </w:trPr>
+        <w:tc>
+          <w:tcPr>
+            <w:tcW w:w="4809" w:type="dxa"/>
             <w:vAlign w:val="center"/>
           </w:tcPr>
           <w:p>
@@ -8535,7 +9007,7 @@
         </w:tc>
         <w:tc>
           <w:tcPr>
-            <w:tcW w:w="4710" w:type="dxa"/>
+            <w:tcW w:w="4954" w:type="dxa"/>
           </w:tcPr>
           <w:p>
             <w:pPr>
@@ -8672,9 +9144,12 @@
         </w:tc>
       </w:tr>
       <w:tr>
-        <w:tc>
-          <w:tcPr>
-            <w:tcW w:w="4572" w:type="dxa"/>
+        <w:trPr>
+          <w:trHeight w:val="85"/>
+        </w:trPr>
+        <w:tc>
+          <w:tcPr>
+            <w:tcW w:w="4809" w:type="dxa"/>
             <w:vAlign w:val="center"/>
           </w:tcPr>
           <w:p>
@@ -8702,7 +9177,7 @@
         </w:tc>
         <w:tc>
           <w:tcPr>
-            <w:tcW w:w="4710" w:type="dxa"/>
+            <w:tcW w:w="4954" w:type="dxa"/>
           </w:tcPr>
           <w:p>
             <w:pPr>
@@ -8729,9 +9204,12 @@
         </w:tc>
       </w:tr>
       <w:tr>
-        <w:tc>
-          <w:tcPr>
-            <w:tcW w:w="4572" w:type="dxa"/>
+        <w:trPr>
+          <w:trHeight w:val="85"/>
+        </w:trPr>
+        <w:tc>
+          <w:tcPr>
+            <w:tcW w:w="4809" w:type="dxa"/>
             <w:vAlign w:val="center"/>
           </w:tcPr>
           <w:p>
@@ -8762,7 +9240,7 @@
         </w:tc>
         <w:tc>
           <w:tcPr>
-            <w:tcW w:w="4710" w:type="dxa"/>
+            <w:tcW w:w="4954" w:type="dxa"/>
           </w:tcPr>
           <w:p>
             <w:pPr>
@@ -8778,9 +9256,12 @@
         </w:tc>
       </w:tr>
       <w:tr>
-        <w:tc>
-          <w:tcPr>
-            <w:tcW w:w="4572" w:type="dxa"/>
+        <w:trPr>
+          <w:trHeight w:val="85"/>
+        </w:trPr>
+        <w:tc>
+          <w:tcPr>
+            <w:tcW w:w="4809" w:type="dxa"/>
             <w:vAlign w:val="center"/>
           </w:tcPr>
           <w:p>
@@ -8797,7 +9278,7 @@
         </w:tc>
         <w:tc>
           <w:tcPr>
-            <w:tcW w:w="4710" w:type="dxa"/>
+            <w:tcW w:w="4954" w:type="dxa"/>
           </w:tcPr>
           <w:p>
             <w:pPr>
@@ -8813,9 +9294,12 @@
         </w:tc>
       </w:tr>
       <w:tr>
-        <w:tc>
-          <w:tcPr>
-            <w:tcW w:w="4572" w:type="dxa"/>
+        <w:trPr>
+          <w:trHeight w:val="85"/>
+        </w:trPr>
+        <w:tc>
+          <w:tcPr>
+            <w:tcW w:w="4809" w:type="dxa"/>
             <w:vAlign w:val="center"/>
           </w:tcPr>
           <w:p>
@@ -8832,7 +9316,7 @@
         </w:tc>
         <w:tc>
           <w:tcPr>
-            <w:tcW w:w="4710" w:type="dxa"/>
+            <w:tcW w:w="4954" w:type="dxa"/>
           </w:tcPr>
           <w:p>
             <w:pPr>
@@ -8888,6 +9372,7 @@
           <w:sz w:val="24"/>
           <w:szCs w:val="24"/>
         </w:rPr>
+        <w:lastRenderedPageBreak/>
         <w:t xml:space="preserve">All above laboratories are having First-Aid kits, Purified Drinking Water Facility. Computer Engineering department also have separate facility of washrooms for faculty, girls and boys as well as </w:t>
       </w:r>
       <w:r>
@@ -9776,7 +10261,6 @@
                 <w:szCs w:val="24"/>
                 <w:lang w:eastAsia="en-IN" w:bidi="mr-IN"/>
               </w:rPr>
-              <w:lastRenderedPageBreak/>
               <w:t>2</w:t>
             </w:r>
           </w:p>
@@ -9816,18 +10300,16 @@
               </w:rPr>
               <w:t xml:space="preserve">Android App </w:t>
             </w:r>
-            <w:proofErr w:type="spellStart"/>
-            <w:r>
-              <w:rPr>
-                <w:rFonts w:ascii="Times New Roman" w:eastAsia="Times New Roman" w:hAnsi="Times New Roman" w:cs="Times New Roman"/>
-                <w:color w:val="1F1F1F"/>
-                <w:sz w:val="24"/>
-                <w:szCs w:val="24"/>
-                <w:lang w:eastAsia="en-IN" w:bidi="mr-IN"/>
-              </w:rPr>
-              <w:t>Developmant</w:t>
-            </w:r>
-            <w:proofErr w:type="spellEnd"/>
+            <w:r>
+              <w:rPr>
+                <w:rFonts w:ascii="Times New Roman" w:eastAsia="Times New Roman" w:hAnsi="Times New Roman" w:cs="Times New Roman"/>
+                <w:color w:val="1F1F1F"/>
+                <w:sz w:val="24"/>
+                <w:szCs w:val="24"/>
+                <w:lang w:eastAsia="en-IN" w:bidi="mr-IN"/>
+              </w:rPr>
+              <w:t>Development</w:t>
+            </w:r>
             <w:r>
               <w:rPr>
                 <w:rFonts w:ascii="Times New Roman" w:eastAsia="Times New Roman" w:hAnsi="Times New Roman" w:cs="Times New Roman"/>
@@ -10871,20 +11353,8 @@
                 <w:szCs w:val="24"/>
                 <w:lang w:eastAsia="en-IN" w:bidi="mr-IN"/>
               </w:rPr>
-              <w:t xml:space="preserve"> S. </w:t>
-            </w:r>
-            <w:proofErr w:type="spellStart"/>
-            <w:r>
-              <w:rPr>
-                <w:rFonts w:ascii="Times New Roman" w:eastAsia="Times New Roman" w:hAnsi="Times New Roman" w:cs="Times New Roman"/>
-                <w:color w:val="1F1F1F"/>
-                <w:sz w:val="24"/>
-                <w:szCs w:val="24"/>
-                <w:lang w:eastAsia="en-IN" w:bidi="mr-IN"/>
-              </w:rPr>
-              <w:t>Gund</w:t>
-            </w:r>
-            <w:proofErr w:type="spellEnd"/>
+              <w:t xml:space="preserve"> S. Gund</w:t>
+            </w:r>
           </w:p>
         </w:tc>
         <w:tc>
@@ -11173,20 +11643,8 @@
                 <w:szCs w:val="24"/>
                 <w:lang w:eastAsia="en-IN" w:bidi="mr-IN"/>
               </w:rPr>
-              <w:t xml:space="preserve"> S. </w:t>
-            </w:r>
-            <w:proofErr w:type="spellStart"/>
-            <w:r>
-              <w:rPr>
-                <w:rFonts w:ascii="Times New Roman" w:eastAsia="Times New Roman" w:hAnsi="Times New Roman" w:cs="Times New Roman"/>
-                <w:color w:val="1F1F1F"/>
-                <w:sz w:val="24"/>
-                <w:szCs w:val="24"/>
-                <w:lang w:eastAsia="en-IN" w:bidi="mr-IN"/>
-              </w:rPr>
-              <w:t>Gund</w:t>
-            </w:r>
-            <w:proofErr w:type="spellEnd"/>
+              <w:t xml:space="preserve"> S. Gund</w:t>
+            </w:r>
           </w:p>
         </w:tc>
         <w:tc>
@@ -11222,7 +11680,18 @@
                 <w:szCs w:val="24"/>
                 <w:lang w:eastAsia="en-IN" w:bidi="mr-IN"/>
               </w:rPr>
-              <w:t>Technical Laboratory Assistant</w:t>
+              <w:t>Technical Laboratory Assistan</w:t>
+            </w:r>
+            <w:r>
+              <w:rPr>
+                <w:rFonts w:ascii="Times New Roman" w:eastAsia="Times New Roman" w:hAnsi="Times New Roman" w:cs="Times New Roman"/>
+                <w:color w:val="1F1F1F"/>
+                <w:sz w:val="24"/>
+                <w:szCs w:val="24"/>
+                <w:lang w:eastAsia="en-IN" w:bidi="mr-IN"/>
+              </w:rPr>
+              <w:lastRenderedPageBreak/>
+              <w:t>t</w:t>
             </w:r>
           </w:p>
         </w:tc>
@@ -11259,6 +11728,7 @@
                 <w:szCs w:val="24"/>
                 <w:lang w:eastAsia="en-IN" w:bidi="mr-IN"/>
               </w:rPr>
+              <w:lastRenderedPageBreak/>
               <w:t>Diploma in IT</w:t>
             </w:r>
           </w:p>
@@ -11301,6 +11771,7 @@
                 <w:szCs w:val="24"/>
                 <w:lang w:eastAsia="en-IN" w:bidi="mr-IN"/>
               </w:rPr>
+              <w:lastRenderedPageBreak/>
               <w:t>7</w:t>
             </w:r>
           </w:p>
@@ -11475,20 +11946,8 @@
                 <w:szCs w:val="24"/>
                 <w:lang w:eastAsia="en-IN" w:bidi="mr-IN"/>
               </w:rPr>
-              <w:t xml:space="preserve"> S. </w:t>
-            </w:r>
-            <w:proofErr w:type="spellStart"/>
-            <w:r>
-              <w:rPr>
-                <w:rFonts w:ascii="Times New Roman" w:eastAsia="Times New Roman" w:hAnsi="Times New Roman" w:cs="Times New Roman"/>
-                <w:color w:val="1F1F1F"/>
-                <w:sz w:val="24"/>
-                <w:szCs w:val="24"/>
-                <w:lang w:eastAsia="en-IN" w:bidi="mr-IN"/>
-              </w:rPr>
-              <w:t>Gund</w:t>
-            </w:r>
-            <w:proofErr w:type="spellEnd"/>
+              <w:t xml:space="preserve"> S. Gund</w:t>
+            </w:r>
           </w:p>
         </w:tc>
         <w:tc>
@@ -11584,60 +12043,6 @@
           <w:lang w:val="en-US"/>
         </w:rPr>
       </w:pPr>
-    </w:p>
-    <w:p>
-      <w:pPr>
-        <w:widowControl w:val="0"/>
-        <w:tabs>
-          <w:tab w:val="left" w:pos="1525"/>
-        </w:tabs>
-        <w:autoSpaceDE w:val="0"/>
-        <w:autoSpaceDN w:val="0"/>
-        <w:spacing w:before="4" w:after="0" w:line="240" w:lineRule="auto"/>
-        <w:ind w:left="720"/>
-        <w:rPr>
-          <w:rFonts w:ascii="Times New Roman" w:eastAsia="Times New Roman" w:hAnsi="Times New Roman" w:cs="Times New Roman"/>
-          <w:sz w:val="24"/>
-          <w:szCs w:val="24"/>
-          <w:lang w:val="en-US"/>
-        </w:rPr>
-      </w:pPr>
-    </w:p>
-    <w:p>
-      <w:pPr>
-        <w:widowControl w:val="0"/>
-        <w:tabs>
-          <w:tab w:val="left" w:pos="1525"/>
-        </w:tabs>
-        <w:autoSpaceDE w:val="0"/>
-        <w:autoSpaceDN w:val="0"/>
-        <w:spacing w:before="4" w:after="0" w:line="240" w:lineRule="auto"/>
-        <w:ind w:left="720"/>
-        <w:rPr>
-          <w:rFonts w:ascii="Times New Roman" w:eastAsia="Times New Roman" w:hAnsi="Times New Roman" w:cs="Times New Roman"/>
-          <w:b/>
-          <w:sz w:val="24"/>
-          <w:szCs w:val="24"/>
-          <w:lang w:val="en-US"/>
-        </w:rPr>
-      </w:pPr>
-    </w:p>
-    <w:p>
-      <w:pPr>
-        <w:rPr>
-          <w:rFonts w:ascii="Times New Roman" w:hAnsi="Times New Roman" w:cs="Times New Roman"/>
-          <w:b/>
-          <w:sz w:val="24"/>
-        </w:rPr>
-      </w:pPr>
-      <w:r>
-        <w:rPr>
-          <w:rFonts w:ascii="Times New Roman" w:hAnsi="Times New Roman" w:cs="Times New Roman"/>
-          <w:b/>
-          <w:sz w:val="24"/>
-        </w:rPr>
-        <w:br w:type="page"/>
-      </w:r>
     </w:p>
     <w:p>
       <w:pPr>
@@ -11662,7 +12067,6 @@
           <w:sz w:val="24"/>
           <w:szCs w:val="24"/>
         </w:rPr>
-        <w:lastRenderedPageBreak/>
         <w:t>Additional facilities created for improving the quality of learning experience in laboratories (20)</w:t>
       </w:r>
     </w:p>
@@ -11772,24 +12176,25 @@
     <w:tbl>
       <w:tblPr>
         <w:tblW w:w="5000" w:type="pct"/>
+        <w:tblLayout w:type="fixed"/>
         <w:tblLook w:val="04A0" w:firstRow="1" w:lastRow="0" w:firstColumn="1" w:lastColumn="0" w:noHBand="0" w:noVBand="1"/>
       </w:tblPr>
       <w:tblGrid>
-        <w:gridCol w:w="556"/>
-        <w:gridCol w:w="1428"/>
-        <w:gridCol w:w="1354"/>
-        <w:gridCol w:w="1354"/>
-        <w:gridCol w:w="1972"/>
-        <w:gridCol w:w="1687"/>
-        <w:gridCol w:w="1057"/>
+        <w:gridCol w:w="554"/>
+        <w:gridCol w:w="1265"/>
+        <w:gridCol w:w="1710"/>
+        <w:gridCol w:w="1189"/>
+        <w:gridCol w:w="1961"/>
+        <w:gridCol w:w="1677"/>
+        <w:gridCol w:w="1052"/>
       </w:tblGrid>
       <w:tr>
         <w:trPr>
-          <w:trHeight w:val="930"/>
+          <w:trHeight w:val="1250"/>
         </w:trPr>
         <w:tc>
           <w:tcPr>
-            <w:tcW w:w="295" w:type="pct"/>
+            <w:tcW w:w="294" w:type="pct"/>
             <w:tcBorders>
               <w:top w:val="single" w:sz="4" w:space="0" w:color="auto"/>
               <w:left w:val="single" w:sz="4" w:space="0" w:color="auto"/>
@@ -11830,7 +12235,7 @@
         </w:tc>
         <w:tc>
           <w:tcPr>
-            <w:tcW w:w="759" w:type="pct"/>
+            <w:tcW w:w="672" w:type="pct"/>
             <w:tcBorders>
               <w:top w:val="single" w:sz="4" w:space="0" w:color="auto"/>
               <w:left w:val="nil"/>
@@ -11871,7 +12276,7 @@
         </w:tc>
         <w:tc>
           <w:tcPr>
-            <w:tcW w:w="720" w:type="pct"/>
+            <w:tcW w:w="909" w:type="pct"/>
             <w:tcBorders>
               <w:top w:val="single" w:sz="4" w:space="0" w:color="auto"/>
               <w:left w:val="nil"/>
@@ -11912,7 +12317,7 @@
         </w:tc>
         <w:tc>
           <w:tcPr>
-            <w:tcW w:w="720" w:type="pct"/>
+            <w:tcW w:w="632" w:type="pct"/>
             <w:tcBorders>
               <w:top w:val="single" w:sz="4" w:space="0" w:color="auto"/>
               <w:left w:val="nil"/>
@@ -11953,7 +12358,7 @@
         </w:tc>
         <w:tc>
           <w:tcPr>
-            <w:tcW w:w="1048" w:type="pct"/>
+            <w:tcW w:w="1042" w:type="pct"/>
             <w:tcBorders>
               <w:top w:val="single" w:sz="4" w:space="0" w:color="auto"/>
               <w:left w:val="nil"/>
@@ -11994,7 +12399,7 @@
         </w:tc>
         <w:tc>
           <w:tcPr>
-            <w:tcW w:w="897" w:type="pct"/>
+            <w:tcW w:w="891" w:type="pct"/>
             <w:tcBorders>
               <w:top w:val="single" w:sz="4" w:space="0" w:color="auto"/>
               <w:left w:val="nil"/>
@@ -12025,8 +12430,6 @@
                 <w:b/>
                 <w:bCs/>
                 <w:color w:val="1F1F1F"/>
-                <w:sz w:val="24"/>
-                <w:szCs w:val="24"/>
                 <w:lang w:eastAsia="en-IN" w:bidi="mr-IN"/>
               </w:rPr>
               <w:t>Area in which students are exposed to have enhanced learning</w:t>
@@ -12035,7 +12438,7 @@
         </w:tc>
         <w:tc>
           <w:tcPr>
-            <w:tcW w:w="562" w:type="pct"/>
+            <w:tcW w:w="559" w:type="pct"/>
             <w:tcBorders>
               <w:top w:val="single" w:sz="4" w:space="0" w:color="auto"/>
               <w:left w:val="nil"/>
@@ -12081,7 +12484,7 @@
         </w:trPr>
         <w:tc>
           <w:tcPr>
-            <w:tcW w:w="295" w:type="pct"/>
+            <w:tcW w:w="294" w:type="pct"/>
             <w:tcBorders>
               <w:top w:val="nil"/>
               <w:left w:val="single" w:sz="4" w:space="0" w:color="auto"/>
@@ -12118,7 +12521,7 @@
         </w:tc>
         <w:tc>
           <w:tcPr>
-            <w:tcW w:w="759" w:type="pct"/>
+            <w:tcW w:w="672" w:type="pct"/>
             <w:tcBorders>
               <w:top w:val="nil"/>
               <w:left w:val="nil"/>
@@ -12155,7 +12558,7 @@
         </w:tc>
         <w:tc>
           <w:tcPr>
-            <w:tcW w:w="720" w:type="pct"/>
+            <w:tcW w:w="909" w:type="pct"/>
             <w:tcBorders>
               <w:top w:val="nil"/>
               <w:left w:val="nil"/>
@@ -12173,17 +12576,16 @@
               <w:rPr>
                 <w:rFonts w:ascii="Times New Roman" w:eastAsia="Times New Roman" w:hAnsi="Times New Roman" w:cs="Times New Roman"/>
                 <w:color w:val="1F1F1F"/>
-                <w:sz w:val="24"/>
-                <w:szCs w:val="24"/>
-                <w:lang w:eastAsia="en-IN" w:bidi="mr-IN"/>
-              </w:rPr>
-            </w:pPr>
-            <w:r>
-              <w:rPr>
-                <w:rFonts w:ascii="Times New Roman" w:eastAsia="Times New Roman" w:hAnsi="Times New Roman" w:cs="Times New Roman"/>
-                <w:color w:val="1F1F1F"/>
-                <w:sz w:val="24"/>
-                <w:szCs w:val="24"/>
+                <w:sz w:val="21"/>
+                <w:szCs w:val="21"/>
+                <w:lang w:eastAsia="en-IN" w:bidi="mr-IN"/>
+              </w:rPr>
+            </w:pPr>
+            <w:r>
+              <w:rPr>
+                <w:rFonts w:ascii="Times New Roman" w:eastAsia="Times New Roman" w:hAnsi="Times New Roman" w:cs="Times New Roman"/>
+                <w:sz w:val="21"/>
+                <w:szCs w:val="21"/>
                 <w:lang w:eastAsia="en-IN" w:bidi="mr-IN"/>
               </w:rPr>
               <w:t xml:space="preserve">Facility for </w:t>
@@ -12191,9 +12593,8 @@
             <w:r>
               <w:rPr>
                 <w:rFonts w:ascii="Times New Roman" w:eastAsia="Times New Roman" w:hAnsi="Times New Roman" w:cs="Times New Roman"/>
-                <w:color w:val="1F1F1F"/>
-                <w:sz w:val="24"/>
-                <w:szCs w:val="24"/>
+                <w:sz w:val="21"/>
+                <w:szCs w:val="21"/>
                 <w:lang w:eastAsia="en-IN" w:bidi="mr-IN"/>
               </w:rPr>
               <w:t>Conduct</w:t>
@@ -12201,9 +12602,8 @@
             <w:r>
               <w:rPr>
                 <w:rFonts w:ascii="Times New Roman" w:eastAsia="Times New Roman" w:hAnsi="Times New Roman" w:cs="Times New Roman"/>
-                <w:color w:val="1F1F1F"/>
-                <w:sz w:val="24"/>
-                <w:szCs w:val="24"/>
+                <w:sz w:val="21"/>
+                <w:szCs w:val="21"/>
                 <w:lang w:eastAsia="en-IN" w:bidi="mr-IN"/>
               </w:rPr>
               <w:t xml:space="preserve"> of MSBTE Online Examination is available. All In One Computers with Web-Cameras, High-Speed Internet, AC, CCTV Cameras, </w:t>
@@ -12213,9 +12613,8 @@
             <w:r>
               <w:rPr>
                 <w:rFonts w:ascii="Times New Roman" w:eastAsia="Times New Roman" w:hAnsi="Times New Roman" w:cs="Times New Roman"/>
-                <w:color w:val="1F1F1F"/>
-                <w:sz w:val="24"/>
-                <w:szCs w:val="24"/>
+                <w:sz w:val="21"/>
+                <w:szCs w:val="21"/>
                 <w:lang w:eastAsia="en-IN" w:bidi="mr-IN"/>
               </w:rPr>
               <w:t>WiFi</w:t>
@@ -12225,18 +12624,27 @@
             <w:r>
               <w:rPr>
                 <w:rFonts w:ascii="Times New Roman" w:eastAsia="Times New Roman" w:hAnsi="Times New Roman" w:cs="Times New Roman"/>
-                <w:color w:val="1F1F1F"/>
-                <w:sz w:val="24"/>
-                <w:szCs w:val="24"/>
-                <w:lang w:eastAsia="en-IN" w:bidi="mr-IN"/>
-              </w:rPr>
-              <w:t xml:space="preserve"> Facilities are provided.</w:t>
-            </w:r>
-          </w:p>
-        </w:tc>
-        <w:tc>
-          <w:tcPr>
-            <w:tcW w:w="720" w:type="pct"/>
+                <w:sz w:val="21"/>
+                <w:szCs w:val="21"/>
+                <w:lang w:eastAsia="en-IN" w:bidi="mr-IN"/>
+              </w:rPr>
+              <w:t xml:space="preserve"> Facilities are provided</w:t>
+            </w:r>
+            <w:r>
+              <w:rPr>
+                <w:rFonts w:ascii="Times New Roman" w:eastAsia="Times New Roman" w:hAnsi="Times New Roman" w:cs="Times New Roman"/>
+                <w:color w:val="1F1F1F"/>
+                <w:sz w:val="21"/>
+                <w:szCs w:val="21"/>
+                <w:lang w:eastAsia="en-IN" w:bidi="mr-IN"/>
+              </w:rPr>
+              <w:t>.</w:t>
+            </w:r>
+          </w:p>
+        </w:tc>
+        <w:tc>
+          <w:tcPr>
+            <w:tcW w:w="632" w:type="pct"/>
             <w:tcBorders>
               <w:top w:val="nil"/>
               <w:left w:val="nil"/>
@@ -12267,13 +12675,25 @@
                 <w:szCs w:val="24"/>
                 <w:lang w:eastAsia="en-IN" w:bidi="mr-IN"/>
               </w:rPr>
-              <w:t>Used for MSBTE Examination as well as Baseline Test conducted by MSBTE each semester.</w:t>
-            </w:r>
-          </w:p>
-        </w:tc>
-        <w:tc>
-          <w:tcPr>
-            <w:tcW w:w="1048" w:type="pct"/>
+              <w:t>Used for MSBTE Examination as well as Baseline Test conducted by MSB</w:t>
+            </w:r>
+            <w:bookmarkStart w:id="0" w:name="_GoBack"/>
+            <w:bookmarkEnd w:id="0"/>
+            <w:r>
+              <w:rPr>
+                <w:rFonts w:ascii="Times New Roman" w:eastAsia="Times New Roman" w:hAnsi="Times New Roman" w:cs="Times New Roman"/>
+                <w:color w:val="1F1F1F"/>
+                <w:sz w:val="24"/>
+                <w:szCs w:val="24"/>
+                <w:lang w:eastAsia="en-IN" w:bidi="mr-IN"/>
+              </w:rPr>
+              <w:t>TE each semester.</w:t>
+            </w:r>
+          </w:p>
+        </w:tc>
+        <w:tc>
+          <w:tcPr>
+            <w:tcW w:w="1042" w:type="pct"/>
             <w:tcBorders>
               <w:top w:val="nil"/>
               <w:left w:val="nil"/>
@@ -12354,7 +12774,7 @@
         </w:tc>
         <w:tc>
           <w:tcPr>
-            <w:tcW w:w="897" w:type="pct"/>
+            <w:tcW w:w="891" w:type="pct"/>
             <w:tcBorders>
               <w:top w:val="nil"/>
               <w:left w:val="nil"/>
@@ -12391,7 +12811,7 @@
         </w:tc>
         <w:tc>
           <w:tcPr>
-            <w:tcW w:w="562" w:type="pct"/>
+            <w:tcW w:w="559" w:type="pct"/>
             <w:tcBorders>
               <w:top w:val="nil"/>
               <w:left w:val="nil"/>
@@ -12433,7 +12853,7 @@
         </w:trPr>
         <w:tc>
           <w:tcPr>
-            <w:tcW w:w="295" w:type="pct"/>
+            <w:tcW w:w="294" w:type="pct"/>
             <w:tcBorders>
               <w:top w:val="nil"/>
               <w:left w:val="single" w:sz="4" w:space="0" w:color="auto"/>
@@ -12469,7 +12889,7 @@
         </w:tc>
         <w:tc>
           <w:tcPr>
-            <w:tcW w:w="759" w:type="pct"/>
+            <w:tcW w:w="672" w:type="pct"/>
             <w:tcBorders>
               <w:top w:val="nil"/>
               <w:left w:val="nil"/>
@@ -12505,7 +12925,7 @@
         </w:tc>
         <w:tc>
           <w:tcPr>
-            <w:tcW w:w="720" w:type="pct"/>
+            <w:tcW w:w="909" w:type="pct"/>
             <w:tcBorders>
               <w:top w:val="nil"/>
               <w:left w:val="nil"/>
@@ -12531,17 +12951,15 @@
               <w:rPr>
                 <w:rFonts w:ascii="Times New Roman" w:eastAsia="Times New Roman" w:hAnsi="Times New Roman" w:cs="Times New Roman"/>
                 <w:color w:val="1F1F1F"/>
-                <w:sz w:val="24"/>
-                <w:szCs w:val="24"/>
-                <w:lang w:eastAsia="en-IN" w:bidi="mr-IN"/>
-              </w:rPr>
-              <w:t>Collection of subject-specific textbooks, reference books, project reports,</w:t>
-            </w:r>
-          </w:p>
-        </w:tc>
-        <w:tc>
-          <w:tcPr>
-            <w:tcW w:w="720" w:type="pct"/>
+                <w:lang w:eastAsia="en-IN" w:bidi="mr-IN"/>
+              </w:rPr>
+              <w:t>Project reports, Specimen copies of books, Specimen copies Manuals, Seminar Reports</w:t>
+            </w:r>
+          </w:p>
+        </w:tc>
+        <w:tc>
+          <w:tcPr>
+            <w:tcW w:w="632" w:type="pct"/>
             <w:tcBorders>
               <w:top w:val="nil"/>
               <w:left w:val="nil"/>
@@ -12567,17 +12985,25 @@
               <w:rPr>
                 <w:rFonts w:ascii="Times New Roman" w:eastAsia="Times New Roman" w:hAnsi="Times New Roman" w:cs="Times New Roman"/>
                 <w:color w:val="1F1F1F"/>
-                <w:sz w:val="24"/>
-                <w:szCs w:val="24"/>
-                <w:lang w:eastAsia="en-IN" w:bidi="mr-IN"/>
-              </w:rPr>
-              <w:t>To provide localized, specialized academic resources for quick reference.</w:t>
-            </w:r>
-          </w:p>
-        </w:tc>
-        <w:tc>
-          <w:tcPr>
-            <w:tcW w:w="1048" w:type="pct"/>
+                <w:lang w:eastAsia="en-IN" w:bidi="mr-IN"/>
+              </w:rPr>
+              <w:t>To get deep knowledge using reference books and textbooks</w:t>
+            </w:r>
+            <w:r>
+              <w:rPr>
+                <w:rFonts w:ascii="Times New Roman" w:eastAsia="Times New Roman" w:hAnsi="Times New Roman" w:cs="Times New Roman"/>
+                <w:color w:val="1F1F1F"/>
+                <w:sz w:val="24"/>
+                <w:szCs w:val="24"/>
+                <w:lang w:eastAsia="en-IN" w:bidi="mr-IN"/>
+              </w:rPr>
+              <w:t>.</w:t>
+            </w:r>
+          </w:p>
+        </w:tc>
+        <w:tc>
+          <w:tcPr>
+            <w:tcW w:w="1042" w:type="pct"/>
             <w:tcBorders>
               <w:top w:val="nil"/>
               <w:left w:val="nil"/>
@@ -12607,53 +13033,13 @@
                 <w:szCs w:val="24"/>
                 <w:lang w:eastAsia="en-IN" w:bidi="mr-IN"/>
               </w:rPr>
-              <w:t xml:space="preserve">Used by students for </w:t>
-            </w:r>
-            <w:r>
-              <w:rPr>
-                <w:rFonts w:ascii="Times New Roman" w:eastAsia="Times New Roman" w:hAnsi="Times New Roman" w:cs="Times New Roman"/>
-                <w:color w:val="1F1F1F"/>
-                <w:sz w:val="24"/>
-                <w:szCs w:val="24"/>
-                <w:lang w:eastAsia="en-IN" w:bidi="mr-IN"/>
-              </w:rPr>
-              <w:t>references</w:t>
-            </w:r>
-            <w:r>
-              <w:rPr>
-                <w:rFonts w:ascii="Times New Roman" w:eastAsia="Times New Roman" w:hAnsi="Times New Roman" w:cs="Times New Roman"/>
-                <w:color w:val="1F1F1F"/>
-                <w:sz w:val="24"/>
-                <w:szCs w:val="24"/>
-                <w:lang w:eastAsia="en-IN" w:bidi="mr-IN"/>
-              </w:rPr>
-              <w:t xml:space="preserve"> to</w:t>
-            </w:r>
-            <w:r>
-              <w:rPr>
-                <w:rFonts w:ascii="Times New Roman" w:eastAsia="Times New Roman" w:hAnsi="Times New Roman" w:cs="Times New Roman"/>
-                <w:color w:val="1F1F1F"/>
-                <w:sz w:val="24"/>
-                <w:szCs w:val="24"/>
-                <w:lang w:eastAsia="en-IN" w:bidi="mr-IN"/>
-              </w:rPr>
-              <w:t xml:space="preserve"> </w:t>
-            </w:r>
-            <w:r>
-              <w:rPr>
-                <w:rFonts w:ascii="Times New Roman" w:eastAsia="Times New Roman" w:hAnsi="Times New Roman" w:cs="Times New Roman"/>
-                <w:color w:val="1F1F1F"/>
-                <w:sz w:val="24"/>
-                <w:szCs w:val="24"/>
-                <w:lang w:eastAsia="en-IN" w:bidi="mr-IN"/>
-              </w:rPr>
-              <w:t xml:space="preserve"> Project reports</w:t>
-            </w:r>
-          </w:p>
-        </w:tc>
-        <w:tc>
-          <w:tcPr>
-            <w:tcW w:w="897" w:type="pct"/>
+              <w:t>Used by students for references to  Project reports</w:t>
+            </w:r>
+          </w:p>
+        </w:tc>
+        <w:tc>
+          <w:tcPr>
+            <w:tcW w:w="891" w:type="pct"/>
             <w:tcBorders>
               <w:top w:val="nil"/>
               <w:left w:val="nil"/>
@@ -12670,26 +13056,144 @@
               <w:rPr>
                 <w:rFonts w:ascii="Times New Roman" w:eastAsia="Times New Roman" w:hAnsi="Times New Roman" w:cs="Times New Roman"/>
                 <w:color w:val="1F1F1F"/>
-                <w:sz w:val="24"/>
-                <w:szCs w:val="24"/>
-                <w:lang w:eastAsia="en-IN" w:bidi="mr-IN"/>
-              </w:rPr>
-            </w:pPr>
-            <w:r>
-              <w:rPr>
-                <w:rFonts w:ascii="Times New Roman" w:eastAsia="Times New Roman" w:hAnsi="Times New Roman" w:cs="Times New Roman"/>
-                <w:color w:val="1F1F1F"/>
-                <w:sz w:val="24"/>
-                <w:szCs w:val="24"/>
-                <w:lang w:eastAsia="en-IN" w:bidi="mr-IN"/>
-              </w:rPr>
-              <w:t>In-depth subject knowledge and literature review skills.</w:t>
-            </w:r>
-          </w:p>
-        </w:tc>
-        <w:tc>
-          <w:tcPr>
-            <w:tcW w:w="562" w:type="pct"/>
+                <w:lang w:eastAsia="en-IN" w:bidi="mr-IN"/>
+              </w:rPr>
+            </w:pPr>
+            <w:r>
+              <w:rPr>
+                <w:rFonts w:ascii="Times New Roman" w:eastAsia="Times New Roman" w:hAnsi="Times New Roman" w:cs="Times New Roman"/>
+                <w:color w:val="1F1F1F"/>
+                <w:lang w:eastAsia="en-IN" w:bidi="mr-IN"/>
+              </w:rPr>
+              <w:t>In</w:t>
+            </w:r>
+            <w:r>
+              <w:rPr>
+                <w:rFonts w:ascii="Times New Roman" w:eastAsia="Times New Roman" w:hAnsi="Times New Roman" w:cs="Times New Roman"/>
+                <w:color w:val="1F1F1F"/>
+                <w:lang w:eastAsia="en-IN" w:bidi="mr-IN"/>
+              </w:rPr>
+              <w:t>-depth subject knowledge and literature review skills.</w:t>
+            </w:r>
+            <w:r>
+              <w:rPr>
+                <w:sz w:val="20"/>
+                <w:szCs w:val="20"/>
+              </w:rPr>
+              <w:t xml:space="preserve"> </w:t>
+            </w:r>
+          </w:p>
+          <w:p>
+            <w:pPr>
+              <w:spacing w:after="0" w:line="240" w:lineRule="auto"/>
+              <w:jc w:val="center"/>
+              <w:rPr>
+                <w:rFonts w:ascii="Times New Roman" w:eastAsia="Times New Roman" w:hAnsi="Times New Roman" w:cs="Times New Roman"/>
+                <w:color w:val="1F1F1F"/>
+                <w:lang w:eastAsia="en-IN" w:bidi="mr-IN"/>
+              </w:rPr>
+            </w:pPr>
+            <w:r>
+              <w:rPr>
+                <w:rFonts w:ascii="Times New Roman" w:eastAsia="Times New Roman" w:hAnsi="Times New Roman" w:cs="Times New Roman"/>
+                <w:color w:val="1F1F1F"/>
+                <w:lang w:eastAsia="en-IN" w:bidi="mr-IN"/>
+              </w:rPr>
+              <w:t>Self-</w:t>
+            </w:r>
+          </w:p>
+          <w:p>
+            <w:pPr>
+              <w:spacing w:after="0" w:line="240" w:lineRule="auto"/>
+              <w:jc w:val="center"/>
+              <w:rPr>
+                <w:rFonts w:ascii="Times New Roman" w:eastAsia="Times New Roman" w:hAnsi="Times New Roman" w:cs="Times New Roman"/>
+                <w:color w:val="1F1F1F"/>
+                <w:lang w:eastAsia="en-IN" w:bidi="mr-IN"/>
+              </w:rPr>
+            </w:pPr>
+            <w:r>
+              <w:rPr>
+                <w:rFonts w:ascii="Times New Roman" w:eastAsia="Times New Roman" w:hAnsi="Times New Roman" w:cs="Times New Roman"/>
+                <w:color w:val="1F1F1F"/>
+                <w:lang w:eastAsia="en-IN" w:bidi="mr-IN"/>
+              </w:rPr>
+              <w:t>learning, project</w:t>
+            </w:r>
+          </w:p>
+          <w:p>
+            <w:pPr>
+              <w:spacing w:after="0" w:line="240" w:lineRule="auto"/>
+              <w:jc w:val="center"/>
+              <w:rPr>
+                <w:rFonts w:ascii="Times New Roman" w:eastAsia="Times New Roman" w:hAnsi="Times New Roman" w:cs="Times New Roman"/>
+                <w:color w:val="1F1F1F"/>
+                <w:lang w:eastAsia="en-IN" w:bidi="mr-IN"/>
+              </w:rPr>
+            </w:pPr>
+            <w:r>
+              <w:rPr>
+                <w:rFonts w:ascii="Times New Roman" w:eastAsia="Times New Roman" w:hAnsi="Times New Roman" w:cs="Times New Roman"/>
+                <w:color w:val="1F1F1F"/>
+                <w:lang w:eastAsia="en-IN" w:bidi="mr-IN"/>
+              </w:rPr>
+              <w:t>work, paper</w:t>
+            </w:r>
+          </w:p>
+          <w:p>
+            <w:pPr>
+              <w:spacing w:after="0" w:line="240" w:lineRule="auto"/>
+              <w:jc w:val="center"/>
+              <w:rPr>
+                <w:rFonts w:ascii="Times New Roman" w:eastAsia="Times New Roman" w:hAnsi="Times New Roman" w:cs="Times New Roman"/>
+                <w:color w:val="1F1F1F"/>
+                <w:lang w:eastAsia="en-IN" w:bidi="mr-IN"/>
+              </w:rPr>
+            </w:pPr>
+            <w:r>
+              <w:rPr>
+                <w:rFonts w:ascii="Times New Roman" w:eastAsia="Times New Roman" w:hAnsi="Times New Roman" w:cs="Times New Roman"/>
+                <w:color w:val="1F1F1F"/>
+                <w:lang w:eastAsia="en-IN" w:bidi="mr-IN"/>
+              </w:rPr>
+              <w:t>presentation,</w:t>
+            </w:r>
+          </w:p>
+          <w:p>
+            <w:pPr>
+              <w:spacing w:after="0" w:line="240" w:lineRule="auto"/>
+              <w:jc w:val="center"/>
+              <w:rPr>
+                <w:rFonts w:ascii="Times New Roman" w:eastAsia="Times New Roman" w:hAnsi="Times New Roman" w:cs="Times New Roman"/>
+                <w:color w:val="1F1F1F"/>
+                <w:sz w:val="24"/>
+                <w:szCs w:val="24"/>
+                <w:lang w:eastAsia="en-IN" w:bidi="mr-IN"/>
+              </w:rPr>
+            </w:pPr>
+            <w:r>
+              <w:rPr>
+                <w:rFonts w:ascii="Times New Roman" w:eastAsia="Times New Roman" w:hAnsi="Times New Roman" w:cs="Times New Roman"/>
+                <w:color w:val="1F1F1F"/>
+                <w:lang w:eastAsia="en-IN" w:bidi="mr-IN"/>
+              </w:rPr>
+              <w:t xml:space="preserve">seminars </w:t>
+            </w:r>
+            <w:proofErr w:type="spellStart"/>
+            <w:r>
+              <w:rPr>
+                <w:rFonts w:ascii="Times New Roman" w:eastAsia="Times New Roman" w:hAnsi="Times New Roman" w:cs="Times New Roman"/>
+                <w:color w:val="1F1F1F"/>
+                <w:lang w:eastAsia="en-IN" w:bidi="mr-IN"/>
+              </w:rPr>
+              <w:t>etc</w:t>
+            </w:r>
+            <w:proofErr w:type="spellEnd"/>
+          </w:p>
+        </w:tc>
+        <w:tc>
+          <w:tcPr>
+            <w:tcW w:w="559" w:type="pct"/>
             <w:tcBorders>
               <w:top w:val="nil"/>
               <w:left w:val="nil"/>
@@ -12719,7 +13223,27 @@
                 <w:szCs w:val="24"/>
                 <w:lang w:eastAsia="en-IN" w:bidi="mr-IN"/>
               </w:rPr>
-              <w:t>PO 1, PO 2, PSO 1</w:t>
+              <w:t>PO 1, PO 2,</w:t>
+            </w:r>
+            <w:r>
+              <w:rPr>
+                <w:rFonts w:ascii="Times New Roman" w:eastAsia="Times New Roman" w:hAnsi="Times New Roman" w:cs="Times New Roman"/>
+                <w:color w:val="1F1F1F"/>
+                <w:sz w:val="24"/>
+                <w:szCs w:val="24"/>
+                <w:lang w:eastAsia="en-IN" w:bidi="mr-IN"/>
+              </w:rPr>
+              <w:t xml:space="preserve"> PO6, PO7,</w:t>
+            </w:r>
+            <w:r>
+              <w:rPr>
+                <w:rFonts w:ascii="Times New Roman" w:eastAsia="Times New Roman" w:hAnsi="Times New Roman" w:cs="Times New Roman"/>
+                <w:color w:val="1F1F1F"/>
+                <w:sz w:val="24"/>
+                <w:szCs w:val="24"/>
+                <w:lang w:eastAsia="en-IN" w:bidi="mr-IN"/>
+              </w:rPr>
+              <w:t xml:space="preserve"> PSO 1</w:t>
             </w:r>
           </w:p>
         </w:tc>
@@ -12730,7 +13254,7 @@
         </w:trPr>
         <w:tc>
           <w:tcPr>
-            <w:tcW w:w="295" w:type="pct"/>
+            <w:tcW w:w="294" w:type="pct"/>
             <w:tcBorders>
               <w:top w:val="nil"/>
               <w:left w:val="single" w:sz="4" w:space="0" w:color="auto"/>
@@ -12766,7 +13290,7 @@
         </w:tc>
         <w:tc>
           <w:tcPr>
-            <w:tcW w:w="759" w:type="pct"/>
+            <w:tcW w:w="672" w:type="pct"/>
             <w:tcBorders>
               <w:top w:val="nil"/>
               <w:left w:val="nil"/>
@@ -12794,7 +13318,6 @@
                 <w:color w:val="1F1F1F"/>
                 <w:sz w:val="24"/>
                 <w:szCs w:val="24"/>
-                <w:highlight w:val="yellow"/>
                 <w:lang w:eastAsia="en-IN" w:bidi="mr-IN"/>
               </w:rPr>
               <w:t>Seminar Hall (MB-CAD-CAM Lab.)</w:t>
@@ -12803,7 +13326,7 @@
         </w:tc>
         <w:tc>
           <w:tcPr>
-            <w:tcW w:w="720" w:type="pct"/>
+            <w:tcW w:w="909" w:type="pct"/>
             <w:tcBorders>
               <w:top w:val="nil"/>
               <w:left w:val="nil"/>
@@ -12825,11 +13348,21 @@
                 <w:lang w:eastAsia="en-IN" w:bidi="mr-IN"/>
               </w:rPr>
             </w:pPr>
-          </w:p>
-        </w:tc>
-        <w:tc>
-          <w:tcPr>
-            <w:tcW w:w="720" w:type="pct"/>
+            <w:r>
+              <w:rPr>
+                <w:rFonts w:ascii="Times New Roman" w:eastAsia="Times New Roman" w:hAnsi="Times New Roman" w:cs="Times New Roman"/>
+                <w:color w:val="1F1F1F"/>
+                <w:sz w:val="24"/>
+                <w:szCs w:val="24"/>
+                <w:lang w:eastAsia="en-IN" w:bidi="mr-IN"/>
+              </w:rPr>
+              <w:t xml:space="preserve">LCD Projector, Screen, AC facility, Chairs are available </w:t>
+            </w:r>
+          </w:p>
+        </w:tc>
+        <w:tc>
+          <w:tcPr>
+            <w:tcW w:w="632" w:type="pct"/>
             <w:tcBorders>
               <w:top w:val="nil"/>
               <w:left w:val="nil"/>
@@ -12846,16 +13379,116 @@
               <w:rPr>
                 <w:rFonts w:ascii="Times New Roman" w:eastAsia="Times New Roman" w:hAnsi="Times New Roman" w:cs="Times New Roman"/>
                 <w:color w:val="1F1F1F"/>
-                <w:sz w:val="24"/>
-                <w:szCs w:val="24"/>
-                <w:lang w:eastAsia="en-IN" w:bidi="mr-IN"/>
-              </w:rPr>
-            </w:pPr>
-          </w:p>
-        </w:tc>
-        <w:tc>
-          <w:tcPr>
-            <w:tcW w:w="1048" w:type="pct"/>
+                <w:lang w:eastAsia="en-IN" w:bidi="mr-IN"/>
+              </w:rPr>
+            </w:pPr>
+            <w:r>
+              <w:rPr>
+                <w:rFonts w:ascii="Times New Roman" w:eastAsia="Times New Roman" w:hAnsi="Times New Roman" w:cs="Times New Roman"/>
+                <w:color w:val="1F1F1F"/>
+                <w:lang w:eastAsia="en-IN" w:bidi="mr-IN"/>
+              </w:rPr>
+              <w:t>Presentation</w:t>
+            </w:r>
+          </w:p>
+          <w:p>
+            <w:pPr>
+              <w:spacing w:after="0" w:line="240" w:lineRule="auto"/>
+              <w:jc w:val="center"/>
+              <w:rPr>
+                <w:rFonts w:ascii="Times New Roman" w:eastAsia="Times New Roman" w:hAnsi="Times New Roman" w:cs="Times New Roman"/>
+                <w:color w:val="1F1F1F"/>
+                <w:lang w:eastAsia="en-IN" w:bidi="mr-IN"/>
+              </w:rPr>
+            </w:pPr>
+            <w:r>
+              <w:rPr>
+                <w:rFonts w:ascii="Times New Roman" w:eastAsia="Times New Roman" w:hAnsi="Times New Roman" w:cs="Times New Roman"/>
+                <w:color w:val="1F1F1F"/>
+                <w:lang w:eastAsia="en-IN" w:bidi="mr-IN"/>
+              </w:rPr>
+              <w:t>on,</w:t>
+            </w:r>
+          </w:p>
+          <w:p>
+            <w:pPr>
+              <w:spacing w:after="0" w:line="240" w:lineRule="auto"/>
+              <w:jc w:val="center"/>
+              <w:rPr>
+                <w:rFonts w:ascii="Times New Roman" w:eastAsia="Times New Roman" w:hAnsi="Times New Roman" w:cs="Times New Roman"/>
+                <w:color w:val="1F1F1F"/>
+                <w:lang w:eastAsia="en-IN" w:bidi="mr-IN"/>
+              </w:rPr>
+            </w:pPr>
+            <w:r>
+              <w:rPr>
+                <w:rFonts w:ascii="Times New Roman" w:eastAsia="Times New Roman" w:hAnsi="Times New Roman" w:cs="Times New Roman"/>
+                <w:color w:val="1F1F1F"/>
+                <w:lang w:eastAsia="en-IN" w:bidi="mr-IN"/>
+              </w:rPr>
+              <w:t>Seminar,</w:t>
+            </w:r>
+          </w:p>
+          <w:p>
+            <w:pPr>
+              <w:spacing w:after="0" w:line="240" w:lineRule="auto"/>
+              <w:jc w:val="center"/>
+              <w:rPr>
+                <w:rFonts w:ascii="Times New Roman" w:eastAsia="Times New Roman" w:hAnsi="Times New Roman" w:cs="Times New Roman"/>
+                <w:color w:val="1F1F1F"/>
+                <w:lang w:eastAsia="en-IN" w:bidi="mr-IN"/>
+              </w:rPr>
+            </w:pPr>
+            <w:r>
+              <w:rPr>
+                <w:rFonts w:ascii="Times New Roman" w:eastAsia="Times New Roman" w:hAnsi="Times New Roman" w:cs="Times New Roman"/>
+                <w:color w:val="1F1F1F"/>
+                <w:lang w:eastAsia="en-IN" w:bidi="mr-IN"/>
+              </w:rPr>
+              <w:t>Project,</w:t>
+            </w:r>
+          </w:p>
+          <w:p>
+            <w:pPr>
+              <w:spacing w:after="0" w:line="240" w:lineRule="auto"/>
+              <w:jc w:val="center"/>
+              <w:rPr>
+                <w:rFonts w:ascii="Times New Roman" w:eastAsia="Times New Roman" w:hAnsi="Times New Roman" w:cs="Times New Roman"/>
+                <w:color w:val="1F1F1F"/>
+                <w:lang w:eastAsia="en-IN" w:bidi="mr-IN"/>
+              </w:rPr>
+            </w:pPr>
+            <w:r>
+              <w:rPr>
+                <w:rFonts w:ascii="Times New Roman" w:eastAsia="Times New Roman" w:hAnsi="Times New Roman" w:cs="Times New Roman"/>
+                <w:color w:val="1F1F1F"/>
+                <w:lang w:eastAsia="en-IN" w:bidi="mr-IN"/>
+              </w:rPr>
+              <w:t>Guest</w:t>
+            </w:r>
+            <w:r>
+              <w:rPr>
+                <w:rFonts w:ascii="Times New Roman" w:eastAsia="Times New Roman" w:hAnsi="Times New Roman" w:cs="Times New Roman"/>
+                <w:color w:val="1F1F1F"/>
+                <w:lang w:eastAsia="en-IN" w:bidi="mr-IN"/>
+              </w:rPr>
+              <w:t xml:space="preserve">/Expert Lecture </w:t>
+            </w:r>
+            <w:proofErr w:type="spellStart"/>
+            <w:r>
+              <w:rPr>
+                <w:rFonts w:ascii="Times New Roman" w:eastAsia="Times New Roman" w:hAnsi="Times New Roman" w:cs="Times New Roman"/>
+                <w:color w:val="1F1F1F"/>
+                <w:lang w:eastAsia="en-IN" w:bidi="mr-IN"/>
+              </w:rPr>
+              <w:t>etc</w:t>
+            </w:r>
+            <w:proofErr w:type="spellEnd"/>
+          </w:p>
+        </w:tc>
+        <w:tc>
+          <w:tcPr>
+            <w:tcW w:w="1042" w:type="pct"/>
             <w:tcBorders>
               <w:top w:val="nil"/>
               <w:left w:val="nil"/>
@@ -12877,11 +13510,64 @@
                 <w:lang w:eastAsia="en-IN" w:bidi="mr-IN"/>
               </w:rPr>
             </w:pPr>
-          </w:p>
-        </w:tc>
-        <w:tc>
-          <w:tcPr>
-            <w:tcW w:w="897" w:type="pct"/>
+            <w:r>
+              <w:rPr>
+                <w:rFonts w:ascii="Times New Roman" w:eastAsia="Times New Roman" w:hAnsi="Times New Roman" w:cs="Times New Roman"/>
+                <w:color w:val="1F1F1F"/>
+                <w:sz w:val="24"/>
+                <w:szCs w:val="24"/>
+                <w:lang w:eastAsia="en-IN" w:bidi="mr-IN"/>
+              </w:rPr>
+              <w:t xml:space="preserve">Used by students for </w:t>
+            </w:r>
+            <w:r>
+              <w:rPr>
+                <w:rFonts w:ascii="Times New Roman" w:eastAsia="Times New Roman" w:hAnsi="Times New Roman" w:cs="Times New Roman"/>
+                <w:color w:val="1F1F1F"/>
+                <w:sz w:val="24"/>
+                <w:szCs w:val="24"/>
+                <w:lang w:eastAsia="en-IN" w:bidi="mr-IN"/>
+              </w:rPr>
+              <w:t xml:space="preserve">seminars on Self learning Activity, Capstone Project </w:t>
+            </w:r>
+            <w:r>
+              <w:rPr>
+                <w:rFonts w:ascii="Times New Roman" w:eastAsia="Times New Roman" w:hAnsi="Times New Roman" w:cs="Times New Roman"/>
+                <w:color w:val="1F1F1F"/>
+                <w:sz w:val="24"/>
+                <w:szCs w:val="24"/>
+                <w:lang w:eastAsia="en-IN" w:bidi="mr-IN"/>
+              </w:rPr>
+              <w:t xml:space="preserve">demonstration, External viva </w:t>
+            </w:r>
+            <w:r>
+              <w:rPr>
+                <w:rFonts w:ascii="Times New Roman" w:eastAsia="Times New Roman" w:hAnsi="Times New Roman" w:cs="Times New Roman"/>
+                <w:color w:val="1F1F1F"/>
+                <w:sz w:val="24"/>
+                <w:szCs w:val="24"/>
+                <w:lang w:eastAsia="en-IN" w:bidi="mr-IN"/>
+              </w:rPr>
+              <w:lastRenderedPageBreak/>
+              <w:t xml:space="preserve">presentation </w:t>
+            </w:r>
+            <w:proofErr w:type="spellStart"/>
+            <w:r>
+              <w:rPr>
+                <w:rFonts w:ascii="Times New Roman" w:eastAsia="Times New Roman" w:hAnsi="Times New Roman" w:cs="Times New Roman"/>
+                <w:color w:val="1F1F1F"/>
+                <w:sz w:val="24"/>
+                <w:szCs w:val="24"/>
+                <w:lang w:eastAsia="en-IN" w:bidi="mr-IN"/>
+              </w:rPr>
+              <w:t>etc</w:t>
+            </w:r>
+            <w:proofErr w:type="spellEnd"/>
+          </w:p>
+        </w:tc>
+        <w:tc>
+          <w:tcPr>
+            <w:tcW w:w="891" w:type="pct"/>
             <w:tcBorders>
               <w:top w:val="nil"/>
               <w:left w:val="nil"/>
@@ -12903,11 +13589,45 @@
                 <w:lang w:eastAsia="en-IN" w:bidi="mr-IN"/>
               </w:rPr>
             </w:pPr>
-          </w:p>
-        </w:tc>
-        <w:tc>
-          <w:tcPr>
-            <w:tcW w:w="562" w:type="pct"/>
+            <w:r>
+              <w:rPr>
+                <w:rFonts w:ascii="Times New Roman" w:eastAsia="Times New Roman" w:hAnsi="Times New Roman" w:cs="Times New Roman"/>
+                <w:color w:val="1F1F1F"/>
+                <w:sz w:val="24"/>
+                <w:szCs w:val="24"/>
+                <w:lang w:eastAsia="en-IN" w:bidi="mr-IN"/>
+              </w:rPr>
+              <w:lastRenderedPageBreak/>
+              <w:t>Lifelong skill</w:t>
+            </w:r>
+          </w:p>
+          <w:p>
+            <w:pPr>
+              <w:spacing w:after="0" w:line="240" w:lineRule="auto"/>
+              <w:jc w:val="center"/>
+              <w:rPr>
+                <w:rFonts w:ascii="Times New Roman" w:eastAsia="Times New Roman" w:hAnsi="Times New Roman" w:cs="Times New Roman"/>
+                <w:color w:val="1F1F1F"/>
+                <w:sz w:val="24"/>
+                <w:szCs w:val="24"/>
+                <w:lang w:eastAsia="en-IN" w:bidi="mr-IN"/>
+              </w:rPr>
+            </w:pPr>
+            <w:r>
+              <w:rPr>
+                <w:rFonts w:ascii="Times New Roman" w:eastAsia="Times New Roman" w:hAnsi="Times New Roman" w:cs="Times New Roman"/>
+                <w:color w:val="1F1F1F"/>
+                <w:sz w:val="24"/>
+                <w:szCs w:val="24"/>
+                <w:lang w:eastAsia="en-IN" w:bidi="mr-IN"/>
+              </w:rPr>
+              <w:t>Development, Soft Skill development etc.</w:t>
+            </w:r>
+          </w:p>
+        </w:tc>
+        <w:tc>
+          <w:tcPr>
+            <w:tcW w:w="559" w:type="pct"/>
             <w:tcBorders>
               <w:top w:val="nil"/>
               <w:left w:val="nil"/>
@@ -12929,6 +13649,62 @@
                 <w:lang w:eastAsia="en-IN" w:bidi="mr-IN"/>
               </w:rPr>
             </w:pPr>
+            <w:r>
+              <w:rPr>
+                <w:rFonts w:ascii="Times New Roman" w:eastAsia="Times New Roman" w:hAnsi="Times New Roman" w:cs="Times New Roman"/>
+                <w:color w:val="1F1F1F"/>
+                <w:sz w:val="24"/>
+                <w:szCs w:val="24"/>
+                <w:lang w:eastAsia="en-IN" w:bidi="mr-IN"/>
+              </w:rPr>
+              <w:t>PO6,</w:t>
+            </w:r>
+          </w:p>
+          <w:p>
+            <w:pPr>
+              <w:spacing w:after="0" w:line="240" w:lineRule="auto"/>
+              <w:jc w:val="center"/>
+              <w:rPr>
+                <w:rFonts w:ascii="Times New Roman" w:eastAsia="Times New Roman" w:hAnsi="Times New Roman" w:cs="Times New Roman"/>
+                <w:color w:val="1F1F1F"/>
+                <w:sz w:val="24"/>
+                <w:szCs w:val="24"/>
+                <w:lang w:eastAsia="en-IN" w:bidi="mr-IN"/>
+              </w:rPr>
+            </w:pPr>
+            <w:r>
+              <w:rPr>
+                <w:rFonts w:ascii="Times New Roman" w:eastAsia="Times New Roman" w:hAnsi="Times New Roman" w:cs="Times New Roman"/>
+                <w:color w:val="1F1F1F"/>
+                <w:sz w:val="24"/>
+                <w:szCs w:val="24"/>
+                <w:lang w:eastAsia="en-IN" w:bidi="mr-IN"/>
+              </w:rPr>
+              <w:t>PO7,</w:t>
+            </w:r>
+          </w:p>
+          <w:p>
+            <w:pPr>
+              <w:spacing w:after="0" w:line="240" w:lineRule="auto"/>
+              <w:jc w:val="center"/>
+              <w:rPr>
+                <w:rFonts w:ascii="Times New Roman" w:eastAsia="Times New Roman" w:hAnsi="Times New Roman" w:cs="Times New Roman"/>
+                <w:color w:val="1F1F1F"/>
+                <w:sz w:val="24"/>
+                <w:szCs w:val="24"/>
+                <w:lang w:eastAsia="en-IN" w:bidi="mr-IN"/>
+              </w:rPr>
+            </w:pPr>
+            <w:r>
+              <w:rPr>
+                <w:rFonts w:ascii="Times New Roman" w:eastAsia="Times New Roman" w:hAnsi="Times New Roman" w:cs="Times New Roman"/>
+                <w:color w:val="1F1F1F"/>
+                <w:sz w:val="24"/>
+                <w:szCs w:val="24"/>
+                <w:lang w:eastAsia="en-IN" w:bidi="mr-IN"/>
+              </w:rPr>
+              <w:t>PSO1</w:t>
+            </w:r>
           </w:p>
         </w:tc>
       </w:tr>
@@ -12938,7 +13714,7 @@
         </w:trPr>
         <w:tc>
           <w:tcPr>
-            <w:tcW w:w="295" w:type="pct"/>
+            <w:tcW w:w="294" w:type="pct"/>
             <w:tcBorders>
               <w:top w:val="nil"/>
               <w:left w:val="single" w:sz="4" w:space="0" w:color="auto"/>
@@ -12968,13 +13744,14 @@
                 <w:szCs w:val="24"/>
                 <w:lang w:eastAsia="en-IN" w:bidi="mr-IN"/>
               </w:rPr>
+              <w:lastRenderedPageBreak/>
               <w:t>4</w:t>
             </w:r>
           </w:p>
         </w:tc>
         <w:tc>
           <w:tcPr>
-            <w:tcW w:w="759" w:type="pct"/>
+            <w:tcW w:w="672" w:type="pct"/>
             <w:tcBorders>
               <w:top w:val="nil"/>
               <w:left w:val="nil"/>
@@ -13031,7 +13808,7 @@
         </w:tc>
         <w:tc>
           <w:tcPr>
-            <w:tcW w:w="720" w:type="pct"/>
+            <w:tcW w:w="909" w:type="pct"/>
             <w:tcBorders>
               <w:top w:val="nil"/>
               <w:left w:val="nil"/>
@@ -13067,7 +13844,7 @@
         </w:tc>
         <w:tc>
           <w:tcPr>
-            <w:tcW w:w="720" w:type="pct"/>
+            <w:tcW w:w="632" w:type="pct"/>
             <w:tcBorders>
               <w:top w:val="nil"/>
               <w:left w:val="nil"/>
@@ -13097,24 +13874,13 @@
                 <w:szCs w:val="24"/>
                 <w:lang w:eastAsia="en-IN" w:bidi="mr-IN"/>
               </w:rPr>
-              <w:t xml:space="preserve">To host large-scale events, guest lectures, </w:t>
-            </w:r>
-            <w:r>
-              <w:rPr>
-                <w:rFonts w:ascii="Times New Roman" w:eastAsia="Times New Roman" w:hAnsi="Times New Roman" w:cs="Times New Roman"/>
-                <w:color w:val="1F1F1F"/>
-                <w:sz w:val="24"/>
-                <w:szCs w:val="24"/>
-                <w:lang w:eastAsia="en-IN" w:bidi="mr-IN"/>
-              </w:rPr>
-              <w:lastRenderedPageBreak/>
-              <w:t>and industry interaction programs.</w:t>
-            </w:r>
-          </w:p>
-        </w:tc>
-        <w:tc>
-          <w:tcPr>
-            <w:tcW w:w="1048" w:type="pct"/>
+              <w:t>To host large-scale events, guest lectures, and industry interaction programs.</w:t>
+            </w:r>
+          </w:p>
+        </w:tc>
+        <w:tc>
+          <w:tcPr>
+            <w:tcW w:w="1042" w:type="pct"/>
             <w:tcBorders>
               <w:top w:val="nil"/>
               <w:left w:val="nil"/>
@@ -13144,14 +13910,13 @@
                 <w:szCs w:val="24"/>
                 <w:lang w:eastAsia="en-IN" w:bidi="mr-IN"/>
               </w:rPr>
-              <w:lastRenderedPageBreak/>
               <w:t>Guest lectures, seminars, cultural events, and annual functions.</w:t>
             </w:r>
           </w:p>
         </w:tc>
         <w:tc>
           <w:tcPr>
-            <w:tcW w:w="897" w:type="pct"/>
+            <w:tcW w:w="891" w:type="pct"/>
             <w:tcBorders>
               <w:top w:val="nil"/>
               <w:left w:val="nil"/>
@@ -13181,36 +13946,13 @@
                 <w:szCs w:val="24"/>
                 <w:lang w:eastAsia="en-IN" w:bidi="mr-IN"/>
               </w:rPr>
-              <w:t xml:space="preserve">Communication skills, professional networking, and </w:t>
-            </w:r>
-            <w:r>
-              <w:rPr>
-                <w:rFonts w:ascii="Times New Roman" w:eastAsia="Times New Roman" w:hAnsi="Times New Roman" w:cs="Times New Roman"/>
-                <w:color w:val="1F1F1F"/>
-                <w:sz w:val="24"/>
-                <w:szCs w:val="24"/>
-                <w:lang w:eastAsia="en-IN" w:bidi="mr-IN"/>
-              </w:rPr>
-              <w:lastRenderedPageBreak/>
-              <w:t>organizational behaviour</w:t>
-            </w:r>
-            <w:bookmarkStart w:id="0" w:name="_GoBack"/>
-            <w:bookmarkEnd w:id="0"/>
-            <w:r>
-              <w:rPr>
-                <w:rFonts w:ascii="Times New Roman" w:eastAsia="Times New Roman" w:hAnsi="Times New Roman" w:cs="Times New Roman"/>
-                <w:color w:val="1F1F1F"/>
-                <w:sz w:val="24"/>
-                <w:szCs w:val="24"/>
-                <w:lang w:eastAsia="en-IN" w:bidi="mr-IN"/>
-              </w:rPr>
-              <w:t>.</w:t>
-            </w:r>
-          </w:p>
-        </w:tc>
-        <w:tc>
-          <w:tcPr>
-            <w:tcW w:w="562" w:type="pct"/>
+              <w:t>Communication skills, professional networking, and organizational behaviour.</w:t>
+            </w:r>
+          </w:p>
+        </w:tc>
+        <w:tc>
+          <w:tcPr>
+            <w:tcW w:w="559" w:type="pct"/>
             <w:tcBorders>
               <w:top w:val="nil"/>
               <w:left w:val="nil"/>
@@ -13240,7 +13982,6 @@
                 <w:szCs w:val="24"/>
                 <w:lang w:eastAsia="en-IN" w:bidi="mr-IN"/>
               </w:rPr>
-              <w:lastRenderedPageBreak/>
               <w:t>PO 6, PO 7</w:t>
             </w:r>
           </w:p>
@@ -13252,7 +13993,7 @@
         </w:trPr>
         <w:tc>
           <w:tcPr>
-            <w:tcW w:w="295" w:type="pct"/>
+            <w:tcW w:w="294" w:type="pct"/>
             <w:tcBorders>
               <w:top w:val="nil"/>
               <w:left w:val="single" w:sz="4" w:space="0" w:color="auto"/>
@@ -13282,14 +14023,13 @@
                 <w:szCs w:val="24"/>
                 <w:lang w:eastAsia="en-IN" w:bidi="mr-IN"/>
               </w:rPr>
-              <w:lastRenderedPageBreak/>
               <w:t>5</w:t>
             </w:r>
           </w:p>
         </w:tc>
         <w:tc>
           <w:tcPr>
-            <w:tcW w:w="759" w:type="pct"/>
+            <w:tcW w:w="672" w:type="pct"/>
             <w:tcBorders>
               <w:top w:val="nil"/>
               <w:left w:val="nil"/>
@@ -13325,7 +14065,7 @@
         </w:tc>
         <w:tc>
           <w:tcPr>
-            <w:tcW w:w="720" w:type="pct"/>
+            <w:tcW w:w="909" w:type="pct"/>
             <w:tcBorders>
               <w:top w:val="nil"/>
               <w:left w:val="nil"/>
@@ -13361,7 +14101,7 @@
         </w:tc>
         <w:tc>
           <w:tcPr>
-            <w:tcW w:w="720" w:type="pct"/>
+            <w:tcW w:w="632" w:type="pct"/>
             <w:tcBorders>
               <w:top w:val="nil"/>
               <w:left w:val="nil"/>
@@ -13397,7 +14137,7 @@
         </w:tc>
         <w:tc>
           <w:tcPr>
-            <w:tcW w:w="1048" w:type="pct"/>
+            <w:tcW w:w="1042" w:type="pct"/>
             <w:tcBorders>
               <w:top w:val="nil"/>
               <w:left w:val="nil"/>
@@ -13433,7 +14173,7 @@
         </w:tc>
         <w:tc>
           <w:tcPr>
-            <w:tcW w:w="897" w:type="pct"/>
+            <w:tcW w:w="891" w:type="pct"/>
             <w:tcBorders>
               <w:top w:val="nil"/>
               <w:left w:val="nil"/>
@@ -13469,7 +14209,7 @@
         </w:tc>
         <w:tc>
           <w:tcPr>
-            <w:tcW w:w="562" w:type="pct"/>
+            <w:tcW w:w="559" w:type="pct"/>
             <w:tcBorders>
               <w:top w:val="nil"/>
               <w:left w:val="nil"/>
@@ -13510,7 +14250,7 @@
         </w:trPr>
         <w:tc>
           <w:tcPr>
-            <w:tcW w:w="295" w:type="pct"/>
+            <w:tcW w:w="294" w:type="pct"/>
             <w:tcBorders>
               <w:top w:val="nil"/>
               <w:left w:val="single" w:sz="4" w:space="0" w:color="auto"/>
@@ -13547,7 +14287,7 @@
         </w:tc>
         <w:tc>
           <w:tcPr>
-            <w:tcW w:w="759" w:type="pct"/>
+            <w:tcW w:w="672" w:type="pct"/>
             <w:tcBorders>
               <w:top w:val="nil"/>
               <w:left w:val="nil"/>
@@ -13584,7 +14324,7 @@
         </w:tc>
         <w:tc>
           <w:tcPr>
-            <w:tcW w:w="720" w:type="pct"/>
+            <w:tcW w:w="909" w:type="pct"/>
             <w:tcBorders>
               <w:top w:val="nil"/>
               <w:left w:val="nil"/>
@@ -13621,7 +14361,7 @@
         </w:tc>
         <w:tc>
           <w:tcPr>
-            <w:tcW w:w="720" w:type="pct"/>
+            <w:tcW w:w="632" w:type="pct"/>
             <w:tcBorders>
               <w:top w:val="nil"/>
               <w:left w:val="nil"/>
@@ -13658,7 +14398,7 @@
         </w:tc>
         <w:tc>
           <w:tcPr>
-            <w:tcW w:w="1048" w:type="pct"/>
+            <w:tcW w:w="1042" w:type="pct"/>
             <w:tcBorders>
               <w:top w:val="nil"/>
               <w:left w:val="nil"/>
@@ -13695,7 +14435,7 @@
         </w:tc>
         <w:tc>
           <w:tcPr>
-            <w:tcW w:w="897" w:type="pct"/>
+            <w:tcW w:w="891" w:type="pct"/>
             <w:tcBorders>
               <w:top w:val="nil"/>
               <w:left w:val="nil"/>
@@ -13732,7 +14472,7 @@
         </w:tc>
         <w:tc>
           <w:tcPr>
-            <w:tcW w:w="562" w:type="pct"/>
+            <w:tcW w:w="559" w:type="pct"/>
             <w:tcBorders>
               <w:top w:val="nil"/>
               <w:left w:val="nil"/>
@@ -13774,7 +14514,7 @@
         </w:trPr>
         <w:tc>
           <w:tcPr>
-            <w:tcW w:w="295" w:type="pct"/>
+            <w:tcW w:w="294" w:type="pct"/>
             <w:tcBorders>
               <w:top w:val="nil"/>
               <w:left w:val="single" w:sz="4" w:space="0" w:color="auto"/>
@@ -13811,7 +14551,7 @@
         </w:tc>
         <w:tc>
           <w:tcPr>
-            <w:tcW w:w="759" w:type="pct"/>
+            <w:tcW w:w="672" w:type="pct"/>
             <w:tcBorders>
               <w:top w:val="nil"/>
               <w:left w:val="nil"/>
@@ -13848,7 +14588,7 @@
         </w:tc>
         <w:tc>
           <w:tcPr>
-            <w:tcW w:w="720" w:type="pct"/>
+            <w:tcW w:w="909" w:type="pct"/>
             <w:tcBorders>
               <w:top w:val="nil"/>
               <w:left w:val="nil"/>
@@ -13897,7 +14637,7 @@
         </w:tc>
         <w:tc>
           <w:tcPr>
-            <w:tcW w:w="720" w:type="pct"/>
+            <w:tcW w:w="632" w:type="pct"/>
             <w:tcBorders>
               <w:top w:val="nil"/>
               <w:left w:val="nil"/>
@@ -13934,7 +14674,7 @@
         </w:tc>
         <w:tc>
           <w:tcPr>
-            <w:tcW w:w="1048" w:type="pct"/>
+            <w:tcW w:w="1042" w:type="pct"/>
             <w:tcBorders>
               <w:top w:val="nil"/>
               <w:left w:val="nil"/>
@@ -13971,7 +14711,7 @@
         </w:tc>
         <w:tc>
           <w:tcPr>
-            <w:tcW w:w="897" w:type="pct"/>
+            <w:tcW w:w="891" w:type="pct"/>
             <w:tcBorders>
               <w:top w:val="nil"/>
               <w:left w:val="nil"/>
@@ -14008,7 +14748,7 @@
         </w:tc>
         <w:tc>
           <w:tcPr>
-            <w:tcW w:w="562" w:type="pct"/>
+            <w:tcW w:w="559" w:type="pct"/>
             <w:tcBorders>
               <w:top w:val="nil"/>
               <w:left w:val="nil"/>
@@ -14050,7 +14790,7 @@
         </w:trPr>
         <w:tc>
           <w:tcPr>
-            <w:tcW w:w="295" w:type="pct"/>
+            <w:tcW w:w="294" w:type="pct"/>
             <w:tcBorders>
               <w:top w:val="nil"/>
               <w:left w:val="single" w:sz="4" w:space="0" w:color="auto"/>
@@ -14087,7 +14827,7 @@
         </w:tc>
         <w:tc>
           <w:tcPr>
-            <w:tcW w:w="759" w:type="pct"/>
+            <w:tcW w:w="672" w:type="pct"/>
             <w:tcBorders>
               <w:top w:val="nil"/>
               <w:left w:val="nil"/>
@@ -14133,7 +14873,7 @@
         </w:tc>
         <w:tc>
           <w:tcPr>
-            <w:tcW w:w="720" w:type="pct"/>
+            <w:tcW w:w="909" w:type="pct"/>
             <w:tcBorders>
               <w:top w:val="nil"/>
               <w:left w:val="nil"/>
@@ -14169,7 +14909,7 @@
         </w:tc>
         <w:tc>
           <w:tcPr>
-            <w:tcW w:w="720" w:type="pct"/>
+            <w:tcW w:w="632" w:type="pct"/>
             <w:tcBorders>
               <w:top w:val="nil"/>
               <w:left w:val="nil"/>
@@ -14205,7 +14945,7 @@
         </w:tc>
         <w:tc>
           <w:tcPr>
-            <w:tcW w:w="1048" w:type="pct"/>
+            <w:tcW w:w="1042" w:type="pct"/>
             <w:tcBorders>
               <w:top w:val="nil"/>
               <w:left w:val="nil"/>
@@ -14251,7 +14991,7 @@
         </w:tc>
         <w:tc>
           <w:tcPr>
-            <w:tcW w:w="897" w:type="pct"/>
+            <w:tcW w:w="891" w:type="pct"/>
             <w:tcBorders>
               <w:top w:val="nil"/>
               <w:left w:val="nil"/>
@@ -14287,7 +15027,7 @@
         </w:tc>
         <w:tc>
           <w:tcPr>
-            <w:tcW w:w="562" w:type="pct"/>
+            <w:tcW w:w="559" w:type="pct"/>
             <w:tcBorders>
               <w:top w:val="nil"/>
               <w:left w:val="nil"/>
@@ -14328,7 +15068,7 @@
         </w:trPr>
         <w:tc>
           <w:tcPr>
-            <w:tcW w:w="295" w:type="pct"/>
+            <w:tcW w:w="294" w:type="pct"/>
             <w:tcBorders>
               <w:top w:val="nil"/>
               <w:left w:val="single" w:sz="4" w:space="0" w:color="auto"/>
@@ -14365,7 +15105,7 @@
         </w:tc>
         <w:tc>
           <w:tcPr>
-            <w:tcW w:w="759" w:type="pct"/>
+            <w:tcW w:w="672" w:type="pct"/>
             <w:tcBorders>
               <w:top w:val="nil"/>
               <w:left w:val="nil"/>
@@ -14402,7 +15142,7 @@
         </w:tc>
         <w:tc>
           <w:tcPr>
-            <w:tcW w:w="720" w:type="pct"/>
+            <w:tcW w:w="909" w:type="pct"/>
             <w:tcBorders>
               <w:top w:val="nil"/>
               <w:left w:val="nil"/>
@@ -14439,7 +15179,7 @@
         </w:tc>
         <w:tc>
           <w:tcPr>
-            <w:tcW w:w="720" w:type="pct"/>
+            <w:tcW w:w="632" w:type="pct"/>
             <w:tcBorders>
               <w:top w:val="nil"/>
               <w:left w:val="nil"/>
@@ -14476,7 +15216,7 @@
         </w:tc>
         <w:tc>
           <w:tcPr>
-            <w:tcW w:w="1048" w:type="pct"/>
+            <w:tcW w:w="1042" w:type="pct"/>
             <w:tcBorders>
               <w:top w:val="nil"/>
               <w:left w:val="nil"/>
@@ -14513,7 +15253,7 @@
         </w:tc>
         <w:tc>
           <w:tcPr>
-            <w:tcW w:w="897" w:type="pct"/>
+            <w:tcW w:w="891" w:type="pct"/>
             <w:tcBorders>
               <w:top w:val="nil"/>
               <w:left w:val="nil"/>
@@ -14550,7 +15290,7 @@
         </w:tc>
         <w:tc>
           <w:tcPr>
-            <w:tcW w:w="562" w:type="pct"/>
+            <w:tcW w:w="559" w:type="pct"/>
             <w:tcBorders>
               <w:top w:val="nil"/>
               <w:left w:val="nil"/>
@@ -14592,7 +15332,7 @@
         </w:trPr>
         <w:tc>
           <w:tcPr>
-            <w:tcW w:w="295" w:type="pct"/>
+            <w:tcW w:w="294" w:type="pct"/>
             <w:tcBorders>
               <w:top w:val="nil"/>
               <w:left w:val="single" w:sz="4" w:space="0" w:color="auto"/>
@@ -14623,13 +15363,14 @@
                 <w:szCs w:val="24"/>
                 <w:lang w:eastAsia="en-IN" w:bidi="mr-IN"/>
               </w:rPr>
+              <w:lastRenderedPageBreak/>
               <w:t>10</w:t>
             </w:r>
           </w:p>
         </w:tc>
         <w:tc>
           <w:tcPr>
-            <w:tcW w:w="759" w:type="pct"/>
+            <w:tcW w:w="672" w:type="pct"/>
             <w:tcBorders>
               <w:top w:val="nil"/>
               <w:left w:val="nil"/>
@@ -14666,7 +15407,7 @@
         </w:tc>
         <w:tc>
           <w:tcPr>
-            <w:tcW w:w="720" w:type="pct"/>
+            <w:tcW w:w="909" w:type="pct"/>
             <w:tcBorders>
               <w:top w:val="nil"/>
               <w:left w:val="nil"/>
@@ -14703,7 +15444,7 @@
         </w:tc>
         <w:tc>
           <w:tcPr>
-            <w:tcW w:w="720" w:type="pct"/>
+            <w:tcW w:w="632" w:type="pct"/>
             <w:tcBorders>
               <w:top w:val="nil"/>
               <w:left w:val="nil"/>
@@ -14762,7 +15503,7 @@
         </w:tc>
         <w:tc>
           <w:tcPr>
-            <w:tcW w:w="1048" w:type="pct"/>
+            <w:tcW w:w="1042" w:type="pct"/>
             <w:tcBorders>
               <w:top w:val="nil"/>
               <w:left w:val="nil"/>
@@ -14799,7 +15540,7 @@
         </w:tc>
         <w:tc>
           <w:tcPr>
-            <w:tcW w:w="897" w:type="pct"/>
+            <w:tcW w:w="891" w:type="pct"/>
             <w:tcBorders>
               <w:top w:val="nil"/>
               <w:left w:val="nil"/>
@@ -14836,7 +15577,7 @@
         </w:tc>
         <w:tc>
           <w:tcPr>
-            <w:tcW w:w="562" w:type="pct"/>
+            <w:tcW w:w="559" w:type="pct"/>
             <w:tcBorders>
               <w:top w:val="nil"/>
               <w:left w:val="nil"/>
@@ -14878,7 +15619,7 @@
         </w:trPr>
         <w:tc>
           <w:tcPr>
-            <w:tcW w:w="295" w:type="pct"/>
+            <w:tcW w:w="294" w:type="pct"/>
             <w:tcBorders>
               <w:top w:val="nil"/>
               <w:left w:val="single" w:sz="4" w:space="0" w:color="auto"/>
@@ -14915,7 +15656,7 @@
         </w:tc>
         <w:tc>
           <w:tcPr>
-            <w:tcW w:w="759" w:type="pct"/>
+            <w:tcW w:w="672" w:type="pct"/>
             <w:tcBorders>
               <w:top w:val="nil"/>
               <w:left w:val="nil"/>
@@ -14952,7 +15693,7 @@
         </w:tc>
         <w:tc>
           <w:tcPr>
-            <w:tcW w:w="720" w:type="pct"/>
+            <w:tcW w:w="909" w:type="pct"/>
             <w:tcBorders>
               <w:top w:val="nil"/>
               <w:left w:val="nil"/>
@@ -14989,7 +15730,7 @@
         </w:tc>
         <w:tc>
           <w:tcPr>
-            <w:tcW w:w="720" w:type="pct"/>
+            <w:tcW w:w="632" w:type="pct"/>
             <w:tcBorders>
               <w:top w:val="nil"/>
               <w:left w:val="nil"/>
@@ -15020,24 +15761,13 @@
                 <w:szCs w:val="24"/>
                 <w:lang w:eastAsia="en-IN" w:bidi="mr-IN"/>
               </w:rPr>
-              <w:t xml:space="preserve">To ensure lab security and equipment </w:t>
-            </w:r>
-            <w:r>
-              <w:rPr>
-                <w:rFonts w:ascii="Times New Roman" w:eastAsia="Times New Roman" w:hAnsi="Times New Roman" w:cs="Times New Roman"/>
-                <w:color w:val="1F1F1F"/>
-                <w:sz w:val="24"/>
-                <w:szCs w:val="24"/>
-                <w:lang w:eastAsia="en-IN" w:bidi="mr-IN"/>
-              </w:rPr>
-              <w:lastRenderedPageBreak/>
-              <w:t>protection</w:t>
-            </w:r>
-          </w:p>
-        </w:tc>
-        <w:tc>
-          <w:tcPr>
-            <w:tcW w:w="1048" w:type="pct"/>
+              <w:t>To ensure lab security and equipment protection</w:t>
+            </w:r>
+          </w:p>
+        </w:tc>
+        <w:tc>
+          <w:tcPr>
+            <w:tcW w:w="1042" w:type="pct"/>
             <w:tcBorders>
               <w:top w:val="nil"/>
               <w:left w:val="nil"/>
@@ -15068,14 +15798,13 @@
                 <w:szCs w:val="24"/>
                 <w:lang w:eastAsia="en-IN" w:bidi="mr-IN"/>
               </w:rPr>
-              <w:lastRenderedPageBreak/>
               <w:t>Monitoring sensitive lab environments</w:t>
             </w:r>
           </w:p>
         </w:tc>
         <w:tc>
           <w:tcPr>
-            <w:tcW w:w="897" w:type="pct"/>
+            <w:tcW w:w="891" w:type="pct"/>
             <w:tcBorders>
               <w:top w:val="nil"/>
               <w:left w:val="nil"/>
@@ -15112,7 +15841,7 @@
         </w:tc>
         <w:tc>
           <w:tcPr>
-            <w:tcW w:w="562" w:type="pct"/>
+            <w:tcW w:w="559" w:type="pct"/>
             <w:tcBorders>
               <w:top w:val="nil"/>
               <w:left w:val="nil"/>
@@ -15154,7 +15883,7 @@
         </w:trPr>
         <w:tc>
           <w:tcPr>
-            <w:tcW w:w="295" w:type="pct"/>
+            <w:tcW w:w="294" w:type="pct"/>
             <w:tcBorders>
               <w:top w:val="nil"/>
               <w:left w:val="single" w:sz="4" w:space="0" w:color="auto"/>
@@ -15185,14 +15914,13 @@
                 <w:szCs w:val="24"/>
                 <w:lang w:eastAsia="en-IN" w:bidi="mr-IN"/>
               </w:rPr>
-              <w:lastRenderedPageBreak/>
               <w:t>12</w:t>
             </w:r>
           </w:p>
         </w:tc>
         <w:tc>
           <w:tcPr>
-            <w:tcW w:w="759" w:type="pct"/>
+            <w:tcW w:w="672" w:type="pct"/>
             <w:tcBorders>
               <w:top w:val="nil"/>
               <w:left w:val="nil"/>
@@ -15228,7 +15956,7 @@
         </w:tc>
         <w:tc>
           <w:tcPr>
-            <w:tcW w:w="720" w:type="pct"/>
+            <w:tcW w:w="909" w:type="pct"/>
             <w:tcBorders>
               <w:top w:val="nil"/>
               <w:left w:val="nil"/>
@@ -15264,7 +15992,7 @@
         </w:tc>
         <w:tc>
           <w:tcPr>
-            <w:tcW w:w="720" w:type="pct"/>
+            <w:tcW w:w="632" w:type="pct"/>
             <w:tcBorders>
               <w:top w:val="nil"/>
               <w:left w:val="nil"/>
@@ -15300,7 +16028,7 @@
         </w:tc>
         <w:tc>
           <w:tcPr>
-            <w:tcW w:w="1048" w:type="pct"/>
+            <w:tcW w:w="1042" w:type="pct"/>
             <w:tcBorders>
               <w:top w:val="nil"/>
               <w:left w:val="nil"/>
@@ -15336,7 +16064,7 @@
         </w:tc>
         <w:tc>
           <w:tcPr>
-            <w:tcW w:w="897" w:type="pct"/>
+            <w:tcW w:w="891" w:type="pct"/>
             <w:tcBorders>
               <w:top w:val="nil"/>
               <w:left w:val="nil"/>
@@ -15372,7 +16100,7 @@
         </w:tc>
         <w:tc>
           <w:tcPr>
-            <w:tcW w:w="562" w:type="pct"/>
+            <w:tcW w:w="559" w:type="pct"/>
             <w:tcBorders>
               <w:top w:val="nil"/>
               <w:left w:val="nil"/>
@@ -15469,6 +16197,7 @@
     <w:p>
       <w:pPr>
         <w:pStyle w:val="NormalWeb"/>
+        <w:jc w:val="both"/>
       </w:pPr>
       <w:r>
         <w:t>The Computer Engineering department follows a systematic approach to ensure that all laboratory equipment remains functional and the environment is optimized for learning.</w:t>
@@ -15481,6 +16210,7 @@
           <w:ilvl w:val="0"/>
           <w:numId w:val="9"/>
         </w:numPr>
+        <w:jc w:val="both"/>
       </w:pPr>
       <w:r>
         <w:rPr>
@@ -15514,15 +16244,7 @@
       </w:r>
       <w:proofErr w:type="spellEnd"/>
       <w:r>
-        <w:t xml:space="preserve"> S. </w:t>
-      </w:r>
-      <w:proofErr w:type="spellStart"/>
-      <w:r>
-        <w:t>Gund</w:t>
-      </w:r>
-      <w:proofErr w:type="spellEnd"/>
-      <w:r>
-        <w:t>) to ensure uninterrupted practical sessions.</w:t>
+        <w:t xml:space="preserve"> S. Gund) to ensure uninterrupted practical sessions.</w:t>
       </w:r>
     </w:p>
     <w:p>
@@ -15532,6 +16254,7 @@
           <w:ilvl w:val="0"/>
           <w:numId w:val="9"/>
         </w:numPr>
+        <w:jc w:val="both"/>
       </w:pPr>
       <w:r>
         <w:rPr>
@@ -15543,13 +16266,11 @@
       <w:r>
         <w:t xml:space="preserve"> Upon reporting a malfunction, the technical </w:t>
       </w:r>
-      <w:proofErr w:type="gramStart"/>
-      <w:r>
-        <w:t>staff</w:t>
-      </w:r>
-      <w:proofErr w:type="gramEnd"/>
-      <w:r>
-        <w:t xml:space="preserve"> initiates immediate repairs or coordinates with external vendors if the equipment is under warranty or requires specialized service.</w:t>
+      <w:r>
+        <w:t>staffs initiate immediate repairs or coordinate</w:t>
+      </w:r>
+      <w:r>
+        <w:t xml:space="preserve"> with external vendors if the equipment is under warranty or requires specialized service.</w:t>
       </w:r>
     </w:p>
     <w:p>
@@ -15559,6 +16280,7 @@
           <w:ilvl w:val="0"/>
           <w:numId w:val="9"/>
         </w:numPr>
+        <w:jc w:val="both"/>
       </w:pPr>
       <w:r>
         <w:rPr>
@@ -15577,7 +16299,7 @@
     <w:p>
       <w:pPr>
         <w:pStyle w:val="Heading4"/>
-        <w:ind w:left="720"/>
+        <w:ind w:left="90"/>
         <w:rPr>
           <w:rFonts w:ascii="Times New Roman" w:hAnsi="Times New Roman" w:cs="Times New Roman"/>
           <w:sz w:val="24"/>
@@ -15609,6 +16331,7 @@
           <w:ilvl w:val="0"/>
           <w:numId w:val="10"/>
         </w:numPr>
+        <w:jc w:val="both"/>
       </w:pPr>
       <w:r>
         <w:rPr>
@@ -15628,6 +16351,7 @@
           <w:ilvl w:val="0"/>
           <w:numId w:val="10"/>
         </w:numPr>
+        <w:jc w:val="both"/>
       </w:pPr>
       <w:r>
         <w:rPr>
@@ -15647,12 +16371,14 @@
           <w:ilvl w:val="0"/>
           <w:numId w:val="10"/>
         </w:numPr>
+        <w:jc w:val="both"/>
       </w:pPr>
       <w:r>
         <w:rPr>
           <w:b/>
           <w:bCs/>
         </w:rPr>
+        <w:lastRenderedPageBreak/>
         <w:t>Lab In-Charge Oversight:</w:t>
       </w:r>
       <w:r>
@@ -15674,7 +16400,7 @@
     <w:p>
       <w:pPr>
         <w:pStyle w:val="Heading4"/>
-        <w:ind w:left="720"/>
+        <w:ind w:left="90"/>
         <w:rPr>
           <w:rFonts w:ascii="Times New Roman" w:hAnsi="Times New Roman" w:cs="Times New Roman"/>
           <w:sz w:val="24"/>
@@ -15706,6 +16432,7 @@
           <w:ilvl w:val="0"/>
           <w:numId w:val="11"/>
         </w:numPr>
+        <w:jc w:val="both"/>
       </w:pPr>
       <w:r>
         <w:rPr>
@@ -15745,6 +16472,7 @@
           <w:ilvl w:val="0"/>
           <w:numId w:val="11"/>
         </w:numPr>
+        <w:jc w:val="both"/>
       </w:pPr>
       <w:r>
         <w:rPr>
@@ -15774,6 +16502,7 @@
           <w:ilvl w:val="0"/>
           <w:numId w:val="11"/>
         </w:numPr>
+        <w:jc w:val="both"/>
       </w:pPr>
       <w:r>
         <w:rPr>
@@ -15793,13 +16522,13 @@
           <w:ilvl w:val="0"/>
           <w:numId w:val="11"/>
         </w:numPr>
+        <w:jc w:val="both"/>
       </w:pPr>
       <w:r>
         <w:rPr>
           <w:b/>
           <w:bCs/>
         </w:rPr>
-        <w:lastRenderedPageBreak/>
         <w:t>Connectivity and Resources:</w:t>
       </w:r>
       <w:r>
@@ -15840,6 +16569,7 @@
           <w:ilvl w:val="0"/>
           <w:numId w:val="11"/>
         </w:numPr>
+        <w:jc w:val="both"/>
       </w:pPr>
       <w:r>
         <w:t xml:space="preserve">The </w:t>
@@ -15854,38 +16584,24 @@
       <w:r>
         <w:t xml:space="preserve"> serves as a repository for technical </w:t>
       </w:r>
-      <w:proofErr w:type="spellStart"/>
-      <w:r>
-        <w:t>ebooks</w:t>
-      </w:r>
-      <w:proofErr w:type="spellEnd"/>
+      <w:r>
+        <w:t>eBooks</w:t>
+      </w:r>
       <w:r>
         <w:t xml:space="preserve">, open source </w:t>
       </w:r>
-      <w:proofErr w:type="spellStart"/>
-      <w:r>
-        <w:t>softwares</w:t>
-      </w:r>
-      <w:proofErr w:type="spellEnd"/>
+      <w:r>
+        <w:t>software’s</w:t>
+      </w:r>
       <w:r>
         <w:t>,</w:t>
       </w:r>
       <w:r>
-        <w:t xml:space="preserve"> </w:t>
-      </w:r>
-      <w:proofErr w:type="gramStart"/>
-      <w:r>
-        <w:t>e</w:t>
-      </w:r>
-      <w:proofErr w:type="gramEnd"/>
-      <w:r>
-        <w:t xml:space="preserve">-learning platform </w:t>
-      </w:r>
-      <w:proofErr w:type="spellStart"/>
-      <w:r>
-        <w:t>etc</w:t>
-      </w:r>
-      <w:proofErr w:type="spellEnd"/>
+        <w:t xml:space="preserve"> e-learning platform </w:t>
+      </w:r>
+      <w:r>
+        <w:t>etc.</w:t>
+      </w:r>
       <w:r>
         <w:t xml:space="preserve"> further supporting student project work.</w:t>
       </w:r>
@@ -15897,6 +16613,7 @@
           <w:ilvl w:val="0"/>
           <w:numId w:val="11"/>
         </w:numPr>
+        <w:jc w:val="both"/>
       </w:pPr>
       <w:r>
         <w:rPr>
@@ -15983,16 +16700,16 @@
         <w:tblLook w:val="04A0" w:firstRow="1" w:lastRow="0" w:firstColumn="1" w:lastColumn="0" w:noHBand="0" w:noVBand="1"/>
       </w:tblPr>
       <w:tblGrid>
-        <w:gridCol w:w="580"/>
-        <w:gridCol w:w="1705"/>
-        <w:gridCol w:w="1705"/>
-        <w:gridCol w:w="1705"/>
-        <w:gridCol w:w="1957"/>
-        <w:gridCol w:w="1756"/>
+        <w:gridCol w:w="552"/>
+        <w:gridCol w:w="1677"/>
+        <w:gridCol w:w="1677"/>
+        <w:gridCol w:w="1677"/>
+        <w:gridCol w:w="1929"/>
+        <w:gridCol w:w="1896"/>
       </w:tblGrid>
       <w:tr>
         <w:trPr>
-          <w:trHeight w:val="1080"/>
+          <w:trHeight w:val="665"/>
         </w:trPr>
         <w:tc>
           <w:tcPr>
@@ -16014,6 +16731,8 @@
               <w:rPr>
                 <w:rFonts w:ascii="Times New Roman" w:eastAsia="Times New Roman" w:hAnsi="Times New Roman" w:cs="Times New Roman"/>
                 <w:color w:val="000000"/>
+                <w:sz w:val="24"/>
+                <w:szCs w:val="24"/>
                 <w:lang w:eastAsia="en-IN" w:bidi="mr-IN"/>
               </w:rPr>
             </w:pPr>
@@ -16022,6 +16741,8 @@
               <w:rPr>
                 <w:rFonts w:ascii="Times New Roman" w:eastAsia="Times New Roman" w:hAnsi="Times New Roman" w:cs="Times New Roman"/>
                 <w:color w:val="000000"/>
+                <w:sz w:val="24"/>
+                <w:szCs w:val="24"/>
                 <w:lang w:val="en-US" w:eastAsia="en-IN" w:bidi="mr-IN"/>
               </w:rPr>
               <w:t>Sr. No</w:t>
@@ -16048,6 +16769,8 @@
               <w:rPr>
                 <w:rFonts w:ascii="Times New Roman" w:eastAsia="Times New Roman" w:hAnsi="Times New Roman" w:cs="Times New Roman"/>
                 <w:color w:val="000000"/>
+                <w:sz w:val="24"/>
+                <w:szCs w:val="24"/>
                 <w:lang w:eastAsia="en-IN" w:bidi="mr-IN"/>
               </w:rPr>
             </w:pPr>
@@ -16056,6 +16779,8 @@
               <w:rPr>
                 <w:rFonts w:ascii="Times New Roman" w:eastAsia="Times New Roman" w:hAnsi="Times New Roman" w:cs="Times New Roman"/>
                 <w:color w:val="000000"/>
+                <w:sz w:val="24"/>
+                <w:szCs w:val="24"/>
                 <w:lang w:val="en-US" w:eastAsia="en-IN" w:bidi="mr-IN"/>
               </w:rPr>
               <w:t>No of computer terminals</w:t>
@@ -16083,6 +16808,8 @@
               <w:rPr>
                 <w:rFonts w:ascii="Times New Roman" w:eastAsia="Times New Roman" w:hAnsi="Times New Roman" w:cs="Times New Roman"/>
                 <w:color w:val="000000"/>
+                <w:sz w:val="24"/>
+                <w:szCs w:val="24"/>
                 <w:lang w:eastAsia="en-IN" w:bidi="mr-IN"/>
               </w:rPr>
             </w:pPr>
@@ -16090,6 +16817,8 @@
               <w:rPr>
                 <w:rFonts w:ascii="Times New Roman" w:eastAsia="Times New Roman" w:hAnsi="Times New Roman" w:cs="Times New Roman"/>
                 <w:color w:val="000000"/>
+                <w:sz w:val="24"/>
+                <w:szCs w:val="24"/>
                 <w:lang w:val="en-US" w:eastAsia="en-IN" w:bidi="mr-IN"/>
               </w:rPr>
               <w:t>Students Computer Ratio</w:t>
@@ -16116,6 +16845,8 @@
               <w:rPr>
                 <w:rFonts w:ascii="Times New Roman" w:eastAsia="Times New Roman" w:hAnsi="Times New Roman" w:cs="Times New Roman"/>
                 <w:color w:val="000000"/>
+                <w:sz w:val="24"/>
+                <w:szCs w:val="24"/>
                 <w:lang w:eastAsia="en-IN" w:bidi="mr-IN"/>
               </w:rPr>
             </w:pPr>
@@ -16123,6 +16854,8 @@
               <w:rPr>
                 <w:rFonts w:ascii="Times New Roman" w:eastAsia="Times New Roman" w:hAnsi="Times New Roman" w:cs="Times New Roman"/>
                 <w:color w:val="000000"/>
+                <w:sz w:val="24"/>
+                <w:szCs w:val="24"/>
                 <w:lang w:val="en-US" w:eastAsia="en-IN" w:bidi="mr-IN"/>
               </w:rPr>
               <w:t>Details of Legal Software</w:t>
@@ -16149,6 +16882,8 @@
               <w:rPr>
                 <w:rFonts w:ascii="Times New Roman" w:eastAsia="Times New Roman" w:hAnsi="Times New Roman" w:cs="Times New Roman"/>
                 <w:color w:val="000000"/>
+                <w:sz w:val="24"/>
+                <w:szCs w:val="24"/>
                 <w:lang w:eastAsia="en-IN" w:bidi="mr-IN"/>
               </w:rPr>
             </w:pPr>
@@ -16156,6 +16891,8 @@
               <w:rPr>
                 <w:rFonts w:ascii="Times New Roman" w:eastAsia="Times New Roman" w:hAnsi="Times New Roman" w:cs="Times New Roman"/>
                 <w:color w:val="000000"/>
+                <w:sz w:val="24"/>
+                <w:szCs w:val="24"/>
                 <w:lang w:val="en-US" w:eastAsia="en-IN" w:bidi="mr-IN"/>
               </w:rPr>
               <w:t>Details of Networking</w:t>
@@ -16182,6 +16919,8 @@
               <w:rPr>
                 <w:rFonts w:ascii="Times New Roman" w:eastAsia="Times New Roman" w:hAnsi="Times New Roman" w:cs="Times New Roman"/>
                 <w:color w:val="000000"/>
+                <w:sz w:val="24"/>
+                <w:szCs w:val="24"/>
                 <w:lang w:eastAsia="en-IN" w:bidi="mr-IN"/>
               </w:rPr>
             </w:pPr>
@@ -16189,6 +16928,8 @@
               <w:rPr>
                 <w:rFonts w:ascii="Times New Roman" w:eastAsia="Times New Roman" w:hAnsi="Times New Roman" w:cs="Times New Roman"/>
                 <w:color w:val="000000"/>
+                <w:sz w:val="24"/>
+                <w:szCs w:val="24"/>
                 <w:lang w:val="en-US" w:eastAsia="en-IN" w:bidi="mr-IN"/>
               </w:rPr>
               <w:t>Details of Printers/Scanners etc.</w:t>
@@ -16220,6 +16961,8 @@
               <w:rPr>
                 <w:rFonts w:ascii="Times New Roman" w:eastAsia="Times New Roman" w:hAnsi="Times New Roman" w:cs="Times New Roman"/>
                 <w:color w:val="000000"/>
+                <w:sz w:val="24"/>
+                <w:szCs w:val="24"/>
                 <w:lang w:eastAsia="en-IN" w:bidi="mr-IN"/>
               </w:rPr>
             </w:pPr>
@@ -16227,6 +16970,8 @@
               <w:rPr>
                 <w:rFonts w:ascii="Times New Roman" w:eastAsia="Times New Roman" w:hAnsi="Times New Roman" w:cs="Times New Roman"/>
                 <w:color w:val="000000"/>
+                <w:sz w:val="24"/>
+                <w:szCs w:val="24"/>
                 <w:lang w:val="en-US" w:eastAsia="en-IN" w:bidi="mr-IN"/>
               </w:rPr>
               <w:t>1</w:t>
@@ -16248,21 +16993,24 @@
           </w:tcPr>
           <w:p>
             <w:pPr>
-              <w:spacing w:after="0" w:line="240" w:lineRule="auto"/>
-              <w:jc w:val="center"/>
-              <w:rPr>
-                <w:rFonts w:ascii="Times New Roman" w:eastAsia="Times New Roman" w:hAnsi="Times New Roman" w:cs="Times New Roman"/>
+              <w:jc w:val="center"/>
+              <w:rPr>
+                <w:rFonts w:ascii="Times New Roman" w:hAnsi="Times New Roman" w:cs="Times New Roman"/>
                 <w:color w:val="000000"/>
-                <w:lang w:eastAsia="en-IN" w:bidi="mr-IN"/>
-              </w:rPr>
-            </w:pPr>
-            <w:r>
-              <w:rPr>
-                <w:rFonts w:ascii="Times New Roman" w:eastAsia="Times New Roman" w:hAnsi="Times New Roman" w:cs="Times New Roman"/>
+                <w:sz w:val="24"/>
+                <w:szCs w:val="24"/>
+                <w:lang w:eastAsia="en-IN" w:bidi="mr-IN"/>
+              </w:rPr>
+            </w:pPr>
+            <w:r>
+              <w:rPr>
+                <w:rFonts w:ascii="Times New Roman" w:hAnsi="Times New Roman" w:cs="Times New Roman"/>
                 <w:color w:val="000000"/>
-                <w:lang w:eastAsia="en-IN" w:bidi="mr-IN"/>
-              </w:rPr>
-              <w:t> </w:t>
+                <w:sz w:val="24"/>
+                <w:szCs w:val="24"/>
+                <w:lang w:eastAsia="en-IN" w:bidi="mr-IN"/>
+              </w:rPr>
+              <w:t>180 Computers including 3 laptops.</w:t>
             </w:r>
           </w:p>
         </w:tc>
@@ -16286,6 +17034,8 @@
               <w:rPr>
                 <w:rFonts w:ascii="Times New Roman" w:eastAsia="Times New Roman" w:hAnsi="Times New Roman" w:cs="Times New Roman"/>
                 <w:color w:val="000000"/>
+                <w:sz w:val="24"/>
+                <w:szCs w:val="24"/>
                 <w:lang w:eastAsia="en-IN" w:bidi="mr-IN"/>
               </w:rPr>
             </w:pPr>
@@ -16293,6 +17043,18 @@
               <w:rPr>
                 <w:rFonts w:ascii="Times New Roman" w:eastAsia="Times New Roman" w:hAnsi="Times New Roman" w:cs="Times New Roman"/>
                 <w:color w:val="000000"/>
+                <w:sz w:val="24"/>
+                <w:szCs w:val="24"/>
+                <w:lang w:eastAsia="en-IN" w:bidi="mr-IN"/>
+              </w:rPr>
+              <w:t>1:1</w:t>
+            </w:r>
+            <w:r>
+              <w:rPr>
+                <w:rFonts w:ascii="Times New Roman" w:eastAsia="Times New Roman" w:hAnsi="Times New Roman" w:cs="Times New Roman"/>
+                <w:color w:val="000000"/>
+                <w:sz w:val="24"/>
+                <w:szCs w:val="24"/>
                 <w:lang w:eastAsia="en-IN" w:bidi="mr-IN"/>
               </w:rPr>
               <w:t> </w:t>
@@ -16319,6 +17081,8 @@
               <w:rPr>
                 <w:rFonts w:ascii="Times New Roman" w:eastAsia="Times New Roman" w:hAnsi="Times New Roman" w:cs="Times New Roman"/>
                 <w:color w:val="000000"/>
+                <w:sz w:val="24"/>
+                <w:szCs w:val="24"/>
                 <w:lang w:eastAsia="en-IN" w:bidi="mr-IN"/>
               </w:rPr>
             </w:pPr>
@@ -16326,17 +17090,11 @@
               <w:rPr>
                 <w:rFonts w:ascii="Times New Roman" w:eastAsia="Times New Roman" w:hAnsi="Times New Roman" w:cs="Times New Roman"/>
                 <w:color w:val="000000"/>
-                <w:lang w:eastAsia="en-IN" w:bidi="mr-IN"/>
-              </w:rPr>
-              <w:t xml:space="preserve">Anti-Virus-Net P, Window 11, </w:t>
-            </w:r>
-            <w:r>
-              <w:rPr>
-                <w:rFonts w:ascii="Times New Roman" w:eastAsia="Times New Roman" w:hAnsi="Times New Roman" w:cs="Times New Roman"/>
-                <w:color w:val="000000"/>
-                <w:lang w:eastAsia="en-IN" w:bidi="mr-IN"/>
-              </w:rPr>
-              <w:t>Office, Turbo C++, Oracle DB</w:t>
+                <w:sz w:val="24"/>
+                <w:szCs w:val="24"/>
+                <w:lang w:eastAsia="en-IN" w:bidi="mr-IN"/>
+              </w:rPr>
+              <w:t>Windows 11, Anti-virus, Oracle DB, Turbo C++, Eclipse IDE</w:t>
             </w:r>
           </w:p>
         </w:tc>
@@ -16360,6 +17118,8 @@
               <w:rPr>
                 <w:rFonts w:ascii="Times New Roman" w:eastAsia="Times New Roman" w:hAnsi="Times New Roman" w:cs="Times New Roman"/>
                 <w:color w:val="000000"/>
+                <w:sz w:val="24"/>
+                <w:szCs w:val="24"/>
                 <w:lang w:eastAsia="en-IN" w:bidi="mr-IN"/>
               </w:rPr>
             </w:pPr>
@@ -16367,6 +17127,8 @@
               <w:rPr>
                 <w:rFonts w:ascii="Times New Roman" w:eastAsia="Times New Roman" w:hAnsi="Times New Roman" w:cs="Times New Roman"/>
                 <w:color w:val="000000"/>
+                <w:sz w:val="24"/>
+                <w:szCs w:val="24"/>
                 <w:lang w:val="en-US" w:eastAsia="en-IN" w:bidi="mr-IN"/>
               </w:rPr>
               <w:t>LAN with internet connectivity</w:t>
@@ -16393,29 +17155,26 @@
               <w:rPr>
                 <w:rFonts w:ascii="Times New Roman" w:eastAsia="Times New Roman" w:hAnsi="Times New Roman" w:cs="Times New Roman"/>
                 <w:color w:val="000000"/>
-                <w:lang w:eastAsia="en-IN" w:bidi="mr-IN"/>
-              </w:rPr>
-            </w:pPr>
+                <w:sz w:val="24"/>
+                <w:szCs w:val="24"/>
+                <w:lang w:eastAsia="en-IN" w:bidi="mr-IN"/>
+              </w:rPr>
+            </w:pPr>
+            <w:r>
+              <w:rPr>
+                <w:rFonts w:ascii="Times New Roman" w:eastAsia="Times New Roman" w:hAnsi="Times New Roman" w:cs="Times New Roman"/>
+                <w:color w:val="000000"/>
+                <w:sz w:val="24"/>
+                <w:szCs w:val="24"/>
+                <w:lang w:eastAsia="en-IN" w:bidi="mr-IN"/>
+              </w:rPr>
+              <w:t>2 MFP Printers, 1 Printer with Scanner, 2 Printers, 1 Scanner.</w:t>
+            </w:r>
           </w:p>
         </w:tc>
       </w:tr>
       <w:bookmarkEnd w:id="1"/>
     </w:tbl>
-    <w:p>
-      <w:pPr>
-        <w:tabs>
-          <w:tab w:val="left" w:pos="1515"/>
-        </w:tabs>
-        <w:spacing w:before="15" w:after="240"/>
-        <w:rPr>
-          <w:rFonts w:ascii="Times New Roman" w:hAnsi="Times New Roman" w:cs="Times New Roman"/>
-          <w:b/>
-          <w:bCs/>
-          <w:sz w:val="24"/>
-          <w:szCs w:val="24"/>
-        </w:rPr>
-      </w:pPr>
-    </w:p>
     <w:p>
       <w:pPr>
         <w:pStyle w:val="ListParagraph"/>
@@ -16492,6 +17251,7 @@
     <w:p>
       <w:pPr>
         <w:pStyle w:val="BodyText"/>
+        <w:ind w:firstLine="720"/>
         <w:jc w:val="both"/>
         <w:rPr>
           <w:rFonts w:ascii="Times New Roman" w:hAnsi="Times New Roman" w:cs="Times New Roman"/>
@@ -16507,16 +17267,16 @@
         </w:rPr>
         <w:t xml:space="preserve">Language lab is available in Science Department and shared with all the departments for conducting </w:t>
       </w:r>
-      <w:proofErr w:type="spellStart"/>
+      <w:proofErr w:type="gramStart"/>
       <w:r>
         <w:rPr>
           <w:rFonts w:ascii="Times New Roman" w:hAnsi="Times New Roman" w:cs="Times New Roman"/>
           <w:sz w:val="24"/>
           <w:szCs w:val="24"/>
         </w:rPr>
-        <w:t>practicals</w:t>
-      </w:r>
-      <w:proofErr w:type="spellEnd"/>
+        <w:t>practical’s</w:t>
+      </w:r>
+      <w:proofErr w:type="gramEnd"/>
       <w:r>
         <w:rPr>
           <w:rFonts w:ascii="Times New Roman" w:hAnsi="Times New Roman" w:cs="Times New Roman"/>
@@ -17462,17 +18222,7 @@
                 <w:sz w:val="24"/>
                 <w:szCs w:val="24"/>
               </w:rPr>
-              <w:t xml:space="preserve">Language Lab equipped with model software and expert </w:t>
-            </w:r>
-            <w:r>
-              <w:rPr>
-                <w:rFonts w:ascii="Times New Roman" w:hAnsi="Times New Roman" w:cs="Times New Roman"/>
-                <w:color w:val="000000"/>
-                <w:sz w:val="24"/>
-                <w:szCs w:val="24"/>
-              </w:rPr>
-              <w:lastRenderedPageBreak/>
-              <w:t>language teachers.</w:t>
+              <w:t>Language Lab equipped with model software and expert language teachers.</w:t>
             </w:r>
           </w:p>
         </w:tc>
@@ -17506,18 +18256,7 @@
                 <w:sz w:val="24"/>
                 <w:szCs w:val="24"/>
               </w:rPr>
-              <w:lastRenderedPageBreak/>
-              <w:t xml:space="preserve">To enable students to express themselves in basic language Skills like </w:t>
-            </w:r>
-            <w:r>
-              <w:rPr>
-                <w:rFonts w:ascii="Times New Roman" w:hAnsi="Times New Roman" w:cs="Times New Roman"/>
-                <w:color w:val="000000"/>
-                <w:sz w:val="24"/>
-                <w:szCs w:val="24"/>
-              </w:rPr>
-              <w:lastRenderedPageBreak/>
-              <w:t>Listening, Speaking, Reading and Writing</w:t>
+              <w:t>To enable students to express themselves in basic language Skills like Listening, Speaking, Reading and Writing</w:t>
             </w:r>
           </w:p>
         </w:tc>
@@ -17678,7 +18417,6 @@
                 <w:sz w:val="24"/>
                 <w:szCs w:val="24"/>
               </w:rPr>
-              <w:lastRenderedPageBreak/>
               <w:t>3</w:t>
             </w:r>
           </w:p>
@@ -17801,7 +18539,6 @@
                 <w:sz w:val="24"/>
                 <w:szCs w:val="24"/>
               </w:rPr>
-              <w:lastRenderedPageBreak/>
               <w:t>4</w:t>
             </w:r>
           </w:p>
@@ -18222,7 +18959,7 @@
           <w:rPr>
             <w:noProof/>
           </w:rPr>
-          <w:t>9</w:t>
+          <w:t>10</w:t>
         </w:r>
         <w:r>
           <w:rPr>
@@ -18468,6 +19205,92 @@
     </w:lvl>
   </w:abstractNum>
   <w:abstractNum w:abstractNumId="2">
+    <w:nsid w:val="13A548F6"/>
+    <w:multiLevelType w:val="hybridMultilevel"/>
+    <w:tmpl w:val="97EEF31C"/>
+    <w:lvl w:ilvl="0" w:tplc="4009000F">
+      <w:start w:val="1"/>
+      <w:numFmt w:val="decimal"/>
+      <w:lvlText w:val="%1."/>
+      <w:lvlJc w:val="left"/>
+      <w:pPr>
+        <w:ind w:left="1496" w:hanging="360"/>
+      </w:pPr>
+    </w:lvl>
+    <w:lvl w:ilvl="1" w:tplc="40090019" w:tentative="1">
+      <w:start w:val="1"/>
+      <w:numFmt w:val="lowerLetter"/>
+      <w:lvlText w:val="%2."/>
+      <w:lvlJc w:val="left"/>
+      <w:pPr>
+        <w:ind w:left="2216" w:hanging="360"/>
+      </w:pPr>
+    </w:lvl>
+    <w:lvl w:ilvl="2" w:tplc="4009001B" w:tentative="1">
+      <w:start w:val="1"/>
+      <w:numFmt w:val="lowerRoman"/>
+      <w:lvlText w:val="%3."/>
+      <w:lvlJc w:val="right"/>
+      <w:pPr>
+        <w:ind w:left="2936" w:hanging="180"/>
+      </w:pPr>
+    </w:lvl>
+    <w:lvl w:ilvl="3" w:tplc="4009000F" w:tentative="1">
+      <w:start w:val="1"/>
+      <w:numFmt w:val="decimal"/>
+      <w:lvlText w:val="%4."/>
+      <w:lvlJc w:val="left"/>
+      <w:pPr>
+        <w:ind w:left="3656" w:hanging="360"/>
+      </w:pPr>
+    </w:lvl>
+    <w:lvl w:ilvl="4" w:tplc="40090019" w:tentative="1">
+      <w:start w:val="1"/>
+      <w:numFmt w:val="lowerLetter"/>
+      <w:lvlText w:val="%5."/>
+      <w:lvlJc w:val="left"/>
+      <w:pPr>
+        <w:ind w:left="4376" w:hanging="360"/>
+      </w:pPr>
+    </w:lvl>
+    <w:lvl w:ilvl="5" w:tplc="4009001B" w:tentative="1">
+      <w:start w:val="1"/>
+      <w:numFmt w:val="lowerRoman"/>
+      <w:lvlText w:val="%6."/>
+      <w:lvlJc w:val="right"/>
+      <w:pPr>
+        <w:ind w:left="5096" w:hanging="180"/>
+      </w:pPr>
+    </w:lvl>
+    <w:lvl w:ilvl="6" w:tplc="4009000F" w:tentative="1">
+      <w:start w:val="1"/>
+      <w:numFmt w:val="decimal"/>
+      <w:lvlText w:val="%7."/>
+      <w:lvlJc w:val="left"/>
+      <w:pPr>
+        <w:ind w:left="5816" w:hanging="360"/>
+      </w:pPr>
+    </w:lvl>
+    <w:lvl w:ilvl="7" w:tplc="40090019" w:tentative="1">
+      <w:start w:val="1"/>
+      <w:numFmt w:val="lowerLetter"/>
+      <w:lvlText w:val="%8."/>
+      <w:lvlJc w:val="left"/>
+      <w:pPr>
+        <w:ind w:left="6536" w:hanging="360"/>
+      </w:pPr>
+    </w:lvl>
+    <w:lvl w:ilvl="8" w:tplc="4009001B" w:tentative="1">
+      <w:start w:val="1"/>
+      <w:numFmt w:val="lowerRoman"/>
+      <w:lvlText w:val="%9."/>
+      <w:lvlJc w:val="right"/>
+      <w:pPr>
+        <w:ind w:left="7256" w:hanging="180"/>
+      </w:pPr>
+    </w:lvl>
+  </w:abstractNum>
+  <w:abstractNum w:abstractNumId="3">
     <w:nsid w:val="22E435A1"/>
     <w:multiLevelType w:val="hybridMultilevel"/>
     <w:tmpl w:val="83F0255C"/>
@@ -18553,7 +19376,7 @@
       </w:pPr>
     </w:lvl>
   </w:abstractNum>
-  <w:abstractNum w:abstractNumId="3">
+  <w:abstractNum w:abstractNumId="4">
     <w:nsid w:val="2B0D59BA"/>
     <w:multiLevelType w:val="hybridMultilevel"/>
     <w:tmpl w:val="4F6C47EE"/>
@@ -18642,7 +19465,7 @@
       </w:pPr>
     </w:lvl>
   </w:abstractNum>
-  <w:abstractNum w:abstractNumId="4">
+  <w:abstractNum w:abstractNumId="5">
     <w:nsid w:val="32FC31F8"/>
     <w:multiLevelType w:val="hybridMultilevel"/>
     <w:tmpl w:val="83F0255C"/>
@@ -18728,7 +19551,7 @@
       </w:pPr>
     </w:lvl>
   </w:abstractNum>
-  <w:abstractNum w:abstractNumId="5">
+  <w:abstractNum w:abstractNumId="6">
     <w:nsid w:val="3D9B18D7"/>
     <w:multiLevelType w:val="hybridMultilevel"/>
     <w:tmpl w:val="83F0255C"/>
@@ -18814,7 +19637,7 @@
       </w:pPr>
     </w:lvl>
   </w:abstractNum>
-  <w:abstractNum w:abstractNumId="6">
+  <w:abstractNum w:abstractNumId="7">
     <w:nsid w:val="3FE44EB8"/>
     <w:multiLevelType w:val="hybridMultilevel"/>
     <w:tmpl w:val="9BFA6D7A"/>
@@ -18927,7 +19750,7 @@
       </w:rPr>
     </w:lvl>
   </w:abstractNum>
-  <w:abstractNum w:abstractNumId="7">
+  <w:abstractNum w:abstractNumId="8">
     <w:nsid w:val="4432768E"/>
     <w:multiLevelType w:val="hybridMultilevel"/>
     <w:tmpl w:val="D43459DE"/>
@@ -19013,7 +19836,7 @@
       </w:pPr>
     </w:lvl>
   </w:abstractNum>
-  <w:abstractNum w:abstractNumId="8">
+  <w:abstractNum w:abstractNumId="9">
     <w:nsid w:val="47CC3126"/>
     <w:multiLevelType w:val="hybridMultilevel"/>
     <w:tmpl w:val="777C42F2"/>
@@ -19099,7 +19922,7 @@
       </w:pPr>
     </w:lvl>
   </w:abstractNum>
-  <w:abstractNum w:abstractNumId="9">
+  <w:abstractNum w:abstractNumId="10">
     <w:nsid w:val="4D0624D6"/>
     <w:multiLevelType w:val="multilevel"/>
     <w:tmpl w:val="D3783F7C"/>
@@ -19248,7 +20071,7 @@
       </w:rPr>
     </w:lvl>
   </w:abstractNum>
-  <w:abstractNum w:abstractNumId="10">
+  <w:abstractNum w:abstractNumId="11">
     <w:nsid w:val="5190363A"/>
     <w:multiLevelType w:val="hybridMultilevel"/>
     <w:tmpl w:val="520AC7A8"/>
@@ -19337,7 +20160,7 @@
       </w:pPr>
     </w:lvl>
   </w:abstractNum>
-  <w:abstractNum w:abstractNumId="11">
+  <w:abstractNum w:abstractNumId="12">
     <w:nsid w:val="56931A61"/>
     <w:multiLevelType w:val="hybridMultilevel"/>
     <w:tmpl w:val="83F0255C"/>
@@ -19423,7 +20246,7 @@
       </w:pPr>
     </w:lvl>
   </w:abstractNum>
-  <w:abstractNum w:abstractNumId="12">
+  <w:abstractNum w:abstractNumId="13">
     <w:nsid w:val="569E43CB"/>
     <w:multiLevelType w:val="multilevel"/>
     <w:tmpl w:val="F6E8E812"/>
@@ -19572,7 +20395,7 @@
       </w:rPr>
     </w:lvl>
   </w:abstractNum>
-  <w:abstractNum w:abstractNumId="13">
+  <w:abstractNum w:abstractNumId="14">
     <w:nsid w:val="60210B7D"/>
     <w:multiLevelType w:val="hybridMultilevel"/>
     <w:tmpl w:val="83F0255C"/>
@@ -19658,7 +20481,7 @@
       </w:pPr>
     </w:lvl>
   </w:abstractNum>
-  <w:abstractNum w:abstractNumId="14">
+  <w:abstractNum w:abstractNumId="15">
     <w:nsid w:val="62E245D1"/>
     <w:multiLevelType w:val="hybridMultilevel"/>
     <w:tmpl w:val="D7BCC384"/>
@@ -19747,7 +20570,7 @@
       </w:pPr>
     </w:lvl>
   </w:abstractNum>
-  <w:abstractNum w:abstractNumId="15">
+  <w:abstractNum w:abstractNumId="16">
     <w:nsid w:val="72592107"/>
     <w:multiLevelType w:val="hybridMultilevel"/>
     <w:tmpl w:val="11286B56"/>
@@ -19860,7 +20683,7 @@
       </w:rPr>
     </w:lvl>
   </w:abstractNum>
-  <w:abstractNum w:abstractNumId="16">
+  <w:abstractNum w:abstractNumId="17">
     <w:nsid w:val="748E3172"/>
     <w:multiLevelType w:val="multilevel"/>
     <w:tmpl w:val="45BCD31C"/>
@@ -20009,7 +20832,7 @@
       </w:rPr>
     </w:lvl>
   </w:abstractNum>
-  <w:abstractNum w:abstractNumId="17">
+  <w:abstractNum w:abstractNumId="18">
     <w:nsid w:val="7C1175E4"/>
     <w:multiLevelType w:val="multilevel"/>
     <w:tmpl w:val="B6CE8E78"/>
@@ -20122,7 +20945,7 @@
       </w:rPr>
     </w:lvl>
   </w:abstractNum>
-  <w:abstractNum w:abstractNumId="18">
+  <w:abstractNum w:abstractNumId="19">
     <w:nsid w:val="7DF02EF7"/>
     <w:multiLevelType w:val="hybridMultilevel"/>
     <w:tmpl w:val="5964D96A"/>
@@ -20211,7 +21034,7 @@
       </w:pPr>
     </w:lvl>
   </w:abstractNum>
-  <w:abstractNum w:abstractNumId="19">
+  <w:abstractNum w:abstractNumId="20">
     <w:nsid w:val="7F715C9C"/>
     <w:multiLevelType w:val="hybridMultilevel"/>
     <w:tmpl w:val="1AD0F918"/>
@@ -20298,64 +21121,67 @@
     </w:lvl>
   </w:abstractNum>
   <w:num w:numId="1">
+    <w:abstractNumId w:val="16"/>
+  </w:num>
+  <w:num w:numId="2">
     <w:abstractNumId w:val="15"/>
   </w:num>
-  <w:num w:numId="2">
-    <w:abstractNumId w:val="14"/>
-  </w:num>
   <w:num w:numId="3">
-    <w:abstractNumId w:val="18"/>
+    <w:abstractNumId w:val="19"/>
   </w:num>
   <w:num w:numId="4">
-    <w:abstractNumId w:val="6"/>
+    <w:abstractNumId w:val="7"/>
   </w:num>
   <w:num w:numId="5">
-    <w:abstractNumId w:val="10"/>
+    <w:abstractNumId w:val="11"/>
   </w:num>
   <w:num w:numId="6">
-    <w:abstractNumId w:val="17"/>
+    <w:abstractNumId w:val="18"/>
   </w:num>
   <w:num w:numId="7">
     <w:abstractNumId w:val="1"/>
   </w:num>
   <w:num w:numId="8">
-    <w:abstractNumId w:val="3"/>
+    <w:abstractNumId w:val="4"/>
   </w:num>
   <w:num w:numId="9">
+    <w:abstractNumId w:val="13"/>
+  </w:num>
+  <w:num w:numId="10">
+    <w:abstractNumId w:val="10"/>
+  </w:num>
+  <w:num w:numId="11">
+    <w:abstractNumId w:val="17"/>
+  </w:num>
+  <w:num w:numId="12">
+    <w:abstractNumId w:val="9"/>
+  </w:num>
+  <w:num w:numId="13">
+    <w:abstractNumId w:val="5"/>
+  </w:num>
+  <w:num w:numId="14">
+    <w:abstractNumId w:val="8"/>
+  </w:num>
+  <w:num w:numId="15">
+    <w:abstractNumId w:val="20"/>
+  </w:num>
+  <w:num w:numId="16">
+    <w:abstractNumId w:val="6"/>
+  </w:num>
+  <w:num w:numId="17">
+    <w:abstractNumId w:val="14"/>
+  </w:num>
+  <w:num w:numId="18">
     <w:abstractNumId w:val="12"/>
   </w:num>
-  <w:num w:numId="10">
-    <w:abstractNumId w:val="9"/>
-  </w:num>
-  <w:num w:numId="11">
-    <w:abstractNumId w:val="16"/>
-  </w:num>
-  <w:num w:numId="12">
-    <w:abstractNumId w:val="8"/>
-  </w:num>
-  <w:num w:numId="13">
-    <w:abstractNumId w:val="4"/>
-  </w:num>
-  <w:num w:numId="14">
-    <w:abstractNumId w:val="7"/>
-  </w:num>
-  <w:num w:numId="15">
-    <w:abstractNumId w:val="19"/>
-  </w:num>
-  <w:num w:numId="16">
-    <w:abstractNumId w:val="5"/>
-  </w:num>
-  <w:num w:numId="17">
-    <w:abstractNumId w:val="13"/>
-  </w:num>
-  <w:num w:numId="18">
-    <w:abstractNumId w:val="11"/>
-  </w:num>
   <w:num w:numId="19">
-    <w:abstractNumId w:val="2"/>
+    <w:abstractNumId w:val="3"/>
   </w:num>
   <w:num w:numId="20">
     <w:abstractNumId w:val="0"/>
+  </w:num>
+  <w:num w:numId="21">
+    <w:abstractNumId w:val="2"/>
   </w:num>
 </w:numbering>
 </file>
@@ -21460,7 +22286,7 @@
 </file>
 
 <file path=customXml/itemProps1.xml><?xml version="1.0" encoding="utf-8"?>
-<ds:datastoreItem xmlns:ds="http://schemas.openxmlformats.org/officeDocument/2006/customXml" ds:itemID="{AA195C5D-E2D7-44A1-808A-13D0EAAA34B5}">
+<ds:datastoreItem xmlns:ds="http://schemas.openxmlformats.org/officeDocument/2006/customXml" ds:itemID="{B4CC5481-278B-40C2-B8BD-3228E62889D4}">
   <ds:schemaRefs>
     <ds:schemaRef ds:uri="http://schemas.openxmlformats.org/officeDocument/2006/bibliography"/>
   </ds:schemaRefs>

</xml_diff>

<commit_message>
Added Equipments of BEE subject
</commit_message>
<xml_diff>
--- a/C6/C6 Documentation/ADA NBA C6 05 06 26  .docx
+++ b/C6/C6 Documentation/ADA NBA C6 05 06 26  .docx
@@ -4804,6 +4804,9 @@
         </w:tc>
       </w:tr>
       <w:tr>
+        <w:trPr>
+          <w:trHeight w:val="1475"/>
+        </w:trPr>
         <w:tc>
           <w:tcPr>
             <w:tcW w:w="284" w:type="pct"/>
@@ -4903,6 +4906,115 @@
                 <w:szCs w:val="24"/>
               </w:rPr>
             </w:pPr>
+            <w:r>
+              <w:rPr>
+                <w:rFonts w:ascii="Times New Roman" w:hAnsi="Times New Roman" w:cs="Times New Roman"/>
+                <w:sz w:val="24"/>
+                <w:szCs w:val="24"/>
+              </w:rPr>
+              <w:t>Ammeter</w:t>
+            </w:r>
+            <w:r>
+              <w:rPr>
+                <w:rFonts w:ascii="Times New Roman" w:hAnsi="Times New Roman" w:cs="Times New Roman"/>
+                <w:sz w:val="24"/>
+                <w:szCs w:val="24"/>
+              </w:rPr>
+              <w:t xml:space="preserve">, </w:t>
+            </w:r>
+            <w:r>
+              <w:rPr>
+                <w:rFonts w:ascii="Times New Roman" w:hAnsi="Times New Roman" w:cs="Times New Roman"/>
+                <w:sz w:val="24"/>
+                <w:szCs w:val="24"/>
+              </w:rPr>
+              <w:t>Wattmeter</w:t>
+            </w:r>
+            <w:r>
+              <w:rPr>
+                <w:rFonts w:ascii="Times New Roman" w:hAnsi="Times New Roman" w:cs="Times New Roman"/>
+                <w:sz w:val="24"/>
+                <w:szCs w:val="24"/>
+              </w:rPr>
+              <w:t xml:space="preserve">, </w:t>
+            </w:r>
+            <w:r>
+              <w:rPr>
+                <w:rFonts w:ascii="Times New Roman" w:hAnsi="Times New Roman" w:cs="Times New Roman"/>
+                <w:sz w:val="24"/>
+                <w:szCs w:val="24"/>
+              </w:rPr>
+              <w:t>Voltmeter</w:t>
+            </w:r>
+            <w:r>
+              <w:rPr>
+                <w:rFonts w:ascii="Times New Roman" w:hAnsi="Times New Roman" w:cs="Times New Roman"/>
+                <w:sz w:val="24"/>
+                <w:szCs w:val="24"/>
+              </w:rPr>
+              <w:t xml:space="preserve">, </w:t>
+            </w:r>
+            <w:r>
+              <w:rPr>
+                <w:rFonts w:ascii="Times New Roman" w:hAnsi="Times New Roman" w:cs="Times New Roman"/>
+                <w:sz w:val="24"/>
+                <w:szCs w:val="24"/>
+              </w:rPr>
+              <w:t>CRO( OSCILLOSCOPE )</w:t>
+            </w:r>
+            <w:r>
+              <w:rPr>
+                <w:rFonts w:ascii="Times New Roman" w:hAnsi="Times New Roman" w:cs="Times New Roman"/>
+                <w:sz w:val="24"/>
+                <w:szCs w:val="24"/>
+              </w:rPr>
+              <w:t xml:space="preserve">, </w:t>
+            </w:r>
+            <w:r>
+              <w:rPr>
+                <w:rFonts w:ascii="Times New Roman" w:hAnsi="Times New Roman" w:cs="Times New Roman"/>
+                <w:sz w:val="24"/>
+                <w:szCs w:val="24"/>
+              </w:rPr>
+              <w:t>Ammeter 0-1 (amp DC)</w:t>
+            </w:r>
+            <w:r>
+              <w:rPr>
+                <w:rFonts w:ascii="Times New Roman" w:hAnsi="Times New Roman" w:cs="Times New Roman"/>
+                <w:sz w:val="24"/>
+                <w:szCs w:val="24"/>
+              </w:rPr>
+              <w:t>,</w:t>
+            </w:r>
+            <w:r>
+              <w:t xml:space="preserve"> </w:t>
+            </w:r>
+            <w:r>
+              <w:rPr>
+                <w:rFonts w:ascii="Times New Roman" w:hAnsi="Times New Roman" w:cs="Times New Roman"/>
+                <w:sz w:val="24"/>
+                <w:szCs w:val="24"/>
+              </w:rPr>
+              <w:t>Voltmeter 0-230  VOLT (DC)</w:t>
+            </w:r>
+            <w:r>
+              <w:rPr>
+                <w:rFonts w:ascii="Times New Roman" w:hAnsi="Times New Roman" w:cs="Times New Roman"/>
+                <w:sz w:val="24"/>
+                <w:szCs w:val="24"/>
+              </w:rPr>
+              <w:t xml:space="preserve">, </w:t>
+            </w:r>
+            <w:r>
+              <w:rPr>
+                <w:rFonts w:ascii="Times New Roman" w:hAnsi="Times New Roman" w:cs="Times New Roman"/>
+                <w:sz w:val="24"/>
+                <w:szCs w:val="24"/>
+              </w:rPr>
+              <w:t>KVL KCL KIT</w:t>
+            </w:r>
+            <w:bookmarkStart w:id="0" w:name="_GoBack"/>
+            <w:bookmarkEnd w:id="0"/>
           </w:p>
         </w:tc>
         <w:tc>
@@ -12675,19 +12787,7 @@
                 <w:szCs w:val="24"/>
                 <w:lang w:eastAsia="en-IN" w:bidi="mr-IN"/>
               </w:rPr>
-              <w:t>Used for MSBTE Examination as well as Baseline Test conducted by MSB</w:t>
-            </w:r>
-            <w:bookmarkStart w:id="0" w:name="_GoBack"/>
-            <w:bookmarkEnd w:id="0"/>
-            <w:r>
-              <w:rPr>
-                <w:rFonts w:ascii="Times New Roman" w:eastAsia="Times New Roman" w:hAnsi="Times New Roman" w:cs="Times New Roman"/>
-                <w:color w:val="1F1F1F"/>
-                <w:sz w:val="24"/>
-                <w:szCs w:val="24"/>
-                <w:lang w:eastAsia="en-IN" w:bidi="mr-IN"/>
-              </w:rPr>
-              <w:t>TE each semester.</w:t>
+              <w:t>Used for MSBTE Examination as well as Baseline Test conducted by MSBTE each semester.</w:t>
             </w:r>
           </w:p>
         </w:tc>
@@ -13464,15 +13564,7 @@
                 <w:color w:val="1F1F1F"/>
                 <w:lang w:eastAsia="en-IN" w:bidi="mr-IN"/>
               </w:rPr>
-              <w:t>Guest</w:t>
-            </w:r>
-            <w:r>
-              <w:rPr>
-                <w:rFonts w:ascii="Times New Roman" w:eastAsia="Times New Roman" w:hAnsi="Times New Roman" w:cs="Times New Roman"/>
-                <w:color w:val="1F1F1F"/>
-                <w:lang w:eastAsia="en-IN" w:bidi="mr-IN"/>
-              </w:rPr>
-              <w:t xml:space="preserve">/Expert Lecture </w:t>
+              <w:t xml:space="preserve">Guest/Expert Lecture </w:t>
             </w:r>
             <w:proofErr w:type="spellStart"/>
             <w:r>
@@ -13518,17 +13610,7 @@
                 <w:szCs w:val="24"/>
                 <w:lang w:eastAsia="en-IN" w:bidi="mr-IN"/>
               </w:rPr>
-              <w:t xml:space="preserve">Used by students for </w:t>
-            </w:r>
-            <w:r>
-              <w:rPr>
-                <w:rFonts w:ascii="Times New Roman" w:eastAsia="Times New Roman" w:hAnsi="Times New Roman" w:cs="Times New Roman"/>
-                <w:color w:val="1F1F1F"/>
-                <w:sz w:val="24"/>
-                <w:szCs w:val="24"/>
-                <w:lang w:eastAsia="en-IN" w:bidi="mr-IN"/>
-              </w:rPr>
-              <w:t xml:space="preserve">seminars on Self learning Activity, Capstone Project </w:t>
+              <w:t xml:space="preserve">Used by students for seminars on Self learning Activity, Capstone Project </w:t>
             </w:r>
             <w:r>
               <w:rPr>
@@ -17010,7 +17092,57 @@
                 <w:szCs w:val="24"/>
                 <w:lang w:eastAsia="en-IN" w:bidi="mr-IN"/>
               </w:rPr>
-              <w:t>180 Computers including 3 laptops.</w:t>
+              <w:t>1</w:t>
+            </w:r>
+            <w:r>
+              <w:rPr>
+                <w:rFonts w:ascii="Times New Roman" w:hAnsi="Times New Roman" w:cs="Times New Roman"/>
+                <w:color w:val="000000"/>
+                <w:sz w:val="24"/>
+                <w:szCs w:val="24"/>
+                <w:lang w:eastAsia="en-IN" w:bidi="mr-IN"/>
+              </w:rPr>
+              <w:t>7</w:t>
+            </w:r>
+            <w:r>
+              <w:rPr>
+                <w:rFonts w:ascii="Times New Roman" w:hAnsi="Times New Roman" w:cs="Times New Roman"/>
+                <w:color w:val="000000"/>
+                <w:sz w:val="24"/>
+                <w:szCs w:val="24"/>
+                <w:lang w:eastAsia="en-IN" w:bidi="mr-IN"/>
+              </w:rPr>
+              <w:t xml:space="preserve">0 </w:t>
+            </w:r>
+            <w:r>
+              <w:rPr>
+                <w:rFonts w:ascii="Times New Roman" w:hAnsi="Times New Roman" w:cs="Times New Roman"/>
+                <w:color w:val="000000"/>
+                <w:sz w:val="24"/>
+                <w:szCs w:val="24"/>
+                <w:lang w:eastAsia="en-IN" w:bidi="mr-IN"/>
+              </w:rPr>
+              <w:t>+</w:t>
+            </w:r>
+            <w:r>
+              <w:rPr>
+                <w:rFonts w:ascii="Times New Roman" w:hAnsi="Times New Roman" w:cs="Times New Roman"/>
+                <w:color w:val="000000"/>
+                <w:sz w:val="24"/>
+                <w:szCs w:val="24"/>
+                <w:lang w:eastAsia="en-IN" w:bidi="mr-IN"/>
+              </w:rPr>
+              <w:t xml:space="preserve"> </w:t>
+            </w:r>
+            <w:r>
+              <w:rPr>
+                <w:rFonts w:ascii="Times New Roman" w:hAnsi="Times New Roman" w:cs="Times New Roman"/>
+                <w:color w:val="000000"/>
+                <w:sz w:val="24"/>
+                <w:szCs w:val="24"/>
+                <w:lang w:eastAsia="en-IN" w:bidi="mr-IN"/>
+              </w:rPr>
+              <w:t>Computers including 3 laptops.</w:t>
             </w:r>
           </w:p>
         </w:tc>
@@ -17267,16 +17399,16 @@
         </w:rPr>
         <w:t xml:space="preserve">Language lab is available in Science Department and shared with all the departments for conducting </w:t>
       </w:r>
-      <w:proofErr w:type="gramStart"/>
+      <w:proofErr w:type="spellStart"/>
       <w:r>
         <w:rPr>
           <w:rFonts w:ascii="Times New Roman" w:hAnsi="Times New Roman" w:cs="Times New Roman"/>
           <w:sz w:val="24"/>
           <w:szCs w:val="24"/>
         </w:rPr>
-        <w:t>practical’s</w:t>
-      </w:r>
-      <w:proofErr w:type="gramEnd"/>
+        <w:t>practicals</w:t>
+      </w:r>
+      <w:proofErr w:type="spellEnd"/>
       <w:r>
         <w:rPr>
           <w:rFonts w:ascii="Times New Roman" w:hAnsi="Times New Roman" w:cs="Times New Roman"/>
@@ -17306,25 +17438,25 @@
       <w:tblPr>
         <w:tblStyle w:val="TableGrid"/>
         <w:tblpPr w:leftFromText="180" w:rightFromText="180" w:vertAnchor="text" w:horzAnchor="margin" w:tblpX="-147" w:tblpY="263"/>
-        <w:tblW w:w="5000" w:type="pct"/>
+        <w:tblW w:w="5197" w:type="pct"/>
         <w:shd w:val="clear" w:color="auto" w:fill="FFFFFF" w:themeFill="background1"/>
         <w:tblLook w:val="04A0" w:firstRow="1" w:lastRow="0" w:firstColumn="1" w:lastColumn="0" w:noHBand="0" w:noVBand="1"/>
       </w:tblPr>
       <w:tblGrid>
-        <w:gridCol w:w="1403"/>
-        <w:gridCol w:w="1110"/>
-        <w:gridCol w:w="1406"/>
-        <w:gridCol w:w="2451"/>
-        <w:gridCol w:w="1430"/>
-        <w:gridCol w:w="1608"/>
+        <w:gridCol w:w="1464"/>
+        <w:gridCol w:w="1154"/>
+        <w:gridCol w:w="1461"/>
+        <w:gridCol w:w="2548"/>
+        <w:gridCol w:w="1486"/>
+        <w:gridCol w:w="1666"/>
       </w:tblGrid>
       <w:tr>
         <w:trPr>
-          <w:trHeight w:val="869"/>
+          <w:trHeight w:val="994"/>
         </w:trPr>
         <w:tc>
           <w:tcPr>
-            <w:tcW w:w="672" w:type="pct"/>
+            <w:tcW w:w="748" w:type="pct"/>
             <w:shd w:val="clear" w:color="auto" w:fill="FFFFFF" w:themeFill="background1"/>
           </w:tcPr>
           <w:p>
@@ -17356,7 +17488,7 @@
         </w:tc>
         <w:tc>
           <w:tcPr>
-            <w:tcW w:w="597" w:type="pct"/>
+            <w:tcW w:w="590" w:type="pct"/>
             <w:shd w:val="clear" w:color="auto" w:fill="FFFFFF" w:themeFill="background1"/>
           </w:tcPr>
           <w:p>
@@ -17388,7 +17520,7 @@
         </w:tc>
         <w:tc>
           <w:tcPr>
-            <w:tcW w:w="821" w:type="pct"/>
+            <w:tcW w:w="747" w:type="pct"/>
             <w:shd w:val="clear" w:color="auto" w:fill="FFFFFF" w:themeFill="background1"/>
           </w:tcPr>
           <w:p>
@@ -17420,7 +17552,7 @@
         </w:tc>
         <w:tc>
           <w:tcPr>
-            <w:tcW w:w="1343" w:type="pct"/>
+            <w:tcW w:w="1303" w:type="pct"/>
             <w:shd w:val="clear" w:color="auto" w:fill="FFFFFF" w:themeFill="background1"/>
           </w:tcPr>
           <w:p>
@@ -17452,7 +17584,7 @@
         </w:tc>
         <w:tc>
           <w:tcPr>
-            <w:tcW w:w="672" w:type="pct"/>
+            <w:tcW w:w="760" w:type="pct"/>
             <w:shd w:val="clear" w:color="auto" w:fill="FFFFFF" w:themeFill="background1"/>
           </w:tcPr>
           <w:p>
@@ -17484,7 +17616,7 @@
         </w:tc>
         <w:tc>
           <w:tcPr>
-            <w:tcW w:w="895" w:type="pct"/>
+            <w:tcW w:w="853" w:type="pct"/>
             <w:shd w:val="clear" w:color="auto" w:fill="FFFFFF" w:themeFill="background1"/>
           </w:tcPr>
           <w:p>
@@ -17517,11 +17649,11 @@
       </w:tr>
       <w:tr>
         <w:trPr>
-          <w:trHeight w:val="3181"/>
+          <w:trHeight w:val="2356"/>
         </w:trPr>
         <w:tc>
           <w:tcPr>
-            <w:tcW w:w="672" w:type="pct"/>
+            <w:tcW w:w="748" w:type="pct"/>
             <w:shd w:val="clear" w:color="auto" w:fill="FFFFFF" w:themeFill="background1"/>
           </w:tcPr>
           <w:p>
@@ -17624,7 +17756,7 @@
         </w:tc>
         <w:tc>
           <w:tcPr>
-            <w:tcW w:w="597" w:type="pct"/>
+            <w:tcW w:w="590" w:type="pct"/>
             <w:shd w:val="clear" w:color="auto" w:fill="FFFFFF" w:themeFill="background1"/>
           </w:tcPr>
           <w:p>
@@ -17679,7 +17811,7 @@
         </w:tc>
         <w:tc>
           <w:tcPr>
-            <w:tcW w:w="821" w:type="pct"/>
+            <w:tcW w:w="747" w:type="pct"/>
             <w:shd w:val="clear" w:color="auto" w:fill="FFFFFF" w:themeFill="background1"/>
             <w:vAlign w:val="center"/>
           </w:tcPr>
@@ -17748,7 +17880,7 @@
         </w:tc>
         <w:tc>
           <w:tcPr>
-            <w:tcW w:w="1343" w:type="pct"/>
+            <w:tcW w:w="1303" w:type="pct"/>
             <w:shd w:val="clear" w:color="auto" w:fill="FFFFFF" w:themeFill="background1"/>
           </w:tcPr>
           <w:p>
@@ -17794,7 +17926,7 @@
         </w:tc>
         <w:tc>
           <w:tcPr>
-            <w:tcW w:w="672" w:type="pct"/>
+            <w:tcW w:w="760" w:type="pct"/>
             <w:shd w:val="clear" w:color="auto" w:fill="FFFFFF" w:themeFill="background1"/>
           </w:tcPr>
           <w:p>
@@ -17872,7 +18004,7 @@
         </w:tc>
         <w:tc>
           <w:tcPr>
-            <w:tcW w:w="895" w:type="pct"/>
+            <w:tcW w:w="853" w:type="pct"/>
             <w:shd w:val="clear" w:color="auto" w:fill="FFFFFF" w:themeFill="background1"/>
           </w:tcPr>
           <w:p>
@@ -17912,30 +18044,19 @@
         <w:ind w:left="862"/>
         <w:rPr>
           <w:rFonts w:ascii="Times New Roman" w:hAnsi="Times New Roman" w:cs="Times New Roman"/>
-          <w:b/>
+          <w:bCs/>
           <w:sz w:val="24"/>
           <w:szCs w:val="24"/>
         </w:rPr>
       </w:pPr>
-    </w:p>
-    <w:p>
-      <w:pPr>
-        <w:spacing w:after="42"/>
-        <w:ind w:left="862"/>
+      <w:r>
         <w:rPr>
           <w:rFonts w:ascii="Times New Roman" w:hAnsi="Times New Roman" w:cs="Times New Roman"/>
           <w:bCs/>
           <w:sz w:val="24"/>
           <w:szCs w:val="24"/>
         </w:rPr>
-      </w:pPr>
-      <w:r>
-        <w:rPr>
-          <w:rFonts w:ascii="Times New Roman" w:hAnsi="Times New Roman" w:cs="Times New Roman"/>
-          <w:bCs/>
-          <w:sz w:val="24"/>
-          <w:szCs w:val="24"/>
-        </w:rPr>
+        <w:lastRenderedPageBreak/>
         <w:t>Skills imparted using above learning resources:</w:t>
       </w:r>
     </w:p>
@@ -18959,7 +19080,7 @@
           <w:rPr>
             <w:noProof/>
           </w:rPr>
-          <w:t>10</w:t>
+          <w:t>2</w:t>
         </w:r>
         <w:r>
           <w:rPr>
@@ -22286,7 +22407,7 @@
 </file>
 
 <file path=customXml/itemProps1.xml><?xml version="1.0" encoding="utf-8"?>
-<ds:datastoreItem xmlns:ds="http://schemas.openxmlformats.org/officeDocument/2006/customXml" ds:itemID="{B4CC5481-278B-40C2-B8BD-3228E62889D4}">
+<ds:datastoreItem xmlns:ds="http://schemas.openxmlformats.org/officeDocument/2006/customXml" ds:itemID="{ABEE938F-FB88-4BB9-8A55-8F90613FA7D0}">
   <ds:schemaRefs>
     <ds:schemaRef ds:uri="http://schemas.openxmlformats.org/officeDocument/2006/bibliography"/>
   </ds:schemaRefs>

</xml_diff>

<commit_message>
Added Photos and Content to C6 file
</commit_message>
<xml_diff>
--- a/C6/C6 Documentation/ADA NBA C6 05 06 26  .docx
+++ b/C6/C6 Documentation/ADA NBA C6 05 06 26  .docx
@@ -1,6 +1,6 @@
 
 <file path=word/document.xml><?xml version="1.0" encoding="utf-8"?>
-<w:document xmlns:wpc="http://schemas.microsoft.com/office/word/2010/wordprocessingCanvas" xmlns:mc="http://schemas.openxmlformats.org/markup-compatibility/2006" xmlns:o="urn:schemas-microsoft-com:office:office" xmlns:r="http://schemas.openxmlformats.org/officeDocument/2006/relationships" xmlns:m="http://schemas.openxmlformats.org/officeDocument/2006/math" xmlns:v="urn:schemas-microsoft-com:vml" xmlns:wp14="http://schemas.microsoft.com/office/word/2010/wordprocessingDrawing" xmlns:wp="http://schemas.openxmlformats.org/drawingml/2006/wordprocessingDrawing" xmlns:w10="urn:schemas-microsoft-com:office:word" xmlns:w="http://schemas.openxmlformats.org/wordprocessingml/2006/main" xmlns:w14="http://schemas.microsoft.com/office/word/2010/wordml" xmlns:wpg="http://schemas.microsoft.com/office/word/2010/wordprocessingGroup" xmlns:wpi="http://schemas.microsoft.com/office/word/2010/wordprocessingInk" xmlns:wne="http://schemas.microsoft.com/office/word/2006/wordml" xmlns:wps="http://schemas.microsoft.com/office/word/2010/wordprocessingShape" mc:Ignorable="w14 wp14">
+<w:document xmlns:wpc="http://schemas.microsoft.com/office/word/2010/wordprocessingCanvas" xmlns:cx="http://schemas.microsoft.com/office/drawing/2014/chartex" xmlns:cx1="http://schemas.microsoft.com/office/drawing/2015/9/8/chartex" xmlns:cx2="http://schemas.microsoft.com/office/drawing/2015/10/21/chartex" xmlns:cx3="http://schemas.microsoft.com/office/drawing/2016/5/9/chartex" xmlns:cx4="http://schemas.microsoft.com/office/drawing/2016/5/10/chartex" xmlns:cx5="http://schemas.microsoft.com/office/drawing/2016/5/11/chartex" xmlns:cx6="http://schemas.microsoft.com/office/drawing/2016/5/12/chartex" xmlns:cx7="http://schemas.microsoft.com/office/drawing/2016/5/13/chartex" xmlns:cx8="http://schemas.microsoft.com/office/drawing/2016/5/14/chartex" xmlns:mc="http://schemas.openxmlformats.org/markup-compatibility/2006" xmlns:aink="http://schemas.microsoft.com/office/drawing/2016/ink" xmlns:am3d="http://schemas.microsoft.com/office/drawing/2017/model3d" xmlns:o="urn:schemas-microsoft-com:office:office" xmlns:oel="http://schemas.microsoft.com/office/2019/extlst" xmlns:r="http://schemas.openxmlformats.org/officeDocument/2006/relationships" xmlns:m="http://schemas.openxmlformats.org/officeDocument/2006/math" xmlns:v="urn:schemas-microsoft-com:vml" xmlns:wp14="http://schemas.microsoft.com/office/word/2010/wordprocessingDrawing" xmlns:wp="http://schemas.openxmlformats.org/drawingml/2006/wordprocessingDrawing" xmlns:w10="urn:schemas-microsoft-com:office:word" xmlns:w="http://schemas.openxmlformats.org/wordprocessingml/2006/main" xmlns:w14="http://schemas.microsoft.com/office/word/2010/wordml" xmlns:w15="http://schemas.microsoft.com/office/word/2012/wordml" xmlns:w16cex="http://schemas.microsoft.com/office/word/2018/wordml/cex" xmlns:w16cid="http://schemas.microsoft.com/office/word/2016/wordml/cid" xmlns:w16="http://schemas.microsoft.com/office/word/2018/wordml" xmlns:w16du="http://schemas.microsoft.com/office/word/2023/wordml/word16du" xmlns:w16sdtdh="http://schemas.microsoft.com/office/word/2020/wordml/sdtdatahash" xmlns:w16se="http://schemas.microsoft.com/office/word/2015/wordml/symex" xmlns:wpg="http://schemas.microsoft.com/office/word/2010/wordprocessingGroup" xmlns:wpi="http://schemas.microsoft.com/office/word/2010/wordprocessingInk" xmlns:wne="http://schemas.microsoft.com/office/word/2006/wordml" xmlns:wps="http://schemas.microsoft.com/office/word/2010/wordprocessingShape" mc:Ignorable="w14 w15 w16se w16cid w16 w16cex w16sdtdh w16du wp14">
   <w:body>
     <w:tbl>
       <w:tblPr>
@@ -545,9 +545,8 @@
                 <w:szCs w:val="24"/>
                 <w:lang w:eastAsia="en-IN" w:bidi="mr-IN"/>
               </w:rPr>
-              <w:t>-</w:t>
-            </w:r>
-            <w:proofErr w:type="spellStart"/>
+              <w:t>-light</w:t>
+            </w:r>
             <w:r>
               <w:rPr>
                 <w:rFonts w:ascii="Times New Roman" w:eastAsia="Times New Roman" w:hAnsi="Times New Roman" w:cs="Times New Roman"/>
@@ -558,21 +557,8 @@
                 <w:szCs w:val="24"/>
                 <w:lang w:eastAsia="en-IN" w:bidi="mr-IN"/>
               </w:rPr>
-              <w:t>light</w:t>
-            </w:r>
-            <w:r>
-              <w:rPr>
-                <w:rFonts w:ascii="Times New Roman" w:eastAsia="Times New Roman" w:hAnsi="Times New Roman" w:cs="Times New Roman"/>
-                <w:b/>
-                <w:bCs/>
-                <w:color w:val="000000"/>
-                <w:sz w:val="24"/>
-                <w:szCs w:val="24"/>
-                <w:lang w:eastAsia="en-IN" w:bidi="mr-IN"/>
-              </w:rPr>
               <w:t>,Fan</w:t>
             </w:r>
-            <w:proofErr w:type="spellEnd"/>
           </w:p>
         </w:tc>
         <w:tc>
@@ -1068,27 +1054,7 @@
                 <w:szCs w:val="24"/>
                 <w:lang w:eastAsia="en-IN" w:bidi="mr-IN"/>
               </w:rPr>
-              <w:t xml:space="preserve"> (Computer </w:t>
-            </w:r>
-            <w:proofErr w:type="spellStart"/>
-            <w:r>
-              <w:rPr>
-                <w:rFonts w:ascii="Times New Roman" w:eastAsia="Times New Roman" w:hAnsi="Times New Roman" w:cs="Times New Roman"/>
-                <w:sz w:val="24"/>
-                <w:szCs w:val="24"/>
-                <w:lang w:eastAsia="en-IN" w:bidi="mr-IN"/>
-              </w:rPr>
-              <w:t>Engg</w:t>
-            </w:r>
-            <w:proofErr w:type="spellEnd"/>
-            <w:r>
-              <w:rPr>
-                <w:rFonts w:ascii="Times New Roman" w:eastAsia="Times New Roman" w:hAnsi="Times New Roman" w:cs="Times New Roman"/>
-                <w:sz w:val="24"/>
-                <w:szCs w:val="24"/>
-                <w:lang w:eastAsia="en-IN" w:bidi="mr-IN"/>
-              </w:rPr>
-              <w:t xml:space="preserve">. Building ) </w:t>
+              <w:t xml:space="preserve"> (Computer Engg. Building ) </w:t>
             </w:r>
           </w:p>
         </w:tc>
@@ -1340,27 +1306,7 @@
                 <w:szCs w:val="24"/>
                 <w:lang w:eastAsia="en-IN" w:bidi="mr-IN"/>
               </w:rPr>
-              <w:t xml:space="preserve"> (Computer </w:t>
-            </w:r>
-            <w:proofErr w:type="spellStart"/>
-            <w:r>
-              <w:rPr>
-                <w:rFonts w:ascii="Times New Roman" w:eastAsia="Times New Roman" w:hAnsi="Times New Roman" w:cs="Times New Roman"/>
-                <w:sz w:val="24"/>
-                <w:szCs w:val="24"/>
-                <w:lang w:eastAsia="en-IN" w:bidi="mr-IN"/>
-              </w:rPr>
-              <w:t>Engg</w:t>
-            </w:r>
-            <w:proofErr w:type="spellEnd"/>
-            <w:r>
-              <w:rPr>
-                <w:rFonts w:ascii="Times New Roman" w:eastAsia="Times New Roman" w:hAnsi="Times New Roman" w:cs="Times New Roman"/>
-                <w:sz w:val="24"/>
-                <w:szCs w:val="24"/>
-                <w:lang w:eastAsia="en-IN" w:bidi="mr-IN"/>
-              </w:rPr>
-              <w:t>. Building )</w:t>
+              <w:t xml:space="preserve"> (Computer Engg. Building )</w:t>
             </w:r>
           </w:p>
         </w:tc>
@@ -5013,8 +4959,6 @@
               </w:rPr>
               <w:t>KVL KCL KIT</w:t>
             </w:r>
-            <w:bookmarkStart w:id="0" w:name="_GoBack"/>
-            <w:bookmarkEnd w:id="0"/>
           </w:p>
         </w:tc>
         <w:tc>
@@ -6105,25 +6049,23 @@
           <w:sz w:val="24"/>
           <w:szCs w:val="24"/>
         </w:rPr>
-        <w:t xml:space="preserve">Routine maintenance activity is performed by laboratory assistant named Mr. Raju R. </w:t>
-      </w:r>
-      <w:proofErr w:type="spellStart"/>
+        <w:t>Routine maintenance activity is performed by laboratory assistant named Mr. Raju R. Jadhav</w:t>
+      </w:r>
       <w:r>
         <w:rPr>
           <w:rFonts w:ascii="Times New Roman" w:hAnsi="Times New Roman" w:cs="Times New Roman"/>
           <w:sz w:val="24"/>
           <w:szCs w:val="24"/>
         </w:rPr>
-        <w:t>Jadhav</w:t>
-      </w:r>
-      <w:proofErr w:type="spellEnd"/>
+        <w:t xml:space="preserve"> and </w:t>
+      </w:r>
       <w:r>
         <w:rPr>
           <w:rFonts w:ascii="Times New Roman" w:hAnsi="Times New Roman" w:cs="Times New Roman"/>
           <w:sz w:val="24"/>
           <w:szCs w:val="24"/>
         </w:rPr>
-        <w:t xml:space="preserve"> and </w:t>
+        <w:t xml:space="preserve">Mr. </w:t>
       </w:r>
       <w:r>
         <w:rPr>
@@ -6131,25 +6073,7 @@
           <w:sz w:val="24"/>
           <w:szCs w:val="24"/>
         </w:rPr>
-        <w:t xml:space="preserve">Mr. </w:t>
-      </w:r>
-      <w:proofErr w:type="spellStart"/>
-      <w:r>
-        <w:rPr>
-          <w:rFonts w:ascii="Times New Roman" w:hAnsi="Times New Roman" w:cs="Times New Roman"/>
-          <w:sz w:val="24"/>
-          <w:szCs w:val="24"/>
-        </w:rPr>
-        <w:t>Suhas</w:t>
-      </w:r>
-      <w:proofErr w:type="spellEnd"/>
-      <w:r>
-        <w:rPr>
-          <w:rFonts w:ascii="Times New Roman" w:hAnsi="Times New Roman" w:cs="Times New Roman"/>
-          <w:sz w:val="24"/>
-          <w:szCs w:val="24"/>
-        </w:rPr>
-        <w:t xml:space="preserve"> S Gund</w:t>
+        <w:t>Suhas S Gund</w:t>
       </w:r>
       <w:r>
         <w:rPr>
@@ -6369,7 +6293,7 @@
               </w:rPr>
               <w:lastRenderedPageBreak/>
               <w:drawing>
-                <wp:inline distT="0" distB="0" distL="0" distR="0" wp14:anchorId="6A466E21" wp14:editId="2AFBE306">
+                <wp:inline distT="0" distB="0" distL="0" distR="0" wp14:anchorId="412A505F" wp14:editId="0F5A2A1A">
                   <wp:extent cx="2768600" cy="2768600"/>
                   <wp:effectExtent l="0" t="0" r="0" b="0"/>
                   <wp:docPr id="1" name="Picture 1"/>
@@ -6384,7 +6308,7 @@
                           <pic:cNvPicPr/>
                         </pic:nvPicPr>
                         <pic:blipFill>
-                          <a:blip r:embed="rId9" cstate="print">
+                          <a:blip r:embed="rId8" cstate="print">
                             <a:extLst>
                               <a:ext uri="{28A0092B-C50C-407E-A947-70E740481C1C}">
                                 <a14:useLocalDpi xmlns:a14="http://schemas.microsoft.com/office/drawing/2010/main" val="0"/>
@@ -6437,7 +6361,7 @@
                 <w:lang w:eastAsia="en-IN" w:bidi="mr-IN"/>
               </w:rPr>
               <w:drawing>
-                <wp:inline distT="0" distB="0" distL="0" distR="0" wp14:anchorId="1C411A66" wp14:editId="089E7DE5">
+                <wp:inline distT="0" distB="0" distL="0" distR="0" wp14:anchorId="110DD5E7" wp14:editId="5AD3CA12">
                   <wp:extent cx="2851150" cy="2755900"/>
                   <wp:effectExtent l="0" t="0" r="6350" b="6350"/>
                   <wp:docPr id="4" name="Picture 4"/>
@@ -6452,7 +6376,7 @@
                           <pic:cNvPicPr/>
                         </pic:nvPicPr>
                         <pic:blipFill>
-                          <a:blip r:embed="rId10" cstate="print">
+                          <a:blip r:embed="rId9" cstate="print">
                             <a:extLst>
                               <a:ext uri="{28A0092B-C50C-407E-A947-70E740481C1C}">
                                 <a14:useLocalDpi xmlns:a14="http://schemas.microsoft.com/office/drawing/2010/main" val="0"/>
@@ -6869,7 +6793,7 @@
                 <w:lang w:eastAsia="en-IN" w:bidi="mr-IN"/>
               </w:rPr>
               <w:drawing>
-                <wp:inline distT="0" distB="0" distL="0" distR="0" wp14:anchorId="7A2C506D" wp14:editId="11165698">
+                <wp:inline distT="0" distB="0" distL="0" distR="0" wp14:anchorId="09FBF580" wp14:editId="2205E4A0">
                   <wp:extent cx="2790497" cy="2396358"/>
                   <wp:effectExtent l="0" t="0" r="0" b="4445"/>
                   <wp:docPr id="2" name="Picture 2"/>
@@ -6884,7 +6808,7 @@
                           <pic:cNvPicPr/>
                         </pic:nvPicPr>
                         <pic:blipFill>
-                          <a:blip r:embed="rId11" cstate="print">
+                          <a:blip r:embed="rId10" cstate="print">
                             <a:extLst>
                               <a:ext uri="{28A0092B-C50C-407E-A947-70E740481C1C}">
                                 <a14:useLocalDpi xmlns:a14="http://schemas.microsoft.com/office/drawing/2010/main" val="0"/>
@@ -6935,7 +6859,7 @@
                 <w:lang w:eastAsia="en-IN" w:bidi="mr-IN"/>
               </w:rPr>
               <w:drawing>
-                <wp:inline distT="0" distB="0" distL="0" distR="0" wp14:anchorId="2104B566" wp14:editId="4CAFDC07">
+                <wp:inline distT="0" distB="0" distL="0" distR="0" wp14:anchorId="57209FA5" wp14:editId="19996EC3">
                   <wp:extent cx="2929328" cy="2506717"/>
                   <wp:effectExtent l="0" t="0" r="4445" b="8255"/>
                   <wp:docPr id="3" name="Picture 3"/>
@@ -6950,7 +6874,7 @@
                           <pic:cNvPicPr/>
                         </pic:nvPicPr>
                         <pic:blipFill>
-                          <a:blip r:embed="rId12" cstate="print">
+                          <a:blip r:embed="rId11" cstate="print">
                             <a:extLst>
                               <a:ext uri="{28A0092B-C50C-407E-A947-70E740481C1C}">
                                 <a14:useLocalDpi xmlns:a14="http://schemas.microsoft.com/office/drawing/2010/main" val="0"/>
@@ -7331,7 +7255,7 @@
               </w:rPr>
               <w:lastRenderedPageBreak/>
               <w:drawing>
-                <wp:inline distT="0" distB="0" distL="0" distR="0" wp14:anchorId="2A48AB97" wp14:editId="40EB9426">
+                <wp:inline distT="0" distB="0" distL="0" distR="0" wp14:anchorId="2E3ADEF2" wp14:editId="2387B4EB">
                   <wp:extent cx="2770495" cy="2879677"/>
                   <wp:effectExtent l="0" t="0" r="0" b="0"/>
                   <wp:docPr id="5" name="Picture 5"/>
@@ -7346,7 +7270,7 @@
                           <pic:cNvPicPr/>
                         </pic:nvPicPr>
                         <pic:blipFill>
-                          <a:blip r:embed="rId13" cstate="print">
+                          <a:blip r:embed="rId12" cstate="print">
                             <a:extLst>
                               <a:ext uri="{28A0092B-C50C-407E-A947-70E740481C1C}">
                                 <a14:useLocalDpi xmlns:a14="http://schemas.microsoft.com/office/drawing/2010/main" val="0"/>
@@ -7397,7 +7321,7 @@
                 <w:lang w:eastAsia="en-IN" w:bidi="mr-IN"/>
               </w:rPr>
               <w:drawing>
-                <wp:inline distT="0" distB="0" distL="0" distR="0" wp14:anchorId="289F5CE8" wp14:editId="04BC07BA">
+                <wp:inline distT="0" distB="0" distL="0" distR="0" wp14:anchorId="28346E65" wp14:editId="7E7BD60E">
                   <wp:extent cx="2852382" cy="2879678"/>
                   <wp:effectExtent l="0" t="0" r="5715" b="0"/>
                   <wp:docPr id="6" name="Picture 6"/>
@@ -7412,7 +7336,7 @@
                           <pic:cNvPicPr/>
                         </pic:nvPicPr>
                         <pic:blipFill>
-                          <a:blip r:embed="rId14" cstate="print">
+                          <a:blip r:embed="rId13" cstate="print">
                             <a:extLst>
                               <a:ext uri="{28A0092B-C50C-407E-A947-70E740481C1C}">
                                 <a14:useLocalDpi xmlns:a14="http://schemas.microsoft.com/office/drawing/2010/main" val="0"/>
@@ -7838,7 +7762,7 @@
                 <w:lang w:eastAsia="en-IN" w:bidi="mr-IN"/>
               </w:rPr>
               <w:drawing>
-                <wp:inline distT="0" distB="0" distL="0" distR="0" wp14:anchorId="13B8399B" wp14:editId="1D869D9E">
+                <wp:inline distT="0" distB="0" distL="0" distR="0" wp14:anchorId="6FCFCE38" wp14:editId="1227335B">
                   <wp:extent cx="2766060" cy="2766060"/>
                   <wp:effectExtent l="0" t="0" r="0" b="0"/>
                   <wp:docPr id="7" name="Picture 7"/>
@@ -7853,7 +7777,7 @@
                           <pic:cNvPicPr/>
                         </pic:nvPicPr>
                         <pic:blipFill>
-                          <a:blip r:embed="rId15" cstate="print">
+                          <a:blip r:embed="rId14" cstate="print">
                             <a:extLst>
                               <a:ext uri="{28A0092B-C50C-407E-A947-70E740481C1C}">
                                 <a14:useLocalDpi xmlns:a14="http://schemas.microsoft.com/office/drawing/2010/main" val="0"/>
@@ -7904,7 +7828,7 @@
                 <w:lang w:eastAsia="en-IN" w:bidi="mr-IN"/>
               </w:rPr>
               <w:drawing>
-                <wp:inline distT="0" distB="0" distL="0" distR="0" wp14:anchorId="5059739D" wp14:editId="12B5373D">
+                <wp:inline distT="0" distB="0" distL="0" distR="0" wp14:anchorId="04E9EB06" wp14:editId="1CEA0B2A">
                   <wp:extent cx="2853690" cy="2853690"/>
                   <wp:effectExtent l="0" t="0" r="3810" b="3810"/>
                   <wp:docPr id="8" name="Picture 8"/>
@@ -7919,7 +7843,7 @@
                           <pic:cNvPicPr/>
                         </pic:nvPicPr>
                         <pic:blipFill>
-                          <a:blip r:embed="rId16" cstate="print">
+                          <a:blip r:embed="rId15" cstate="print">
                             <a:extLst>
                               <a:ext uri="{28A0092B-C50C-407E-A947-70E740481C1C}">
                                 <a14:useLocalDpi xmlns:a14="http://schemas.microsoft.com/office/drawing/2010/main" val="0"/>
@@ -8348,7 +8272,7 @@
               </w:rPr>
               <w:lastRenderedPageBreak/>
               <w:drawing>
-                <wp:inline distT="0" distB="0" distL="0" distR="0" wp14:anchorId="2F7D63D3" wp14:editId="786B6D9D">
+                <wp:inline distT="0" distB="0" distL="0" distR="0" wp14:anchorId="59BB16C2" wp14:editId="7964FBC5">
                   <wp:extent cx="2766060" cy="2766060"/>
                   <wp:effectExtent l="0" t="0" r="0" b="0"/>
                   <wp:docPr id="9" name="Picture 9"/>
@@ -8363,7 +8287,7 @@
                           <pic:cNvPicPr/>
                         </pic:nvPicPr>
                         <pic:blipFill>
-                          <a:blip r:embed="rId17" cstate="print">
+                          <a:blip r:embed="rId16" cstate="print">
                             <a:extLst>
                               <a:ext uri="{28A0092B-C50C-407E-A947-70E740481C1C}">
                                 <a14:useLocalDpi xmlns:a14="http://schemas.microsoft.com/office/drawing/2010/main" val="0"/>
@@ -8414,7 +8338,7 @@
                 <w:lang w:eastAsia="en-IN" w:bidi="mr-IN"/>
               </w:rPr>
               <w:drawing>
-                <wp:inline distT="0" distB="0" distL="0" distR="0" wp14:anchorId="4C5929AE" wp14:editId="13A0C59D">
+                <wp:inline distT="0" distB="0" distL="0" distR="0" wp14:anchorId="321BB8F7" wp14:editId="6C93B412">
                   <wp:extent cx="2853690" cy="2853690"/>
                   <wp:effectExtent l="0" t="0" r="3810" b="3810"/>
                   <wp:docPr id="10" name="Picture 10"/>
@@ -8429,7 +8353,7 @@
                           <pic:cNvPicPr/>
                         </pic:nvPicPr>
                         <pic:blipFill>
-                          <a:blip r:embed="rId18" cstate="print">
+                          <a:blip r:embed="rId17" cstate="print">
                             <a:extLst>
                               <a:ext uri="{28A0092B-C50C-407E-A947-70E740481C1C}">
                                 <a14:useLocalDpi xmlns:a14="http://schemas.microsoft.com/office/drawing/2010/main" val="0"/>
@@ -8839,7 +8763,7 @@
                 <w:lang w:eastAsia="en-IN" w:bidi="mr-IN"/>
               </w:rPr>
               <w:drawing>
-                <wp:inline distT="0" distB="0" distL="0" distR="0" wp14:anchorId="00E0AB4F" wp14:editId="4618A1AF">
+                <wp:inline distT="0" distB="0" distL="0" distR="0" wp14:anchorId="796FF64B" wp14:editId="5748A0D8">
                   <wp:extent cx="2766060" cy="2766060"/>
                   <wp:effectExtent l="0" t="0" r="0" b="0"/>
                   <wp:docPr id="11" name="Picture 11"/>
@@ -8854,7 +8778,7 @@
                           <pic:cNvPicPr/>
                         </pic:nvPicPr>
                         <pic:blipFill>
-                          <a:blip r:embed="rId19" cstate="print">
+                          <a:blip r:embed="rId18" cstate="print">
                             <a:extLst>
                               <a:ext uri="{28A0092B-C50C-407E-A947-70E740481C1C}">
                                 <a14:useLocalDpi xmlns:a14="http://schemas.microsoft.com/office/drawing/2010/main" val="0"/>
@@ -8905,7 +8829,7 @@
                 <w:lang w:eastAsia="en-IN" w:bidi="mr-IN"/>
               </w:rPr>
               <w:drawing>
-                <wp:inline distT="0" distB="0" distL="0" distR="0" wp14:anchorId="39FF81F4" wp14:editId="1A29489B">
+                <wp:inline distT="0" distB="0" distL="0" distR="0" wp14:anchorId="184F5337" wp14:editId="3638292B">
                   <wp:extent cx="2853690" cy="2853690"/>
                   <wp:effectExtent l="0" t="0" r="3810" b="3810"/>
                   <wp:docPr id="12" name="Picture 12"/>
@@ -8920,7 +8844,7 @@
                           <pic:cNvPicPr/>
                         </pic:nvPicPr>
                         <pic:blipFill>
-                          <a:blip r:embed="rId20" cstate="print">
+                          <a:blip r:embed="rId19" cstate="print">
                             <a:extLst>
                               <a:ext uri="{28A0092B-C50C-407E-A947-70E740481C1C}">
                                 <a14:useLocalDpi xmlns:a14="http://schemas.microsoft.com/office/drawing/2010/main" val="0"/>
@@ -9277,13 +9201,54 @@
             <w:r>
               <w:rPr>
                 <w:rFonts w:ascii="Times New Roman" w:eastAsia="Times New Roman" w:hAnsi="Times New Roman" w:cs="Times New Roman"/>
+                <w:noProof/>
                 <w:color w:val="000000"/>
                 <w:sz w:val="24"/>
                 <w:szCs w:val="24"/>
-                <w:highlight w:val="yellow"/>
-                <w:lang w:eastAsia="en-IN" w:bidi="mr-IN"/>
-              </w:rPr>
-              <w:t>Photo-1</w:t>
+                <w:lang w:eastAsia="en-IN" w:bidi="mr-IN"/>
+              </w:rPr>
+              <w:lastRenderedPageBreak/>
+              <w:drawing>
+                <wp:inline distT="0" distB="0" distL="0" distR="0" wp14:anchorId="55CB74A9" wp14:editId="0BF05880">
+                  <wp:extent cx="2916555" cy="2187575"/>
+                  <wp:effectExtent l="0" t="0" r="0" b="3175"/>
+                  <wp:docPr id="1870358107" name="Picture 1"/>
+                  <wp:cNvGraphicFramePr>
+                    <a:graphicFrameLocks xmlns:a="http://schemas.openxmlformats.org/drawingml/2006/main" noChangeAspect="1"/>
+                  </wp:cNvGraphicFramePr>
+                  <a:graphic xmlns:a="http://schemas.openxmlformats.org/drawingml/2006/main">
+                    <a:graphicData uri="http://schemas.openxmlformats.org/drawingml/2006/picture">
+                      <pic:pic xmlns:pic="http://schemas.openxmlformats.org/drawingml/2006/picture">
+                        <pic:nvPicPr>
+                          <pic:cNvPr id="1870358107" name="Picture 1870358107"/>
+                          <pic:cNvPicPr/>
+                        </pic:nvPicPr>
+                        <pic:blipFill>
+                          <a:blip r:embed="rId20" cstate="print">
+                            <a:extLst>
+                              <a:ext uri="{28A0092B-C50C-407E-A947-70E740481C1C}">
+                                <a14:useLocalDpi xmlns:a14="http://schemas.microsoft.com/office/drawing/2010/main" val="0"/>
+                              </a:ext>
+                            </a:extLst>
+                          </a:blip>
+                          <a:stretch>
+                            <a:fillRect/>
+                          </a:stretch>
+                        </pic:blipFill>
+                        <pic:spPr>
+                          <a:xfrm>
+                            <a:off x="0" y="0"/>
+                            <a:ext cx="2916555" cy="2187575"/>
+                          </a:xfrm>
+                          <a:prstGeom prst="rect">
+                            <a:avLst/>
+                          </a:prstGeom>
+                        </pic:spPr>
+                      </pic:pic>
+                    </a:graphicData>
+                  </a:graphic>
+                </wp:inline>
+              </w:drawing>
             </w:r>
           </w:p>
         </w:tc>
@@ -9303,21 +9268,59 @@
             </w:pPr>
             <w:r>
               <w:rPr>
-                <w:rFonts w:ascii="Times New Roman" w:eastAsia="Times New Roman" w:hAnsi="Times New Roman" w:cs="Times New Roman"/>
-                <w:color w:val="000000"/>
-                <w:sz w:val="24"/>
-                <w:szCs w:val="24"/>
-                <w:highlight w:val="yellow"/>
-                <w:lang w:eastAsia="en-IN" w:bidi="mr-IN"/>
-              </w:rPr>
-              <w:t>Photo-2</w:t>
+                <w:rFonts w:ascii="Times New Roman" w:hAnsi="Times New Roman" w:cs="Times New Roman"/>
+                <w:noProof/>
+                <w:sz w:val="24"/>
+                <w:szCs w:val="24"/>
+              </w:rPr>
+              <w:drawing>
+                <wp:inline distT="0" distB="0" distL="0" distR="0" wp14:anchorId="2894074C" wp14:editId="38CC2D3D">
+                  <wp:extent cx="3008630" cy="2256790"/>
+                  <wp:effectExtent l="0" t="0" r="1270" b="0"/>
+                  <wp:docPr id="94645969" name="Picture 2" descr="A room with computers and a whiteboard"/>
+                  <wp:cNvGraphicFramePr>
+                    <a:graphicFrameLocks xmlns:a="http://schemas.openxmlformats.org/drawingml/2006/main" noChangeAspect="1"/>
+                  </wp:cNvGraphicFramePr>
+                  <a:graphic xmlns:a="http://schemas.openxmlformats.org/drawingml/2006/main">
+                    <a:graphicData uri="http://schemas.openxmlformats.org/drawingml/2006/picture">
+                      <pic:pic xmlns:pic="http://schemas.openxmlformats.org/drawingml/2006/picture">
+                        <pic:nvPicPr>
+                          <pic:cNvPr id="94645969" name="Picture 2" descr="A room with computers and a whiteboard"/>
+                          <pic:cNvPicPr/>
+                        </pic:nvPicPr>
+                        <pic:blipFill>
+                          <a:blip r:embed="rId21" cstate="print">
+                            <a:extLst>
+                              <a:ext uri="{28A0092B-C50C-407E-A947-70E740481C1C}">
+                                <a14:useLocalDpi xmlns:a14="http://schemas.microsoft.com/office/drawing/2010/main" val="0"/>
+                              </a:ext>
+                            </a:extLst>
+                          </a:blip>
+                          <a:stretch>
+                            <a:fillRect/>
+                          </a:stretch>
+                        </pic:blipFill>
+                        <pic:spPr>
+                          <a:xfrm>
+                            <a:off x="0" y="0"/>
+                            <a:ext cx="3008630" cy="2256790"/>
+                          </a:xfrm>
+                          <a:prstGeom prst="rect">
+                            <a:avLst/>
+                          </a:prstGeom>
+                        </pic:spPr>
+                      </pic:pic>
+                    </a:graphicData>
+                  </a:graphic>
+                </wp:inline>
+              </w:drawing>
             </w:r>
           </w:p>
         </w:tc>
       </w:tr>
       <w:tr>
         <w:trPr>
-          <w:trHeight w:val="85"/>
+          <w:trHeight w:val="1245"/>
         </w:trPr>
         <w:tc>
           <w:tcPr>
@@ -9349,6 +9352,110 @@
               <w:t>Hardware and Networking Laboratory</w:t>
             </w:r>
           </w:p>
+          <w:p>
+            <w:pPr>
+              <w:pStyle w:val="ListParagraph"/>
+              <w:numPr>
+                <w:ilvl w:val="0"/>
+                <w:numId w:val="22"/>
+              </w:numPr>
+              <w:ind w:left="426" w:hanging="426"/>
+              <w:rPr>
+                <w:rFonts w:ascii="Times New Roman" w:hAnsi="Times New Roman" w:cs="Times New Roman"/>
+                <w:color w:val="1F1F1F"/>
+                <w:lang w:eastAsia="en-IN" w:bidi="mr-IN"/>
+              </w:rPr>
+            </w:pPr>
+            <w:r>
+              <w:rPr>
+                <w:rFonts w:ascii="Times New Roman" w:hAnsi="Times New Roman" w:cs="Times New Roman"/>
+                <w:color w:val="1F1F1F"/>
+                <w:lang w:eastAsia="en-IN" w:bidi="mr-IN"/>
+              </w:rPr>
+              <w:t>HP/ACER</w:t>
+            </w:r>
+            <w:r>
+              <w:rPr>
+                <w:rFonts w:ascii="Times New Roman" w:hAnsi="Times New Roman" w:cs="Times New Roman"/>
+                <w:color w:val="1F1F1F"/>
+                <w:lang w:eastAsia="en-IN" w:bidi="mr-IN"/>
+              </w:rPr>
+              <w:t xml:space="preserve"> Desktop PC </w:t>
+            </w:r>
+          </w:p>
+          <w:p>
+            <w:pPr>
+              <w:pStyle w:val="ListParagraph"/>
+              <w:numPr>
+                <w:ilvl w:val="0"/>
+                <w:numId w:val="22"/>
+              </w:numPr>
+              <w:ind w:left="270" w:hanging="270"/>
+              <w:rPr>
+                <w:rFonts w:ascii="Times New Roman" w:hAnsi="Times New Roman" w:cs="Times New Roman"/>
+                <w:color w:val="1F1F1F"/>
+                <w:lang w:eastAsia="en-IN" w:bidi="mr-IN"/>
+              </w:rPr>
+            </w:pPr>
+            <w:r>
+              <w:rPr>
+                <w:rFonts w:ascii="Times New Roman" w:hAnsi="Times New Roman" w:cs="Times New Roman"/>
+                <w:color w:val="1F1F1F"/>
+                <w:lang w:eastAsia="en-IN" w:bidi="mr-IN"/>
+              </w:rPr>
+              <w:t xml:space="preserve">White Board </w:t>
+            </w:r>
+          </w:p>
+          <w:p>
+            <w:pPr>
+              <w:pStyle w:val="ListParagraph"/>
+              <w:numPr>
+                <w:ilvl w:val="0"/>
+                <w:numId w:val="22"/>
+              </w:numPr>
+              <w:ind w:left="270" w:hanging="270"/>
+              <w:rPr>
+                <w:rFonts w:ascii="Times New Roman" w:hAnsi="Times New Roman" w:cs="Times New Roman"/>
+                <w:color w:val="1F1F1F"/>
+                <w:lang w:eastAsia="en-IN" w:bidi="mr-IN"/>
+              </w:rPr>
+            </w:pPr>
+            <w:r>
+              <w:rPr>
+                <w:rFonts w:ascii="Times New Roman" w:hAnsi="Times New Roman" w:cs="Times New Roman"/>
+                <w:color w:val="1F1F1F"/>
+                <w:lang w:eastAsia="en-IN" w:bidi="mr-IN"/>
+              </w:rPr>
+              <w:t>RJ45 Male Female Connectors</w:t>
+            </w:r>
+          </w:p>
+          <w:p>
+            <w:pPr>
+              <w:pStyle w:val="ListParagraph"/>
+              <w:numPr>
+                <w:ilvl w:val="0"/>
+                <w:numId w:val="22"/>
+              </w:numPr>
+              <w:ind w:left="270" w:hanging="270"/>
+              <w:rPr>
+                <w:rFonts w:ascii="Times New Roman" w:hAnsi="Times New Roman" w:cs="Times New Roman"/>
+                <w:b/>
+                <w:bCs/>
+                <w:color w:val="000000"/>
+                <w:sz w:val="24"/>
+                <w:szCs w:val="24"/>
+                <w:lang w:eastAsia="en-IN" w:bidi="mr-IN"/>
+              </w:rPr>
+            </w:pPr>
+            <w:r>
+              <w:rPr>
+                <w:rFonts w:ascii="Times New Roman" w:hAnsi="Times New Roman" w:cs="Times New Roman"/>
+                <w:color w:val="1F1F1F"/>
+                <w:lang w:eastAsia="en-IN" w:bidi="mr-IN"/>
+              </w:rPr>
+              <w:t>D-Link Switches, Wi-Fi Devices</w:t>
+            </w:r>
+          </w:p>
         </w:tc>
         <w:tc>
           <w:tcPr>
@@ -9356,6 +9463,11 @@
           </w:tcPr>
           <w:p>
             <w:pPr>
+              <w:pStyle w:val="ListParagraph"/>
+              <w:numPr>
+                <w:ilvl w:val="0"/>
+                <w:numId w:val="22"/>
+              </w:numPr>
               <w:adjustRightInd w:val="0"/>
               <w:jc w:val="both"/>
               <w:rPr>
@@ -9364,36 +9476,30 @@
                 <w:szCs w:val="24"/>
               </w:rPr>
             </w:pPr>
-          </w:p>
-        </w:tc>
-      </w:tr>
-      <w:tr>
-        <w:trPr>
-          <w:trHeight w:val="85"/>
-        </w:trPr>
-        <w:tc>
-          <w:tcPr>
-            <w:tcW w:w="4809" w:type="dxa"/>
-            <w:vAlign w:val="center"/>
-          </w:tcPr>
-          <w:p>
-            <w:pPr>
-              <w:rPr>
-                <w:rFonts w:ascii="Times New Roman" w:eastAsia="Times New Roman" w:hAnsi="Times New Roman" w:cs="Times New Roman"/>
-                <w:color w:val="000000"/>
-                <w:sz w:val="24"/>
-                <w:szCs w:val="24"/>
-                <w:lang w:eastAsia="en-IN" w:bidi="mr-IN"/>
-              </w:rPr>
-            </w:pPr>
-          </w:p>
-        </w:tc>
-        <w:tc>
-          <w:tcPr>
-            <w:tcW w:w="4954" w:type="dxa"/>
-          </w:tcPr>
-          <w:p>
-            <w:pPr>
+            <w:r>
+              <w:rPr>
+                <w:rFonts w:ascii="Times New Roman" w:hAnsi="Times New Roman" w:cs="Times New Roman"/>
+                <w:sz w:val="24"/>
+                <w:szCs w:val="24"/>
+              </w:rPr>
+              <w:t xml:space="preserve"> </w:t>
+            </w:r>
+            <w:r>
+              <w:rPr>
+                <w:rFonts w:ascii="Times New Roman" w:hAnsi="Times New Roman" w:cs="Times New Roman"/>
+                <w:sz w:val="24"/>
+                <w:szCs w:val="24"/>
+              </w:rPr>
+              <w:t>CAT 6 Cable</w:t>
+            </w:r>
+          </w:p>
+          <w:p>
+            <w:pPr>
+              <w:pStyle w:val="ListParagraph"/>
+              <w:numPr>
+                <w:ilvl w:val="0"/>
+                <w:numId w:val="22"/>
+              </w:numPr>
               <w:adjustRightInd w:val="0"/>
               <w:jc w:val="both"/>
               <w:rPr>
@@ -9402,36 +9508,22 @@
                 <w:szCs w:val="24"/>
               </w:rPr>
             </w:pPr>
-          </w:p>
-        </w:tc>
-      </w:tr>
-      <w:tr>
-        <w:trPr>
-          <w:trHeight w:val="85"/>
-        </w:trPr>
-        <w:tc>
-          <w:tcPr>
-            <w:tcW w:w="4809" w:type="dxa"/>
-            <w:vAlign w:val="center"/>
-          </w:tcPr>
-          <w:p>
-            <w:pPr>
-              <w:rPr>
-                <w:rFonts w:ascii="Times New Roman" w:eastAsia="Times New Roman" w:hAnsi="Times New Roman" w:cs="Times New Roman"/>
-                <w:color w:val="000000"/>
-                <w:sz w:val="24"/>
-                <w:szCs w:val="24"/>
-                <w:lang w:eastAsia="en-IN" w:bidi="mr-IN"/>
-              </w:rPr>
-            </w:pPr>
-          </w:p>
-        </w:tc>
-        <w:tc>
-          <w:tcPr>
-            <w:tcW w:w="4954" w:type="dxa"/>
-          </w:tcPr>
-          <w:p>
-            <w:pPr>
+            <w:r>
+              <w:rPr>
+                <w:rFonts w:ascii="Times New Roman" w:hAnsi="Times New Roman" w:cs="Times New Roman"/>
+                <w:sz w:val="24"/>
+                <w:szCs w:val="24"/>
+              </w:rPr>
+              <w:t>Crimping tool, Cable Tester, Stripper</w:t>
+            </w:r>
+          </w:p>
+          <w:p>
+            <w:pPr>
+              <w:pStyle w:val="ListParagraph"/>
+              <w:numPr>
+                <w:ilvl w:val="0"/>
+                <w:numId w:val="22"/>
+              </w:numPr>
               <w:adjustRightInd w:val="0"/>
               <w:jc w:val="both"/>
               <w:rPr>
@@ -9440,6 +9532,30 @@
                 <w:szCs w:val="24"/>
               </w:rPr>
             </w:pPr>
+            <w:r>
+              <w:rPr>
+                <w:rFonts w:ascii="Times New Roman" w:hAnsi="Times New Roman" w:cs="Times New Roman"/>
+                <w:color w:val="1F1F1F"/>
+                <w:lang w:eastAsia="en-IN" w:bidi="mr-IN"/>
+              </w:rPr>
+              <w:t>NIC Cards, Printer</w:t>
+            </w:r>
+            <w:r>
+              <w:rPr>
+                <w:rFonts w:ascii="Times New Roman" w:hAnsi="Times New Roman" w:cs="Times New Roman"/>
+                <w:color w:val="1F1F1F"/>
+                <w:lang w:eastAsia="en-IN" w:bidi="mr-IN"/>
+              </w:rPr>
+              <w:t xml:space="preserve"> and Component</w:t>
+            </w:r>
+            <w:r>
+              <w:rPr>
+                <w:rFonts w:ascii="Times New Roman" w:hAnsi="Times New Roman" w:cs="Times New Roman"/>
+                <w:color w:val="1F1F1F"/>
+                <w:lang w:eastAsia="en-IN" w:bidi="mr-IN"/>
+              </w:rPr>
+              <w:t>s</w:t>
+            </w:r>
           </w:p>
         </w:tc>
       </w:tr>
@@ -9484,7 +9600,6 @@
           <w:sz w:val="24"/>
           <w:szCs w:val="24"/>
         </w:rPr>
-        <w:lastRenderedPageBreak/>
         <w:t xml:space="preserve">All above laboratories are having First-Aid kits, Purified Drinking Water Facility. Computer Engineering department also have separate facility of washrooms for faculty, girls and boys as well as </w:t>
       </w:r>
       <w:r>
@@ -10137,20 +10252,8 @@
                 <w:szCs w:val="24"/>
                 <w:lang w:eastAsia="en-IN" w:bidi="mr-IN"/>
               </w:rPr>
-              <w:t xml:space="preserve">Shri A D </w:t>
-            </w:r>
-            <w:proofErr w:type="spellStart"/>
-            <w:r>
-              <w:rPr>
-                <w:rFonts w:ascii="Times New Roman" w:eastAsia="Times New Roman" w:hAnsi="Times New Roman" w:cs="Times New Roman"/>
-                <w:color w:val="1F1F1F"/>
-                <w:sz w:val="24"/>
-                <w:szCs w:val="24"/>
-                <w:lang w:eastAsia="en-IN" w:bidi="mr-IN"/>
-              </w:rPr>
-              <w:t>Ambure</w:t>
-            </w:r>
-            <w:proofErr w:type="spellEnd"/>
+              <w:t>Shri A D Ambure</w:t>
+            </w:r>
           </w:p>
         </w:tc>
         <w:tc>
@@ -10223,42 +10326,8 @@
                 <w:szCs w:val="24"/>
                 <w:lang w:eastAsia="en-IN" w:bidi="mr-IN"/>
               </w:rPr>
-              <w:t xml:space="preserve">Raju </w:t>
-            </w:r>
-            <w:proofErr w:type="spellStart"/>
-            <w:r>
-              <w:rPr>
-                <w:rFonts w:ascii="Times New Roman" w:eastAsia="Times New Roman" w:hAnsi="Times New Roman" w:cs="Times New Roman"/>
-                <w:color w:val="1F1F1F"/>
-                <w:sz w:val="24"/>
-                <w:szCs w:val="24"/>
-                <w:lang w:eastAsia="en-IN" w:bidi="mr-IN"/>
-              </w:rPr>
-              <w:t>Ramrao</w:t>
-            </w:r>
-            <w:proofErr w:type="spellEnd"/>
-            <w:r>
-              <w:rPr>
-                <w:rFonts w:ascii="Times New Roman" w:eastAsia="Times New Roman" w:hAnsi="Times New Roman" w:cs="Times New Roman"/>
-                <w:color w:val="1F1F1F"/>
-                <w:sz w:val="24"/>
-                <w:szCs w:val="24"/>
-                <w:lang w:eastAsia="en-IN" w:bidi="mr-IN"/>
-              </w:rPr>
-              <w:t xml:space="preserve"> </w:t>
-            </w:r>
-            <w:proofErr w:type="spellStart"/>
-            <w:r>
-              <w:rPr>
-                <w:rFonts w:ascii="Times New Roman" w:eastAsia="Times New Roman" w:hAnsi="Times New Roman" w:cs="Times New Roman"/>
-                <w:color w:val="1F1F1F"/>
-                <w:sz w:val="24"/>
-                <w:szCs w:val="24"/>
-                <w:lang w:eastAsia="en-IN" w:bidi="mr-IN"/>
-              </w:rPr>
-              <w:t>Jadhav</w:t>
-            </w:r>
-            <w:proofErr w:type="spellEnd"/>
+              <w:t>Raju Ramrao Jadhav</w:t>
+            </w:r>
           </w:p>
         </w:tc>
         <w:tc>
@@ -10541,42 +10610,8 @@
                 <w:szCs w:val="24"/>
                 <w:lang w:eastAsia="en-IN" w:bidi="mr-IN"/>
               </w:rPr>
-              <w:t xml:space="preserve">Raju </w:t>
-            </w:r>
-            <w:proofErr w:type="spellStart"/>
-            <w:r>
-              <w:rPr>
-                <w:rFonts w:ascii="Times New Roman" w:eastAsia="Times New Roman" w:hAnsi="Times New Roman" w:cs="Times New Roman"/>
-                <w:color w:val="1F1F1F"/>
-                <w:sz w:val="24"/>
-                <w:szCs w:val="24"/>
-                <w:lang w:eastAsia="en-IN" w:bidi="mr-IN"/>
-              </w:rPr>
-              <w:t>Ramrao</w:t>
-            </w:r>
-            <w:proofErr w:type="spellEnd"/>
-            <w:r>
-              <w:rPr>
-                <w:rFonts w:ascii="Times New Roman" w:eastAsia="Times New Roman" w:hAnsi="Times New Roman" w:cs="Times New Roman"/>
-                <w:color w:val="1F1F1F"/>
-                <w:sz w:val="24"/>
-                <w:szCs w:val="24"/>
-                <w:lang w:eastAsia="en-IN" w:bidi="mr-IN"/>
-              </w:rPr>
-              <w:t xml:space="preserve"> </w:t>
-            </w:r>
-            <w:proofErr w:type="spellStart"/>
-            <w:r>
-              <w:rPr>
-                <w:rFonts w:ascii="Times New Roman" w:eastAsia="Times New Roman" w:hAnsi="Times New Roman" w:cs="Times New Roman"/>
-                <w:color w:val="1F1F1F"/>
-                <w:sz w:val="24"/>
-                <w:szCs w:val="24"/>
-                <w:lang w:eastAsia="en-IN" w:bidi="mr-IN"/>
-              </w:rPr>
-              <w:t>Jadhav</w:t>
-            </w:r>
-            <w:proofErr w:type="spellEnd"/>
+              <w:t>Raju Ramrao Jadhav</w:t>
+            </w:r>
           </w:p>
         </w:tc>
         <w:tc>
@@ -10767,20 +10802,8 @@
                 <w:szCs w:val="24"/>
                 <w:lang w:eastAsia="en-IN" w:bidi="mr-IN"/>
               </w:rPr>
-              <w:t xml:space="preserve">Shri N V </w:t>
-            </w:r>
-            <w:proofErr w:type="spellStart"/>
-            <w:r>
-              <w:rPr>
-                <w:rFonts w:ascii="Times New Roman" w:eastAsia="Times New Roman" w:hAnsi="Times New Roman" w:cs="Times New Roman"/>
-                <w:color w:val="000000"/>
-                <w:sz w:val="24"/>
-                <w:szCs w:val="24"/>
-                <w:lang w:eastAsia="en-IN" w:bidi="mr-IN"/>
-              </w:rPr>
-              <w:t>Bhalerao</w:t>
-            </w:r>
-            <w:proofErr w:type="spellEnd"/>
+              <w:t>Shri N V Bhalerao</w:t>
+            </w:r>
           </w:p>
         </w:tc>
         <w:tc>
@@ -10816,7 +10839,18 @@
                 <w:szCs w:val="24"/>
                 <w:lang w:eastAsia="en-IN" w:bidi="mr-IN"/>
               </w:rPr>
-              <w:t>Lecturer in Computer Engineering</w:t>
+              <w:t xml:space="preserve">Lecturer in Computer </w:t>
+            </w:r>
+            <w:r>
+              <w:rPr>
+                <w:rFonts w:ascii="Times New Roman" w:eastAsia="Times New Roman" w:hAnsi="Times New Roman" w:cs="Times New Roman"/>
+                <w:color w:val="1F1F1F"/>
+                <w:sz w:val="24"/>
+                <w:szCs w:val="24"/>
+                <w:lang w:eastAsia="en-IN" w:bidi="mr-IN"/>
+              </w:rPr>
+              <w:lastRenderedPageBreak/>
+              <w:t>Engineering</w:t>
             </w:r>
           </w:p>
         </w:tc>
@@ -10853,42 +10887,9 @@
                 <w:szCs w:val="24"/>
                 <w:lang w:eastAsia="en-IN" w:bidi="mr-IN"/>
               </w:rPr>
-              <w:t xml:space="preserve">Raju </w:t>
-            </w:r>
-            <w:proofErr w:type="spellStart"/>
-            <w:r>
-              <w:rPr>
-                <w:rFonts w:ascii="Times New Roman" w:eastAsia="Times New Roman" w:hAnsi="Times New Roman" w:cs="Times New Roman"/>
-                <w:color w:val="1F1F1F"/>
-                <w:sz w:val="24"/>
-                <w:szCs w:val="24"/>
-                <w:lang w:eastAsia="en-IN" w:bidi="mr-IN"/>
-              </w:rPr>
-              <w:t>Ramrao</w:t>
-            </w:r>
-            <w:proofErr w:type="spellEnd"/>
-            <w:r>
-              <w:rPr>
-                <w:rFonts w:ascii="Times New Roman" w:eastAsia="Times New Roman" w:hAnsi="Times New Roman" w:cs="Times New Roman"/>
-                <w:color w:val="1F1F1F"/>
-                <w:sz w:val="24"/>
-                <w:szCs w:val="24"/>
-                <w:lang w:eastAsia="en-IN" w:bidi="mr-IN"/>
-              </w:rPr>
-              <w:t xml:space="preserve"> </w:t>
-            </w:r>
-            <w:proofErr w:type="spellStart"/>
-            <w:r>
-              <w:rPr>
-                <w:rFonts w:ascii="Times New Roman" w:eastAsia="Times New Roman" w:hAnsi="Times New Roman" w:cs="Times New Roman"/>
-                <w:color w:val="1F1F1F"/>
-                <w:sz w:val="24"/>
-                <w:szCs w:val="24"/>
-                <w:lang w:eastAsia="en-IN" w:bidi="mr-IN"/>
-              </w:rPr>
-              <w:t>Jadhav</w:t>
-            </w:r>
-            <w:proofErr w:type="spellEnd"/>
+              <w:lastRenderedPageBreak/>
+              <w:t>Raju Ramrao Jadhav</w:t>
+            </w:r>
           </w:p>
         </w:tc>
         <w:tc>
@@ -10924,7 +10925,18 @@
                 <w:szCs w:val="24"/>
                 <w:lang w:eastAsia="en-IN" w:bidi="mr-IN"/>
               </w:rPr>
-              <w:t>Technical Laboratory Assistant</w:t>
+              <w:t>Technical Laborat</w:t>
+            </w:r>
+            <w:r>
+              <w:rPr>
+                <w:rFonts w:ascii="Times New Roman" w:eastAsia="Times New Roman" w:hAnsi="Times New Roman" w:cs="Times New Roman"/>
+                <w:color w:val="1F1F1F"/>
+                <w:sz w:val="24"/>
+                <w:szCs w:val="24"/>
+                <w:lang w:eastAsia="en-IN" w:bidi="mr-IN"/>
+              </w:rPr>
+              <w:lastRenderedPageBreak/>
+              <w:t>ory Assistant</w:t>
             </w:r>
           </w:p>
         </w:tc>
@@ -10961,6 +10973,7 @@
                 <w:szCs w:val="24"/>
                 <w:lang w:eastAsia="en-IN" w:bidi="mr-IN"/>
               </w:rPr>
+              <w:lastRenderedPageBreak/>
               <w:t>B.Sc. (ITI)</w:t>
             </w:r>
           </w:p>
@@ -11153,42 +11166,8 @@
                 <w:szCs w:val="24"/>
                 <w:lang w:eastAsia="en-IN" w:bidi="mr-IN"/>
               </w:rPr>
-              <w:t xml:space="preserve">Raju </w:t>
-            </w:r>
-            <w:proofErr w:type="spellStart"/>
-            <w:r>
-              <w:rPr>
-                <w:rFonts w:ascii="Times New Roman" w:eastAsia="Times New Roman" w:hAnsi="Times New Roman" w:cs="Times New Roman"/>
-                <w:color w:val="1F1F1F"/>
-                <w:sz w:val="24"/>
-                <w:szCs w:val="24"/>
-                <w:lang w:eastAsia="en-IN" w:bidi="mr-IN"/>
-              </w:rPr>
-              <w:t>Ramrao</w:t>
-            </w:r>
-            <w:proofErr w:type="spellEnd"/>
-            <w:r>
-              <w:rPr>
-                <w:rFonts w:ascii="Times New Roman" w:eastAsia="Times New Roman" w:hAnsi="Times New Roman" w:cs="Times New Roman"/>
-                <w:color w:val="1F1F1F"/>
-                <w:sz w:val="24"/>
-                <w:szCs w:val="24"/>
-                <w:lang w:eastAsia="en-IN" w:bidi="mr-IN"/>
-              </w:rPr>
-              <w:t xml:space="preserve"> </w:t>
-            </w:r>
-            <w:proofErr w:type="spellStart"/>
-            <w:r>
-              <w:rPr>
-                <w:rFonts w:ascii="Times New Roman" w:eastAsia="Times New Roman" w:hAnsi="Times New Roman" w:cs="Times New Roman"/>
-                <w:color w:val="1F1F1F"/>
-                <w:sz w:val="24"/>
-                <w:szCs w:val="24"/>
-                <w:lang w:eastAsia="en-IN" w:bidi="mr-IN"/>
-              </w:rPr>
-              <w:t>Jadhav</w:t>
-            </w:r>
-            <w:proofErr w:type="spellEnd"/>
+              <w:t>Raju Ramrao Jadhav</w:t>
+            </w:r>
           </w:p>
         </w:tc>
         <w:tc>
@@ -11445,27 +11424,15 @@
                 <w:lang w:eastAsia="en-IN" w:bidi="mr-IN"/>
               </w:rPr>
             </w:pPr>
-            <w:proofErr w:type="spellStart"/>
-            <w:r>
-              <w:rPr>
-                <w:rFonts w:ascii="Times New Roman" w:eastAsia="Times New Roman" w:hAnsi="Times New Roman" w:cs="Times New Roman"/>
-                <w:color w:val="1F1F1F"/>
-                <w:sz w:val="24"/>
-                <w:szCs w:val="24"/>
-                <w:lang w:eastAsia="en-IN" w:bidi="mr-IN"/>
-              </w:rPr>
-              <w:t>Suhas</w:t>
-            </w:r>
-            <w:proofErr w:type="spellEnd"/>
-            <w:r>
-              <w:rPr>
-                <w:rFonts w:ascii="Times New Roman" w:eastAsia="Times New Roman" w:hAnsi="Times New Roman" w:cs="Times New Roman"/>
-                <w:color w:val="1F1F1F"/>
-                <w:sz w:val="24"/>
-                <w:szCs w:val="24"/>
-                <w:lang w:eastAsia="en-IN" w:bidi="mr-IN"/>
-              </w:rPr>
-              <w:t xml:space="preserve"> S. Gund</w:t>
+            <w:r>
+              <w:rPr>
+                <w:rFonts w:ascii="Times New Roman" w:eastAsia="Times New Roman" w:hAnsi="Times New Roman" w:cs="Times New Roman"/>
+                <w:color w:val="1F1F1F"/>
+                <w:sz w:val="24"/>
+                <w:szCs w:val="24"/>
+                <w:lang w:eastAsia="en-IN" w:bidi="mr-IN"/>
+              </w:rPr>
+              <w:t>Suhas S. Gund</w:t>
             </w:r>
           </w:p>
         </w:tc>
@@ -11657,20 +11624,8 @@
                 <w:szCs w:val="24"/>
                 <w:lang w:eastAsia="en-IN" w:bidi="mr-IN"/>
               </w:rPr>
-              <w:t xml:space="preserve">Shri P J </w:t>
-            </w:r>
-            <w:proofErr w:type="spellStart"/>
-            <w:r>
-              <w:rPr>
-                <w:rFonts w:ascii="Times New Roman" w:eastAsia="Times New Roman" w:hAnsi="Times New Roman" w:cs="Times New Roman"/>
-                <w:color w:val="000000"/>
-                <w:sz w:val="24"/>
-                <w:szCs w:val="24"/>
-                <w:lang w:eastAsia="en-IN" w:bidi="mr-IN"/>
-              </w:rPr>
-              <w:t>Bansode</w:t>
-            </w:r>
-            <w:proofErr w:type="spellEnd"/>
+              <w:t>Shri P J Bansode</w:t>
+            </w:r>
           </w:p>
         </w:tc>
         <w:tc>
@@ -11735,27 +11690,15 @@
                 <w:lang w:eastAsia="en-IN" w:bidi="mr-IN"/>
               </w:rPr>
             </w:pPr>
-            <w:proofErr w:type="spellStart"/>
-            <w:r>
-              <w:rPr>
-                <w:rFonts w:ascii="Times New Roman" w:eastAsia="Times New Roman" w:hAnsi="Times New Roman" w:cs="Times New Roman"/>
-                <w:color w:val="1F1F1F"/>
-                <w:sz w:val="24"/>
-                <w:szCs w:val="24"/>
-                <w:lang w:eastAsia="en-IN" w:bidi="mr-IN"/>
-              </w:rPr>
-              <w:t>Suhas</w:t>
-            </w:r>
-            <w:proofErr w:type="spellEnd"/>
-            <w:r>
-              <w:rPr>
-                <w:rFonts w:ascii="Times New Roman" w:eastAsia="Times New Roman" w:hAnsi="Times New Roman" w:cs="Times New Roman"/>
-                <w:color w:val="1F1F1F"/>
-                <w:sz w:val="24"/>
-                <w:szCs w:val="24"/>
-                <w:lang w:eastAsia="en-IN" w:bidi="mr-IN"/>
-              </w:rPr>
-              <w:t xml:space="preserve"> S. Gund</w:t>
+            <w:r>
+              <w:rPr>
+                <w:rFonts w:ascii="Times New Roman" w:eastAsia="Times New Roman" w:hAnsi="Times New Roman" w:cs="Times New Roman"/>
+                <w:color w:val="1F1F1F"/>
+                <w:sz w:val="24"/>
+                <w:szCs w:val="24"/>
+                <w:lang w:eastAsia="en-IN" w:bidi="mr-IN"/>
+              </w:rPr>
+              <w:t>Suhas S. Gund</w:t>
             </w:r>
           </w:p>
         </w:tc>
@@ -11792,18 +11735,7 @@
                 <w:szCs w:val="24"/>
                 <w:lang w:eastAsia="en-IN" w:bidi="mr-IN"/>
               </w:rPr>
-              <w:t>Technical Laboratory Assistan</w:t>
-            </w:r>
-            <w:r>
-              <w:rPr>
-                <w:rFonts w:ascii="Times New Roman" w:eastAsia="Times New Roman" w:hAnsi="Times New Roman" w:cs="Times New Roman"/>
-                <w:color w:val="1F1F1F"/>
-                <w:sz w:val="24"/>
-                <w:szCs w:val="24"/>
-                <w:lang w:eastAsia="en-IN" w:bidi="mr-IN"/>
-              </w:rPr>
-              <w:lastRenderedPageBreak/>
-              <w:t>t</w:t>
+              <w:t>Technical Laboratory Assistant</w:t>
             </w:r>
           </w:p>
         </w:tc>
@@ -11840,7 +11772,6 @@
                 <w:szCs w:val="24"/>
                 <w:lang w:eastAsia="en-IN" w:bidi="mr-IN"/>
               </w:rPr>
-              <w:lastRenderedPageBreak/>
               <w:t>Diploma in IT</w:t>
             </w:r>
           </w:p>
@@ -11883,7 +11814,6 @@
                 <w:szCs w:val="24"/>
                 <w:lang w:eastAsia="en-IN" w:bidi="mr-IN"/>
               </w:rPr>
-              <w:lastRenderedPageBreak/>
               <w:t>7</w:t>
             </w:r>
           </w:p>
@@ -11960,20 +11890,8 @@
                 <w:szCs w:val="24"/>
                 <w:lang w:eastAsia="en-IN" w:bidi="mr-IN"/>
               </w:rPr>
-              <w:t xml:space="preserve">Shri N V </w:t>
-            </w:r>
-            <w:proofErr w:type="spellStart"/>
-            <w:r>
-              <w:rPr>
-                <w:rFonts w:ascii="Times New Roman" w:eastAsia="Times New Roman" w:hAnsi="Times New Roman" w:cs="Times New Roman"/>
-                <w:color w:val="000000"/>
-                <w:sz w:val="24"/>
-                <w:szCs w:val="24"/>
-                <w:lang w:eastAsia="en-IN" w:bidi="mr-IN"/>
-              </w:rPr>
-              <w:t>Bhalerao</w:t>
-            </w:r>
-            <w:proofErr w:type="spellEnd"/>
+              <w:t>Shri N V Bhalerao</w:t>
+            </w:r>
           </w:p>
         </w:tc>
         <w:tc>
@@ -12038,27 +11956,15 @@
                 <w:lang w:eastAsia="en-IN" w:bidi="mr-IN"/>
               </w:rPr>
             </w:pPr>
-            <w:proofErr w:type="spellStart"/>
-            <w:r>
-              <w:rPr>
-                <w:rFonts w:ascii="Times New Roman" w:eastAsia="Times New Roman" w:hAnsi="Times New Roman" w:cs="Times New Roman"/>
-                <w:color w:val="1F1F1F"/>
-                <w:sz w:val="24"/>
-                <w:szCs w:val="24"/>
-                <w:lang w:eastAsia="en-IN" w:bidi="mr-IN"/>
-              </w:rPr>
-              <w:t>Suhas</w:t>
-            </w:r>
-            <w:proofErr w:type="spellEnd"/>
-            <w:r>
-              <w:rPr>
-                <w:rFonts w:ascii="Times New Roman" w:eastAsia="Times New Roman" w:hAnsi="Times New Roman" w:cs="Times New Roman"/>
-                <w:color w:val="1F1F1F"/>
-                <w:sz w:val="24"/>
-                <w:szCs w:val="24"/>
-                <w:lang w:eastAsia="en-IN" w:bidi="mr-IN"/>
-              </w:rPr>
-              <w:t xml:space="preserve"> S. Gund</w:t>
+            <w:r>
+              <w:rPr>
+                <w:rFonts w:ascii="Times New Roman" w:eastAsia="Times New Roman" w:hAnsi="Times New Roman" w:cs="Times New Roman"/>
+                <w:color w:val="1F1F1F"/>
+                <w:sz w:val="24"/>
+                <w:szCs w:val="24"/>
+                <w:lang w:eastAsia="en-IN" w:bidi="mr-IN"/>
+              </w:rPr>
+              <w:t>Suhas S. Gund</w:t>
             </w:r>
           </w:p>
         </w:tc>
@@ -12718,10 +12624,8 @@
                 <w:szCs w:val="21"/>
                 <w:lang w:eastAsia="en-IN" w:bidi="mr-IN"/>
               </w:rPr>
-              <w:t xml:space="preserve"> of MSBTE Online Examination is available. All In One Computers with Web-Cameras, High-Speed Internet, AC, CCTV Cameras, </w:t>
-            </w:r>
-            <w:proofErr w:type="spellStart"/>
-            <w:proofErr w:type="gramStart"/>
+              <w:t xml:space="preserve"> of MSBTE Online Examination is available. All In One Computers with Web-Cameras, High-Speed Internet, AC, CCTV Cameras, WiFi </w:t>
+            </w:r>
             <w:r>
               <w:rPr>
                 <w:rFonts w:ascii="Times New Roman" w:eastAsia="Times New Roman" w:hAnsi="Times New Roman" w:cs="Times New Roman"/>
@@ -12729,27 +12633,17 @@
                 <w:szCs w:val="21"/>
                 <w:lang w:eastAsia="en-IN" w:bidi="mr-IN"/>
               </w:rPr>
-              <w:t>WiFi</w:t>
-            </w:r>
-            <w:proofErr w:type="spellEnd"/>
-            <w:proofErr w:type="gramEnd"/>
-            <w:r>
-              <w:rPr>
-                <w:rFonts w:ascii="Times New Roman" w:eastAsia="Times New Roman" w:hAnsi="Times New Roman" w:cs="Times New Roman"/>
+              <w:lastRenderedPageBreak/>
+              <w:t>Facilities are provided</w:t>
+            </w:r>
+            <w:r>
+              <w:rPr>
+                <w:rFonts w:ascii="Times New Roman" w:eastAsia="Times New Roman" w:hAnsi="Times New Roman" w:cs="Times New Roman"/>
+                <w:color w:val="1F1F1F"/>
                 <w:sz w:val="21"/>
                 <w:szCs w:val="21"/>
                 <w:lang w:eastAsia="en-IN" w:bidi="mr-IN"/>
               </w:rPr>
-              <w:t xml:space="preserve"> Facilities are provided</w:t>
-            </w:r>
-            <w:r>
-              <w:rPr>
-                <w:rFonts w:ascii="Times New Roman" w:eastAsia="Times New Roman" w:hAnsi="Times New Roman" w:cs="Times New Roman"/>
-                <w:color w:val="1F1F1F"/>
-                <w:sz w:val="21"/>
-                <w:szCs w:val="21"/>
-                <w:lang w:eastAsia="en-IN" w:bidi="mr-IN"/>
-              </w:rPr>
               <w:t>.</w:t>
             </w:r>
           </w:p>
@@ -12787,7 +12681,19 @@
                 <w:szCs w:val="24"/>
                 <w:lang w:eastAsia="en-IN" w:bidi="mr-IN"/>
               </w:rPr>
-              <w:t>Used for MSBTE Examination as well as Baseline Test conducted by MSBTE each semester.</w:t>
+              <w:lastRenderedPageBreak/>
+              <w:t xml:space="preserve">Used for MSBTE Examination as well as Baseline Test conducted by MSBTE </w:t>
+            </w:r>
+            <w:r>
+              <w:rPr>
+                <w:rFonts w:ascii="Times New Roman" w:eastAsia="Times New Roman" w:hAnsi="Times New Roman" w:cs="Times New Roman"/>
+                <w:color w:val="1F1F1F"/>
+                <w:sz w:val="24"/>
+                <w:szCs w:val="24"/>
+                <w:lang w:eastAsia="en-IN" w:bidi="mr-IN"/>
+              </w:rPr>
+              <w:lastRenderedPageBreak/>
+              <w:t>each semester.</w:t>
             </w:r>
           </w:p>
         </w:tc>
@@ -12824,51 +12730,8 @@
                 <w:szCs w:val="24"/>
                 <w:lang w:eastAsia="en-IN" w:bidi="mr-IN"/>
               </w:rPr>
-              <w:t xml:space="preserve">Facility is utilized by </w:t>
-            </w:r>
-            <w:proofErr w:type="spellStart"/>
-            <w:r>
-              <w:rPr>
-                <w:rFonts w:ascii="Times New Roman" w:eastAsia="Times New Roman" w:hAnsi="Times New Roman" w:cs="Times New Roman"/>
-                <w:color w:val="1F1F1F"/>
-                <w:sz w:val="24"/>
-                <w:szCs w:val="24"/>
-                <w:lang w:eastAsia="en-IN" w:bidi="mr-IN"/>
-              </w:rPr>
-              <w:t>Compuer</w:t>
-            </w:r>
-            <w:proofErr w:type="spellEnd"/>
-            <w:r>
-              <w:rPr>
-                <w:rFonts w:ascii="Times New Roman" w:eastAsia="Times New Roman" w:hAnsi="Times New Roman" w:cs="Times New Roman"/>
-                <w:color w:val="1F1F1F"/>
-                <w:sz w:val="24"/>
-                <w:szCs w:val="24"/>
-                <w:lang w:eastAsia="en-IN" w:bidi="mr-IN"/>
-              </w:rPr>
-              <w:t xml:space="preserve"> </w:t>
-            </w:r>
-            <w:proofErr w:type="spellStart"/>
-            <w:r>
-              <w:rPr>
-                <w:rFonts w:ascii="Times New Roman" w:eastAsia="Times New Roman" w:hAnsi="Times New Roman" w:cs="Times New Roman"/>
-                <w:color w:val="1F1F1F"/>
-                <w:sz w:val="24"/>
-                <w:szCs w:val="24"/>
-                <w:lang w:eastAsia="en-IN" w:bidi="mr-IN"/>
-              </w:rPr>
-              <w:t>Engg</w:t>
-            </w:r>
-            <w:proofErr w:type="spellEnd"/>
-            <w:r>
-              <w:rPr>
-                <w:rFonts w:ascii="Times New Roman" w:eastAsia="Times New Roman" w:hAnsi="Times New Roman" w:cs="Times New Roman"/>
-                <w:color w:val="1F1F1F"/>
-                <w:sz w:val="24"/>
-                <w:szCs w:val="24"/>
-                <w:lang w:eastAsia="en-IN" w:bidi="mr-IN"/>
-              </w:rPr>
-              <w:t xml:space="preserve"> Students as well all students of other Programs. Exam/Test are conducted Each Semester</w:t>
+              <w:lastRenderedPageBreak/>
+              <w:t>Facility is utilized by Compuer Engg Students as well all students of other Programs. Exam/Test are conducted Each Semester</w:t>
             </w:r>
           </w:p>
         </w:tc>
@@ -12905,7 +12768,18 @@
                 <w:szCs w:val="24"/>
                 <w:lang w:eastAsia="en-IN" w:bidi="mr-IN"/>
               </w:rPr>
-              <w:t>This facility is maintained well and hence it helps students to boost their handling of computer/digital devices as well as confidence level in examination</w:t>
+              <w:t xml:space="preserve">This facility is maintained well and hence it helps students to boost their handling of computer/digital devices as well as </w:t>
+            </w:r>
+            <w:r>
+              <w:rPr>
+                <w:rFonts w:ascii="Times New Roman" w:eastAsia="Times New Roman" w:hAnsi="Times New Roman" w:cs="Times New Roman"/>
+                <w:color w:val="1F1F1F"/>
+                <w:sz w:val="24"/>
+                <w:szCs w:val="24"/>
+                <w:lang w:eastAsia="en-IN" w:bidi="mr-IN"/>
+              </w:rPr>
+              <w:lastRenderedPageBreak/>
+              <w:t>confidence level in examination</w:t>
             </w:r>
           </w:p>
         </w:tc>
@@ -12942,6 +12816,7 @@
                 <w:szCs w:val="24"/>
                 <w:lang w:eastAsia="en-IN" w:bidi="mr-IN"/>
               </w:rPr>
+              <w:lastRenderedPageBreak/>
               <w:t>PO1 to PO7 and PSO1, PSO2</w:t>
             </w:r>
           </w:p>
@@ -13277,18 +13152,8 @@
                 <w:color w:val="1F1F1F"/>
                 <w:lang w:eastAsia="en-IN" w:bidi="mr-IN"/>
               </w:rPr>
-              <w:t xml:space="preserve">seminars </w:t>
-            </w:r>
-            <w:proofErr w:type="spellStart"/>
-            <w:r>
-              <w:rPr>
-                <w:rFonts w:ascii="Times New Roman" w:eastAsia="Times New Roman" w:hAnsi="Times New Roman" w:cs="Times New Roman"/>
-                <w:color w:val="1F1F1F"/>
-                <w:lang w:eastAsia="en-IN" w:bidi="mr-IN"/>
-              </w:rPr>
-              <w:t>etc</w:t>
-            </w:r>
-            <w:proofErr w:type="spellEnd"/>
+              <w:t>seminars etc</w:t>
+            </w:r>
           </w:p>
         </w:tc>
         <w:tc>
@@ -13564,18 +13429,8 @@
                 <w:color w:val="1F1F1F"/>
                 <w:lang w:eastAsia="en-IN" w:bidi="mr-IN"/>
               </w:rPr>
-              <w:t xml:space="preserve">Guest/Expert Lecture </w:t>
-            </w:r>
-            <w:proofErr w:type="spellStart"/>
-            <w:r>
-              <w:rPr>
-                <w:rFonts w:ascii="Times New Roman" w:eastAsia="Times New Roman" w:hAnsi="Times New Roman" w:cs="Times New Roman"/>
-                <w:color w:val="1F1F1F"/>
-                <w:lang w:eastAsia="en-IN" w:bidi="mr-IN"/>
-              </w:rPr>
-              <w:t>etc</w:t>
-            </w:r>
-            <w:proofErr w:type="spellEnd"/>
+              <w:t>Guest/Expert Lecture etc</w:t>
+            </w:r>
           </w:p>
         </w:tc>
         <w:tc>
@@ -13620,31 +13475,8 @@
                 <w:szCs w:val="24"/>
                 <w:lang w:eastAsia="en-IN" w:bidi="mr-IN"/>
               </w:rPr>
-              <w:t xml:space="preserve">demonstration, External viva </w:t>
-            </w:r>
-            <w:r>
-              <w:rPr>
-                <w:rFonts w:ascii="Times New Roman" w:eastAsia="Times New Roman" w:hAnsi="Times New Roman" w:cs="Times New Roman"/>
-                <w:color w:val="1F1F1F"/>
-                <w:sz w:val="24"/>
-                <w:szCs w:val="24"/>
-                <w:lang w:eastAsia="en-IN" w:bidi="mr-IN"/>
-              </w:rPr>
-              <w:lastRenderedPageBreak/>
-              <w:t xml:space="preserve">presentation </w:t>
-            </w:r>
-            <w:proofErr w:type="spellStart"/>
-            <w:r>
-              <w:rPr>
-                <w:rFonts w:ascii="Times New Roman" w:eastAsia="Times New Roman" w:hAnsi="Times New Roman" w:cs="Times New Roman"/>
-                <w:color w:val="1F1F1F"/>
-                <w:sz w:val="24"/>
-                <w:szCs w:val="24"/>
-                <w:lang w:eastAsia="en-IN" w:bidi="mr-IN"/>
-              </w:rPr>
-              <w:t>etc</w:t>
-            </w:r>
-            <w:proofErr w:type="spellEnd"/>
+              <w:t>demonstration, External viva presentation etc</w:t>
+            </w:r>
           </w:p>
         </w:tc>
         <w:tc>
@@ -13679,7 +13511,6 @@
                 <w:szCs w:val="24"/>
                 <w:lang w:eastAsia="en-IN" w:bidi="mr-IN"/>
               </w:rPr>
-              <w:lastRenderedPageBreak/>
               <w:t>Lifelong skill</w:t>
             </w:r>
           </w:p>
@@ -13826,7 +13657,6 @@
                 <w:szCs w:val="24"/>
                 <w:lang w:eastAsia="en-IN" w:bidi="mr-IN"/>
               </w:rPr>
-              <w:lastRenderedPageBreak/>
               <w:t>4</w:t>
             </w:r>
           </w:p>
@@ -14627,6 +14457,7 @@
                 <w:szCs w:val="24"/>
                 <w:lang w:eastAsia="en-IN" w:bidi="mr-IN"/>
               </w:rPr>
+              <w:lastRenderedPageBreak/>
               <w:t>7</w:t>
             </w:r>
           </w:p>
@@ -14701,20 +14532,8 @@
                 <w:szCs w:val="24"/>
                 <w:lang w:eastAsia="en-IN" w:bidi="mr-IN"/>
               </w:rPr>
-              <w:t xml:space="preserve">Essential stationery like File/Folder, Notebooks, Laboratory Manual, Tutorial Pages, Xerox Facility </w:t>
-            </w:r>
-            <w:proofErr w:type="spellStart"/>
-            <w:r>
-              <w:rPr>
-                <w:rFonts w:ascii="Times New Roman" w:eastAsia="Times New Roman" w:hAnsi="Times New Roman" w:cs="Times New Roman"/>
-                <w:color w:val="1F1F1F"/>
-                <w:sz w:val="24"/>
-                <w:szCs w:val="24"/>
-                <w:lang w:eastAsia="en-IN" w:bidi="mr-IN"/>
-              </w:rPr>
-              <w:t>Etc</w:t>
-            </w:r>
-            <w:proofErr w:type="spellEnd"/>
+              <w:t>Essential stationery like File/Folder, Notebooks, Laboratory Manual, Tutorial Pages, Xerox Facility Etc</w:t>
+            </w:r>
           </w:p>
         </w:tc>
         <w:tc>
@@ -15445,7 +15264,6 @@
                 <w:szCs w:val="24"/>
                 <w:lang w:eastAsia="en-IN" w:bidi="mr-IN"/>
               </w:rPr>
-              <w:lastRenderedPageBreak/>
               <w:t>10</w:t>
             </w:r>
           </w:p>
@@ -15557,29 +15375,7 @@
                 <w:szCs w:val="24"/>
                 <w:lang w:eastAsia="en-IN" w:bidi="mr-IN"/>
               </w:rPr>
-              <w:t xml:space="preserve">To enable students to learn new emerging technologies (AI, Cloud, </w:t>
-            </w:r>
-            <w:proofErr w:type="spellStart"/>
-            <w:r>
-              <w:rPr>
-                <w:rFonts w:ascii="Times New Roman" w:eastAsia="Times New Roman" w:hAnsi="Times New Roman" w:cs="Times New Roman"/>
-                <w:color w:val="1F1F1F"/>
-                <w:sz w:val="24"/>
-                <w:szCs w:val="24"/>
-                <w:lang w:eastAsia="en-IN" w:bidi="mr-IN"/>
-              </w:rPr>
-              <w:t>IoT</w:t>
-            </w:r>
-            <w:proofErr w:type="spellEnd"/>
-            <w:r>
-              <w:rPr>
-                <w:rFonts w:ascii="Times New Roman" w:eastAsia="Times New Roman" w:hAnsi="Times New Roman" w:cs="Times New Roman"/>
-                <w:color w:val="1F1F1F"/>
-                <w:sz w:val="24"/>
-                <w:szCs w:val="24"/>
-                <w:lang w:eastAsia="en-IN" w:bidi="mr-IN"/>
-              </w:rPr>
-              <w:t>)</w:t>
+              <w:t>To enable students to learn new emerging technologies (AI, Cloud, IoT)</w:t>
             </w:r>
           </w:p>
         </w:tc>
@@ -16299,34 +16095,11 @@
           <w:b/>
           <w:bCs/>
         </w:rPr>
+        <w:lastRenderedPageBreak/>
         <w:t>Preventive Maintenance:</w:t>
       </w:r>
       <w:r>
-        <w:t xml:space="preserve"> Hardware, networking equipment, and software are checked periodically by the Laboratory Assistants (Shri. Raju </w:t>
-      </w:r>
-      <w:proofErr w:type="spellStart"/>
-      <w:r>
-        <w:t>Ramrao</w:t>
-      </w:r>
-      <w:proofErr w:type="spellEnd"/>
-      <w:r>
-        <w:t xml:space="preserve"> </w:t>
-      </w:r>
-      <w:proofErr w:type="spellStart"/>
-      <w:r>
-        <w:t>Jadhav</w:t>
-      </w:r>
-      <w:proofErr w:type="spellEnd"/>
-      <w:r>
-        <w:t xml:space="preserve"> and Shri. </w:t>
-      </w:r>
-      <w:proofErr w:type="spellStart"/>
-      <w:r>
-        <w:t>Suhas</w:t>
-      </w:r>
-      <w:proofErr w:type="spellEnd"/>
-      <w:r>
-        <w:t xml:space="preserve"> S. Gund) to ensure uninterrupted practical sessions.</w:t>
+        <w:t xml:space="preserve"> Hardware, networking equipment, and software are checked periodically by the Laboratory Assistants (Shri. Raju Ramrao Jadhav and Shri. Suhas S. Gund) to ensure uninterrupted practical sessions.</w:t>
       </w:r>
     </w:p>
     <w:p>
@@ -16460,7 +16233,6 @@
           <w:b/>
           <w:bCs/>
         </w:rPr>
-        <w:lastRenderedPageBreak/>
         <w:t>Lab In-Charge Oversight:</w:t>
       </w:r>
       <w:r>
@@ -16818,7 +16590,7 @@
                 <w:lang w:eastAsia="en-IN" w:bidi="mr-IN"/>
               </w:rPr>
             </w:pPr>
-            <w:bookmarkStart w:id="1" w:name="_Hlk126180514" w:colFirst="2" w:colLast="5"/>
+            <w:bookmarkStart w:id="0" w:name="_Hlk126180514" w:colFirst="2" w:colLast="5"/>
             <w:r>
               <w:rPr>
                 <w:rFonts w:ascii="Times New Roman" w:eastAsia="Times New Roman" w:hAnsi="Times New Roman" w:cs="Times New Roman"/>
@@ -16856,7 +16628,7 @@
                 <w:lang w:eastAsia="en-IN" w:bidi="mr-IN"/>
               </w:rPr>
             </w:pPr>
-            <w:bookmarkStart w:id="2" w:name="RANGE!B1"/>
+            <w:bookmarkStart w:id="1" w:name="RANGE!B1"/>
             <w:r>
               <w:rPr>
                 <w:rFonts w:ascii="Times New Roman" w:eastAsia="Times New Roman" w:hAnsi="Times New Roman" w:cs="Times New Roman"/>
@@ -16867,7 +16639,7 @@
               </w:rPr>
               <w:t>No of computer terminals</w:t>
             </w:r>
-            <w:bookmarkEnd w:id="2"/>
+            <w:bookmarkEnd w:id="1"/>
           </w:p>
         </w:tc>
         <w:tc>
@@ -17056,6 +16828,7 @@
                 <w:szCs w:val="24"/>
                 <w:lang w:val="en-US" w:eastAsia="en-IN" w:bidi="mr-IN"/>
               </w:rPr>
+              <w:lastRenderedPageBreak/>
               <w:t>1</w:t>
             </w:r>
           </w:p>
@@ -17305,7 +17078,7 @@
           </w:p>
         </w:tc>
       </w:tr>
-      <w:bookmarkEnd w:id="1"/>
+      <w:bookmarkEnd w:id="0"/>
     </w:tbl>
     <w:p>
       <w:pPr>
@@ -17399,7 +17172,6 @@
         </w:rPr>
         <w:t xml:space="preserve">Language lab is available in Science Department and shared with all the departments for conducting </w:t>
       </w:r>
-      <w:proofErr w:type="spellStart"/>
       <w:r>
         <w:rPr>
           <w:rFonts w:ascii="Times New Roman" w:hAnsi="Times New Roman" w:cs="Times New Roman"/>
@@ -17408,7 +17180,6 @@
         </w:rPr>
         <w:t>practicals</w:t>
       </w:r>
-      <w:proofErr w:type="spellEnd"/>
       <w:r>
         <w:rPr>
           <w:rFonts w:ascii="Times New Roman" w:hAnsi="Times New Roman" w:cs="Times New Roman"/>
@@ -17858,23 +17629,13 @@
                 <w:szCs w:val="24"/>
               </w:rPr>
             </w:pPr>
-            <w:proofErr w:type="spellStart"/>
-            <w:r>
-              <w:rPr>
-                <w:rFonts w:ascii="Times New Roman" w:hAnsi="Times New Roman" w:cs="Times New Roman"/>
-                <w:sz w:val="24"/>
-                <w:szCs w:val="24"/>
-              </w:rPr>
-              <w:t>Biyani</w:t>
-            </w:r>
-            <w:proofErr w:type="spellEnd"/>
-            <w:r>
-              <w:rPr>
-                <w:rFonts w:ascii="Times New Roman" w:hAnsi="Times New Roman" w:cs="Times New Roman"/>
-                <w:sz w:val="24"/>
-                <w:szCs w:val="24"/>
-              </w:rPr>
-              <w:t xml:space="preserve"> Technology</w:t>
+            <w:r>
+              <w:rPr>
+                <w:rFonts w:ascii="Times New Roman" w:hAnsi="Times New Roman" w:cs="Times New Roman"/>
+                <w:sz w:val="24"/>
+                <w:szCs w:val="24"/>
+              </w:rPr>
+              <w:t>Biyani Technology</w:t>
             </w:r>
           </w:p>
         </w:tc>
@@ -18056,7 +17817,6 @@
           <w:sz w:val="24"/>
           <w:szCs w:val="24"/>
         </w:rPr>
-        <w:lastRenderedPageBreak/>
         <w:t>Skills imparted using above learning resources:</w:t>
       </w:r>
     </w:p>
@@ -18101,7 +17861,6 @@
                 <w:szCs w:val="24"/>
               </w:rPr>
             </w:pPr>
-            <w:proofErr w:type="spellStart"/>
             <w:r>
               <w:rPr>
                 <w:rFonts w:ascii="Times New Roman" w:hAnsi="Times New Roman" w:cs="Times New Roman"/>
@@ -18111,19 +17870,7 @@
                 <w:szCs w:val="24"/>
                 <w:lang w:val="en-US"/>
               </w:rPr>
-              <w:t>Sr.No</w:t>
-            </w:r>
-            <w:proofErr w:type="spellEnd"/>
-            <w:r>
-              <w:rPr>
-                <w:rFonts w:ascii="Times New Roman" w:hAnsi="Times New Roman" w:cs="Times New Roman"/>
-                <w:b/>
-                <w:bCs/>
-                <w:sz w:val="24"/>
-                <w:szCs w:val="24"/>
-                <w:lang w:val="en-US"/>
-              </w:rPr>
-              <w:t>.</w:t>
+              <w:t>Sr.No.</w:t>
             </w:r>
           </w:p>
         </w:tc>
@@ -19005,7 +18752,7 @@
       </w:pPr>
     </w:p>
     <w:sectPr>
-      <w:footerReference w:type="default" r:id="rId21"/>
+      <w:footerReference w:type="default" r:id="rId22"/>
       <w:pgSz w:w="11906" w:h="16838"/>
       <w:pgMar w:top="1440" w:right="1274" w:bottom="1440" w:left="1440" w:header="708" w:footer="432" w:gutter="0"/>
       <w:pgBorders w:offsetFrom="page">
@@ -19022,7 +18769,7 @@
 </file>
 
 <file path=word/endnotes.xml><?xml version="1.0" encoding="utf-8"?>
-<w:endnotes xmlns:wpc="http://schemas.microsoft.com/office/word/2010/wordprocessingCanvas" xmlns:mc="http://schemas.openxmlformats.org/markup-compatibility/2006" xmlns:o="urn:schemas-microsoft-com:office:office" xmlns:r="http://schemas.openxmlformats.org/officeDocument/2006/relationships" xmlns:m="http://schemas.openxmlformats.org/officeDocument/2006/math" xmlns:v="urn:schemas-microsoft-com:vml" xmlns:wp14="http://schemas.microsoft.com/office/word/2010/wordprocessingDrawing" xmlns:wp="http://schemas.openxmlformats.org/drawingml/2006/wordprocessingDrawing" xmlns:w10="urn:schemas-microsoft-com:office:word" xmlns:w="http://schemas.openxmlformats.org/wordprocessingml/2006/main" xmlns:w14="http://schemas.microsoft.com/office/word/2010/wordml" xmlns:wpg="http://schemas.microsoft.com/office/word/2010/wordprocessingGroup" xmlns:wpi="http://schemas.microsoft.com/office/word/2010/wordprocessingInk" xmlns:wne="http://schemas.microsoft.com/office/word/2006/wordml" xmlns:wps="http://schemas.microsoft.com/office/word/2010/wordprocessingShape" mc:Ignorable="w14 wp14">
+<w:endnotes xmlns:wpc="http://schemas.microsoft.com/office/word/2010/wordprocessingCanvas" xmlns:cx="http://schemas.microsoft.com/office/drawing/2014/chartex" xmlns:cx1="http://schemas.microsoft.com/office/drawing/2015/9/8/chartex" xmlns:cx2="http://schemas.microsoft.com/office/drawing/2015/10/21/chartex" xmlns:cx3="http://schemas.microsoft.com/office/drawing/2016/5/9/chartex" xmlns:cx4="http://schemas.microsoft.com/office/drawing/2016/5/10/chartex" xmlns:cx5="http://schemas.microsoft.com/office/drawing/2016/5/11/chartex" xmlns:cx6="http://schemas.microsoft.com/office/drawing/2016/5/12/chartex" xmlns:cx7="http://schemas.microsoft.com/office/drawing/2016/5/13/chartex" xmlns:cx8="http://schemas.microsoft.com/office/drawing/2016/5/14/chartex" xmlns:mc="http://schemas.openxmlformats.org/markup-compatibility/2006" xmlns:aink="http://schemas.microsoft.com/office/drawing/2016/ink" xmlns:am3d="http://schemas.microsoft.com/office/drawing/2017/model3d" xmlns:o="urn:schemas-microsoft-com:office:office" xmlns:oel="http://schemas.microsoft.com/office/2019/extlst" xmlns:r="http://schemas.openxmlformats.org/officeDocument/2006/relationships" xmlns:m="http://schemas.openxmlformats.org/officeDocument/2006/math" xmlns:v="urn:schemas-microsoft-com:vml" xmlns:wp14="http://schemas.microsoft.com/office/word/2010/wordprocessingDrawing" xmlns:wp="http://schemas.openxmlformats.org/drawingml/2006/wordprocessingDrawing" xmlns:w10="urn:schemas-microsoft-com:office:word" xmlns:w="http://schemas.openxmlformats.org/wordprocessingml/2006/main" xmlns:w14="http://schemas.microsoft.com/office/word/2010/wordml" xmlns:w15="http://schemas.microsoft.com/office/word/2012/wordml" xmlns:w16cex="http://schemas.microsoft.com/office/word/2018/wordml/cex" xmlns:w16cid="http://schemas.microsoft.com/office/word/2016/wordml/cid" xmlns:w16="http://schemas.microsoft.com/office/word/2018/wordml" xmlns:w16du="http://schemas.microsoft.com/office/word/2023/wordml/word16du" xmlns:w16sdtdh="http://schemas.microsoft.com/office/word/2020/wordml/sdtdatahash" xmlns:w16se="http://schemas.microsoft.com/office/word/2015/wordml/symex" xmlns:wpg="http://schemas.microsoft.com/office/word/2010/wordprocessingGroup" xmlns:wpi="http://schemas.microsoft.com/office/word/2010/wordprocessingInk" xmlns:wne="http://schemas.microsoft.com/office/word/2006/wordml" xmlns:wps="http://schemas.microsoft.com/office/word/2010/wordprocessingShape" mc:Ignorable="w14 w15 w16se w16cid w16 w16cex w16sdtdh w16du wp14">
   <w:endnote w:type="separator" w:id="-1">
     <w:p>
       <w:pPr>
@@ -19047,7 +18794,7 @@
 </file>
 
 <file path=word/footer1.xml><?xml version="1.0" encoding="utf-8"?>
-<w:ftr xmlns:wpc="http://schemas.microsoft.com/office/word/2010/wordprocessingCanvas" xmlns:mc="http://schemas.openxmlformats.org/markup-compatibility/2006" xmlns:o="urn:schemas-microsoft-com:office:office" xmlns:r="http://schemas.openxmlformats.org/officeDocument/2006/relationships" xmlns:m="http://schemas.openxmlformats.org/officeDocument/2006/math" xmlns:v="urn:schemas-microsoft-com:vml" xmlns:wp14="http://schemas.microsoft.com/office/word/2010/wordprocessingDrawing" xmlns:wp="http://schemas.openxmlformats.org/drawingml/2006/wordprocessingDrawing" xmlns:w10="urn:schemas-microsoft-com:office:word" xmlns:w="http://schemas.openxmlformats.org/wordprocessingml/2006/main" xmlns:w14="http://schemas.microsoft.com/office/word/2010/wordml" xmlns:wpg="http://schemas.microsoft.com/office/word/2010/wordprocessingGroup" xmlns:wpi="http://schemas.microsoft.com/office/word/2010/wordprocessingInk" xmlns:wne="http://schemas.microsoft.com/office/word/2006/wordml" xmlns:wps="http://schemas.microsoft.com/office/word/2010/wordprocessingShape" mc:Ignorable="w14 wp14">
+<w:ftr xmlns:wpc="http://schemas.microsoft.com/office/word/2010/wordprocessingCanvas" xmlns:cx="http://schemas.microsoft.com/office/drawing/2014/chartex" xmlns:cx1="http://schemas.microsoft.com/office/drawing/2015/9/8/chartex" xmlns:cx2="http://schemas.microsoft.com/office/drawing/2015/10/21/chartex" xmlns:cx3="http://schemas.microsoft.com/office/drawing/2016/5/9/chartex" xmlns:cx4="http://schemas.microsoft.com/office/drawing/2016/5/10/chartex" xmlns:cx5="http://schemas.microsoft.com/office/drawing/2016/5/11/chartex" xmlns:cx6="http://schemas.microsoft.com/office/drawing/2016/5/12/chartex" xmlns:cx7="http://schemas.microsoft.com/office/drawing/2016/5/13/chartex" xmlns:cx8="http://schemas.microsoft.com/office/drawing/2016/5/14/chartex" xmlns:mc="http://schemas.openxmlformats.org/markup-compatibility/2006" xmlns:aink="http://schemas.microsoft.com/office/drawing/2016/ink" xmlns:am3d="http://schemas.microsoft.com/office/drawing/2017/model3d" xmlns:o="urn:schemas-microsoft-com:office:office" xmlns:oel="http://schemas.microsoft.com/office/2019/extlst" xmlns:r="http://schemas.openxmlformats.org/officeDocument/2006/relationships" xmlns:m="http://schemas.openxmlformats.org/officeDocument/2006/math" xmlns:v="urn:schemas-microsoft-com:vml" xmlns:wp14="http://schemas.microsoft.com/office/word/2010/wordprocessingDrawing" xmlns:wp="http://schemas.openxmlformats.org/drawingml/2006/wordprocessingDrawing" xmlns:w10="urn:schemas-microsoft-com:office:word" xmlns:w="http://schemas.openxmlformats.org/wordprocessingml/2006/main" xmlns:w14="http://schemas.microsoft.com/office/word/2010/wordml" xmlns:w15="http://schemas.microsoft.com/office/word/2012/wordml" xmlns:w16cex="http://schemas.microsoft.com/office/word/2018/wordml/cex" xmlns:w16cid="http://schemas.microsoft.com/office/word/2016/wordml/cid" xmlns:w16="http://schemas.microsoft.com/office/word/2018/wordml" xmlns:w16du="http://schemas.microsoft.com/office/word/2023/wordml/word16du" xmlns:w16sdtdh="http://schemas.microsoft.com/office/word/2020/wordml/sdtdatahash" xmlns:w16se="http://schemas.microsoft.com/office/word/2015/wordml/symex" xmlns:wpg="http://schemas.microsoft.com/office/word/2010/wordprocessingGroup" xmlns:wpi="http://schemas.microsoft.com/office/word/2010/wordprocessingInk" xmlns:wne="http://schemas.microsoft.com/office/word/2006/wordml" xmlns:wps="http://schemas.microsoft.com/office/word/2010/wordprocessingShape" mc:Ignorable="w14 w15 w16se w16cid w16 w16cex w16sdtdh w16du wp14">
   <w:sdt>
     <w:sdtPr>
       <w:id w:val="1810202757"/>
@@ -19100,7 +18847,7 @@
 </file>
 
 <file path=word/footnotes.xml><?xml version="1.0" encoding="utf-8"?>
-<w:footnotes xmlns:wpc="http://schemas.microsoft.com/office/word/2010/wordprocessingCanvas" xmlns:mc="http://schemas.openxmlformats.org/markup-compatibility/2006" xmlns:o="urn:schemas-microsoft-com:office:office" xmlns:r="http://schemas.openxmlformats.org/officeDocument/2006/relationships" xmlns:m="http://schemas.openxmlformats.org/officeDocument/2006/math" xmlns:v="urn:schemas-microsoft-com:vml" xmlns:wp14="http://schemas.microsoft.com/office/word/2010/wordprocessingDrawing" xmlns:wp="http://schemas.openxmlformats.org/drawingml/2006/wordprocessingDrawing" xmlns:w10="urn:schemas-microsoft-com:office:word" xmlns:w="http://schemas.openxmlformats.org/wordprocessingml/2006/main" xmlns:w14="http://schemas.microsoft.com/office/word/2010/wordml" xmlns:wpg="http://schemas.microsoft.com/office/word/2010/wordprocessingGroup" xmlns:wpi="http://schemas.microsoft.com/office/word/2010/wordprocessingInk" xmlns:wne="http://schemas.microsoft.com/office/word/2006/wordml" xmlns:wps="http://schemas.microsoft.com/office/word/2010/wordprocessingShape" mc:Ignorable="w14 wp14">
+<w:footnotes xmlns:wpc="http://schemas.microsoft.com/office/word/2010/wordprocessingCanvas" xmlns:cx="http://schemas.microsoft.com/office/drawing/2014/chartex" xmlns:cx1="http://schemas.microsoft.com/office/drawing/2015/9/8/chartex" xmlns:cx2="http://schemas.microsoft.com/office/drawing/2015/10/21/chartex" xmlns:cx3="http://schemas.microsoft.com/office/drawing/2016/5/9/chartex" xmlns:cx4="http://schemas.microsoft.com/office/drawing/2016/5/10/chartex" xmlns:cx5="http://schemas.microsoft.com/office/drawing/2016/5/11/chartex" xmlns:cx6="http://schemas.microsoft.com/office/drawing/2016/5/12/chartex" xmlns:cx7="http://schemas.microsoft.com/office/drawing/2016/5/13/chartex" xmlns:cx8="http://schemas.microsoft.com/office/drawing/2016/5/14/chartex" xmlns:mc="http://schemas.openxmlformats.org/markup-compatibility/2006" xmlns:aink="http://schemas.microsoft.com/office/drawing/2016/ink" xmlns:am3d="http://schemas.microsoft.com/office/drawing/2017/model3d" xmlns:o="urn:schemas-microsoft-com:office:office" xmlns:oel="http://schemas.microsoft.com/office/2019/extlst" xmlns:r="http://schemas.openxmlformats.org/officeDocument/2006/relationships" xmlns:m="http://schemas.openxmlformats.org/officeDocument/2006/math" xmlns:v="urn:schemas-microsoft-com:vml" xmlns:wp14="http://schemas.microsoft.com/office/word/2010/wordprocessingDrawing" xmlns:wp="http://schemas.openxmlformats.org/drawingml/2006/wordprocessingDrawing" xmlns:w10="urn:schemas-microsoft-com:office:word" xmlns:w="http://schemas.openxmlformats.org/wordprocessingml/2006/main" xmlns:w14="http://schemas.microsoft.com/office/word/2010/wordml" xmlns:w15="http://schemas.microsoft.com/office/word/2012/wordml" xmlns:w16cex="http://schemas.microsoft.com/office/word/2018/wordml/cex" xmlns:w16cid="http://schemas.microsoft.com/office/word/2016/wordml/cid" xmlns:w16="http://schemas.microsoft.com/office/word/2018/wordml" xmlns:w16du="http://schemas.microsoft.com/office/word/2023/wordml/word16du" xmlns:w16sdtdh="http://schemas.microsoft.com/office/word/2020/wordml/sdtdatahash" xmlns:w16se="http://schemas.microsoft.com/office/word/2015/wordml/symex" xmlns:wpg="http://schemas.microsoft.com/office/word/2010/wordprocessingGroup" xmlns:wpi="http://schemas.microsoft.com/office/word/2010/wordprocessingInk" xmlns:wne="http://schemas.microsoft.com/office/word/2006/wordml" xmlns:wps="http://schemas.microsoft.com/office/word/2010/wordprocessingShape" mc:Ignorable="w14 w15 w16se w16cid w16 w16cex w16sdtdh w16du wp14">
   <w:footnote w:type="separator" w:id="-1">
     <w:p>
       <w:pPr>
@@ -19125,8 +18872,8 @@
 </file>
 
 <file path=word/numbering.xml><?xml version="1.0" encoding="utf-8"?>
-<w:numbering xmlns:wpc="http://schemas.microsoft.com/office/word/2010/wordprocessingCanvas" xmlns:mc="http://schemas.openxmlformats.org/markup-compatibility/2006" xmlns:o="urn:schemas-microsoft-com:office:office" xmlns:r="http://schemas.openxmlformats.org/officeDocument/2006/relationships" xmlns:m="http://schemas.openxmlformats.org/officeDocument/2006/math" xmlns:v="urn:schemas-microsoft-com:vml" xmlns:wp14="http://schemas.microsoft.com/office/word/2010/wordprocessingDrawing" xmlns:wp="http://schemas.openxmlformats.org/drawingml/2006/wordprocessingDrawing" xmlns:w10="urn:schemas-microsoft-com:office:word" xmlns:w="http://schemas.openxmlformats.org/wordprocessingml/2006/main" xmlns:w14="http://schemas.microsoft.com/office/word/2010/wordml" xmlns:wpg="http://schemas.microsoft.com/office/word/2010/wordprocessingGroup" xmlns:wpi="http://schemas.microsoft.com/office/word/2010/wordprocessingInk" xmlns:wne="http://schemas.microsoft.com/office/word/2006/wordml" xmlns:wps="http://schemas.microsoft.com/office/word/2010/wordprocessingShape" mc:Ignorable="w14 wp14">
-  <w:abstractNum w:abstractNumId="0">
+<w:numbering xmlns:wpc="http://schemas.microsoft.com/office/word/2010/wordprocessingCanvas" xmlns:cx="http://schemas.microsoft.com/office/drawing/2014/chartex" xmlns:cx1="http://schemas.microsoft.com/office/drawing/2015/9/8/chartex" xmlns:cx2="http://schemas.microsoft.com/office/drawing/2015/10/21/chartex" xmlns:cx3="http://schemas.microsoft.com/office/drawing/2016/5/9/chartex" xmlns:cx4="http://schemas.microsoft.com/office/drawing/2016/5/10/chartex" xmlns:cx5="http://schemas.microsoft.com/office/drawing/2016/5/11/chartex" xmlns:cx6="http://schemas.microsoft.com/office/drawing/2016/5/12/chartex" xmlns:cx7="http://schemas.microsoft.com/office/drawing/2016/5/13/chartex" xmlns:cx8="http://schemas.microsoft.com/office/drawing/2016/5/14/chartex" xmlns:mc="http://schemas.openxmlformats.org/markup-compatibility/2006" xmlns:aink="http://schemas.microsoft.com/office/drawing/2016/ink" xmlns:am3d="http://schemas.microsoft.com/office/drawing/2017/model3d" xmlns:o="urn:schemas-microsoft-com:office:office" xmlns:oel="http://schemas.microsoft.com/office/2019/extlst" xmlns:r="http://schemas.openxmlformats.org/officeDocument/2006/relationships" xmlns:m="http://schemas.openxmlformats.org/officeDocument/2006/math" xmlns:v="urn:schemas-microsoft-com:vml" xmlns:wp14="http://schemas.microsoft.com/office/word/2010/wordprocessingDrawing" xmlns:wp="http://schemas.openxmlformats.org/drawingml/2006/wordprocessingDrawing" xmlns:w10="urn:schemas-microsoft-com:office:word" xmlns:w="http://schemas.openxmlformats.org/wordprocessingml/2006/main" xmlns:w14="http://schemas.microsoft.com/office/word/2010/wordml" xmlns:w15="http://schemas.microsoft.com/office/word/2012/wordml" xmlns:w16cex="http://schemas.microsoft.com/office/word/2018/wordml/cex" xmlns:w16cid="http://schemas.microsoft.com/office/word/2016/wordml/cid" xmlns:w16="http://schemas.microsoft.com/office/word/2018/wordml" xmlns:w16du="http://schemas.microsoft.com/office/word/2023/wordml/word16du" xmlns:w16sdtdh="http://schemas.microsoft.com/office/word/2020/wordml/sdtdatahash" xmlns:w16se="http://schemas.microsoft.com/office/word/2015/wordml/symex" xmlns:wpg="http://schemas.microsoft.com/office/word/2010/wordprocessingGroup" xmlns:wpi="http://schemas.microsoft.com/office/word/2010/wordprocessingInk" xmlns:wne="http://schemas.microsoft.com/office/word/2006/wordml" xmlns:wps="http://schemas.microsoft.com/office/word/2010/wordprocessingShape" mc:Ignorable="w14 w15 w16se w16cid w16 w16cex w16sdtdh w16du wp14">
+  <w:abstractNum w:abstractNumId="0" w15:restartNumberingAfterBreak="0">
     <w:nsid w:val="002942AA"/>
     <w:multiLevelType w:val="hybridMultilevel"/>
     <w:tmpl w:val="83F0255C"/>
@@ -19212,7 +18959,7 @@
       </w:pPr>
     </w:lvl>
   </w:abstractNum>
-  <w:abstractNum w:abstractNumId="1">
+  <w:abstractNum w:abstractNumId="1" w15:restartNumberingAfterBreak="0">
     <w:nsid w:val="0D3E2F72"/>
     <w:multiLevelType w:val="hybridMultilevel"/>
     <w:tmpl w:val="D4985AD8"/>
@@ -19325,7 +19072,7 @@
       </w:rPr>
     </w:lvl>
   </w:abstractNum>
-  <w:abstractNum w:abstractNumId="2">
+  <w:abstractNum w:abstractNumId="2" w15:restartNumberingAfterBreak="0">
     <w:nsid w:val="13A548F6"/>
     <w:multiLevelType w:val="hybridMultilevel"/>
     <w:tmpl w:val="97EEF31C"/>
@@ -19411,7 +19158,7 @@
       </w:pPr>
     </w:lvl>
   </w:abstractNum>
-  <w:abstractNum w:abstractNumId="3">
+  <w:abstractNum w:abstractNumId="3" w15:restartNumberingAfterBreak="0">
     <w:nsid w:val="22E435A1"/>
     <w:multiLevelType w:val="hybridMultilevel"/>
     <w:tmpl w:val="83F0255C"/>
@@ -19497,7 +19244,7 @@
       </w:pPr>
     </w:lvl>
   </w:abstractNum>
-  <w:abstractNum w:abstractNumId="4">
+  <w:abstractNum w:abstractNumId="4" w15:restartNumberingAfterBreak="0">
     <w:nsid w:val="2B0D59BA"/>
     <w:multiLevelType w:val="hybridMultilevel"/>
     <w:tmpl w:val="4F6C47EE"/>
@@ -19586,7 +19333,7 @@
       </w:pPr>
     </w:lvl>
   </w:abstractNum>
-  <w:abstractNum w:abstractNumId="5">
+  <w:abstractNum w:abstractNumId="5" w15:restartNumberingAfterBreak="0">
     <w:nsid w:val="32FC31F8"/>
     <w:multiLevelType w:val="hybridMultilevel"/>
     <w:tmpl w:val="83F0255C"/>
@@ -19672,7 +19419,7 @@
       </w:pPr>
     </w:lvl>
   </w:abstractNum>
-  <w:abstractNum w:abstractNumId="6">
+  <w:abstractNum w:abstractNumId="6" w15:restartNumberingAfterBreak="0">
     <w:nsid w:val="3D9B18D7"/>
     <w:multiLevelType w:val="hybridMultilevel"/>
     <w:tmpl w:val="83F0255C"/>
@@ -19758,7 +19505,7 @@
       </w:pPr>
     </w:lvl>
   </w:abstractNum>
-  <w:abstractNum w:abstractNumId="7">
+  <w:abstractNum w:abstractNumId="7" w15:restartNumberingAfterBreak="0">
     <w:nsid w:val="3FE44EB8"/>
     <w:multiLevelType w:val="hybridMultilevel"/>
     <w:tmpl w:val="9BFA6D7A"/>
@@ -19871,7 +19618,7 @@
       </w:rPr>
     </w:lvl>
   </w:abstractNum>
-  <w:abstractNum w:abstractNumId="8">
+  <w:abstractNum w:abstractNumId="8" w15:restartNumberingAfterBreak="0">
     <w:nsid w:val="4432768E"/>
     <w:multiLevelType w:val="hybridMultilevel"/>
     <w:tmpl w:val="D43459DE"/>
@@ -19957,7 +19704,7 @@
       </w:pPr>
     </w:lvl>
   </w:abstractNum>
-  <w:abstractNum w:abstractNumId="9">
+  <w:abstractNum w:abstractNumId="9" w15:restartNumberingAfterBreak="0">
     <w:nsid w:val="47CC3126"/>
     <w:multiLevelType w:val="hybridMultilevel"/>
     <w:tmpl w:val="777C42F2"/>
@@ -20043,7 +19790,7 @@
       </w:pPr>
     </w:lvl>
   </w:abstractNum>
-  <w:abstractNum w:abstractNumId="10">
+  <w:abstractNum w:abstractNumId="10" w15:restartNumberingAfterBreak="0">
     <w:nsid w:val="4D0624D6"/>
     <w:multiLevelType w:val="multilevel"/>
     <w:tmpl w:val="D3783F7C"/>
@@ -20192,7 +19939,7 @@
       </w:rPr>
     </w:lvl>
   </w:abstractNum>
-  <w:abstractNum w:abstractNumId="11">
+  <w:abstractNum w:abstractNumId="11" w15:restartNumberingAfterBreak="0">
     <w:nsid w:val="5190363A"/>
     <w:multiLevelType w:val="hybridMultilevel"/>
     <w:tmpl w:val="520AC7A8"/>
@@ -20281,7 +20028,7 @@
       </w:pPr>
     </w:lvl>
   </w:abstractNum>
-  <w:abstractNum w:abstractNumId="12">
+  <w:abstractNum w:abstractNumId="12" w15:restartNumberingAfterBreak="0">
     <w:nsid w:val="56931A61"/>
     <w:multiLevelType w:val="hybridMultilevel"/>
     <w:tmpl w:val="83F0255C"/>
@@ -20367,7 +20114,7 @@
       </w:pPr>
     </w:lvl>
   </w:abstractNum>
-  <w:abstractNum w:abstractNumId="13">
+  <w:abstractNum w:abstractNumId="13" w15:restartNumberingAfterBreak="0">
     <w:nsid w:val="569E43CB"/>
     <w:multiLevelType w:val="multilevel"/>
     <w:tmpl w:val="F6E8E812"/>
@@ -20516,7 +20263,7 @@
       </w:rPr>
     </w:lvl>
   </w:abstractNum>
-  <w:abstractNum w:abstractNumId="14">
+  <w:abstractNum w:abstractNumId="14" w15:restartNumberingAfterBreak="0">
     <w:nsid w:val="60210B7D"/>
     <w:multiLevelType w:val="hybridMultilevel"/>
     <w:tmpl w:val="83F0255C"/>
@@ -20602,7 +20349,7 @@
       </w:pPr>
     </w:lvl>
   </w:abstractNum>
-  <w:abstractNum w:abstractNumId="15">
+  <w:abstractNum w:abstractNumId="15" w15:restartNumberingAfterBreak="0">
     <w:nsid w:val="62E245D1"/>
     <w:multiLevelType w:val="hybridMultilevel"/>
     <w:tmpl w:val="D7BCC384"/>
@@ -20691,7 +20438,93 @@
       </w:pPr>
     </w:lvl>
   </w:abstractNum>
-  <w:abstractNum w:abstractNumId="16">
+  <w:abstractNum w:abstractNumId="16" w15:restartNumberingAfterBreak="0">
+    <w:nsid w:val="644F65D0"/>
+    <w:multiLevelType w:val="hybridMultilevel"/>
+    <w:tmpl w:val="83F0255C"/>
+    <w:lvl w:ilvl="0" w:tplc="FFFFFFFF">
+      <w:start w:val="1"/>
+      <w:numFmt w:val="decimal"/>
+      <w:lvlText w:val="%1."/>
+      <w:lvlJc w:val="left"/>
+      <w:pPr>
+        <w:ind w:left="720" w:hanging="360"/>
+      </w:pPr>
+    </w:lvl>
+    <w:lvl w:ilvl="1" w:tplc="FFFFFFFF" w:tentative="1">
+      <w:start w:val="1"/>
+      <w:numFmt w:val="lowerLetter"/>
+      <w:lvlText w:val="%2."/>
+      <w:lvlJc w:val="left"/>
+      <w:pPr>
+        <w:ind w:left="1440" w:hanging="360"/>
+      </w:pPr>
+    </w:lvl>
+    <w:lvl w:ilvl="2" w:tplc="FFFFFFFF" w:tentative="1">
+      <w:start w:val="1"/>
+      <w:numFmt w:val="lowerRoman"/>
+      <w:lvlText w:val="%3."/>
+      <w:lvlJc w:val="right"/>
+      <w:pPr>
+        <w:ind w:left="2160" w:hanging="180"/>
+      </w:pPr>
+    </w:lvl>
+    <w:lvl w:ilvl="3" w:tplc="FFFFFFFF" w:tentative="1">
+      <w:start w:val="1"/>
+      <w:numFmt w:val="decimal"/>
+      <w:lvlText w:val="%4."/>
+      <w:lvlJc w:val="left"/>
+      <w:pPr>
+        <w:ind w:left="2880" w:hanging="360"/>
+      </w:pPr>
+    </w:lvl>
+    <w:lvl w:ilvl="4" w:tplc="FFFFFFFF" w:tentative="1">
+      <w:start w:val="1"/>
+      <w:numFmt w:val="lowerLetter"/>
+      <w:lvlText w:val="%5."/>
+      <w:lvlJc w:val="left"/>
+      <w:pPr>
+        <w:ind w:left="3600" w:hanging="360"/>
+      </w:pPr>
+    </w:lvl>
+    <w:lvl w:ilvl="5" w:tplc="FFFFFFFF" w:tentative="1">
+      <w:start w:val="1"/>
+      <w:numFmt w:val="lowerRoman"/>
+      <w:lvlText w:val="%6."/>
+      <w:lvlJc w:val="right"/>
+      <w:pPr>
+        <w:ind w:left="4320" w:hanging="180"/>
+      </w:pPr>
+    </w:lvl>
+    <w:lvl w:ilvl="6" w:tplc="FFFFFFFF" w:tentative="1">
+      <w:start w:val="1"/>
+      <w:numFmt w:val="decimal"/>
+      <w:lvlText w:val="%7."/>
+      <w:lvlJc w:val="left"/>
+      <w:pPr>
+        <w:ind w:left="5040" w:hanging="360"/>
+      </w:pPr>
+    </w:lvl>
+    <w:lvl w:ilvl="7" w:tplc="FFFFFFFF" w:tentative="1">
+      <w:start w:val="1"/>
+      <w:numFmt w:val="lowerLetter"/>
+      <w:lvlText w:val="%8."/>
+      <w:lvlJc w:val="left"/>
+      <w:pPr>
+        <w:ind w:left="5760" w:hanging="360"/>
+      </w:pPr>
+    </w:lvl>
+    <w:lvl w:ilvl="8" w:tplc="FFFFFFFF" w:tentative="1">
+      <w:start w:val="1"/>
+      <w:numFmt w:val="lowerRoman"/>
+      <w:lvlText w:val="%9."/>
+      <w:lvlJc w:val="right"/>
+      <w:pPr>
+        <w:ind w:left="6480" w:hanging="180"/>
+      </w:pPr>
+    </w:lvl>
+  </w:abstractNum>
+  <w:abstractNum w:abstractNumId="17" w15:restartNumberingAfterBreak="0">
     <w:nsid w:val="72592107"/>
     <w:multiLevelType w:val="hybridMultilevel"/>
     <w:tmpl w:val="11286B56"/>
@@ -20804,7 +20637,7 @@
       </w:rPr>
     </w:lvl>
   </w:abstractNum>
-  <w:abstractNum w:abstractNumId="17">
+  <w:abstractNum w:abstractNumId="18" w15:restartNumberingAfterBreak="0">
     <w:nsid w:val="748E3172"/>
     <w:multiLevelType w:val="multilevel"/>
     <w:tmpl w:val="45BCD31C"/>
@@ -20953,7 +20786,7 @@
       </w:rPr>
     </w:lvl>
   </w:abstractNum>
-  <w:abstractNum w:abstractNumId="18">
+  <w:abstractNum w:abstractNumId="19" w15:restartNumberingAfterBreak="0">
     <w:nsid w:val="7C1175E4"/>
     <w:multiLevelType w:val="multilevel"/>
     <w:tmpl w:val="B6CE8E78"/>
@@ -21066,7 +20899,7 @@
       </w:rPr>
     </w:lvl>
   </w:abstractNum>
-  <w:abstractNum w:abstractNumId="19">
+  <w:abstractNum w:abstractNumId="20" w15:restartNumberingAfterBreak="0">
     <w:nsid w:val="7DF02EF7"/>
     <w:multiLevelType w:val="hybridMultilevel"/>
     <w:tmpl w:val="5964D96A"/>
@@ -21155,7 +20988,7 @@
       </w:pPr>
     </w:lvl>
   </w:abstractNum>
-  <w:abstractNum w:abstractNumId="20">
+  <w:abstractNum w:abstractNumId="21" w15:restartNumberingAfterBreak="0">
     <w:nsid w:val="7F715C9C"/>
     <w:multiLevelType w:val="hybridMultilevel"/>
     <w:tmpl w:val="1AD0F918"/>
@@ -21241,74 +21074,77 @@
       </w:pPr>
     </w:lvl>
   </w:abstractNum>
-  <w:num w:numId="1">
-    <w:abstractNumId w:val="16"/>
+  <w:num w:numId="1" w16cid:durableId="1768192930">
+    <w:abstractNumId w:val="17"/>
   </w:num>
-  <w:num w:numId="2">
+  <w:num w:numId="2" w16cid:durableId="1168710877">
     <w:abstractNumId w:val="15"/>
   </w:num>
-  <w:num w:numId="3">
+  <w:num w:numId="3" w16cid:durableId="1354650845">
+    <w:abstractNumId w:val="20"/>
+  </w:num>
+  <w:num w:numId="4" w16cid:durableId="511845422">
+    <w:abstractNumId w:val="7"/>
+  </w:num>
+  <w:num w:numId="5" w16cid:durableId="419760224">
+    <w:abstractNumId w:val="11"/>
+  </w:num>
+  <w:num w:numId="6" w16cid:durableId="1645506939">
     <w:abstractNumId w:val="19"/>
   </w:num>
-  <w:num w:numId="4">
-    <w:abstractNumId w:val="7"/>
+  <w:num w:numId="7" w16cid:durableId="509099617">
+    <w:abstractNumId w:val="1"/>
   </w:num>
-  <w:num w:numId="5">
-    <w:abstractNumId w:val="11"/>
+  <w:num w:numId="8" w16cid:durableId="1757284909">
+    <w:abstractNumId w:val="4"/>
   </w:num>
-  <w:num w:numId="6">
+  <w:num w:numId="9" w16cid:durableId="416485029">
+    <w:abstractNumId w:val="13"/>
+  </w:num>
+  <w:num w:numId="10" w16cid:durableId="1187019037">
+    <w:abstractNumId w:val="10"/>
+  </w:num>
+  <w:num w:numId="11" w16cid:durableId="713621825">
     <w:abstractNumId w:val="18"/>
   </w:num>
-  <w:num w:numId="7">
-    <w:abstractNumId w:val="1"/>
-  </w:num>
-  <w:num w:numId="8">
-    <w:abstractNumId w:val="4"/>
-  </w:num>
-  <w:num w:numId="9">
-    <w:abstractNumId w:val="13"/>
-  </w:num>
-  <w:num w:numId="10">
-    <w:abstractNumId w:val="10"/>
-  </w:num>
-  <w:num w:numId="11">
-    <w:abstractNumId w:val="17"/>
-  </w:num>
-  <w:num w:numId="12">
+  <w:num w:numId="12" w16cid:durableId="1265650646">
     <w:abstractNumId w:val="9"/>
   </w:num>
-  <w:num w:numId="13">
+  <w:num w:numId="13" w16cid:durableId="365183430">
     <w:abstractNumId w:val="5"/>
   </w:num>
-  <w:num w:numId="14">
+  <w:num w:numId="14" w16cid:durableId="677804101">
     <w:abstractNumId w:val="8"/>
   </w:num>
-  <w:num w:numId="15">
-    <w:abstractNumId w:val="20"/>
+  <w:num w:numId="15" w16cid:durableId="545070895">
+    <w:abstractNumId w:val="21"/>
   </w:num>
-  <w:num w:numId="16">
+  <w:num w:numId="16" w16cid:durableId="725682806">
     <w:abstractNumId w:val="6"/>
   </w:num>
-  <w:num w:numId="17">
+  <w:num w:numId="17" w16cid:durableId="1747874321">
     <w:abstractNumId w:val="14"/>
   </w:num>
-  <w:num w:numId="18">
+  <w:num w:numId="18" w16cid:durableId="1891914514">
     <w:abstractNumId w:val="12"/>
   </w:num>
-  <w:num w:numId="19">
+  <w:num w:numId="19" w16cid:durableId="5593514">
     <w:abstractNumId w:val="3"/>
   </w:num>
-  <w:num w:numId="20">
+  <w:num w:numId="20" w16cid:durableId="1611162868">
     <w:abstractNumId w:val="0"/>
   </w:num>
-  <w:num w:numId="21">
+  <w:num w:numId="21" w16cid:durableId="615873042">
     <w:abstractNumId w:val="2"/>
+  </w:num>
+  <w:num w:numId="22" w16cid:durableId="647441564">
+    <w:abstractNumId w:val="16"/>
   </w:num>
 </w:numbering>
 </file>
 
 <file path=word/styles.xml><?xml version="1.0" encoding="utf-8"?>
-<w:styles xmlns:mc="http://schemas.openxmlformats.org/markup-compatibility/2006" xmlns:r="http://schemas.openxmlformats.org/officeDocument/2006/relationships" xmlns:w="http://schemas.openxmlformats.org/wordprocessingml/2006/main" xmlns:w14="http://schemas.microsoft.com/office/word/2010/wordml" mc:Ignorable="w14">
+<w:styles xmlns:mc="http://schemas.openxmlformats.org/markup-compatibility/2006" xmlns:r="http://schemas.openxmlformats.org/officeDocument/2006/relationships" xmlns:w="http://schemas.openxmlformats.org/wordprocessingml/2006/main" xmlns:w14="http://schemas.microsoft.com/office/word/2010/wordml" xmlns:w15="http://schemas.microsoft.com/office/word/2012/wordml" xmlns:w16cex="http://schemas.microsoft.com/office/word/2018/wordml/cex" xmlns:w16cid="http://schemas.microsoft.com/office/word/2016/wordml/cid" xmlns:w16="http://schemas.microsoft.com/office/word/2018/wordml" xmlns:w16du="http://schemas.microsoft.com/office/word/2023/wordml/word16du" xmlns:w16sdtdh="http://schemas.microsoft.com/office/word/2020/wordml/sdtdatahash" xmlns:w16se="http://schemas.microsoft.com/office/word/2015/wordml/symex" mc:Ignorable="w14 w15 w16se w16cid w16 w16cex w16sdtdh w16du">
   <w:docDefaults>
     <w:rPrDefault>
       <w:rPr>
@@ -21324,150 +21160,388 @@
       </w:pPr>
     </w:pPrDefault>
   </w:docDefaults>
-  <w:latentStyles w:defLockedState="0" w:defUIPriority="99" w:defSemiHidden="1" w:defUnhideWhenUsed="1" w:defQFormat="0" w:count="267">
-    <w:lsdException w:name="Normal" w:semiHidden="0" w:uiPriority="0" w:unhideWhenUsed="0" w:qFormat="1"/>
-    <w:lsdException w:name="heading 1" w:semiHidden="0" w:uiPriority="9" w:unhideWhenUsed="0" w:qFormat="1"/>
-    <w:lsdException w:name="heading 2" w:uiPriority="9" w:qFormat="1"/>
-    <w:lsdException w:name="heading 3" w:uiPriority="9" w:qFormat="1"/>
-    <w:lsdException w:name="heading 4" w:uiPriority="9" w:qFormat="1"/>
-    <w:lsdException w:name="heading 5" w:uiPriority="9" w:qFormat="1"/>
-    <w:lsdException w:name="heading 6" w:uiPriority="9" w:qFormat="1"/>
-    <w:lsdException w:name="heading 7" w:uiPriority="9" w:qFormat="1"/>
-    <w:lsdException w:name="heading 8" w:uiPriority="9" w:qFormat="1"/>
-    <w:lsdException w:name="heading 9" w:uiPriority="9" w:qFormat="1"/>
-    <w:lsdException w:name="toc 1" w:uiPriority="39"/>
-    <w:lsdException w:name="toc 2" w:uiPriority="39"/>
-    <w:lsdException w:name="toc 3" w:uiPriority="39"/>
-    <w:lsdException w:name="toc 4" w:uiPriority="39"/>
-    <w:lsdException w:name="toc 5" w:uiPriority="39"/>
-    <w:lsdException w:name="toc 6" w:uiPriority="39"/>
-    <w:lsdException w:name="toc 7" w:uiPriority="39"/>
-    <w:lsdException w:name="toc 8" w:uiPriority="39"/>
-    <w:lsdException w:name="toc 9" w:uiPriority="39"/>
-    <w:lsdException w:name="caption" w:uiPriority="35" w:qFormat="1"/>
-    <w:lsdException w:name="Title" w:semiHidden="0" w:uiPriority="10" w:unhideWhenUsed="0" w:qFormat="1"/>
-    <w:lsdException w:name="Default Paragraph Font" w:uiPriority="1"/>
-    <w:lsdException w:name="Body Text" w:uiPriority="1" w:qFormat="1"/>
-    <w:lsdException w:name="Subtitle" w:semiHidden="0" w:uiPriority="11" w:unhideWhenUsed="0" w:qFormat="1"/>
-    <w:lsdException w:name="Strong" w:semiHidden="0" w:uiPriority="22" w:unhideWhenUsed="0" w:qFormat="1"/>
-    <w:lsdException w:name="Emphasis" w:semiHidden="0" w:uiPriority="20" w:unhideWhenUsed="0" w:qFormat="1"/>
-    <w:lsdException w:name="Table Grid" w:semiHidden="0" w:uiPriority="59" w:unhideWhenUsed="0"/>
-    <w:lsdException w:name="Placeholder Text" w:unhideWhenUsed="0"/>
-    <w:lsdException w:name="No Spacing" w:semiHidden="0" w:uiPriority="1" w:unhideWhenUsed="0" w:qFormat="1"/>
-    <w:lsdException w:name="Light Shading" w:semiHidden="0" w:uiPriority="60" w:unhideWhenUsed="0"/>
-    <w:lsdException w:name="Light List" w:semiHidden="0" w:uiPriority="61" w:unhideWhenUsed="0"/>
-    <w:lsdException w:name="Light Grid" w:semiHidden="0" w:uiPriority="62" w:unhideWhenUsed="0"/>
-    <w:lsdException w:name="Medium Shading 1" w:semiHidden="0" w:uiPriority="63" w:unhideWhenUsed="0"/>
-    <w:lsdException w:name="Medium Shading 2" w:semiHidden="0" w:uiPriority="64" w:unhideWhenUsed="0"/>
-    <w:lsdException w:name="Medium List 1" w:semiHidden="0" w:uiPriority="65" w:unhideWhenUsed="0"/>
-    <w:lsdException w:name="Medium List 2" w:semiHidden="0" w:uiPriority="66" w:unhideWhenUsed="0"/>
-    <w:lsdException w:name="Medium Grid 1" w:semiHidden="0" w:uiPriority="67" w:unhideWhenUsed="0"/>
-    <w:lsdException w:name="Medium Grid 2" w:semiHidden="0" w:uiPriority="68" w:unhideWhenUsed="0"/>
-    <w:lsdException w:name="Medium Grid 3" w:semiHidden="0" w:uiPriority="69" w:unhideWhenUsed="0"/>
-    <w:lsdException w:name="Dark List" w:semiHidden="0" w:uiPriority="70" w:unhideWhenUsed="0"/>
-    <w:lsdException w:name="Colorful Shading" w:semiHidden="0" w:uiPriority="71" w:unhideWhenUsed="0"/>
-    <w:lsdException w:name="Colorful List" w:semiHidden="0" w:uiPriority="72" w:unhideWhenUsed="0"/>
-    <w:lsdException w:name="Colorful Grid" w:semiHidden="0" w:uiPriority="73" w:unhideWhenUsed="0"/>
-    <w:lsdException w:name="Light Shading Accent 1" w:semiHidden="0" w:uiPriority="60" w:unhideWhenUsed="0"/>
-    <w:lsdException w:name="Light List Accent 1" w:semiHidden="0" w:uiPriority="61" w:unhideWhenUsed="0"/>
-    <w:lsdException w:name="Light Grid Accent 1" w:semiHidden="0" w:uiPriority="62" w:unhideWhenUsed="0"/>
-    <w:lsdException w:name="Medium Shading 1 Accent 1" w:semiHidden="0" w:uiPriority="63" w:unhideWhenUsed="0"/>
-    <w:lsdException w:name="Medium Shading 2 Accent 1" w:semiHidden="0" w:uiPriority="64" w:unhideWhenUsed="0"/>
-    <w:lsdException w:name="Medium List 1 Accent 1" w:semiHidden="0" w:uiPriority="65" w:unhideWhenUsed="0"/>
-    <w:lsdException w:name="Revision" w:unhideWhenUsed="0"/>
-    <w:lsdException w:name="List Paragraph" w:semiHidden="0" w:uiPriority="34" w:unhideWhenUsed="0" w:qFormat="1"/>
-    <w:lsdException w:name="Quote" w:semiHidden="0" w:uiPriority="29" w:unhideWhenUsed="0" w:qFormat="1"/>
-    <w:lsdException w:name="Intense Quote" w:semiHidden="0" w:uiPriority="30" w:unhideWhenUsed="0" w:qFormat="1"/>
-    <w:lsdException w:name="Medium List 2 Accent 1" w:semiHidden="0" w:uiPriority="66" w:unhideWhenUsed="0"/>
-    <w:lsdException w:name="Medium Grid 1 Accent 1" w:semiHidden="0" w:uiPriority="67" w:unhideWhenUsed="0"/>
-    <w:lsdException w:name="Medium Grid 2 Accent 1" w:semiHidden="0" w:uiPriority="68" w:unhideWhenUsed="0"/>
-    <w:lsdException w:name="Medium Grid 3 Accent 1" w:semiHidden="0" w:uiPriority="69" w:unhideWhenUsed="0"/>
-    <w:lsdException w:name="Dark List Accent 1" w:semiHidden="0" w:uiPriority="70" w:unhideWhenUsed="0"/>
-    <w:lsdException w:name="Colorful Shading Accent 1" w:semiHidden="0" w:uiPriority="71" w:unhideWhenUsed="0"/>
-    <w:lsdException w:name="Colorful List Accent 1" w:semiHidden="0" w:uiPriority="72" w:unhideWhenUsed="0"/>
-    <w:lsdException w:name="Colorful Grid Accent 1" w:semiHidden="0" w:uiPriority="73" w:unhideWhenUsed="0"/>
-    <w:lsdException w:name="Light Shading Accent 2" w:semiHidden="0" w:uiPriority="60" w:unhideWhenUsed="0"/>
-    <w:lsdException w:name="Light List Accent 2" w:semiHidden="0" w:uiPriority="61" w:unhideWhenUsed="0"/>
-    <w:lsdException w:name="Light Grid Accent 2" w:semiHidden="0" w:uiPriority="62" w:unhideWhenUsed="0"/>
-    <w:lsdException w:name="Medium Shading 1 Accent 2" w:semiHidden="0" w:uiPriority="63" w:unhideWhenUsed="0"/>
-    <w:lsdException w:name="Medium Shading 2 Accent 2" w:semiHidden="0" w:uiPriority="64" w:unhideWhenUsed="0"/>
-    <w:lsdException w:name="Medium List 1 Accent 2" w:semiHidden="0" w:uiPriority="65" w:unhideWhenUsed="0"/>
-    <w:lsdException w:name="Medium List 2 Accent 2" w:semiHidden="0" w:uiPriority="66" w:unhideWhenUsed="0"/>
-    <w:lsdException w:name="Medium Grid 1 Accent 2" w:semiHidden="0" w:uiPriority="67" w:unhideWhenUsed="0"/>
-    <w:lsdException w:name="Medium Grid 2 Accent 2" w:semiHidden="0" w:uiPriority="68" w:unhideWhenUsed="0"/>
-    <w:lsdException w:name="Medium Grid 3 Accent 2" w:semiHidden="0" w:uiPriority="69" w:unhideWhenUsed="0"/>
-    <w:lsdException w:name="Dark List Accent 2" w:semiHidden="0" w:uiPriority="70" w:unhideWhenUsed="0"/>
-    <w:lsdException w:name="Colorful Shading Accent 2" w:semiHidden="0" w:uiPriority="71" w:unhideWhenUsed="0"/>
-    <w:lsdException w:name="Colorful List Accent 2" w:semiHidden="0" w:uiPriority="72" w:unhideWhenUsed="0"/>
-    <w:lsdException w:name="Colorful Grid Accent 2" w:semiHidden="0" w:uiPriority="73" w:unhideWhenUsed="0"/>
-    <w:lsdException w:name="Light Shading Accent 3" w:semiHidden="0" w:uiPriority="60" w:unhideWhenUsed="0"/>
-    <w:lsdException w:name="Light List Accent 3" w:semiHidden="0" w:uiPriority="61" w:unhideWhenUsed="0"/>
-    <w:lsdException w:name="Light Grid Accent 3" w:semiHidden="0" w:uiPriority="62" w:unhideWhenUsed="0"/>
-    <w:lsdException w:name="Medium Shading 1 Accent 3" w:semiHidden="0" w:uiPriority="63" w:unhideWhenUsed="0"/>
-    <w:lsdException w:name="Medium Shading 2 Accent 3" w:semiHidden="0" w:uiPriority="64" w:unhideWhenUsed="0"/>
-    <w:lsdException w:name="Medium List 1 Accent 3" w:semiHidden="0" w:uiPriority="65" w:unhideWhenUsed="0"/>
-    <w:lsdException w:name="Medium List 2 Accent 3" w:semiHidden="0" w:uiPriority="66" w:unhideWhenUsed="0"/>
-    <w:lsdException w:name="Medium Grid 1 Accent 3" w:semiHidden="0" w:uiPriority="67" w:unhideWhenUsed="0"/>
-    <w:lsdException w:name="Medium Grid 2 Accent 3" w:semiHidden="0" w:uiPriority="68" w:unhideWhenUsed="0"/>
-    <w:lsdException w:name="Medium Grid 3 Accent 3" w:semiHidden="0" w:uiPriority="69" w:unhideWhenUsed="0"/>
-    <w:lsdException w:name="Dark List Accent 3" w:semiHidden="0" w:uiPriority="70" w:unhideWhenUsed="0"/>
-    <w:lsdException w:name="Colorful Shading Accent 3" w:semiHidden="0" w:uiPriority="71" w:unhideWhenUsed="0"/>
-    <w:lsdException w:name="Colorful List Accent 3" w:semiHidden="0" w:uiPriority="72" w:unhideWhenUsed="0"/>
-    <w:lsdException w:name="Colorful Grid Accent 3" w:semiHidden="0" w:uiPriority="73" w:unhideWhenUsed="0"/>
-    <w:lsdException w:name="Light Shading Accent 4" w:semiHidden="0" w:uiPriority="60" w:unhideWhenUsed="0"/>
-    <w:lsdException w:name="Light List Accent 4" w:semiHidden="0" w:uiPriority="61" w:unhideWhenUsed="0"/>
-    <w:lsdException w:name="Light Grid Accent 4" w:semiHidden="0" w:uiPriority="62" w:unhideWhenUsed="0"/>
-    <w:lsdException w:name="Medium Shading 1 Accent 4" w:semiHidden="0" w:uiPriority="63" w:unhideWhenUsed="0"/>
-    <w:lsdException w:name="Medium Shading 2 Accent 4" w:semiHidden="0" w:uiPriority="64" w:unhideWhenUsed="0"/>
-    <w:lsdException w:name="Medium List 1 Accent 4" w:semiHidden="0" w:uiPriority="65" w:unhideWhenUsed="0"/>
-    <w:lsdException w:name="Medium List 2 Accent 4" w:semiHidden="0" w:uiPriority="66" w:unhideWhenUsed="0"/>
-    <w:lsdException w:name="Medium Grid 1 Accent 4" w:semiHidden="0" w:uiPriority="67" w:unhideWhenUsed="0"/>
-    <w:lsdException w:name="Medium Grid 2 Accent 4" w:semiHidden="0" w:uiPriority="68" w:unhideWhenUsed="0"/>
-    <w:lsdException w:name="Medium Grid 3 Accent 4" w:semiHidden="0" w:uiPriority="69" w:unhideWhenUsed="0"/>
-    <w:lsdException w:name="Dark List Accent 4" w:semiHidden="0" w:uiPriority="70" w:unhideWhenUsed="0"/>
-    <w:lsdException w:name="Colorful Shading Accent 4" w:semiHidden="0" w:uiPriority="71" w:unhideWhenUsed="0"/>
-    <w:lsdException w:name="Colorful List Accent 4" w:semiHidden="0" w:uiPriority="72" w:unhideWhenUsed="0"/>
-    <w:lsdException w:name="Colorful Grid Accent 4" w:semiHidden="0" w:uiPriority="73" w:unhideWhenUsed="0"/>
-    <w:lsdException w:name="Light Shading Accent 5" w:semiHidden="0" w:uiPriority="60" w:unhideWhenUsed="0"/>
-    <w:lsdException w:name="Light List Accent 5" w:semiHidden="0" w:uiPriority="61" w:unhideWhenUsed="0"/>
-    <w:lsdException w:name="Light Grid Accent 5" w:semiHidden="0" w:uiPriority="62" w:unhideWhenUsed="0"/>
-    <w:lsdException w:name="Medium Shading 1 Accent 5" w:semiHidden="0" w:uiPriority="63" w:unhideWhenUsed="0"/>
-    <w:lsdException w:name="Medium Shading 2 Accent 5" w:semiHidden="0" w:uiPriority="64" w:unhideWhenUsed="0"/>
-    <w:lsdException w:name="Medium List 1 Accent 5" w:semiHidden="0" w:uiPriority="65" w:unhideWhenUsed="0"/>
-    <w:lsdException w:name="Medium List 2 Accent 5" w:semiHidden="0" w:uiPriority="66" w:unhideWhenUsed="0"/>
-    <w:lsdException w:name="Medium Grid 1 Accent 5" w:semiHidden="0" w:uiPriority="67" w:unhideWhenUsed="0"/>
-    <w:lsdException w:name="Medium Grid 2 Accent 5" w:semiHidden="0" w:uiPriority="68" w:unhideWhenUsed="0"/>
-    <w:lsdException w:name="Medium Grid 3 Accent 5" w:semiHidden="0" w:uiPriority="69" w:unhideWhenUsed="0"/>
-    <w:lsdException w:name="Dark List Accent 5" w:semiHidden="0" w:uiPriority="70" w:unhideWhenUsed="0"/>
-    <w:lsdException w:name="Colorful Shading Accent 5" w:semiHidden="0" w:uiPriority="71" w:unhideWhenUsed="0"/>
-    <w:lsdException w:name="Colorful List Accent 5" w:semiHidden="0" w:uiPriority="72" w:unhideWhenUsed="0"/>
-    <w:lsdException w:name="Colorful Grid Accent 5" w:semiHidden="0" w:uiPriority="73" w:unhideWhenUsed="0"/>
-    <w:lsdException w:name="Light Shading Accent 6" w:semiHidden="0" w:uiPriority="60" w:unhideWhenUsed="0"/>
-    <w:lsdException w:name="Light List Accent 6" w:semiHidden="0" w:uiPriority="61" w:unhideWhenUsed="0"/>
-    <w:lsdException w:name="Light Grid Accent 6" w:semiHidden="0" w:uiPriority="62" w:unhideWhenUsed="0"/>
-    <w:lsdException w:name="Medium Shading 1 Accent 6" w:semiHidden="0" w:uiPriority="63" w:unhideWhenUsed="0"/>
-    <w:lsdException w:name="Medium Shading 2 Accent 6" w:semiHidden="0" w:uiPriority="64" w:unhideWhenUsed="0"/>
-    <w:lsdException w:name="Medium List 1 Accent 6" w:semiHidden="0" w:uiPriority="65" w:unhideWhenUsed="0"/>
-    <w:lsdException w:name="Medium List 2 Accent 6" w:semiHidden="0" w:uiPriority="66" w:unhideWhenUsed="0"/>
-    <w:lsdException w:name="Medium Grid 1 Accent 6" w:semiHidden="0" w:uiPriority="67" w:unhideWhenUsed="0"/>
-    <w:lsdException w:name="Medium Grid 2 Accent 6" w:semiHidden="0" w:uiPriority="68" w:unhideWhenUsed="0"/>
-    <w:lsdException w:name="Medium Grid 3 Accent 6" w:semiHidden="0" w:uiPriority="69" w:unhideWhenUsed="0"/>
-    <w:lsdException w:name="Dark List Accent 6" w:semiHidden="0" w:uiPriority="70" w:unhideWhenUsed="0"/>
-    <w:lsdException w:name="Colorful Shading Accent 6" w:semiHidden="0" w:uiPriority="71" w:unhideWhenUsed="0"/>
-    <w:lsdException w:name="Colorful List Accent 6" w:semiHidden="0" w:uiPriority="72" w:unhideWhenUsed="0"/>
-    <w:lsdException w:name="Colorful Grid Accent 6" w:semiHidden="0" w:uiPriority="73" w:unhideWhenUsed="0"/>
-    <w:lsdException w:name="Subtle Emphasis" w:semiHidden="0" w:uiPriority="19" w:unhideWhenUsed="0" w:qFormat="1"/>
-    <w:lsdException w:name="Intense Emphasis" w:semiHidden="0" w:uiPriority="21" w:unhideWhenUsed="0" w:qFormat="1"/>
-    <w:lsdException w:name="Subtle Reference" w:semiHidden="0" w:uiPriority="31" w:unhideWhenUsed="0" w:qFormat="1"/>
-    <w:lsdException w:name="Intense Reference" w:semiHidden="0" w:uiPriority="32" w:unhideWhenUsed="0" w:qFormat="1"/>
-    <w:lsdException w:name="Book Title" w:semiHidden="0" w:uiPriority="33" w:unhideWhenUsed="0" w:qFormat="1"/>
-    <w:lsdException w:name="Bibliography" w:uiPriority="37"/>
-    <w:lsdException w:name="TOC Heading" w:uiPriority="39" w:qFormat="1"/>
+  <w:latentStyles w:defLockedState="0" w:defUIPriority="99" w:defSemiHidden="0" w:defUnhideWhenUsed="0" w:defQFormat="0" w:count="376">
+    <w:lsdException w:name="Normal" w:uiPriority="0" w:qFormat="1"/>
+    <w:lsdException w:name="heading 1" w:uiPriority="9" w:qFormat="1"/>
+    <w:lsdException w:name="heading 2" w:semiHidden="1" w:uiPriority="9" w:unhideWhenUsed="1" w:qFormat="1"/>
+    <w:lsdException w:name="heading 3" w:semiHidden="1" w:uiPriority="9" w:unhideWhenUsed="1" w:qFormat="1"/>
+    <w:lsdException w:name="heading 4" w:semiHidden="1" w:uiPriority="9" w:unhideWhenUsed="1" w:qFormat="1"/>
+    <w:lsdException w:name="heading 5" w:semiHidden="1" w:uiPriority="9" w:unhideWhenUsed="1" w:qFormat="1"/>
+    <w:lsdException w:name="heading 6" w:semiHidden="1" w:uiPriority="9" w:unhideWhenUsed="1" w:qFormat="1"/>
+    <w:lsdException w:name="heading 7" w:semiHidden="1" w:uiPriority="9" w:unhideWhenUsed="1" w:qFormat="1"/>
+    <w:lsdException w:name="heading 8" w:semiHidden="1" w:uiPriority="9" w:unhideWhenUsed="1" w:qFormat="1"/>
+    <w:lsdException w:name="heading 9" w:semiHidden="1" w:uiPriority="9" w:unhideWhenUsed="1" w:qFormat="1"/>
+    <w:lsdException w:name="index 1" w:semiHidden="1" w:unhideWhenUsed="1"/>
+    <w:lsdException w:name="index 2" w:semiHidden="1" w:unhideWhenUsed="1"/>
+    <w:lsdException w:name="index 3" w:semiHidden="1" w:unhideWhenUsed="1"/>
+    <w:lsdException w:name="index 4" w:semiHidden="1" w:unhideWhenUsed="1"/>
+    <w:lsdException w:name="index 5" w:semiHidden="1" w:unhideWhenUsed="1"/>
+    <w:lsdException w:name="index 6" w:semiHidden="1" w:unhideWhenUsed="1"/>
+    <w:lsdException w:name="index 7" w:semiHidden="1" w:unhideWhenUsed="1"/>
+    <w:lsdException w:name="index 8" w:semiHidden="1" w:unhideWhenUsed="1"/>
+    <w:lsdException w:name="index 9" w:semiHidden="1" w:unhideWhenUsed="1"/>
+    <w:lsdException w:name="toc 1" w:semiHidden="1" w:uiPriority="39" w:unhideWhenUsed="1"/>
+    <w:lsdException w:name="toc 2" w:semiHidden="1" w:uiPriority="39" w:unhideWhenUsed="1"/>
+    <w:lsdException w:name="toc 3" w:semiHidden="1" w:uiPriority="39" w:unhideWhenUsed="1"/>
+    <w:lsdException w:name="toc 4" w:semiHidden="1" w:uiPriority="39" w:unhideWhenUsed="1"/>
+    <w:lsdException w:name="toc 5" w:semiHidden="1" w:uiPriority="39" w:unhideWhenUsed="1"/>
+    <w:lsdException w:name="toc 6" w:semiHidden="1" w:uiPriority="39" w:unhideWhenUsed="1"/>
+    <w:lsdException w:name="toc 7" w:semiHidden="1" w:uiPriority="39" w:unhideWhenUsed="1"/>
+    <w:lsdException w:name="toc 8" w:semiHidden="1" w:uiPriority="39" w:unhideWhenUsed="1"/>
+    <w:lsdException w:name="toc 9" w:semiHidden="1" w:uiPriority="39" w:unhideWhenUsed="1"/>
+    <w:lsdException w:name="Normal Indent" w:semiHidden="1" w:unhideWhenUsed="1"/>
+    <w:lsdException w:name="footnote text" w:semiHidden="1" w:unhideWhenUsed="1"/>
+    <w:lsdException w:name="annotation text" w:semiHidden="1" w:unhideWhenUsed="1"/>
+    <w:lsdException w:name="header" w:semiHidden="1" w:unhideWhenUsed="1"/>
+    <w:lsdException w:name="footer" w:semiHidden="1" w:unhideWhenUsed="1"/>
+    <w:lsdException w:name="index heading" w:semiHidden="1" w:unhideWhenUsed="1"/>
+    <w:lsdException w:name="caption" w:semiHidden="1" w:uiPriority="35" w:unhideWhenUsed="1" w:qFormat="1"/>
+    <w:lsdException w:name="table of figures" w:semiHidden="1" w:unhideWhenUsed="1"/>
+    <w:lsdException w:name="envelope address" w:semiHidden="1" w:unhideWhenUsed="1"/>
+    <w:lsdException w:name="envelope return" w:semiHidden="1" w:unhideWhenUsed="1"/>
+    <w:lsdException w:name="footnote reference" w:semiHidden="1" w:unhideWhenUsed="1"/>
+    <w:lsdException w:name="annotation reference" w:semiHidden="1" w:unhideWhenUsed="1"/>
+    <w:lsdException w:name="line number" w:semiHidden="1" w:unhideWhenUsed="1"/>
+    <w:lsdException w:name="page number" w:semiHidden="1" w:unhideWhenUsed="1"/>
+    <w:lsdException w:name="endnote reference" w:semiHidden="1" w:unhideWhenUsed="1"/>
+    <w:lsdException w:name="endnote text" w:semiHidden="1" w:unhideWhenUsed="1"/>
+    <w:lsdException w:name="table of authorities" w:semiHidden="1" w:unhideWhenUsed="1"/>
+    <w:lsdException w:name="macro" w:semiHidden="1" w:unhideWhenUsed="1"/>
+    <w:lsdException w:name="toa heading" w:semiHidden="1" w:unhideWhenUsed="1"/>
+    <w:lsdException w:name="List" w:semiHidden="1" w:unhideWhenUsed="1"/>
+    <w:lsdException w:name="List Bullet" w:semiHidden="1" w:unhideWhenUsed="1"/>
+    <w:lsdException w:name="List Number" w:semiHidden="1" w:unhideWhenUsed="1"/>
+    <w:lsdException w:name="List 2" w:semiHidden="1" w:unhideWhenUsed="1"/>
+    <w:lsdException w:name="List 3" w:semiHidden="1" w:unhideWhenUsed="1"/>
+    <w:lsdException w:name="List 4" w:semiHidden="1" w:unhideWhenUsed="1"/>
+    <w:lsdException w:name="List 5" w:semiHidden="1" w:unhideWhenUsed="1"/>
+    <w:lsdException w:name="List Bullet 2" w:semiHidden="1" w:unhideWhenUsed="1"/>
+    <w:lsdException w:name="List Bullet 3" w:semiHidden="1" w:unhideWhenUsed="1"/>
+    <w:lsdException w:name="List Bullet 4" w:semiHidden="1" w:unhideWhenUsed="1"/>
+    <w:lsdException w:name="List Bullet 5" w:semiHidden="1" w:unhideWhenUsed="1"/>
+    <w:lsdException w:name="List Number 2" w:semiHidden="1" w:unhideWhenUsed="1"/>
+    <w:lsdException w:name="List Number 3" w:semiHidden="1" w:unhideWhenUsed="1"/>
+    <w:lsdException w:name="List Number 4" w:semiHidden="1" w:unhideWhenUsed="1"/>
+    <w:lsdException w:name="List Number 5" w:semiHidden="1" w:unhideWhenUsed="1"/>
+    <w:lsdException w:name="Title" w:uiPriority="10" w:qFormat="1"/>
+    <w:lsdException w:name="Closing" w:semiHidden="1" w:unhideWhenUsed="1"/>
+    <w:lsdException w:name="Signature" w:semiHidden="1" w:unhideWhenUsed="1"/>
+    <w:lsdException w:name="Default Paragraph Font" w:semiHidden="1" w:uiPriority="1" w:unhideWhenUsed="1"/>
+    <w:lsdException w:name="Body Text" w:semiHidden="1" w:uiPriority="1" w:unhideWhenUsed="1" w:qFormat="1"/>
+    <w:lsdException w:name="Body Text Indent" w:semiHidden="1" w:unhideWhenUsed="1"/>
+    <w:lsdException w:name="List Continue" w:semiHidden="1" w:unhideWhenUsed="1"/>
+    <w:lsdException w:name="List Continue 2" w:semiHidden="1" w:unhideWhenUsed="1"/>
+    <w:lsdException w:name="List Continue 3" w:semiHidden="1" w:unhideWhenUsed="1"/>
+    <w:lsdException w:name="List Continue 4" w:semiHidden="1" w:unhideWhenUsed="1"/>
+    <w:lsdException w:name="List Continue 5" w:semiHidden="1" w:unhideWhenUsed="1"/>
+    <w:lsdException w:name="Message Header" w:semiHidden="1" w:unhideWhenUsed="1"/>
+    <w:lsdException w:name="Subtitle" w:uiPriority="11" w:qFormat="1"/>
+    <w:lsdException w:name="Salutation" w:semiHidden="1" w:unhideWhenUsed="1"/>
+    <w:lsdException w:name="Date" w:semiHidden="1" w:unhideWhenUsed="1"/>
+    <w:lsdException w:name="Body Text First Indent" w:semiHidden="1" w:unhideWhenUsed="1"/>
+    <w:lsdException w:name="Body Text First Indent 2" w:semiHidden="1" w:unhideWhenUsed="1"/>
+    <w:lsdException w:name="Note Heading" w:semiHidden="1" w:unhideWhenUsed="1"/>
+    <w:lsdException w:name="Body Text 2" w:semiHidden="1" w:unhideWhenUsed="1"/>
+    <w:lsdException w:name="Body Text 3" w:semiHidden="1" w:unhideWhenUsed="1"/>
+    <w:lsdException w:name="Body Text Indent 2" w:semiHidden="1" w:unhideWhenUsed="1"/>
+    <w:lsdException w:name="Body Text Indent 3" w:semiHidden="1" w:unhideWhenUsed="1"/>
+    <w:lsdException w:name="Block Text" w:semiHidden="1" w:unhideWhenUsed="1"/>
+    <w:lsdException w:name="Hyperlink" w:semiHidden="1" w:unhideWhenUsed="1"/>
+    <w:lsdException w:name="FollowedHyperlink" w:semiHidden="1" w:unhideWhenUsed="1"/>
+    <w:lsdException w:name="Strong" w:uiPriority="22" w:qFormat="1"/>
+    <w:lsdException w:name="Emphasis" w:uiPriority="20" w:qFormat="1"/>
+    <w:lsdException w:name="Document Map" w:semiHidden="1" w:unhideWhenUsed="1"/>
+    <w:lsdException w:name="Plain Text" w:semiHidden="1" w:unhideWhenUsed="1"/>
+    <w:lsdException w:name="E-mail Signature" w:semiHidden="1" w:unhideWhenUsed="1"/>
+    <w:lsdException w:name="HTML Top of Form" w:semiHidden="1" w:unhideWhenUsed="1"/>
+    <w:lsdException w:name="HTML Bottom of Form" w:semiHidden="1" w:unhideWhenUsed="1"/>
+    <w:lsdException w:name="Normal (Web)" w:semiHidden="1" w:unhideWhenUsed="1"/>
+    <w:lsdException w:name="HTML Acronym" w:semiHidden="1" w:unhideWhenUsed="1"/>
+    <w:lsdException w:name="HTML Address" w:semiHidden="1" w:unhideWhenUsed="1"/>
+    <w:lsdException w:name="HTML Cite" w:semiHidden="1" w:unhideWhenUsed="1"/>
+    <w:lsdException w:name="HTML Code" w:semiHidden="1" w:unhideWhenUsed="1"/>
+    <w:lsdException w:name="HTML Definition" w:semiHidden="1" w:unhideWhenUsed="1"/>
+    <w:lsdException w:name="HTML Keyboard" w:semiHidden="1" w:unhideWhenUsed="1"/>
+    <w:lsdException w:name="HTML Preformatted" w:semiHidden="1" w:unhideWhenUsed="1"/>
+    <w:lsdException w:name="HTML Sample" w:semiHidden="1" w:unhideWhenUsed="1"/>
+    <w:lsdException w:name="HTML Typewriter" w:semiHidden="1" w:unhideWhenUsed="1"/>
+    <w:lsdException w:name="HTML Variable" w:semiHidden="1" w:unhideWhenUsed="1"/>
+    <w:lsdException w:name="Normal Table" w:semiHidden="1" w:unhideWhenUsed="1"/>
+    <w:lsdException w:name="annotation subject" w:semiHidden="1" w:unhideWhenUsed="1"/>
+    <w:lsdException w:name="No List" w:semiHidden="1" w:unhideWhenUsed="1"/>
+    <w:lsdException w:name="Outline List 1" w:semiHidden="1" w:unhideWhenUsed="1"/>
+    <w:lsdException w:name="Outline List 2" w:semiHidden="1" w:unhideWhenUsed="1"/>
+    <w:lsdException w:name="Outline List 3" w:semiHidden="1" w:unhideWhenUsed="1"/>
+    <w:lsdException w:name="Table Simple 1" w:semiHidden="1" w:unhideWhenUsed="1"/>
+    <w:lsdException w:name="Table Simple 2" w:semiHidden="1" w:unhideWhenUsed="1"/>
+    <w:lsdException w:name="Table Simple 3" w:semiHidden="1" w:unhideWhenUsed="1"/>
+    <w:lsdException w:name="Table Classic 1" w:semiHidden="1" w:unhideWhenUsed="1"/>
+    <w:lsdException w:name="Table Classic 2" w:semiHidden="1" w:unhideWhenUsed="1"/>
+    <w:lsdException w:name="Table Classic 3" w:semiHidden="1" w:unhideWhenUsed="1"/>
+    <w:lsdException w:name="Table Classic 4" w:semiHidden="1" w:unhideWhenUsed="1"/>
+    <w:lsdException w:name="Table Colorful 1" w:semiHidden="1" w:unhideWhenUsed="1"/>
+    <w:lsdException w:name="Table Colorful 2" w:semiHidden="1" w:unhideWhenUsed="1"/>
+    <w:lsdException w:name="Table Colorful 3" w:semiHidden="1" w:unhideWhenUsed="1"/>
+    <w:lsdException w:name="Table Columns 1" w:semiHidden="1" w:unhideWhenUsed="1"/>
+    <w:lsdException w:name="Table Columns 2" w:semiHidden="1" w:unhideWhenUsed="1"/>
+    <w:lsdException w:name="Table Columns 3" w:semiHidden="1" w:unhideWhenUsed="1"/>
+    <w:lsdException w:name="Table Columns 4" w:semiHidden="1" w:unhideWhenUsed="1"/>
+    <w:lsdException w:name="Table Columns 5" w:semiHidden="1" w:unhideWhenUsed="1"/>
+    <w:lsdException w:name="Table Grid 1" w:semiHidden="1" w:unhideWhenUsed="1"/>
+    <w:lsdException w:name="Table Grid 2" w:semiHidden="1" w:unhideWhenUsed="1"/>
+    <w:lsdException w:name="Table Grid 3" w:semiHidden="1" w:unhideWhenUsed="1"/>
+    <w:lsdException w:name="Table Grid 4" w:semiHidden="1" w:unhideWhenUsed="1"/>
+    <w:lsdException w:name="Table Grid 5" w:semiHidden="1" w:unhideWhenUsed="1"/>
+    <w:lsdException w:name="Table Grid 6" w:semiHidden="1" w:unhideWhenUsed="1"/>
+    <w:lsdException w:name="Table Grid 7" w:semiHidden="1" w:unhideWhenUsed="1"/>
+    <w:lsdException w:name="Table Grid 8" w:semiHidden="1" w:unhideWhenUsed="1"/>
+    <w:lsdException w:name="Table List 1" w:semiHidden="1" w:unhideWhenUsed="1"/>
+    <w:lsdException w:name="Table List 2" w:semiHidden="1" w:unhideWhenUsed="1"/>
+    <w:lsdException w:name="Table List 3" w:semiHidden="1" w:unhideWhenUsed="1"/>
+    <w:lsdException w:name="Table List 4" w:semiHidden="1" w:unhideWhenUsed="1"/>
+    <w:lsdException w:name="Table List 5" w:semiHidden="1" w:unhideWhenUsed="1"/>
+    <w:lsdException w:name="Table List 6" w:semiHidden="1" w:unhideWhenUsed="1"/>
+    <w:lsdException w:name="Table List 7" w:semiHidden="1" w:unhideWhenUsed="1"/>
+    <w:lsdException w:name="Table List 8" w:semiHidden="1" w:unhideWhenUsed="1"/>
+    <w:lsdException w:name="Table 3D effects 1" w:semiHidden="1" w:unhideWhenUsed="1"/>
+    <w:lsdException w:name="Table 3D effects 2" w:semiHidden="1" w:unhideWhenUsed="1"/>
+    <w:lsdException w:name="Table 3D effects 3" w:semiHidden="1" w:unhideWhenUsed="1"/>
+    <w:lsdException w:name="Table Contemporary" w:semiHidden="1" w:unhideWhenUsed="1"/>
+    <w:lsdException w:name="Table Elegant" w:semiHidden="1" w:unhideWhenUsed="1"/>
+    <w:lsdException w:name="Table Professional" w:semiHidden="1" w:unhideWhenUsed="1"/>
+    <w:lsdException w:name="Table Subtle 1" w:semiHidden="1" w:unhideWhenUsed="1"/>
+    <w:lsdException w:name="Table Subtle 2" w:semiHidden="1" w:unhideWhenUsed="1"/>
+    <w:lsdException w:name="Table Web 1" w:semiHidden="1" w:unhideWhenUsed="1"/>
+    <w:lsdException w:name="Table Web 2" w:semiHidden="1" w:unhideWhenUsed="1"/>
+    <w:lsdException w:name="Table Web 3" w:semiHidden="1" w:unhideWhenUsed="1"/>
+    <w:lsdException w:name="Balloon Text" w:semiHidden="1" w:unhideWhenUsed="1"/>
+    <w:lsdException w:name="Table Grid" w:uiPriority="59"/>
+    <w:lsdException w:name="Table Theme" w:semiHidden="1" w:unhideWhenUsed="1"/>
+    <w:lsdException w:name="Placeholder Text" w:semiHidden="1"/>
+    <w:lsdException w:name="No Spacing" w:uiPriority="1" w:qFormat="1"/>
+    <w:lsdException w:name="Light Shading" w:uiPriority="60"/>
+    <w:lsdException w:name="Light List" w:uiPriority="61"/>
+    <w:lsdException w:name="Light Grid" w:uiPriority="62"/>
+    <w:lsdException w:name="Medium Shading 1" w:uiPriority="63"/>
+    <w:lsdException w:name="Medium Shading 2" w:uiPriority="64"/>
+    <w:lsdException w:name="Medium List 1" w:uiPriority="65"/>
+    <w:lsdException w:name="Medium List 2" w:uiPriority="66"/>
+    <w:lsdException w:name="Medium Grid 1" w:uiPriority="67"/>
+    <w:lsdException w:name="Medium Grid 2" w:uiPriority="68"/>
+    <w:lsdException w:name="Medium Grid 3" w:uiPriority="69"/>
+    <w:lsdException w:name="Dark List" w:uiPriority="70"/>
+    <w:lsdException w:name="Colorful Shading" w:uiPriority="71"/>
+    <w:lsdException w:name="Colorful List" w:uiPriority="72"/>
+    <w:lsdException w:name="Colorful Grid" w:uiPriority="73"/>
+    <w:lsdException w:name="Light Shading Accent 1" w:uiPriority="60"/>
+    <w:lsdException w:name="Light List Accent 1" w:uiPriority="61"/>
+    <w:lsdException w:name="Light Grid Accent 1" w:uiPriority="62"/>
+    <w:lsdException w:name="Medium Shading 1 Accent 1" w:uiPriority="63"/>
+    <w:lsdException w:name="Medium Shading 2 Accent 1" w:uiPriority="64"/>
+    <w:lsdException w:name="Medium List 1 Accent 1" w:uiPriority="65"/>
+    <w:lsdException w:name="Revision" w:semiHidden="1"/>
+    <w:lsdException w:name="List Paragraph" w:uiPriority="34" w:qFormat="1"/>
+    <w:lsdException w:name="Quote" w:uiPriority="29" w:qFormat="1"/>
+    <w:lsdException w:name="Intense Quote" w:uiPriority="30" w:qFormat="1"/>
+    <w:lsdException w:name="Medium List 2 Accent 1" w:uiPriority="66"/>
+    <w:lsdException w:name="Medium Grid 1 Accent 1" w:uiPriority="67"/>
+    <w:lsdException w:name="Medium Grid 2 Accent 1" w:uiPriority="68"/>
+    <w:lsdException w:name="Medium Grid 3 Accent 1" w:uiPriority="69"/>
+    <w:lsdException w:name="Dark List Accent 1" w:uiPriority="70"/>
+    <w:lsdException w:name="Colorful Shading Accent 1" w:uiPriority="71"/>
+    <w:lsdException w:name="Colorful List Accent 1" w:uiPriority="72"/>
+    <w:lsdException w:name="Colorful Grid Accent 1" w:uiPriority="73"/>
+    <w:lsdException w:name="Light Shading Accent 2" w:uiPriority="60"/>
+    <w:lsdException w:name="Light List Accent 2" w:uiPriority="61"/>
+    <w:lsdException w:name="Light Grid Accent 2" w:uiPriority="62"/>
+    <w:lsdException w:name="Medium Shading 1 Accent 2" w:uiPriority="63"/>
+    <w:lsdException w:name="Medium Shading 2 Accent 2" w:uiPriority="64"/>
+    <w:lsdException w:name="Medium List 1 Accent 2" w:uiPriority="65"/>
+    <w:lsdException w:name="Medium List 2 Accent 2" w:uiPriority="66"/>
+    <w:lsdException w:name="Medium Grid 1 Accent 2" w:uiPriority="67"/>
+    <w:lsdException w:name="Medium Grid 2 Accent 2" w:uiPriority="68"/>
+    <w:lsdException w:name="Medium Grid 3 Accent 2" w:uiPriority="69"/>
+    <w:lsdException w:name="Dark List Accent 2" w:uiPriority="70"/>
+    <w:lsdException w:name="Colorful Shading Accent 2" w:uiPriority="71"/>
+    <w:lsdException w:name="Colorful List Accent 2" w:uiPriority="72"/>
+    <w:lsdException w:name="Colorful Grid Accent 2" w:uiPriority="73"/>
+    <w:lsdException w:name="Light Shading Accent 3" w:uiPriority="60"/>
+    <w:lsdException w:name="Light List Accent 3" w:uiPriority="61"/>
+    <w:lsdException w:name="Light Grid Accent 3" w:uiPriority="62"/>
+    <w:lsdException w:name="Medium Shading 1 Accent 3" w:uiPriority="63"/>
+    <w:lsdException w:name="Medium Shading 2 Accent 3" w:uiPriority="64"/>
+    <w:lsdException w:name="Medium List 1 Accent 3" w:uiPriority="65"/>
+    <w:lsdException w:name="Medium List 2 Accent 3" w:uiPriority="66"/>
+    <w:lsdException w:name="Medium Grid 1 Accent 3" w:uiPriority="67"/>
+    <w:lsdException w:name="Medium Grid 2 Accent 3" w:uiPriority="68"/>
+    <w:lsdException w:name="Medium Grid 3 Accent 3" w:uiPriority="69"/>
+    <w:lsdException w:name="Dark List Accent 3" w:uiPriority="70"/>
+    <w:lsdException w:name="Colorful Shading Accent 3" w:uiPriority="71"/>
+    <w:lsdException w:name="Colorful List Accent 3" w:uiPriority="72"/>
+    <w:lsdException w:name="Colorful Grid Accent 3" w:uiPriority="73"/>
+    <w:lsdException w:name="Light Shading Accent 4" w:uiPriority="60"/>
+    <w:lsdException w:name="Light List Accent 4" w:uiPriority="61"/>
+    <w:lsdException w:name="Light Grid Accent 4" w:uiPriority="62"/>
+    <w:lsdException w:name="Medium Shading 1 Accent 4" w:uiPriority="63"/>
+    <w:lsdException w:name="Medium Shading 2 Accent 4" w:uiPriority="64"/>
+    <w:lsdException w:name="Medium List 1 Accent 4" w:uiPriority="65"/>
+    <w:lsdException w:name="Medium List 2 Accent 4" w:uiPriority="66"/>
+    <w:lsdException w:name="Medium Grid 1 Accent 4" w:uiPriority="67"/>
+    <w:lsdException w:name="Medium Grid 2 Accent 4" w:uiPriority="68"/>
+    <w:lsdException w:name="Medium Grid 3 Accent 4" w:uiPriority="69"/>
+    <w:lsdException w:name="Dark List Accent 4" w:uiPriority="70"/>
+    <w:lsdException w:name="Colorful Shading Accent 4" w:uiPriority="71"/>
+    <w:lsdException w:name="Colorful List Accent 4" w:uiPriority="72"/>
+    <w:lsdException w:name="Colorful Grid Accent 4" w:uiPriority="73"/>
+    <w:lsdException w:name="Light Shading Accent 5" w:uiPriority="60"/>
+    <w:lsdException w:name="Light List Accent 5" w:uiPriority="61"/>
+    <w:lsdException w:name="Light Grid Accent 5" w:uiPriority="62"/>
+    <w:lsdException w:name="Medium Shading 1 Accent 5" w:uiPriority="63"/>
+    <w:lsdException w:name="Medium Shading 2 Accent 5" w:uiPriority="64"/>
+    <w:lsdException w:name="Medium List 1 Accent 5" w:uiPriority="65"/>
+    <w:lsdException w:name="Medium List 2 Accent 5" w:uiPriority="66"/>
+    <w:lsdException w:name="Medium Grid 1 Accent 5" w:uiPriority="67"/>
+    <w:lsdException w:name="Medium Grid 2 Accent 5" w:uiPriority="68"/>
+    <w:lsdException w:name="Medium Grid 3 Accent 5" w:uiPriority="69"/>
+    <w:lsdException w:name="Dark List Accent 5" w:uiPriority="70"/>
+    <w:lsdException w:name="Colorful Shading Accent 5" w:uiPriority="71"/>
+    <w:lsdException w:name="Colorful List Accent 5" w:uiPriority="72"/>
+    <w:lsdException w:name="Colorful Grid Accent 5" w:uiPriority="73"/>
+    <w:lsdException w:name="Light Shading Accent 6" w:uiPriority="60"/>
+    <w:lsdException w:name="Light List Accent 6" w:uiPriority="61"/>
+    <w:lsdException w:name="Light Grid Accent 6" w:uiPriority="62"/>
+    <w:lsdException w:name="Medium Shading 1 Accent 6" w:uiPriority="63"/>
+    <w:lsdException w:name="Medium Shading 2 Accent 6" w:uiPriority="64"/>
+    <w:lsdException w:name="Medium List 1 Accent 6" w:uiPriority="65"/>
+    <w:lsdException w:name="Medium List 2 Accent 6" w:uiPriority="66"/>
+    <w:lsdException w:name="Medium Grid 1 Accent 6" w:uiPriority="67"/>
+    <w:lsdException w:name="Medium Grid 2 Accent 6" w:uiPriority="68"/>
+    <w:lsdException w:name="Medium Grid 3 Accent 6" w:uiPriority="69"/>
+    <w:lsdException w:name="Dark List Accent 6" w:uiPriority="70"/>
+    <w:lsdException w:name="Colorful Shading Accent 6" w:uiPriority="71"/>
+    <w:lsdException w:name="Colorful List Accent 6" w:uiPriority="72"/>
+    <w:lsdException w:name="Colorful Grid Accent 6" w:uiPriority="73"/>
+    <w:lsdException w:name="Subtle Emphasis" w:uiPriority="19" w:qFormat="1"/>
+    <w:lsdException w:name="Intense Emphasis" w:uiPriority="21" w:qFormat="1"/>
+    <w:lsdException w:name="Subtle Reference" w:uiPriority="31" w:qFormat="1"/>
+    <w:lsdException w:name="Intense Reference" w:uiPriority="32" w:qFormat="1"/>
+    <w:lsdException w:name="Book Title" w:uiPriority="33" w:qFormat="1"/>
+    <w:lsdException w:name="Bibliography" w:semiHidden="1" w:uiPriority="37" w:unhideWhenUsed="1"/>
+    <w:lsdException w:name="TOC Heading" w:semiHidden="1" w:uiPriority="39" w:unhideWhenUsed="1" w:qFormat="1"/>
+    <w:lsdException w:name="Plain Table 1" w:uiPriority="41"/>
+    <w:lsdException w:name="Plain Table 2" w:uiPriority="42"/>
+    <w:lsdException w:name="Plain Table 3" w:uiPriority="43"/>
+    <w:lsdException w:name="Plain Table 4" w:uiPriority="44"/>
+    <w:lsdException w:name="Plain Table 5" w:uiPriority="45"/>
+    <w:lsdException w:name="Grid Table Light" w:uiPriority="40"/>
+    <w:lsdException w:name="Grid Table 1 Light" w:uiPriority="46"/>
+    <w:lsdException w:name="Grid Table 2" w:uiPriority="47"/>
+    <w:lsdException w:name="Grid Table 3" w:uiPriority="48"/>
+    <w:lsdException w:name="Grid Table 4" w:uiPriority="49"/>
+    <w:lsdException w:name="Grid Table 5 Dark" w:uiPriority="50"/>
+    <w:lsdException w:name="Grid Table 6 Colorful" w:uiPriority="51"/>
+    <w:lsdException w:name="Grid Table 7 Colorful" w:uiPriority="52"/>
+    <w:lsdException w:name="Grid Table 1 Light Accent 1" w:uiPriority="46"/>
+    <w:lsdException w:name="Grid Table 2 Accent 1" w:uiPriority="47"/>
+    <w:lsdException w:name="Grid Table 3 Accent 1" w:uiPriority="48"/>
+    <w:lsdException w:name="Grid Table 4 Accent 1" w:uiPriority="49"/>
+    <w:lsdException w:name="Grid Table 5 Dark Accent 1" w:uiPriority="50"/>
+    <w:lsdException w:name="Grid Table 6 Colorful Accent 1" w:uiPriority="51"/>
+    <w:lsdException w:name="Grid Table 7 Colorful Accent 1" w:uiPriority="52"/>
+    <w:lsdException w:name="Grid Table 1 Light Accent 2" w:uiPriority="46"/>
+    <w:lsdException w:name="Grid Table 2 Accent 2" w:uiPriority="47"/>
+    <w:lsdException w:name="Grid Table 3 Accent 2" w:uiPriority="48"/>
+    <w:lsdException w:name="Grid Table 4 Accent 2" w:uiPriority="49"/>
+    <w:lsdException w:name="Grid Table 5 Dark Accent 2" w:uiPriority="50"/>
+    <w:lsdException w:name="Grid Table 6 Colorful Accent 2" w:uiPriority="51"/>
+    <w:lsdException w:name="Grid Table 7 Colorful Accent 2" w:uiPriority="52"/>
+    <w:lsdException w:name="Grid Table 1 Light Accent 3" w:uiPriority="46"/>
+    <w:lsdException w:name="Grid Table 2 Accent 3" w:uiPriority="47"/>
+    <w:lsdException w:name="Grid Table 3 Accent 3" w:uiPriority="48"/>
+    <w:lsdException w:name="Grid Table 4 Accent 3" w:uiPriority="49"/>
+    <w:lsdException w:name="Grid Table 5 Dark Accent 3" w:uiPriority="50"/>
+    <w:lsdException w:name="Grid Table 6 Colorful Accent 3" w:uiPriority="51"/>
+    <w:lsdException w:name="Grid Table 7 Colorful Accent 3" w:uiPriority="52"/>
+    <w:lsdException w:name="Grid Table 1 Light Accent 4" w:uiPriority="46"/>
+    <w:lsdException w:name="Grid Table 2 Accent 4" w:uiPriority="47"/>
+    <w:lsdException w:name="Grid Table 3 Accent 4" w:uiPriority="48"/>
+    <w:lsdException w:name="Grid Table 4 Accent 4" w:uiPriority="49"/>
+    <w:lsdException w:name="Grid Table 5 Dark Accent 4" w:uiPriority="50"/>
+    <w:lsdException w:name="Grid Table 6 Colorful Accent 4" w:uiPriority="51"/>
+    <w:lsdException w:name="Grid Table 7 Colorful Accent 4" w:uiPriority="52"/>
+    <w:lsdException w:name="Grid Table 1 Light Accent 5" w:uiPriority="46"/>
+    <w:lsdException w:name="Grid Table 2 Accent 5" w:uiPriority="47"/>
+    <w:lsdException w:name="Grid Table 3 Accent 5" w:uiPriority="48"/>
+    <w:lsdException w:name="Grid Table 4 Accent 5" w:uiPriority="49"/>
+    <w:lsdException w:name="Grid Table 5 Dark Accent 5" w:uiPriority="50"/>
+    <w:lsdException w:name="Grid Table 6 Colorful Accent 5" w:uiPriority="51"/>
+    <w:lsdException w:name="Grid Table 7 Colorful Accent 5" w:uiPriority="52"/>
+    <w:lsdException w:name="Grid Table 1 Light Accent 6" w:uiPriority="46"/>
+    <w:lsdException w:name="Grid Table 2 Accent 6" w:uiPriority="47"/>
+    <w:lsdException w:name="Grid Table 3 Accent 6" w:uiPriority="48"/>
+    <w:lsdException w:name="Grid Table 4 Accent 6" w:uiPriority="49"/>
+    <w:lsdException w:name="Grid Table 5 Dark Accent 6" w:uiPriority="50"/>
+    <w:lsdException w:name="Grid Table 6 Colorful Accent 6" w:uiPriority="51"/>
+    <w:lsdException w:name="Grid Table 7 Colorful Accent 6" w:uiPriority="52"/>
+    <w:lsdException w:name="List Table 1 Light" w:uiPriority="46"/>
+    <w:lsdException w:name="List Table 2" w:uiPriority="47"/>
+    <w:lsdException w:name="List Table 3" w:uiPriority="48"/>
+    <w:lsdException w:name="List Table 4" w:uiPriority="49"/>
+    <w:lsdException w:name="List Table 5 Dark" w:uiPriority="50"/>
+    <w:lsdException w:name="List Table 6 Colorful" w:uiPriority="51"/>
+    <w:lsdException w:name="List Table 7 Colorful" w:uiPriority="52"/>
+    <w:lsdException w:name="List Table 1 Light Accent 1" w:uiPriority="46"/>
+    <w:lsdException w:name="List Table 2 Accent 1" w:uiPriority="47"/>
+    <w:lsdException w:name="List Table 3 Accent 1" w:uiPriority="48"/>
+    <w:lsdException w:name="List Table 4 Accent 1" w:uiPriority="49"/>
+    <w:lsdException w:name="List Table 5 Dark Accent 1" w:uiPriority="50"/>
+    <w:lsdException w:name="List Table 6 Colorful Accent 1" w:uiPriority="51"/>
+    <w:lsdException w:name="List Table 7 Colorful Accent 1" w:uiPriority="52"/>
+    <w:lsdException w:name="List Table 1 Light Accent 2" w:uiPriority="46"/>
+    <w:lsdException w:name="List Table 2 Accent 2" w:uiPriority="47"/>
+    <w:lsdException w:name="List Table 3 Accent 2" w:uiPriority="48"/>
+    <w:lsdException w:name="List Table 4 Accent 2" w:uiPriority="49"/>
+    <w:lsdException w:name="List Table 5 Dark Accent 2" w:uiPriority="50"/>
+    <w:lsdException w:name="List Table 6 Colorful Accent 2" w:uiPriority="51"/>
+    <w:lsdException w:name="List Table 7 Colorful Accent 2" w:uiPriority="52"/>
+    <w:lsdException w:name="List Table 1 Light Accent 3" w:uiPriority="46"/>
+    <w:lsdException w:name="List Table 2 Accent 3" w:uiPriority="47"/>
+    <w:lsdException w:name="List Table 3 Accent 3" w:uiPriority="48"/>
+    <w:lsdException w:name="List Table 4 Accent 3" w:uiPriority="49"/>
+    <w:lsdException w:name="List Table 5 Dark Accent 3" w:uiPriority="50"/>
+    <w:lsdException w:name="List Table 6 Colorful Accent 3" w:uiPriority="51"/>
+    <w:lsdException w:name="List Table 7 Colorful Accent 3" w:uiPriority="52"/>
+    <w:lsdException w:name="List Table 1 Light Accent 4" w:uiPriority="46"/>
+    <w:lsdException w:name="List Table 2 Accent 4" w:uiPriority="47"/>
+    <w:lsdException w:name="List Table 3 Accent 4" w:uiPriority="48"/>
+    <w:lsdException w:name="List Table 4 Accent 4" w:uiPriority="49"/>
+    <w:lsdException w:name="List Table 5 Dark Accent 4" w:uiPriority="50"/>
+    <w:lsdException w:name="List Table 6 Colorful Accent 4" w:uiPriority="51"/>
+    <w:lsdException w:name="List Table 7 Colorful Accent 4" w:uiPriority="52"/>
+    <w:lsdException w:name="List Table 1 Light Accent 5" w:uiPriority="46"/>
+    <w:lsdException w:name="List Table 2 Accent 5" w:uiPriority="47"/>
+    <w:lsdException w:name="List Table 3 Accent 5" w:uiPriority="48"/>
+    <w:lsdException w:name="List Table 4 Accent 5" w:uiPriority="49"/>
+    <w:lsdException w:name="List Table 5 Dark Accent 5" w:uiPriority="50"/>
+    <w:lsdException w:name="List Table 6 Colorful Accent 5" w:uiPriority="51"/>
+    <w:lsdException w:name="List Table 7 Colorful Accent 5" w:uiPriority="52"/>
+    <w:lsdException w:name="List Table 1 Light Accent 6" w:uiPriority="46"/>
+    <w:lsdException w:name="List Table 2 Accent 6" w:uiPriority="47"/>
+    <w:lsdException w:name="List Table 3 Accent 6" w:uiPriority="48"/>
+    <w:lsdException w:name="List Table 4 Accent 6" w:uiPriority="49"/>
+    <w:lsdException w:name="List Table 5 Dark Accent 6" w:uiPriority="50"/>
+    <w:lsdException w:name="List Table 6 Colorful Accent 6" w:uiPriority="51"/>
+    <w:lsdException w:name="List Table 7 Colorful Accent 6" w:uiPriority="52"/>
+    <w:lsdException w:name="Mention" w:semiHidden="1" w:unhideWhenUsed="1"/>
+    <w:lsdException w:name="Smart Hyperlink" w:semiHidden="1" w:unhideWhenUsed="1"/>
+    <w:lsdException w:name="Hashtag" w:semiHidden="1" w:unhideWhenUsed="1"/>
+    <w:lsdException w:name="Unresolved Mention" w:semiHidden="1" w:unhideWhenUsed="1"/>
+    <w:lsdException w:name="Smart Link" w:semiHidden="1" w:unhideWhenUsed="1"/>
   </w:latentStyles>
   <w:style w:type="paragraph" w:default="1" w:styleId="Normal">
     <w:name w:val="Normal"/>
     <w:qFormat/>
-    <w:rsid w:val="008B35AD"/>
+    <w:rsid w:val="00023440"/>
   </w:style>
   <w:style w:type="paragraph" w:styleId="Heading4">
     <w:name w:val="heading 4"/>
@@ -21496,412 +21570,6 @@
   <w:style w:type="character" w:default="1" w:styleId="DefaultParagraphFont">
     <w:name w:val="Default Paragraph Font"/>
     <w:uiPriority w:val="1"/>
-    <w:semiHidden/>
-    <w:unhideWhenUsed/>
-  </w:style>
-  <w:style w:type="table" w:default="1" w:styleId="TableNormal">
-    <w:name w:val="Normal Table"/>
-    <w:uiPriority w:val="99"/>
-    <w:semiHidden/>
-    <w:unhideWhenUsed/>
-    <w:tblPr>
-      <w:tblInd w:w="0" w:type="dxa"/>
-      <w:tblCellMar>
-        <w:top w:w="0" w:type="dxa"/>
-        <w:left w:w="108" w:type="dxa"/>
-        <w:bottom w:w="0" w:type="dxa"/>
-        <w:right w:w="108" w:type="dxa"/>
-      </w:tblCellMar>
-    </w:tblPr>
-  </w:style>
-  <w:style w:type="numbering" w:default="1" w:styleId="NoList">
-    <w:name w:val="No List"/>
-    <w:uiPriority w:val="99"/>
-    <w:semiHidden/>
-    <w:unhideWhenUsed/>
-  </w:style>
-  <w:style w:type="table" w:styleId="TableGrid">
-    <w:name w:val="Table Grid"/>
-    <w:aliases w:val="unBiet tin gi chua,vao day coi di   http://www.freewebtown.com/gaigoisaigon/"/>
-    <w:basedOn w:val="TableNormal"/>
-    <w:uiPriority w:val="59"/>
-    <w:rsid w:val="008F678E"/>
-    <w:pPr>
-      <w:spacing w:after="0" w:line="240" w:lineRule="auto"/>
-    </w:pPr>
-    <w:tblPr>
-      <w:tblBorders>
-        <w:top w:val="single" w:sz="4" w:space="0" w:color="auto"/>
-        <w:left w:val="single" w:sz="4" w:space="0" w:color="auto"/>
-        <w:bottom w:val="single" w:sz="4" w:space="0" w:color="auto"/>
-        <w:right w:val="single" w:sz="4" w:space="0" w:color="auto"/>
-        <w:insideH w:val="single" w:sz="4" w:space="0" w:color="auto"/>
-        <w:insideV w:val="single" w:sz="4" w:space="0" w:color="auto"/>
-      </w:tblBorders>
-    </w:tblPr>
-  </w:style>
-  <w:style w:type="paragraph" w:styleId="ListParagraph">
-    <w:name w:val="List Paragraph"/>
-    <w:basedOn w:val="Normal"/>
-    <w:link w:val="ListParagraphChar"/>
-    <w:uiPriority w:val="34"/>
-    <w:qFormat/>
-    <w:rsid w:val="00FA180C"/>
-    <w:pPr>
-      <w:widowControl w:val="0"/>
-      <w:autoSpaceDE w:val="0"/>
-      <w:autoSpaceDN w:val="0"/>
-      <w:spacing w:after="0" w:line="240" w:lineRule="auto"/>
-      <w:ind w:left="1764"/>
-    </w:pPr>
-    <w:rPr>
-      <w:rFonts w:ascii="Verdana" w:eastAsia="Times New Roman" w:hAnsi="Verdana" w:cs="Verdana"/>
-      <w:lang w:val="en-US"/>
-    </w:rPr>
-  </w:style>
-  <w:style w:type="character" w:customStyle="1" w:styleId="ListParagraphChar">
-    <w:name w:val="List Paragraph Char"/>
-    <w:link w:val="ListParagraph"/>
-    <w:uiPriority w:val="34"/>
-    <w:locked/>
-    <w:rsid w:val="00FA180C"/>
-    <w:rPr>
-      <w:rFonts w:ascii="Verdana" w:eastAsia="Times New Roman" w:hAnsi="Verdana" w:cs="Verdana"/>
-      <w:lang w:val="en-US"/>
-    </w:rPr>
-  </w:style>
-  <w:style w:type="character" w:customStyle="1" w:styleId="Heading4Char">
-    <w:name w:val="Heading 4 Char"/>
-    <w:basedOn w:val="DefaultParagraphFont"/>
-    <w:link w:val="Heading4"/>
-    <w:uiPriority w:val="9"/>
-    <w:rsid w:val="00FA180C"/>
-    <w:rPr>
-      <w:rFonts w:ascii="Verdana" w:eastAsia="Times New Roman" w:hAnsi="Verdana" w:cs="Verdana"/>
-      <w:b/>
-      <w:bCs/>
-      <w:sz w:val="18"/>
-      <w:szCs w:val="18"/>
-      <w:lang w:val="en-US"/>
-    </w:rPr>
-  </w:style>
-  <w:style w:type="paragraph" w:styleId="NormalWeb">
-    <w:name w:val="Normal (Web)"/>
-    <w:basedOn w:val="Normal"/>
-    <w:uiPriority w:val="99"/>
-    <w:semiHidden/>
-    <w:unhideWhenUsed/>
-    <w:rsid w:val="00CB56E0"/>
-    <w:pPr>
-      <w:spacing w:before="100" w:beforeAutospacing="1" w:after="100" w:afterAutospacing="1" w:line="240" w:lineRule="auto"/>
-    </w:pPr>
-    <w:rPr>
-      <w:rFonts w:ascii="Times New Roman" w:eastAsia="Times New Roman" w:hAnsi="Times New Roman" w:cs="Times New Roman"/>
-      <w:sz w:val="24"/>
-      <w:szCs w:val="24"/>
-      <w:lang w:eastAsia="en-IN" w:bidi="mr-IN"/>
-    </w:rPr>
-  </w:style>
-  <w:style w:type="paragraph" w:styleId="BodyText">
-    <w:name w:val="Body Text"/>
-    <w:basedOn w:val="Normal"/>
-    <w:link w:val="BodyTextChar"/>
-    <w:uiPriority w:val="1"/>
-    <w:qFormat/>
-    <w:rsid w:val="001A3FA0"/>
-    <w:pPr>
-      <w:widowControl w:val="0"/>
-      <w:autoSpaceDE w:val="0"/>
-      <w:autoSpaceDN w:val="0"/>
-      <w:spacing w:after="0" w:line="240" w:lineRule="auto"/>
-    </w:pPr>
-    <w:rPr>
-      <w:rFonts w:ascii="Verdana" w:eastAsia="Verdana" w:hAnsi="Verdana" w:cs="Verdana"/>
-      <w:sz w:val="18"/>
-      <w:szCs w:val="18"/>
-      <w:lang w:val="en-US"/>
-    </w:rPr>
-  </w:style>
-  <w:style w:type="character" w:customStyle="1" w:styleId="BodyTextChar">
-    <w:name w:val="Body Text Char"/>
-    <w:basedOn w:val="DefaultParagraphFont"/>
-    <w:link w:val="BodyText"/>
-    <w:uiPriority w:val="1"/>
-    <w:rsid w:val="001A3FA0"/>
-    <w:rPr>
-      <w:rFonts w:ascii="Verdana" w:eastAsia="Verdana" w:hAnsi="Verdana" w:cs="Verdana"/>
-      <w:sz w:val="18"/>
-      <w:szCs w:val="18"/>
-      <w:lang w:val="en-US"/>
-    </w:rPr>
-  </w:style>
-  <w:style w:type="paragraph" w:styleId="Header">
-    <w:name w:val="header"/>
-    <w:basedOn w:val="Normal"/>
-    <w:link w:val="HeaderChar"/>
-    <w:uiPriority w:val="99"/>
-    <w:unhideWhenUsed/>
-    <w:rsid w:val="007A645E"/>
-    <w:pPr>
-      <w:tabs>
-        <w:tab w:val="center" w:pos="4513"/>
-        <w:tab w:val="right" w:pos="9026"/>
-      </w:tabs>
-      <w:spacing w:after="0" w:line="240" w:lineRule="auto"/>
-    </w:pPr>
-  </w:style>
-  <w:style w:type="character" w:customStyle="1" w:styleId="HeaderChar">
-    <w:name w:val="Header Char"/>
-    <w:basedOn w:val="DefaultParagraphFont"/>
-    <w:link w:val="Header"/>
-    <w:uiPriority w:val="99"/>
-    <w:rsid w:val="007A645E"/>
-  </w:style>
-  <w:style w:type="paragraph" w:styleId="Footer">
-    <w:name w:val="footer"/>
-    <w:basedOn w:val="Normal"/>
-    <w:link w:val="FooterChar"/>
-    <w:uiPriority w:val="99"/>
-    <w:unhideWhenUsed/>
-    <w:rsid w:val="007A645E"/>
-    <w:pPr>
-      <w:tabs>
-        <w:tab w:val="center" w:pos="4513"/>
-        <w:tab w:val="right" w:pos="9026"/>
-      </w:tabs>
-      <w:spacing w:after="0" w:line="240" w:lineRule="auto"/>
-    </w:pPr>
-  </w:style>
-  <w:style w:type="character" w:customStyle="1" w:styleId="FooterChar">
-    <w:name w:val="Footer Char"/>
-    <w:basedOn w:val="DefaultParagraphFont"/>
-    <w:link w:val="Footer"/>
-    <w:uiPriority w:val="99"/>
-    <w:rsid w:val="007A645E"/>
-  </w:style>
-  <w:style w:type="paragraph" w:styleId="BalloonText">
-    <w:name w:val="Balloon Text"/>
-    <w:basedOn w:val="Normal"/>
-    <w:link w:val="BalloonTextChar"/>
-    <w:uiPriority w:val="99"/>
-    <w:semiHidden/>
-    <w:unhideWhenUsed/>
-    <w:rsid w:val="00570A52"/>
-    <w:pPr>
-      <w:spacing w:after="0" w:line="240" w:lineRule="auto"/>
-    </w:pPr>
-    <w:rPr>
-      <w:rFonts w:ascii="Tahoma" w:hAnsi="Tahoma" w:cs="Tahoma"/>
-      <w:sz w:val="16"/>
-      <w:szCs w:val="16"/>
-    </w:rPr>
-  </w:style>
-  <w:style w:type="character" w:customStyle="1" w:styleId="BalloonTextChar">
-    <w:name w:val="Balloon Text Char"/>
-    <w:basedOn w:val="DefaultParagraphFont"/>
-    <w:link w:val="BalloonText"/>
-    <w:uiPriority w:val="99"/>
-    <w:semiHidden/>
-    <w:rsid w:val="00570A52"/>
-    <w:rPr>
-      <w:rFonts w:ascii="Tahoma" w:hAnsi="Tahoma" w:cs="Tahoma"/>
-      <w:sz w:val="16"/>
-      <w:szCs w:val="16"/>
-    </w:rPr>
-  </w:style>
-</w:styles>
-</file>
-
-<file path=word/stylesWithEffects.xml><?xml version="1.0" encoding="utf-8"?>
-<w:styles xmlns:wpc="http://schemas.microsoft.com/office/word/2010/wordprocessingCanvas" xmlns:mc="http://schemas.openxmlformats.org/markup-compatibility/2006" xmlns:o="urn:schemas-microsoft-com:office:office" xmlns:r="http://schemas.openxmlformats.org/officeDocument/2006/relationships" xmlns:m="http://schemas.openxmlformats.org/officeDocument/2006/math" xmlns:v="urn:schemas-microsoft-com:vml" xmlns:wp14="http://schemas.microsoft.com/office/word/2010/wordprocessingDrawing" xmlns:wp="http://schemas.openxmlformats.org/drawingml/2006/wordprocessingDrawing" xmlns:w10="urn:schemas-microsoft-com:office:word" xmlns:w="http://schemas.openxmlformats.org/wordprocessingml/2006/main" xmlns:w14="http://schemas.microsoft.com/office/word/2010/wordml" xmlns:wpg="http://schemas.microsoft.com/office/word/2010/wordprocessingGroup" xmlns:wpi="http://schemas.microsoft.com/office/word/2010/wordprocessingInk" xmlns:wne="http://schemas.microsoft.com/office/word/2006/wordml" xmlns:wps="http://schemas.microsoft.com/office/word/2010/wordprocessingShape" mc:Ignorable="w14 wp14">
-  <w:docDefaults>
-    <w:rPrDefault>
-      <w:rPr>
-        <w:rFonts w:asciiTheme="minorHAnsi" w:eastAsiaTheme="minorHAnsi" w:hAnsiTheme="minorHAnsi" w:cstheme="minorBidi"/>
-        <w:sz w:val="22"/>
-        <w:szCs w:val="22"/>
-        <w:lang w:val="en-IN" w:eastAsia="en-US" w:bidi="ar-SA"/>
-      </w:rPr>
-    </w:rPrDefault>
-    <w:pPrDefault>
-      <w:pPr>
-        <w:spacing w:after="200" w:line="276" w:lineRule="auto"/>
-      </w:pPr>
-    </w:pPrDefault>
-  </w:docDefaults>
-  <w:latentStyles w:defLockedState="0" w:defUIPriority="99" w:defSemiHidden="1" w:defUnhideWhenUsed="1" w:defQFormat="0" w:count="267">
-    <w:lsdException w:name="Normal" w:semiHidden="0" w:uiPriority="0" w:unhideWhenUsed="0" w:qFormat="1"/>
-    <w:lsdException w:name="heading 1" w:semiHidden="0" w:uiPriority="9" w:unhideWhenUsed="0" w:qFormat="1"/>
-    <w:lsdException w:name="heading 2" w:uiPriority="9" w:qFormat="1"/>
-    <w:lsdException w:name="heading 3" w:uiPriority="9" w:qFormat="1"/>
-    <w:lsdException w:name="heading 4" w:uiPriority="9" w:qFormat="1"/>
-    <w:lsdException w:name="heading 5" w:uiPriority="9" w:qFormat="1"/>
-    <w:lsdException w:name="heading 6" w:uiPriority="9" w:qFormat="1"/>
-    <w:lsdException w:name="heading 7" w:uiPriority="9" w:qFormat="1"/>
-    <w:lsdException w:name="heading 8" w:uiPriority="9" w:qFormat="1"/>
-    <w:lsdException w:name="heading 9" w:uiPriority="9" w:qFormat="1"/>
-    <w:lsdException w:name="toc 1" w:uiPriority="39"/>
-    <w:lsdException w:name="toc 2" w:uiPriority="39"/>
-    <w:lsdException w:name="toc 3" w:uiPriority="39"/>
-    <w:lsdException w:name="toc 4" w:uiPriority="39"/>
-    <w:lsdException w:name="toc 5" w:uiPriority="39"/>
-    <w:lsdException w:name="toc 6" w:uiPriority="39"/>
-    <w:lsdException w:name="toc 7" w:uiPriority="39"/>
-    <w:lsdException w:name="toc 8" w:uiPriority="39"/>
-    <w:lsdException w:name="toc 9" w:uiPriority="39"/>
-    <w:lsdException w:name="caption" w:uiPriority="35" w:qFormat="1"/>
-    <w:lsdException w:name="Title" w:semiHidden="0" w:uiPriority="10" w:unhideWhenUsed="0" w:qFormat="1"/>
-    <w:lsdException w:name="Default Paragraph Font" w:uiPriority="1"/>
-    <w:lsdException w:name="Body Text" w:uiPriority="1" w:qFormat="1"/>
-    <w:lsdException w:name="Subtitle" w:semiHidden="0" w:uiPriority="11" w:unhideWhenUsed="0" w:qFormat="1"/>
-    <w:lsdException w:name="Strong" w:semiHidden="0" w:uiPriority="22" w:unhideWhenUsed="0" w:qFormat="1"/>
-    <w:lsdException w:name="Emphasis" w:semiHidden="0" w:uiPriority="20" w:unhideWhenUsed="0" w:qFormat="1"/>
-    <w:lsdException w:name="Table Grid" w:semiHidden="0" w:uiPriority="59" w:unhideWhenUsed="0"/>
-    <w:lsdException w:name="Placeholder Text" w:unhideWhenUsed="0"/>
-    <w:lsdException w:name="No Spacing" w:semiHidden="0" w:uiPriority="1" w:unhideWhenUsed="0" w:qFormat="1"/>
-    <w:lsdException w:name="Light Shading" w:semiHidden="0" w:uiPriority="60" w:unhideWhenUsed="0"/>
-    <w:lsdException w:name="Light List" w:semiHidden="0" w:uiPriority="61" w:unhideWhenUsed="0"/>
-    <w:lsdException w:name="Light Grid" w:semiHidden="0" w:uiPriority="62" w:unhideWhenUsed="0"/>
-    <w:lsdException w:name="Medium Shading 1" w:semiHidden="0" w:uiPriority="63" w:unhideWhenUsed="0"/>
-    <w:lsdException w:name="Medium Shading 2" w:semiHidden="0" w:uiPriority="64" w:unhideWhenUsed="0"/>
-    <w:lsdException w:name="Medium List 1" w:semiHidden="0" w:uiPriority="65" w:unhideWhenUsed="0"/>
-    <w:lsdException w:name="Medium List 2" w:semiHidden="0" w:uiPriority="66" w:unhideWhenUsed="0"/>
-    <w:lsdException w:name="Medium Grid 1" w:semiHidden="0" w:uiPriority="67" w:unhideWhenUsed="0"/>
-    <w:lsdException w:name="Medium Grid 2" w:semiHidden="0" w:uiPriority="68" w:unhideWhenUsed="0"/>
-    <w:lsdException w:name="Medium Grid 3" w:semiHidden="0" w:uiPriority="69" w:unhideWhenUsed="0"/>
-    <w:lsdException w:name="Dark List" w:semiHidden="0" w:uiPriority="70" w:unhideWhenUsed="0"/>
-    <w:lsdException w:name="Colorful Shading" w:semiHidden="0" w:uiPriority="71" w:unhideWhenUsed="0"/>
-    <w:lsdException w:name="Colorful List" w:semiHidden="0" w:uiPriority="72" w:unhideWhenUsed="0"/>
-    <w:lsdException w:name="Colorful Grid" w:semiHidden="0" w:uiPriority="73" w:unhideWhenUsed="0"/>
-    <w:lsdException w:name="Light Shading Accent 1" w:semiHidden="0" w:uiPriority="60" w:unhideWhenUsed="0"/>
-    <w:lsdException w:name="Light List Accent 1" w:semiHidden="0" w:uiPriority="61" w:unhideWhenUsed="0"/>
-    <w:lsdException w:name="Light Grid Accent 1" w:semiHidden="0" w:uiPriority="62" w:unhideWhenUsed="0"/>
-    <w:lsdException w:name="Medium Shading 1 Accent 1" w:semiHidden="0" w:uiPriority="63" w:unhideWhenUsed="0"/>
-    <w:lsdException w:name="Medium Shading 2 Accent 1" w:semiHidden="0" w:uiPriority="64" w:unhideWhenUsed="0"/>
-    <w:lsdException w:name="Medium List 1 Accent 1" w:semiHidden="0" w:uiPriority="65" w:unhideWhenUsed="0"/>
-    <w:lsdException w:name="Revision" w:unhideWhenUsed="0"/>
-    <w:lsdException w:name="List Paragraph" w:semiHidden="0" w:uiPriority="34" w:unhideWhenUsed="0" w:qFormat="1"/>
-    <w:lsdException w:name="Quote" w:semiHidden="0" w:uiPriority="29" w:unhideWhenUsed="0" w:qFormat="1"/>
-    <w:lsdException w:name="Intense Quote" w:semiHidden="0" w:uiPriority="30" w:unhideWhenUsed="0" w:qFormat="1"/>
-    <w:lsdException w:name="Medium List 2 Accent 1" w:semiHidden="0" w:uiPriority="66" w:unhideWhenUsed="0"/>
-    <w:lsdException w:name="Medium Grid 1 Accent 1" w:semiHidden="0" w:uiPriority="67" w:unhideWhenUsed="0"/>
-    <w:lsdException w:name="Medium Grid 2 Accent 1" w:semiHidden="0" w:uiPriority="68" w:unhideWhenUsed="0"/>
-    <w:lsdException w:name="Medium Grid 3 Accent 1" w:semiHidden="0" w:uiPriority="69" w:unhideWhenUsed="0"/>
-    <w:lsdException w:name="Dark List Accent 1" w:semiHidden="0" w:uiPriority="70" w:unhideWhenUsed="0"/>
-    <w:lsdException w:name="Colorful Shading Accent 1" w:semiHidden="0" w:uiPriority="71" w:unhideWhenUsed="0"/>
-    <w:lsdException w:name="Colorful List Accent 1" w:semiHidden="0" w:uiPriority="72" w:unhideWhenUsed="0"/>
-    <w:lsdException w:name="Colorful Grid Accent 1" w:semiHidden="0" w:uiPriority="73" w:unhideWhenUsed="0"/>
-    <w:lsdException w:name="Light Shading Accent 2" w:semiHidden="0" w:uiPriority="60" w:unhideWhenUsed="0"/>
-    <w:lsdException w:name="Light List Accent 2" w:semiHidden="0" w:uiPriority="61" w:unhideWhenUsed="0"/>
-    <w:lsdException w:name="Light Grid Accent 2" w:semiHidden="0" w:uiPriority="62" w:unhideWhenUsed="0"/>
-    <w:lsdException w:name="Medium Shading 1 Accent 2" w:semiHidden="0" w:uiPriority="63" w:unhideWhenUsed="0"/>
-    <w:lsdException w:name="Medium Shading 2 Accent 2" w:semiHidden="0" w:uiPriority="64" w:unhideWhenUsed="0"/>
-    <w:lsdException w:name="Medium List 1 Accent 2" w:semiHidden="0" w:uiPriority="65" w:unhideWhenUsed="0"/>
-    <w:lsdException w:name="Medium List 2 Accent 2" w:semiHidden="0" w:uiPriority="66" w:unhideWhenUsed="0"/>
-    <w:lsdException w:name="Medium Grid 1 Accent 2" w:semiHidden="0" w:uiPriority="67" w:unhideWhenUsed="0"/>
-    <w:lsdException w:name="Medium Grid 2 Accent 2" w:semiHidden="0" w:uiPriority="68" w:unhideWhenUsed="0"/>
-    <w:lsdException w:name="Medium Grid 3 Accent 2" w:semiHidden="0" w:uiPriority="69" w:unhideWhenUsed="0"/>
-    <w:lsdException w:name="Dark List Accent 2" w:semiHidden="0" w:uiPriority="70" w:unhideWhenUsed="0"/>
-    <w:lsdException w:name="Colorful Shading Accent 2" w:semiHidden="0" w:uiPriority="71" w:unhideWhenUsed="0"/>
-    <w:lsdException w:name="Colorful List Accent 2" w:semiHidden="0" w:uiPriority="72" w:unhideWhenUsed="0"/>
-    <w:lsdException w:name="Colorful Grid Accent 2" w:semiHidden="0" w:uiPriority="73" w:unhideWhenUsed="0"/>
-    <w:lsdException w:name="Light Shading Accent 3" w:semiHidden="0" w:uiPriority="60" w:unhideWhenUsed="0"/>
-    <w:lsdException w:name="Light List Accent 3" w:semiHidden="0" w:uiPriority="61" w:unhideWhenUsed="0"/>
-    <w:lsdException w:name="Light Grid Accent 3" w:semiHidden="0" w:uiPriority="62" w:unhideWhenUsed="0"/>
-    <w:lsdException w:name="Medium Shading 1 Accent 3" w:semiHidden="0" w:uiPriority="63" w:unhideWhenUsed="0"/>
-    <w:lsdException w:name="Medium Shading 2 Accent 3" w:semiHidden="0" w:uiPriority="64" w:unhideWhenUsed="0"/>
-    <w:lsdException w:name="Medium List 1 Accent 3" w:semiHidden="0" w:uiPriority="65" w:unhideWhenUsed="0"/>
-    <w:lsdException w:name="Medium List 2 Accent 3" w:semiHidden="0" w:uiPriority="66" w:unhideWhenUsed="0"/>
-    <w:lsdException w:name="Medium Grid 1 Accent 3" w:semiHidden="0" w:uiPriority="67" w:unhideWhenUsed="0"/>
-    <w:lsdException w:name="Medium Grid 2 Accent 3" w:semiHidden="0" w:uiPriority="68" w:unhideWhenUsed="0"/>
-    <w:lsdException w:name="Medium Grid 3 Accent 3" w:semiHidden="0" w:uiPriority="69" w:unhideWhenUsed="0"/>
-    <w:lsdException w:name="Dark List Accent 3" w:semiHidden="0" w:uiPriority="70" w:unhideWhenUsed="0"/>
-    <w:lsdException w:name="Colorful Shading Accent 3" w:semiHidden="0" w:uiPriority="71" w:unhideWhenUsed="0"/>
-    <w:lsdException w:name="Colorful List Accent 3" w:semiHidden="0" w:uiPriority="72" w:unhideWhenUsed="0"/>
-    <w:lsdException w:name="Colorful Grid Accent 3" w:semiHidden="0" w:uiPriority="73" w:unhideWhenUsed="0"/>
-    <w:lsdException w:name="Light Shading Accent 4" w:semiHidden="0" w:uiPriority="60" w:unhideWhenUsed="0"/>
-    <w:lsdException w:name="Light List Accent 4" w:semiHidden="0" w:uiPriority="61" w:unhideWhenUsed="0"/>
-    <w:lsdException w:name="Light Grid Accent 4" w:semiHidden="0" w:uiPriority="62" w:unhideWhenUsed="0"/>
-    <w:lsdException w:name="Medium Shading 1 Accent 4" w:semiHidden="0" w:uiPriority="63" w:unhideWhenUsed="0"/>
-    <w:lsdException w:name="Medium Shading 2 Accent 4" w:semiHidden="0" w:uiPriority="64" w:unhideWhenUsed="0"/>
-    <w:lsdException w:name="Medium List 1 Accent 4" w:semiHidden="0" w:uiPriority="65" w:unhideWhenUsed="0"/>
-    <w:lsdException w:name="Medium List 2 Accent 4" w:semiHidden="0" w:uiPriority="66" w:unhideWhenUsed="0"/>
-    <w:lsdException w:name="Medium Grid 1 Accent 4" w:semiHidden="0" w:uiPriority="67" w:unhideWhenUsed="0"/>
-    <w:lsdException w:name="Medium Grid 2 Accent 4" w:semiHidden="0" w:uiPriority="68" w:unhideWhenUsed="0"/>
-    <w:lsdException w:name="Medium Grid 3 Accent 4" w:semiHidden="0" w:uiPriority="69" w:unhideWhenUsed="0"/>
-    <w:lsdException w:name="Dark List Accent 4" w:semiHidden="0" w:uiPriority="70" w:unhideWhenUsed="0"/>
-    <w:lsdException w:name="Colorful Shading Accent 4" w:semiHidden="0" w:uiPriority="71" w:unhideWhenUsed="0"/>
-    <w:lsdException w:name="Colorful List Accent 4" w:semiHidden="0" w:uiPriority="72" w:unhideWhenUsed="0"/>
-    <w:lsdException w:name="Colorful Grid Accent 4" w:semiHidden="0" w:uiPriority="73" w:unhideWhenUsed="0"/>
-    <w:lsdException w:name="Light Shading Accent 5" w:semiHidden="0" w:uiPriority="60" w:unhideWhenUsed="0"/>
-    <w:lsdException w:name="Light List Accent 5" w:semiHidden="0" w:uiPriority="61" w:unhideWhenUsed="0"/>
-    <w:lsdException w:name="Light Grid Accent 5" w:semiHidden="0" w:uiPriority="62" w:unhideWhenUsed="0"/>
-    <w:lsdException w:name="Medium Shading 1 Accent 5" w:semiHidden="0" w:uiPriority="63" w:unhideWhenUsed="0"/>
-    <w:lsdException w:name="Medium Shading 2 Accent 5" w:semiHidden="0" w:uiPriority="64" w:unhideWhenUsed="0"/>
-    <w:lsdException w:name="Medium List 1 Accent 5" w:semiHidden="0" w:uiPriority="65" w:unhideWhenUsed="0"/>
-    <w:lsdException w:name="Medium List 2 Accent 5" w:semiHidden="0" w:uiPriority="66" w:unhideWhenUsed="0"/>
-    <w:lsdException w:name="Medium Grid 1 Accent 5" w:semiHidden="0" w:uiPriority="67" w:unhideWhenUsed="0"/>
-    <w:lsdException w:name="Medium Grid 2 Accent 5" w:semiHidden="0" w:uiPriority="68" w:unhideWhenUsed="0"/>
-    <w:lsdException w:name="Medium Grid 3 Accent 5" w:semiHidden="0" w:uiPriority="69" w:unhideWhenUsed="0"/>
-    <w:lsdException w:name="Dark List Accent 5" w:semiHidden="0" w:uiPriority="70" w:unhideWhenUsed="0"/>
-    <w:lsdException w:name="Colorful Shading Accent 5" w:semiHidden="0" w:uiPriority="71" w:unhideWhenUsed="0"/>
-    <w:lsdException w:name="Colorful List Accent 5" w:semiHidden="0" w:uiPriority="72" w:unhideWhenUsed="0"/>
-    <w:lsdException w:name="Colorful Grid Accent 5" w:semiHidden="0" w:uiPriority="73" w:unhideWhenUsed="0"/>
-    <w:lsdException w:name="Light Shading Accent 6" w:semiHidden="0" w:uiPriority="60" w:unhideWhenUsed="0"/>
-    <w:lsdException w:name="Light List Accent 6" w:semiHidden="0" w:uiPriority="61" w:unhideWhenUsed="0"/>
-    <w:lsdException w:name="Light Grid Accent 6" w:semiHidden="0" w:uiPriority="62" w:unhideWhenUsed="0"/>
-    <w:lsdException w:name="Medium Shading 1 Accent 6" w:semiHidden="0" w:uiPriority="63" w:unhideWhenUsed="0"/>
-    <w:lsdException w:name="Medium Shading 2 Accent 6" w:semiHidden="0" w:uiPriority="64" w:unhideWhenUsed="0"/>
-    <w:lsdException w:name="Medium List 1 Accent 6" w:semiHidden="0" w:uiPriority="65" w:unhideWhenUsed="0"/>
-    <w:lsdException w:name="Medium List 2 Accent 6" w:semiHidden="0" w:uiPriority="66" w:unhideWhenUsed="0"/>
-    <w:lsdException w:name="Medium Grid 1 Accent 6" w:semiHidden="0" w:uiPriority="67" w:unhideWhenUsed="0"/>
-    <w:lsdException w:name="Medium Grid 2 Accent 6" w:semiHidden="0" w:uiPriority="68" w:unhideWhenUsed="0"/>
-    <w:lsdException w:name="Medium Grid 3 Accent 6" w:semiHidden="0" w:uiPriority="69" w:unhideWhenUsed="0"/>
-    <w:lsdException w:name="Dark List Accent 6" w:semiHidden="0" w:uiPriority="70" w:unhideWhenUsed="0"/>
-    <w:lsdException w:name="Colorful Shading Accent 6" w:semiHidden="0" w:uiPriority="71" w:unhideWhenUsed="0"/>
-    <w:lsdException w:name="Colorful List Accent 6" w:semiHidden="0" w:uiPriority="72" w:unhideWhenUsed="0"/>
-    <w:lsdException w:name="Colorful Grid Accent 6" w:semiHidden="0" w:uiPriority="73" w:unhideWhenUsed="0"/>
-    <w:lsdException w:name="Subtle Emphasis" w:semiHidden="0" w:uiPriority="19" w:unhideWhenUsed="0" w:qFormat="1"/>
-    <w:lsdException w:name="Intense Emphasis" w:semiHidden="0" w:uiPriority="21" w:unhideWhenUsed="0" w:qFormat="1"/>
-    <w:lsdException w:name="Subtle Reference" w:semiHidden="0" w:uiPriority="31" w:unhideWhenUsed="0" w:qFormat="1"/>
-    <w:lsdException w:name="Intense Reference" w:semiHidden="0" w:uiPriority="32" w:unhideWhenUsed="0" w:qFormat="1"/>
-    <w:lsdException w:name="Book Title" w:semiHidden="0" w:uiPriority="33" w:unhideWhenUsed="0" w:qFormat="1"/>
-    <w:lsdException w:name="Bibliography" w:uiPriority="37"/>
-    <w:lsdException w:name="TOC Heading" w:uiPriority="39" w:qFormat="1"/>
-  </w:latentStyles>
-  <w:style w:type="paragraph" w:default="1" w:styleId="Normal">
-    <w:name w:val="Normal"/>
-    <w:qFormat/>
-    <w:rsid w:val="008B35AD"/>
-  </w:style>
-  <w:style w:type="paragraph" w:styleId="Heading4">
-    <w:name w:val="heading 4"/>
-    <w:basedOn w:val="Normal"/>
-    <w:link w:val="Heading4Char"/>
-    <w:uiPriority w:val="9"/>
-    <w:qFormat/>
-    <w:rsid w:val="00FA180C"/>
-    <w:pPr>
-      <w:widowControl w:val="0"/>
-      <w:autoSpaceDE w:val="0"/>
-      <w:autoSpaceDN w:val="0"/>
-      <w:spacing w:after="0" w:line="240" w:lineRule="auto"/>
-      <w:ind w:left="1346"/>
-      <w:outlineLvl w:val="3"/>
-    </w:pPr>
-    <w:rPr>
-      <w:rFonts w:ascii="Verdana" w:eastAsia="Times New Roman" w:hAnsi="Verdana" w:cs="Verdana"/>
-      <w:b/>
-      <w:bCs/>
-      <w:sz w:val="18"/>
-      <w:szCs w:val="18"/>
-      <w:lang w:val="en-US"/>
-    </w:rPr>
-  </w:style>
-  <w:style w:type="character" w:default="1" w:styleId="DefaultParagraphFont">
-    <w:name w:val="Default Paragraph Font"/>
-    <w:uiPriority w:val="1"/>
-    <w:semiHidden/>
     <w:unhideWhenUsed/>
   </w:style>
   <w:style w:type="table" w:default="1" w:styleId="TableNormal">

</xml_diff>

<commit_message>
Corrected Claaroom and Tut Room Locations
</commit_message>
<xml_diff>
--- a/C6/C6 Documentation/ADA NBA C6 05 06 26  .docx
+++ b/C6/C6 Documentation/ADA NBA C6 05 06 26  .docx
@@ -929,7 +929,16 @@
                 <w:szCs w:val="24"/>
                 <w:lang w:eastAsia="en-IN" w:bidi="mr-IN"/>
               </w:rPr>
-              <w:t>Duel Bench (60+ nos.)</w:t>
+              <w:t>Dua</w:t>
+            </w:r>
+            <w:r>
+              <w:rPr>
+                <w:rFonts w:ascii="Times New Roman" w:eastAsia="Times New Roman" w:hAnsi="Times New Roman" w:cs="Times New Roman"/>
+                <w:sz w:val="24"/>
+                <w:szCs w:val="24"/>
+                <w:lang w:eastAsia="en-IN" w:bidi="mr-IN"/>
+              </w:rPr>
+              <w:t>l Bench (60+ nos.)</w:t>
             </w:r>
           </w:p>
         </w:tc>
@@ -1140,27 +1149,25 @@
                 <w:szCs w:val="24"/>
                 <w:lang w:eastAsia="en-IN" w:bidi="mr-IN"/>
               </w:rPr>
-              <w:t xml:space="preserve"> (Computer </w:t>
-            </w:r>
-            <w:proofErr w:type="spellStart"/>
-            <w:r>
-              <w:rPr>
-                <w:rFonts w:ascii="Times New Roman" w:eastAsia="Times New Roman" w:hAnsi="Times New Roman" w:cs="Times New Roman"/>
-                <w:sz w:val="24"/>
-                <w:szCs w:val="24"/>
-                <w:lang w:eastAsia="en-IN" w:bidi="mr-IN"/>
-              </w:rPr>
-              <w:t>Engg</w:t>
-            </w:r>
-            <w:proofErr w:type="spellEnd"/>
-            <w:r>
-              <w:rPr>
-                <w:rFonts w:ascii="Times New Roman" w:eastAsia="Times New Roman" w:hAnsi="Times New Roman" w:cs="Times New Roman"/>
-                <w:sz w:val="24"/>
-                <w:szCs w:val="24"/>
-                <w:lang w:eastAsia="en-IN" w:bidi="mr-IN"/>
-              </w:rPr>
-              <w:t xml:space="preserve">. Building ) </w:t>
+              <w:t xml:space="preserve"> (</w:t>
+            </w:r>
+            <w:r>
+              <w:rPr>
+                <w:rFonts w:ascii="Times New Roman" w:eastAsia="Times New Roman" w:hAnsi="Times New Roman" w:cs="Times New Roman"/>
+                <w:sz w:val="24"/>
+                <w:szCs w:val="24"/>
+                <w:lang w:eastAsia="en-IN" w:bidi="mr-IN"/>
+              </w:rPr>
+              <w:t>Main Building</w:t>
+            </w:r>
+            <w:r>
+              <w:rPr>
+                <w:rFonts w:ascii="Times New Roman" w:eastAsia="Times New Roman" w:hAnsi="Times New Roman" w:cs="Times New Roman"/>
+                <w:sz w:val="24"/>
+                <w:szCs w:val="24"/>
+                <w:lang w:eastAsia="en-IN" w:bidi="mr-IN"/>
+              </w:rPr>
+              <w:t xml:space="preserve">) </w:t>
             </w:r>
           </w:p>
         </w:tc>
@@ -1228,7 +1235,16 @@
                 <w:szCs w:val="24"/>
                 <w:lang w:eastAsia="en-IN" w:bidi="mr-IN"/>
               </w:rPr>
-              <w:t>Duel Bench (60+ nos.)</w:t>
+              <w:t>Dua</w:t>
+            </w:r>
+            <w:r>
+              <w:rPr>
+                <w:rFonts w:ascii="Times New Roman" w:eastAsia="Times New Roman" w:hAnsi="Times New Roman" w:cs="Times New Roman"/>
+                <w:sz w:val="24"/>
+                <w:szCs w:val="24"/>
+                <w:lang w:eastAsia="en-IN" w:bidi="mr-IN"/>
+              </w:rPr>
+              <w:t>l Bench (60+ nos.)</w:t>
             </w:r>
           </w:p>
         </w:tc>
@@ -1500,7 +1516,16 @@
                 <w:szCs w:val="24"/>
                 <w:lang w:eastAsia="en-IN" w:bidi="mr-IN"/>
               </w:rPr>
-              <w:t>Duel Bench (60+ nos.)</w:t>
+              <w:t>Dua</w:t>
+            </w:r>
+            <w:r>
+              <w:rPr>
+                <w:rFonts w:ascii="Times New Roman" w:eastAsia="Times New Roman" w:hAnsi="Times New Roman" w:cs="Times New Roman"/>
+                <w:sz w:val="24"/>
+                <w:szCs w:val="24"/>
+                <w:lang w:eastAsia="en-IN" w:bidi="mr-IN"/>
+              </w:rPr>
+              <w:t>l Bench (60+ nos.)</w:t>
             </w:r>
           </w:p>
         </w:tc>
@@ -1958,7 +1983,45 @@
                 <w:szCs w:val="24"/>
                 <w:lang w:eastAsia="en-IN" w:bidi="mr-IN"/>
               </w:rPr>
-              <w:t>Tutorial Room ( Main Building )</w:t>
+              <w:t>Tutorial Room (</w:t>
+            </w:r>
+            <w:r>
+              <w:rPr>
+                <w:rFonts w:ascii="Times New Roman" w:eastAsia="Times New Roman" w:hAnsi="Times New Roman" w:cs="Times New Roman"/>
+                <w:sz w:val="24"/>
+                <w:szCs w:val="24"/>
+                <w:lang w:eastAsia="en-IN" w:bidi="mr-IN"/>
+              </w:rPr>
+              <w:t xml:space="preserve">Computer </w:t>
+            </w:r>
+            <w:proofErr w:type="spellStart"/>
+            <w:r>
+              <w:rPr>
+                <w:rFonts w:ascii="Times New Roman" w:eastAsia="Times New Roman" w:hAnsi="Times New Roman" w:cs="Times New Roman"/>
+                <w:sz w:val="24"/>
+                <w:szCs w:val="24"/>
+                <w:lang w:eastAsia="en-IN" w:bidi="mr-IN"/>
+              </w:rPr>
+              <w:t>Engg</w:t>
+            </w:r>
+            <w:proofErr w:type="spellEnd"/>
+            <w:r>
+              <w:rPr>
+                <w:rFonts w:ascii="Times New Roman" w:eastAsia="Times New Roman" w:hAnsi="Times New Roman" w:cs="Times New Roman"/>
+                <w:sz w:val="24"/>
+                <w:szCs w:val="24"/>
+                <w:lang w:eastAsia="en-IN" w:bidi="mr-IN"/>
+              </w:rPr>
+              <w:t>. Building</w:t>
+            </w:r>
+            <w:r>
+              <w:rPr>
+                <w:rFonts w:ascii="Times New Roman" w:eastAsia="Times New Roman" w:hAnsi="Times New Roman" w:cs="Times New Roman"/>
+                <w:sz w:val="24"/>
+                <w:szCs w:val="24"/>
+                <w:lang w:eastAsia="en-IN" w:bidi="mr-IN"/>
+              </w:rPr>
+              <w:t>)</w:t>
             </w:r>
           </w:p>
         </w:tc>
@@ -2024,7 +2087,18 @@
                 <w:szCs w:val="24"/>
                 <w:lang w:eastAsia="en-IN" w:bidi="mr-IN"/>
               </w:rPr>
-              <w:t>Duel Bench (15+ nos.)</w:t>
+              <w:t>Dua</w:t>
+            </w:r>
+            <w:bookmarkStart w:id="0" w:name="_GoBack"/>
+            <w:bookmarkEnd w:id="0"/>
+            <w:r>
+              <w:rPr>
+                <w:rFonts w:ascii="Times New Roman" w:eastAsia="Times New Roman" w:hAnsi="Times New Roman" w:cs="Times New Roman"/>
+                <w:sz w:val="24"/>
+                <w:szCs w:val="24"/>
+                <w:lang w:eastAsia="en-IN" w:bidi="mr-IN"/>
+              </w:rPr>
+              <w:t>l Bench (15+ nos.)</w:t>
             </w:r>
           </w:p>
         </w:tc>
@@ -12360,37 +12434,7 @@
           <w:sz w:val="24"/>
           <w:szCs w:val="24"/>
         </w:rPr>
-        <w:t>Table 6.2.</w:t>
-      </w:r>
-      <w:r>
-        <w:rPr>
-          <w:rFonts w:ascii="Times New Roman,Bold" w:hAnsi="Times New Roman,Bold" w:cs="Times New Roman,Bold"/>
-          <w:b/>
-          <w:bCs/>
-          <w:sz w:val="24"/>
-          <w:szCs w:val="24"/>
-        </w:rPr>
-        <w:t>3</w:t>
-      </w:r>
-      <w:r>
-        <w:rPr>
-          <w:rFonts w:ascii="Times New Roman,Bold" w:hAnsi="Times New Roman,Bold" w:cs="Times New Roman,Bold"/>
-          <w:b/>
-          <w:bCs/>
-          <w:sz w:val="24"/>
-          <w:szCs w:val="24"/>
-        </w:rPr>
-        <w:t xml:space="preserve"> </w:t>
-      </w:r>
-      <w:r>
-        <w:rPr>
-          <w:rFonts w:ascii="Times New Roman,Bold" w:hAnsi="Times New Roman,Bold" w:cs="Times New Roman,Bold"/>
-          <w:b/>
-          <w:bCs/>
-          <w:sz w:val="24"/>
-          <w:szCs w:val="24"/>
-        </w:rPr>
-        <w:t>Details of Technical Manpower Support</w:t>
+        <w:t>Table 6.2.3 Details of Technical Manpower Support</w:t>
       </w:r>
     </w:p>
     <w:p>
@@ -13041,18 +13085,7 @@
                 <w:szCs w:val="24"/>
                 <w:lang w:eastAsia="en-IN" w:bidi="mr-IN"/>
               </w:rPr>
-              <w:t xml:space="preserve">Used for MSBTE Examination as well as Baseline Test conducted by MSBTE each </w:t>
-            </w:r>
-            <w:r>
-              <w:rPr>
-                <w:rFonts w:ascii="Times New Roman" w:eastAsia="Times New Roman" w:hAnsi="Times New Roman" w:cs="Times New Roman"/>
-                <w:color w:val="1F1F1F"/>
-                <w:sz w:val="24"/>
-                <w:szCs w:val="24"/>
-                <w:lang w:eastAsia="en-IN" w:bidi="mr-IN"/>
-              </w:rPr>
-              <w:lastRenderedPageBreak/>
-              <w:t>semester.</w:t>
+              <w:t>Used for MSBTE Examination as well as Baseline Test conducted by MSBTE each semester.</w:t>
             </w:r>
           </w:p>
         </w:tc>
@@ -13089,7 +13122,6 @@
                 <w:szCs w:val="24"/>
                 <w:lang w:eastAsia="en-IN" w:bidi="mr-IN"/>
               </w:rPr>
-              <w:lastRenderedPageBreak/>
               <w:t xml:space="preserve">Facility is utilized by </w:t>
             </w:r>
             <w:r>
@@ -13169,7 +13201,7 @@
                 <w:szCs w:val="24"/>
                 <w:lang w:eastAsia="en-IN" w:bidi="mr-IN"/>
               </w:rPr>
-              <w:t xml:space="preserve">This facility is maintained well and hence it helps students to boost their handling of computer/digital devices as well as confidence </w:t>
+              <w:t xml:space="preserve">This facility is maintained well and hence it helps students to boost their handling of computer/digital devices as well as confidence level in </w:t>
             </w:r>
             <w:r>
               <w:rPr>
@@ -13180,7 +13212,7 @@
                 <w:lang w:eastAsia="en-IN" w:bidi="mr-IN"/>
               </w:rPr>
               <w:lastRenderedPageBreak/>
-              <w:t>level in examination</w:t>
+              <w:t>examination</w:t>
             </w:r>
           </w:p>
         </w:tc>
@@ -16495,27 +16527,7 @@
           <w:sz w:val="24"/>
           <w:szCs w:val="24"/>
         </w:rPr>
-        <w:t>Table 6.3.1</w:t>
-      </w:r>
-      <w:r>
-        <w:rPr>
-          <w:rFonts w:ascii="Times New Roman,Bold" w:hAnsi="Times New Roman,Bold" w:cs="Times New Roman,Bold"/>
-          <w:b/>
-          <w:bCs/>
-          <w:sz w:val="24"/>
-          <w:szCs w:val="24"/>
-        </w:rPr>
-        <w:t xml:space="preserve"> </w:t>
-      </w:r>
-      <w:r>
-        <w:rPr>
-          <w:rFonts w:ascii="Times New Roman,Bold" w:hAnsi="Times New Roman,Bold" w:cs="Times New Roman,Bold"/>
-          <w:b/>
-          <w:bCs/>
-          <w:sz w:val="24"/>
-          <w:szCs w:val="24"/>
-        </w:rPr>
-        <w:t xml:space="preserve">Details of available </w:t>
+        <w:t xml:space="preserve">Table 6.3.1 Details of available </w:t>
       </w:r>
       <w:r>
         <w:rPr>
@@ -16593,8 +16605,6 @@
           <w:szCs w:val="24"/>
         </w:rPr>
       </w:pPr>
-      <w:bookmarkStart w:id="0" w:name="_GoBack"/>
-      <w:bookmarkEnd w:id="0"/>
     </w:p>
     <w:p>
       <w:pPr>
@@ -19562,7 +19572,7 @@
           <w:rPr>
             <w:noProof/>
           </w:rPr>
-          <w:t>12</w:t>
+          <w:t>1</w:t>
         </w:r>
         <w:r>
           <w:rPr>
@@ -23293,7 +23303,7 @@
 </file>
 
 <file path=customXml/itemProps1.xml><?xml version="1.0" encoding="utf-8"?>
-<ds:datastoreItem xmlns:ds="http://schemas.openxmlformats.org/officeDocument/2006/customXml" ds:itemID="{9EF364EA-2E25-4258-909C-5787116FABAA}">
+<ds:datastoreItem xmlns:ds="http://schemas.openxmlformats.org/officeDocument/2006/customXml" ds:itemID="{42441823-46A6-4210-80BA-FBF98900F414}">
   <ds:schemaRefs>
     <ds:schemaRef ds:uri="http://schemas.openxmlformats.org/officeDocument/2006/bibliography"/>
   </ds:schemaRefs>

</xml_diff>

<commit_message>
Added Areas in Classrooms Tut drawing hall
</commit_message>
<xml_diff>
--- a/C6/C6 Documentation/ADA NBA C6 05 06 26  .docx
+++ b/C6/C6 Documentation/ADA NBA C6 05 06 26  .docx
@@ -1,6 +1,6 @@
 
 <file path=word/document.xml><?xml version="1.0" encoding="utf-8"?>
-<w:document xmlns:wpc="http://schemas.microsoft.com/office/word/2010/wordprocessingCanvas" xmlns:mc="http://schemas.openxmlformats.org/markup-compatibility/2006" xmlns:o="urn:schemas-microsoft-com:office:office" xmlns:r="http://schemas.openxmlformats.org/officeDocument/2006/relationships" xmlns:m="http://schemas.openxmlformats.org/officeDocument/2006/math" xmlns:v="urn:schemas-microsoft-com:vml" xmlns:wp14="http://schemas.microsoft.com/office/word/2010/wordprocessingDrawing" xmlns:wp="http://schemas.openxmlformats.org/drawingml/2006/wordprocessingDrawing" xmlns:w10="urn:schemas-microsoft-com:office:word" xmlns:w="http://schemas.openxmlformats.org/wordprocessingml/2006/main" xmlns:w14="http://schemas.microsoft.com/office/word/2010/wordml" xmlns:wpg="http://schemas.microsoft.com/office/word/2010/wordprocessingGroup" xmlns:wpi="http://schemas.microsoft.com/office/word/2010/wordprocessingInk" xmlns:wne="http://schemas.microsoft.com/office/word/2006/wordml" xmlns:wps="http://schemas.microsoft.com/office/word/2010/wordprocessingShape" mc:Ignorable="w14 wp14">
+<w:document xmlns:wpc="http://schemas.microsoft.com/office/word/2010/wordprocessingCanvas" xmlns:cx="http://schemas.microsoft.com/office/drawing/2014/chartex" xmlns:cx1="http://schemas.microsoft.com/office/drawing/2015/9/8/chartex" xmlns:cx2="http://schemas.microsoft.com/office/drawing/2015/10/21/chartex" xmlns:cx3="http://schemas.microsoft.com/office/drawing/2016/5/9/chartex" xmlns:cx4="http://schemas.microsoft.com/office/drawing/2016/5/10/chartex" xmlns:cx5="http://schemas.microsoft.com/office/drawing/2016/5/11/chartex" xmlns:cx6="http://schemas.microsoft.com/office/drawing/2016/5/12/chartex" xmlns:cx7="http://schemas.microsoft.com/office/drawing/2016/5/13/chartex" xmlns:cx8="http://schemas.microsoft.com/office/drawing/2016/5/14/chartex" xmlns:mc="http://schemas.openxmlformats.org/markup-compatibility/2006" xmlns:aink="http://schemas.microsoft.com/office/drawing/2016/ink" xmlns:am3d="http://schemas.microsoft.com/office/drawing/2017/model3d" xmlns:o="urn:schemas-microsoft-com:office:office" xmlns:oel="http://schemas.microsoft.com/office/2019/extlst" xmlns:r="http://schemas.openxmlformats.org/officeDocument/2006/relationships" xmlns:m="http://schemas.openxmlformats.org/officeDocument/2006/math" xmlns:v="urn:schemas-microsoft-com:vml" xmlns:wp14="http://schemas.microsoft.com/office/word/2010/wordprocessingDrawing" xmlns:wp="http://schemas.openxmlformats.org/drawingml/2006/wordprocessingDrawing" xmlns:w10="urn:schemas-microsoft-com:office:word" xmlns:w="http://schemas.openxmlformats.org/wordprocessingml/2006/main" xmlns:w14="http://schemas.microsoft.com/office/word/2010/wordml" xmlns:w15="http://schemas.microsoft.com/office/word/2012/wordml" xmlns:w16cex="http://schemas.microsoft.com/office/word/2018/wordml/cex" xmlns:w16cid="http://schemas.microsoft.com/office/word/2016/wordml/cid" xmlns:w16="http://schemas.microsoft.com/office/word/2018/wordml" xmlns:w16du="http://schemas.microsoft.com/office/word/2023/wordml/word16du" xmlns:w16sdtdh="http://schemas.microsoft.com/office/word/2020/wordml/sdtdatahash" xmlns:w16se="http://schemas.microsoft.com/office/word/2015/wordml/symex" xmlns:wpg="http://schemas.microsoft.com/office/word/2010/wordprocessingGroup" xmlns:wpi="http://schemas.microsoft.com/office/word/2010/wordprocessingInk" xmlns:wne="http://schemas.microsoft.com/office/word/2006/wordml" xmlns:wps="http://schemas.microsoft.com/office/word/2010/wordprocessingShape" mc:Ignorable="w14 w15 w16se w16cid w16 w16cex w16sdtdh w16du wp14">
   <w:body>
     <w:tbl>
       <w:tblPr>
@@ -351,8 +351,8 @@
         <w:gridCol w:w="857"/>
         <w:gridCol w:w="2339"/>
         <w:gridCol w:w="1185"/>
-        <w:gridCol w:w="787"/>
-        <w:gridCol w:w="1629"/>
+        <w:gridCol w:w="1054"/>
+        <w:gridCol w:w="1362"/>
       </w:tblGrid>
       <w:tr>
         <w:trPr>
@@ -649,7 +649,7 @@
         </w:tc>
         <w:tc>
           <w:tcPr>
-            <w:tcW w:w="418" w:type="pct"/>
+            <w:tcW w:w="560" w:type="pct"/>
             <w:tcBorders>
               <w:top w:val="single" w:sz="8" w:space="0" w:color="auto"/>
               <w:left w:val="nil"/>
@@ -690,7 +690,7 @@
         </w:tc>
         <w:tc>
           <w:tcPr>
-            <w:tcW w:w="866" w:type="pct"/>
+            <w:tcW w:w="724" w:type="pct"/>
             <w:tcBorders>
               <w:top w:val="single" w:sz="8" w:space="0" w:color="auto"/>
               <w:left w:val="nil"/>
@@ -938,7 +938,25 @@
                 <w:szCs w:val="24"/>
                 <w:lang w:eastAsia="en-IN" w:bidi="mr-IN"/>
               </w:rPr>
-              <w:t>l Bench (60+ nos.)</w:t>
+              <w:t>l Bench (</w:t>
+            </w:r>
+            <w:r>
+              <w:rPr>
+                <w:rFonts w:ascii="Times New Roman" w:eastAsia="Times New Roman" w:hAnsi="Times New Roman" w:cs="Times New Roman"/>
+                <w:sz w:val="24"/>
+                <w:szCs w:val="24"/>
+                <w:lang w:eastAsia="en-IN" w:bidi="mr-IN"/>
+              </w:rPr>
+              <w:t>70</w:t>
+            </w:r>
+            <w:r>
+              <w:rPr>
+                <w:rFonts w:ascii="Times New Roman" w:eastAsia="Times New Roman" w:hAnsi="Times New Roman" w:cs="Times New Roman"/>
+                <w:sz w:val="24"/>
+                <w:szCs w:val="24"/>
+                <w:lang w:eastAsia="en-IN" w:bidi="mr-IN"/>
+              </w:rPr>
+              <w:t xml:space="preserve"> nos.)</w:t>
             </w:r>
           </w:p>
         </w:tc>
@@ -978,7 +996,7 @@
         </w:tc>
         <w:tc>
           <w:tcPr>
-            <w:tcW w:w="418" w:type="pct"/>
+            <w:tcW w:w="560" w:type="pct"/>
             <w:tcBorders>
               <w:top w:val="single" w:sz="4" w:space="0" w:color="auto"/>
               <w:left w:val="nil"/>
@@ -999,11 +1017,20 @@
                 <w:lang w:eastAsia="en-IN" w:bidi="mr-IN"/>
               </w:rPr>
             </w:pPr>
-          </w:p>
-        </w:tc>
-        <w:tc>
-          <w:tcPr>
-            <w:tcW w:w="866" w:type="pct"/>
+            <w:r>
+              <w:rPr>
+                <w:rFonts w:ascii="Times New Roman" w:eastAsia="Times New Roman" w:hAnsi="Times New Roman" w:cs="Times New Roman"/>
+                <w:sz w:val="24"/>
+                <w:szCs w:val="24"/>
+                <w:lang w:eastAsia="en-IN" w:bidi="mr-IN"/>
+              </w:rPr>
+              <w:t>96</w:t>
+            </w:r>
+          </w:p>
+        </w:tc>
+        <w:tc>
+          <w:tcPr>
+            <w:tcW w:w="724" w:type="pct"/>
             <w:tcBorders>
               <w:top w:val="single" w:sz="4" w:space="0" w:color="auto"/>
               <w:left w:val="nil"/>
@@ -1244,7 +1271,25 @@
                 <w:szCs w:val="24"/>
                 <w:lang w:eastAsia="en-IN" w:bidi="mr-IN"/>
               </w:rPr>
-              <w:t>l Bench (60+ nos.)</w:t>
+              <w:t>l Bench (</w:t>
+            </w:r>
+            <w:r>
+              <w:rPr>
+                <w:rFonts w:ascii="Times New Roman" w:eastAsia="Times New Roman" w:hAnsi="Times New Roman" w:cs="Times New Roman"/>
+                <w:sz w:val="24"/>
+                <w:szCs w:val="24"/>
+                <w:lang w:eastAsia="en-IN" w:bidi="mr-IN"/>
+              </w:rPr>
+              <w:t xml:space="preserve">80 </w:t>
+            </w:r>
+            <w:r>
+              <w:rPr>
+                <w:rFonts w:ascii="Times New Roman" w:eastAsia="Times New Roman" w:hAnsi="Times New Roman" w:cs="Times New Roman"/>
+                <w:sz w:val="24"/>
+                <w:szCs w:val="24"/>
+                <w:lang w:eastAsia="en-IN" w:bidi="mr-IN"/>
+              </w:rPr>
+              <w:t>nos.)</w:t>
             </w:r>
           </w:p>
         </w:tc>
@@ -1284,7 +1329,7 @@
         </w:tc>
         <w:tc>
           <w:tcPr>
-            <w:tcW w:w="418" w:type="pct"/>
+            <w:tcW w:w="560" w:type="pct"/>
             <w:tcBorders>
               <w:top w:val="nil"/>
               <w:left w:val="nil"/>
@@ -1305,11 +1350,20 @@
                 <w:lang w:eastAsia="en-IN" w:bidi="mr-IN"/>
               </w:rPr>
             </w:pPr>
-          </w:p>
-        </w:tc>
-        <w:tc>
-          <w:tcPr>
-            <w:tcW w:w="866" w:type="pct"/>
+            <w:r>
+              <w:rPr>
+                <w:rFonts w:ascii="Times New Roman" w:eastAsia="Times New Roman" w:hAnsi="Times New Roman" w:cs="Times New Roman"/>
+                <w:sz w:val="24"/>
+                <w:szCs w:val="24"/>
+                <w:lang w:eastAsia="en-IN" w:bidi="mr-IN"/>
+              </w:rPr>
+              <w:t>120</w:t>
+            </w:r>
+          </w:p>
+        </w:tc>
+        <w:tc>
+          <w:tcPr>
+            <w:tcW w:w="724" w:type="pct"/>
             <w:tcBorders>
               <w:top w:val="nil"/>
               <w:left w:val="nil"/>
@@ -1525,7 +1579,25 @@
                 <w:szCs w:val="24"/>
                 <w:lang w:eastAsia="en-IN" w:bidi="mr-IN"/>
               </w:rPr>
-              <w:t>l Bench (60+ nos.)</w:t>
+              <w:t>l Bench (6</w:t>
+            </w:r>
+            <w:r>
+              <w:rPr>
+                <w:rFonts w:ascii="Times New Roman" w:eastAsia="Times New Roman" w:hAnsi="Times New Roman" w:cs="Times New Roman"/>
+                <w:sz w:val="24"/>
+                <w:szCs w:val="24"/>
+                <w:lang w:eastAsia="en-IN" w:bidi="mr-IN"/>
+              </w:rPr>
+              <w:t>5</w:t>
+            </w:r>
+            <w:r>
+              <w:rPr>
+                <w:rFonts w:ascii="Times New Roman" w:eastAsia="Times New Roman" w:hAnsi="Times New Roman" w:cs="Times New Roman"/>
+                <w:sz w:val="24"/>
+                <w:szCs w:val="24"/>
+                <w:lang w:eastAsia="en-IN" w:bidi="mr-IN"/>
+              </w:rPr>
+              <w:t xml:space="preserve"> nos.)</w:t>
             </w:r>
           </w:p>
         </w:tc>
@@ -1565,7 +1637,7 @@
         </w:tc>
         <w:tc>
           <w:tcPr>
-            <w:tcW w:w="418" w:type="pct"/>
+            <w:tcW w:w="560" w:type="pct"/>
             <w:tcBorders>
               <w:top w:val="nil"/>
               <w:left w:val="nil"/>
@@ -1586,11 +1658,20 @@
                 <w:lang w:eastAsia="en-IN" w:bidi="mr-IN"/>
               </w:rPr>
             </w:pPr>
-          </w:p>
-        </w:tc>
-        <w:tc>
-          <w:tcPr>
-            <w:tcW w:w="866" w:type="pct"/>
+            <w:r>
+              <w:rPr>
+                <w:rFonts w:ascii="Times New Roman" w:eastAsia="Times New Roman" w:hAnsi="Times New Roman" w:cs="Times New Roman"/>
+                <w:sz w:val="24"/>
+                <w:szCs w:val="24"/>
+                <w:lang w:eastAsia="en-IN" w:bidi="mr-IN"/>
+              </w:rPr>
+              <w:t>53</w:t>
+            </w:r>
+          </w:p>
+        </w:tc>
+        <w:tc>
+          <w:tcPr>
+            <w:tcW w:w="724" w:type="pct"/>
             <w:tcBorders>
               <w:top w:val="nil"/>
               <w:left w:val="nil"/>
@@ -1802,16 +1883,25 @@
                 <w:szCs w:val="24"/>
                 <w:lang w:eastAsia="en-IN" w:bidi="mr-IN"/>
               </w:rPr>
-              <w:t>70</w:t>
-            </w:r>
-            <w:r>
-              <w:rPr>
-                <w:rFonts w:ascii="Times New Roman" w:eastAsia="Times New Roman" w:hAnsi="Times New Roman" w:cs="Times New Roman"/>
-                <w:sz w:val="24"/>
-                <w:szCs w:val="24"/>
-                <w:lang w:eastAsia="en-IN" w:bidi="mr-IN"/>
-              </w:rPr>
-              <w:t>+ nos.)</w:t>
+              <w:t>7</w:t>
+            </w:r>
+            <w:r>
+              <w:rPr>
+                <w:rFonts w:ascii="Times New Roman" w:eastAsia="Times New Roman" w:hAnsi="Times New Roman" w:cs="Times New Roman"/>
+                <w:sz w:val="24"/>
+                <w:szCs w:val="24"/>
+                <w:lang w:eastAsia="en-IN" w:bidi="mr-IN"/>
+              </w:rPr>
+              <w:t>5</w:t>
+            </w:r>
+            <w:r>
+              <w:rPr>
+                <w:rFonts w:ascii="Times New Roman" w:eastAsia="Times New Roman" w:hAnsi="Times New Roman" w:cs="Times New Roman"/>
+                <w:sz w:val="24"/>
+                <w:szCs w:val="24"/>
+                <w:lang w:eastAsia="en-IN" w:bidi="mr-IN"/>
+              </w:rPr>
+              <w:t xml:space="preserve"> nos.)</w:t>
             </w:r>
           </w:p>
         </w:tc>
@@ -1850,7 +1940,7 @@
         </w:tc>
         <w:tc>
           <w:tcPr>
-            <w:tcW w:w="418" w:type="pct"/>
+            <w:tcW w:w="560" w:type="pct"/>
             <w:tcBorders>
               <w:top w:val="nil"/>
               <w:left w:val="nil"/>
@@ -1870,11 +1960,20 @@
                 <w:lang w:eastAsia="en-IN" w:bidi="mr-IN"/>
               </w:rPr>
             </w:pPr>
-          </w:p>
-        </w:tc>
-        <w:tc>
-          <w:tcPr>
-            <w:tcW w:w="866" w:type="pct"/>
+            <w:r>
+              <w:rPr>
+                <w:rFonts w:ascii="Times New Roman" w:eastAsia="Times New Roman" w:hAnsi="Times New Roman" w:cs="Times New Roman"/>
+                <w:sz w:val="24"/>
+                <w:szCs w:val="24"/>
+                <w:lang w:eastAsia="en-IN" w:bidi="mr-IN"/>
+              </w:rPr>
+              <w:t>208</w:t>
+            </w:r>
+          </w:p>
+        </w:tc>
+        <w:tc>
+          <w:tcPr>
+            <w:tcW w:w="724" w:type="pct"/>
             <w:tcBorders>
               <w:top w:val="nil"/>
               <w:left w:val="nil"/>
@@ -2089,16 +2188,32 @@
               </w:rPr>
               <w:t>Dua</w:t>
             </w:r>
-            <w:bookmarkStart w:id="0" w:name="_GoBack"/>
-            <w:bookmarkEnd w:id="0"/>
-            <w:r>
-              <w:rPr>
-                <w:rFonts w:ascii="Times New Roman" w:eastAsia="Times New Roman" w:hAnsi="Times New Roman" w:cs="Times New Roman"/>
-                <w:sz w:val="24"/>
-                <w:szCs w:val="24"/>
-                <w:lang w:eastAsia="en-IN" w:bidi="mr-IN"/>
-              </w:rPr>
-              <w:t>l Bench (15+ nos.)</w:t>
+            <w:r>
+              <w:rPr>
+                <w:rFonts w:ascii="Times New Roman" w:eastAsia="Times New Roman" w:hAnsi="Times New Roman" w:cs="Times New Roman"/>
+                <w:sz w:val="24"/>
+                <w:szCs w:val="24"/>
+                <w:lang w:eastAsia="en-IN" w:bidi="mr-IN"/>
+              </w:rPr>
+              <w:t>l Bench (</w:t>
+            </w:r>
+            <w:r>
+              <w:rPr>
+                <w:rFonts w:ascii="Times New Roman" w:eastAsia="Times New Roman" w:hAnsi="Times New Roman" w:cs="Times New Roman"/>
+                <w:sz w:val="24"/>
+                <w:szCs w:val="24"/>
+                <w:lang w:eastAsia="en-IN" w:bidi="mr-IN"/>
+              </w:rPr>
+              <w:t>35</w:t>
+            </w:r>
+            <w:r>
+              <w:rPr>
+                <w:rFonts w:ascii="Times New Roman" w:eastAsia="Times New Roman" w:hAnsi="Times New Roman" w:cs="Times New Roman"/>
+                <w:sz w:val="24"/>
+                <w:szCs w:val="24"/>
+                <w:lang w:eastAsia="en-IN" w:bidi="mr-IN"/>
+              </w:rPr>
+              <w:t xml:space="preserve"> nos.)</w:t>
             </w:r>
           </w:p>
         </w:tc>
@@ -2137,7 +2252,7 @@
         </w:tc>
         <w:tc>
           <w:tcPr>
-            <w:tcW w:w="418" w:type="pct"/>
+            <w:tcW w:w="560" w:type="pct"/>
             <w:tcBorders>
               <w:top w:val="single" w:sz="4" w:space="0" w:color="auto"/>
               <w:left w:val="nil"/>
@@ -2157,11 +2272,20 @@
                 <w:lang w:eastAsia="en-IN" w:bidi="mr-IN"/>
               </w:rPr>
             </w:pPr>
-          </w:p>
-        </w:tc>
-        <w:tc>
-          <w:tcPr>
-            <w:tcW w:w="866" w:type="pct"/>
+            <w:r>
+              <w:rPr>
+                <w:rFonts w:ascii="Times New Roman" w:eastAsia="Times New Roman" w:hAnsi="Times New Roman" w:cs="Times New Roman"/>
+                <w:sz w:val="24"/>
+                <w:szCs w:val="24"/>
+                <w:lang w:eastAsia="en-IN" w:bidi="mr-IN"/>
+              </w:rPr>
+              <w:t>47</w:t>
+            </w:r>
+          </w:p>
+        </w:tc>
+        <w:tc>
+          <w:tcPr>
+            <w:tcW w:w="724" w:type="pct"/>
             <w:tcBorders>
               <w:top w:val="single" w:sz="4" w:space="0" w:color="auto"/>
               <w:left w:val="nil"/>
@@ -2220,7 +2344,29 @@
           <w:szCs w:val="24"/>
           <w:lang w:val="en-US"/>
         </w:rPr>
-        <w:t>Table No. 6.1.1 Details of class rooms facilities available</w:t>
+        <w:t xml:space="preserve">Table No. 6.1.1 Details of </w:t>
+      </w:r>
+      <w:r>
+        <w:rPr>
+          <w:rFonts w:ascii="Times New Roman" w:eastAsia="Times New Roman" w:hAnsi="Times New Roman" w:cs="Times New Roman"/>
+          <w:b/>
+          <w:bCs/>
+          <w:sz w:val="24"/>
+          <w:szCs w:val="24"/>
+          <w:lang w:val="en-US"/>
+        </w:rPr>
+        <w:t>classrooms</w:t>
+      </w:r>
+      <w:r>
+        <w:rPr>
+          <w:rFonts w:ascii="Times New Roman" w:eastAsia="Times New Roman" w:hAnsi="Times New Roman" w:cs="Times New Roman"/>
+          <w:b/>
+          <w:bCs/>
+          <w:sz w:val="24"/>
+          <w:szCs w:val="24"/>
+          <w:lang w:val="en-US"/>
+        </w:rPr>
+        <w:t xml:space="preserve"> facilities available</w:t>
       </w:r>
     </w:p>
     <w:p>
@@ -4923,7 +5069,6 @@
                 <w:sz w:val="24"/>
                 <w:szCs w:val="24"/>
               </w:rPr>
-              <w:lastRenderedPageBreak/>
               <w:t>10</w:t>
             </w:r>
           </w:p>
@@ -6124,47 +6269,7 @@
           <w:szCs w:val="24"/>
           <w:lang w:eastAsia="en-IN" w:bidi="mr-IN"/>
         </w:rPr>
-        <w:t xml:space="preserve">Routine maintenance is conducted by laboratory assistants Mr. Raju R. </w:t>
-      </w:r>
-      <w:proofErr w:type="spellStart"/>
-      <w:r>
-        <w:rPr>
-          <w:rFonts w:ascii="Times New Roman" w:hAnsi="Times New Roman" w:cs="Times New Roman"/>
-          <w:sz w:val="24"/>
-          <w:szCs w:val="24"/>
-          <w:lang w:eastAsia="en-IN" w:bidi="mr-IN"/>
-        </w:rPr>
-        <w:t>Jadhav</w:t>
-      </w:r>
-      <w:proofErr w:type="spellEnd"/>
-      <w:r>
-        <w:rPr>
-          <w:rFonts w:ascii="Times New Roman" w:hAnsi="Times New Roman" w:cs="Times New Roman"/>
-          <w:sz w:val="24"/>
-          <w:szCs w:val="24"/>
-          <w:lang w:eastAsia="en-IN" w:bidi="mr-IN"/>
-        </w:rPr>
-        <w:t xml:space="preserve"> and Mr. </w:t>
-      </w:r>
-      <w:proofErr w:type="spellStart"/>
-      <w:r>
-        <w:rPr>
-          <w:rFonts w:ascii="Times New Roman" w:hAnsi="Times New Roman" w:cs="Times New Roman"/>
-          <w:sz w:val="24"/>
-          <w:szCs w:val="24"/>
-          <w:lang w:eastAsia="en-IN" w:bidi="mr-IN"/>
-        </w:rPr>
-        <w:t>Suhas</w:t>
-      </w:r>
-      <w:proofErr w:type="spellEnd"/>
-      <w:r>
-        <w:rPr>
-          <w:rFonts w:ascii="Times New Roman" w:hAnsi="Times New Roman" w:cs="Times New Roman"/>
-          <w:sz w:val="24"/>
-          <w:szCs w:val="24"/>
-          <w:lang w:eastAsia="en-IN" w:bidi="mr-IN"/>
-        </w:rPr>
-        <w:t xml:space="preserve"> S. Gund. All service activities are meticulously documented in the official maintenance register to ensure comprehensive record-keeping</w:t>
+        <w:t>Routine maintenance is conducted by laboratory assistants Mr. Raju R. Jadhav and Mr. Suhas S. Gund. All service activities are meticulously documented in the official maintenance register to ensure comprehensive record-keeping</w:t>
       </w:r>
       <w:r>
         <w:rPr>
@@ -6387,7 +6492,7 @@
                           <pic:cNvPicPr/>
                         </pic:nvPicPr>
                         <pic:blipFill>
-                          <a:blip r:embed="rId9" cstate="print">
+                          <a:blip r:embed="rId8" cstate="print">
                             <a:extLst>
                               <a:ext uri="{28A0092B-C50C-407E-A947-70E740481C1C}">
                                 <a14:useLocalDpi xmlns:a14="http://schemas.microsoft.com/office/drawing/2010/main" val="0"/>
@@ -6455,7 +6560,7 @@
                           <pic:cNvPicPr/>
                         </pic:nvPicPr>
                         <pic:blipFill>
-                          <a:blip r:embed="rId10" cstate="print">
+                          <a:blip r:embed="rId9" cstate="print">
                             <a:extLst>
                               <a:ext uri="{28A0092B-C50C-407E-A947-70E740481C1C}">
                                 <a14:useLocalDpi xmlns:a14="http://schemas.microsoft.com/office/drawing/2010/main" val="0"/>
@@ -6887,7 +6992,7 @@
                           <pic:cNvPicPr/>
                         </pic:nvPicPr>
                         <pic:blipFill>
-                          <a:blip r:embed="rId11" cstate="print">
+                          <a:blip r:embed="rId10" cstate="print">
                             <a:extLst>
                               <a:ext uri="{28A0092B-C50C-407E-A947-70E740481C1C}">
                                 <a14:useLocalDpi xmlns:a14="http://schemas.microsoft.com/office/drawing/2010/main" val="0"/>
@@ -6953,7 +7058,7 @@
                           <pic:cNvPicPr/>
                         </pic:nvPicPr>
                         <pic:blipFill>
-                          <a:blip r:embed="rId12" cstate="print">
+                          <a:blip r:embed="rId11" cstate="print">
                             <a:extLst>
                               <a:ext uri="{28A0092B-C50C-407E-A947-70E740481C1C}">
                                 <a14:useLocalDpi xmlns:a14="http://schemas.microsoft.com/office/drawing/2010/main" val="0"/>
@@ -7349,7 +7454,7 @@
                           <pic:cNvPicPr/>
                         </pic:nvPicPr>
                         <pic:blipFill>
-                          <a:blip r:embed="rId13" cstate="print">
+                          <a:blip r:embed="rId12" cstate="print">
                             <a:extLst>
                               <a:ext uri="{28A0092B-C50C-407E-A947-70E740481C1C}">
                                 <a14:useLocalDpi xmlns:a14="http://schemas.microsoft.com/office/drawing/2010/main" val="0"/>
@@ -7415,7 +7520,7 @@
                           <pic:cNvPicPr/>
                         </pic:nvPicPr>
                         <pic:blipFill>
-                          <a:blip r:embed="rId14" cstate="print">
+                          <a:blip r:embed="rId13" cstate="print">
                             <a:extLst>
                               <a:ext uri="{28A0092B-C50C-407E-A947-70E740481C1C}">
                                 <a14:useLocalDpi xmlns:a14="http://schemas.microsoft.com/office/drawing/2010/main" val="0"/>
@@ -7856,7 +7961,7 @@
                           <pic:cNvPicPr/>
                         </pic:nvPicPr>
                         <pic:blipFill>
-                          <a:blip r:embed="rId15" cstate="print">
+                          <a:blip r:embed="rId14" cstate="print">
                             <a:extLst>
                               <a:ext uri="{28A0092B-C50C-407E-A947-70E740481C1C}">
                                 <a14:useLocalDpi xmlns:a14="http://schemas.microsoft.com/office/drawing/2010/main" val="0"/>
@@ -7922,7 +8027,7 @@
                           <pic:cNvPicPr/>
                         </pic:nvPicPr>
                         <pic:blipFill>
-                          <a:blip r:embed="rId16" cstate="print">
+                          <a:blip r:embed="rId15" cstate="print">
                             <a:extLst>
                               <a:ext uri="{28A0092B-C50C-407E-A947-70E740481C1C}">
                                 <a14:useLocalDpi xmlns:a14="http://schemas.microsoft.com/office/drawing/2010/main" val="0"/>
@@ -8366,7 +8471,7 @@
                           <pic:cNvPicPr/>
                         </pic:nvPicPr>
                         <pic:blipFill>
-                          <a:blip r:embed="rId17" cstate="print">
+                          <a:blip r:embed="rId16" cstate="print">
                             <a:extLst>
                               <a:ext uri="{28A0092B-C50C-407E-A947-70E740481C1C}">
                                 <a14:useLocalDpi xmlns:a14="http://schemas.microsoft.com/office/drawing/2010/main" val="0"/>
@@ -8432,7 +8537,7 @@
                           <pic:cNvPicPr/>
                         </pic:nvPicPr>
                         <pic:blipFill>
-                          <a:blip r:embed="rId18" cstate="print">
+                          <a:blip r:embed="rId17" cstate="print">
                             <a:extLst>
                               <a:ext uri="{28A0092B-C50C-407E-A947-70E740481C1C}">
                                 <a14:useLocalDpi xmlns:a14="http://schemas.microsoft.com/office/drawing/2010/main" val="0"/>
@@ -8857,7 +8962,7 @@
                           <pic:cNvPicPr/>
                         </pic:nvPicPr>
                         <pic:blipFill>
-                          <a:blip r:embed="rId19" cstate="print">
+                          <a:blip r:embed="rId18" cstate="print">
                             <a:extLst>
                               <a:ext uri="{28A0092B-C50C-407E-A947-70E740481C1C}">
                                 <a14:useLocalDpi xmlns:a14="http://schemas.microsoft.com/office/drawing/2010/main" val="0"/>
@@ -8923,7 +9028,7 @@
                           <pic:cNvPicPr/>
                         </pic:nvPicPr>
                         <pic:blipFill>
-                          <a:blip r:embed="rId20" cstate="print">
+                          <a:blip r:embed="rId19" cstate="print">
                             <a:extLst>
                               <a:ext uri="{28A0092B-C50C-407E-A947-70E740481C1C}">
                                 <a14:useLocalDpi xmlns:a14="http://schemas.microsoft.com/office/drawing/2010/main" val="0"/>
@@ -9303,7 +9408,7 @@
                           <pic:cNvPicPr/>
                         </pic:nvPicPr>
                         <pic:blipFill>
-                          <a:blip r:embed="rId21" cstate="print">
+                          <a:blip r:embed="rId20" cstate="print">
                             <a:extLst>
                               <a:ext uri="{28A0092B-C50C-407E-A947-70E740481C1C}">
                                 <a14:useLocalDpi xmlns:a14="http://schemas.microsoft.com/office/drawing/2010/main" val="0"/>
@@ -9369,7 +9474,7 @@
                           <pic:cNvPicPr/>
                         </pic:nvPicPr>
                         <pic:blipFill>
-                          <a:blip r:embed="rId22" cstate="print">
+                          <a:blip r:embed="rId21" cstate="print">
                             <a:extLst>
                               <a:ext uri="{28A0092B-C50C-407E-A947-70E740481C1C}">
                                 <a14:useLocalDpi xmlns:a14="http://schemas.microsoft.com/office/drawing/2010/main" val="0"/>
@@ -10532,20 +10637,8 @@
                 <w:szCs w:val="24"/>
                 <w:lang w:eastAsia="en-IN" w:bidi="mr-IN"/>
               </w:rPr>
-              <w:t xml:space="preserve"> </w:t>
-            </w:r>
-            <w:proofErr w:type="spellStart"/>
-            <w:r>
-              <w:rPr>
-                <w:rFonts w:ascii="Times New Roman" w:eastAsia="Times New Roman" w:hAnsi="Times New Roman" w:cs="Times New Roman"/>
-                <w:color w:val="1F1F1F"/>
-                <w:sz w:val="24"/>
-                <w:szCs w:val="24"/>
-                <w:lang w:eastAsia="en-IN" w:bidi="mr-IN"/>
-              </w:rPr>
-              <w:t>Jadhav</w:t>
-            </w:r>
-            <w:proofErr w:type="spellEnd"/>
+              <w:t xml:space="preserve"> Jadhav</w:t>
+            </w:r>
           </w:p>
         </w:tc>
         <w:tc>
@@ -10850,20 +10943,8 @@
                 <w:szCs w:val="24"/>
                 <w:lang w:eastAsia="en-IN" w:bidi="mr-IN"/>
               </w:rPr>
-              <w:t xml:space="preserve"> </w:t>
-            </w:r>
-            <w:proofErr w:type="spellStart"/>
-            <w:r>
-              <w:rPr>
-                <w:rFonts w:ascii="Times New Roman" w:eastAsia="Times New Roman" w:hAnsi="Times New Roman" w:cs="Times New Roman"/>
-                <w:color w:val="1F1F1F"/>
-                <w:sz w:val="24"/>
-                <w:szCs w:val="24"/>
-                <w:lang w:eastAsia="en-IN" w:bidi="mr-IN"/>
-              </w:rPr>
-              <w:t>Jadhav</w:t>
-            </w:r>
-            <w:proofErr w:type="spellEnd"/>
+              <w:t xml:space="preserve"> Jadhav</w:t>
+            </w:r>
           </w:p>
         </w:tc>
         <w:tc>
@@ -11054,20 +11135,8 @@
                 <w:szCs w:val="24"/>
                 <w:lang w:eastAsia="en-IN" w:bidi="mr-IN"/>
               </w:rPr>
-              <w:t xml:space="preserve">Shri N V </w:t>
-            </w:r>
-            <w:proofErr w:type="spellStart"/>
-            <w:r>
-              <w:rPr>
-                <w:rFonts w:ascii="Times New Roman" w:eastAsia="Times New Roman" w:hAnsi="Times New Roman" w:cs="Times New Roman"/>
-                <w:color w:val="000000"/>
-                <w:sz w:val="24"/>
-                <w:szCs w:val="24"/>
-                <w:lang w:eastAsia="en-IN" w:bidi="mr-IN"/>
-              </w:rPr>
-              <w:t>Bhalerao</w:t>
-            </w:r>
-            <w:proofErr w:type="spellEnd"/>
+              <w:t>Shri N V Bhalerao</w:t>
+            </w:r>
           </w:p>
         </w:tc>
         <w:tc>
@@ -11162,20 +11231,8 @@
                 <w:szCs w:val="24"/>
                 <w:lang w:eastAsia="en-IN" w:bidi="mr-IN"/>
               </w:rPr>
-              <w:t xml:space="preserve"> </w:t>
-            </w:r>
-            <w:proofErr w:type="spellStart"/>
-            <w:r>
-              <w:rPr>
-                <w:rFonts w:ascii="Times New Roman" w:eastAsia="Times New Roman" w:hAnsi="Times New Roman" w:cs="Times New Roman"/>
-                <w:color w:val="1F1F1F"/>
-                <w:sz w:val="24"/>
-                <w:szCs w:val="24"/>
-                <w:lang w:eastAsia="en-IN" w:bidi="mr-IN"/>
-              </w:rPr>
-              <w:t>Jadhav</w:t>
-            </w:r>
-            <w:proofErr w:type="spellEnd"/>
+              <w:t xml:space="preserve"> Jadhav</w:t>
+            </w:r>
           </w:p>
         </w:tc>
         <w:tc>
@@ -11463,20 +11520,8 @@
                 <w:szCs w:val="24"/>
                 <w:lang w:eastAsia="en-IN" w:bidi="mr-IN"/>
               </w:rPr>
-              <w:t xml:space="preserve"> </w:t>
-            </w:r>
-            <w:proofErr w:type="spellStart"/>
-            <w:r>
-              <w:rPr>
-                <w:rFonts w:ascii="Times New Roman" w:eastAsia="Times New Roman" w:hAnsi="Times New Roman" w:cs="Times New Roman"/>
-                <w:color w:val="1F1F1F"/>
-                <w:sz w:val="24"/>
-                <w:szCs w:val="24"/>
-                <w:lang w:eastAsia="en-IN" w:bidi="mr-IN"/>
-              </w:rPr>
-              <w:t>Jadhav</w:t>
-            </w:r>
-            <w:proofErr w:type="spellEnd"/>
+              <w:t xml:space="preserve"> Jadhav</w:t>
+            </w:r>
           </w:p>
         </w:tc>
         <w:tc>
@@ -11733,27 +11778,15 @@
                 <w:lang w:eastAsia="en-IN" w:bidi="mr-IN"/>
               </w:rPr>
             </w:pPr>
-            <w:proofErr w:type="spellStart"/>
-            <w:r>
-              <w:rPr>
-                <w:rFonts w:ascii="Times New Roman" w:eastAsia="Times New Roman" w:hAnsi="Times New Roman" w:cs="Times New Roman"/>
-                <w:color w:val="1F1F1F"/>
-                <w:sz w:val="24"/>
-                <w:szCs w:val="24"/>
-                <w:lang w:eastAsia="en-IN" w:bidi="mr-IN"/>
-              </w:rPr>
-              <w:t>Suhas</w:t>
-            </w:r>
-            <w:proofErr w:type="spellEnd"/>
-            <w:r>
-              <w:rPr>
-                <w:rFonts w:ascii="Times New Roman" w:eastAsia="Times New Roman" w:hAnsi="Times New Roman" w:cs="Times New Roman"/>
-                <w:color w:val="1F1F1F"/>
-                <w:sz w:val="24"/>
-                <w:szCs w:val="24"/>
-                <w:lang w:eastAsia="en-IN" w:bidi="mr-IN"/>
-              </w:rPr>
-              <w:t xml:space="preserve"> S. Gund</w:t>
+            <w:r>
+              <w:rPr>
+                <w:rFonts w:ascii="Times New Roman" w:eastAsia="Times New Roman" w:hAnsi="Times New Roman" w:cs="Times New Roman"/>
+                <w:color w:val="1F1F1F"/>
+                <w:sz w:val="24"/>
+                <w:szCs w:val="24"/>
+                <w:lang w:eastAsia="en-IN" w:bidi="mr-IN"/>
+              </w:rPr>
+              <w:t>Suhas S. Gund</w:t>
             </w:r>
           </w:p>
         </w:tc>
@@ -11945,20 +11978,8 @@
                 <w:szCs w:val="24"/>
                 <w:lang w:eastAsia="en-IN" w:bidi="mr-IN"/>
               </w:rPr>
-              <w:t xml:space="preserve">Shri P J </w:t>
-            </w:r>
-            <w:proofErr w:type="spellStart"/>
-            <w:r>
-              <w:rPr>
-                <w:rFonts w:ascii="Times New Roman" w:eastAsia="Times New Roman" w:hAnsi="Times New Roman" w:cs="Times New Roman"/>
-                <w:color w:val="000000"/>
-                <w:sz w:val="24"/>
-                <w:szCs w:val="24"/>
-                <w:lang w:eastAsia="en-IN" w:bidi="mr-IN"/>
-              </w:rPr>
-              <w:t>Bansode</w:t>
-            </w:r>
-            <w:proofErr w:type="spellEnd"/>
+              <w:t>Shri P J Bansode</w:t>
+            </w:r>
           </w:p>
         </w:tc>
         <w:tc>
@@ -12023,27 +12044,15 @@
                 <w:lang w:eastAsia="en-IN" w:bidi="mr-IN"/>
               </w:rPr>
             </w:pPr>
-            <w:proofErr w:type="spellStart"/>
-            <w:r>
-              <w:rPr>
-                <w:rFonts w:ascii="Times New Roman" w:eastAsia="Times New Roman" w:hAnsi="Times New Roman" w:cs="Times New Roman"/>
-                <w:color w:val="1F1F1F"/>
-                <w:sz w:val="24"/>
-                <w:szCs w:val="24"/>
-                <w:lang w:eastAsia="en-IN" w:bidi="mr-IN"/>
-              </w:rPr>
-              <w:t>Suhas</w:t>
-            </w:r>
-            <w:proofErr w:type="spellEnd"/>
-            <w:r>
-              <w:rPr>
-                <w:rFonts w:ascii="Times New Roman" w:eastAsia="Times New Roman" w:hAnsi="Times New Roman" w:cs="Times New Roman"/>
-                <w:color w:val="1F1F1F"/>
-                <w:sz w:val="24"/>
-                <w:szCs w:val="24"/>
-                <w:lang w:eastAsia="en-IN" w:bidi="mr-IN"/>
-              </w:rPr>
-              <w:t xml:space="preserve"> S. Gund</w:t>
+            <w:r>
+              <w:rPr>
+                <w:rFonts w:ascii="Times New Roman" w:eastAsia="Times New Roman" w:hAnsi="Times New Roman" w:cs="Times New Roman"/>
+                <w:color w:val="1F1F1F"/>
+                <w:sz w:val="24"/>
+                <w:szCs w:val="24"/>
+                <w:lang w:eastAsia="en-IN" w:bidi="mr-IN"/>
+              </w:rPr>
+              <w:t>Suhas S. Gund</w:t>
             </w:r>
           </w:p>
         </w:tc>
@@ -12235,20 +12244,8 @@
                 <w:szCs w:val="24"/>
                 <w:lang w:eastAsia="en-IN" w:bidi="mr-IN"/>
               </w:rPr>
-              <w:t xml:space="preserve">Shri N V </w:t>
-            </w:r>
-            <w:proofErr w:type="spellStart"/>
-            <w:r>
-              <w:rPr>
-                <w:rFonts w:ascii="Times New Roman" w:eastAsia="Times New Roman" w:hAnsi="Times New Roman" w:cs="Times New Roman"/>
-                <w:color w:val="000000"/>
-                <w:sz w:val="24"/>
-                <w:szCs w:val="24"/>
-                <w:lang w:eastAsia="en-IN" w:bidi="mr-IN"/>
-              </w:rPr>
-              <w:t>Bhalerao</w:t>
-            </w:r>
-            <w:proofErr w:type="spellEnd"/>
+              <w:t>Shri N V Bhalerao</w:t>
+            </w:r>
           </w:p>
         </w:tc>
         <w:tc>
@@ -12313,27 +12310,15 @@
                 <w:lang w:eastAsia="en-IN" w:bidi="mr-IN"/>
               </w:rPr>
             </w:pPr>
-            <w:proofErr w:type="spellStart"/>
-            <w:r>
-              <w:rPr>
-                <w:rFonts w:ascii="Times New Roman" w:eastAsia="Times New Roman" w:hAnsi="Times New Roman" w:cs="Times New Roman"/>
-                <w:color w:val="1F1F1F"/>
-                <w:sz w:val="24"/>
-                <w:szCs w:val="24"/>
-                <w:lang w:eastAsia="en-IN" w:bidi="mr-IN"/>
-              </w:rPr>
-              <w:t>Suhas</w:t>
-            </w:r>
-            <w:proofErr w:type="spellEnd"/>
-            <w:r>
-              <w:rPr>
-                <w:rFonts w:ascii="Times New Roman" w:eastAsia="Times New Roman" w:hAnsi="Times New Roman" w:cs="Times New Roman"/>
-                <w:color w:val="1F1F1F"/>
-                <w:sz w:val="24"/>
-                <w:szCs w:val="24"/>
-                <w:lang w:eastAsia="en-IN" w:bidi="mr-IN"/>
-              </w:rPr>
-              <w:t xml:space="preserve"> S. Gund</w:t>
+            <w:r>
+              <w:rPr>
+                <w:rFonts w:ascii="Times New Roman" w:eastAsia="Times New Roman" w:hAnsi="Times New Roman" w:cs="Times New Roman"/>
+                <w:color w:val="1F1F1F"/>
+                <w:sz w:val="24"/>
+                <w:szCs w:val="24"/>
+                <w:lang w:eastAsia="en-IN" w:bidi="mr-IN"/>
+              </w:rPr>
+              <w:t>Suhas S. Gund</w:t>
             </w:r>
           </w:p>
         </w:tc>
@@ -13009,19 +12994,8 @@
                 <w:szCs w:val="21"/>
                 <w:lang w:eastAsia="en-IN" w:bidi="mr-IN"/>
               </w:rPr>
-              <w:t xml:space="preserve"> of MSBTE Online Examination is available. All In One Computers with Web-Cameras, High-Speed Internet, AC, CCTV Cameras, </w:t>
-            </w:r>
-            <w:proofErr w:type="gramStart"/>
-            <w:r>
-              <w:rPr>
-                <w:rFonts w:ascii="Times New Roman" w:eastAsia="Times New Roman" w:hAnsi="Times New Roman" w:cs="Times New Roman"/>
-                <w:sz w:val="21"/>
-                <w:szCs w:val="21"/>
-                <w:lang w:eastAsia="en-IN" w:bidi="mr-IN"/>
-              </w:rPr>
-              <w:t>Wi</w:t>
-            </w:r>
-            <w:proofErr w:type="gramEnd"/>
+              <w:t xml:space="preserve"> of MSBTE Online Examination is available. All In One Computers with Web-Cameras, High-Speed Internet, AC, CCTV Cameras, Wi</w:t>
+            </w:r>
             <w:r>
               <w:rPr>
                 <w:rFonts w:ascii="Times New Roman" w:eastAsia="Times New Roman" w:hAnsi="Times New Roman" w:cs="Times New Roman"/>
@@ -13291,7 +13265,6 @@
                 <w:szCs w:val="24"/>
                 <w:lang w:eastAsia="en-IN" w:bidi="mr-IN"/>
               </w:rPr>
-              <w:lastRenderedPageBreak/>
               <w:t>2</w:t>
             </w:r>
           </w:p>
@@ -13586,18 +13559,8 @@
                 <w:color w:val="1F1F1F"/>
                 <w:lang w:eastAsia="en-IN" w:bidi="mr-IN"/>
               </w:rPr>
-              <w:t xml:space="preserve">seminars </w:t>
-            </w:r>
-            <w:proofErr w:type="spellStart"/>
-            <w:r>
-              <w:rPr>
-                <w:rFonts w:ascii="Times New Roman" w:eastAsia="Times New Roman" w:hAnsi="Times New Roman" w:cs="Times New Roman"/>
-                <w:color w:val="1F1F1F"/>
-                <w:lang w:eastAsia="en-IN" w:bidi="mr-IN"/>
-              </w:rPr>
-              <w:t>etc</w:t>
-            </w:r>
-            <w:proofErr w:type="spellEnd"/>
+              <w:t>seminars etc</w:t>
+            </w:r>
           </w:p>
         </w:tc>
         <w:tc>
@@ -13873,18 +13836,8 @@
                 <w:color w:val="1F1F1F"/>
                 <w:lang w:eastAsia="en-IN" w:bidi="mr-IN"/>
               </w:rPr>
-              <w:t xml:space="preserve">Guest/Expert Lecture </w:t>
-            </w:r>
-            <w:proofErr w:type="spellStart"/>
-            <w:r>
-              <w:rPr>
-                <w:rFonts w:ascii="Times New Roman" w:eastAsia="Times New Roman" w:hAnsi="Times New Roman" w:cs="Times New Roman"/>
-                <w:color w:val="1F1F1F"/>
-                <w:lang w:eastAsia="en-IN" w:bidi="mr-IN"/>
-              </w:rPr>
-              <w:t>etc</w:t>
-            </w:r>
-            <w:proofErr w:type="spellEnd"/>
+              <w:t>Guest/Expert Lecture etc</w:t>
+            </w:r>
           </w:p>
         </w:tc>
         <w:tc>
@@ -13929,20 +13882,8 @@
                 <w:szCs w:val="24"/>
                 <w:lang w:eastAsia="en-IN" w:bidi="mr-IN"/>
               </w:rPr>
-              <w:t xml:space="preserve">demonstration, External viva presentation </w:t>
-            </w:r>
-            <w:proofErr w:type="spellStart"/>
-            <w:r>
-              <w:rPr>
-                <w:rFonts w:ascii="Times New Roman" w:eastAsia="Times New Roman" w:hAnsi="Times New Roman" w:cs="Times New Roman"/>
-                <w:color w:val="1F1F1F"/>
-                <w:sz w:val="24"/>
-                <w:szCs w:val="24"/>
-                <w:lang w:eastAsia="en-IN" w:bidi="mr-IN"/>
-              </w:rPr>
-              <w:t>etc</w:t>
-            </w:r>
-            <w:proofErr w:type="spellEnd"/>
+              <w:t>demonstration, External viva presentation etc</w:t>
+            </w:r>
           </w:p>
         </w:tc>
         <w:tc>
@@ -14996,20 +14937,8 @@
                 <w:szCs w:val="24"/>
                 <w:lang w:eastAsia="en-IN" w:bidi="mr-IN"/>
               </w:rPr>
-              <w:t xml:space="preserve">Essential stationery like File/Folder, Notebooks, Laboratory Manual, Tutorial Pages, Xerox Facility </w:t>
-            </w:r>
-            <w:proofErr w:type="spellStart"/>
-            <w:r>
-              <w:rPr>
-                <w:rFonts w:ascii="Times New Roman" w:eastAsia="Times New Roman" w:hAnsi="Times New Roman" w:cs="Times New Roman"/>
-                <w:color w:val="1F1F1F"/>
-                <w:sz w:val="24"/>
-                <w:szCs w:val="24"/>
-                <w:lang w:eastAsia="en-IN" w:bidi="mr-IN"/>
-              </w:rPr>
-              <w:t>Etc</w:t>
-            </w:r>
-            <w:proofErr w:type="spellEnd"/>
+              <w:t>Essential stationery like File/Folder, Notebooks, Laboratory Manual, Tutorial Pages, Xerox Facility Etc</w:t>
+            </w:r>
           </w:p>
         </w:tc>
         <w:tc>
@@ -15849,25 +15778,7 @@
                 <w:color w:val="1F1F1F"/>
                 <w:lang w:eastAsia="en-IN" w:bidi="mr-IN"/>
               </w:rPr>
-              <w:t xml:space="preserve">To enable students to learn new emerging technologies (AI, Cloud, </w:t>
-            </w:r>
-            <w:proofErr w:type="spellStart"/>
-            <w:r>
-              <w:rPr>
-                <w:rFonts w:ascii="Times New Roman" w:eastAsia="Times New Roman" w:hAnsi="Times New Roman" w:cs="Times New Roman"/>
-                <w:color w:val="1F1F1F"/>
-                <w:lang w:eastAsia="en-IN" w:bidi="mr-IN"/>
-              </w:rPr>
-              <w:t>IoT</w:t>
-            </w:r>
-            <w:proofErr w:type="spellEnd"/>
-            <w:r>
-              <w:rPr>
-                <w:rFonts w:ascii="Times New Roman" w:eastAsia="Times New Roman" w:hAnsi="Times New Roman" w:cs="Times New Roman"/>
-                <w:color w:val="1F1F1F"/>
-                <w:lang w:eastAsia="en-IN" w:bidi="mr-IN"/>
-              </w:rPr>
-              <w:t>)</w:t>
+              <w:t>To enable students to learn new emerging technologies (AI, Cloud, IoT)</w:t>
             </w:r>
           </w:p>
         </w:tc>
@@ -16743,23 +16654,7 @@
       </w:r>
       <w:proofErr w:type="spellEnd"/>
       <w:r>
-        <w:t xml:space="preserve"> </w:t>
-      </w:r>
-      <w:proofErr w:type="spellStart"/>
-      <w:r>
-        <w:t>Jadhav</w:t>
-      </w:r>
-      <w:proofErr w:type="spellEnd"/>
-      <w:r>
-        <w:t xml:space="preserve"> and Shri. </w:t>
-      </w:r>
-      <w:proofErr w:type="spellStart"/>
-      <w:r>
-        <w:t>Suhas</w:t>
-      </w:r>
-      <w:proofErr w:type="spellEnd"/>
-      <w:r>
-        <w:t xml:space="preserve"> S. Gund) to ensure uninterrupted practical sessions.</w:t>
+        <w:t xml:space="preserve"> Jadhav and Shri. Suhas S. Gund) to ensure uninterrupted practical sessions.</w:t>
       </w:r>
     </w:p>
     <w:p>
@@ -17297,7 +17192,7 @@
                 <w:lang w:eastAsia="en-IN" w:bidi="mr-IN"/>
               </w:rPr>
             </w:pPr>
-            <w:bookmarkStart w:id="1" w:name="_Hlk126180514" w:colFirst="2" w:colLast="5"/>
+            <w:bookmarkStart w:id="0" w:name="_Hlk126180514" w:colFirst="2" w:colLast="5"/>
             <w:r>
               <w:rPr>
                 <w:rFonts w:ascii="Times New Roman" w:eastAsia="Times New Roman" w:hAnsi="Times New Roman" w:cs="Times New Roman"/>
@@ -17335,7 +17230,7 @@
                 <w:lang w:eastAsia="en-IN" w:bidi="mr-IN"/>
               </w:rPr>
             </w:pPr>
-            <w:bookmarkStart w:id="2" w:name="RANGE!B1"/>
+            <w:bookmarkStart w:id="1" w:name="RANGE!B1"/>
             <w:r>
               <w:rPr>
                 <w:rFonts w:ascii="Times New Roman" w:eastAsia="Times New Roman" w:hAnsi="Times New Roman" w:cs="Times New Roman"/>
@@ -17346,7 +17241,7 @@
               </w:rPr>
               <w:t>No of computer terminals</w:t>
             </w:r>
-            <w:bookmarkEnd w:id="2"/>
+            <w:bookmarkEnd w:id="1"/>
           </w:p>
         </w:tc>
         <w:tc>
@@ -17784,7 +17679,7 @@
           </w:p>
         </w:tc>
       </w:tr>
-      <w:bookmarkEnd w:id="1"/>
+      <w:bookmarkEnd w:id="0"/>
     </w:tbl>
     <w:p>
       <w:pPr>
@@ -18351,23 +18246,13 @@
                 <w:szCs w:val="24"/>
               </w:rPr>
             </w:pPr>
-            <w:proofErr w:type="spellStart"/>
-            <w:r>
-              <w:rPr>
-                <w:rFonts w:ascii="Times New Roman" w:hAnsi="Times New Roman" w:cs="Times New Roman"/>
-                <w:sz w:val="24"/>
-                <w:szCs w:val="24"/>
-              </w:rPr>
-              <w:t>Biyani</w:t>
-            </w:r>
-            <w:proofErr w:type="spellEnd"/>
-            <w:r>
-              <w:rPr>
-                <w:rFonts w:ascii="Times New Roman" w:hAnsi="Times New Roman" w:cs="Times New Roman"/>
-                <w:sz w:val="24"/>
-                <w:szCs w:val="24"/>
-              </w:rPr>
-              <w:t xml:space="preserve"> Technology</w:t>
+            <w:r>
+              <w:rPr>
+                <w:rFonts w:ascii="Times New Roman" w:hAnsi="Times New Roman" w:cs="Times New Roman"/>
+                <w:sz w:val="24"/>
+                <w:szCs w:val="24"/>
+              </w:rPr>
+              <w:t>Biyani Technology</w:t>
             </w:r>
           </w:p>
         </w:tc>
@@ -19497,7 +19382,7 @@
       </w:pPr>
     </w:p>
     <w:sectPr>
-      <w:footerReference w:type="default" r:id="rId23"/>
+      <w:footerReference w:type="default" r:id="rId22"/>
       <w:pgSz w:w="11906" w:h="16838"/>
       <w:pgMar w:top="1440" w:right="1274" w:bottom="1440" w:left="1440" w:header="708" w:footer="432" w:gutter="0"/>
       <w:pgBorders w:offsetFrom="page">
@@ -19514,7 +19399,7 @@
 </file>
 
 <file path=word/endnotes.xml><?xml version="1.0" encoding="utf-8"?>
-<w:endnotes xmlns:wpc="http://schemas.microsoft.com/office/word/2010/wordprocessingCanvas" xmlns:mc="http://schemas.openxmlformats.org/markup-compatibility/2006" xmlns:o="urn:schemas-microsoft-com:office:office" xmlns:r="http://schemas.openxmlformats.org/officeDocument/2006/relationships" xmlns:m="http://schemas.openxmlformats.org/officeDocument/2006/math" xmlns:v="urn:schemas-microsoft-com:vml" xmlns:wp14="http://schemas.microsoft.com/office/word/2010/wordprocessingDrawing" xmlns:wp="http://schemas.openxmlformats.org/drawingml/2006/wordprocessingDrawing" xmlns:w10="urn:schemas-microsoft-com:office:word" xmlns:w="http://schemas.openxmlformats.org/wordprocessingml/2006/main" xmlns:w14="http://schemas.microsoft.com/office/word/2010/wordml" xmlns:wpg="http://schemas.microsoft.com/office/word/2010/wordprocessingGroup" xmlns:wpi="http://schemas.microsoft.com/office/word/2010/wordprocessingInk" xmlns:wne="http://schemas.microsoft.com/office/word/2006/wordml" xmlns:wps="http://schemas.microsoft.com/office/word/2010/wordprocessingShape" mc:Ignorable="w14 wp14">
+<w:endnotes xmlns:wpc="http://schemas.microsoft.com/office/word/2010/wordprocessingCanvas" xmlns:cx="http://schemas.microsoft.com/office/drawing/2014/chartex" xmlns:cx1="http://schemas.microsoft.com/office/drawing/2015/9/8/chartex" xmlns:cx2="http://schemas.microsoft.com/office/drawing/2015/10/21/chartex" xmlns:cx3="http://schemas.microsoft.com/office/drawing/2016/5/9/chartex" xmlns:cx4="http://schemas.microsoft.com/office/drawing/2016/5/10/chartex" xmlns:cx5="http://schemas.microsoft.com/office/drawing/2016/5/11/chartex" xmlns:cx6="http://schemas.microsoft.com/office/drawing/2016/5/12/chartex" xmlns:cx7="http://schemas.microsoft.com/office/drawing/2016/5/13/chartex" xmlns:cx8="http://schemas.microsoft.com/office/drawing/2016/5/14/chartex" xmlns:mc="http://schemas.openxmlformats.org/markup-compatibility/2006" xmlns:aink="http://schemas.microsoft.com/office/drawing/2016/ink" xmlns:am3d="http://schemas.microsoft.com/office/drawing/2017/model3d" xmlns:o="urn:schemas-microsoft-com:office:office" xmlns:oel="http://schemas.microsoft.com/office/2019/extlst" xmlns:r="http://schemas.openxmlformats.org/officeDocument/2006/relationships" xmlns:m="http://schemas.openxmlformats.org/officeDocument/2006/math" xmlns:v="urn:schemas-microsoft-com:vml" xmlns:wp14="http://schemas.microsoft.com/office/word/2010/wordprocessingDrawing" xmlns:wp="http://schemas.openxmlformats.org/drawingml/2006/wordprocessingDrawing" xmlns:w10="urn:schemas-microsoft-com:office:word" xmlns:w="http://schemas.openxmlformats.org/wordprocessingml/2006/main" xmlns:w14="http://schemas.microsoft.com/office/word/2010/wordml" xmlns:w15="http://schemas.microsoft.com/office/word/2012/wordml" xmlns:w16cex="http://schemas.microsoft.com/office/word/2018/wordml/cex" xmlns:w16cid="http://schemas.microsoft.com/office/word/2016/wordml/cid" xmlns:w16="http://schemas.microsoft.com/office/word/2018/wordml" xmlns:w16du="http://schemas.microsoft.com/office/word/2023/wordml/word16du" xmlns:w16sdtdh="http://schemas.microsoft.com/office/word/2020/wordml/sdtdatahash" xmlns:w16se="http://schemas.microsoft.com/office/word/2015/wordml/symex" xmlns:wpg="http://schemas.microsoft.com/office/word/2010/wordprocessingGroup" xmlns:wpi="http://schemas.microsoft.com/office/word/2010/wordprocessingInk" xmlns:wne="http://schemas.microsoft.com/office/word/2006/wordml" xmlns:wps="http://schemas.microsoft.com/office/word/2010/wordprocessingShape" mc:Ignorable="w14 w15 w16se w16cid w16 w16cex w16sdtdh w16du wp14">
   <w:endnote w:type="separator" w:id="-1">
     <w:p>
       <w:pPr>
@@ -19539,7 +19424,7 @@
 </file>
 
 <file path=word/footer1.xml><?xml version="1.0" encoding="utf-8"?>
-<w:ftr xmlns:wpc="http://schemas.microsoft.com/office/word/2010/wordprocessingCanvas" xmlns:mc="http://schemas.openxmlformats.org/markup-compatibility/2006" xmlns:o="urn:schemas-microsoft-com:office:office" xmlns:r="http://schemas.openxmlformats.org/officeDocument/2006/relationships" xmlns:m="http://schemas.openxmlformats.org/officeDocument/2006/math" xmlns:v="urn:schemas-microsoft-com:vml" xmlns:wp14="http://schemas.microsoft.com/office/word/2010/wordprocessingDrawing" xmlns:wp="http://schemas.openxmlformats.org/drawingml/2006/wordprocessingDrawing" xmlns:w10="urn:schemas-microsoft-com:office:word" xmlns:w="http://schemas.openxmlformats.org/wordprocessingml/2006/main" xmlns:w14="http://schemas.microsoft.com/office/word/2010/wordml" xmlns:wpg="http://schemas.microsoft.com/office/word/2010/wordprocessingGroup" xmlns:wpi="http://schemas.microsoft.com/office/word/2010/wordprocessingInk" xmlns:wne="http://schemas.microsoft.com/office/word/2006/wordml" xmlns:wps="http://schemas.microsoft.com/office/word/2010/wordprocessingShape" mc:Ignorable="w14 wp14">
+<w:ftr xmlns:wpc="http://schemas.microsoft.com/office/word/2010/wordprocessingCanvas" xmlns:cx="http://schemas.microsoft.com/office/drawing/2014/chartex" xmlns:cx1="http://schemas.microsoft.com/office/drawing/2015/9/8/chartex" xmlns:cx2="http://schemas.microsoft.com/office/drawing/2015/10/21/chartex" xmlns:cx3="http://schemas.microsoft.com/office/drawing/2016/5/9/chartex" xmlns:cx4="http://schemas.microsoft.com/office/drawing/2016/5/10/chartex" xmlns:cx5="http://schemas.microsoft.com/office/drawing/2016/5/11/chartex" xmlns:cx6="http://schemas.microsoft.com/office/drawing/2016/5/12/chartex" xmlns:cx7="http://schemas.microsoft.com/office/drawing/2016/5/13/chartex" xmlns:cx8="http://schemas.microsoft.com/office/drawing/2016/5/14/chartex" xmlns:mc="http://schemas.openxmlformats.org/markup-compatibility/2006" xmlns:aink="http://schemas.microsoft.com/office/drawing/2016/ink" xmlns:am3d="http://schemas.microsoft.com/office/drawing/2017/model3d" xmlns:o="urn:schemas-microsoft-com:office:office" xmlns:oel="http://schemas.microsoft.com/office/2019/extlst" xmlns:r="http://schemas.openxmlformats.org/officeDocument/2006/relationships" xmlns:m="http://schemas.openxmlformats.org/officeDocument/2006/math" xmlns:v="urn:schemas-microsoft-com:vml" xmlns:wp14="http://schemas.microsoft.com/office/word/2010/wordprocessingDrawing" xmlns:wp="http://schemas.openxmlformats.org/drawingml/2006/wordprocessingDrawing" xmlns:w10="urn:schemas-microsoft-com:office:word" xmlns:w="http://schemas.openxmlformats.org/wordprocessingml/2006/main" xmlns:w14="http://schemas.microsoft.com/office/word/2010/wordml" xmlns:w15="http://schemas.microsoft.com/office/word/2012/wordml" xmlns:w16cex="http://schemas.microsoft.com/office/word/2018/wordml/cex" xmlns:w16cid="http://schemas.microsoft.com/office/word/2016/wordml/cid" xmlns:w16="http://schemas.microsoft.com/office/word/2018/wordml" xmlns:w16du="http://schemas.microsoft.com/office/word/2023/wordml/word16du" xmlns:w16sdtdh="http://schemas.microsoft.com/office/word/2020/wordml/sdtdatahash" xmlns:w16se="http://schemas.microsoft.com/office/word/2015/wordml/symex" xmlns:wpg="http://schemas.microsoft.com/office/word/2010/wordprocessingGroup" xmlns:wpi="http://schemas.microsoft.com/office/word/2010/wordprocessingInk" xmlns:wne="http://schemas.microsoft.com/office/word/2006/wordml" xmlns:wps="http://schemas.microsoft.com/office/word/2010/wordprocessingShape" mc:Ignorable="w14 w15 w16se w16cid w16 w16cex w16sdtdh w16du wp14">
   <w:sdt>
     <w:sdtPr>
       <w:id w:val="1810202757"/>
@@ -19592,7 +19477,7 @@
 </file>
 
 <file path=word/footnotes.xml><?xml version="1.0" encoding="utf-8"?>
-<w:footnotes xmlns:wpc="http://schemas.microsoft.com/office/word/2010/wordprocessingCanvas" xmlns:mc="http://schemas.openxmlformats.org/markup-compatibility/2006" xmlns:o="urn:schemas-microsoft-com:office:office" xmlns:r="http://schemas.openxmlformats.org/officeDocument/2006/relationships" xmlns:m="http://schemas.openxmlformats.org/officeDocument/2006/math" xmlns:v="urn:schemas-microsoft-com:vml" xmlns:wp14="http://schemas.microsoft.com/office/word/2010/wordprocessingDrawing" xmlns:wp="http://schemas.openxmlformats.org/drawingml/2006/wordprocessingDrawing" xmlns:w10="urn:schemas-microsoft-com:office:word" xmlns:w="http://schemas.openxmlformats.org/wordprocessingml/2006/main" xmlns:w14="http://schemas.microsoft.com/office/word/2010/wordml" xmlns:wpg="http://schemas.microsoft.com/office/word/2010/wordprocessingGroup" xmlns:wpi="http://schemas.microsoft.com/office/word/2010/wordprocessingInk" xmlns:wne="http://schemas.microsoft.com/office/word/2006/wordml" xmlns:wps="http://schemas.microsoft.com/office/word/2010/wordprocessingShape" mc:Ignorable="w14 wp14">
+<w:footnotes xmlns:wpc="http://schemas.microsoft.com/office/word/2010/wordprocessingCanvas" xmlns:cx="http://schemas.microsoft.com/office/drawing/2014/chartex" xmlns:cx1="http://schemas.microsoft.com/office/drawing/2015/9/8/chartex" xmlns:cx2="http://schemas.microsoft.com/office/drawing/2015/10/21/chartex" xmlns:cx3="http://schemas.microsoft.com/office/drawing/2016/5/9/chartex" xmlns:cx4="http://schemas.microsoft.com/office/drawing/2016/5/10/chartex" xmlns:cx5="http://schemas.microsoft.com/office/drawing/2016/5/11/chartex" xmlns:cx6="http://schemas.microsoft.com/office/drawing/2016/5/12/chartex" xmlns:cx7="http://schemas.microsoft.com/office/drawing/2016/5/13/chartex" xmlns:cx8="http://schemas.microsoft.com/office/drawing/2016/5/14/chartex" xmlns:mc="http://schemas.openxmlformats.org/markup-compatibility/2006" xmlns:aink="http://schemas.microsoft.com/office/drawing/2016/ink" xmlns:am3d="http://schemas.microsoft.com/office/drawing/2017/model3d" xmlns:o="urn:schemas-microsoft-com:office:office" xmlns:oel="http://schemas.microsoft.com/office/2019/extlst" xmlns:r="http://schemas.openxmlformats.org/officeDocument/2006/relationships" xmlns:m="http://schemas.openxmlformats.org/officeDocument/2006/math" xmlns:v="urn:schemas-microsoft-com:vml" xmlns:wp14="http://schemas.microsoft.com/office/word/2010/wordprocessingDrawing" xmlns:wp="http://schemas.openxmlformats.org/drawingml/2006/wordprocessingDrawing" xmlns:w10="urn:schemas-microsoft-com:office:word" xmlns:w="http://schemas.openxmlformats.org/wordprocessingml/2006/main" xmlns:w14="http://schemas.microsoft.com/office/word/2010/wordml" xmlns:w15="http://schemas.microsoft.com/office/word/2012/wordml" xmlns:w16cex="http://schemas.microsoft.com/office/word/2018/wordml/cex" xmlns:w16cid="http://schemas.microsoft.com/office/word/2016/wordml/cid" xmlns:w16="http://schemas.microsoft.com/office/word/2018/wordml" xmlns:w16du="http://schemas.microsoft.com/office/word/2023/wordml/word16du" xmlns:w16sdtdh="http://schemas.microsoft.com/office/word/2020/wordml/sdtdatahash" xmlns:w16se="http://schemas.microsoft.com/office/word/2015/wordml/symex" xmlns:wpg="http://schemas.microsoft.com/office/word/2010/wordprocessingGroup" xmlns:wpi="http://schemas.microsoft.com/office/word/2010/wordprocessingInk" xmlns:wne="http://schemas.microsoft.com/office/word/2006/wordml" xmlns:wps="http://schemas.microsoft.com/office/word/2010/wordprocessingShape" mc:Ignorable="w14 w15 w16se w16cid w16 w16cex w16sdtdh w16du wp14">
   <w:footnote w:type="separator" w:id="-1">
     <w:p>
       <w:pPr>
@@ -19617,8 +19502,8 @@
 </file>
 
 <file path=word/numbering.xml><?xml version="1.0" encoding="utf-8"?>
-<w:numbering xmlns:wpc="http://schemas.microsoft.com/office/word/2010/wordprocessingCanvas" xmlns:mc="http://schemas.openxmlformats.org/markup-compatibility/2006" xmlns:o="urn:schemas-microsoft-com:office:office" xmlns:r="http://schemas.openxmlformats.org/officeDocument/2006/relationships" xmlns:m="http://schemas.openxmlformats.org/officeDocument/2006/math" xmlns:v="urn:schemas-microsoft-com:vml" xmlns:wp14="http://schemas.microsoft.com/office/word/2010/wordprocessingDrawing" xmlns:wp="http://schemas.openxmlformats.org/drawingml/2006/wordprocessingDrawing" xmlns:w10="urn:schemas-microsoft-com:office:word" xmlns:w="http://schemas.openxmlformats.org/wordprocessingml/2006/main" xmlns:w14="http://schemas.microsoft.com/office/word/2010/wordml" xmlns:wpg="http://schemas.microsoft.com/office/word/2010/wordprocessingGroup" xmlns:wpi="http://schemas.microsoft.com/office/word/2010/wordprocessingInk" xmlns:wne="http://schemas.microsoft.com/office/word/2006/wordml" xmlns:wps="http://schemas.microsoft.com/office/word/2010/wordprocessingShape" mc:Ignorable="w14 wp14">
-  <w:abstractNum w:abstractNumId="0">
+<w:numbering xmlns:wpc="http://schemas.microsoft.com/office/word/2010/wordprocessingCanvas" xmlns:cx="http://schemas.microsoft.com/office/drawing/2014/chartex" xmlns:cx1="http://schemas.microsoft.com/office/drawing/2015/9/8/chartex" xmlns:cx2="http://schemas.microsoft.com/office/drawing/2015/10/21/chartex" xmlns:cx3="http://schemas.microsoft.com/office/drawing/2016/5/9/chartex" xmlns:cx4="http://schemas.microsoft.com/office/drawing/2016/5/10/chartex" xmlns:cx5="http://schemas.microsoft.com/office/drawing/2016/5/11/chartex" xmlns:cx6="http://schemas.microsoft.com/office/drawing/2016/5/12/chartex" xmlns:cx7="http://schemas.microsoft.com/office/drawing/2016/5/13/chartex" xmlns:cx8="http://schemas.microsoft.com/office/drawing/2016/5/14/chartex" xmlns:mc="http://schemas.openxmlformats.org/markup-compatibility/2006" xmlns:aink="http://schemas.microsoft.com/office/drawing/2016/ink" xmlns:am3d="http://schemas.microsoft.com/office/drawing/2017/model3d" xmlns:o="urn:schemas-microsoft-com:office:office" xmlns:oel="http://schemas.microsoft.com/office/2019/extlst" xmlns:r="http://schemas.openxmlformats.org/officeDocument/2006/relationships" xmlns:m="http://schemas.openxmlformats.org/officeDocument/2006/math" xmlns:v="urn:schemas-microsoft-com:vml" xmlns:wp14="http://schemas.microsoft.com/office/word/2010/wordprocessingDrawing" xmlns:wp="http://schemas.openxmlformats.org/drawingml/2006/wordprocessingDrawing" xmlns:w10="urn:schemas-microsoft-com:office:word" xmlns:w="http://schemas.openxmlformats.org/wordprocessingml/2006/main" xmlns:w14="http://schemas.microsoft.com/office/word/2010/wordml" xmlns:w15="http://schemas.microsoft.com/office/word/2012/wordml" xmlns:w16cex="http://schemas.microsoft.com/office/word/2018/wordml/cex" xmlns:w16cid="http://schemas.microsoft.com/office/word/2016/wordml/cid" xmlns:w16="http://schemas.microsoft.com/office/word/2018/wordml" xmlns:w16du="http://schemas.microsoft.com/office/word/2023/wordml/word16du" xmlns:w16sdtdh="http://schemas.microsoft.com/office/word/2020/wordml/sdtdatahash" xmlns:w16se="http://schemas.microsoft.com/office/word/2015/wordml/symex" xmlns:wpg="http://schemas.microsoft.com/office/word/2010/wordprocessingGroup" xmlns:wpi="http://schemas.microsoft.com/office/word/2010/wordprocessingInk" xmlns:wne="http://schemas.microsoft.com/office/word/2006/wordml" xmlns:wps="http://schemas.microsoft.com/office/word/2010/wordprocessingShape" mc:Ignorable="w14 w15 w16se w16cid w16 w16cex w16sdtdh w16du wp14">
+  <w:abstractNum w:abstractNumId="0" w15:restartNumberingAfterBreak="0">
     <w:nsid w:val="002942AA"/>
     <w:multiLevelType w:val="hybridMultilevel"/>
     <w:tmpl w:val="83F0255C"/>
@@ -19704,7 +19589,7 @@
       </w:pPr>
     </w:lvl>
   </w:abstractNum>
-  <w:abstractNum w:abstractNumId="1">
+  <w:abstractNum w:abstractNumId="1" w15:restartNumberingAfterBreak="0">
     <w:nsid w:val="050A0021"/>
     <w:multiLevelType w:val="hybridMultilevel"/>
     <w:tmpl w:val="5C0A532E"/>
@@ -19790,7 +19675,7 @@
       </w:pPr>
     </w:lvl>
   </w:abstractNum>
-  <w:abstractNum w:abstractNumId="2">
+  <w:abstractNum w:abstractNumId="2" w15:restartNumberingAfterBreak="0">
     <w:nsid w:val="0D3E2F72"/>
     <w:multiLevelType w:val="hybridMultilevel"/>
     <w:tmpl w:val="D4985AD8"/>
@@ -19903,7 +19788,7 @@
       </w:rPr>
     </w:lvl>
   </w:abstractNum>
-  <w:abstractNum w:abstractNumId="3">
+  <w:abstractNum w:abstractNumId="3" w15:restartNumberingAfterBreak="0">
     <w:nsid w:val="13A548F6"/>
     <w:multiLevelType w:val="hybridMultilevel"/>
     <w:tmpl w:val="97EEF31C"/>
@@ -19989,7 +19874,7 @@
       </w:pPr>
     </w:lvl>
   </w:abstractNum>
-  <w:abstractNum w:abstractNumId="4">
+  <w:abstractNum w:abstractNumId="4" w15:restartNumberingAfterBreak="0">
     <w:nsid w:val="22E435A1"/>
     <w:multiLevelType w:val="hybridMultilevel"/>
     <w:tmpl w:val="83F0255C"/>
@@ -20075,7 +19960,7 @@
       </w:pPr>
     </w:lvl>
   </w:abstractNum>
-  <w:abstractNum w:abstractNumId="5">
+  <w:abstractNum w:abstractNumId="5" w15:restartNumberingAfterBreak="0">
     <w:nsid w:val="257C3D96"/>
     <w:multiLevelType w:val="multilevel"/>
     <w:tmpl w:val="EA96FCAC"/>
@@ -20224,7 +20109,7 @@
       </w:rPr>
     </w:lvl>
   </w:abstractNum>
-  <w:abstractNum w:abstractNumId="6">
+  <w:abstractNum w:abstractNumId="6" w15:restartNumberingAfterBreak="0">
     <w:nsid w:val="2B0D59BA"/>
     <w:multiLevelType w:val="hybridMultilevel"/>
     <w:tmpl w:val="4F6C47EE"/>
@@ -20313,7 +20198,7 @@
       </w:pPr>
     </w:lvl>
   </w:abstractNum>
-  <w:abstractNum w:abstractNumId="7">
+  <w:abstractNum w:abstractNumId="7" w15:restartNumberingAfterBreak="0">
     <w:nsid w:val="32FC31F8"/>
     <w:multiLevelType w:val="hybridMultilevel"/>
     <w:tmpl w:val="83F0255C"/>
@@ -20399,7 +20284,7 @@
       </w:pPr>
     </w:lvl>
   </w:abstractNum>
-  <w:abstractNum w:abstractNumId="8">
+  <w:abstractNum w:abstractNumId="8" w15:restartNumberingAfterBreak="0">
     <w:nsid w:val="3D9B18D7"/>
     <w:multiLevelType w:val="hybridMultilevel"/>
     <w:tmpl w:val="83F0255C"/>
@@ -20485,7 +20370,7 @@
       </w:pPr>
     </w:lvl>
   </w:abstractNum>
-  <w:abstractNum w:abstractNumId="9">
+  <w:abstractNum w:abstractNumId="9" w15:restartNumberingAfterBreak="0">
     <w:nsid w:val="3FE44EB8"/>
     <w:multiLevelType w:val="hybridMultilevel"/>
     <w:tmpl w:val="9BFA6D7A"/>
@@ -20598,7 +20483,7 @@
       </w:rPr>
     </w:lvl>
   </w:abstractNum>
-  <w:abstractNum w:abstractNumId="10">
+  <w:abstractNum w:abstractNumId="10" w15:restartNumberingAfterBreak="0">
     <w:nsid w:val="4432768E"/>
     <w:multiLevelType w:val="hybridMultilevel"/>
     <w:tmpl w:val="D43459DE"/>
@@ -20684,7 +20569,7 @@
       </w:pPr>
     </w:lvl>
   </w:abstractNum>
-  <w:abstractNum w:abstractNumId="11">
+  <w:abstractNum w:abstractNumId="11" w15:restartNumberingAfterBreak="0">
     <w:nsid w:val="47CC3126"/>
     <w:multiLevelType w:val="hybridMultilevel"/>
     <w:tmpl w:val="777C42F2"/>
@@ -20770,7 +20655,7 @@
       </w:pPr>
     </w:lvl>
   </w:abstractNum>
-  <w:abstractNum w:abstractNumId="12">
+  <w:abstractNum w:abstractNumId="12" w15:restartNumberingAfterBreak="0">
     <w:nsid w:val="4D0624D6"/>
     <w:multiLevelType w:val="multilevel"/>
     <w:tmpl w:val="D3783F7C"/>
@@ -20919,7 +20804,7 @@
       </w:rPr>
     </w:lvl>
   </w:abstractNum>
-  <w:abstractNum w:abstractNumId="13">
+  <w:abstractNum w:abstractNumId="13" w15:restartNumberingAfterBreak="0">
     <w:nsid w:val="5190363A"/>
     <w:multiLevelType w:val="hybridMultilevel"/>
     <w:tmpl w:val="520AC7A8"/>
@@ -21008,7 +20893,7 @@
       </w:pPr>
     </w:lvl>
   </w:abstractNum>
-  <w:abstractNum w:abstractNumId="14">
+  <w:abstractNum w:abstractNumId="14" w15:restartNumberingAfterBreak="0">
     <w:nsid w:val="56931A61"/>
     <w:multiLevelType w:val="hybridMultilevel"/>
     <w:tmpl w:val="83F0255C"/>
@@ -21094,7 +20979,7 @@
       </w:pPr>
     </w:lvl>
   </w:abstractNum>
-  <w:abstractNum w:abstractNumId="15">
+  <w:abstractNum w:abstractNumId="15" w15:restartNumberingAfterBreak="0">
     <w:nsid w:val="569E43CB"/>
     <w:multiLevelType w:val="multilevel"/>
     <w:tmpl w:val="F6E8E812"/>
@@ -21243,7 +21128,7 @@
       </w:rPr>
     </w:lvl>
   </w:abstractNum>
-  <w:abstractNum w:abstractNumId="16">
+  <w:abstractNum w:abstractNumId="16" w15:restartNumberingAfterBreak="0">
     <w:nsid w:val="60210B7D"/>
     <w:multiLevelType w:val="hybridMultilevel"/>
     <w:tmpl w:val="83F0255C"/>
@@ -21329,7 +21214,7 @@
       </w:pPr>
     </w:lvl>
   </w:abstractNum>
-  <w:abstractNum w:abstractNumId="17">
+  <w:abstractNum w:abstractNumId="17" w15:restartNumberingAfterBreak="0">
     <w:nsid w:val="62E245D1"/>
     <w:multiLevelType w:val="hybridMultilevel"/>
     <w:tmpl w:val="D7BCC384"/>
@@ -21418,7 +21303,7 @@
       </w:pPr>
     </w:lvl>
   </w:abstractNum>
-  <w:abstractNum w:abstractNumId="18">
+  <w:abstractNum w:abstractNumId="18" w15:restartNumberingAfterBreak="0">
     <w:nsid w:val="644F65D0"/>
     <w:multiLevelType w:val="hybridMultilevel"/>
     <w:tmpl w:val="83F0255C"/>
@@ -21504,7 +21389,7 @@
       </w:pPr>
     </w:lvl>
   </w:abstractNum>
-  <w:abstractNum w:abstractNumId="19">
+  <w:abstractNum w:abstractNumId="19" w15:restartNumberingAfterBreak="0">
     <w:nsid w:val="72592107"/>
     <w:multiLevelType w:val="hybridMultilevel"/>
     <w:tmpl w:val="11286B56"/>
@@ -21617,7 +21502,7 @@
       </w:rPr>
     </w:lvl>
   </w:abstractNum>
-  <w:abstractNum w:abstractNumId="20">
+  <w:abstractNum w:abstractNumId="20" w15:restartNumberingAfterBreak="0">
     <w:nsid w:val="748E3172"/>
     <w:multiLevelType w:val="multilevel"/>
     <w:tmpl w:val="45BCD31C"/>
@@ -21766,7 +21651,7 @@
       </w:rPr>
     </w:lvl>
   </w:abstractNum>
-  <w:abstractNum w:abstractNumId="21">
+  <w:abstractNum w:abstractNumId="21" w15:restartNumberingAfterBreak="0">
     <w:nsid w:val="7C1175E4"/>
     <w:multiLevelType w:val="multilevel"/>
     <w:tmpl w:val="B6CE8E78"/>
@@ -21879,7 +21764,7 @@
       </w:rPr>
     </w:lvl>
   </w:abstractNum>
-  <w:abstractNum w:abstractNumId="22">
+  <w:abstractNum w:abstractNumId="22" w15:restartNumberingAfterBreak="0">
     <w:nsid w:val="7DF02EF7"/>
     <w:multiLevelType w:val="hybridMultilevel"/>
     <w:tmpl w:val="5964D96A"/>
@@ -21968,7 +21853,7 @@
       </w:pPr>
     </w:lvl>
   </w:abstractNum>
-  <w:abstractNum w:abstractNumId="23">
+  <w:abstractNum w:abstractNumId="23" w15:restartNumberingAfterBreak="0">
     <w:nsid w:val="7F715C9C"/>
     <w:multiLevelType w:val="hybridMultilevel"/>
     <w:tmpl w:val="1AD0F918"/>
@@ -22054,83 +21939,83 @@
       </w:pPr>
     </w:lvl>
   </w:abstractNum>
-  <w:num w:numId="1">
+  <w:num w:numId="1" w16cid:durableId="726105833">
     <w:abstractNumId w:val="19"/>
   </w:num>
-  <w:num w:numId="2">
+  <w:num w:numId="2" w16cid:durableId="164631792">
     <w:abstractNumId w:val="17"/>
   </w:num>
-  <w:num w:numId="3">
+  <w:num w:numId="3" w16cid:durableId="1398360940">
     <w:abstractNumId w:val="22"/>
   </w:num>
-  <w:num w:numId="4">
+  <w:num w:numId="4" w16cid:durableId="31002741">
     <w:abstractNumId w:val="9"/>
   </w:num>
-  <w:num w:numId="5">
+  <w:num w:numId="5" w16cid:durableId="299767576">
     <w:abstractNumId w:val="13"/>
   </w:num>
-  <w:num w:numId="6">
+  <w:num w:numId="6" w16cid:durableId="78019515">
     <w:abstractNumId w:val="21"/>
   </w:num>
-  <w:num w:numId="7">
+  <w:num w:numId="7" w16cid:durableId="822430550">
     <w:abstractNumId w:val="2"/>
   </w:num>
-  <w:num w:numId="8">
+  <w:num w:numId="8" w16cid:durableId="613830234">
     <w:abstractNumId w:val="6"/>
   </w:num>
-  <w:num w:numId="9">
+  <w:num w:numId="9" w16cid:durableId="2035879944">
     <w:abstractNumId w:val="15"/>
   </w:num>
-  <w:num w:numId="10">
+  <w:num w:numId="10" w16cid:durableId="460347060">
     <w:abstractNumId w:val="12"/>
   </w:num>
-  <w:num w:numId="11">
+  <w:num w:numId="11" w16cid:durableId="974678597">
     <w:abstractNumId w:val="20"/>
   </w:num>
-  <w:num w:numId="12">
+  <w:num w:numId="12" w16cid:durableId="1299532726">
     <w:abstractNumId w:val="11"/>
   </w:num>
-  <w:num w:numId="13">
+  <w:num w:numId="13" w16cid:durableId="2089576056">
     <w:abstractNumId w:val="7"/>
   </w:num>
-  <w:num w:numId="14">
+  <w:num w:numId="14" w16cid:durableId="996811449">
     <w:abstractNumId w:val="10"/>
   </w:num>
-  <w:num w:numId="15">
+  <w:num w:numId="15" w16cid:durableId="1307659370">
     <w:abstractNumId w:val="23"/>
   </w:num>
-  <w:num w:numId="16">
+  <w:num w:numId="16" w16cid:durableId="129515834">
     <w:abstractNumId w:val="8"/>
   </w:num>
-  <w:num w:numId="17">
+  <w:num w:numId="17" w16cid:durableId="379407027">
     <w:abstractNumId w:val="16"/>
   </w:num>
-  <w:num w:numId="18">
+  <w:num w:numId="18" w16cid:durableId="1971551207">
     <w:abstractNumId w:val="14"/>
   </w:num>
-  <w:num w:numId="19">
+  <w:num w:numId="19" w16cid:durableId="833490541">
     <w:abstractNumId w:val="4"/>
   </w:num>
-  <w:num w:numId="20">
+  <w:num w:numId="20" w16cid:durableId="1770807754">
     <w:abstractNumId w:val="0"/>
   </w:num>
-  <w:num w:numId="21">
+  <w:num w:numId="21" w16cid:durableId="1669214799">
     <w:abstractNumId w:val="3"/>
   </w:num>
-  <w:num w:numId="22">
+  <w:num w:numId="22" w16cid:durableId="669794961">
     <w:abstractNumId w:val="18"/>
   </w:num>
-  <w:num w:numId="23">
+  <w:num w:numId="23" w16cid:durableId="483205302">
     <w:abstractNumId w:val="1"/>
   </w:num>
-  <w:num w:numId="24">
+  <w:num w:numId="24" w16cid:durableId="1872641843">
     <w:abstractNumId w:val="5"/>
   </w:num>
 </w:numbering>
 </file>
 
 <file path=word/styles.xml><?xml version="1.0" encoding="utf-8"?>
-<w:styles xmlns:mc="http://schemas.openxmlformats.org/markup-compatibility/2006" xmlns:r="http://schemas.openxmlformats.org/officeDocument/2006/relationships" xmlns:w="http://schemas.openxmlformats.org/wordprocessingml/2006/main" xmlns:w14="http://schemas.microsoft.com/office/word/2010/wordml" mc:Ignorable="w14">
+<w:styles xmlns:mc="http://schemas.openxmlformats.org/markup-compatibility/2006" xmlns:r="http://schemas.openxmlformats.org/officeDocument/2006/relationships" xmlns:w="http://schemas.openxmlformats.org/wordprocessingml/2006/main" xmlns:w14="http://schemas.microsoft.com/office/word/2010/wordml" xmlns:w15="http://schemas.microsoft.com/office/word/2012/wordml" xmlns:w16cex="http://schemas.microsoft.com/office/word/2018/wordml/cex" xmlns:w16cid="http://schemas.microsoft.com/office/word/2016/wordml/cid" xmlns:w16="http://schemas.microsoft.com/office/word/2018/wordml" xmlns:w16du="http://schemas.microsoft.com/office/word/2023/wordml/word16du" xmlns:w16sdtdh="http://schemas.microsoft.com/office/word/2020/wordml/sdtdatahash" xmlns:w16se="http://schemas.microsoft.com/office/word/2015/wordml/symex" mc:Ignorable="w14 w15 w16se w16cid w16 w16cex w16sdtdh w16du">
   <w:docDefaults>
     <w:rPrDefault>
       <w:rPr>
@@ -22146,587 +22031,383 @@
       </w:pPr>
     </w:pPrDefault>
   </w:docDefaults>
-  <w:latentStyles w:defLockedState="0" w:defUIPriority="99" w:defSemiHidden="1" w:defUnhideWhenUsed="1" w:defQFormat="0" w:count="267">
-    <w:lsdException w:name="Normal" w:semiHidden="0" w:uiPriority="0" w:unhideWhenUsed="0" w:qFormat="1"/>
-    <w:lsdException w:name="heading 1" w:semiHidden="0" w:uiPriority="9" w:unhideWhenUsed="0" w:qFormat="1"/>
-    <w:lsdException w:name="heading 2" w:uiPriority="9" w:qFormat="1"/>
-    <w:lsdException w:name="heading 3" w:uiPriority="9" w:qFormat="1"/>
-    <w:lsdException w:name="heading 4" w:uiPriority="9" w:qFormat="1"/>
-    <w:lsdException w:name="heading 5" w:uiPriority="9" w:qFormat="1"/>
-    <w:lsdException w:name="heading 6" w:uiPriority="9" w:qFormat="1"/>
-    <w:lsdException w:name="heading 7" w:uiPriority="9" w:qFormat="1"/>
-    <w:lsdException w:name="heading 8" w:uiPriority="9" w:qFormat="1"/>
-    <w:lsdException w:name="heading 9" w:uiPriority="9" w:qFormat="1"/>
-    <w:lsdException w:name="toc 1" w:uiPriority="39"/>
-    <w:lsdException w:name="toc 2" w:uiPriority="39"/>
-    <w:lsdException w:name="toc 3" w:uiPriority="39"/>
-    <w:lsdException w:name="toc 4" w:uiPriority="39"/>
-    <w:lsdException w:name="toc 5" w:uiPriority="39"/>
-    <w:lsdException w:name="toc 6" w:uiPriority="39"/>
-    <w:lsdException w:name="toc 7" w:uiPriority="39"/>
-    <w:lsdException w:name="toc 8" w:uiPriority="39"/>
-    <w:lsdException w:name="toc 9" w:uiPriority="39"/>
-    <w:lsdException w:name="caption" w:uiPriority="35" w:qFormat="1"/>
-    <w:lsdException w:name="Title" w:semiHidden="0" w:uiPriority="10" w:unhideWhenUsed="0" w:qFormat="1"/>
-    <w:lsdException w:name="Default Paragraph Font" w:uiPriority="1"/>
-    <w:lsdException w:name="Body Text" w:uiPriority="1" w:qFormat="1"/>
-    <w:lsdException w:name="Subtitle" w:semiHidden="0" w:uiPriority="11" w:unhideWhenUsed="0" w:qFormat="1"/>
-    <w:lsdException w:name="Strong" w:semiHidden="0" w:uiPriority="22" w:unhideWhenUsed="0" w:qFormat="1"/>
-    <w:lsdException w:name="Emphasis" w:semiHidden="0" w:uiPriority="20" w:unhideWhenUsed="0" w:qFormat="1"/>
-    <w:lsdException w:name="Table Grid" w:semiHidden="0" w:uiPriority="59" w:unhideWhenUsed="0"/>
-    <w:lsdException w:name="Placeholder Text" w:unhideWhenUsed="0"/>
-    <w:lsdException w:name="No Spacing" w:semiHidden="0" w:uiPriority="1" w:unhideWhenUsed="0" w:qFormat="1"/>
-    <w:lsdException w:name="Light Shading" w:semiHidden="0" w:uiPriority="60" w:unhideWhenUsed="0"/>
-    <w:lsdException w:name="Light List" w:semiHidden="0" w:uiPriority="61" w:unhideWhenUsed="0"/>
-    <w:lsdException w:name="Light Grid" w:semiHidden="0" w:uiPriority="62" w:unhideWhenUsed="0"/>
-    <w:lsdException w:name="Medium Shading 1" w:semiHidden="0" w:uiPriority="63" w:unhideWhenUsed="0"/>
-    <w:lsdException w:name="Medium Shading 2" w:semiHidden="0" w:uiPriority="64" w:unhideWhenUsed="0"/>
-    <w:lsdException w:name="Medium List 1" w:semiHidden="0" w:uiPriority="65" w:unhideWhenUsed="0"/>
-    <w:lsdException w:name="Medium List 2" w:semiHidden="0" w:uiPriority="66" w:unhideWhenUsed="0"/>
-    <w:lsdException w:name="Medium Grid 1" w:semiHidden="0" w:uiPriority="67" w:unhideWhenUsed="0"/>
-    <w:lsdException w:name="Medium Grid 2" w:semiHidden="0" w:uiPriority="68" w:unhideWhenUsed="0"/>
-    <w:lsdException w:name="Medium Grid 3" w:semiHidden="0" w:uiPriority="69" w:unhideWhenUsed="0"/>
-    <w:lsdException w:name="Dark List" w:semiHidden="0" w:uiPriority="70" w:unhideWhenUsed="0"/>
-    <w:lsdException w:name="Colorful Shading" w:semiHidden="0" w:uiPriority="71" w:unhideWhenUsed="0"/>
-    <w:lsdException w:name="Colorful List" w:semiHidden="0" w:uiPriority="72" w:unhideWhenUsed="0"/>
-    <w:lsdException w:name="Colorful Grid" w:semiHidden="0" w:uiPriority="73" w:unhideWhenUsed="0"/>
-    <w:lsdException w:name="Light Shading Accent 1" w:semiHidden="0" w:uiPriority="60" w:unhideWhenUsed="0"/>
-    <w:lsdException w:name="Light List Accent 1" w:semiHidden="0" w:uiPriority="61" w:unhideWhenUsed="0"/>
-    <w:lsdException w:name="Light Grid Accent 1" w:semiHidden="0" w:uiPriority="62" w:unhideWhenUsed="0"/>
-    <w:lsdException w:name="Medium Shading 1 Accent 1" w:semiHidden="0" w:uiPriority="63" w:unhideWhenUsed="0"/>
-    <w:lsdException w:name="Medium Shading 2 Accent 1" w:semiHidden="0" w:uiPriority="64" w:unhideWhenUsed="0"/>
-    <w:lsdException w:name="Medium List 1 Accent 1" w:semiHidden="0" w:uiPriority="65" w:unhideWhenUsed="0"/>
-    <w:lsdException w:name="Revision" w:unhideWhenUsed="0"/>
-    <w:lsdException w:name="List Paragraph" w:semiHidden="0" w:uiPriority="34" w:unhideWhenUsed="0" w:qFormat="1"/>
-    <w:lsdException w:name="Quote" w:semiHidden="0" w:uiPriority="29" w:unhideWhenUsed="0" w:qFormat="1"/>
-    <w:lsdException w:name="Intense Quote" w:semiHidden="0" w:uiPriority="30" w:unhideWhenUsed="0" w:qFormat="1"/>
-    <w:lsdException w:name="Medium List 2 Accent 1" w:semiHidden="0" w:uiPriority="66" w:unhideWhenUsed="0"/>
-    <w:lsdException w:name="Medium Grid 1 Accent 1" w:semiHidden="0" w:uiPriority="67" w:unhideWhenUsed="0"/>
-    <w:lsdException w:name="Medium Grid 2 Accent 1" w:semiHidden="0" w:uiPriority="68" w:unhideWhenUsed="0"/>
-    <w:lsdException w:name="Medium Grid 3 Accent 1" w:semiHidden="0" w:uiPriority="69" w:unhideWhenUsed="0"/>
-    <w:lsdException w:name="Dark List Accent 1" w:semiHidden="0" w:uiPriority="70" w:unhideWhenUsed="0"/>
-    <w:lsdException w:name="Colorful Shading Accent 1" w:semiHidden="0" w:uiPriority="71" w:unhideWhenUsed="0"/>
-    <w:lsdException w:name="Colorful List Accent 1" w:semiHidden="0" w:uiPriority="72" w:unhideWhenUsed="0"/>
-    <w:lsdException w:name="Colorful Grid Accent 1" w:semiHidden="0" w:uiPriority="73" w:unhideWhenUsed="0"/>
-    <w:lsdException w:name="Light Shading Accent 2" w:semiHidden="0" w:uiPriority="60" w:unhideWhenUsed="0"/>
-    <w:lsdException w:name="Light List Accent 2" w:semiHidden="0" w:uiPriority="61" w:unhideWhenUsed="0"/>
-    <w:lsdException w:name="Light Grid Accent 2" w:semiHidden="0" w:uiPriority="62" w:unhideWhenUsed="0"/>
-    <w:lsdException w:name="Medium Shading 1 Accent 2" w:semiHidden="0" w:uiPriority="63" w:unhideWhenUsed="0"/>
-    <w:lsdException w:name="Medium Shading 2 Accent 2" w:semiHidden="0" w:uiPriority="64" w:unhideWhenUsed="0"/>
-    <w:lsdException w:name="Medium List 1 Accent 2" w:semiHidden="0" w:uiPriority="65" w:unhideWhenUsed="0"/>
-    <w:lsdException w:name="Medium List 2 Accent 2" w:semiHidden="0" w:uiPriority="66" w:unhideWhenUsed="0"/>
-    <w:lsdException w:name="Medium Grid 1 Accent 2" w:semiHidden="0" w:uiPriority="67" w:unhideWhenUsed="0"/>
-    <w:lsdException w:name="Medium Grid 2 Accent 2" w:semiHidden="0" w:uiPriority="68" w:unhideWhenUsed="0"/>
-    <w:lsdException w:name="Medium Grid 3 Accent 2" w:semiHidden="0" w:uiPriority="69" w:unhideWhenUsed="0"/>
-    <w:lsdException w:name="Dark List Accent 2" w:semiHidden="0" w:uiPriority="70" w:unhideWhenUsed="0"/>
-    <w:lsdException w:name="Colorful Shading Accent 2" w:semiHidden="0" w:uiPriority="71" w:unhideWhenUsed="0"/>
-    <w:lsdException w:name="Colorful List Accent 2" w:semiHidden="0" w:uiPriority="72" w:unhideWhenUsed="0"/>
-    <w:lsdException w:name="Colorful Grid Accent 2" w:semiHidden="0" w:uiPriority="73" w:unhideWhenUsed="0"/>
-    <w:lsdException w:name="Light Shading Accent 3" w:semiHidden="0" w:uiPriority="60" w:unhideWhenUsed="0"/>
-    <w:lsdException w:name="Light List Accent 3" w:semiHidden="0" w:uiPriority="61" w:unhideWhenUsed="0"/>
-    <w:lsdException w:name="Light Grid Accent 3" w:semiHidden="0" w:uiPriority="62" w:unhideWhenUsed="0"/>
-    <w:lsdException w:name="Medium Shading 1 Accent 3" w:semiHidden="0" w:uiPriority="63" w:unhideWhenUsed="0"/>
-    <w:lsdException w:name="Medium Shading 2 Accent 3" w:semiHidden="0" w:uiPriority="64" w:unhideWhenUsed="0"/>
-    <w:lsdException w:name="Medium List 1 Accent 3" w:semiHidden="0" w:uiPriority="65" w:unhideWhenUsed="0"/>
-    <w:lsdException w:name="Medium List 2 Accent 3" w:semiHidden="0" w:uiPriority="66" w:unhideWhenUsed="0"/>
-    <w:lsdException w:name="Medium Grid 1 Accent 3" w:semiHidden="0" w:uiPriority="67" w:unhideWhenUsed="0"/>
-    <w:lsdException w:name="Medium Grid 2 Accent 3" w:semiHidden="0" w:uiPriority="68" w:unhideWhenUsed="0"/>
-    <w:lsdException w:name="Medium Grid 3 Accent 3" w:semiHidden="0" w:uiPriority="69" w:unhideWhenUsed="0"/>
-    <w:lsdException w:name="Dark List Accent 3" w:semiHidden="0" w:uiPriority="70" w:unhideWhenUsed="0"/>
-    <w:lsdException w:name="Colorful Shading Accent 3" w:semiHidden="0" w:uiPriority="71" w:unhideWhenUsed="0"/>
-    <w:lsdException w:name="Colorful List Accent 3" w:semiHidden="0" w:uiPriority="72" w:unhideWhenUsed="0"/>
-    <w:lsdException w:name="Colorful Grid Accent 3" w:semiHidden="0" w:uiPriority="73" w:unhideWhenUsed="0"/>
-    <w:lsdException w:name="Light Shading Accent 4" w:semiHidden="0" w:uiPriority="60" w:unhideWhenUsed="0"/>
-    <w:lsdException w:name="Light List Accent 4" w:semiHidden="0" w:uiPriority="61" w:unhideWhenUsed="0"/>
-    <w:lsdException w:name="Light Grid Accent 4" w:semiHidden="0" w:uiPriority="62" w:unhideWhenUsed="0"/>
-    <w:lsdException w:name="Medium Shading 1 Accent 4" w:semiHidden="0" w:uiPriority="63" w:unhideWhenUsed="0"/>
-    <w:lsdException w:name="Medium Shading 2 Accent 4" w:semiHidden="0" w:uiPriority="64" w:unhideWhenUsed="0"/>
-    <w:lsdException w:name="Medium List 1 Accent 4" w:semiHidden="0" w:uiPriority="65" w:unhideWhenUsed="0"/>
-    <w:lsdException w:name="Medium List 2 Accent 4" w:semiHidden="0" w:uiPriority="66" w:unhideWhenUsed="0"/>
-    <w:lsdException w:name="Medium Grid 1 Accent 4" w:semiHidden="0" w:uiPriority="67" w:unhideWhenUsed="0"/>
-    <w:lsdException w:name="Medium Grid 2 Accent 4" w:semiHidden="0" w:uiPriority="68" w:unhideWhenUsed="0"/>
-    <w:lsdException w:name="Medium Grid 3 Accent 4" w:semiHidden="0" w:uiPriority="69" w:unhideWhenUsed="0"/>
-    <w:lsdException w:name="Dark List Accent 4" w:semiHidden="0" w:uiPriority="70" w:unhideWhenUsed="0"/>
-    <w:lsdException w:name="Colorful Shading Accent 4" w:semiHidden="0" w:uiPriority="71" w:unhideWhenUsed="0"/>
-    <w:lsdException w:name="Colorful List Accent 4" w:semiHidden="0" w:uiPriority="72" w:unhideWhenUsed="0"/>
-    <w:lsdException w:name="Colorful Grid Accent 4" w:semiHidden="0" w:uiPriority="73" w:unhideWhenUsed="0"/>
-    <w:lsdException w:name="Light Shading Accent 5" w:semiHidden="0" w:uiPriority="60" w:unhideWhenUsed="0"/>
-    <w:lsdException w:name="Light List Accent 5" w:semiHidden="0" w:uiPriority="61" w:unhideWhenUsed="0"/>
-    <w:lsdException w:name="Light Grid Accent 5" w:semiHidden="0" w:uiPriority="62" w:unhideWhenUsed="0"/>
-    <w:lsdException w:name="Medium Shading 1 Accent 5" w:semiHidden="0" w:uiPriority="63" w:unhideWhenUsed="0"/>
-    <w:lsdException w:name="Medium Shading 2 Accent 5" w:semiHidden="0" w:uiPriority="64" w:unhideWhenUsed="0"/>
-    <w:lsdException w:name="Medium List 1 Accent 5" w:semiHidden="0" w:uiPriority="65" w:unhideWhenUsed="0"/>
-    <w:lsdException w:name="Medium List 2 Accent 5" w:semiHidden="0" w:uiPriority="66" w:unhideWhenUsed="0"/>
-    <w:lsdException w:name="Medium Grid 1 Accent 5" w:semiHidden="0" w:uiPriority="67" w:unhideWhenUsed="0"/>
-    <w:lsdException w:name="Medium Grid 2 Accent 5" w:semiHidden="0" w:uiPriority="68" w:unhideWhenUsed="0"/>
-    <w:lsdException w:name="Medium Grid 3 Accent 5" w:semiHidden="0" w:uiPriority="69" w:unhideWhenUsed="0"/>
-    <w:lsdException w:name="Dark List Accent 5" w:semiHidden="0" w:uiPriority="70" w:unhideWhenUsed="0"/>
-    <w:lsdException w:name="Colorful Shading Accent 5" w:semiHidden="0" w:uiPriority="71" w:unhideWhenUsed="0"/>
-    <w:lsdException w:name="Colorful List Accent 5" w:semiHidden="0" w:uiPriority="72" w:unhideWhenUsed="0"/>
-    <w:lsdException w:name="Colorful Grid Accent 5" w:semiHidden="0" w:uiPriority="73" w:unhideWhenUsed="0"/>
-    <w:lsdException w:name="Light Shading Accent 6" w:semiHidden="0" w:uiPriority="60" w:unhideWhenUsed="0"/>
-    <w:lsdException w:name="Light List Accent 6" w:semiHidden="0" w:uiPriority="61" w:unhideWhenUsed="0"/>
-    <w:lsdException w:name="Light Grid Accent 6" w:semiHidden="0" w:uiPriority="62" w:unhideWhenUsed="0"/>
-    <w:lsdException w:name="Medium Shading 1 Accent 6" w:semiHidden="0" w:uiPriority="63" w:unhideWhenUsed="0"/>
-    <w:lsdException w:name="Medium Shading 2 Accent 6" w:semiHidden="0" w:uiPriority="64" w:unhideWhenUsed="0"/>
-    <w:lsdException w:name="Medium List 1 Accent 6" w:semiHidden="0" w:uiPriority="65" w:unhideWhenUsed="0"/>
-    <w:lsdException w:name="Medium List 2 Accent 6" w:semiHidden="0" w:uiPriority="66" w:unhideWhenUsed="0"/>
-    <w:lsdException w:name="Medium Grid 1 Accent 6" w:semiHidden="0" w:uiPriority="67" w:unhideWhenUsed="0"/>
-    <w:lsdException w:name="Medium Grid 2 Accent 6" w:semiHidden="0" w:uiPriority="68" w:unhideWhenUsed="0"/>
-    <w:lsdException w:name="Medium Grid 3 Accent 6" w:semiHidden="0" w:uiPriority="69" w:unhideWhenUsed="0"/>
-    <w:lsdException w:name="Dark List Accent 6" w:semiHidden="0" w:uiPriority="70" w:unhideWhenUsed="0"/>
-    <w:lsdException w:name="Colorful Shading Accent 6" w:semiHidden="0" w:uiPriority="71" w:unhideWhenUsed="0"/>
-    <w:lsdException w:name="Colorful List Accent 6" w:semiHidden="0" w:uiPriority="72" w:unhideWhenUsed="0"/>
-    <w:lsdException w:name="Colorful Grid Accent 6" w:semiHidden="0" w:uiPriority="73" w:unhideWhenUsed="0"/>
-    <w:lsdException w:name="Subtle Emphasis" w:semiHidden="0" w:uiPriority="19" w:unhideWhenUsed="0" w:qFormat="1"/>
-    <w:lsdException w:name="Intense Emphasis" w:semiHidden="0" w:uiPriority="21" w:unhideWhenUsed="0" w:qFormat="1"/>
-    <w:lsdException w:name="Subtle Reference" w:semiHidden="0" w:uiPriority="31" w:unhideWhenUsed="0" w:qFormat="1"/>
-    <w:lsdException w:name="Intense Reference" w:semiHidden="0" w:uiPriority="32" w:unhideWhenUsed="0" w:qFormat="1"/>
-    <w:lsdException w:name="Book Title" w:semiHidden="0" w:uiPriority="33" w:unhideWhenUsed="0" w:qFormat="1"/>
-    <w:lsdException w:name="Bibliography" w:uiPriority="37"/>
-    <w:lsdException w:name="TOC Heading" w:uiPriority="39" w:qFormat="1"/>
-  </w:latentStyles>
-  <w:style w:type="paragraph" w:default="1" w:styleId="Normal">
-    <w:name w:val="Normal"/>
-    <w:qFormat/>
-    <w:rsid w:val="00124279"/>
-  </w:style>
-  <w:style w:type="paragraph" w:styleId="Heading3">
-    <w:name w:val="heading 3"/>
-    <w:basedOn w:val="Normal"/>
-    <w:next w:val="Normal"/>
-    <w:link w:val="Heading3Char"/>
-    <w:uiPriority w:val="9"/>
-    <w:semiHidden/>
-    <w:unhideWhenUsed/>
-    <w:qFormat/>
-    <w:rsid w:val="001D691F"/>
-    <w:pPr>
-      <w:keepNext/>
-      <w:keepLines/>
-      <w:spacing w:before="200" w:after="0"/>
-      <w:outlineLvl w:val="2"/>
-    </w:pPr>
-    <w:rPr>
-      <w:rFonts w:asciiTheme="majorHAnsi" w:eastAsiaTheme="majorEastAsia" w:hAnsiTheme="majorHAnsi" w:cstheme="majorBidi"/>
-      <w:b/>
-      <w:bCs/>
-      <w:color w:val="4F81BD" w:themeColor="accent1"/>
-    </w:rPr>
-  </w:style>
-  <w:style w:type="paragraph" w:styleId="Heading4">
-    <w:name w:val="heading 4"/>
-    <w:basedOn w:val="Normal"/>
-    <w:link w:val="Heading4Char"/>
-    <w:uiPriority w:val="9"/>
-    <w:qFormat/>
-    <w:rsid w:val="00FA180C"/>
-    <w:pPr>
-      <w:widowControl w:val="0"/>
-      <w:autoSpaceDE w:val="0"/>
-      <w:autoSpaceDN w:val="0"/>
-      <w:spacing w:after="0" w:line="240" w:lineRule="auto"/>
-      <w:ind w:left="1346"/>
-      <w:outlineLvl w:val="3"/>
-    </w:pPr>
-    <w:rPr>
-      <w:rFonts w:ascii="Verdana" w:eastAsia="Times New Roman" w:hAnsi="Verdana" w:cs="Verdana"/>
-      <w:b/>
-      <w:bCs/>
-      <w:sz w:val="18"/>
-      <w:szCs w:val="18"/>
-      <w:lang w:val="en-US"/>
-    </w:rPr>
-  </w:style>
-  <w:style w:type="character" w:default="1" w:styleId="DefaultParagraphFont">
-    <w:name w:val="Default Paragraph Font"/>
-    <w:uiPriority w:val="1"/>
-    <w:semiHidden/>
-    <w:unhideWhenUsed/>
-  </w:style>
-  <w:style w:type="table" w:default="1" w:styleId="TableNormal">
-    <w:name w:val="Normal Table"/>
-    <w:uiPriority w:val="99"/>
-    <w:semiHidden/>
-    <w:unhideWhenUsed/>
-    <w:tblPr>
-      <w:tblInd w:w="0" w:type="dxa"/>
-      <w:tblCellMar>
-        <w:top w:w="0" w:type="dxa"/>
-        <w:left w:w="108" w:type="dxa"/>
-        <w:bottom w:w="0" w:type="dxa"/>
-        <w:right w:w="108" w:type="dxa"/>
-      </w:tblCellMar>
-    </w:tblPr>
-  </w:style>
-  <w:style w:type="numbering" w:default="1" w:styleId="NoList">
-    <w:name w:val="No List"/>
-    <w:uiPriority w:val="99"/>
-    <w:semiHidden/>
-    <w:unhideWhenUsed/>
-  </w:style>
-  <w:style w:type="table" w:styleId="TableGrid">
-    <w:name w:val="Table Grid"/>
-    <w:aliases w:val="unBiet tin gi chua,vao day coi di   http://www.freewebtown.com/gaigoisaigon/"/>
-    <w:basedOn w:val="TableNormal"/>
-    <w:uiPriority w:val="59"/>
-    <w:rsid w:val="008F678E"/>
-    <w:pPr>
-      <w:spacing w:after="0" w:line="240" w:lineRule="auto"/>
-    </w:pPr>
-    <w:tblPr>
-      <w:tblBorders>
-        <w:top w:val="single" w:sz="4" w:space="0" w:color="auto"/>
-        <w:left w:val="single" w:sz="4" w:space="0" w:color="auto"/>
-        <w:bottom w:val="single" w:sz="4" w:space="0" w:color="auto"/>
-        <w:right w:val="single" w:sz="4" w:space="0" w:color="auto"/>
-        <w:insideH w:val="single" w:sz="4" w:space="0" w:color="auto"/>
-        <w:insideV w:val="single" w:sz="4" w:space="0" w:color="auto"/>
-      </w:tblBorders>
-    </w:tblPr>
-  </w:style>
-  <w:style w:type="paragraph" w:styleId="ListParagraph">
-    <w:name w:val="List Paragraph"/>
-    <w:basedOn w:val="Normal"/>
-    <w:link w:val="ListParagraphChar"/>
-    <w:uiPriority w:val="34"/>
-    <w:qFormat/>
-    <w:rsid w:val="00FA180C"/>
-    <w:pPr>
-      <w:widowControl w:val="0"/>
-      <w:autoSpaceDE w:val="0"/>
-      <w:autoSpaceDN w:val="0"/>
-      <w:spacing w:after="0" w:line="240" w:lineRule="auto"/>
-      <w:ind w:left="1764"/>
-    </w:pPr>
-    <w:rPr>
-      <w:rFonts w:ascii="Verdana" w:eastAsia="Times New Roman" w:hAnsi="Verdana" w:cs="Verdana"/>
-      <w:lang w:val="en-US"/>
-    </w:rPr>
-  </w:style>
-  <w:style w:type="character" w:customStyle="1" w:styleId="ListParagraphChar">
-    <w:name w:val="List Paragraph Char"/>
-    <w:link w:val="ListParagraph"/>
-    <w:uiPriority w:val="34"/>
-    <w:locked/>
-    <w:rsid w:val="00FA180C"/>
-    <w:rPr>
-      <w:rFonts w:ascii="Verdana" w:eastAsia="Times New Roman" w:hAnsi="Verdana" w:cs="Verdana"/>
-      <w:lang w:val="en-US"/>
-    </w:rPr>
-  </w:style>
-  <w:style w:type="character" w:customStyle="1" w:styleId="Heading4Char">
-    <w:name w:val="Heading 4 Char"/>
-    <w:basedOn w:val="DefaultParagraphFont"/>
-    <w:link w:val="Heading4"/>
-    <w:uiPriority w:val="9"/>
-    <w:rsid w:val="00FA180C"/>
-    <w:rPr>
-      <w:rFonts w:ascii="Verdana" w:eastAsia="Times New Roman" w:hAnsi="Verdana" w:cs="Verdana"/>
-      <w:b/>
-      <w:bCs/>
-      <w:sz w:val="18"/>
-      <w:szCs w:val="18"/>
-      <w:lang w:val="en-US"/>
-    </w:rPr>
-  </w:style>
-  <w:style w:type="paragraph" w:styleId="NormalWeb">
-    <w:name w:val="Normal (Web)"/>
-    <w:basedOn w:val="Normal"/>
-    <w:uiPriority w:val="99"/>
-    <w:semiHidden/>
-    <w:unhideWhenUsed/>
-    <w:rsid w:val="00CB56E0"/>
-    <w:pPr>
-      <w:spacing w:before="100" w:beforeAutospacing="1" w:after="100" w:afterAutospacing="1" w:line="240" w:lineRule="auto"/>
-    </w:pPr>
-    <w:rPr>
-      <w:rFonts w:ascii="Times New Roman" w:eastAsia="Times New Roman" w:hAnsi="Times New Roman" w:cs="Times New Roman"/>
-      <w:sz w:val="24"/>
-      <w:szCs w:val="24"/>
-      <w:lang w:eastAsia="en-IN" w:bidi="mr-IN"/>
-    </w:rPr>
-  </w:style>
-  <w:style w:type="paragraph" w:styleId="BodyText">
-    <w:name w:val="Body Text"/>
-    <w:basedOn w:val="Normal"/>
-    <w:link w:val="BodyTextChar"/>
-    <w:uiPriority w:val="1"/>
-    <w:qFormat/>
-    <w:rsid w:val="001A3FA0"/>
-    <w:pPr>
-      <w:widowControl w:val="0"/>
-      <w:autoSpaceDE w:val="0"/>
-      <w:autoSpaceDN w:val="0"/>
-      <w:spacing w:after="0" w:line="240" w:lineRule="auto"/>
-    </w:pPr>
-    <w:rPr>
-      <w:rFonts w:ascii="Verdana" w:eastAsia="Verdana" w:hAnsi="Verdana" w:cs="Verdana"/>
-      <w:sz w:val="18"/>
-      <w:szCs w:val="18"/>
-      <w:lang w:val="en-US"/>
-    </w:rPr>
-  </w:style>
-  <w:style w:type="character" w:customStyle="1" w:styleId="BodyTextChar">
-    <w:name w:val="Body Text Char"/>
-    <w:basedOn w:val="DefaultParagraphFont"/>
-    <w:link w:val="BodyText"/>
-    <w:uiPriority w:val="1"/>
-    <w:rsid w:val="001A3FA0"/>
-    <w:rPr>
-      <w:rFonts w:ascii="Verdana" w:eastAsia="Verdana" w:hAnsi="Verdana" w:cs="Verdana"/>
-      <w:sz w:val="18"/>
-      <w:szCs w:val="18"/>
-      <w:lang w:val="en-US"/>
-    </w:rPr>
-  </w:style>
-  <w:style w:type="paragraph" w:styleId="Header">
-    <w:name w:val="header"/>
-    <w:basedOn w:val="Normal"/>
-    <w:link w:val="HeaderChar"/>
-    <w:uiPriority w:val="99"/>
-    <w:unhideWhenUsed/>
-    <w:rsid w:val="007A645E"/>
-    <w:pPr>
-      <w:tabs>
-        <w:tab w:val="center" w:pos="4513"/>
-        <w:tab w:val="right" w:pos="9026"/>
-      </w:tabs>
-      <w:spacing w:after="0" w:line="240" w:lineRule="auto"/>
-    </w:pPr>
-  </w:style>
-  <w:style w:type="character" w:customStyle="1" w:styleId="HeaderChar">
-    <w:name w:val="Header Char"/>
-    <w:basedOn w:val="DefaultParagraphFont"/>
-    <w:link w:val="Header"/>
-    <w:uiPriority w:val="99"/>
-    <w:rsid w:val="007A645E"/>
-  </w:style>
-  <w:style w:type="paragraph" w:styleId="Footer">
-    <w:name w:val="footer"/>
-    <w:basedOn w:val="Normal"/>
-    <w:link w:val="FooterChar"/>
-    <w:uiPriority w:val="99"/>
-    <w:unhideWhenUsed/>
-    <w:rsid w:val="007A645E"/>
-    <w:pPr>
-      <w:tabs>
-        <w:tab w:val="center" w:pos="4513"/>
-        <w:tab w:val="right" w:pos="9026"/>
-      </w:tabs>
-      <w:spacing w:after="0" w:line="240" w:lineRule="auto"/>
-    </w:pPr>
-  </w:style>
-  <w:style w:type="character" w:customStyle="1" w:styleId="FooterChar">
-    <w:name w:val="Footer Char"/>
-    <w:basedOn w:val="DefaultParagraphFont"/>
-    <w:link w:val="Footer"/>
-    <w:uiPriority w:val="99"/>
-    <w:rsid w:val="007A645E"/>
-  </w:style>
-  <w:style w:type="paragraph" w:styleId="BalloonText">
-    <w:name w:val="Balloon Text"/>
-    <w:basedOn w:val="Normal"/>
-    <w:link w:val="BalloonTextChar"/>
-    <w:uiPriority w:val="99"/>
-    <w:semiHidden/>
-    <w:unhideWhenUsed/>
-    <w:rsid w:val="00570A52"/>
-    <w:pPr>
-      <w:spacing w:after="0" w:line="240" w:lineRule="auto"/>
-    </w:pPr>
-    <w:rPr>
-      <w:rFonts w:ascii="Tahoma" w:hAnsi="Tahoma" w:cs="Tahoma"/>
-      <w:sz w:val="16"/>
-      <w:szCs w:val="16"/>
-    </w:rPr>
-  </w:style>
-  <w:style w:type="character" w:customStyle="1" w:styleId="BalloonTextChar">
-    <w:name w:val="Balloon Text Char"/>
-    <w:basedOn w:val="DefaultParagraphFont"/>
-    <w:link w:val="BalloonText"/>
-    <w:uiPriority w:val="99"/>
-    <w:semiHidden/>
-    <w:rsid w:val="00570A52"/>
-    <w:rPr>
-      <w:rFonts w:ascii="Tahoma" w:hAnsi="Tahoma" w:cs="Tahoma"/>
-      <w:sz w:val="16"/>
-      <w:szCs w:val="16"/>
-    </w:rPr>
-  </w:style>
-  <w:style w:type="character" w:customStyle="1" w:styleId="Heading3Char">
-    <w:name w:val="Heading 3 Char"/>
-    <w:basedOn w:val="DefaultParagraphFont"/>
-    <w:link w:val="Heading3"/>
-    <w:uiPriority w:val="9"/>
-    <w:semiHidden/>
-    <w:rsid w:val="001D691F"/>
-    <w:rPr>
-      <w:rFonts w:asciiTheme="majorHAnsi" w:eastAsiaTheme="majorEastAsia" w:hAnsiTheme="majorHAnsi" w:cstheme="majorBidi"/>
-      <w:b/>
-      <w:bCs/>
-      <w:color w:val="4F81BD" w:themeColor="accent1"/>
-    </w:rPr>
-  </w:style>
-</w:styles>
-</file>
-
-<file path=word/stylesWithEffects.xml><?xml version="1.0" encoding="utf-8"?>
-<w:styles xmlns:wpc="http://schemas.microsoft.com/office/word/2010/wordprocessingCanvas" xmlns:mc="http://schemas.openxmlformats.org/markup-compatibility/2006" xmlns:o="urn:schemas-microsoft-com:office:office" xmlns:r="http://schemas.openxmlformats.org/officeDocument/2006/relationships" xmlns:m="http://schemas.openxmlformats.org/officeDocument/2006/math" xmlns:v="urn:schemas-microsoft-com:vml" xmlns:wp14="http://schemas.microsoft.com/office/word/2010/wordprocessingDrawing" xmlns:wp="http://schemas.openxmlformats.org/drawingml/2006/wordprocessingDrawing" xmlns:w10="urn:schemas-microsoft-com:office:word" xmlns:w="http://schemas.openxmlformats.org/wordprocessingml/2006/main" xmlns:w14="http://schemas.microsoft.com/office/word/2010/wordml" xmlns:wpg="http://schemas.microsoft.com/office/word/2010/wordprocessingGroup" xmlns:wpi="http://schemas.microsoft.com/office/word/2010/wordprocessingInk" xmlns:wne="http://schemas.microsoft.com/office/word/2006/wordml" xmlns:wps="http://schemas.microsoft.com/office/word/2010/wordprocessingShape" mc:Ignorable="w14 wp14">
-  <w:docDefaults>
-    <w:rPrDefault>
-      <w:rPr>
-        <w:rFonts w:asciiTheme="minorHAnsi" w:eastAsiaTheme="minorHAnsi" w:hAnsiTheme="minorHAnsi" w:cstheme="minorBidi"/>
-        <w:sz w:val="22"/>
-        <w:szCs w:val="22"/>
-        <w:lang w:val="en-IN" w:eastAsia="en-US" w:bidi="ar-SA"/>
-      </w:rPr>
-    </w:rPrDefault>
-    <w:pPrDefault>
-      <w:pPr>
-        <w:spacing w:after="200" w:line="276" w:lineRule="auto"/>
-      </w:pPr>
-    </w:pPrDefault>
-  </w:docDefaults>
-  <w:latentStyles w:defLockedState="0" w:defUIPriority="99" w:defSemiHidden="1" w:defUnhideWhenUsed="1" w:defQFormat="0" w:count="267">
-    <w:lsdException w:name="Normal" w:semiHidden="0" w:uiPriority="0" w:unhideWhenUsed="0" w:qFormat="1"/>
-    <w:lsdException w:name="heading 1" w:semiHidden="0" w:uiPriority="9" w:unhideWhenUsed="0" w:qFormat="1"/>
-    <w:lsdException w:name="heading 2" w:uiPriority="9" w:qFormat="1"/>
-    <w:lsdException w:name="heading 3" w:uiPriority="9" w:qFormat="1"/>
-    <w:lsdException w:name="heading 4" w:uiPriority="9" w:qFormat="1"/>
-    <w:lsdException w:name="heading 5" w:uiPriority="9" w:qFormat="1"/>
-    <w:lsdException w:name="heading 6" w:uiPriority="9" w:qFormat="1"/>
-    <w:lsdException w:name="heading 7" w:uiPriority="9" w:qFormat="1"/>
-    <w:lsdException w:name="heading 8" w:uiPriority="9" w:qFormat="1"/>
-    <w:lsdException w:name="heading 9" w:uiPriority="9" w:qFormat="1"/>
-    <w:lsdException w:name="toc 1" w:uiPriority="39"/>
-    <w:lsdException w:name="toc 2" w:uiPriority="39"/>
-    <w:lsdException w:name="toc 3" w:uiPriority="39"/>
-    <w:lsdException w:name="toc 4" w:uiPriority="39"/>
-    <w:lsdException w:name="toc 5" w:uiPriority="39"/>
-    <w:lsdException w:name="toc 6" w:uiPriority="39"/>
-    <w:lsdException w:name="toc 7" w:uiPriority="39"/>
-    <w:lsdException w:name="toc 8" w:uiPriority="39"/>
-    <w:lsdException w:name="toc 9" w:uiPriority="39"/>
-    <w:lsdException w:name="caption" w:uiPriority="35" w:qFormat="1"/>
-    <w:lsdException w:name="Title" w:semiHidden="0" w:uiPriority="10" w:unhideWhenUsed="0" w:qFormat="1"/>
-    <w:lsdException w:name="Default Paragraph Font" w:uiPriority="1"/>
-    <w:lsdException w:name="Body Text" w:uiPriority="1" w:qFormat="1"/>
-    <w:lsdException w:name="Subtitle" w:semiHidden="0" w:uiPriority="11" w:unhideWhenUsed="0" w:qFormat="1"/>
-    <w:lsdException w:name="Strong" w:semiHidden="0" w:uiPriority="22" w:unhideWhenUsed="0" w:qFormat="1"/>
-    <w:lsdException w:name="Emphasis" w:semiHidden="0" w:uiPriority="20" w:unhideWhenUsed="0" w:qFormat="1"/>
-    <w:lsdException w:name="Table Grid" w:semiHidden="0" w:uiPriority="59" w:unhideWhenUsed="0"/>
-    <w:lsdException w:name="Placeholder Text" w:unhideWhenUsed="0"/>
-    <w:lsdException w:name="No Spacing" w:semiHidden="0" w:uiPriority="1" w:unhideWhenUsed="0" w:qFormat="1"/>
-    <w:lsdException w:name="Light Shading" w:semiHidden="0" w:uiPriority="60" w:unhideWhenUsed="0"/>
-    <w:lsdException w:name="Light List" w:semiHidden="0" w:uiPriority="61" w:unhideWhenUsed="0"/>
-    <w:lsdException w:name="Light Grid" w:semiHidden="0" w:uiPriority="62" w:unhideWhenUsed="0"/>
-    <w:lsdException w:name="Medium Shading 1" w:semiHidden="0" w:uiPriority="63" w:unhideWhenUsed="0"/>
-    <w:lsdException w:name="Medium Shading 2" w:semiHidden="0" w:uiPriority="64" w:unhideWhenUsed="0"/>
-    <w:lsdException w:name="Medium List 1" w:semiHidden="0" w:uiPriority="65" w:unhideWhenUsed="0"/>
-    <w:lsdException w:name="Medium List 2" w:semiHidden="0" w:uiPriority="66" w:unhideWhenUsed="0"/>
-    <w:lsdException w:name="Medium Grid 1" w:semiHidden="0" w:uiPriority="67" w:unhideWhenUsed="0"/>
-    <w:lsdException w:name="Medium Grid 2" w:semiHidden="0" w:uiPriority="68" w:unhideWhenUsed="0"/>
-    <w:lsdException w:name="Medium Grid 3" w:semiHidden="0" w:uiPriority="69" w:unhideWhenUsed="0"/>
-    <w:lsdException w:name="Dark List" w:semiHidden="0" w:uiPriority="70" w:unhideWhenUsed="0"/>
-    <w:lsdException w:name="Colorful Shading" w:semiHidden="0" w:uiPriority="71" w:unhideWhenUsed="0"/>
-    <w:lsdException w:name="Colorful List" w:semiHidden="0" w:uiPriority="72" w:unhideWhenUsed="0"/>
-    <w:lsdException w:name="Colorful Grid" w:semiHidden="0" w:uiPriority="73" w:unhideWhenUsed="0"/>
-    <w:lsdException w:name="Light Shading Accent 1" w:semiHidden="0" w:uiPriority="60" w:unhideWhenUsed="0"/>
-    <w:lsdException w:name="Light List Accent 1" w:semiHidden="0" w:uiPriority="61" w:unhideWhenUsed="0"/>
-    <w:lsdException w:name="Light Grid Accent 1" w:semiHidden="0" w:uiPriority="62" w:unhideWhenUsed="0"/>
-    <w:lsdException w:name="Medium Shading 1 Accent 1" w:semiHidden="0" w:uiPriority="63" w:unhideWhenUsed="0"/>
-    <w:lsdException w:name="Medium Shading 2 Accent 1" w:semiHidden="0" w:uiPriority="64" w:unhideWhenUsed="0"/>
-    <w:lsdException w:name="Medium List 1 Accent 1" w:semiHidden="0" w:uiPriority="65" w:unhideWhenUsed="0"/>
-    <w:lsdException w:name="Revision" w:unhideWhenUsed="0"/>
-    <w:lsdException w:name="List Paragraph" w:semiHidden="0" w:uiPriority="34" w:unhideWhenUsed="0" w:qFormat="1"/>
-    <w:lsdException w:name="Quote" w:semiHidden="0" w:uiPriority="29" w:unhideWhenUsed="0" w:qFormat="1"/>
-    <w:lsdException w:name="Intense Quote" w:semiHidden="0" w:uiPriority="30" w:unhideWhenUsed="0" w:qFormat="1"/>
-    <w:lsdException w:name="Medium List 2 Accent 1" w:semiHidden="0" w:uiPriority="66" w:unhideWhenUsed="0"/>
-    <w:lsdException w:name="Medium Grid 1 Accent 1" w:semiHidden="0" w:uiPriority="67" w:unhideWhenUsed="0"/>
-    <w:lsdException w:name="Medium Grid 2 Accent 1" w:semiHidden="0" w:uiPriority="68" w:unhideWhenUsed="0"/>
-    <w:lsdException w:name="Medium Grid 3 Accent 1" w:semiHidden="0" w:uiPriority="69" w:unhideWhenUsed="0"/>
-    <w:lsdException w:name="Dark List Accent 1" w:semiHidden="0" w:uiPriority="70" w:unhideWhenUsed="0"/>
-    <w:lsdException w:name="Colorful Shading Accent 1" w:semiHidden="0" w:uiPriority="71" w:unhideWhenUsed="0"/>
-    <w:lsdException w:name="Colorful List Accent 1" w:semiHidden="0" w:uiPriority="72" w:unhideWhenUsed="0"/>
-    <w:lsdException w:name="Colorful Grid Accent 1" w:semiHidden="0" w:uiPriority="73" w:unhideWhenUsed="0"/>
-    <w:lsdException w:name="Light Shading Accent 2" w:semiHidden="0" w:uiPriority="60" w:unhideWhenUsed="0"/>
-    <w:lsdException w:name="Light List Accent 2" w:semiHidden="0" w:uiPriority="61" w:unhideWhenUsed="0"/>
-    <w:lsdException w:name="Light Grid Accent 2" w:semiHidden="0" w:uiPriority="62" w:unhideWhenUsed="0"/>
-    <w:lsdException w:name="Medium Shading 1 Accent 2" w:semiHidden="0" w:uiPriority="63" w:unhideWhenUsed="0"/>
-    <w:lsdException w:name="Medium Shading 2 Accent 2" w:semiHidden="0" w:uiPriority="64" w:unhideWhenUsed="0"/>
-    <w:lsdException w:name="Medium List 1 Accent 2" w:semiHidden="0" w:uiPriority="65" w:unhideWhenUsed="0"/>
-    <w:lsdException w:name="Medium List 2 Accent 2" w:semiHidden="0" w:uiPriority="66" w:unhideWhenUsed="0"/>
-    <w:lsdException w:name="Medium Grid 1 Accent 2" w:semiHidden="0" w:uiPriority="67" w:unhideWhenUsed="0"/>
-    <w:lsdException w:name="Medium Grid 2 Accent 2" w:semiHidden="0" w:uiPriority="68" w:unhideWhenUsed="0"/>
-    <w:lsdException w:name="Medium Grid 3 Accent 2" w:semiHidden="0" w:uiPriority="69" w:unhideWhenUsed="0"/>
-    <w:lsdException w:name="Dark List Accent 2" w:semiHidden="0" w:uiPriority="70" w:unhideWhenUsed="0"/>
-    <w:lsdException w:name="Colorful Shading Accent 2" w:semiHidden="0" w:uiPriority="71" w:unhideWhenUsed="0"/>
-    <w:lsdException w:name="Colorful List Accent 2" w:semiHidden="0" w:uiPriority="72" w:unhideWhenUsed="0"/>
-    <w:lsdException w:name="Colorful Grid Accent 2" w:semiHidden="0" w:uiPriority="73" w:unhideWhenUsed="0"/>
-    <w:lsdException w:name="Light Shading Accent 3" w:semiHidden="0" w:uiPriority="60" w:unhideWhenUsed="0"/>
-    <w:lsdException w:name="Light List Accent 3" w:semiHidden="0" w:uiPriority="61" w:unhideWhenUsed="0"/>
-    <w:lsdException w:name="Light Grid Accent 3" w:semiHidden="0" w:uiPriority="62" w:unhideWhenUsed="0"/>
-    <w:lsdException w:name="Medium Shading 1 Accent 3" w:semiHidden="0" w:uiPriority="63" w:unhideWhenUsed="0"/>
-    <w:lsdException w:name="Medium Shading 2 Accent 3" w:semiHidden="0" w:uiPriority="64" w:unhideWhenUsed="0"/>
-    <w:lsdException w:name="Medium List 1 Accent 3" w:semiHidden="0" w:uiPriority="65" w:unhideWhenUsed="0"/>
-    <w:lsdException w:name="Medium List 2 Accent 3" w:semiHidden="0" w:uiPriority="66" w:unhideWhenUsed="0"/>
-    <w:lsdException w:name="Medium Grid 1 Accent 3" w:semiHidden="0" w:uiPriority="67" w:unhideWhenUsed="0"/>
-    <w:lsdException w:name="Medium Grid 2 Accent 3" w:semiHidden="0" w:uiPriority="68" w:unhideWhenUsed="0"/>
-    <w:lsdException w:name="Medium Grid 3 Accent 3" w:semiHidden="0" w:uiPriority="69" w:unhideWhenUsed="0"/>
-    <w:lsdException w:name="Dark List Accent 3" w:semiHidden="0" w:uiPriority="70" w:unhideWhenUsed="0"/>
-    <w:lsdException w:name="Colorful Shading Accent 3" w:semiHidden="0" w:uiPriority="71" w:unhideWhenUsed="0"/>
-    <w:lsdException w:name="Colorful List Accent 3" w:semiHidden="0" w:uiPriority="72" w:unhideWhenUsed="0"/>
-    <w:lsdException w:name="Colorful Grid Accent 3" w:semiHidden="0" w:uiPriority="73" w:unhideWhenUsed="0"/>
-    <w:lsdException w:name="Light Shading Accent 4" w:semiHidden="0" w:uiPriority="60" w:unhideWhenUsed="0"/>
-    <w:lsdException w:name="Light List Accent 4" w:semiHidden="0" w:uiPriority="61" w:unhideWhenUsed="0"/>
-    <w:lsdException w:name="Light Grid Accent 4" w:semiHidden="0" w:uiPriority="62" w:unhideWhenUsed="0"/>
-    <w:lsdException w:name="Medium Shading 1 Accent 4" w:semiHidden="0" w:uiPriority="63" w:unhideWhenUsed="0"/>
-    <w:lsdException w:name="Medium Shading 2 Accent 4" w:semiHidden="0" w:uiPriority="64" w:unhideWhenUsed="0"/>
-    <w:lsdException w:name="Medium List 1 Accent 4" w:semiHidden="0" w:uiPriority="65" w:unhideWhenUsed="0"/>
-    <w:lsdException w:name="Medium List 2 Accent 4" w:semiHidden="0" w:uiPriority="66" w:unhideWhenUsed="0"/>
-    <w:lsdException w:name="Medium Grid 1 Accent 4" w:semiHidden="0" w:uiPriority="67" w:unhideWhenUsed="0"/>
-    <w:lsdException w:name="Medium Grid 2 Accent 4" w:semiHidden="0" w:uiPriority="68" w:unhideWhenUsed="0"/>
-    <w:lsdException w:name="Medium Grid 3 Accent 4" w:semiHidden="0" w:uiPriority="69" w:unhideWhenUsed="0"/>
-    <w:lsdException w:name="Dark List Accent 4" w:semiHidden="0" w:uiPriority="70" w:unhideWhenUsed="0"/>
-    <w:lsdException w:name="Colorful Shading Accent 4" w:semiHidden="0" w:uiPriority="71" w:unhideWhenUsed="0"/>
-    <w:lsdException w:name="Colorful List Accent 4" w:semiHidden="0" w:uiPriority="72" w:unhideWhenUsed="0"/>
-    <w:lsdException w:name="Colorful Grid Accent 4" w:semiHidden="0" w:uiPriority="73" w:unhideWhenUsed="0"/>
-    <w:lsdException w:name="Light Shading Accent 5" w:semiHidden="0" w:uiPriority="60" w:unhideWhenUsed="0"/>
-    <w:lsdException w:name="Light List Accent 5" w:semiHidden="0" w:uiPriority="61" w:unhideWhenUsed="0"/>
-    <w:lsdException w:name="Light Grid Accent 5" w:semiHidden="0" w:uiPriority="62" w:unhideWhenUsed="0"/>
-    <w:lsdException w:name="Medium Shading 1 Accent 5" w:semiHidden="0" w:uiPriority="63" w:unhideWhenUsed="0"/>
-    <w:lsdException w:name="Medium Shading 2 Accent 5" w:semiHidden="0" w:uiPriority="64" w:unhideWhenUsed="0"/>
-    <w:lsdException w:name="Medium List 1 Accent 5" w:semiHidden="0" w:uiPriority="65" w:unhideWhenUsed="0"/>
-    <w:lsdException w:name="Medium List 2 Accent 5" w:semiHidden="0" w:uiPriority="66" w:unhideWhenUsed="0"/>
-    <w:lsdException w:name="Medium Grid 1 Accent 5" w:semiHidden="0" w:uiPriority="67" w:unhideWhenUsed="0"/>
-    <w:lsdException w:name="Medium Grid 2 Accent 5" w:semiHidden="0" w:uiPriority="68" w:unhideWhenUsed="0"/>
-    <w:lsdException w:name="Medium Grid 3 Accent 5" w:semiHidden="0" w:uiPriority="69" w:unhideWhenUsed="0"/>
-    <w:lsdException w:name="Dark List Accent 5" w:semiHidden="0" w:uiPriority="70" w:unhideWhenUsed="0"/>
-    <w:lsdException w:name="Colorful Shading Accent 5" w:semiHidden="0" w:uiPriority="71" w:unhideWhenUsed="0"/>
-    <w:lsdException w:name="Colorful List Accent 5" w:semiHidden="0" w:uiPriority="72" w:unhideWhenUsed="0"/>
-    <w:lsdException w:name="Colorful Grid Accent 5" w:semiHidden="0" w:uiPriority="73" w:unhideWhenUsed="0"/>
-    <w:lsdException w:name="Light Shading Accent 6" w:semiHidden="0" w:uiPriority="60" w:unhideWhenUsed="0"/>
-    <w:lsdException w:name="Light List Accent 6" w:semiHidden="0" w:uiPriority="61" w:unhideWhenUsed="0"/>
-    <w:lsdException w:name="Light Grid Accent 6" w:semiHidden="0" w:uiPriority="62" w:unhideWhenUsed="0"/>
-    <w:lsdException w:name="Medium Shading 1 Accent 6" w:semiHidden="0" w:uiPriority="63" w:unhideWhenUsed="0"/>
-    <w:lsdException w:name="Medium Shading 2 Accent 6" w:semiHidden="0" w:uiPriority="64" w:unhideWhenUsed="0"/>
-    <w:lsdException w:name="Medium List 1 Accent 6" w:semiHidden="0" w:uiPriority="65" w:unhideWhenUsed="0"/>
-    <w:lsdException w:name="Medium List 2 Accent 6" w:semiHidden="0" w:uiPriority="66" w:unhideWhenUsed="0"/>
-    <w:lsdException w:name="Medium Grid 1 Accent 6" w:semiHidden="0" w:uiPriority="67" w:unhideWhenUsed="0"/>
-    <w:lsdException w:name="Medium Grid 2 Accent 6" w:semiHidden="0" w:uiPriority="68" w:unhideWhenUsed="0"/>
-    <w:lsdException w:name="Medium Grid 3 Accent 6" w:semiHidden="0" w:uiPriority="69" w:unhideWhenUsed="0"/>
-    <w:lsdException w:name="Dark List Accent 6" w:semiHidden="0" w:uiPriority="70" w:unhideWhenUsed="0"/>
-    <w:lsdException w:name="Colorful Shading Accent 6" w:semiHidden="0" w:uiPriority="71" w:unhideWhenUsed="0"/>
-    <w:lsdException w:name="Colorful List Accent 6" w:semiHidden="0" w:uiPriority="72" w:unhideWhenUsed="0"/>
-    <w:lsdException w:name="Colorful Grid Accent 6" w:semiHidden="0" w:uiPriority="73" w:unhideWhenUsed="0"/>
-    <w:lsdException w:name="Subtle Emphasis" w:semiHidden="0" w:uiPriority="19" w:unhideWhenUsed="0" w:qFormat="1"/>
-    <w:lsdException w:name="Intense Emphasis" w:semiHidden="0" w:uiPriority="21" w:unhideWhenUsed="0" w:qFormat="1"/>
-    <w:lsdException w:name="Subtle Reference" w:semiHidden="0" w:uiPriority="31" w:unhideWhenUsed="0" w:qFormat="1"/>
-    <w:lsdException w:name="Intense Reference" w:semiHidden="0" w:uiPriority="32" w:unhideWhenUsed="0" w:qFormat="1"/>
-    <w:lsdException w:name="Book Title" w:semiHidden="0" w:uiPriority="33" w:unhideWhenUsed="0" w:qFormat="1"/>
-    <w:lsdException w:name="Bibliography" w:uiPriority="37"/>
-    <w:lsdException w:name="TOC Heading" w:uiPriority="39" w:qFormat="1"/>
+  <w:latentStyles w:defLockedState="0" w:defUIPriority="99" w:defSemiHidden="0" w:defUnhideWhenUsed="0" w:defQFormat="0" w:count="376">
+    <w:lsdException w:name="Normal" w:uiPriority="0" w:qFormat="1"/>
+    <w:lsdException w:name="heading 1" w:uiPriority="9" w:qFormat="1"/>
+    <w:lsdException w:name="heading 2" w:semiHidden="1" w:uiPriority="9" w:unhideWhenUsed="1" w:qFormat="1"/>
+    <w:lsdException w:name="heading 3" w:semiHidden="1" w:uiPriority="9" w:unhideWhenUsed="1" w:qFormat="1"/>
+    <w:lsdException w:name="heading 4" w:semiHidden="1" w:uiPriority="9" w:unhideWhenUsed="1" w:qFormat="1"/>
+    <w:lsdException w:name="heading 5" w:semiHidden="1" w:uiPriority="9" w:unhideWhenUsed="1" w:qFormat="1"/>
+    <w:lsdException w:name="heading 6" w:semiHidden="1" w:uiPriority="9" w:unhideWhenUsed="1" w:qFormat="1"/>
+    <w:lsdException w:name="heading 7" w:semiHidden="1" w:uiPriority="9" w:unhideWhenUsed="1" w:qFormat="1"/>
+    <w:lsdException w:name="heading 8" w:semiHidden="1" w:uiPriority="9" w:unhideWhenUsed="1" w:qFormat="1"/>
+    <w:lsdException w:name="heading 9" w:semiHidden="1" w:uiPriority="9" w:unhideWhenUsed="1" w:qFormat="1"/>
+    <w:lsdException w:name="index 1" w:semiHidden="1" w:unhideWhenUsed="1"/>
+    <w:lsdException w:name="index 2" w:semiHidden="1" w:unhideWhenUsed="1"/>
+    <w:lsdException w:name="index 3" w:semiHidden="1" w:unhideWhenUsed="1"/>
+    <w:lsdException w:name="index 4" w:semiHidden="1" w:unhideWhenUsed="1"/>
+    <w:lsdException w:name="index 5" w:semiHidden="1" w:unhideWhenUsed="1"/>
+    <w:lsdException w:name="index 6" w:semiHidden="1" w:unhideWhenUsed="1"/>
+    <w:lsdException w:name="index 7" w:semiHidden="1" w:unhideWhenUsed="1"/>
+    <w:lsdException w:name="index 8" w:semiHidden="1" w:unhideWhenUsed="1"/>
+    <w:lsdException w:name="index 9" w:semiHidden="1" w:unhideWhenUsed="1"/>
+    <w:lsdException w:name="toc 1" w:semiHidden="1" w:uiPriority="39" w:unhideWhenUsed="1"/>
+    <w:lsdException w:name="toc 2" w:semiHidden="1" w:uiPriority="39" w:unhideWhenUsed="1"/>
+    <w:lsdException w:name="toc 3" w:semiHidden="1" w:uiPriority="39" w:unhideWhenUsed="1"/>
+    <w:lsdException w:name="toc 4" w:semiHidden="1" w:uiPriority="39" w:unhideWhenUsed="1"/>
+    <w:lsdException w:name="toc 5" w:semiHidden="1" w:uiPriority="39" w:unhideWhenUsed="1"/>
+    <w:lsdException w:name="toc 6" w:semiHidden="1" w:uiPriority="39" w:unhideWhenUsed="1"/>
+    <w:lsdException w:name="toc 7" w:semiHidden="1" w:uiPriority="39" w:unhideWhenUsed="1"/>
+    <w:lsdException w:name="toc 8" w:semiHidden="1" w:uiPriority="39" w:unhideWhenUsed="1"/>
+    <w:lsdException w:name="toc 9" w:semiHidden="1" w:uiPriority="39" w:unhideWhenUsed="1"/>
+    <w:lsdException w:name="Normal Indent" w:semiHidden="1" w:unhideWhenUsed="1"/>
+    <w:lsdException w:name="footnote text" w:semiHidden="1" w:unhideWhenUsed="1"/>
+    <w:lsdException w:name="annotation text" w:semiHidden="1" w:unhideWhenUsed="1"/>
+    <w:lsdException w:name="header" w:semiHidden="1" w:unhideWhenUsed="1"/>
+    <w:lsdException w:name="footer" w:semiHidden="1" w:unhideWhenUsed="1"/>
+    <w:lsdException w:name="index heading" w:semiHidden="1" w:unhideWhenUsed="1"/>
+    <w:lsdException w:name="caption" w:semiHidden="1" w:uiPriority="35" w:unhideWhenUsed="1" w:qFormat="1"/>
+    <w:lsdException w:name="table of figures" w:semiHidden="1" w:unhideWhenUsed="1"/>
+    <w:lsdException w:name="envelope address" w:semiHidden="1" w:unhideWhenUsed="1"/>
+    <w:lsdException w:name="envelope return" w:semiHidden="1" w:unhideWhenUsed="1"/>
+    <w:lsdException w:name="footnote reference" w:semiHidden="1" w:unhideWhenUsed="1"/>
+    <w:lsdException w:name="annotation reference" w:semiHidden="1" w:unhideWhenUsed="1"/>
+    <w:lsdException w:name="line number" w:semiHidden="1" w:unhideWhenUsed="1"/>
+    <w:lsdException w:name="page number" w:semiHidden="1" w:unhideWhenUsed="1"/>
+    <w:lsdException w:name="endnote reference" w:semiHidden="1" w:unhideWhenUsed="1"/>
+    <w:lsdException w:name="endnote text" w:semiHidden="1" w:unhideWhenUsed="1"/>
+    <w:lsdException w:name="table of authorities" w:semiHidden="1" w:unhideWhenUsed="1"/>
+    <w:lsdException w:name="macro" w:semiHidden="1" w:unhideWhenUsed="1"/>
+    <w:lsdException w:name="toa heading" w:semiHidden="1" w:unhideWhenUsed="1"/>
+    <w:lsdException w:name="List" w:semiHidden="1" w:unhideWhenUsed="1"/>
+    <w:lsdException w:name="List Bullet" w:semiHidden="1" w:unhideWhenUsed="1"/>
+    <w:lsdException w:name="List Number" w:semiHidden="1" w:unhideWhenUsed="1"/>
+    <w:lsdException w:name="List 2" w:semiHidden="1" w:unhideWhenUsed="1"/>
+    <w:lsdException w:name="List 3" w:semiHidden="1" w:unhideWhenUsed="1"/>
+    <w:lsdException w:name="List 4" w:semiHidden="1" w:unhideWhenUsed="1"/>
+    <w:lsdException w:name="List 5" w:semiHidden="1" w:unhideWhenUsed="1"/>
+    <w:lsdException w:name="List Bullet 2" w:semiHidden="1" w:unhideWhenUsed="1"/>
+    <w:lsdException w:name="List Bullet 3" w:semiHidden="1" w:unhideWhenUsed="1"/>
+    <w:lsdException w:name="List Bullet 4" w:semiHidden="1" w:unhideWhenUsed="1"/>
+    <w:lsdException w:name="List Bullet 5" w:semiHidden="1" w:unhideWhenUsed="1"/>
+    <w:lsdException w:name="List Number 2" w:semiHidden="1" w:unhideWhenUsed="1"/>
+    <w:lsdException w:name="List Number 3" w:semiHidden="1" w:unhideWhenUsed="1"/>
+    <w:lsdException w:name="List Number 4" w:semiHidden="1" w:unhideWhenUsed="1"/>
+    <w:lsdException w:name="List Number 5" w:semiHidden="1" w:unhideWhenUsed="1"/>
+    <w:lsdException w:name="Title" w:uiPriority="10" w:qFormat="1"/>
+    <w:lsdException w:name="Closing" w:semiHidden="1" w:unhideWhenUsed="1"/>
+    <w:lsdException w:name="Signature" w:semiHidden="1" w:unhideWhenUsed="1"/>
+    <w:lsdException w:name="Default Paragraph Font" w:semiHidden="1" w:uiPriority="1" w:unhideWhenUsed="1"/>
+    <w:lsdException w:name="Body Text" w:semiHidden="1" w:uiPriority="1" w:unhideWhenUsed="1" w:qFormat="1"/>
+    <w:lsdException w:name="Body Text Indent" w:semiHidden="1" w:unhideWhenUsed="1"/>
+    <w:lsdException w:name="List Continue" w:semiHidden="1" w:unhideWhenUsed="1"/>
+    <w:lsdException w:name="List Continue 2" w:semiHidden="1" w:unhideWhenUsed="1"/>
+    <w:lsdException w:name="List Continue 3" w:semiHidden="1" w:unhideWhenUsed="1"/>
+    <w:lsdException w:name="List Continue 4" w:semiHidden="1" w:unhideWhenUsed="1"/>
+    <w:lsdException w:name="List Continue 5" w:semiHidden="1" w:unhideWhenUsed="1"/>
+    <w:lsdException w:name="Message Header" w:semiHidden="1" w:unhideWhenUsed="1"/>
+    <w:lsdException w:name="Subtitle" w:uiPriority="11" w:qFormat="1"/>
+    <w:lsdException w:name="Salutation" w:semiHidden="1" w:unhideWhenUsed="1"/>
+    <w:lsdException w:name="Date" w:semiHidden="1" w:unhideWhenUsed="1"/>
+    <w:lsdException w:name="Body Text First Indent" w:semiHidden="1" w:unhideWhenUsed="1"/>
+    <w:lsdException w:name="Body Text First Indent 2" w:semiHidden="1" w:unhideWhenUsed="1"/>
+    <w:lsdException w:name="Note Heading" w:semiHidden="1" w:unhideWhenUsed="1"/>
+    <w:lsdException w:name="Body Text 2" w:semiHidden="1" w:unhideWhenUsed="1"/>
+    <w:lsdException w:name="Body Text 3" w:semiHidden="1" w:unhideWhenUsed="1"/>
+    <w:lsdException w:name="Body Text Indent 2" w:semiHidden="1" w:unhideWhenUsed="1"/>
+    <w:lsdException w:name="Body Text Indent 3" w:semiHidden="1" w:unhideWhenUsed="1"/>
+    <w:lsdException w:name="Block Text" w:semiHidden="1" w:unhideWhenUsed="1"/>
+    <w:lsdException w:name="Hyperlink" w:semiHidden="1" w:unhideWhenUsed="1"/>
+    <w:lsdException w:name="FollowedHyperlink" w:semiHidden="1" w:unhideWhenUsed="1"/>
+    <w:lsdException w:name="Strong" w:uiPriority="22" w:qFormat="1"/>
+    <w:lsdException w:name="Emphasis" w:uiPriority="20" w:qFormat="1"/>
+    <w:lsdException w:name="Document Map" w:semiHidden="1" w:unhideWhenUsed="1"/>
+    <w:lsdException w:name="Plain Text" w:semiHidden="1" w:unhideWhenUsed="1"/>
+    <w:lsdException w:name="E-mail Signature" w:semiHidden="1" w:unhideWhenUsed="1"/>
+    <w:lsdException w:name="HTML Top of Form" w:semiHidden="1" w:unhideWhenUsed="1"/>
+    <w:lsdException w:name="HTML Bottom of Form" w:semiHidden="1" w:unhideWhenUsed="1"/>
+    <w:lsdException w:name="Normal (Web)" w:semiHidden="1" w:unhideWhenUsed="1"/>
+    <w:lsdException w:name="HTML Acronym" w:semiHidden="1" w:unhideWhenUsed="1"/>
+    <w:lsdException w:name="HTML Address" w:semiHidden="1" w:unhideWhenUsed="1"/>
+    <w:lsdException w:name="HTML Cite" w:semiHidden="1" w:unhideWhenUsed="1"/>
+    <w:lsdException w:name="HTML Code" w:semiHidden="1" w:unhideWhenUsed="1"/>
+    <w:lsdException w:name="HTML Definition" w:semiHidden="1" w:unhideWhenUsed="1"/>
+    <w:lsdException w:name="HTML Keyboard" w:semiHidden="1" w:unhideWhenUsed="1"/>
+    <w:lsdException w:name="HTML Preformatted" w:semiHidden="1" w:unhideWhenUsed="1"/>
+    <w:lsdException w:name="HTML Sample" w:semiHidden="1" w:unhideWhenUsed="1"/>
+    <w:lsdException w:name="HTML Typewriter" w:semiHidden="1" w:unhideWhenUsed="1"/>
+    <w:lsdException w:name="HTML Variable" w:semiHidden="1" w:unhideWhenUsed="1"/>
+    <w:lsdException w:name="Normal Table" w:semiHidden="1" w:unhideWhenUsed="1"/>
+    <w:lsdException w:name="annotation subject" w:semiHidden="1" w:unhideWhenUsed="1"/>
+    <w:lsdException w:name="No List" w:semiHidden="1" w:unhideWhenUsed="1"/>
+    <w:lsdException w:name="Outline List 1" w:semiHidden="1" w:unhideWhenUsed="1"/>
+    <w:lsdException w:name="Outline List 2" w:semiHidden="1" w:unhideWhenUsed="1"/>
+    <w:lsdException w:name="Outline List 3" w:semiHidden="1" w:unhideWhenUsed="1"/>
+    <w:lsdException w:name="Table Simple 1" w:semiHidden="1" w:unhideWhenUsed="1"/>
+    <w:lsdException w:name="Table Simple 2" w:semiHidden="1" w:unhideWhenUsed="1"/>
+    <w:lsdException w:name="Table Simple 3" w:semiHidden="1" w:unhideWhenUsed="1"/>
+    <w:lsdException w:name="Table Classic 1" w:semiHidden="1" w:unhideWhenUsed="1"/>
+    <w:lsdException w:name="Table Classic 2" w:semiHidden="1" w:unhideWhenUsed="1"/>
+    <w:lsdException w:name="Table Classic 3" w:semiHidden="1" w:unhideWhenUsed="1"/>
+    <w:lsdException w:name="Table Classic 4" w:semiHidden="1" w:unhideWhenUsed="1"/>
+    <w:lsdException w:name="Table Colorful 1" w:semiHidden="1" w:unhideWhenUsed="1"/>
+    <w:lsdException w:name="Table Colorful 2" w:semiHidden="1" w:unhideWhenUsed="1"/>
+    <w:lsdException w:name="Table Colorful 3" w:semiHidden="1" w:unhideWhenUsed="1"/>
+    <w:lsdException w:name="Table Columns 1" w:semiHidden="1" w:unhideWhenUsed="1"/>
+    <w:lsdException w:name="Table Columns 2" w:semiHidden="1" w:unhideWhenUsed="1"/>
+    <w:lsdException w:name="Table Columns 3" w:semiHidden="1" w:unhideWhenUsed="1"/>
+    <w:lsdException w:name="Table Columns 4" w:semiHidden="1" w:unhideWhenUsed="1"/>
+    <w:lsdException w:name="Table Columns 5" w:semiHidden="1" w:unhideWhenUsed="1"/>
+    <w:lsdException w:name="Table Grid 1" w:semiHidden="1" w:unhideWhenUsed="1"/>
+    <w:lsdException w:name="Table Grid 2" w:semiHidden="1" w:unhideWhenUsed="1"/>
+    <w:lsdException w:name="Table Grid 3" w:semiHidden="1" w:unhideWhenUsed="1"/>
+    <w:lsdException w:name="Table Grid 4" w:semiHidden="1" w:unhideWhenUsed="1"/>
+    <w:lsdException w:name="Table Grid 5" w:semiHidden="1" w:unhideWhenUsed="1"/>
+    <w:lsdException w:name="Table Grid 6" w:semiHidden="1" w:unhideWhenUsed="1"/>
+    <w:lsdException w:name="Table Grid 7" w:semiHidden="1" w:unhideWhenUsed="1"/>
+    <w:lsdException w:name="Table Grid 8" w:semiHidden="1" w:unhideWhenUsed="1"/>
+    <w:lsdException w:name="Table List 1" w:semiHidden="1" w:unhideWhenUsed="1"/>
+    <w:lsdException w:name="Table List 2" w:semiHidden="1" w:unhideWhenUsed="1"/>
+    <w:lsdException w:name="Table List 3" w:semiHidden="1" w:unhideWhenUsed="1"/>
+    <w:lsdException w:name="Table List 4" w:semiHidden="1" w:unhideWhenUsed="1"/>
+    <w:lsdException w:name="Table List 5" w:semiHidden="1" w:unhideWhenUsed="1"/>
+    <w:lsdException w:name="Table List 6" w:semiHidden="1" w:unhideWhenUsed="1"/>
+    <w:lsdException w:name="Table List 7" w:semiHidden="1" w:unhideWhenUsed="1"/>
+    <w:lsdException w:name="Table List 8" w:semiHidden="1" w:unhideWhenUsed="1"/>
+    <w:lsdException w:name="Table 3D effects 1" w:semiHidden="1" w:unhideWhenUsed="1"/>
+    <w:lsdException w:name="Table 3D effects 2" w:semiHidden="1" w:unhideWhenUsed="1"/>
+    <w:lsdException w:name="Table 3D effects 3" w:semiHidden="1" w:unhideWhenUsed="1"/>
+    <w:lsdException w:name="Table Contemporary" w:semiHidden="1" w:unhideWhenUsed="1"/>
+    <w:lsdException w:name="Table Elegant" w:semiHidden="1" w:unhideWhenUsed="1"/>
+    <w:lsdException w:name="Table Professional" w:semiHidden="1" w:unhideWhenUsed="1"/>
+    <w:lsdException w:name="Table Subtle 1" w:semiHidden="1" w:unhideWhenUsed="1"/>
+    <w:lsdException w:name="Table Subtle 2" w:semiHidden="1" w:unhideWhenUsed="1"/>
+    <w:lsdException w:name="Table Web 1" w:semiHidden="1" w:unhideWhenUsed="1"/>
+    <w:lsdException w:name="Table Web 2" w:semiHidden="1" w:unhideWhenUsed="1"/>
+    <w:lsdException w:name="Table Web 3" w:semiHidden="1" w:unhideWhenUsed="1"/>
+    <w:lsdException w:name="Balloon Text" w:semiHidden="1" w:unhideWhenUsed="1"/>
+    <w:lsdException w:name="Table Grid" w:uiPriority="59"/>
+    <w:lsdException w:name="Table Theme" w:semiHidden="1" w:unhideWhenUsed="1"/>
+    <w:lsdException w:name="Placeholder Text" w:semiHidden="1"/>
+    <w:lsdException w:name="No Spacing" w:uiPriority="1" w:qFormat="1"/>
+    <w:lsdException w:name="Light Shading" w:uiPriority="60"/>
+    <w:lsdException w:name="Light List" w:uiPriority="61"/>
+    <w:lsdException w:name="Light Grid" w:uiPriority="62"/>
+    <w:lsdException w:name="Medium Shading 1" w:uiPriority="63"/>
+    <w:lsdException w:name="Medium Shading 2" w:uiPriority="64"/>
+    <w:lsdException w:name="Medium List 1" w:uiPriority="65"/>
+    <w:lsdException w:name="Medium List 2" w:uiPriority="66"/>
+    <w:lsdException w:name="Medium Grid 1" w:uiPriority="67"/>
+    <w:lsdException w:name="Medium Grid 2" w:uiPriority="68"/>
+    <w:lsdException w:name="Medium Grid 3" w:uiPriority="69"/>
+    <w:lsdException w:name="Dark List" w:uiPriority="70"/>
+    <w:lsdException w:name="Colorful Shading" w:uiPriority="71"/>
+    <w:lsdException w:name="Colorful List" w:uiPriority="72"/>
+    <w:lsdException w:name="Colorful Grid" w:uiPriority="73"/>
+    <w:lsdException w:name="Light Shading Accent 1" w:uiPriority="60"/>
+    <w:lsdException w:name="Light List Accent 1" w:uiPriority="61"/>
+    <w:lsdException w:name="Light Grid Accent 1" w:uiPriority="62"/>
+    <w:lsdException w:name="Medium Shading 1 Accent 1" w:uiPriority="63"/>
+    <w:lsdException w:name="Medium Shading 2 Accent 1" w:uiPriority="64"/>
+    <w:lsdException w:name="Medium List 1 Accent 1" w:uiPriority="65"/>
+    <w:lsdException w:name="Revision" w:semiHidden="1"/>
+    <w:lsdException w:name="List Paragraph" w:uiPriority="34" w:qFormat="1"/>
+    <w:lsdException w:name="Quote" w:uiPriority="29" w:qFormat="1"/>
+    <w:lsdException w:name="Intense Quote" w:uiPriority="30" w:qFormat="1"/>
+    <w:lsdException w:name="Medium List 2 Accent 1" w:uiPriority="66"/>
+    <w:lsdException w:name="Medium Grid 1 Accent 1" w:uiPriority="67"/>
+    <w:lsdException w:name="Medium Grid 2 Accent 1" w:uiPriority="68"/>
+    <w:lsdException w:name="Medium Grid 3 Accent 1" w:uiPriority="69"/>
+    <w:lsdException w:name="Dark List Accent 1" w:uiPriority="70"/>
+    <w:lsdException w:name="Colorful Shading Accent 1" w:uiPriority="71"/>
+    <w:lsdException w:name="Colorful List Accent 1" w:uiPriority="72"/>
+    <w:lsdException w:name="Colorful Grid Accent 1" w:uiPriority="73"/>
+    <w:lsdException w:name="Light Shading Accent 2" w:uiPriority="60"/>
+    <w:lsdException w:name="Light List Accent 2" w:uiPriority="61"/>
+    <w:lsdException w:name="Light Grid Accent 2" w:uiPriority="62"/>
+    <w:lsdException w:name="Medium Shading 1 Accent 2" w:uiPriority="63"/>
+    <w:lsdException w:name="Medium Shading 2 Accent 2" w:uiPriority="64"/>
+    <w:lsdException w:name="Medium List 1 Accent 2" w:uiPriority="65"/>
+    <w:lsdException w:name="Medium List 2 Accent 2" w:uiPriority="66"/>
+    <w:lsdException w:name="Medium Grid 1 Accent 2" w:uiPriority="67"/>
+    <w:lsdException w:name="Medium Grid 2 Accent 2" w:uiPriority="68"/>
+    <w:lsdException w:name="Medium Grid 3 Accent 2" w:uiPriority="69"/>
+    <w:lsdException w:name="Dark List Accent 2" w:uiPriority="70"/>
+    <w:lsdException w:name="Colorful Shading Accent 2" w:uiPriority="71"/>
+    <w:lsdException w:name="Colorful List Accent 2" w:uiPriority="72"/>
+    <w:lsdException w:name="Colorful Grid Accent 2" w:uiPriority="73"/>
+    <w:lsdException w:name="Light Shading Accent 3" w:uiPriority="60"/>
+    <w:lsdException w:name="Light List Accent 3" w:uiPriority="61"/>
+    <w:lsdException w:name="Light Grid Accent 3" w:uiPriority="62"/>
+    <w:lsdException w:name="Medium Shading 1 Accent 3" w:uiPriority="63"/>
+    <w:lsdException w:name="Medium Shading 2 Accent 3" w:uiPriority="64"/>
+    <w:lsdException w:name="Medium List 1 Accent 3" w:uiPriority="65"/>
+    <w:lsdException w:name="Medium List 2 Accent 3" w:uiPriority="66"/>
+    <w:lsdException w:name="Medium Grid 1 Accent 3" w:uiPriority="67"/>
+    <w:lsdException w:name="Medium Grid 2 Accent 3" w:uiPriority="68"/>
+    <w:lsdException w:name="Medium Grid 3 Accent 3" w:uiPriority="69"/>
+    <w:lsdException w:name="Dark List Accent 3" w:uiPriority="70"/>
+    <w:lsdException w:name="Colorful Shading Accent 3" w:uiPriority="71"/>
+    <w:lsdException w:name="Colorful List Accent 3" w:uiPriority="72"/>
+    <w:lsdException w:name="Colorful Grid Accent 3" w:uiPriority="73"/>
+    <w:lsdException w:name="Light Shading Accent 4" w:uiPriority="60"/>
+    <w:lsdException w:name="Light List Accent 4" w:uiPriority="61"/>
+    <w:lsdException w:name="Light Grid Accent 4" w:uiPriority="62"/>
+    <w:lsdException w:name="Medium Shading 1 Accent 4" w:uiPriority="63"/>
+    <w:lsdException w:name="Medium Shading 2 Accent 4" w:uiPriority="64"/>
+    <w:lsdException w:name="Medium List 1 Accent 4" w:uiPriority="65"/>
+    <w:lsdException w:name="Medium List 2 Accent 4" w:uiPriority="66"/>
+    <w:lsdException w:name="Medium Grid 1 Accent 4" w:uiPriority="67"/>
+    <w:lsdException w:name="Medium Grid 2 Accent 4" w:uiPriority="68"/>
+    <w:lsdException w:name="Medium Grid 3 Accent 4" w:uiPriority="69"/>
+    <w:lsdException w:name="Dark List Accent 4" w:uiPriority="70"/>
+    <w:lsdException w:name="Colorful Shading Accent 4" w:uiPriority="71"/>
+    <w:lsdException w:name="Colorful List Accent 4" w:uiPriority="72"/>
+    <w:lsdException w:name="Colorful Grid Accent 4" w:uiPriority="73"/>
+    <w:lsdException w:name="Light Shading Accent 5" w:uiPriority="60"/>
+    <w:lsdException w:name="Light List Accent 5" w:uiPriority="61"/>
+    <w:lsdException w:name="Light Grid Accent 5" w:uiPriority="62"/>
+    <w:lsdException w:name="Medium Shading 1 Accent 5" w:uiPriority="63"/>
+    <w:lsdException w:name="Medium Shading 2 Accent 5" w:uiPriority="64"/>
+    <w:lsdException w:name="Medium List 1 Accent 5" w:uiPriority="65"/>
+    <w:lsdException w:name="Medium List 2 Accent 5" w:uiPriority="66"/>
+    <w:lsdException w:name="Medium Grid 1 Accent 5" w:uiPriority="67"/>
+    <w:lsdException w:name="Medium Grid 2 Accent 5" w:uiPriority="68"/>
+    <w:lsdException w:name="Medium Grid 3 Accent 5" w:uiPriority="69"/>
+    <w:lsdException w:name="Dark List Accent 5" w:uiPriority="70"/>
+    <w:lsdException w:name="Colorful Shading Accent 5" w:uiPriority="71"/>
+    <w:lsdException w:name="Colorful List Accent 5" w:uiPriority="72"/>
+    <w:lsdException w:name="Colorful Grid Accent 5" w:uiPriority="73"/>
+    <w:lsdException w:name="Light Shading Accent 6" w:uiPriority="60"/>
+    <w:lsdException w:name="Light List Accent 6" w:uiPriority="61"/>
+    <w:lsdException w:name="Light Grid Accent 6" w:uiPriority="62"/>
+    <w:lsdException w:name="Medium Shading 1 Accent 6" w:uiPriority="63"/>
+    <w:lsdException w:name="Medium Shading 2 Accent 6" w:uiPriority="64"/>
+    <w:lsdException w:name="Medium List 1 Accent 6" w:uiPriority="65"/>
+    <w:lsdException w:name="Medium List 2 Accent 6" w:uiPriority="66"/>
+    <w:lsdException w:name="Medium Grid 1 Accent 6" w:uiPriority="67"/>
+    <w:lsdException w:name="Medium Grid 2 Accent 6" w:uiPriority="68"/>
+    <w:lsdException w:name="Medium Grid 3 Accent 6" w:uiPriority="69"/>
+    <w:lsdException w:name="Dark List Accent 6" w:uiPriority="70"/>
+    <w:lsdException w:name="Colorful Shading Accent 6" w:uiPriority="71"/>
+    <w:lsdException w:name="Colorful List Accent 6" w:uiPriority="72"/>
+    <w:lsdException w:name="Colorful Grid Accent 6" w:uiPriority="73"/>
+    <w:lsdException w:name="Subtle Emphasis" w:uiPriority="19" w:qFormat="1"/>
+    <w:lsdException w:name="Intense Emphasis" w:uiPriority="21" w:qFormat="1"/>
+    <w:lsdException w:name="Subtle Reference" w:uiPriority="31" w:qFormat="1"/>
+    <w:lsdException w:name="Intense Reference" w:uiPriority="32" w:qFormat="1"/>
+    <w:lsdException w:name="Book Title" w:uiPriority="33" w:qFormat="1"/>
+    <w:lsdException w:name="Bibliography" w:semiHidden="1" w:uiPriority="37" w:unhideWhenUsed="1"/>
+    <w:lsdException w:name="TOC Heading" w:semiHidden="1" w:uiPriority="39" w:unhideWhenUsed="1" w:qFormat="1"/>
+    <w:lsdException w:name="Plain Table 1" w:uiPriority="41"/>
+    <w:lsdException w:name="Plain Table 2" w:uiPriority="42"/>
+    <w:lsdException w:name="Plain Table 3" w:uiPriority="43"/>
+    <w:lsdException w:name="Plain Table 4" w:uiPriority="44"/>
+    <w:lsdException w:name="Plain Table 5" w:uiPriority="45"/>
+    <w:lsdException w:name="Grid Table Light" w:uiPriority="40"/>
+    <w:lsdException w:name="Grid Table 1 Light" w:uiPriority="46"/>
+    <w:lsdException w:name="Grid Table 2" w:uiPriority="47"/>
+    <w:lsdException w:name="Grid Table 3" w:uiPriority="48"/>
+    <w:lsdException w:name="Grid Table 4" w:uiPriority="49"/>
+    <w:lsdException w:name="Grid Table 5 Dark" w:uiPriority="50"/>
+    <w:lsdException w:name="Grid Table 6 Colorful" w:uiPriority="51"/>
+    <w:lsdException w:name="Grid Table 7 Colorful" w:uiPriority="52"/>
+    <w:lsdException w:name="Grid Table 1 Light Accent 1" w:uiPriority="46"/>
+    <w:lsdException w:name="Grid Table 2 Accent 1" w:uiPriority="47"/>
+    <w:lsdException w:name="Grid Table 3 Accent 1" w:uiPriority="48"/>
+    <w:lsdException w:name="Grid Table 4 Accent 1" w:uiPriority="49"/>
+    <w:lsdException w:name="Grid Table 5 Dark Accent 1" w:uiPriority="50"/>
+    <w:lsdException w:name="Grid Table 6 Colorful Accent 1" w:uiPriority="51"/>
+    <w:lsdException w:name="Grid Table 7 Colorful Accent 1" w:uiPriority="52"/>
+    <w:lsdException w:name="Grid Table 1 Light Accent 2" w:uiPriority="46"/>
+    <w:lsdException w:name="Grid Table 2 Accent 2" w:uiPriority="47"/>
+    <w:lsdException w:name="Grid Table 3 Accent 2" w:uiPriority="48"/>
+    <w:lsdException w:name="Grid Table 4 Accent 2" w:uiPriority="49"/>
+    <w:lsdException w:name="Grid Table 5 Dark Accent 2" w:uiPriority="50"/>
+    <w:lsdException w:name="Grid Table 6 Colorful Accent 2" w:uiPriority="51"/>
+    <w:lsdException w:name="Grid Table 7 Colorful Accent 2" w:uiPriority="52"/>
+    <w:lsdException w:name="Grid Table 1 Light Accent 3" w:uiPriority="46"/>
+    <w:lsdException w:name="Grid Table 2 Accent 3" w:uiPriority="47"/>
+    <w:lsdException w:name="Grid Table 3 Accent 3" w:uiPriority="48"/>
+    <w:lsdException w:name="Grid Table 4 Accent 3" w:uiPriority="49"/>
+    <w:lsdException w:name="Grid Table 5 Dark Accent 3" w:uiPriority="50"/>
+    <w:lsdException w:name="Grid Table 6 Colorful Accent 3" w:uiPriority="51"/>
+    <w:lsdException w:name="Grid Table 7 Colorful Accent 3" w:uiPriority="52"/>
+    <w:lsdException w:name="Grid Table 1 Light Accent 4" w:uiPriority="46"/>
+    <w:lsdException w:name="Grid Table 2 Accent 4" w:uiPriority="47"/>
+    <w:lsdException w:name="Grid Table 3 Accent 4" w:uiPriority="48"/>
+    <w:lsdException w:name="Grid Table 4 Accent 4" w:uiPriority="49"/>
+    <w:lsdException w:name="Grid Table 5 Dark Accent 4" w:uiPriority="50"/>
+    <w:lsdException w:name="Grid Table 6 Colorful Accent 4" w:uiPriority="51"/>
+    <w:lsdException w:name="Grid Table 7 Colorful Accent 4" w:uiPriority="52"/>
+    <w:lsdException w:name="Grid Table 1 Light Accent 5" w:uiPriority="46"/>
+    <w:lsdException w:name="Grid Table 2 Accent 5" w:uiPriority="47"/>
+    <w:lsdException w:name="Grid Table 3 Accent 5" w:uiPriority="48"/>
+    <w:lsdException w:name="Grid Table 4 Accent 5" w:uiPriority="49"/>
+    <w:lsdException w:name="Grid Table 5 Dark Accent 5" w:uiPriority="50"/>
+    <w:lsdException w:name="Grid Table 6 Colorful Accent 5" w:uiPriority="51"/>
+    <w:lsdException w:name="Grid Table 7 Colorful Accent 5" w:uiPriority="52"/>
+    <w:lsdException w:name="Grid Table 1 Light Accent 6" w:uiPriority="46"/>
+    <w:lsdException w:name="Grid Table 2 Accent 6" w:uiPriority="47"/>
+    <w:lsdException w:name="Grid Table 3 Accent 6" w:uiPriority="48"/>
+    <w:lsdException w:name="Grid Table 4 Accent 6" w:uiPriority="49"/>
+    <w:lsdException w:name="Grid Table 5 Dark Accent 6" w:uiPriority="50"/>
+    <w:lsdException w:name="Grid Table 6 Colorful Accent 6" w:uiPriority="51"/>
+    <w:lsdException w:name="Grid Table 7 Colorful Accent 6" w:uiPriority="52"/>
+    <w:lsdException w:name="List Table 1 Light" w:uiPriority="46"/>
+    <w:lsdException w:name="List Table 2" w:uiPriority="47"/>
+    <w:lsdException w:name="List Table 3" w:uiPriority="48"/>
+    <w:lsdException w:name="List Table 4" w:uiPriority="49"/>
+    <w:lsdException w:name="List Table 5 Dark" w:uiPriority="50"/>
+    <w:lsdException w:name="List Table 6 Colorful" w:uiPriority="51"/>
+    <w:lsdException w:name="List Table 7 Colorful" w:uiPriority="52"/>
+    <w:lsdException w:name="List Table 1 Light Accent 1" w:uiPriority="46"/>
+    <w:lsdException w:name="List Table 2 Accent 1" w:uiPriority="47"/>
+    <w:lsdException w:name="List Table 3 Accent 1" w:uiPriority="48"/>
+    <w:lsdException w:name="List Table 4 Accent 1" w:uiPriority="49"/>
+    <w:lsdException w:name="List Table 5 Dark Accent 1" w:uiPriority="50"/>
+    <w:lsdException w:name="List Table 6 Colorful Accent 1" w:uiPriority="51"/>
+    <w:lsdException w:name="List Table 7 Colorful Accent 1" w:uiPriority="52"/>
+    <w:lsdException w:name="List Table 1 Light Accent 2" w:uiPriority="46"/>
+    <w:lsdException w:name="List Table 2 Accent 2" w:uiPriority="47"/>
+    <w:lsdException w:name="List Table 3 Accent 2" w:uiPriority="48"/>
+    <w:lsdException w:name="List Table 4 Accent 2" w:uiPriority="49"/>
+    <w:lsdException w:name="List Table 5 Dark Accent 2" w:uiPriority="50"/>
+    <w:lsdException w:name="List Table 6 Colorful Accent 2" w:uiPriority="51"/>
+    <w:lsdException w:name="List Table 7 Colorful Accent 2" w:uiPriority="52"/>
+    <w:lsdException w:name="List Table 1 Light Accent 3" w:uiPriority="46"/>
+    <w:lsdException w:name="List Table 2 Accent 3" w:uiPriority="47"/>
+    <w:lsdException w:name="List Table 3 Accent 3" w:uiPriority="48"/>
+    <w:lsdException w:name="List Table 4 Accent 3" w:uiPriority="49"/>
+    <w:lsdException w:name="List Table 5 Dark Accent 3" w:uiPriority="50"/>
+    <w:lsdException w:name="List Table 6 Colorful Accent 3" w:uiPriority="51"/>
+    <w:lsdException w:name="List Table 7 Colorful Accent 3" w:uiPriority="52"/>
+    <w:lsdException w:name="List Table 1 Light Accent 4" w:uiPriority="46"/>
+    <w:lsdException w:name="List Table 2 Accent 4" w:uiPriority="47"/>
+    <w:lsdException w:name="List Table 3 Accent 4" w:uiPriority="48"/>
+    <w:lsdException w:name="List Table 4 Accent 4" w:uiPriority="49"/>
+    <w:lsdException w:name="List Table 5 Dark Accent 4" w:uiPriority="50"/>
+    <w:lsdException w:name="List Table 6 Colorful Accent 4" w:uiPriority="51"/>
+    <w:lsdException w:name="List Table 7 Colorful Accent 4" w:uiPriority="52"/>
+    <w:lsdException w:name="List Table 1 Light Accent 5" w:uiPriority="46"/>
+    <w:lsdException w:name="List Table 2 Accent 5" w:uiPriority="47"/>
+    <w:lsdException w:name="List Table 3 Accent 5" w:uiPriority="48"/>
+    <w:lsdException w:name="List Table 4 Accent 5" w:uiPriority="49"/>
+    <w:lsdException w:name="List Table 5 Dark Accent 5" w:uiPriority="50"/>
+    <w:lsdException w:name="List Table 6 Colorful Accent 5" w:uiPriority="51"/>
+    <w:lsdException w:name="List Table 7 Colorful Accent 5" w:uiPriority="52"/>
+    <w:lsdException w:name="List Table 1 Light Accent 6" w:uiPriority="46"/>
+    <w:lsdException w:name="List Table 2 Accent 6" w:uiPriority="47"/>
+    <w:lsdException w:name="List Table 3 Accent 6" w:uiPriority="48"/>
+    <w:lsdException w:name="List Table 4 Accent 6" w:uiPriority="49"/>
+    <w:lsdException w:name="List Table 5 Dark Accent 6" w:uiPriority="50"/>
+    <w:lsdException w:name="List Table 6 Colorful Accent 6" w:uiPriority="51"/>
+    <w:lsdException w:name="List Table 7 Colorful Accent 6" w:uiPriority="52"/>
+    <w:lsdException w:name="Mention" w:semiHidden="1" w:unhideWhenUsed="1"/>
+    <w:lsdException w:name="Smart Hyperlink" w:semiHidden="1" w:unhideWhenUsed="1"/>
+    <w:lsdException w:name="Hashtag" w:semiHidden="1" w:unhideWhenUsed="1"/>
+    <w:lsdException w:name="Unresolved Mention" w:semiHidden="1" w:unhideWhenUsed="1"/>
+    <w:lsdException w:name="Smart Link" w:semiHidden="1" w:unhideWhenUsed="1"/>
   </w:latentStyles>
   <w:style w:type="paragraph" w:default="1" w:styleId="Normal">
     <w:name w:val="Normal"/>

</xml_diff>

<commit_message>
Made changes in Details of networking and all
</commit_message>
<xml_diff>
--- a/C6/C6 Documentation/ADA NBA C6 05 06 26  .docx
+++ b/C6/C6 Documentation/ADA NBA C6 05 06 26  .docx
@@ -1,6 +1,6 @@
 
 <file path=word/document.xml><?xml version="1.0" encoding="utf-8"?>
-<w:document xmlns:wpc="http://schemas.microsoft.com/office/word/2010/wordprocessingCanvas" xmlns:cx="http://schemas.microsoft.com/office/drawing/2014/chartex" xmlns:cx1="http://schemas.microsoft.com/office/drawing/2015/9/8/chartex" xmlns:cx2="http://schemas.microsoft.com/office/drawing/2015/10/21/chartex" xmlns:cx3="http://schemas.microsoft.com/office/drawing/2016/5/9/chartex" xmlns:cx4="http://schemas.microsoft.com/office/drawing/2016/5/10/chartex" xmlns:cx5="http://schemas.microsoft.com/office/drawing/2016/5/11/chartex" xmlns:cx6="http://schemas.microsoft.com/office/drawing/2016/5/12/chartex" xmlns:cx7="http://schemas.microsoft.com/office/drawing/2016/5/13/chartex" xmlns:cx8="http://schemas.microsoft.com/office/drawing/2016/5/14/chartex" xmlns:mc="http://schemas.openxmlformats.org/markup-compatibility/2006" xmlns:aink="http://schemas.microsoft.com/office/drawing/2016/ink" xmlns:am3d="http://schemas.microsoft.com/office/drawing/2017/model3d" xmlns:o="urn:schemas-microsoft-com:office:office" xmlns:oel="http://schemas.microsoft.com/office/2019/extlst" xmlns:r="http://schemas.openxmlformats.org/officeDocument/2006/relationships" xmlns:m="http://schemas.openxmlformats.org/officeDocument/2006/math" xmlns:v="urn:schemas-microsoft-com:vml" xmlns:wp14="http://schemas.microsoft.com/office/word/2010/wordprocessingDrawing" xmlns:wp="http://schemas.openxmlformats.org/drawingml/2006/wordprocessingDrawing" xmlns:w10="urn:schemas-microsoft-com:office:word" xmlns:w="http://schemas.openxmlformats.org/wordprocessingml/2006/main" xmlns:w14="http://schemas.microsoft.com/office/word/2010/wordml" xmlns:w15="http://schemas.microsoft.com/office/word/2012/wordml" xmlns:w16cex="http://schemas.microsoft.com/office/word/2018/wordml/cex" xmlns:w16cid="http://schemas.microsoft.com/office/word/2016/wordml/cid" xmlns:w16="http://schemas.microsoft.com/office/word/2018/wordml" xmlns:w16du="http://schemas.microsoft.com/office/word/2023/wordml/word16du" xmlns:w16sdtdh="http://schemas.microsoft.com/office/word/2020/wordml/sdtdatahash" xmlns:w16se="http://schemas.microsoft.com/office/word/2015/wordml/symex" xmlns:wpg="http://schemas.microsoft.com/office/word/2010/wordprocessingGroup" xmlns:wpi="http://schemas.microsoft.com/office/word/2010/wordprocessingInk" xmlns:wne="http://schemas.microsoft.com/office/word/2006/wordml" xmlns:wps="http://schemas.microsoft.com/office/word/2010/wordprocessingShape" mc:Ignorable="w14 w15 w16se w16cid w16 w16cex w16sdtdh w16du wp14">
+<w:document xmlns:wpc="http://schemas.microsoft.com/office/word/2010/wordprocessingCanvas" xmlns:mc="http://schemas.openxmlformats.org/markup-compatibility/2006" xmlns:o="urn:schemas-microsoft-com:office:office" xmlns:r="http://schemas.openxmlformats.org/officeDocument/2006/relationships" xmlns:m="http://schemas.openxmlformats.org/officeDocument/2006/math" xmlns:v="urn:schemas-microsoft-com:vml" xmlns:wp14="http://schemas.microsoft.com/office/word/2010/wordprocessingDrawing" xmlns:wp="http://schemas.openxmlformats.org/drawingml/2006/wordprocessingDrawing" xmlns:w10="urn:schemas-microsoft-com:office:word" xmlns:w="http://schemas.openxmlformats.org/wordprocessingml/2006/main" xmlns:w14="http://schemas.microsoft.com/office/word/2010/wordml" xmlns:wpg="http://schemas.microsoft.com/office/word/2010/wordprocessingGroup" xmlns:wpi="http://schemas.microsoft.com/office/word/2010/wordprocessingInk" xmlns:wne="http://schemas.microsoft.com/office/word/2006/wordml" xmlns:wps="http://schemas.microsoft.com/office/word/2010/wordprocessingShape" mc:Ignorable="w14 wp14">
   <w:body>
     <w:tbl>
       <w:tblPr>
@@ -5069,6 +5069,7 @@
                 <w:sz w:val="24"/>
                 <w:szCs w:val="24"/>
               </w:rPr>
+              <w:lastRenderedPageBreak/>
               <w:t>10</w:t>
             </w:r>
           </w:p>
@@ -6492,7 +6493,7 @@
                           <pic:cNvPicPr/>
                         </pic:nvPicPr>
                         <pic:blipFill>
-                          <a:blip r:embed="rId8" cstate="print">
+                          <a:blip r:embed="rId9" cstate="print">
                             <a:extLst>
                               <a:ext uri="{28A0092B-C50C-407E-A947-70E740481C1C}">
                                 <a14:useLocalDpi xmlns:a14="http://schemas.microsoft.com/office/drawing/2010/main" val="0"/>
@@ -6560,7 +6561,7 @@
                           <pic:cNvPicPr/>
                         </pic:nvPicPr>
                         <pic:blipFill>
-                          <a:blip r:embed="rId9" cstate="print">
+                          <a:blip r:embed="rId10" cstate="print">
                             <a:extLst>
                               <a:ext uri="{28A0092B-C50C-407E-A947-70E740481C1C}">
                                 <a14:useLocalDpi xmlns:a14="http://schemas.microsoft.com/office/drawing/2010/main" val="0"/>
@@ -6992,7 +6993,7 @@
                           <pic:cNvPicPr/>
                         </pic:nvPicPr>
                         <pic:blipFill>
-                          <a:blip r:embed="rId10" cstate="print">
+                          <a:blip r:embed="rId11" cstate="print">
                             <a:extLst>
                               <a:ext uri="{28A0092B-C50C-407E-A947-70E740481C1C}">
                                 <a14:useLocalDpi xmlns:a14="http://schemas.microsoft.com/office/drawing/2010/main" val="0"/>
@@ -7058,7 +7059,7 @@
                           <pic:cNvPicPr/>
                         </pic:nvPicPr>
                         <pic:blipFill>
-                          <a:blip r:embed="rId11" cstate="print">
+                          <a:blip r:embed="rId12" cstate="print">
                             <a:extLst>
                               <a:ext uri="{28A0092B-C50C-407E-A947-70E740481C1C}">
                                 <a14:useLocalDpi xmlns:a14="http://schemas.microsoft.com/office/drawing/2010/main" val="0"/>
@@ -7454,7 +7455,7 @@
                           <pic:cNvPicPr/>
                         </pic:nvPicPr>
                         <pic:blipFill>
-                          <a:blip r:embed="rId12" cstate="print">
+                          <a:blip r:embed="rId13" cstate="print">
                             <a:extLst>
                               <a:ext uri="{28A0092B-C50C-407E-A947-70E740481C1C}">
                                 <a14:useLocalDpi xmlns:a14="http://schemas.microsoft.com/office/drawing/2010/main" val="0"/>
@@ -7520,7 +7521,7 @@
                           <pic:cNvPicPr/>
                         </pic:nvPicPr>
                         <pic:blipFill>
-                          <a:blip r:embed="rId13" cstate="print">
+                          <a:blip r:embed="rId14" cstate="print">
                             <a:extLst>
                               <a:ext uri="{28A0092B-C50C-407E-A947-70E740481C1C}">
                                 <a14:useLocalDpi xmlns:a14="http://schemas.microsoft.com/office/drawing/2010/main" val="0"/>
@@ -7961,7 +7962,7 @@
                           <pic:cNvPicPr/>
                         </pic:nvPicPr>
                         <pic:blipFill>
-                          <a:blip r:embed="rId14" cstate="print">
+                          <a:blip r:embed="rId15" cstate="print">
                             <a:extLst>
                               <a:ext uri="{28A0092B-C50C-407E-A947-70E740481C1C}">
                                 <a14:useLocalDpi xmlns:a14="http://schemas.microsoft.com/office/drawing/2010/main" val="0"/>
@@ -8027,7 +8028,7 @@
                           <pic:cNvPicPr/>
                         </pic:nvPicPr>
                         <pic:blipFill>
-                          <a:blip r:embed="rId15" cstate="print">
+                          <a:blip r:embed="rId16" cstate="print">
                             <a:extLst>
                               <a:ext uri="{28A0092B-C50C-407E-A947-70E740481C1C}">
                                 <a14:useLocalDpi xmlns:a14="http://schemas.microsoft.com/office/drawing/2010/main" val="0"/>
@@ -8471,7 +8472,7 @@
                           <pic:cNvPicPr/>
                         </pic:nvPicPr>
                         <pic:blipFill>
-                          <a:blip r:embed="rId16" cstate="print">
+                          <a:blip r:embed="rId17" cstate="print">
                             <a:extLst>
                               <a:ext uri="{28A0092B-C50C-407E-A947-70E740481C1C}">
                                 <a14:useLocalDpi xmlns:a14="http://schemas.microsoft.com/office/drawing/2010/main" val="0"/>
@@ -8537,7 +8538,7 @@
                           <pic:cNvPicPr/>
                         </pic:nvPicPr>
                         <pic:blipFill>
-                          <a:blip r:embed="rId17" cstate="print">
+                          <a:blip r:embed="rId18" cstate="print">
                             <a:extLst>
                               <a:ext uri="{28A0092B-C50C-407E-A947-70E740481C1C}">
                                 <a14:useLocalDpi xmlns:a14="http://schemas.microsoft.com/office/drawing/2010/main" val="0"/>
@@ -8962,7 +8963,7 @@
                           <pic:cNvPicPr/>
                         </pic:nvPicPr>
                         <pic:blipFill>
-                          <a:blip r:embed="rId18" cstate="print">
+                          <a:blip r:embed="rId19" cstate="print">
                             <a:extLst>
                               <a:ext uri="{28A0092B-C50C-407E-A947-70E740481C1C}">
                                 <a14:useLocalDpi xmlns:a14="http://schemas.microsoft.com/office/drawing/2010/main" val="0"/>
@@ -9028,7 +9029,7 @@
                           <pic:cNvPicPr/>
                         </pic:nvPicPr>
                         <pic:blipFill>
-                          <a:blip r:embed="rId19" cstate="print">
+                          <a:blip r:embed="rId20" cstate="print">
                             <a:extLst>
                               <a:ext uri="{28A0092B-C50C-407E-A947-70E740481C1C}">
                                 <a14:useLocalDpi xmlns:a14="http://schemas.microsoft.com/office/drawing/2010/main" val="0"/>
@@ -9408,7 +9409,7 @@
                           <pic:cNvPicPr/>
                         </pic:nvPicPr>
                         <pic:blipFill>
-                          <a:blip r:embed="rId20" cstate="print">
+                          <a:blip r:embed="rId21" cstate="print">
                             <a:extLst>
                               <a:ext uri="{28A0092B-C50C-407E-A947-70E740481C1C}">
                                 <a14:useLocalDpi xmlns:a14="http://schemas.microsoft.com/office/drawing/2010/main" val="0"/>
@@ -9474,7 +9475,7 @@
                           <pic:cNvPicPr/>
                         </pic:nvPicPr>
                         <pic:blipFill>
-                          <a:blip r:embed="rId21" cstate="print">
+                          <a:blip r:embed="rId22" cstate="print">
                             <a:extLst>
                               <a:ext uri="{28A0092B-C50C-407E-A947-70E740481C1C}">
                                 <a14:useLocalDpi xmlns:a14="http://schemas.microsoft.com/office/drawing/2010/main" val="0"/>
@@ -10637,8 +10638,20 @@
                 <w:szCs w:val="24"/>
                 <w:lang w:eastAsia="en-IN" w:bidi="mr-IN"/>
               </w:rPr>
-              <w:t xml:space="preserve"> Jadhav</w:t>
-            </w:r>
+              <w:t xml:space="preserve"> </w:t>
+            </w:r>
+            <w:proofErr w:type="spellStart"/>
+            <w:r>
+              <w:rPr>
+                <w:rFonts w:ascii="Times New Roman" w:eastAsia="Times New Roman" w:hAnsi="Times New Roman" w:cs="Times New Roman"/>
+                <w:color w:val="1F1F1F"/>
+                <w:sz w:val="24"/>
+                <w:szCs w:val="24"/>
+                <w:lang w:eastAsia="en-IN" w:bidi="mr-IN"/>
+              </w:rPr>
+              <w:t>Jadhav</w:t>
+            </w:r>
+            <w:proofErr w:type="spellEnd"/>
           </w:p>
         </w:tc>
         <w:tc>
@@ -10943,8 +10956,20 @@
                 <w:szCs w:val="24"/>
                 <w:lang w:eastAsia="en-IN" w:bidi="mr-IN"/>
               </w:rPr>
-              <w:t xml:space="preserve"> Jadhav</w:t>
-            </w:r>
+              <w:t xml:space="preserve"> </w:t>
+            </w:r>
+            <w:proofErr w:type="spellStart"/>
+            <w:r>
+              <w:rPr>
+                <w:rFonts w:ascii="Times New Roman" w:eastAsia="Times New Roman" w:hAnsi="Times New Roman" w:cs="Times New Roman"/>
+                <w:color w:val="1F1F1F"/>
+                <w:sz w:val="24"/>
+                <w:szCs w:val="24"/>
+                <w:lang w:eastAsia="en-IN" w:bidi="mr-IN"/>
+              </w:rPr>
+              <w:t>Jadhav</w:t>
+            </w:r>
+            <w:proofErr w:type="spellEnd"/>
           </w:p>
         </w:tc>
         <w:tc>
@@ -11231,8 +11256,20 @@
                 <w:szCs w:val="24"/>
                 <w:lang w:eastAsia="en-IN" w:bidi="mr-IN"/>
               </w:rPr>
-              <w:t xml:space="preserve"> Jadhav</w:t>
-            </w:r>
+              <w:t xml:space="preserve"> </w:t>
+            </w:r>
+            <w:proofErr w:type="spellStart"/>
+            <w:r>
+              <w:rPr>
+                <w:rFonts w:ascii="Times New Roman" w:eastAsia="Times New Roman" w:hAnsi="Times New Roman" w:cs="Times New Roman"/>
+                <w:color w:val="1F1F1F"/>
+                <w:sz w:val="24"/>
+                <w:szCs w:val="24"/>
+                <w:lang w:eastAsia="en-IN" w:bidi="mr-IN"/>
+              </w:rPr>
+              <w:t>Jadhav</w:t>
+            </w:r>
+            <w:proofErr w:type="spellEnd"/>
           </w:p>
         </w:tc>
         <w:tc>
@@ -11520,8 +11557,20 @@
                 <w:szCs w:val="24"/>
                 <w:lang w:eastAsia="en-IN" w:bidi="mr-IN"/>
               </w:rPr>
-              <w:t xml:space="preserve"> Jadhav</w:t>
-            </w:r>
+              <w:t xml:space="preserve"> </w:t>
+            </w:r>
+            <w:proofErr w:type="spellStart"/>
+            <w:r>
+              <w:rPr>
+                <w:rFonts w:ascii="Times New Roman" w:eastAsia="Times New Roman" w:hAnsi="Times New Roman" w:cs="Times New Roman"/>
+                <w:color w:val="1F1F1F"/>
+                <w:sz w:val="24"/>
+                <w:szCs w:val="24"/>
+                <w:lang w:eastAsia="en-IN" w:bidi="mr-IN"/>
+              </w:rPr>
+              <w:t>Jadhav</w:t>
+            </w:r>
+            <w:proofErr w:type="spellEnd"/>
           </w:p>
         </w:tc>
         <w:tc>
@@ -13265,6 +13314,7 @@
                 <w:szCs w:val="24"/>
                 <w:lang w:eastAsia="en-IN" w:bidi="mr-IN"/>
               </w:rPr>
+              <w:lastRenderedPageBreak/>
               <w:t>2</w:t>
             </w:r>
           </w:p>
@@ -16654,7 +16704,15 @@
       </w:r>
       <w:proofErr w:type="spellEnd"/>
       <w:r>
-        <w:t xml:space="preserve"> Jadhav and Shri. Suhas S. Gund) to ensure uninterrupted practical sessions.</w:t>
+        <w:t xml:space="preserve"> </w:t>
+      </w:r>
+      <w:proofErr w:type="spellStart"/>
+      <w:r>
+        <w:t>Jadhav</w:t>
+      </w:r>
+      <w:proofErr w:type="spellEnd"/>
+      <w:r>
+        <w:t xml:space="preserve"> and Shri. Suhas S. Gund) to ensure uninterrupted practical sessions.</w:t>
       </w:r>
     </w:p>
     <w:p>
@@ -17153,15 +17211,16 @@
     <w:tbl>
       <w:tblPr>
         <w:tblW w:w="5000" w:type="pct"/>
+        <w:tblLayout w:type="fixed"/>
         <w:tblLook w:val="04A0" w:firstRow="1" w:lastRow="0" w:firstColumn="1" w:lastColumn="0" w:noHBand="0" w:noVBand="1"/>
       </w:tblPr>
       <w:tblGrid>
-        <w:gridCol w:w="552"/>
-        <w:gridCol w:w="1677"/>
-        <w:gridCol w:w="1677"/>
-        <w:gridCol w:w="1677"/>
-        <w:gridCol w:w="1929"/>
-        <w:gridCol w:w="1896"/>
+        <w:gridCol w:w="482"/>
+        <w:gridCol w:w="1170"/>
+        <w:gridCol w:w="977"/>
+        <w:gridCol w:w="1349"/>
+        <w:gridCol w:w="2519"/>
+        <w:gridCol w:w="2911"/>
       </w:tblGrid>
       <w:tr>
         <w:trPr>
@@ -17169,7 +17228,7 @@
         </w:trPr>
         <w:tc>
           <w:tcPr>
-            <w:tcW w:w="313" w:type="pct"/>
+            <w:tcW w:w="256" w:type="pct"/>
             <w:tcBorders>
               <w:top w:val="single" w:sz="4" w:space="0" w:color="auto"/>
               <w:left w:val="single" w:sz="4" w:space="0" w:color="auto"/>
@@ -17207,7 +17266,7 @@
         </w:tc>
         <w:tc>
           <w:tcPr>
-            <w:tcW w:w="911" w:type="pct"/>
+            <w:tcW w:w="622" w:type="pct"/>
             <w:tcBorders>
               <w:top w:val="single" w:sz="4" w:space="0" w:color="auto"/>
               <w:left w:val="nil"/>
@@ -17246,7 +17305,7 @@
         </w:tc>
         <w:tc>
           <w:tcPr>
-            <w:tcW w:w="911" w:type="pct"/>
+            <w:tcW w:w="519" w:type="pct"/>
             <w:tcBorders>
               <w:top w:val="single" w:sz="4" w:space="0" w:color="auto"/>
               <w:left w:val="nil"/>
@@ -17273,8 +17332,6 @@
               <w:rPr>
                 <w:rFonts w:ascii="Times New Roman" w:eastAsia="Times New Roman" w:hAnsi="Times New Roman" w:cs="Times New Roman"/>
                 <w:color w:val="000000"/>
-                <w:sz w:val="24"/>
-                <w:szCs w:val="24"/>
                 <w:lang w:val="en-US" w:eastAsia="en-IN" w:bidi="mr-IN"/>
               </w:rPr>
               <w:t>Students Computer Ratio</w:t>
@@ -17283,7 +17340,7 @@
         </w:tc>
         <w:tc>
           <w:tcPr>
-            <w:tcW w:w="911" w:type="pct"/>
+            <w:tcW w:w="717" w:type="pct"/>
             <w:tcBorders>
               <w:top w:val="single" w:sz="4" w:space="0" w:color="auto"/>
               <w:left w:val="nil"/>
@@ -17320,7 +17377,7 @@
         </w:tc>
         <w:tc>
           <w:tcPr>
-            <w:tcW w:w="1045" w:type="pct"/>
+            <w:tcW w:w="1339" w:type="pct"/>
             <w:tcBorders>
               <w:top w:val="single" w:sz="4" w:space="0" w:color="auto"/>
               <w:left w:val="nil"/>
@@ -17357,7 +17414,7 @@
         </w:tc>
         <w:tc>
           <w:tcPr>
-            <w:tcW w:w="911" w:type="pct"/>
+            <w:tcW w:w="1547" w:type="pct"/>
             <w:tcBorders>
               <w:top w:val="single" w:sz="4" w:space="0" w:color="auto"/>
               <w:left w:val="nil"/>
@@ -17388,7 +17445,27 @@
                 <w:szCs w:val="24"/>
                 <w:lang w:val="en-US" w:eastAsia="en-IN" w:bidi="mr-IN"/>
               </w:rPr>
-              <w:t>Details of Printers/Scanners etc.</w:t>
+              <w:t>Details of Printers/</w:t>
+            </w:r>
+            <w:r>
+              <w:rPr>
+                <w:rFonts w:ascii="Times New Roman" w:eastAsia="Times New Roman" w:hAnsi="Times New Roman" w:cs="Times New Roman"/>
+                <w:color w:val="000000"/>
+                <w:sz w:val="24"/>
+                <w:szCs w:val="24"/>
+                <w:lang w:val="en-US" w:eastAsia="en-IN" w:bidi="mr-IN"/>
+              </w:rPr>
+              <w:t xml:space="preserve"> </w:t>
+            </w:r>
+            <w:r>
+              <w:rPr>
+                <w:rFonts w:ascii="Times New Roman" w:eastAsia="Times New Roman" w:hAnsi="Times New Roman" w:cs="Times New Roman"/>
+                <w:color w:val="000000"/>
+                <w:sz w:val="24"/>
+                <w:szCs w:val="24"/>
+                <w:lang w:val="en-US" w:eastAsia="en-IN" w:bidi="mr-IN"/>
+              </w:rPr>
+              <w:t>Scanners etc.</w:t>
             </w:r>
           </w:p>
         </w:tc>
@@ -17399,7 +17476,7 @@
         </w:trPr>
         <w:tc>
           <w:tcPr>
-            <w:tcW w:w="313" w:type="pct"/>
+            <w:tcW w:w="256" w:type="pct"/>
             <w:tcBorders>
               <w:top w:val="nil"/>
               <w:left w:val="single" w:sz="4" w:space="0" w:color="auto"/>
@@ -17436,7 +17513,7 @@
         </w:tc>
         <w:tc>
           <w:tcPr>
-            <w:tcW w:w="911" w:type="pct"/>
+            <w:tcW w:w="622" w:type="pct"/>
             <w:tcBorders>
               <w:top w:val="nil"/>
               <w:left w:val="nil"/>
@@ -17466,7 +17543,7 @@
                 <w:szCs w:val="24"/>
                 <w:lang w:eastAsia="en-IN" w:bidi="mr-IN"/>
               </w:rPr>
-              <w:t>1</w:t>
+              <w:t>185</w:t>
             </w:r>
             <w:r>
               <w:rPr>
@@ -17476,7 +17553,7 @@
                 <w:szCs w:val="24"/>
                 <w:lang w:eastAsia="en-IN" w:bidi="mr-IN"/>
               </w:rPr>
-              <w:t>7</w:t>
+              <w:t xml:space="preserve"> </w:t>
             </w:r>
             <w:r>
               <w:rPr>
@@ -17486,43 +17563,13 @@
                 <w:szCs w:val="24"/>
                 <w:lang w:eastAsia="en-IN" w:bidi="mr-IN"/>
               </w:rPr>
-              <w:t xml:space="preserve">0 </w:t>
-            </w:r>
-            <w:r>
-              <w:rPr>
-                <w:rFonts w:ascii="Times New Roman" w:hAnsi="Times New Roman" w:cs="Times New Roman"/>
-                <w:color w:val="000000"/>
-                <w:sz w:val="24"/>
-                <w:szCs w:val="24"/>
-                <w:lang w:eastAsia="en-IN" w:bidi="mr-IN"/>
-              </w:rPr>
-              <w:t>+</w:t>
-            </w:r>
-            <w:r>
-              <w:rPr>
-                <w:rFonts w:ascii="Times New Roman" w:hAnsi="Times New Roman" w:cs="Times New Roman"/>
-                <w:color w:val="000000"/>
-                <w:sz w:val="24"/>
-                <w:szCs w:val="24"/>
-                <w:lang w:eastAsia="en-IN" w:bidi="mr-IN"/>
-              </w:rPr>
-              <w:t xml:space="preserve"> </w:t>
-            </w:r>
-            <w:r>
-              <w:rPr>
-                <w:rFonts w:ascii="Times New Roman" w:hAnsi="Times New Roman" w:cs="Times New Roman"/>
-                <w:color w:val="000000"/>
-                <w:sz w:val="24"/>
-                <w:szCs w:val="24"/>
-                <w:lang w:eastAsia="en-IN" w:bidi="mr-IN"/>
-              </w:rPr>
               <w:t>Computers including 3 laptops.</w:t>
             </w:r>
           </w:p>
         </w:tc>
         <w:tc>
           <w:tcPr>
-            <w:tcW w:w="911" w:type="pct"/>
+            <w:tcW w:w="519" w:type="pct"/>
             <w:tcBorders>
               <w:top w:val="nil"/>
               <w:left w:val="nil"/>
@@ -17569,7 +17616,7 @@
         </w:tc>
         <w:tc>
           <w:tcPr>
-            <w:tcW w:w="911" w:type="pct"/>
+            <w:tcW w:w="717" w:type="pct"/>
             <w:tcBorders>
               <w:top w:val="nil"/>
               <w:left w:val="nil"/>
@@ -17602,11 +17649,22 @@
               </w:rPr>
               <w:t>Windows 11, Anti-virus, Oracle DB, Turbo C++, Eclipse IDE</w:t>
             </w:r>
-          </w:p>
-        </w:tc>
-        <w:tc>
-          <w:tcPr>
-            <w:tcW w:w="1045" w:type="pct"/>
+            <w:r>
+              <w:rPr>
+                <w:rFonts w:ascii="Times New Roman" w:eastAsia="Times New Roman" w:hAnsi="Times New Roman" w:cs="Times New Roman"/>
+                <w:color w:val="000000"/>
+                <w:sz w:val="24"/>
+                <w:szCs w:val="24"/>
+                <w:lang w:eastAsia="en-IN" w:bidi="mr-IN"/>
+              </w:rPr>
+              <w:br/>
+              <w:t>MS-Office, Mint-Book</w:t>
+            </w:r>
+          </w:p>
+        </w:tc>
+        <w:tc>
+          <w:tcPr>
+            <w:tcW w:w="1339" w:type="pct"/>
             <w:tcBorders>
               <w:top w:val="nil"/>
               <w:left w:val="nil"/>
@@ -17614,19 +17672,17 @@
               <w:right w:val="single" w:sz="4" w:space="0" w:color="auto"/>
             </w:tcBorders>
             <w:shd w:val="clear" w:color="auto" w:fill="auto"/>
-            <w:vAlign w:val="center"/>
             <w:hideMark/>
           </w:tcPr>
           <w:p>
             <w:pPr>
               <w:spacing w:after="0" w:line="240" w:lineRule="auto"/>
-              <w:jc w:val="center"/>
               <w:rPr>
                 <w:rFonts w:ascii="Times New Roman" w:eastAsia="Times New Roman" w:hAnsi="Times New Roman" w:cs="Times New Roman"/>
                 <w:color w:val="000000"/>
                 <w:sz w:val="24"/>
                 <w:szCs w:val="24"/>
-                <w:lang w:eastAsia="en-IN" w:bidi="mr-IN"/>
+                <w:lang w:val="en-US" w:eastAsia="en-IN" w:bidi="mr-IN"/>
               </w:rPr>
             </w:pPr>
             <w:r>
@@ -17637,13 +17693,161 @@
                 <w:szCs w:val="24"/>
                 <w:lang w:val="en-US" w:eastAsia="en-IN" w:bidi="mr-IN"/>
               </w:rPr>
-              <w:t>LAN with internet connectivity</w:t>
-            </w:r>
-          </w:p>
-        </w:tc>
-        <w:tc>
-          <w:tcPr>
-            <w:tcW w:w="911" w:type="pct"/>
+              <w:t xml:space="preserve">1) D-link Switch 24 ports – 8 </w:t>
+            </w:r>
+            <w:proofErr w:type="spellStart"/>
+            <w:r>
+              <w:rPr>
+                <w:rFonts w:ascii="Times New Roman" w:eastAsia="Times New Roman" w:hAnsi="Times New Roman" w:cs="Times New Roman"/>
+                <w:color w:val="000000"/>
+                <w:sz w:val="24"/>
+                <w:szCs w:val="24"/>
+                <w:lang w:val="en-US" w:eastAsia="en-IN" w:bidi="mr-IN"/>
+              </w:rPr>
+              <w:t>Qty</w:t>
+            </w:r>
+            <w:proofErr w:type="spellEnd"/>
+          </w:p>
+          <w:p>
+            <w:pPr>
+              <w:spacing w:after="0" w:line="240" w:lineRule="auto"/>
+              <w:rPr>
+                <w:rFonts w:ascii="Times New Roman" w:eastAsia="Times New Roman" w:hAnsi="Times New Roman" w:cs="Times New Roman"/>
+                <w:color w:val="000000"/>
+                <w:sz w:val="24"/>
+                <w:szCs w:val="24"/>
+                <w:lang w:val="en-US" w:eastAsia="en-IN" w:bidi="mr-IN"/>
+              </w:rPr>
+            </w:pPr>
+            <w:r>
+              <w:rPr>
+                <w:rFonts w:ascii="Times New Roman" w:eastAsia="Times New Roman" w:hAnsi="Times New Roman" w:cs="Times New Roman"/>
+                <w:color w:val="000000"/>
+                <w:sz w:val="24"/>
+                <w:szCs w:val="24"/>
+                <w:lang w:val="en-US" w:eastAsia="en-IN" w:bidi="mr-IN"/>
+              </w:rPr>
+              <w:t xml:space="preserve">2) Network Switch 8 Ports -2 </w:t>
+            </w:r>
+            <w:proofErr w:type="spellStart"/>
+            <w:r>
+              <w:rPr>
+                <w:rFonts w:ascii="Times New Roman" w:eastAsia="Times New Roman" w:hAnsi="Times New Roman" w:cs="Times New Roman"/>
+                <w:color w:val="000000"/>
+                <w:sz w:val="24"/>
+                <w:szCs w:val="24"/>
+                <w:lang w:val="en-US" w:eastAsia="en-IN" w:bidi="mr-IN"/>
+              </w:rPr>
+              <w:t>Qty</w:t>
+            </w:r>
+            <w:proofErr w:type="spellEnd"/>
+          </w:p>
+          <w:p>
+            <w:pPr>
+              <w:spacing w:after="0" w:line="240" w:lineRule="auto"/>
+              <w:rPr>
+                <w:rFonts w:ascii="Times New Roman" w:eastAsia="Times New Roman" w:hAnsi="Times New Roman" w:cs="Times New Roman"/>
+                <w:color w:val="000000"/>
+                <w:sz w:val="24"/>
+                <w:szCs w:val="24"/>
+                <w:lang w:val="en-US" w:eastAsia="en-IN" w:bidi="mr-IN"/>
+              </w:rPr>
+            </w:pPr>
+            <w:r>
+              <w:rPr>
+                <w:rFonts w:ascii="Times New Roman" w:eastAsia="Times New Roman" w:hAnsi="Times New Roman" w:cs="Times New Roman"/>
+                <w:color w:val="000000"/>
+                <w:sz w:val="24"/>
+                <w:szCs w:val="24"/>
+                <w:lang w:val="en-US" w:eastAsia="en-IN" w:bidi="mr-IN"/>
+              </w:rPr>
+              <w:t xml:space="preserve">3) </w:t>
+            </w:r>
+            <w:proofErr w:type="spellStart"/>
+            <w:r>
+              <w:rPr>
+                <w:rFonts w:ascii="Times New Roman" w:eastAsia="Times New Roman" w:hAnsi="Times New Roman" w:cs="Times New Roman"/>
+                <w:color w:val="000000"/>
+                <w:sz w:val="24"/>
+                <w:szCs w:val="24"/>
+                <w:lang w:val="en-US" w:eastAsia="en-IN" w:bidi="mr-IN"/>
+              </w:rPr>
+              <w:t>Wifi</w:t>
+            </w:r>
+            <w:proofErr w:type="spellEnd"/>
+            <w:r>
+              <w:rPr>
+                <w:rFonts w:ascii="Times New Roman" w:eastAsia="Times New Roman" w:hAnsi="Times New Roman" w:cs="Times New Roman"/>
+                <w:color w:val="000000"/>
+                <w:sz w:val="24"/>
+                <w:szCs w:val="24"/>
+                <w:lang w:val="en-US" w:eastAsia="en-IN" w:bidi="mr-IN"/>
+              </w:rPr>
+              <w:t xml:space="preserve"> Router – 5 </w:t>
+            </w:r>
+            <w:proofErr w:type="spellStart"/>
+            <w:r>
+              <w:rPr>
+                <w:rFonts w:ascii="Times New Roman" w:eastAsia="Times New Roman" w:hAnsi="Times New Roman" w:cs="Times New Roman"/>
+                <w:color w:val="000000"/>
+                <w:sz w:val="24"/>
+                <w:szCs w:val="24"/>
+                <w:lang w:val="en-US" w:eastAsia="en-IN" w:bidi="mr-IN"/>
+              </w:rPr>
+              <w:t>Qty</w:t>
+            </w:r>
+            <w:proofErr w:type="spellEnd"/>
+          </w:p>
+          <w:p>
+            <w:pPr>
+              <w:spacing w:after="0" w:line="240" w:lineRule="auto"/>
+              <w:rPr>
+                <w:rFonts w:ascii="Times New Roman" w:eastAsia="Times New Roman" w:hAnsi="Times New Roman" w:cs="Times New Roman"/>
+                <w:color w:val="000000"/>
+                <w:sz w:val="24"/>
+                <w:szCs w:val="24"/>
+                <w:lang w:val="en-US" w:eastAsia="en-IN" w:bidi="mr-IN"/>
+              </w:rPr>
+            </w:pPr>
+            <w:r>
+              <w:rPr>
+                <w:rFonts w:ascii="Times New Roman" w:eastAsia="Times New Roman" w:hAnsi="Times New Roman" w:cs="Times New Roman"/>
+                <w:color w:val="000000"/>
+                <w:sz w:val="24"/>
+                <w:szCs w:val="24"/>
+                <w:lang w:val="en-US" w:eastAsia="en-IN" w:bidi="mr-IN"/>
+              </w:rPr>
+              <w:t xml:space="preserve">4) Internet Router – 2 </w:t>
+            </w:r>
+            <w:proofErr w:type="spellStart"/>
+            <w:r>
+              <w:rPr>
+                <w:rFonts w:ascii="Times New Roman" w:eastAsia="Times New Roman" w:hAnsi="Times New Roman" w:cs="Times New Roman"/>
+                <w:color w:val="000000"/>
+                <w:sz w:val="24"/>
+                <w:szCs w:val="24"/>
+                <w:lang w:val="en-US" w:eastAsia="en-IN" w:bidi="mr-IN"/>
+              </w:rPr>
+              <w:t>Qty</w:t>
+            </w:r>
+            <w:proofErr w:type="spellEnd"/>
+          </w:p>
+          <w:p>
+            <w:pPr>
+              <w:spacing w:after="0" w:line="240" w:lineRule="auto"/>
+              <w:rPr>
+                <w:rFonts w:ascii="Times New Roman" w:eastAsia="Times New Roman" w:hAnsi="Times New Roman" w:cs="Times New Roman"/>
+                <w:color w:val="000000"/>
+                <w:sz w:val="24"/>
+                <w:szCs w:val="24"/>
+                <w:lang w:eastAsia="en-IN" w:bidi="mr-IN"/>
+              </w:rPr>
+            </w:pPr>
+          </w:p>
+        </w:tc>
+        <w:tc>
+          <w:tcPr>
+            <w:tcW w:w="1547" w:type="pct"/>
             <w:tcBorders>
               <w:top w:val="nil"/>
               <w:left w:val="nil"/>
@@ -17651,19 +17855,17 @@
               <w:right w:val="single" w:sz="4" w:space="0" w:color="auto"/>
             </w:tcBorders>
             <w:shd w:val="clear" w:color="auto" w:fill="auto"/>
-            <w:vAlign w:val="center"/>
             <w:hideMark/>
           </w:tcPr>
           <w:p>
             <w:pPr>
               <w:spacing w:after="0" w:line="240" w:lineRule="auto"/>
-              <w:jc w:val="center"/>
               <w:rPr>
                 <w:rFonts w:ascii="Times New Roman" w:eastAsia="Times New Roman" w:hAnsi="Times New Roman" w:cs="Times New Roman"/>
                 <w:color w:val="000000"/>
                 <w:sz w:val="24"/>
                 <w:szCs w:val="24"/>
-                <w:lang w:eastAsia="en-IN" w:bidi="mr-IN"/>
+                <w:lang w:val="en-US" w:eastAsia="en-IN" w:bidi="mr-IN"/>
               </w:rPr>
             </w:pPr>
             <w:r>
@@ -17672,10 +17874,208 @@
                 <w:color w:val="000000"/>
                 <w:sz w:val="24"/>
                 <w:szCs w:val="24"/>
-                <w:lang w:eastAsia="en-IN" w:bidi="mr-IN"/>
-              </w:rPr>
-              <w:t>2 MFP Printers, 1 Printer with Scanner, 2 Printers, 1 Scanner.</w:t>
-            </w:r>
+                <w:lang w:val="en-US" w:eastAsia="en-IN" w:bidi="mr-IN"/>
+              </w:rPr>
+              <w:t>1)</w:t>
+            </w:r>
+            <w:r>
+              <w:rPr>
+                <w:rFonts w:ascii="Times New Roman" w:eastAsia="Times New Roman" w:hAnsi="Times New Roman" w:cs="Times New Roman"/>
+                <w:color w:val="000000"/>
+                <w:sz w:val="24"/>
+                <w:szCs w:val="24"/>
+                <w:lang w:val="en-US" w:eastAsia="en-IN" w:bidi="mr-IN"/>
+              </w:rPr>
+              <w:t xml:space="preserve">Canon Scanner – 2 </w:t>
+            </w:r>
+            <w:proofErr w:type="spellStart"/>
+            <w:r>
+              <w:rPr>
+                <w:rFonts w:ascii="Times New Roman" w:eastAsia="Times New Roman" w:hAnsi="Times New Roman" w:cs="Times New Roman"/>
+                <w:color w:val="000000"/>
+                <w:sz w:val="24"/>
+                <w:szCs w:val="24"/>
+                <w:lang w:val="en-US" w:eastAsia="en-IN" w:bidi="mr-IN"/>
+              </w:rPr>
+              <w:t>Qty</w:t>
+            </w:r>
+            <w:proofErr w:type="spellEnd"/>
+          </w:p>
+          <w:p>
+            <w:pPr>
+              <w:spacing w:after="0" w:line="240" w:lineRule="auto"/>
+              <w:rPr>
+                <w:rFonts w:ascii="Times New Roman" w:eastAsia="Times New Roman" w:hAnsi="Times New Roman" w:cs="Times New Roman"/>
+                <w:color w:val="000000"/>
+                <w:sz w:val="24"/>
+                <w:szCs w:val="24"/>
+                <w:lang w:val="en-US" w:eastAsia="en-IN" w:bidi="mr-IN"/>
+              </w:rPr>
+            </w:pPr>
+            <w:r>
+              <w:rPr>
+                <w:rFonts w:ascii="Times New Roman" w:eastAsia="Times New Roman" w:hAnsi="Times New Roman" w:cs="Times New Roman"/>
+                <w:color w:val="000000"/>
+                <w:sz w:val="24"/>
+                <w:szCs w:val="24"/>
+                <w:lang w:val="en-US" w:eastAsia="en-IN" w:bidi="mr-IN"/>
+              </w:rPr>
+              <w:t>2)</w:t>
+            </w:r>
+            <w:proofErr w:type="spellStart"/>
+            <w:r>
+              <w:rPr>
+                <w:rFonts w:ascii="Times New Roman" w:eastAsia="Times New Roman" w:hAnsi="Times New Roman" w:cs="Times New Roman"/>
+                <w:color w:val="000000"/>
+                <w:sz w:val="24"/>
+                <w:szCs w:val="24"/>
+                <w:lang w:val="en-US" w:eastAsia="en-IN" w:bidi="mr-IN"/>
+              </w:rPr>
+              <w:t>Hp</w:t>
+            </w:r>
+            <w:proofErr w:type="spellEnd"/>
+            <w:r>
+              <w:rPr>
+                <w:rFonts w:ascii="Times New Roman" w:eastAsia="Times New Roman" w:hAnsi="Times New Roman" w:cs="Times New Roman"/>
+                <w:color w:val="000000"/>
+                <w:sz w:val="24"/>
+                <w:szCs w:val="24"/>
+                <w:lang w:val="en-US" w:eastAsia="en-IN" w:bidi="mr-IN"/>
+              </w:rPr>
+              <w:t xml:space="preserve"> LaserJet 1020 – 1 </w:t>
+            </w:r>
+            <w:proofErr w:type="spellStart"/>
+            <w:r>
+              <w:rPr>
+                <w:rFonts w:ascii="Times New Roman" w:eastAsia="Times New Roman" w:hAnsi="Times New Roman" w:cs="Times New Roman"/>
+                <w:color w:val="000000"/>
+                <w:sz w:val="24"/>
+                <w:szCs w:val="24"/>
+                <w:lang w:val="en-US" w:eastAsia="en-IN" w:bidi="mr-IN"/>
+              </w:rPr>
+              <w:t>Qty</w:t>
+            </w:r>
+            <w:proofErr w:type="spellEnd"/>
+          </w:p>
+          <w:p>
+            <w:pPr>
+              <w:spacing w:after="0" w:line="240" w:lineRule="auto"/>
+              <w:rPr>
+                <w:rFonts w:ascii="Times New Roman" w:eastAsia="Times New Roman" w:hAnsi="Times New Roman" w:cs="Times New Roman"/>
+                <w:color w:val="000000"/>
+                <w:sz w:val="24"/>
+                <w:szCs w:val="24"/>
+                <w:lang w:val="en-US" w:eastAsia="en-IN" w:bidi="mr-IN"/>
+              </w:rPr>
+            </w:pPr>
+            <w:r>
+              <w:rPr>
+                <w:rFonts w:ascii="Times New Roman" w:eastAsia="Times New Roman" w:hAnsi="Times New Roman" w:cs="Times New Roman"/>
+                <w:color w:val="000000"/>
+                <w:sz w:val="24"/>
+                <w:szCs w:val="24"/>
+                <w:lang w:val="en-US" w:eastAsia="en-IN" w:bidi="mr-IN"/>
+              </w:rPr>
+              <w:t>3)</w:t>
+            </w:r>
+            <w:r>
+              <w:rPr>
+                <w:rFonts w:ascii="Times New Roman" w:eastAsia="Times New Roman" w:hAnsi="Times New Roman" w:cs="Times New Roman"/>
+                <w:color w:val="000000"/>
+                <w:sz w:val="24"/>
+                <w:szCs w:val="24"/>
+                <w:lang w:val="en-US" w:eastAsia="en-IN" w:bidi="mr-IN"/>
+              </w:rPr>
+              <w:t>HP MFP S 237-1Qty</w:t>
+            </w:r>
+          </w:p>
+          <w:p>
+            <w:pPr>
+              <w:spacing w:after="0" w:line="240" w:lineRule="auto"/>
+              <w:rPr>
+                <w:rFonts w:ascii="Times New Roman" w:eastAsia="Times New Roman" w:hAnsi="Times New Roman" w:cs="Times New Roman"/>
+                <w:color w:val="000000"/>
+                <w:sz w:val="24"/>
+                <w:szCs w:val="24"/>
+                <w:lang w:val="en-US" w:eastAsia="en-IN" w:bidi="mr-IN"/>
+              </w:rPr>
+            </w:pPr>
+            <w:r>
+              <w:rPr>
+                <w:rFonts w:ascii="Times New Roman" w:eastAsia="Times New Roman" w:hAnsi="Times New Roman" w:cs="Times New Roman"/>
+                <w:color w:val="000000"/>
+                <w:sz w:val="24"/>
+                <w:szCs w:val="24"/>
+                <w:lang w:val="en-US" w:eastAsia="en-IN" w:bidi="mr-IN"/>
+              </w:rPr>
+              <w:t>4)</w:t>
+            </w:r>
+            <w:r>
+              <w:rPr>
+                <w:rFonts w:ascii="Times New Roman" w:eastAsia="Times New Roman" w:hAnsi="Times New Roman" w:cs="Times New Roman"/>
+                <w:color w:val="000000"/>
+                <w:sz w:val="24"/>
+                <w:szCs w:val="24"/>
+                <w:lang w:val="en-US" w:eastAsia="en-IN" w:bidi="mr-IN"/>
+              </w:rPr>
+              <w:t xml:space="preserve">Canon Printer – 1 </w:t>
+            </w:r>
+            <w:proofErr w:type="spellStart"/>
+            <w:r>
+              <w:rPr>
+                <w:rFonts w:ascii="Times New Roman" w:eastAsia="Times New Roman" w:hAnsi="Times New Roman" w:cs="Times New Roman"/>
+                <w:color w:val="000000"/>
+                <w:sz w:val="24"/>
+                <w:szCs w:val="24"/>
+                <w:lang w:val="en-US" w:eastAsia="en-IN" w:bidi="mr-IN"/>
+              </w:rPr>
+              <w:t>Qty</w:t>
+            </w:r>
+            <w:proofErr w:type="spellEnd"/>
+          </w:p>
+          <w:p>
+            <w:pPr>
+              <w:spacing w:after="0" w:line="240" w:lineRule="auto"/>
+              <w:rPr>
+                <w:rFonts w:ascii="Times New Roman" w:eastAsia="Times New Roman" w:hAnsi="Times New Roman" w:cs="Times New Roman"/>
+                <w:color w:val="000000"/>
+                <w:sz w:val="24"/>
+                <w:szCs w:val="24"/>
+                <w:lang w:eastAsia="en-IN" w:bidi="mr-IN"/>
+              </w:rPr>
+            </w:pPr>
+            <w:r>
+              <w:rPr>
+                <w:rFonts w:ascii="Times New Roman" w:eastAsia="Times New Roman" w:hAnsi="Times New Roman" w:cs="Times New Roman"/>
+                <w:color w:val="000000"/>
+                <w:sz w:val="24"/>
+                <w:szCs w:val="24"/>
+                <w:lang w:val="en-US" w:eastAsia="en-IN" w:bidi="mr-IN"/>
+              </w:rPr>
+              <w:t>5)</w:t>
+            </w:r>
+            <w:r>
+              <w:rPr>
+                <w:rFonts w:ascii="Times New Roman" w:eastAsia="Times New Roman" w:hAnsi="Times New Roman" w:cs="Times New Roman"/>
+                <w:color w:val="000000"/>
+                <w:sz w:val="24"/>
+                <w:szCs w:val="24"/>
+                <w:lang w:val="en-US" w:eastAsia="en-IN" w:bidi="mr-IN"/>
+              </w:rPr>
+              <w:t xml:space="preserve">Epson MFP 15140 -2 </w:t>
+            </w:r>
+            <w:proofErr w:type="spellStart"/>
+            <w:r>
+              <w:rPr>
+                <w:rFonts w:ascii="Times New Roman" w:eastAsia="Times New Roman" w:hAnsi="Times New Roman" w:cs="Times New Roman"/>
+                <w:color w:val="000000"/>
+                <w:sz w:val="24"/>
+                <w:szCs w:val="24"/>
+                <w:lang w:val="en-US" w:eastAsia="en-IN" w:bidi="mr-IN"/>
+              </w:rPr>
+              <w:t>Qty</w:t>
+            </w:r>
+            <w:proofErr w:type="spellEnd"/>
           </w:p>
         </w:tc>
       </w:tr>
@@ -17826,21 +18226,21 @@
       <w:tblPr>
         <w:tblStyle w:val="TableGrid"/>
         <w:tblpPr w:leftFromText="180" w:rightFromText="180" w:vertAnchor="text" w:horzAnchor="margin" w:tblpX="-147" w:tblpY="263"/>
-        <w:tblW w:w="5197" w:type="pct"/>
+        <w:tblW w:w="5134" w:type="pct"/>
         <w:shd w:val="clear" w:color="auto" w:fill="FFFFFF" w:themeFill="background1"/>
         <w:tblLook w:val="04A0" w:firstRow="1" w:lastRow="0" w:firstColumn="1" w:lastColumn="0" w:noHBand="0" w:noVBand="1"/>
       </w:tblPr>
       <w:tblGrid>
-        <w:gridCol w:w="1464"/>
-        <w:gridCol w:w="1154"/>
-        <w:gridCol w:w="1461"/>
-        <w:gridCol w:w="2548"/>
-        <w:gridCol w:w="1486"/>
-        <w:gridCol w:w="1666"/>
+        <w:gridCol w:w="1446"/>
+        <w:gridCol w:w="1140"/>
+        <w:gridCol w:w="1443"/>
+        <w:gridCol w:w="2517"/>
+        <w:gridCol w:w="1468"/>
+        <w:gridCol w:w="1646"/>
       </w:tblGrid>
       <w:tr>
         <w:trPr>
-          <w:trHeight w:val="994"/>
+          <w:trHeight w:val="1014"/>
         </w:trPr>
         <w:tc>
           <w:tcPr>
@@ -18004,7 +18404,7 @@
         </w:tc>
         <w:tc>
           <w:tcPr>
-            <w:tcW w:w="853" w:type="pct"/>
+            <w:tcW w:w="852" w:type="pct"/>
             <w:shd w:val="clear" w:color="auto" w:fill="FFFFFF" w:themeFill="background1"/>
           </w:tcPr>
           <w:p>
@@ -18037,7 +18437,7 @@
       </w:tr>
       <w:tr>
         <w:trPr>
-          <w:trHeight w:val="2356"/>
+          <w:trHeight w:val="2403"/>
         </w:trPr>
         <w:tc>
           <w:tcPr>
@@ -18382,7 +18782,7 @@
         </w:tc>
         <w:tc>
           <w:tcPr>
-            <w:tcW w:w="853" w:type="pct"/>
+            <w:tcW w:w="852" w:type="pct"/>
             <w:shd w:val="clear" w:color="auto" w:fill="FFFFFF" w:themeFill="background1"/>
           </w:tcPr>
           <w:p>
@@ -18754,7 +19154,18 @@
                 <w:sz w:val="24"/>
                 <w:szCs w:val="24"/>
               </w:rPr>
-              <w:t>To enable students to express themselves in basic language Skills like Listening, Speaking, Reading and Writing</w:t>
+              <w:t>To enable</w:t>
+            </w:r>
+            <w:bookmarkStart w:id="2" w:name="_GoBack"/>
+            <w:bookmarkEnd w:id="2"/>
+            <w:r>
+              <w:rPr>
+                <w:rFonts w:ascii="Times New Roman" w:hAnsi="Times New Roman" w:cs="Times New Roman"/>
+                <w:color w:val="000000"/>
+                <w:sz w:val="24"/>
+                <w:szCs w:val="24"/>
+              </w:rPr>
+              <w:t xml:space="preserve"> students to express themselves in basic language Skills like Listening, Speaking, Reading and Writing</w:t>
             </w:r>
           </w:p>
         </w:tc>
@@ -19382,7 +19793,7 @@
       </w:pPr>
     </w:p>
     <w:sectPr>
-      <w:footerReference w:type="default" r:id="rId22"/>
+      <w:footerReference w:type="default" r:id="rId23"/>
       <w:pgSz w:w="11906" w:h="16838"/>
       <w:pgMar w:top="1440" w:right="1274" w:bottom="1440" w:left="1440" w:header="708" w:footer="432" w:gutter="0"/>
       <w:pgBorders w:offsetFrom="page">
@@ -19399,7 +19810,7 @@
 </file>
 
 <file path=word/endnotes.xml><?xml version="1.0" encoding="utf-8"?>
-<w:endnotes xmlns:wpc="http://schemas.microsoft.com/office/word/2010/wordprocessingCanvas" xmlns:cx="http://schemas.microsoft.com/office/drawing/2014/chartex" xmlns:cx1="http://schemas.microsoft.com/office/drawing/2015/9/8/chartex" xmlns:cx2="http://schemas.microsoft.com/office/drawing/2015/10/21/chartex" xmlns:cx3="http://schemas.microsoft.com/office/drawing/2016/5/9/chartex" xmlns:cx4="http://schemas.microsoft.com/office/drawing/2016/5/10/chartex" xmlns:cx5="http://schemas.microsoft.com/office/drawing/2016/5/11/chartex" xmlns:cx6="http://schemas.microsoft.com/office/drawing/2016/5/12/chartex" xmlns:cx7="http://schemas.microsoft.com/office/drawing/2016/5/13/chartex" xmlns:cx8="http://schemas.microsoft.com/office/drawing/2016/5/14/chartex" xmlns:mc="http://schemas.openxmlformats.org/markup-compatibility/2006" xmlns:aink="http://schemas.microsoft.com/office/drawing/2016/ink" xmlns:am3d="http://schemas.microsoft.com/office/drawing/2017/model3d" xmlns:o="urn:schemas-microsoft-com:office:office" xmlns:oel="http://schemas.microsoft.com/office/2019/extlst" xmlns:r="http://schemas.openxmlformats.org/officeDocument/2006/relationships" xmlns:m="http://schemas.openxmlformats.org/officeDocument/2006/math" xmlns:v="urn:schemas-microsoft-com:vml" xmlns:wp14="http://schemas.microsoft.com/office/word/2010/wordprocessingDrawing" xmlns:wp="http://schemas.openxmlformats.org/drawingml/2006/wordprocessingDrawing" xmlns:w10="urn:schemas-microsoft-com:office:word" xmlns:w="http://schemas.openxmlformats.org/wordprocessingml/2006/main" xmlns:w14="http://schemas.microsoft.com/office/word/2010/wordml" xmlns:w15="http://schemas.microsoft.com/office/word/2012/wordml" xmlns:w16cex="http://schemas.microsoft.com/office/word/2018/wordml/cex" xmlns:w16cid="http://schemas.microsoft.com/office/word/2016/wordml/cid" xmlns:w16="http://schemas.microsoft.com/office/word/2018/wordml" xmlns:w16du="http://schemas.microsoft.com/office/word/2023/wordml/word16du" xmlns:w16sdtdh="http://schemas.microsoft.com/office/word/2020/wordml/sdtdatahash" xmlns:w16se="http://schemas.microsoft.com/office/word/2015/wordml/symex" xmlns:wpg="http://schemas.microsoft.com/office/word/2010/wordprocessingGroup" xmlns:wpi="http://schemas.microsoft.com/office/word/2010/wordprocessingInk" xmlns:wne="http://schemas.microsoft.com/office/word/2006/wordml" xmlns:wps="http://schemas.microsoft.com/office/word/2010/wordprocessingShape" mc:Ignorable="w14 w15 w16se w16cid w16 w16cex w16sdtdh w16du wp14">
+<w:endnotes xmlns:wpc="http://schemas.microsoft.com/office/word/2010/wordprocessingCanvas" xmlns:mc="http://schemas.openxmlformats.org/markup-compatibility/2006" xmlns:o="urn:schemas-microsoft-com:office:office" xmlns:r="http://schemas.openxmlformats.org/officeDocument/2006/relationships" xmlns:m="http://schemas.openxmlformats.org/officeDocument/2006/math" xmlns:v="urn:schemas-microsoft-com:vml" xmlns:wp14="http://schemas.microsoft.com/office/word/2010/wordprocessingDrawing" xmlns:wp="http://schemas.openxmlformats.org/drawingml/2006/wordprocessingDrawing" xmlns:w10="urn:schemas-microsoft-com:office:word" xmlns:w="http://schemas.openxmlformats.org/wordprocessingml/2006/main" xmlns:w14="http://schemas.microsoft.com/office/word/2010/wordml" xmlns:wpg="http://schemas.microsoft.com/office/word/2010/wordprocessingGroup" xmlns:wpi="http://schemas.microsoft.com/office/word/2010/wordprocessingInk" xmlns:wne="http://schemas.microsoft.com/office/word/2006/wordml" xmlns:wps="http://schemas.microsoft.com/office/word/2010/wordprocessingShape" mc:Ignorable="w14 wp14">
   <w:endnote w:type="separator" w:id="-1">
     <w:p>
       <w:pPr>
@@ -19424,7 +19835,7 @@
 </file>
 
 <file path=word/footer1.xml><?xml version="1.0" encoding="utf-8"?>
-<w:ftr xmlns:wpc="http://schemas.microsoft.com/office/word/2010/wordprocessingCanvas" xmlns:cx="http://schemas.microsoft.com/office/drawing/2014/chartex" xmlns:cx1="http://schemas.microsoft.com/office/drawing/2015/9/8/chartex" xmlns:cx2="http://schemas.microsoft.com/office/drawing/2015/10/21/chartex" xmlns:cx3="http://schemas.microsoft.com/office/drawing/2016/5/9/chartex" xmlns:cx4="http://schemas.microsoft.com/office/drawing/2016/5/10/chartex" xmlns:cx5="http://schemas.microsoft.com/office/drawing/2016/5/11/chartex" xmlns:cx6="http://schemas.microsoft.com/office/drawing/2016/5/12/chartex" xmlns:cx7="http://schemas.microsoft.com/office/drawing/2016/5/13/chartex" xmlns:cx8="http://schemas.microsoft.com/office/drawing/2016/5/14/chartex" xmlns:mc="http://schemas.openxmlformats.org/markup-compatibility/2006" xmlns:aink="http://schemas.microsoft.com/office/drawing/2016/ink" xmlns:am3d="http://schemas.microsoft.com/office/drawing/2017/model3d" xmlns:o="urn:schemas-microsoft-com:office:office" xmlns:oel="http://schemas.microsoft.com/office/2019/extlst" xmlns:r="http://schemas.openxmlformats.org/officeDocument/2006/relationships" xmlns:m="http://schemas.openxmlformats.org/officeDocument/2006/math" xmlns:v="urn:schemas-microsoft-com:vml" xmlns:wp14="http://schemas.microsoft.com/office/word/2010/wordprocessingDrawing" xmlns:wp="http://schemas.openxmlformats.org/drawingml/2006/wordprocessingDrawing" xmlns:w10="urn:schemas-microsoft-com:office:word" xmlns:w="http://schemas.openxmlformats.org/wordprocessingml/2006/main" xmlns:w14="http://schemas.microsoft.com/office/word/2010/wordml" xmlns:w15="http://schemas.microsoft.com/office/word/2012/wordml" xmlns:w16cex="http://schemas.microsoft.com/office/word/2018/wordml/cex" xmlns:w16cid="http://schemas.microsoft.com/office/word/2016/wordml/cid" xmlns:w16="http://schemas.microsoft.com/office/word/2018/wordml" xmlns:w16du="http://schemas.microsoft.com/office/word/2023/wordml/word16du" xmlns:w16sdtdh="http://schemas.microsoft.com/office/word/2020/wordml/sdtdatahash" xmlns:w16se="http://schemas.microsoft.com/office/word/2015/wordml/symex" xmlns:wpg="http://schemas.microsoft.com/office/word/2010/wordprocessingGroup" xmlns:wpi="http://schemas.microsoft.com/office/word/2010/wordprocessingInk" xmlns:wne="http://schemas.microsoft.com/office/word/2006/wordml" xmlns:wps="http://schemas.microsoft.com/office/word/2010/wordprocessingShape" mc:Ignorable="w14 w15 w16se w16cid w16 w16cex w16sdtdh w16du wp14">
+<w:ftr xmlns:wpc="http://schemas.microsoft.com/office/word/2010/wordprocessingCanvas" xmlns:mc="http://schemas.openxmlformats.org/markup-compatibility/2006" xmlns:o="urn:schemas-microsoft-com:office:office" xmlns:r="http://schemas.openxmlformats.org/officeDocument/2006/relationships" xmlns:m="http://schemas.openxmlformats.org/officeDocument/2006/math" xmlns:v="urn:schemas-microsoft-com:vml" xmlns:wp14="http://schemas.microsoft.com/office/word/2010/wordprocessingDrawing" xmlns:wp="http://schemas.openxmlformats.org/drawingml/2006/wordprocessingDrawing" xmlns:w10="urn:schemas-microsoft-com:office:word" xmlns:w="http://schemas.openxmlformats.org/wordprocessingml/2006/main" xmlns:w14="http://schemas.microsoft.com/office/word/2010/wordml" xmlns:wpg="http://schemas.microsoft.com/office/word/2010/wordprocessingGroup" xmlns:wpi="http://schemas.microsoft.com/office/word/2010/wordprocessingInk" xmlns:wne="http://schemas.microsoft.com/office/word/2006/wordml" xmlns:wps="http://schemas.microsoft.com/office/word/2010/wordprocessingShape" mc:Ignorable="w14 wp14">
   <w:sdt>
     <w:sdtPr>
       <w:id w:val="1810202757"/>
@@ -19457,7 +19868,7 @@
           <w:rPr>
             <w:noProof/>
           </w:rPr>
-          <w:t>1</w:t>
+          <w:t>13</w:t>
         </w:r>
         <w:r>
           <w:rPr>
@@ -19477,7 +19888,7 @@
 </file>
 
 <file path=word/footnotes.xml><?xml version="1.0" encoding="utf-8"?>
-<w:footnotes xmlns:wpc="http://schemas.microsoft.com/office/word/2010/wordprocessingCanvas" xmlns:cx="http://schemas.microsoft.com/office/drawing/2014/chartex" xmlns:cx1="http://schemas.microsoft.com/office/drawing/2015/9/8/chartex" xmlns:cx2="http://schemas.microsoft.com/office/drawing/2015/10/21/chartex" xmlns:cx3="http://schemas.microsoft.com/office/drawing/2016/5/9/chartex" xmlns:cx4="http://schemas.microsoft.com/office/drawing/2016/5/10/chartex" xmlns:cx5="http://schemas.microsoft.com/office/drawing/2016/5/11/chartex" xmlns:cx6="http://schemas.microsoft.com/office/drawing/2016/5/12/chartex" xmlns:cx7="http://schemas.microsoft.com/office/drawing/2016/5/13/chartex" xmlns:cx8="http://schemas.microsoft.com/office/drawing/2016/5/14/chartex" xmlns:mc="http://schemas.openxmlformats.org/markup-compatibility/2006" xmlns:aink="http://schemas.microsoft.com/office/drawing/2016/ink" xmlns:am3d="http://schemas.microsoft.com/office/drawing/2017/model3d" xmlns:o="urn:schemas-microsoft-com:office:office" xmlns:oel="http://schemas.microsoft.com/office/2019/extlst" xmlns:r="http://schemas.openxmlformats.org/officeDocument/2006/relationships" xmlns:m="http://schemas.openxmlformats.org/officeDocument/2006/math" xmlns:v="urn:schemas-microsoft-com:vml" xmlns:wp14="http://schemas.microsoft.com/office/word/2010/wordprocessingDrawing" xmlns:wp="http://schemas.openxmlformats.org/drawingml/2006/wordprocessingDrawing" xmlns:w10="urn:schemas-microsoft-com:office:word" xmlns:w="http://schemas.openxmlformats.org/wordprocessingml/2006/main" xmlns:w14="http://schemas.microsoft.com/office/word/2010/wordml" xmlns:w15="http://schemas.microsoft.com/office/word/2012/wordml" xmlns:w16cex="http://schemas.microsoft.com/office/word/2018/wordml/cex" xmlns:w16cid="http://schemas.microsoft.com/office/word/2016/wordml/cid" xmlns:w16="http://schemas.microsoft.com/office/word/2018/wordml" xmlns:w16du="http://schemas.microsoft.com/office/word/2023/wordml/word16du" xmlns:w16sdtdh="http://schemas.microsoft.com/office/word/2020/wordml/sdtdatahash" xmlns:w16se="http://schemas.microsoft.com/office/word/2015/wordml/symex" xmlns:wpg="http://schemas.microsoft.com/office/word/2010/wordprocessingGroup" xmlns:wpi="http://schemas.microsoft.com/office/word/2010/wordprocessingInk" xmlns:wne="http://schemas.microsoft.com/office/word/2006/wordml" xmlns:wps="http://schemas.microsoft.com/office/word/2010/wordprocessingShape" mc:Ignorable="w14 w15 w16se w16cid w16 w16cex w16sdtdh w16du wp14">
+<w:footnotes xmlns:wpc="http://schemas.microsoft.com/office/word/2010/wordprocessingCanvas" xmlns:mc="http://schemas.openxmlformats.org/markup-compatibility/2006" xmlns:o="urn:schemas-microsoft-com:office:office" xmlns:r="http://schemas.openxmlformats.org/officeDocument/2006/relationships" xmlns:m="http://schemas.openxmlformats.org/officeDocument/2006/math" xmlns:v="urn:schemas-microsoft-com:vml" xmlns:wp14="http://schemas.microsoft.com/office/word/2010/wordprocessingDrawing" xmlns:wp="http://schemas.openxmlformats.org/drawingml/2006/wordprocessingDrawing" xmlns:w10="urn:schemas-microsoft-com:office:word" xmlns:w="http://schemas.openxmlformats.org/wordprocessingml/2006/main" xmlns:w14="http://schemas.microsoft.com/office/word/2010/wordml" xmlns:wpg="http://schemas.microsoft.com/office/word/2010/wordprocessingGroup" xmlns:wpi="http://schemas.microsoft.com/office/word/2010/wordprocessingInk" xmlns:wne="http://schemas.microsoft.com/office/word/2006/wordml" xmlns:wps="http://schemas.microsoft.com/office/word/2010/wordprocessingShape" mc:Ignorable="w14 wp14">
   <w:footnote w:type="separator" w:id="-1">
     <w:p>
       <w:pPr>
@@ -19502,8 +19913,8 @@
 </file>
 
 <file path=word/numbering.xml><?xml version="1.0" encoding="utf-8"?>
-<w:numbering xmlns:wpc="http://schemas.microsoft.com/office/word/2010/wordprocessingCanvas" xmlns:cx="http://schemas.microsoft.com/office/drawing/2014/chartex" xmlns:cx1="http://schemas.microsoft.com/office/drawing/2015/9/8/chartex" xmlns:cx2="http://schemas.microsoft.com/office/drawing/2015/10/21/chartex" xmlns:cx3="http://schemas.microsoft.com/office/drawing/2016/5/9/chartex" xmlns:cx4="http://schemas.microsoft.com/office/drawing/2016/5/10/chartex" xmlns:cx5="http://schemas.microsoft.com/office/drawing/2016/5/11/chartex" xmlns:cx6="http://schemas.microsoft.com/office/drawing/2016/5/12/chartex" xmlns:cx7="http://schemas.microsoft.com/office/drawing/2016/5/13/chartex" xmlns:cx8="http://schemas.microsoft.com/office/drawing/2016/5/14/chartex" xmlns:mc="http://schemas.openxmlformats.org/markup-compatibility/2006" xmlns:aink="http://schemas.microsoft.com/office/drawing/2016/ink" xmlns:am3d="http://schemas.microsoft.com/office/drawing/2017/model3d" xmlns:o="urn:schemas-microsoft-com:office:office" xmlns:oel="http://schemas.microsoft.com/office/2019/extlst" xmlns:r="http://schemas.openxmlformats.org/officeDocument/2006/relationships" xmlns:m="http://schemas.openxmlformats.org/officeDocument/2006/math" xmlns:v="urn:schemas-microsoft-com:vml" xmlns:wp14="http://schemas.microsoft.com/office/word/2010/wordprocessingDrawing" xmlns:wp="http://schemas.openxmlformats.org/drawingml/2006/wordprocessingDrawing" xmlns:w10="urn:schemas-microsoft-com:office:word" xmlns:w="http://schemas.openxmlformats.org/wordprocessingml/2006/main" xmlns:w14="http://schemas.microsoft.com/office/word/2010/wordml" xmlns:w15="http://schemas.microsoft.com/office/word/2012/wordml" xmlns:w16cex="http://schemas.microsoft.com/office/word/2018/wordml/cex" xmlns:w16cid="http://schemas.microsoft.com/office/word/2016/wordml/cid" xmlns:w16="http://schemas.microsoft.com/office/word/2018/wordml" xmlns:w16du="http://schemas.microsoft.com/office/word/2023/wordml/word16du" xmlns:w16sdtdh="http://schemas.microsoft.com/office/word/2020/wordml/sdtdatahash" xmlns:w16se="http://schemas.microsoft.com/office/word/2015/wordml/symex" xmlns:wpg="http://schemas.microsoft.com/office/word/2010/wordprocessingGroup" xmlns:wpi="http://schemas.microsoft.com/office/word/2010/wordprocessingInk" xmlns:wne="http://schemas.microsoft.com/office/word/2006/wordml" xmlns:wps="http://schemas.microsoft.com/office/word/2010/wordprocessingShape" mc:Ignorable="w14 w15 w16se w16cid w16 w16cex w16sdtdh w16du wp14">
-  <w:abstractNum w:abstractNumId="0" w15:restartNumberingAfterBreak="0">
+<w:numbering xmlns:wpc="http://schemas.microsoft.com/office/word/2010/wordprocessingCanvas" xmlns:mc="http://schemas.openxmlformats.org/markup-compatibility/2006" xmlns:o="urn:schemas-microsoft-com:office:office" xmlns:r="http://schemas.openxmlformats.org/officeDocument/2006/relationships" xmlns:m="http://schemas.openxmlformats.org/officeDocument/2006/math" xmlns:v="urn:schemas-microsoft-com:vml" xmlns:wp14="http://schemas.microsoft.com/office/word/2010/wordprocessingDrawing" xmlns:wp="http://schemas.openxmlformats.org/drawingml/2006/wordprocessingDrawing" xmlns:w10="urn:schemas-microsoft-com:office:word" xmlns:w="http://schemas.openxmlformats.org/wordprocessingml/2006/main" xmlns:w14="http://schemas.microsoft.com/office/word/2010/wordml" xmlns:wpg="http://schemas.microsoft.com/office/word/2010/wordprocessingGroup" xmlns:wpi="http://schemas.microsoft.com/office/word/2010/wordprocessingInk" xmlns:wne="http://schemas.microsoft.com/office/word/2006/wordml" xmlns:wps="http://schemas.microsoft.com/office/word/2010/wordprocessingShape" mc:Ignorable="w14 wp14">
+  <w:abstractNum w:abstractNumId="0">
     <w:nsid w:val="002942AA"/>
     <w:multiLevelType w:val="hybridMultilevel"/>
     <w:tmpl w:val="83F0255C"/>
@@ -19589,7 +20000,7 @@
       </w:pPr>
     </w:lvl>
   </w:abstractNum>
-  <w:abstractNum w:abstractNumId="1" w15:restartNumberingAfterBreak="0">
+  <w:abstractNum w:abstractNumId="1">
     <w:nsid w:val="050A0021"/>
     <w:multiLevelType w:val="hybridMultilevel"/>
     <w:tmpl w:val="5C0A532E"/>
@@ -19675,7 +20086,7 @@
       </w:pPr>
     </w:lvl>
   </w:abstractNum>
-  <w:abstractNum w:abstractNumId="2" w15:restartNumberingAfterBreak="0">
+  <w:abstractNum w:abstractNumId="2">
     <w:nsid w:val="0D3E2F72"/>
     <w:multiLevelType w:val="hybridMultilevel"/>
     <w:tmpl w:val="D4985AD8"/>
@@ -19788,7 +20199,7 @@
       </w:rPr>
     </w:lvl>
   </w:abstractNum>
-  <w:abstractNum w:abstractNumId="3" w15:restartNumberingAfterBreak="0">
+  <w:abstractNum w:abstractNumId="3">
     <w:nsid w:val="13A548F6"/>
     <w:multiLevelType w:val="hybridMultilevel"/>
     <w:tmpl w:val="97EEF31C"/>
@@ -19874,7 +20285,7 @@
       </w:pPr>
     </w:lvl>
   </w:abstractNum>
-  <w:abstractNum w:abstractNumId="4" w15:restartNumberingAfterBreak="0">
+  <w:abstractNum w:abstractNumId="4">
     <w:nsid w:val="22E435A1"/>
     <w:multiLevelType w:val="hybridMultilevel"/>
     <w:tmpl w:val="83F0255C"/>
@@ -19960,7 +20371,7 @@
       </w:pPr>
     </w:lvl>
   </w:abstractNum>
-  <w:abstractNum w:abstractNumId="5" w15:restartNumberingAfterBreak="0">
+  <w:abstractNum w:abstractNumId="5">
     <w:nsid w:val="257C3D96"/>
     <w:multiLevelType w:val="multilevel"/>
     <w:tmpl w:val="EA96FCAC"/>
@@ -20109,7 +20520,7 @@
       </w:rPr>
     </w:lvl>
   </w:abstractNum>
-  <w:abstractNum w:abstractNumId="6" w15:restartNumberingAfterBreak="0">
+  <w:abstractNum w:abstractNumId="6">
     <w:nsid w:val="2B0D59BA"/>
     <w:multiLevelType w:val="hybridMultilevel"/>
     <w:tmpl w:val="4F6C47EE"/>
@@ -20198,7 +20609,7 @@
       </w:pPr>
     </w:lvl>
   </w:abstractNum>
-  <w:abstractNum w:abstractNumId="7" w15:restartNumberingAfterBreak="0">
+  <w:abstractNum w:abstractNumId="7">
     <w:nsid w:val="32FC31F8"/>
     <w:multiLevelType w:val="hybridMultilevel"/>
     <w:tmpl w:val="83F0255C"/>
@@ -20284,7 +20695,7 @@
       </w:pPr>
     </w:lvl>
   </w:abstractNum>
-  <w:abstractNum w:abstractNumId="8" w15:restartNumberingAfterBreak="0">
+  <w:abstractNum w:abstractNumId="8">
     <w:nsid w:val="3D9B18D7"/>
     <w:multiLevelType w:val="hybridMultilevel"/>
     <w:tmpl w:val="83F0255C"/>
@@ -20370,7 +20781,7 @@
       </w:pPr>
     </w:lvl>
   </w:abstractNum>
-  <w:abstractNum w:abstractNumId="9" w15:restartNumberingAfterBreak="0">
+  <w:abstractNum w:abstractNumId="9">
     <w:nsid w:val="3FE44EB8"/>
     <w:multiLevelType w:val="hybridMultilevel"/>
     <w:tmpl w:val="9BFA6D7A"/>
@@ -20483,7 +20894,7 @@
       </w:rPr>
     </w:lvl>
   </w:abstractNum>
-  <w:abstractNum w:abstractNumId="10" w15:restartNumberingAfterBreak="0">
+  <w:abstractNum w:abstractNumId="10">
     <w:nsid w:val="4432768E"/>
     <w:multiLevelType w:val="hybridMultilevel"/>
     <w:tmpl w:val="D43459DE"/>
@@ -20569,7 +20980,7 @@
       </w:pPr>
     </w:lvl>
   </w:abstractNum>
-  <w:abstractNum w:abstractNumId="11" w15:restartNumberingAfterBreak="0">
+  <w:abstractNum w:abstractNumId="11">
     <w:nsid w:val="47CC3126"/>
     <w:multiLevelType w:val="hybridMultilevel"/>
     <w:tmpl w:val="777C42F2"/>
@@ -20655,7 +21066,7 @@
       </w:pPr>
     </w:lvl>
   </w:abstractNum>
-  <w:abstractNum w:abstractNumId="12" w15:restartNumberingAfterBreak="0">
+  <w:abstractNum w:abstractNumId="12">
     <w:nsid w:val="4D0624D6"/>
     <w:multiLevelType w:val="multilevel"/>
     <w:tmpl w:val="D3783F7C"/>
@@ -20804,7 +21215,7 @@
       </w:rPr>
     </w:lvl>
   </w:abstractNum>
-  <w:abstractNum w:abstractNumId="13" w15:restartNumberingAfterBreak="0">
+  <w:abstractNum w:abstractNumId="13">
     <w:nsid w:val="5190363A"/>
     <w:multiLevelType w:val="hybridMultilevel"/>
     <w:tmpl w:val="520AC7A8"/>
@@ -20893,7 +21304,7 @@
       </w:pPr>
     </w:lvl>
   </w:abstractNum>
-  <w:abstractNum w:abstractNumId="14" w15:restartNumberingAfterBreak="0">
+  <w:abstractNum w:abstractNumId="14">
     <w:nsid w:val="56931A61"/>
     <w:multiLevelType w:val="hybridMultilevel"/>
     <w:tmpl w:val="83F0255C"/>
@@ -20979,7 +21390,7 @@
       </w:pPr>
     </w:lvl>
   </w:abstractNum>
-  <w:abstractNum w:abstractNumId="15" w15:restartNumberingAfterBreak="0">
+  <w:abstractNum w:abstractNumId="15">
     <w:nsid w:val="569E43CB"/>
     <w:multiLevelType w:val="multilevel"/>
     <w:tmpl w:val="F6E8E812"/>
@@ -21128,7 +21539,7 @@
       </w:rPr>
     </w:lvl>
   </w:abstractNum>
-  <w:abstractNum w:abstractNumId="16" w15:restartNumberingAfterBreak="0">
+  <w:abstractNum w:abstractNumId="16">
     <w:nsid w:val="60210B7D"/>
     <w:multiLevelType w:val="hybridMultilevel"/>
     <w:tmpl w:val="83F0255C"/>
@@ -21214,7 +21625,7 @@
       </w:pPr>
     </w:lvl>
   </w:abstractNum>
-  <w:abstractNum w:abstractNumId="17" w15:restartNumberingAfterBreak="0">
+  <w:abstractNum w:abstractNumId="17">
     <w:nsid w:val="62E245D1"/>
     <w:multiLevelType w:val="hybridMultilevel"/>
     <w:tmpl w:val="D7BCC384"/>
@@ -21303,7 +21714,7 @@
       </w:pPr>
     </w:lvl>
   </w:abstractNum>
-  <w:abstractNum w:abstractNumId="18" w15:restartNumberingAfterBreak="0">
+  <w:abstractNum w:abstractNumId="18">
     <w:nsid w:val="644F65D0"/>
     <w:multiLevelType w:val="hybridMultilevel"/>
     <w:tmpl w:val="83F0255C"/>
@@ -21389,7 +21800,7 @@
       </w:pPr>
     </w:lvl>
   </w:abstractNum>
-  <w:abstractNum w:abstractNumId="19" w15:restartNumberingAfterBreak="0">
+  <w:abstractNum w:abstractNumId="19">
     <w:nsid w:val="72592107"/>
     <w:multiLevelType w:val="hybridMultilevel"/>
     <w:tmpl w:val="11286B56"/>
@@ -21502,10 +21913,10 @@
       </w:rPr>
     </w:lvl>
   </w:abstractNum>
-  <w:abstractNum w:abstractNumId="20" w15:restartNumberingAfterBreak="0">
+  <w:abstractNum w:abstractNumId="20">
     <w:nsid w:val="748E3172"/>
     <w:multiLevelType w:val="multilevel"/>
-    <w:tmpl w:val="45BCD31C"/>
+    <w:tmpl w:val="A3EC36FA"/>
     <w:lvl w:ilvl="0">
       <w:start w:val="1"/>
       <w:numFmt w:val="bullet"/>
@@ -21538,23 +21949,19 @@
         <w:sz w:val="20"/>
       </w:rPr>
     </w:lvl>
-    <w:lvl w:ilvl="2" w:tentative="1">
+    <w:lvl w:ilvl="2">
       <w:start w:val="1"/>
-      <w:numFmt w:val="bullet"/>
-      <w:lvlText w:val=""/>
+      <w:numFmt w:val="decimal"/>
+      <w:lvlText w:val="%3)"/>
       <w:lvlJc w:val="left"/>
       <w:pPr>
-        <w:tabs>
-          <w:tab w:val="num" w:pos="2160"/>
-        </w:tabs>
         <w:ind w:left="2160" w:hanging="360"/>
       </w:pPr>
       <w:rPr>
-        <w:rFonts w:ascii="Wingdings" w:hAnsi="Wingdings" w:hint="default"/>
-        <w:sz w:val="20"/>
+        <w:rFonts w:hint="default"/>
       </w:rPr>
     </w:lvl>
-    <w:lvl w:ilvl="3" w:tentative="1">
+    <w:lvl w:ilvl="3">
       <w:start w:val="1"/>
       <w:numFmt w:val="bullet"/>
       <w:lvlText w:val=""/>
@@ -21651,7 +22058,7 @@
       </w:rPr>
     </w:lvl>
   </w:abstractNum>
-  <w:abstractNum w:abstractNumId="21" w15:restartNumberingAfterBreak="0">
+  <w:abstractNum w:abstractNumId="21">
     <w:nsid w:val="7C1175E4"/>
     <w:multiLevelType w:val="multilevel"/>
     <w:tmpl w:val="B6CE8E78"/>
@@ -21764,7 +22171,7 @@
       </w:rPr>
     </w:lvl>
   </w:abstractNum>
-  <w:abstractNum w:abstractNumId="22" w15:restartNumberingAfterBreak="0">
+  <w:abstractNum w:abstractNumId="22">
     <w:nsid w:val="7DF02EF7"/>
     <w:multiLevelType w:val="hybridMultilevel"/>
     <w:tmpl w:val="5964D96A"/>
@@ -21853,7 +22260,7 @@
       </w:pPr>
     </w:lvl>
   </w:abstractNum>
-  <w:abstractNum w:abstractNumId="23" w15:restartNumberingAfterBreak="0">
+  <w:abstractNum w:abstractNumId="23">
     <w:nsid w:val="7F715C9C"/>
     <w:multiLevelType w:val="hybridMultilevel"/>
     <w:tmpl w:val="1AD0F918"/>
@@ -21939,83 +22346,83 @@
       </w:pPr>
     </w:lvl>
   </w:abstractNum>
-  <w:num w:numId="1" w16cid:durableId="726105833">
+  <w:num w:numId="1">
     <w:abstractNumId w:val="19"/>
   </w:num>
-  <w:num w:numId="2" w16cid:durableId="164631792">
+  <w:num w:numId="2">
     <w:abstractNumId w:val="17"/>
   </w:num>
-  <w:num w:numId="3" w16cid:durableId="1398360940">
+  <w:num w:numId="3">
     <w:abstractNumId w:val="22"/>
   </w:num>
-  <w:num w:numId="4" w16cid:durableId="31002741">
+  <w:num w:numId="4">
     <w:abstractNumId w:val="9"/>
   </w:num>
-  <w:num w:numId="5" w16cid:durableId="299767576">
+  <w:num w:numId="5">
     <w:abstractNumId w:val="13"/>
   </w:num>
-  <w:num w:numId="6" w16cid:durableId="78019515">
+  <w:num w:numId="6">
     <w:abstractNumId w:val="21"/>
   </w:num>
-  <w:num w:numId="7" w16cid:durableId="822430550">
+  <w:num w:numId="7">
     <w:abstractNumId w:val="2"/>
   </w:num>
-  <w:num w:numId="8" w16cid:durableId="613830234">
+  <w:num w:numId="8">
     <w:abstractNumId w:val="6"/>
   </w:num>
-  <w:num w:numId="9" w16cid:durableId="2035879944">
+  <w:num w:numId="9">
     <w:abstractNumId w:val="15"/>
   </w:num>
-  <w:num w:numId="10" w16cid:durableId="460347060">
+  <w:num w:numId="10">
     <w:abstractNumId w:val="12"/>
   </w:num>
-  <w:num w:numId="11" w16cid:durableId="974678597">
+  <w:num w:numId="11">
     <w:abstractNumId w:val="20"/>
   </w:num>
-  <w:num w:numId="12" w16cid:durableId="1299532726">
+  <w:num w:numId="12">
     <w:abstractNumId w:val="11"/>
   </w:num>
-  <w:num w:numId="13" w16cid:durableId="2089576056">
+  <w:num w:numId="13">
     <w:abstractNumId w:val="7"/>
   </w:num>
-  <w:num w:numId="14" w16cid:durableId="996811449">
+  <w:num w:numId="14">
     <w:abstractNumId w:val="10"/>
   </w:num>
-  <w:num w:numId="15" w16cid:durableId="1307659370">
+  <w:num w:numId="15">
     <w:abstractNumId w:val="23"/>
   </w:num>
-  <w:num w:numId="16" w16cid:durableId="129515834">
+  <w:num w:numId="16">
     <w:abstractNumId w:val="8"/>
   </w:num>
-  <w:num w:numId="17" w16cid:durableId="379407027">
+  <w:num w:numId="17">
     <w:abstractNumId w:val="16"/>
   </w:num>
-  <w:num w:numId="18" w16cid:durableId="1971551207">
+  <w:num w:numId="18">
     <w:abstractNumId w:val="14"/>
   </w:num>
-  <w:num w:numId="19" w16cid:durableId="833490541">
+  <w:num w:numId="19">
     <w:abstractNumId w:val="4"/>
   </w:num>
-  <w:num w:numId="20" w16cid:durableId="1770807754">
+  <w:num w:numId="20">
     <w:abstractNumId w:val="0"/>
   </w:num>
-  <w:num w:numId="21" w16cid:durableId="1669214799">
+  <w:num w:numId="21">
     <w:abstractNumId w:val="3"/>
   </w:num>
-  <w:num w:numId="22" w16cid:durableId="669794961">
+  <w:num w:numId="22">
     <w:abstractNumId w:val="18"/>
   </w:num>
-  <w:num w:numId="23" w16cid:durableId="483205302">
+  <w:num w:numId="23">
     <w:abstractNumId w:val="1"/>
   </w:num>
-  <w:num w:numId="24" w16cid:durableId="1872641843">
+  <w:num w:numId="24">
     <w:abstractNumId w:val="5"/>
   </w:num>
 </w:numbering>
 </file>
 
 <file path=word/styles.xml><?xml version="1.0" encoding="utf-8"?>
-<w:styles xmlns:mc="http://schemas.openxmlformats.org/markup-compatibility/2006" xmlns:r="http://schemas.openxmlformats.org/officeDocument/2006/relationships" xmlns:w="http://schemas.openxmlformats.org/wordprocessingml/2006/main" xmlns:w14="http://schemas.microsoft.com/office/word/2010/wordml" xmlns:w15="http://schemas.microsoft.com/office/word/2012/wordml" xmlns:w16cex="http://schemas.microsoft.com/office/word/2018/wordml/cex" xmlns:w16cid="http://schemas.microsoft.com/office/word/2016/wordml/cid" xmlns:w16="http://schemas.microsoft.com/office/word/2018/wordml" xmlns:w16du="http://schemas.microsoft.com/office/word/2023/wordml/word16du" xmlns:w16sdtdh="http://schemas.microsoft.com/office/word/2020/wordml/sdtdatahash" xmlns:w16se="http://schemas.microsoft.com/office/word/2015/wordml/symex" mc:Ignorable="w14 w15 w16se w16cid w16 w16cex w16sdtdh w16du">
+<w:styles xmlns:mc="http://schemas.openxmlformats.org/markup-compatibility/2006" xmlns:r="http://schemas.openxmlformats.org/officeDocument/2006/relationships" xmlns:w="http://schemas.openxmlformats.org/wordprocessingml/2006/main" xmlns:w14="http://schemas.microsoft.com/office/word/2010/wordml" mc:Ignorable="w14">
   <w:docDefaults>
     <w:rPrDefault>
       <w:rPr>
@@ -22031,383 +22438,587 @@
       </w:pPr>
     </w:pPrDefault>
   </w:docDefaults>
-  <w:latentStyles w:defLockedState="0" w:defUIPriority="99" w:defSemiHidden="0" w:defUnhideWhenUsed="0" w:defQFormat="0" w:count="376">
-    <w:lsdException w:name="Normal" w:uiPriority="0" w:qFormat="1"/>
-    <w:lsdException w:name="heading 1" w:uiPriority="9" w:qFormat="1"/>
-    <w:lsdException w:name="heading 2" w:semiHidden="1" w:uiPriority="9" w:unhideWhenUsed="1" w:qFormat="1"/>
-    <w:lsdException w:name="heading 3" w:semiHidden="1" w:uiPriority="9" w:unhideWhenUsed="1" w:qFormat="1"/>
-    <w:lsdException w:name="heading 4" w:semiHidden="1" w:uiPriority="9" w:unhideWhenUsed="1" w:qFormat="1"/>
-    <w:lsdException w:name="heading 5" w:semiHidden="1" w:uiPriority="9" w:unhideWhenUsed="1" w:qFormat="1"/>
-    <w:lsdException w:name="heading 6" w:semiHidden="1" w:uiPriority="9" w:unhideWhenUsed="1" w:qFormat="1"/>
-    <w:lsdException w:name="heading 7" w:semiHidden="1" w:uiPriority="9" w:unhideWhenUsed="1" w:qFormat="1"/>
-    <w:lsdException w:name="heading 8" w:semiHidden="1" w:uiPriority="9" w:unhideWhenUsed="1" w:qFormat="1"/>
-    <w:lsdException w:name="heading 9" w:semiHidden="1" w:uiPriority="9" w:unhideWhenUsed="1" w:qFormat="1"/>
-    <w:lsdException w:name="index 1" w:semiHidden="1" w:unhideWhenUsed="1"/>
-    <w:lsdException w:name="index 2" w:semiHidden="1" w:unhideWhenUsed="1"/>
-    <w:lsdException w:name="index 3" w:semiHidden="1" w:unhideWhenUsed="1"/>
-    <w:lsdException w:name="index 4" w:semiHidden="1" w:unhideWhenUsed="1"/>
-    <w:lsdException w:name="index 5" w:semiHidden="1" w:unhideWhenUsed="1"/>
-    <w:lsdException w:name="index 6" w:semiHidden="1" w:unhideWhenUsed="1"/>
-    <w:lsdException w:name="index 7" w:semiHidden="1" w:unhideWhenUsed="1"/>
-    <w:lsdException w:name="index 8" w:semiHidden="1" w:unhideWhenUsed="1"/>
-    <w:lsdException w:name="index 9" w:semiHidden="1" w:unhideWhenUsed="1"/>
-    <w:lsdException w:name="toc 1" w:semiHidden="1" w:uiPriority="39" w:unhideWhenUsed="1"/>
-    <w:lsdException w:name="toc 2" w:semiHidden="1" w:uiPriority="39" w:unhideWhenUsed="1"/>
-    <w:lsdException w:name="toc 3" w:semiHidden="1" w:uiPriority="39" w:unhideWhenUsed="1"/>
-    <w:lsdException w:name="toc 4" w:semiHidden="1" w:uiPriority="39" w:unhideWhenUsed="1"/>
-    <w:lsdException w:name="toc 5" w:semiHidden="1" w:uiPriority="39" w:unhideWhenUsed="1"/>
-    <w:lsdException w:name="toc 6" w:semiHidden="1" w:uiPriority="39" w:unhideWhenUsed="1"/>
-    <w:lsdException w:name="toc 7" w:semiHidden="1" w:uiPriority="39" w:unhideWhenUsed="1"/>
-    <w:lsdException w:name="toc 8" w:semiHidden="1" w:uiPriority="39" w:unhideWhenUsed="1"/>
-    <w:lsdException w:name="toc 9" w:semiHidden="1" w:uiPriority="39" w:unhideWhenUsed="1"/>
-    <w:lsdException w:name="Normal Indent" w:semiHidden="1" w:unhideWhenUsed="1"/>
-    <w:lsdException w:name="footnote text" w:semiHidden="1" w:unhideWhenUsed="1"/>
-    <w:lsdException w:name="annotation text" w:semiHidden="1" w:unhideWhenUsed="1"/>
-    <w:lsdException w:name="header" w:semiHidden="1" w:unhideWhenUsed="1"/>
-    <w:lsdException w:name="footer" w:semiHidden="1" w:unhideWhenUsed="1"/>
-    <w:lsdException w:name="index heading" w:semiHidden="1" w:unhideWhenUsed="1"/>
-    <w:lsdException w:name="caption" w:semiHidden="1" w:uiPriority="35" w:unhideWhenUsed="1" w:qFormat="1"/>
-    <w:lsdException w:name="table of figures" w:semiHidden="1" w:unhideWhenUsed="1"/>
-    <w:lsdException w:name="envelope address" w:semiHidden="1" w:unhideWhenUsed="1"/>
-    <w:lsdException w:name="envelope return" w:semiHidden="1" w:unhideWhenUsed="1"/>
-    <w:lsdException w:name="footnote reference" w:semiHidden="1" w:unhideWhenUsed="1"/>
-    <w:lsdException w:name="annotation reference" w:semiHidden="1" w:unhideWhenUsed="1"/>
-    <w:lsdException w:name="line number" w:semiHidden="1" w:unhideWhenUsed="1"/>
-    <w:lsdException w:name="page number" w:semiHidden="1" w:unhideWhenUsed="1"/>
-    <w:lsdException w:name="endnote reference" w:semiHidden="1" w:unhideWhenUsed="1"/>
-    <w:lsdException w:name="endnote text" w:semiHidden="1" w:unhideWhenUsed="1"/>
-    <w:lsdException w:name="table of authorities" w:semiHidden="1" w:unhideWhenUsed="1"/>
-    <w:lsdException w:name="macro" w:semiHidden="1" w:unhideWhenUsed="1"/>
-    <w:lsdException w:name="toa heading" w:semiHidden="1" w:unhideWhenUsed="1"/>
-    <w:lsdException w:name="List" w:semiHidden="1" w:unhideWhenUsed="1"/>
-    <w:lsdException w:name="List Bullet" w:semiHidden="1" w:unhideWhenUsed="1"/>
-    <w:lsdException w:name="List Number" w:semiHidden="1" w:unhideWhenUsed="1"/>
-    <w:lsdException w:name="List 2" w:semiHidden="1" w:unhideWhenUsed="1"/>
-    <w:lsdException w:name="List 3" w:semiHidden="1" w:unhideWhenUsed="1"/>
-    <w:lsdException w:name="List 4" w:semiHidden="1" w:unhideWhenUsed="1"/>
-    <w:lsdException w:name="List 5" w:semiHidden="1" w:unhideWhenUsed="1"/>
-    <w:lsdException w:name="List Bullet 2" w:semiHidden="1" w:unhideWhenUsed="1"/>
-    <w:lsdException w:name="List Bullet 3" w:semiHidden="1" w:unhideWhenUsed="1"/>
-    <w:lsdException w:name="List Bullet 4" w:semiHidden="1" w:unhideWhenUsed="1"/>
-    <w:lsdException w:name="List Bullet 5" w:semiHidden="1" w:unhideWhenUsed="1"/>
-    <w:lsdException w:name="List Number 2" w:semiHidden="1" w:unhideWhenUsed="1"/>
-    <w:lsdException w:name="List Number 3" w:semiHidden="1" w:unhideWhenUsed="1"/>
-    <w:lsdException w:name="List Number 4" w:semiHidden="1" w:unhideWhenUsed="1"/>
-    <w:lsdException w:name="List Number 5" w:semiHidden="1" w:unhideWhenUsed="1"/>
-    <w:lsdException w:name="Title" w:uiPriority="10" w:qFormat="1"/>
-    <w:lsdException w:name="Closing" w:semiHidden="1" w:unhideWhenUsed="1"/>
-    <w:lsdException w:name="Signature" w:semiHidden="1" w:unhideWhenUsed="1"/>
-    <w:lsdException w:name="Default Paragraph Font" w:semiHidden="1" w:uiPriority="1" w:unhideWhenUsed="1"/>
-    <w:lsdException w:name="Body Text" w:semiHidden="1" w:uiPriority="1" w:unhideWhenUsed="1" w:qFormat="1"/>
-    <w:lsdException w:name="Body Text Indent" w:semiHidden="1" w:unhideWhenUsed="1"/>
-    <w:lsdException w:name="List Continue" w:semiHidden="1" w:unhideWhenUsed="1"/>
-    <w:lsdException w:name="List Continue 2" w:semiHidden="1" w:unhideWhenUsed="1"/>
-    <w:lsdException w:name="List Continue 3" w:semiHidden="1" w:unhideWhenUsed="1"/>
-    <w:lsdException w:name="List Continue 4" w:semiHidden="1" w:unhideWhenUsed="1"/>
-    <w:lsdException w:name="List Continue 5" w:semiHidden="1" w:unhideWhenUsed="1"/>
-    <w:lsdException w:name="Message Header" w:semiHidden="1" w:unhideWhenUsed="1"/>
-    <w:lsdException w:name="Subtitle" w:uiPriority="11" w:qFormat="1"/>
-    <w:lsdException w:name="Salutation" w:semiHidden="1" w:unhideWhenUsed="1"/>
-    <w:lsdException w:name="Date" w:semiHidden="1" w:unhideWhenUsed="1"/>
-    <w:lsdException w:name="Body Text First Indent" w:semiHidden="1" w:unhideWhenUsed="1"/>
-    <w:lsdException w:name="Body Text First Indent 2" w:semiHidden="1" w:unhideWhenUsed="1"/>
-    <w:lsdException w:name="Note Heading" w:semiHidden="1" w:unhideWhenUsed="1"/>
-    <w:lsdException w:name="Body Text 2" w:semiHidden="1" w:unhideWhenUsed="1"/>
-    <w:lsdException w:name="Body Text 3" w:semiHidden="1" w:unhideWhenUsed="1"/>
-    <w:lsdException w:name="Body Text Indent 2" w:semiHidden="1" w:unhideWhenUsed="1"/>
-    <w:lsdException w:name="Body Text Indent 3" w:semiHidden="1" w:unhideWhenUsed="1"/>
-    <w:lsdException w:name="Block Text" w:semiHidden="1" w:unhideWhenUsed="1"/>
-    <w:lsdException w:name="Hyperlink" w:semiHidden="1" w:unhideWhenUsed="1"/>
-    <w:lsdException w:name="FollowedHyperlink" w:semiHidden="1" w:unhideWhenUsed="1"/>
-    <w:lsdException w:name="Strong" w:uiPriority="22" w:qFormat="1"/>
-    <w:lsdException w:name="Emphasis" w:uiPriority="20" w:qFormat="1"/>
-    <w:lsdException w:name="Document Map" w:semiHidden="1" w:unhideWhenUsed="1"/>
-    <w:lsdException w:name="Plain Text" w:semiHidden="1" w:unhideWhenUsed="1"/>
-    <w:lsdException w:name="E-mail Signature" w:semiHidden="1" w:unhideWhenUsed="1"/>
-    <w:lsdException w:name="HTML Top of Form" w:semiHidden="1" w:unhideWhenUsed="1"/>
-    <w:lsdException w:name="HTML Bottom of Form" w:semiHidden="1" w:unhideWhenUsed="1"/>
-    <w:lsdException w:name="Normal (Web)" w:semiHidden="1" w:unhideWhenUsed="1"/>
-    <w:lsdException w:name="HTML Acronym" w:semiHidden="1" w:unhideWhenUsed="1"/>
-    <w:lsdException w:name="HTML Address" w:semiHidden="1" w:unhideWhenUsed="1"/>
-    <w:lsdException w:name="HTML Cite" w:semiHidden="1" w:unhideWhenUsed="1"/>
-    <w:lsdException w:name="HTML Code" w:semiHidden="1" w:unhideWhenUsed="1"/>
-    <w:lsdException w:name="HTML Definition" w:semiHidden="1" w:unhideWhenUsed="1"/>
-    <w:lsdException w:name="HTML Keyboard" w:semiHidden="1" w:unhideWhenUsed="1"/>
-    <w:lsdException w:name="HTML Preformatted" w:semiHidden="1" w:unhideWhenUsed="1"/>
-    <w:lsdException w:name="HTML Sample" w:semiHidden="1" w:unhideWhenUsed="1"/>
-    <w:lsdException w:name="HTML Typewriter" w:semiHidden="1" w:unhideWhenUsed="1"/>
-    <w:lsdException w:name="HTML Variable" w:semiHidden="1" w:unhideWhenUsed="1"/>
-    <w:lsdException w:name="Normal Table" w:semiHidden="1" w:unhideWhenUsed="1"/>
-    <w:lsdException w:name="annotation subject" w:semiHidden="1" w:unhideWhenUsed="1"/>
-    <w:lsdException w:name="No List" w:semiHidden="1" w:unhideWhenUsed="1"/>
-    <w:lsdException w:name="Outline List 1" w:semiHidden="1" w:unhideWhenUsed="1"/>
-    <w:lsdException w:name="Outline List 2" w:semiHidden="1" w:unhideWhenUsed="1"/>
-    <w:lsdException w:name="Outline List 3" w:semiHidden="1" w:unhideWhenUsed="1"/>
-    <w:lsdException w:name="Table Simple 1" w:semiHidden="1" w:unhideWhenUsed="1"/>
-    <w:lsdException w:name="Table Simple 2" w:semiHidden="1" w:unhideWhenUsed="1"/>
-    <w:lsdException w:name="Table Simple 3" w:semiHidden="1" w:unhideWhenUsed="1"/>
-    <w:lsdException w:name="Table Classic 1" w:semiHidden="1" w:unhideWhenUsed="1"/>
-    <w:lsdException w:name="Table Classic 2" w:semiHidden="1" w:unhideWhenUsed="1"/>
-    <w:lsdException w:name="Table Classic 3" w:semiHidden="1" w:unhideWhenUsed="1"/>
-    <w:lsdException w:name="Table Classic 4" w:semiHidden="1" w:unhideWhenUsed="1"/>
-    <w:lsdException w:name="Table Colorful 1" w:semiHidden="1" w:unhideWhenUsed="1"/>
-    <w:lsdException w:name="Table Colorful 2" w:semiHidden="1" w:unhideWhenUsed="1"/>
-    <w:lsdException w:name="Table Colorful 3" w:semiHidden="1" w:unhideWhenUsed="1"/>
-    <w:lsdException w:name="Table Columns 1" w:semiHidden="1" w:unhideWhenUsed="1"/>
-    <w:lsdException w:name="Table Columns 2" w:semiHidden="1" w:unhideWhenUsed="1"/>
-    <w:lsdException w:name="Table Columns 3" w:semiHidden="1" w:unhideWhenUsed="1"/>
-    <w:lsdException w:name="Table Columns 4" w:semiHidden="1" w:unhideWhenUsed="1"/>
-    <w:lsdException w:name="Table Columns 5" w:semiHidden="1" w:unhideWhenUsed="1"/>
-    <w:lsdException w:name="Table Grid 1" w:semiHidden="1" w:unhideWhenUsed="1"/>
-    <w:lsdException w:name="Table Grid 2" w:semiHidden="1" w:unhideWhenUsed="1"/>
-    <w:lsdException w:name="Table Grid 3" w:semiHidden="1" w:unhideWhenUsed="1"/>
-    <w:lsdException w:name="Table Grid 4" w:semiHidden="1" w:unhideWhenUsed="1"/>
-    <w:lsdException w:name="Table Grid 5" w:semiHidden="1" w:unhideWhenUsed="1"/>
-    <w:lsdException w:name="Table Grid 6" w:semiHidden="1" w:unhideWhenUsed="1"/>
-    <w:lsdException w:name="Table Grid 7" w:semiHidden="1" w:unhideWhenUsed="1"/>
-    <w:lsdException w:name="Table Grid 8" w:semiHidden="1" w:unhideWhenUsed="1"/>
-    <w:lsdException w:name="Table List 1" w:semiHidden="1" w:unhideWhenUsed="1"/>
-    <w:lsdException w:name="Table List 2" w:semiHidden="1" w:unhideWhenUsed="1"/>
-    <w:lsdException w:name="Table List 3" w:semiHidden="1" w:unhideWhenUsed="1"/>
-    <w:lsdException w:name="Table List 4" w:semiHidden="1" w:unhideWhenUsed="1"/>
-    <w:lsdException w:name="Table List 5" w:semiHidden="1" w:unhideWhenUsed="1"/>
-    <w:lsdException w:name="Table List 6" w:semiHidden="1" w:unhideWhenUsed="1"/>
-    <w:lsdException w:name="Table List 7" w:semiHidden="1" w:unhideWhenUsed="1"/>
-    <w:lsdException w:name="Table List 8" w:semiHidden="1" w:unhideWhenUsed="1"/>
-    <w:lsdException w:name="Table 3D effects 1" w:semiHidden="1" w:unhideWhenUsed="1"/>
-    <w:lsdException w:name="Table 3D effects 2" w:semiHidden="1" w:unhideWhenUsed="1"/>
-    <w:lsdException w:name="Table 3D effects 3" w:semiHidden="1" w:unhideWhenUsed="1"/>
-    <w:lsdException w:name="Table Contemporary" w:semiHidden="1" w:unhideWhenUsed="1"/>
-    <w:lsdException w:name="Table Elegant" w:semiHidden="1" w:unhideWhenUsed="1"/>
-    <w:lsdException w:name="Table Professional" w:semiHidden="1" w:unhideWhenUsed="1"/>
-    <w:lsdException w:name="Table Subtle 1" w:semiHidden="1" w:unhideWhenUsed="1"/>
-    <w:lsdException w:name="Table Subtle 2" w:semiHidden="1" w:unhideWhenUsed="1"/>
-    <w:lsdException w:name="Table Web 1" w:semiHidden="1" w:unhideWhenUsed="1"/>
-    <w:lsdException w:name="Table Web 2" w:semiHidden="1" w:unhideWhenUsed="1"/>
-    <w:lsdException w:name="Table Web 3" w:semiHidden="1" w:unhideWhenUsed="1"/>
-    <w:lsdException w:name="Balloon Text" w:semiHidden="1" w:unhideWhenUsed="1"/>
-    <w:lsdException w:name="Table Grid" w:uiPriority="59"/>
-    <w:lsdException w:name="Table Theme" w:semiHidden="1" w:unhideWhenUsed="1"/>
-    <w:lsdException w:name="Placeholder Text" w:semiHidden="1"/>
-    <w:lsdException w:name="No Spacing" w:uiPriority="1" w:qFormat="1"/>
-    <w:lsdException w:name="Light Shading" w:uiPriority="60"/>
-    <w:lsdException w:name="Light List" w:uiPriority="61"/>
-    <w:lsdException w:name="Light Grid" w:uiPriority="62"/>
-    <w:lsdException w:name="Medium Shading 1" w:uiPriority="63"/>
-    <w:lsdException w:name="Medium Shading 2" w:uiPriority="64"/>
-    <w:lsdException w:name="Medium List 1" w:uiPriority="65"/>
-    <w:lsdException w:name="Medium List 2" w:uiPriority="66"/>
-    <w:lsdException w:name="Medium Grid 1" w:uiPriority="67"/>
-    <w:lsdException w:name="Medium Grid 2" w:uiPriority="68"/>
-    <w:lsdException w:name="Medium Grid 3" w:uiPriority="69"/>
-    <w:lsdException w:name="Dark List" w:uiPriority="70"/>
-    <w:lsdException w:name="Colorful Shading" w:uiPriority="71"/>
-    <w:lsdException w:name="Colorful List" w:uiPriority="72"/>
-    <w:lsdException w:name="Colorful Grid" w:uiPriority="73"/>
-    <w:lsdException w:name="Light Shading Accent 1" w:uiPriority="60"/>
-    <w:lsdException w:name="Light List Accent 1" w:uiPriority="61"/>
-    <w:lsdException w:name="Light Grid Accent 1" w:uiPriority="62"/>
-    <w:lsdException w:name="Medium Shading 1 Accent 1" w:uiPriority="63"/>
-    <w:lsdException w:name="Medium Shading 2 Accent 1" w:uiPriority="64"/>
-    <w:lsdException w:name="Medium List 1 Accent 1" w:uiPriority="65"/>
-    <w:lsdException w:name="Revision" w:semiHidden="1"/>
-    <w:lsdException w:name="List Paragraph" w:uiPriority="34" w:qFormat="1"/>
-    <w:lsdException w:name="Quote" w:uiPriority="29" w:qFormat="1"/>
-    <w:lsdException w:name="Intense Quote" w:uiPriority="30" w:qFormat="1"/>
-    <w:lsdException w:name="Medium List 2 Accent 1" w:uiPriority="66"/>
-    <w:lsdException w:name="Medium Grid 1 Accent 1" w:uiPriority="67"/>
-    <w:lsdException w:name="Medium Grid 2 Accent 1" w:uiPriority="68"/>
-    <w:lsdException w:name="Medium Grid 3 Accent 1" w:uiPriority="69"/>
-    <w:lsdException w:name="Dark List Accent 1" w:uiPriority="70"/>
-    <w:lsdException w:name="Colorful Shading Accent 1" w:uiPriority="71"/>
-    <w:lsdException w:name="Colorful List Accent 1" w:uiPriority="72"/>
-    <w:lsdException w:name="Colorful Grid Accent 1" w:uiPriority="73"/>
-    <w:lsdException w:name="Light Shading Accent 2" w:uiPriority="60"/>
-    <w:lsdException w:name="Light List Accent 2" w:uiPriority="61"/>
-    <w:lsdException w:name="Light Grid Accent 2" w:uiPriority="62"/>
-    <w:lsdException w:name="Medium Shading 1 Accent 2" w:uiPriority="63"/>
-    <w:lsdException w:name="Medium Shading 2 Accent 2" w:uiPriority="64"/>
-    <w:lsdException w:name="Medium List 1 Accent 2" w:uiPriority="65"/>
-    <w:lsdException w:name="Medium List 2 Accent 2" w:uiPriority="66"/>
-    <w:lsdException w:name="Medium Grid 1 Accent 2" w:uiPriority="67"/>
-    <w:lsdException w:name="Medium Grid 2 Accent 2" w:uiPriority="68"/>
-    <w:lsdException w:name="Medium Grid 3 Accent 2" w:uiPriority="69"/>
-    <w:lsdException w:name="Dark List Accent 2" w:uiPriority="70"/>
-    <w:lsdException w:name="Colorful Shading Accent 2" w:uiPriority="71"/>
-    <w:lsdException w:name="Colorful List Accent 2" w:uiPriority="72"/>
-    <w:lsdException w:name="Colorful Grid Accent 2" w:uiPriority="73"/>
-    <w:lsdException w:name="Light Shading Accent 3" w:uiPriority="60"/>
-    <w:lsdException w:name="Light List Accent 3" w:uiPriority="61"/>
-    <w:lsdException w:name="Light Grid Accent 3" w:uiPriority="62"/>
-    <w:lsdException w:name="Medium Shading 1 Accent 3" w:uiPriority="63"/>
-    <w:lsdException w:name="Medium Shading 2 Accent 3" w:uiPriority="64"/>
-    <w:lsdException w:name="Medium List 1 Accent 3" w:uiPriority="65"/>
-    <w:lsdException w:name="Medium List 2 Accent 3" w:uiPriority="66"/>
-    <w:lsdException w:name="Medium Grid 1 Accent 3" w:uiPriority="67"/>
-    <w:lsdException w:name="Medium Grid 2 Accent 3" w:uiPriority="68"/>
-    <w:lsdException w:name="Medium Grid 3 Accent 3" w:uiPriority="69"/>
-    <w:lsdException w:name="Dark List Accent 3" w:uiPriority="70"/>
-    <w:lsdException w:name="Colorful Shading Accent 3" w:uiPriority="71"/>
-    <w:lsdException w:name="Colorful List Accent 3" w:uiPriority="72"/>
-    <w:lsdException w:name="Colorful Grid Accent 3" w:uiPriority="73"/>
-    <w:lsdException w:name="Light Shading Accent 4" w:uiPriority="60"/>
-    <w:lsdException w:name="Light List Accent 4" w:uiPriority="61"/>
-    <w:lsdException w:name="Light Grid Accent 4" w:uiPriority="62"/>
-    <w:lsdException w:name="Medium Shading 1 Accent 4" w:uiPriority="63"/>
-    <w:lsdException w:name="Medium Shading 2 Accent 4" w:uiPriority="64"/>
-    <w:lsdException w:name="Medium List 1 Accent 4" w:uiPriority="65"/>
-    <w:lsdException w:name="Medium List 2 Accent 4" w:uiPriority="66"/>
-    <w:lsdException w:name="Medium Grid 1 Accent 4" w:uiPriority="67"/>
-    <w:lsdException w:name="Medium Grid 2 Accent 4" w:uiPriority="68"/>
-    <w:lsdException w:name="Medium Grid 3 Accent 4" w:uiPriority="69"/>
-    <w:lsdException w:name="Dark List Accent 4" w:uiPriority="70"/>
-    <w:lsdException w:name="Colorful Shading Accent 4" w:uiPriority="71"/>
-    <w:lsdException w:name="Colorful List Accent 4" w:uiPriority="72"/>
-    <w:lsdException w:name="Colorful Grid Accent 4" w:uiPriority="73"/>
-    <w:lsdException w:name="Light Shading Accent 5" w:uiPriority="60"/>
-    <w:lsdException w:name="Light List Accent 5" w:uiPriority="61"/>
-    <w:lsdException w:name="Light Grid Accent 5" w:uiPriority="62"/>
-    <w:lsdException w:name="Medium Shading 1 Accent 5" w:uiPriority="63"/>
-    <w:lsdException w:name="Medium Shading 2 Accent 5" w:uiPriority="64"/>
-    <w:lsdException w:name="Medium List 1 Accent 5" w:uiPriority="65"/>
-    <w:lsdException w:name="Medium List 2 Accent 5" w:uiPriority="66"/>
-    <w:lsdException w:name="Medium Grid 1 Accent 5" w:uiPriority="67"/>
-    <w:lsdException w:name="Medium Grid 2 Accent 5" w:uiPriority="68"/>
-    <w:lsdException w:name="Medium Grid 3 Accent 5" w:uiPriority="69"/>
-    <w:lsdException w:name="Dark List Accent 5" w:uiPriority="70"/>
-    <w:lsdException w:name="Colorful Shading Accent 5" w:uiPriority="71"/>
-    <w:lsdException w:name="Colorful List Accent 5" w:uiPriority="72"/>
-    <w:lsdException w:name="Colorful Grid Accent 5" w:uiPriority="73"/>
-    <w:lsdException w:name="Light Shading Accent 6" w:uiPriority="60"/>
-    <w:lsdException w:name="Light List Accent 6" w:uiPriority="61"/>
-    <w:lsdException w:name="Light Grid Accent 6" w:uiPriority="62"/>
-    <w:lsdException w:name="Medium Shading 1 Accent 6" w:uiPriority="63"/>
-    <w:lsdException w:name="Medium Shading 2 Accent 6" w:uiPriority="64"/>
-    <w:lsdException w:name="Medium List 1 Accent 6" w:uiPriority="65"/>
-    <w:lsdException w:name="Medium List 2 Accent 6" w:uiPriority="66"/>
-    <w:lsdException w:name="Medium Grid 1 Accent 6" w:uiPriority="67"/>
-    <w:lsdException w:name="Medium Grid 2 Accent 6" w:uiPriority="68"/>
-    <w:lsdException w:name="Medium Grid 3 Accent 6" w:uiPriority="69"/>
-    <w:lsdException w:name="Dark List Accent 6" w:uiPriority="70"/>
-    <w:lsdException w:name="Colorful Shading Accent 6" w:uiPriority="71"/>
-    <w:lsdException w:name="Colorful List Accent 6" w:uiPriority="72"/>
-    <w:lsdException w:name="Colorful Grid Accent 6" w:uiPriority="73"/>
-    <w:lsdException w:name="Subtle Emphasis" w:uiPriority="19" w:qFormat="1"/>
-    <w:lsdException w:name="Intense Emphasis" w:uiPriority="21" w:qFormat="1"/>
-    <w:lsdException w:name="Subtle Reference" w:uiPriority="31" w:qFormat="1"/>
-    <w:lsdException w:name="Intense Reference" w:uiPriority="32" w:qFormat="1"/>
-    <w:lsdException w:name="Book Title" w:uiPriority="33" w:qFormat="1"/>
-    <w:lsdException w:name="Bibliography" w:semiHidden="1" w:uiPriority="37" w:unhideWhenUsed="1"/>
-    <w:lsdException w:name="TOC Heading" w:semiHidden="1" w:uiPriority="39" w:unhideWhenUsed="1" w:qFormat="1"/>
-    <w:lsdException w:name="Plain Table 1" w:uiPriority="41"/>
-    <w:lsdException w:name="Plain Table 2" w:uiPriority="42"/>
-    <w:lsdException w:name="Plain Table 3" w:uiPriority="43"/>
-    <w:lsdException w:name="Plain Table 4" w:uiPriority="44"/>
-    <w:lsdException w:name="Plain Table 5" w:uiPriority="45"/>
-    <w:lsdException w:name="Grid Table Light" w:uiPriority="40"/>
-    <w:lsdException w:name="Grid Table 1 Light" w:uiPriority="46"/>
-    <w:lsdException w:name="Grid Table 2" w:uiPriority="47"/>
-    <w:lsdException w:name="Grid Table 3" w:uiPriority="48"/>
-    <w:lsdException w:name="Grid Table 4" w:uiPriority="49"/>
-    <w:lsdException w:name="Grid Table 5 Dark" w:uiPriority="50"/>
-    <w:lsdException w:name="Grid Table 6 Colorful" w:uiPriority="51"/>
-    <w:lsdException w:name="Grid Table 7 Colorful" w:uiPriority="52"/>
-    <w:lsdException w:name="Grid Table 1 Light Accent 1" w:uiPriority="46"/>
-    <w:lsdException w:name="Grid Table 2 Accent 1" w:uiPriority="47"/>
-    <w:lsdException w:name="Grid Table 3 Accent 1" w:uiPriority="48"/>
-    <w:lsdException w:name="Grid Table 4 Accent 1" w:uiPriority="49"/>
-    <w:lsdException w:name="Grid Table 5 Dark Accent 1" w:uiPriority="50"/>
-    <w:lsdException w:name="Grid Table 6 Colorful Accent 1" w:uiPriority="51"/>
-    <w:lsdException w:name="Grid Table 7 Colorful Accent 1" w:uiPriority="52"/>
-    <w:lsdException w:name="Grid Table 1 Light Accent 2" w:uiPriority="46"/>
-    <w:lsdException w:name="Grid Table 2 Accent 2" w:uiPriority="47"/>
-    <w:lsdException w:name="Grid Table 3 Accent 2" w:uiPriority="48"/>
-    <w:lsdException w:name="Grid Table 4 Accent 2" w:uiPriority="49"/>
-    <w:lsdException w:name="Grid Table 5 Dark Accent 2" w:uiPriority="50"/>
-    <w:lsdException w:name="Grid Table 6 Colorful Accent 2" w:uiPriority="51"/>
-    <w:lsdException w:name="Grid Table 7 Colorful Accent 2" w:uiPriority="52"/>
-    <w:lsdException w:name="Grid Table 1 Light Accent 3" w:uiPriority="46"/>
-    <w:lsdException w:name="Grid Table 2 Accent 3" w:uiPriority="47"/>
-    <w:lsdException w:name="Grid Table 3 Accent 3" w:uiPriority="48"/>
-    <w:lsdException w:name="Grid Table 4 Accent 3" w:uiPriority="49"/>
-    <w:lsdException w:name="Grid Table 5 Dark Accent 3" w:uiPriority="50"/>
-    <w:lsdException w:name="Grid Table 6 Colorful Accent 3" w:uiPriority="51"/>
-    <w:lsdException w:name="Grid Table 7 Colorful Accent 3" w:uiPriority="52"/>
-    <w:lsdException w:name="Grid Table 1 Light Accent 4" w:uiPriority="46"/>
-    <w:lsdException w:name="Grid Table 2 Accent 4" w:uiPriority="47"/>
-    <w:lsdException w:name="Grid Table 3 Accent 4" w:uiPriority="48"/>
-    <w:lsdException w:name="Grid Table 4 Accent 4" w:uiPriority="49"/>
-    <w:lsdException w:name="Grid Table 5 Dark Accent 4" w:uiPriority="50"/>
-    <w:lsdException w:name="Grid Table 6 Colorful Accent 4" w:uiPriority="51"/>
-    <w:lsdException w:name="Grid Table 7 Colorful Accent 4" w:uiPriority="52"/>
-    <w:lsdException w:name="Grid Table 1 Light Accent 5" w:uiPriority="46"/>
-    <w:lsdException w:name="Grid Table 2 Accent 5" w:uiPriority="47"/>
-    <w:lsdException w:name="Grid Table 3 Accent 5" w:uiPriority="48"/>
-    <w:lsdException w:name="Grid Table 4 Accent 5" w:uiPriority="49"/>
-    <w:lsdException w:name="Grid Table 5 Dark Accent 5" w:uiPriority="50"/>
-    <w:lsdException w:name="Grid Table 6 Colorful Accent 5" w:uiPriority="51"/>
-    <w:lsdException w:name="Grid Table 7 Colorful Accent 5" w:uiPriority="52"/>
-    <w:lsdException w:name="Grid Table 1 Light Accent 6" w:uiPriority="46"/>
-    <w:lsdException w:name="Grid Table 2 Accent 6" w:uiPriority="47"/>
-    <w:lsdException w:name="Grid Table 3 Accent 6" w:uiPriority="48"/>
-    <w:lsdException w:name="Grid Table 4 Accent 6" w:uiPriority="49"/>
-    <w:lsdException w:name="Grid Table 5 Dark Accent 6" w:uiPriority="50"/>
-    <w:lsdException w:name="Grid Table 6 Colorful Accent 6" w:uiPriority="51"/>
-    <w:lsdException w:name="Grid Table 7 Colorful Accent 6" w:uiPriority="52"/>
-    <w:lsdException w:name="List Table 1 Light" w:uiPriority="46"/>
-    <w:lsdException w:name="List Table 2" w:uiPriority="47"/>
-    <w:lsdException w:name="List Table 3" w:uiPriority="48"/>
-    <w:lsdException w:name="List Table 4" w:uiPriority="49"/>
-    <w:lsdException w:name="List Table 5 Dark" w:uiPriority="50"/>
-    <w:lsdException w:name="List Table 6 Colorful" w:uiPriority="51"/>
-    <w:lsdException w:name="List Table 7 Colorful" w:uiPriority="52"/>
-    <w:lsdException w:name="List Table 1 Light Accent 1" w:uiPriority="46"/>
-    <w:lsdException w:name="List Table 2 Accent 1" w:uiPriority="47"/>
-    <w:lsdException w:name="List Table 3 Accent 1" w:uiPriority="48"/>
-    <w:lsdException w:name="List Table 4 Accent 1" w:uiPriority="49"/>
-    <w:lsdException w:name="List Table 5 Dark Accent 1" w:uiPriority="50"/>
-    <w:lsdException w:name="List Table 6 Colorful Accent 1" w:uiPriority="51"/>
-    <w:lsdException w:name="List Table 7 Colorful Accent 1" w:uiPriority="52"/>
-    <w:lsdException w:name="List Table 1 Light Accent 2" w:uiPriority="46"/>
-    <w:lsdException w:name="List Table 2 Accent 2" w:uiPriority="47"/>
-    <w:lsdException w:name="List Table 3 Accent 2" w:uiPriority="48"/>
-    <w:lsdException w:name="List Table 4 Accent 2" w:uiPriority="49"/>
-    <w:lsdException w:name="List Table 5 Dark Accent 2" w:uiPriority="50"/>
-    <w:lsdException w:name="List Table 6 Colorful Accent 2" w:uiPriority="51"/>
-    <w:lsdException w:name="List Table 7 Colorful Accent 2" w:uiPriority="52"/>
-    <w:lsdException w:name="List Table 1 Light Accent 3" w:uiPriority="46"/>
-    <w:lsdException w:name="List Table 2 Accent 3" w:uiPriority="47"/>
-    <w:lsdException w:name="List Table 3 Accent 3" w:uiPriority="48"/>
-    <w:lsdException w:name="List Table 4 Accent 3" w:uiPriority="49"/>
-    <w:lsdException w:name="List Table 5 Dark Accent 3" w:uiPriority="50"/>
-    <w:lsdException w:name="List Table 6 Colorful Accent 3" w:uiPriority="51"/>
-    <w:lsdException w:name="List Table 7 Colorful Accent 3" w:uiPriority="52"/>
-    <w:lsdException w:name="List Table 1 Light Accent 4" w:uiPriority="46"/>
-    <w:lsdException w:name="List Table 2 Accent 4" w:uiPriority="47"/>
-    <w:lsdException w:name="List Table 3 Accent 4" w:uiPriority="48"/>
-    <w:lsdException w:name="List Table 4 Accent 4" w:uiPriority="49"/>
-    <w:lsdException w:name="List Table 5 Dark Accent 4" w:uiPriority="50"/>
-    <w:lsdException w:name="List Table 6 Colorful Accent 4" w:uiPriority="51"/>
-    <w:lsdException w:name="List Table 7 Colorful Accent 4" w:uiPriority="52"/>
-    <w:lsdException w:name="List Table 1 Light Accent 5" w:uiPriority="46"/>
-    <w:lsdException w:name="List Table 2 Accent 5" w:uiPriority="47"/>
-    <w:lsdException w:name="List Table 3 Accent 5" w:uiPriority="48"/>
-    <w:lsdException w:name="List Table 4 Accent 5" w:uiPriority="49"/>
-    <w:lsdException w:name="List Table 5 Dark Accent 5" w:uiPriority="50"/>
-    <w:lsdException w:name="List Table 6 Colorful Accent 5" w:uiPriority="51"/>
-    <w:lsdException w:name="List Table 7 Colorful Accent 5" w:uiPriority="52"/>
-    <w:lsdException w:name="List Table 1 Light Accent 6" w:uiPriority="46"/>
-    <w:lsdException w:name="List Table 2 Accent 6" w:uiPriority="47"/>
-    <w:lsdException w:name="List Table 3 Accent 6" w:uiPriority="48"/>
-    <w:lsdException w:name="List Table 4 Accent 6" w:uiPriority="49"/>
-    <w:lsdException w:name="List Table 5 Dark Accent 6" w:uiPriority="50"/>
-    <w:lsdException w:name="List Table 6 Colorful Accent 6" w:uiPriority="51"/>
-    <w:lsdException w:name="List Table 7 Colorful Accent 6" w:uiPriority="52"/>
-    <w:lsdException w:name="Mention" w:semiHidden="1" w:unhideWhenUsed="1"/>
-    <w:lsdException w:name="Smart Hyperlink" w:semiHidden="1" w:unhideWhenUsed="1"/>
-    <w:lsdException w:name="Hashtag" w:semiHidden="1" w:unhideWhenUsed="1"/>
-    <w:lsdException w:name="Unresolved Mention" w:semiHidden="1" w:unhideWhenUsed="1"/>
-    <w:lsdException w:name="Smart Link" w:semiHidden="1" w:unhideWhenUsed="1"/>
+  <w:latentStyles w:defLockedState="0" w:defUIPriority="99" w:defSemiHidden="1" w:defUnhideWhenUsed="1" w:defQFormat="0" w:count="267">
+    <w:lsdException w:name="Normal" w:semiHidden="0" w:uiPriority="0" w:unhideWhenUsed="0" w:qFormat="1"/>
+    <w:lsdException w:name="heading 1" w:semiHidden="0" w:uiPriority="9" w:unhideWhenUsed="0" w:qFormat="1"/>
+    <w:lsdException w:name="heading 2" w:uiPriority="9" w:qFormat="1"/>
+    <w:lsdException w:name="heading 3" w:uiPriority="9" w:qFormat="1"/>
+    <w:lsdException w:name="heading 4" w:uiPriority="9" w:qFormat="1"/>
+    <w:lsdException w:name="heading 5" w:uiPriority="9" w:qFormat="1"/>
+    <w:lsdException w:name="heading 6" w:uiPriority="9" w:qFormat="1"/>
+    <w:lsdException w:name="heading 7" w:uiPriority="9" w:qFormat="1"/>
+    <w:lsdException w:name="heading 8" w:uiPriority="9" w:qFormat="1"/>
+    <w:lsdException w:name="heading 9" w:uiPriority="9" w:qFormat="1"/>
+    <w:lsdException w:name="toc 1" w:uiPriority="39"/>
+    <w:lsdException w:name="toc 2" w:uiPriority="39"/>
+    <w:lsdException w:name="toc 3" w:uiPriority="39"/>
+    <w:lsdException w:name="toc 4" w:uiPriority="39"/>
+    <w:lsdException w:name="toc 5" w:uiPriority="39"/>
+    <w:lsdException w:name="toc 6" w:uiPriority="39"/>
+    <w:lsdException w:name="toc 7" w:uiPriority="39"/>
+    <w:lsdException w:name="toc 8" w:uiPriority="39"/>
+    <w:lsdException w:name="toc 9" w:uiPriority="39"/>
+    <w:lsdException w:name="caption" w:uiPriority="35" w:qFormat="1"/>
+    <w:lsdException w:name="Title" w:semiHidden="0" w:uiPriority="10" w:unhideWhenUsed="0" w:qFormat="1"/>
+    <w:lsdException w:name="Default Paragraph Font" w:uiPriority="1"/>
+    <w:lsdException w:name="Body Text" w:uiPriority="1" w:qFormat="1"/>
+    <w:lsdException w:name="Subtitle" w:semiHidden="0" w:uiPriority="11" w:unhideWhenUsed="0" w:qFormat="1"/>
+    <w:lsdException w:name="Strong" w:semiHidden="0" w:uiPriority="22" w:unhideWhenUsed="0" w:qFormat="1"/>
+    <w:lsdException w:name="Emphasis" w:semiHidden="0" w:uiPriority="20" w:unhideWhenUsed="0" w:qFormat="1"/>
+    <w:lsdException w:name="Table Grid" w:semiHidden="0" w:uiPriority="59" w:unhideWhenUsed="0"/>
+    <w:lsdException w:name="Placeholder Text" w:unhideWhenUsed="0"/>
+    <w:lsdException w:name="No Spacing" w:semiHidden="0" w:uiPriority="1" w:unhideWhenUsed="0" w:qFormat="1"/>
+    <w:lsdException w:name="Light Shading" w:semiHidden="0" w:uiPriority="60" w:unhideWhenUsed="0"/>
+    <w:lsdException w:name="Light List" w:semiHidden="0" w:uiPriority="61" w:unhideWhenUsed="0"/>
+    <w:lsdException w:name="Light Grid" w:semiHidden="0" w:uiPriority="62" w:unhideWhenUsed="0"/>
+    <w:lsdException w:name="Medium Shading 1" w:semiHidden="0" w:uiPriority="63" w:unhideWhenUsed="0"/>
+    <w:lsdException w:name="Medium Shading 2" w:semiHidden="0" w:uiPriority="64" w:unhideWhenUsed="0"/>
+    <w:lsdException w:name="Medium List 1" w:semiHidden="0" w:uiPriority="65" w:unhideWhenUsed="0"/>
+    <w:lsdException w:name="Medium List 2" w:semiHidden="0" w:uiPriority="66" w:unhideWhenUsed="0"/>
+    <w:lsdException w:name="Medium Grid 1" w:semiHidden="0" w:uiPriority="67" w:unhideWhenUsed="0"/>
+    <w:lsdException w:name="Medium Grid 2" w:semiHidden="0" w:uiPriority="68" w:unhideWhenUsed="0"/>
+    <w:lsdException w:name="Medium Grid 3" w:semiHidden="0" w:uiPriority="69" w:unhideWhenUsed="0"/>
+    <w:lsdException w:name="Dark List" w:semiHidden="0" w:uiPriority="70" w:unhideWhenUsed="0"/>
+    <w:lsdException w:name="Colorful Shading" w:semiHidden="0" w:uiPriority="71" w:unhideWhenUsed="0"/>
+    <w:lsdException w:name="Colorful List" w:semiHidden="0" w:uiPriority="72" w:unhideWhenUsed="0"/>
+    <w:lsdException w:name="Colorful Grid" w:semiHidden="0" w:uiPriority="73" w:unhideWhenUsed="0"/>
+    <w:lsdException w:name="Light Shading Accent 1" w:semiHidden="0" w:uiPriority="60" w:unhideWhenUsed="0"/>
+    <w:lsdException w:name="Light List Accent 1" w:semiHidden="0" w:uiPriority="61" w:unhideWhenUsed="0"/>
+    <w:lsdException w:name="Light Grid Accent 1" w:semiHidden="0" w:uiPriority="62" w:unhideWhenUsed="0"/>
+    <w:lsdException w:name="Medium Shading 1 Accent 1" w:semiHidden="0" w:uiPriority="63" w:unhideWhenUsed="0"/>
+    <w:lsdException w:name="Medium Shading 2 Accent 1" w:semiHidden="0" w:uiPriority="64" w:unhideWhenUsed="0"/>
+    <w:lsdException w:name="Medium List 1 Accent 1" w:semiHidden="0" w:uiPriority="65" w:unhideWhenUsed="0"/>
+    <w:lsdException w:name="Revision" w:unhideWhenUsed="0"/>
+    <w:lsdException w:name="List Paragraph" w:semiHidden="0" w:uiPriority="34" w:unhideWhenUsed="0" w:qFormat="1"/>
+    <w:lsdException w:name="Quote" w:semiHidden="0" w:uiPriority="29" w:unhideWhenUsed="0" w:qFormat="1"/>
+    <w:lsdException w:name="Intense Quote" w:semiHidden="0" w:uiPriority="30" w:unhideWhenUsed="0" w:qFormat="1"/>
+    <w:lsdException w:name="Medium List 2 Accent 1" w:semiHidden="0" w:uiPriority="66" w:unhideWhenUsed="0"/>
+    <w:lsdException w:name="Medium Grid 1 Accent 1" w:semiHidden="0" w:uiPriority="67" w:unhideWhenUsed="0"/>
+    <w:lsdException w:name="Medium Grid 2 Accent 1" w:semiHidden="0" w:uiPriority="68" w:unhideWhenUsed="0"/>
+    <w:lsdException w:name="Medium Grid 3 Accent 1" w:semiHidden="0" w:uiPriority="69" w:unhideWhenUsed="0"/>
+    <w:lsdException w:name="Dark List Accent 1" w:semiHidden="0" w:uiPriority="70" w:unhideWhenUsed="0"/>
+    <w:lsdException w:name="Colorful Shading Accent 1" w:semiHidden="0" w:uiPriority="71" w:unhideWhenUsed="0"/>
+    <w:lsdException w:name="Colorful List Accent 1" w:semiHidden="0" w:uiPriority="72" w:unhideWhenUsed="0"/>
+    <w:lsdException w:name="Colorful Grid Accent 1" w:semiHidden="0" w:uiPriority="73" w:unhideWhenUsed="0"/>
+    <w:lsdException w:name="Light Shading Accent 2" w:semiHidden="0" w:uiPriority="60" w:unhideWhenUsed="0"/>
+    <w:lsdException w:name="Light List Accent 2" w:semiHidden="0" w:uiPriority="61" w:unhideWhenUsed="0"/>
+    <w:lsdException w:name="Light Grid Accent 2" w:semiHidden="0" w:uiPriority="62" w:unhideWhenUsed="0"/>
+    <w:lsdException w:name="Medium Shading 1 Accent 2" w:semiHidden="0" w:uiPriority="63" w:unhideWhenUsed="0"/>
+    <w:lsdException w:name="Medium Shading 2 Accent 2" w:semiHidden="0" w:uiPriority="64" w:unhideWhenUsed="0"/>
+    <w:lsdException w:name="Medium List 1 Accent 2" w:semiHidden="0" w:uiPriority="65" w:unhideWhenUsed="0"/>
+    <w:lsdException w:name="Medium List 2 Accent 2" w:semiHidden="0" w:uiPriority="66" w:unhideWhenUsed="0"/>
+    <w:lsdException w:name="Medium Grid 1 Accent 2" w:semiHidden="0" w:uiPriority="67" w:unhideWhenUsed="0"/>
+    <w:lsdException w:name="Medium Grid 2 Accent 2" w:semiHidden="0" w:uiPriority="68" w:unhideWhenUsed="0"/>
+    <w:lsdException w:name="Medium Grid 3 Accent 2" w:semiHidden="0" w:uiPriority="69" w:unhideWhenUsed="0"/>
+    <w:lsdException w:name="Dark List Accent 2" w:semiHidden="0" w:uiPriority="70" w:unhideWhenUsed="0"/>
+    <w:lsdException w:name="Colorful Shading Accent 2" w:semiHidden="0" w:uiPriority="71" w:unhideWhenUsed="0"/>
+    <w:lsdException w:name="Colorful List Accent 2" w:semiHidden="0" w:uiPriority="72" w:unhideWhenUsed="0"/>
+    <w:lsdException w:name="Colorful Grid Accent 2" w:semiHidden="0" w:uiPriority="73" w:unhideWhenUsed="0"/>
+    <w:lsdException w:name="Light Shading Accent 3" w:semiHidden="0" w:uiPriority="60" w:unhideWhenUsed="0"/>
+    <w:lsdException w:name="Light List Accent 3" w:semiHidden="0" w:uiPriority="61" w:unhideWhenUsed="0"/>
+    <w:lsdException w:name="Light Grid Accent 3" w:semiHidden="0" w:uiPriority="62" w:unhideWhenUsed="0"/>
+    <w:lsdException w:name="Medium Shading 1 Accent 3" w:semiHidden="0" w:uiPriority="63" w:unhideWhenUsed="0"/>
+    <w:lsdException w:name="Medium Shading 2 Accent 3" w:semiHidden="0" w:uiPriority="64" w:unhideWhenUsed="0"/>
+    <w:lsdException w:name="Medium List 1 Accent 3" w:semiHidden="0" w:uiPriority="65" w:unhideWhenUsed="0"/>
+    <w:lsdException w:name="Medium List 2 Accent 3" w:semiHidden="0" w:uiPriority="66" w:unhideWhenUsed="0"/>
+    <w:lsdException w:name="Medium Grid 1 Accent 3" w:semiHidden="0" w:uiPriority="67" w:unhideWhenUsed="0"/>
+    <w:lsdException w:name="Medium Grid 2 Accent 3" w:semiHidden="0" w:uiPriority="68" w:unhideWhenUsed="0"/>
+    <w:lsdException w:name="Medium Grid 3 Accent 3" w:semiHidden="0" w:uiPriority="69" w:unhideWhenUsed="0"/>
+    <w:lsdException w:name="Dark List Accent 3" w:semiHidden="0" w:uiPriority="70" w:unhideWhenUsed="0"/>
+    <w:lsdException w:name="Colorful Shading Accent 3" w:semiHidden="0" w:uiPriority="71" w:unhideWhenUsed="0"/>
+    <w:lsdException w:name="Colorful List Accent 3" w:semiHidden="0" w:uiPriority="72" w:unhideWhenUsed="0"/>
+    <w:lsdException w:name="Colorful Grid Accent 3" w:semiHidden="0" w:uiPriority="73" w:unhideWhenUsed="0"/>
+    <w:lsdException w:name="Light Shading Accent 4" w:semiHidden="0" w:uiPriority="60" w:unhideWhenUsed="0"/>
+    <w:lsdException w:name="Light List Accent 4" w:semiHidden="0" w:uiPriority="61" w:unhideWhenUsed="0"/>
+    <w:lsdException w:name="Light Grid Accent 4" w:semiHidden="0" w:uiPriority="62" w:unhideWhenUsed="0"/>
+    <w:lsdException w:name="Medium Shading 1 Accent 4" w:semiHidden="0" w:uiPriority="63" w:unhideWhenUsed="0"/>
+    <w:lsdException w:name="Medium Shading 2 Accent 4" w:semiHidden="0" w:uiPriority="64" w:unhideWhenUsed="0"/>
+    <w:lsdException w:name="Medium List 1 Accent 4" w:semiHidden="0" w:uiPriority="65" w:unhideWhenUsed="0"/>
+    <w:lsdException w:name="Medium List 2 Accent 4" w:semiHidden="0" w:uiPriority="66" w:unhideWhenUsed="0"/>
+    <w:lsdException w:name="Medium Grid 1 Accent 4" w:semiHidden="0" w:uiPriority="67" w:unhideWhenUsed="0"/>
+    <w:lsdException w:name="Medium Grid 2 Accent 4" w:semiHidden="0" w:uiPriority="68" w:unhideWhenUsed="0"/>
+    <w:lsdException w:name="Medium Grid 3 Accent 4" w:semiHidden="0" w:uiPriority="69" w:unhideWhenUsed="0"/>
+    <w:lsdException w:name="Dark List Accent 4" w:semiHidden="0" w:uiPriority="70" w:unhideWhenUsed="0"/>
+    <w:lsdException w:name="Colorful Shading Accent 4" w:semiHidden="0" w:uiPriority="71" w:unhideWhenUsed="0"/>
+    <w:lsdException w:name="Colorful List Accent 4" w:semiHidden="0" w:uiPriority="72" w:unhideWhenUsed="0"/>
+    <w:lsdException w:name="Colorful Grid Accent 4" w:semiHidden="0" w:uiPriority="73" w:unhideWhenUsed="0"/>
+    <w:lsdException w:name="Light Shading Accent 5" w:semiHidden="0" w:uiPriority="60" w:unhideWhenUsed="0"/>
+    <w:lsdException w:name="Light List Accent 5" w:semiHidden="0" w:uiPriority="61" w:unhideWhenUsed="0"/>
+    <w:lsdException w:name="Light Grid Accent 5" w:semiHidden="0" w:uiPriority="62" w:unhideWhenUsed="0"/>
+    <w:lsdException w:name="Medium Shading 1 Accent 5" w:semiHidden="0" w:uiPriority="63" w:unhideWhenUsed="0"/>
+    <w:lsdException w:name="Medium Shading 2 Accent 5" w:semiHidden="0" w:uiPriority="64" w:unhideWhenUsed="0"/>
+    <w:lsdException w:name="Medium List 1 Accent 5" w:semiHidden="0" w:uiPriority="65" w:unhideWhenUsed="0"/>
+    <w:lsdException w:name="Medium List 2 Accent 5" w:semiHidden="0" w:uiPriority="66" w:unhideWhenUsed="0"/>
+    <w:lsdException w:name="Medium Grid 1 Accent 5" w:semiHidden="0" w:uiPriority="67" w:unhideWhenUsed="0"/>
+    <w:lsdException w:name="Medium Grid 2 Accent 5" w:semiHidden="0" w:uiPriority="68" w:unhideWhenUsed="0"/>
+    <w:lsdException w:name="Medium Grid 3 Accent 5" w:semiHidden="0" w:uiPriority="69" w:unhideWhenUsed="0"/>
+    <w:lsdException w:name="Dark List Accent 5" w:semiHidden="0" w:uiPriority="70" w:unhideWhenUsed="0"/>
+    <w:lsdException w:name="Colorful Shading Accent 5" w:semiHidden="0" w:uiPriority="71" w:unhideWhenUsed="0"/>
+    <w:lsdException w:name="Colorful List Accent 5" w:semiHidden="0" w:uiPriority="72" w:unhideWhenUsed="0"/>
+    <w:lsdException w:name="Colorful Grid Accent 5" w:semiHidden="0" w:uiPriority="73" w:unhideWhenUsed="0"/>
+    <w:lsdException w:name="Light Shading Accent 6" w:semiHidden="0" w:uiPriority="60" w:unhideWhenUsed="0"/>
+    <w:lsdException w:name="Light List Accent 6" w:semiHidden="0" w:uiPriority="61" w:unhideWhenUsed="0"/>
+    <w:lsdException w:name="Light Grid Accent 6" w:semiHidden="0" w:uiPriority="62" w:unhideWhenUsed="0"/>
+    <w:lsdException w:name="Medium Shading 1 Accent 6" w:semiHidden="0" w:uiPriority="63" w:unhideWhenUsed="0"/>
+    <w:lsdException w:name="Medium Shading 2 Accent 6" w:semiHidden="0" w:uiPriority="64" w:unhideWhenUsed="0"/>
+    <w:lsdException w:name="Medium List 1 Accent 6" w:semiHidden="0" w:uiPriority="65" w:unhideWhenUsed="0"/>
+    <w:lsdException w:name="Medium List 2 Accent 6" w:semiHidden="0" w:uiPriority="66" w:unhideWhenUsed="0"/>
+    <w:lsdException w:name="Medium Grid 1 Accent 6" w:semiHidden="0" w:uiPriority="67" w:unhideWhenUsed="0"/>
+    <w:lsdException w:name="Medium Grid 2 Accent 6" w:semiHidden="0" w:uiPriority="68" w:unhideWhenUsed="0"/>
+    <w:lsdException w:name="Medium Grid 3 Accent 6" w:semiHidden="0" w:uiPriority="69" w:unhideWhenUsed="0"/>
+    <w:lsdException w:name="Dark List Accent 6" w:semiHidden="0" w:uiPriority="70" w:unhideWhenUsed="0"/>
+    <w:lsdException w:name="Colorful Shading Accent 6" w:semiHidden="0" w:uiPriority="71" w:unhideWhenUsed="0"/>
+    <w:lsdException w:name="Colorful List Accent 6" w:semiHidden="0" w:uiPriority="72" w:unhideWhenUsed="0"/>
+    <w:lsdException w:name="Colorful Grid Accent 6" w:semiHidden="0" w:uiPriority="73" w:unhideWhenUsed="0"/>
+    <w:lsdException w:name="Subtle Emphasis" w:semiHidden="0" w:uiPriority="19" w:unhideWhenUsed="0" w:qFormat="1"/>
+    <w:lsdException w:name="Intense Emphasis" w:semiHidden="0" w:uiPriority="21" w:unhideWhenUsed="0" w:qFormat="1"/>
+    <w:lsdException w:name="Subtle Reference" w:semiHidden="0" w:uiPriority="31" w:unhideWhenUsed="0" w:qFormat="1"/>
+    <w:lsdException w:name="Intense Reference" w:semiHidden="0" w:uiPriority="32" w:unhideWhenUsed="0" w:qFormat="1"/>
+    <w:lsdException w:name="Book Title" w:semiHidden="0" w:uiPriority="33" w:unhideWhenUsed="0" w:qFormat="1"/>
+    <w:lsdException w:name="Bibliography" w:uiPriority="37"/>
+    <w:lsdException w:name="TOC Heading" w:uiPriority="39" w:qFormat="1"/>
+  </w:latentStyles>
+  <w:style w:type="paragraph" w:default="1" w:styleId="Normal">
+    <w:name w:val="Normal"/>
+    <w:qFormat/>
+    <w:rsid w:val="00124279"/>
+  </w:style>
+  <w:style w:type="paragraph" w:styleId="Heading3">
+    <w:name w:val="heading 3"/>
+    <w:basedOn w:val="Normal"/>
+    <w:next w:val="Normal"/>
+    <w:link w:val="Heading3Char"/>
+    <w:uiPriority w:val="9"/>
+    <w:semiHidden/>
+    <w:unhideWhenUsed/>
+    <w:qFormat/>
+    <w:rsid w:val="001D691F"/>
+    <w:pPr>
+      <w:keepNext/>
+      <w:keepLines/>
+      <w:spacing w:before="200" w:after="0"/>
+      <w:outlineLvl w:val="2"/>
+    </w:pPr>
+    <w:rPr>
+      <w:rFonts w:asciiTheme="majorHAnsi" w:eastAsiaTheme="majorEastAsia" w:hAnsiTheme="majorHAnsi" w:cstheme="majorBidi"/>
+      <w:b/>
+      <w:bCs/>
+      <w:color w:val="4F81BD" w:themeColor="accent1"/>
+    </w:rPr>
+  </w:style>
+  <w:style w:type="paragraph" w:styleId="Heading4">
+    <w:name w:val="heading 4"/>
+    <w:basedOn w:val="Normal"/>
+    <w:link w:val="Heading4Char"/>
+    <w:uiPriority w:val="9"/>
+    <w:qFormat/>
+    <w:rsid w:val="00FA180C"/>
+    <w:pPr>
+      <w:widowControl w:val="0"/>
+      <w:autoSpaceDE w:val="0"/>
+      <w:autoSpaceDN w:val="0"/>
+      <w:spacing w:after="0" w:line="240" w:lineRule="auto"/>
+      <w:ind w:left="1346"/>
+      <w:outlineLvl w:val="3"/>
+    </w:pPr>
+    <w:rPr>
+      <w:rFonts w:ascii="Verdana" w:eastAsia="Times New Roman" w:hAnsi="Verdana" w:cs="Verdana"/>
+      <w:b/>
+      <w:bCs/>
+      <w:sz w:val="18"/>
+      <w:szCs w:val="18"/>
+      <w:lang w:val="en-US"/>
+    </w:rPr>
+  </w:style>
+  <w:style w:type="character" w:default="1" w:styleId="DefaultParagraphFont">
+    <w:name w:val="Default Paragraph Font"/>
+    <w:uiPriority w:val="1"/>
+    <w:semiHidden/>
+    <w:unhideWhenUsed/>
+  </w:style>
+  <w:style w:type="table" w:default="1" w:styleId="TableNormal">
+    <w:name w:val="Normal Table"/>
+    <w:uiPriority w:val="99"/>
+    <w:semiHidden/>
+    <w:unhideWhenUsed/>
+    <w:tblPr>
+      <w:tblInd w:w="0" w:type="dxa"/>
+      <w:tblCellMar>
+        <w:top w:w="0" w:type="dxa"/>
+        <w:left w:w="108" w:type="dxa"/>
+        <w:bottom w:w="0" w:type="dxa"/>
+        <w:right w:w="108" w:type="dxa"/>
+      </w:tblCellMar>
+    </w:tblPr>
+  </w:style>
+  <w:style w:type="numbering" w:default="1" w:styleId="NoList">
+    <w:name w:val="No List"/>
+    <w:uiPriority w:val="99"/>
+    <w:semiHidden/>
+    <w:unhideWhenUsed/>
+  </w:style>
+  <w:style w:type="table" w:styleId="TableGrid">
+    <w:name w:val="Table Grid"/>
+    <w:aliases w:val="unBiet tin gi chua,vao day coi di   http://www.freewebtown.com/gaigoisaigon/"/>
+    <w:basedOn w:val="TableNormal"/>
+    <w:uiPriority w:val="59"/>
+    <w:rsid w:val="008F678E"/>
+    <w:pPr>
+      <w:spacing w:after="0" w:line="240" w:lineRule="auto"/>
+    </w:pPr>
+    <w:tblPr>
+      <w:tblBorders>
+        <w:top w:val="single" w:sz="4" w:space="0" w:color="auto"/>
+        <w:left w:val="single" w:sz="4" w:space="0" w:color="auto"/>
+        <w:bottom w:val="single" w:sz="4" w:space="0" w:color="auto"/>
+        <w:right w:val="single" w:sz="4" w:space="0" w:color="auto"/>
+        <w:insideH w:val="single" w:sz="4" w:space="0" w:color="auto"/>
+        <w:insideV w:val="single" w:sz="4" w:space="0" w:color="auto"/>
+      </w:tblBorders>
+    </w:tblPr>
+  </w:style>
+  <w:style w:type="paragraph" w:styleId="ListParagraph">
+    <w:name w:val="List Paragraph"/>
+    <w:basedOn w:val="Normal"/>
+    <w:link w:val="ListParagraphChar"/>
+    <w:uiPriority w:val="34"/>
+    <w:qFormat/>
+    <w:rsid w:val="00FA180C"/>
+    <w:pPr>
+      <w:widowControl w:val="0"/>
+      <w:autoSpaceDE w:val="0"/>
+      <w:autoSpaceDN w:val="0"/>
+      <w:spacing w:after="0" w:line="240" w:lineRule="auto"/>
+      <w:ind w:left="1764"/>
+    </w:pPr>
+    <w:rPr>
+      <w:rFonts w:ascii="Verdana" w:eastAsia="Times New Roman" w:hAnsi="Verdana" w:cs="Verdana"/>
+      <w:lang w:val="en-US"/>
+    </w:rPr>
+  </w:style>
+  <w:style w:type="character" w:customStyle="1" w:styleId="ListParagraphChar">
+    <w:name w:val="List Paragraph Char"/>
+    <w:link w:val="ListParagraph"/>
+    <w:uiPriority w:val="34"/>
+    <w:locked/>
+    <w:rsid w:val="00FA180C"/>
+    <w:rPr>
+      <w:rFonts w:ascii="Verdana" w:eastAsia="Times New Roman" w:hAnsi="Verdana" w:cs="Verdana"/>
+      <w:lang w:val="en-US"/>
+    </w:rPr>
+  </w:style>
+  <w:style w:type="character" w:customStyle="1" w:styleId="Heading4Char">
+    <w:name w:val="Heading 4 Char"/>
+    <w:basedOn w:val="DefaultParagraphFont"/>
+    <w:link w:val="Heading4"/>
+    <w:uiPriority w:val="9"/>
+    <w:rsid w:val="00FA180C"/>
+    <w:rPr>
+      <w:rFonts w:ascii="Verdana" w:eastAsia="Times New Roman" w:hAnsi="Verdana" w:cs="Verdana"/>
+      <w:b/>
+      <w:bCs/>
+      <w:sz w:val="18"/>
+      <w:szCs w:val="18"/>
+      <w:lang w:val="en-US"/>
+    </w:rPr>
+  </w:style>
+  <w:style w:type="paragraph" w:styleId="NormalWeb">
+    <w:name w:val="Normal (Web)"/>
+    <w:basedOn w:val="Normal"/>
+    <w:uiPriority w:val="99"/>
+    <w:semiHidden/>
+    <w:unhideWhenUsed/>
+    <w:rsid w:val="00CB56E0"/>
+    <w:pPr>
+      <w:spacing w:before="100" w:beforeAutospacing="1" w:after="100" w:afterAutospacing="1" w:line="240" w:lineRule="auto"/>
+    </w:pPr>
+    <w:rPr>
+      <w:rFonts w:ascii="Times New Roman" w:eastAsia="Times New Roman" w:hAnsi="Times New Roman" w:cs="Times New Roman"/>
+      <w:sz w:val="24"/>
+      <w:szCs w:val="24"/>
+      <w:lang w:eastAsia="en-IN" w:bidi="mr-IN"/>
+    </w:rPr>
+  </w:style>
+  <w:style w:type="paragraph" w:styleId="BodyText">
+    <w:name w:val="Body Text"/>
+    <w:basedOn w:val="Normal"/>
+    <w:link w:val="BodyTextChar"/>
+    <w:uiPriority w:val="1"/>
+    <w:qFormat/>
+    <w:rsid w:val="001A3FA0"/>
+    <w:pPr>
+      <w:widowControl w:val="0"/>
+      <w:autoSpaceDE w:val="0"/>
+      <w:autoSpaceDN w:val="0"/>
+      <w:spacing w:after="0" w:line="240" w:lineRule="auto"/>
+    </w:pPr>
+    <w:rPr>
+      <w:rFonts w:ascii="Verdana" w:eastAsia="Verdana" w:hAnsi="Verdana" w:cs="Verdana"/>
+      <w:sz w:val="18"/>
+      <w:szCs w:val="18"/>
+      <w:lang w:val="en-US"/>
+    </w:rPr>
+  </w:style>
+  <w:style w:type="character" w:customStyle="1" w:styleId="BodyTextChar">
+    <w:name w:val="Body Text Char"/>
+    <w:basedOn w:val="DefaultParagraphFont"/>
+    <w:link w:val="BodyText"/>
+    <w:uiPriority w:val="1"/>
+    <w:rsid w:val="001A3FA0"/>
+    <w:rPr>
+      <w:rFonts w:ascii="Verdana" w:eastAsia="Verdana" w:hAnsi="Verdana" w:cs="Verdana"/>
+      <w:sz w:val="18"/>
+      <w:szCs w:val="18"/>
+      <w:lang w:val="en-US"/>
+    </w:rPr>
+  </w:style>
+  <w:style w:type="paragraph" w:styleId="Header">
+    <w:name w:val="header"/>
+    <w:basedOn w:val="Normal"/>
+    <w:link w:val="HeaderChar"/>
+    <w:uiPriority w:val="99"/>
+    <w:unhideWhenUsed/>
+    <w:rsid w:val="007A645E"/>
+    <w:pPr>
+      <w:tabs>
+        <w:tab w:val="center" w:pos="4513"/>
+        <w:tab w:val="right" w:pos="9026"/>
+      </w:tabs>
+      <w:spacing w:after="0" w:line="240" w:lineRule="auto"/>
+    </w:pPr>
+  </w:style>
+  <w:style w:type="character" w:customStyle="1" w:styleId="HeaderChar">
+    <w:name w:val="Header Char"/>
+    <w:basedOn w:val="DefaultParagraphFont"/>
+    <w:link w:val="Header"/>
+    <w:uiPriority w:val="99"/>
+    <w:rsid w:val="007A645E"/>
+  </w:style>
+  <w:style w:type="paragraph" w:styleId="Footer">
+    <w:name w:val="footer"/>
+    <w:basedOn w:val="Normal"/>
+    <w:link w:val="FooterChar"/>
+    <w:uiPriority w:val="99"/>
+    <w:unhideWhenUsed/>
+    <w:rsid w:val="007A645E"/>
+    <w:pPr>
+      <w:tabs>
+        <w:tab w:val="center" w:pos="4513"/>
+        <w:tab w:val="right" w:pos="9026"/>
+      </w:tabs>
+      <w:spacing w:after="0" w:line="240" w:lineRule="auto"/>
+    </w:pPr>
+  </w:style>
+  <w:style w:type="character" w:customStyle="1" w:styleId="FooterChar">
+    <w:name w:val="Footer Char"/>
+    <w:basedOn w:val="DefaultParagraphFont"/>
+    <w:link w:val="Footer"/>
+    <w:uiPriority w:val="99"/>
+    <w:rsid w:val="007A645E"/>
+  </w:style>
+  <w:style w:type="paragraph" w:styleId="BalloonText">
+    <w:name w:val="Balloon Text"/>
+    <w:basedOn w:val="Normal"/>
+    <w:link w:val="BalloonTextChar"/>
+    <w:uiPriority w:val="99"/>
+    <w:semiHidden/>
+    <w:unhideWhenUsed/>
+    <w:rsid w:val="00570A52"/>
+    <w:pPr>
+      <w:spacing w:after="0" w:line="240" w:lineRule="auto"/>
+    </w:pPr>
+    <w:rPr>
+      <w:rFonts w:ascii="Tahoma" w:hAnsi="Tahoma" w:cs="Tahoma"/>
+      <w:sz w:val="16"/>
+      <w:szCs w:val="16"/>
+    </w:rPr>
+  </w:style>
+  <w:style w:type="character" w:customStyle="1" w:styleId="BalloonTextChar">
+    <w:name w:val="Balloon Text Char"/>
+    <w:basedOn w:val="DefaultParagraphFont"/>
+    <w:link w:val="BalloonText"/>
+    <w:uiPriority w:val="99"/>
+    <w:semiHidden/>
+    <w:rsid w:val="00570A52"/>
+    <w:rPr>
+      <w:rFonts w:ascii="Tahoma" w:hAnsi="Tahoma" w:cs="Tahoma"/>
+      <w:sz w:val="16"/>
+      <w:szCs w:val="16"/>
+    </w:rPr>
+  </w:style>
+  <w:style w:type="character" w:customStyle="1" w:styleId="Heading3Char">
+    <w:name w:val="Heading 3 Char"/>
+    <w:basedOn w:val="DefaultParagraphFont"/>
+    <w:link w:val="Heading3"/>
+    <w:uiPriority w:val="9"/>
+    <w:semiHidden/>
+    <w:rsid w:val="001D691F"/>
+    <w:rPr>
+      <w:rFonts w:asciiTheme="majorHAnsi" w:eastAsiaTheme="majorEastAsia" w:hAnsiTheme="majorHAnsi" w:cstheme="majorBidi"/>
+      <w:b/>
+      <w:bCs/>
+      <w:color w:val="4F81BD" w:themeColor="accent1"/>
+    </w:rPr>
+  </w:style>
+</w:styles>
+</file>
+
+<file path=word/stylesWithEffects.xml><?xml version="1.0" encoding="utf-8"?>
+<w:styles xmlns:wpc="http://schemas.microsoft.com/office/word/2010/wordprocessingCanvas" xmlns:mc="http://schemas.openxmlformats.org/markup-compatibility/2006" xmlns:o="urn:schemas-microsoft-com:office:office" xmlns:r="http://schemas.openxmlformats.org/officeDocument/2006/relationships" xmlns:m="http://schemas.openxmlformats.org/officeDocument/2006/math" xmlns:v="urn:schemas-microsoft-com:vml" xmlns:wp14="http://schemas.microsoft.com/office/word/2010/wordprocessingDrawing" xmlns:wp="http://schemas.openxmlformats.org/drawingml/2006/wordprocessingDrawing" xmlns:w10="urn:schemas-microsoft-com:office:word" xmlns:w="http://schemas.openxmlformats.org/wordprocessingml/2006/main" xmlns:w14="http://schemas.microsoft.com/office/word/2010/wordml" xmlns:wpg="http://schemas.microsoft.com/office/word/2010/wordprocessingGroup" xmlns:wpi="http://schemas.microsoft.com/office/word/2010/wordprocessingInk" xmlns:wne="http://schemas.microsoft.com/office/word/2006/wordml" xmlns:wps="http://schemas.microsoft.com/office/word/2010/wordprocessingShape" mc:Ignorable="w14 wp14">
+  <w:docDefaults>
+    <w:rPrDefault>
+      <w:rPr>
+        <w:rFonts w:asciiTheme="minorHAnsi" w:eastAsiaTheme="minorHAnsi" w:hAnsiTheme="minorHAnsi" w:cstheme="minorBidi"/>
+        <w:sz w:val="22"/>
+        <w:szCs w:val="22"/>
+        <w:lang w:val="en-IN" w:eastAsia="en-US" w:bidi="ar-SA"/>
+      </w:rPr>
+    </w:rPrDefault>
+    <w:pPrDefault>
+      <w:pPr>
+        <w:spacing w:after="200" w:line="276" w:lineRule="auto"/>
+      </w:pPr>
+    </w:pPrDefault>
+  </w:docDefaults>
+  <w:latentStyles w:defLockedState="0" w:defUIPriority="99" w:defSemiHidden="1" w:defUnhideWhenUsed="1" w:defQFormat="0" w:count="267">
+    <w:lsdException w:name="Normal" w:semiHidden="0" w:uiPriority="0" w:unhideWhenUsed="0" w:qFormat="1"/>
+    <w:lsdException w:name="heading 1" w:semiHidden="0" w:uiPriority="9" w:unhideWhenUsed="0" w:qFormat="1"/>
+    <w:lsdException w:name="heading 2" w:uiPriority="9" w:qFormat="1"/>
+    <w:lsdException w:name="heading 3" w:uiPriority="9" w:qFormat="1"/>
+    <w:lsdException w:name="heading 4" w:uiPriority="9" w:qFormat="1"/>
+    <w:lsdException w:name="heading 5" w:uiPriority="9" w:qFormat="1"/>
+    <w:lsdException w:name="heading 6" w:uiPriority="9" w:qFormat="1"/>
+    <w:lsdException w:name="heading 7" w:uiPriority="9" w:qFormat="1"/>
+    <w:lsdException w:name="heading 8" w:uiPriority="9" w:qFormat="1"/>
+    <w:lsdException w:name="heading 9" w:uiPriority="9" w:qFormat="1"/>
+    <w:lsdException w:name="toc 1" w:uiPriority="39"/>
+    <w:lsdException w:name="toc 2" w:uiPriority="39"/>
+    <w:lsdException w:name="toc 3" w:uiPriority="39"/>
+    <w:lsdException w:name="toc 4" w:uiPriority="39"/>
+    <w:lsdException w:name="toc 5" w:uiPriority="39"/>
+    <w:lsdException w:name="toc 6" w:uiPriority="39"/>
+    <w:lsdException w:name="toc 7" w:uiPriority="39"/>
+    <w:lsdException w:name="toc 8" w:uiPriority="39"/>
+    <w:lsdException w:name="toc 9" w:uiPriority="39"/>
+    <w:lsdException w:name="caption" w:uiPriority="35" w:qFormat="1"/>
+    <w:lsdException w:name="Title" w:semiHidden="0" w:uiPriority="10" w:unhideWhenUsed="0" w:qFormat="1"/>
+    <w:lsdException w:name="Default Paragraph Font" w:uiPriority="1"/>
+    <w:lsdException w:name="Body Text" w:uiPriority="1" w:qFormat="1"/>
+    <w:lsdException w:name="Subtitle" w:semiHidden="0" w:uiPriority="11" w:unhideWhenUsed="0" w:qFormat="1"/>
+    <w:lsdException w:name="Strong" w:semiHidden="0" w:uiPriority="22" w:unhideWhenUsed="0" w:qFormat="1"/>
+    <w:lsdException w:name="Emphasis" w:semiHidden="0" w:uiPriority="20" w:unhideWhenUsed="0" w:qFormat="1"/>
+    <w:lsdException w:name="Table Grid" w:semiHidden="0" w:uiPriority="59" w:unhideWhenUsed="0"/>
+    <w:lsdException w:name="Placeholder Text" w:unhideWhenUsed="0"/>
+    <w:lsdException w:name="No Spacing" w:semiHidden="0" w:uiPriority="1" w:unhideWhenUsed="0" w:qFormat="1"/>
+    <w:lsdException w:name="Light Shading" w:semiHidden="0" w:uiPriority="60" w:unhideWhenUsed="0"/>
+    <w:lsdException w:name="Light List" w:semiHidden="0" w:uiPriority="61" w:unhideWhenUsed="0"/>
+    <w:lsdException w:name="Light Grid" w:semiHidden="0" w:uiPriority="62" w:unhideWhenUsed="0"/>
+    <w:lsdException w:name="Medium Shading 1" w:semiHidden="0" w:uiPriority="63" w:unhideWhenUsed="0"/>
+    <w:lsdException w:name="Medium Shading 2" w:semiHidden="0" w:uiPriority="64" w:unhideWhenUsed="0"/>
+    <w:lsdException w:name="Medium List 1" w:semiHidden="0" w:uiPriority="65" w:unhideWhenUsed="0"/>
+    <w:lsdException w:name="Medium List 2" w:semiHidden="0" w:uiPriority="66" w:unhideWhenUsed="0"/>
+    <w:lsdException w:name="Medium Grid 1" w:semiHidden="0" w:uiPriority="67" w:unhideWhenUsed="0"/>
+    <w:lsdException w:name="Medium Grid 2" w:semiHidden="0" w:uiPriority="68" w:unhideWhenUsed="0"/>
+    <w:lsdException w:name="Medium Grid 3" w:semiHidden="0" w:uiPriority="69" w:unhideWhenUsed="0"/>
+    <w:lsdException w:name="Dark List" w:semiHidden="0" w:uiPriority="70" w:unhideWhenUsed="0"/>
+    <w:lsdException w:name="Colorful Shading" w:semiHidden="0" w:uiPriority="71" w:unhideWhenUsed="0"/>
+    <w:lsdException w:name="Colorful List" w:semiHidden="0" w:uiPriority="72" w:unhideWhenUsed="0"/>
+    <w:lsdException w:name="Colorful Grid" w:semiHidden="0" w:uiPriority="73" w:unhideWhenUsed="0"/>
+    <w:lsdException w:name="Light Shading Accent 1" w:semiHidden="0" w:uiPriority="60" w:unhideWhenUsed="0"/>
+    <w:lsdException w:name="Light List Accent 1" w:semiHidden="0" w:uiPriority="61" w:unhideWhenUsed="0"/>
+    <w:lsdException w:name="Light Grid Accent 1" w:semiHidden="0" w:uiPriority="62" w:unhideWhenUsed="0"/>
+    <w:lsdException w:name="Medium Shading 1 Accent 1" w:semiHidden="0" w:uiPriority="63" w:unhideWhenUsed="0"/>
+    <w:lsdException w:name="Medium Shading 2 Accent 1" w:semiHidden="0" w:uiPriority="64" w:unhideWhenUsed="0"/>
+    <w:lsdException w:name="Medium List 1 Accent 1" w:semiHidden="0" w:uiPriority="65" w:unhideWhenUsed="0"/>
+    <w:lsdException w:name="Revision" w:unhideWhenUsed="0"/>
+    <w:lsdException w:name="List Paragraph" w:semiHidden="0" w:uiPriority="34" w:unhideWhenUsed="0" w:qFormat="1"/>
+    <w:lsdException w:name="Quote" w:semiHidden="0" w:uiPriority="29" w:unhideWhenUsed="0" w:qFormat="1"/>
+    <w:lsdException w:name="Intense Quote" w:semiHidden="0" w:uiPriority="30" w:unhideWhenUsed="0" w:qFormat="1"/>
+    <w:lsdException w:name="Medium List 2 Accent 1" w:semiHidden="0" w:uiPriority="66" w:unhideWhenUsed="0"/>
+    <w:lsdException w:name="Medium Grid 1 Accent 1" w:semiHidden="0" w:uiPriority="67" w:unhideWhenUsed="0"/>
+    <w:lsdException w:name="Medium Grid 2 Accent 1" w:semiHidden="0" w:uiPriority="68" w:unhideWhenUsed="0"/>
+    <w:lsdException w:name="Medium Grid 3 Accent 1" w:semiHidden="0" w:uiPriority="69" w:unhideWhenUsed="0"/>
+    <w:lsdException w:name="Dark List Accent 1" w:semiHidden="0" w:uiPriority="70" w:unhideWhenUsed="0"/>
+    <w:lsdException w:name="Colorful Shading Accent 1" w:semiHidden="0" w:uiPriority="71" w:unhideWhenUsed="0"/>
+    <w:lsdException w:name="Colorful List Accent 1" w:semiHidden="0" w:uiPriority="72" w:unhideWhenUsed="0"/>
+    <w:lsdException w:name="Colorful Grid Accent 1" w:semiHidden="0" w:uiPriority="73" w:unhideWhenUsed="0"/>
+    <w:lsdException w:name="Light Shading Accent 2" w:semiHidden="0" w:uiPriority="60" w:unhideWhenUsed="0"/>
+    <w:lsdException w:name="Light List Accent 2" w:semiHidden="0" w:uiPriority="61" w:unhideWhenUsed="0"/>
+    <w:lsdException w:name="Light Grid Accent 2" w:semiHidden="0" w:uiPriority="62" w:unhideWhenUsed="0"/>
+    <w:lsdException w:name="Medium Shading 1 Accent 2" w:semiHidden="0" w:uiPriority="63" w:unhideWhenUsed="0"/>
+    <w:lsdException w:name="Medium Shading 2 Accent 2" w:semiHidden="0" w:uiPriority="64" w:unhideWhenUsed="0"/>
+    <w:lsdException w:name="Medium List 1 Accent 2" w:semiHidden="0" w:uiPriority="65" w:unhideWhenUsed="0"/>
+    <w:lsdException w:name="Medium List 2 Accent 2" w:semiHidden="0" w:uiPriority="66" w:unhideWhenUsed="0"/>
+    <w:lsdException w:name="Medium Grid 1 Accent 2" w:semiHidden="0" w:uiPriority="67" w:unhideWhenUsed="0"/>
+    <w:lsdException w:name="Medium Grid 2 Accent 2" w:semiHidden="0" w:uiPriority="68" w:unhideWhenUsed="0"/>
+    <w:lsdException w:name="Medium Grid 3 Accent 2" w:semiHidden="0" w:uiPriority="69" w:unhideWhenUsed="0"/>
+    <w:lsdException w:name="Dark List Accent 2" w:semiHidden="0" w:uiPriority="70" w:unhideWhenUsed="0"/>
+    <w:lsdException w:name="Colorful Shading Accent 2" w:semiHidden="0" w:uiPriority="71" w:unhideWhenUsed="0"/>
+    <w:lsdException w:name="Colorful List Accent 2" w:semiHidden="0" w:uiPriority="72" w:unhideWhenUsed="0"/>
+    <w:lsdException w:name="Colorful Grid Accent 2" w:semiHidden="0" w:uiPriority="73" w:unhideWhenUsed="0"/>
+    <w:lsdException w:name="Light Shading Accent 3" w:semiHidden="0" w:uiPriority="60" w:unhideWhenUsed="0"/>
+    <w:lsdException w:name="Light List Accent 3" w:semiHidden="0" w:uiPriority="61" w:unhideWhenUsed="0"/>
+    <w:lsdException w:name="Light Grid Accent 3" w:semiHidden="0" w:uiPriority="62" w:unhideWhenUsed="0"/>
+    <w:lsdException w:name="Medium Shading 1 Accent 3" w:semiHidden="0" w:uiPriority="63" w:unhideWhenUsed="0"/>
+    <w:lsdException w:name="Medium Shading 2 Accent 3" w:semiHidden="0" w:uiPriority="64" w:unhideWhenUsed="0"/>
+    <w:lsdException w:name="Medium List 1 Accent 3" w:semiHidden="0" w:uiPriority="65" w:unhideWhenUsed="0"/>
+    <w:lsdException w:name="Medium List 2 Accent 3" w:semiHidden="0" w:uiPriority="66" w:unhideWhenUsed="0"/>
+    <w:lsdException w:name="Medium Grid 1 Accent 3" w:semiHidden="0" w:uiPriority="67" w:unhideWhenUsed="0"/>
+    <w:lsdException w:name="Medium Grid 2 Accent 3" w:semiHidden="0" w:uiPriority="68" w:unhideWhenUsed="0"/>
+    <w:lsdException w:name="Medium Grid 3 Accent 3" w:semiHidden="0" w:uiPriority="69" w:unhideWhenUsed="0"/>
+    <w:lsdException w:name="Dark List Accent 3" w:semiHidden="0" w:uiPriority="70" w:unhideWhenUsed="0"/>
+    <w:lsdException w:name="Colorful Shading Accent 3" w:semiHidden="0" w:uiPriority="71" w:unhideWhenUsed="0"/>
+    <w:lsdException w:name="Colorful List Accent 3" w:semiHidden="0" w:uiPriority="72" w:unhideWhenUsed="0"/>
+    <w:lsdException w:name="Colorful Grid Accent 3" w:semiHidden="0" w:uiPriority="73" w:unhideWhenUsed="0"/>
+    <w:lsdException w:name="Light Shading Accent 4" w:semiHidden="0" w:uiPriority="60" w:unhideWhenUsed="0"/>
+    <w:lsdException w:name="Light List Accent 4" w:semiHidden="0" w:uiPriority="61" w:unhideWhenUsed="0"/>
+    <w:lsdException w:name="Light Grid Accent 4" w:semiHidden="0" w:uiPriority="62" w:unhideWhenUsed="0"/>
+    <w:lsdException w:name="Medium Shading 1 Accent 4" w:semiHidden="0" w:uiPriority="63" w:unhideWhenUsed="0"/>
+    <w:lsdException w:name="Medium Shading 2 Accent 4" w:semiHidden="0" w:uiPriority="64" w:unhideWhenUsed="0"/>
+    <w:lsdException w:name="Medium List 1 Accent 4" w:semiHidden="0" w:uiPriority="65" w:unhideWhenUsed="0"/>
+    <w:lsdException w:name="Medium List 2 Accent 4" w:semiHidden="0" w:uiPriority="66" w:unhideWhenUsed="0"/>
+    <w:lsdException w:name="Medium Grid 1 Accent 4" w:semiHidden="0" w:uiPriority="67" w:unhideWhenUsed="0"/>
+    <w:lsdException w:name="Medium Grid 2 Accent 4" w:semiHidden="0" w:uiPriority="68" w:unhideWhenUsed="0"/>
+    <w:lsdException w:name="Medium Grid 3 Accent 4" w:semiHidden="0" w:uiPriority="69" w:unhideWhenUsed="0"/>
+    <w:lsdException w:name="Dark List Accent 4" w:semiHidden="0" w:uiPriority="70" w:unhideWhenUsed="0"/>
+    <w:lsdException w:name="Colorful Shading Accent 4" w:semiHidden="0" w:uiPriority="71" w:unhideWhenUsed="0"/>
+    <w:lsdException w:name="Colorful List Accent 4" w:semiHidden="0" w:uiPriority="72" w:unhideWhenUsed="0"/>
+    <w:lsdException w:name="Colorful Grid Accent 4" w:semiHidden="0" w:uiPriority="73" w:unhideWhenUsed="0"/>
+    <w:lsdException w:name="Light Shading Accent 5" w:semiHidden="0" w:uiPriority="60" w:unhideWhenUsed="0"/>
+    <w:lsdException w:name="Light List Accent 5" w:semiHidden="0" w:uiPriority="61" w:unhideWhenUsed="0"/>
+    <w:lsdException w:name="Light Grid Accent 5" w:semiHidden="0" w:uiPriority="62" w:unhideWhenUsed="0"/>
+    <w:lsdException w:name="Medium Shading 1 Accent 5" w:semiHidden="0" w:uiPriority="63" w:unhideWhenUsed="0"/>
+    <w:lsdException w:name="Medium Shading 2 Accent 5" w:semiHidden="0" w:uiPriority="64" w:unhideWhenUsed="0"/>
+    <w:lsdException w:name="Medium List 1 Accent 5" w:semiHidden="0" w:uiPriority="65" w:unhideWhenUsed="0"/>
+    <w:lsdException w:name="Medium List 2 Accent 5" w:semiHidden="0" w:uiPriority="66" w:unhideWhenUsed="0"/>
+    <w:lsdException w:name="Medium Grid 1 Accent 5" w:semiHidden="0" w:uiPriority="67" w:unhideWhenUsed="0"/>
+    <w:lsdException w:name="Medium Grid 2 Accent 5" w:semiHidden="0" w:uiPriority="68" w:unhideWhenUsed="0"/>
+    <w:lsdException w:name="Medium Grid 3 Accent 5" w:semiHidden="0" w:uiPriority="69" w:unhideWhenUsed="0"/>
+    <w:lsdException w:name="Dark List Accent 5" w:semiHidden="0" w:uiPriority="70" w:unhideWhenUsed="0"/>
+    <w:lsdException w:name="Colorful Shading Accent 5" w:semiHidden="0" w:uiPriority="71" w:unhideWhenUsed="0"/>
+    <w:lsdException w:name="Colorful List Accent 5" w:semiHidden="0" w:uiPriority="72" w:unhideWhenUsed="0"/>
+    <w:lsdException w:name="Colorful Grid Accent 5" w:semiHidden="0" w:uiPriority="73" w:unhideWhenUsed="0"/>
+    <w:lsdException w:name="Light Shading Accent 6" w:semiHidden="0" w:uiPriority="60" w:unhideWhenUsed="0"/>
+    <w:lsdException w:name="Light List Accent 6" w:semiHidden="0" w:uiPriority="61" w:unhideWhenUsed="0"/>
+    <w:lsdException w:name="Light Grid Accent 6" w:semiHidden="0" w:uiPriority="62" w:unhideWhenUsed="0"/>
+    <w:lsdException w:name="Medium Shading 1 Accent 6" w:semiHidden="0" w:uiPriority="63" w:unhideWhenUsed="0"/>
+    <w:lsdException w:name="Medium Shading 2 Accent 6" w:semiHidden="0" w:uiPriority="64" w:unhideWhenUsed="0"/>
+    <w:lsdException w:name="Medium List 1 Accent 6" w:semiHidden="0" w:uiPriority="65" w:unhideWhenUsed="0"/>
+    <w:lsdException w:name="Medium List 2 Accent 6" w:semiHidden="0" w:uiPriority="66" w:unhideWhenUsed="0"/>
+    <w:lsdException w:name="Medium Grid 1 Accent 6" w:semiHidden="0" w:uiPriority="67" w:unhideWhenUsed="0"/>
+    <w:lsdException w:name="Medium Grid 2 Accent 6" w:semiHidden="0" w:uiPriority="68" w:unhideWhenUsed="0"/>
+    <w:lsdException w:name="Medium Grid 3 Accent 6" w:semiHidden="0" w:uiPriority="69" w:unhideWhenUsed="0"/>
+    <w:lsdException w:name="Dark List Accent 6" w:semiHidden="0" w:uiPriority="70" w:unhideWhenUsed="0"/>
+    <w:lsdException w:name="Colorful Shading Accent 6" w:semiHidden="0" w:uiPriority="71" w:unhideWhenUsed="0"/>
+    <w:lsdException w:name="Colorful List Accent 6" w:semiHidden="0" w:uiPriority="72" w:unhideWhenUsed="0"/>
+    <w:lsdException w:name="Colorful Grid Accent 6" w:semiHidden="0" w:uiPriority="73" w:unhideWhenUsed="0"/>
+    <w:lsdException w:name="Subtle Emphasis" w:semiHidden="0" w:uiPriority="19" w:unhideWhenUsed="0" w:qFormat="1"/>
+    <w:lsdException w:name="Intense Emphasis" w:semiHidden="0" w:uiPriority="21" w:unhideWhenUsed="0" w:qFormat="1"/>
+    <w:lsdException w:name="Subtle Reference" w:semiHidden="0" w:uiPriority="31" w:unhideWhenUsed="0" w:qFormat="1"/>
+    <w:lsdException w:name="Intense Reference" w:semiHidden="0" w:uiPriority="32" w:unhideWhenUsed="0" w:qFormat="1"/>
+    <w:lsdException w:name="Book Title" w:semiHidden="0" w:uiPriority="33" w:unhideWhenUsed="0" w:qFormat="1"/>
+    <w:lsdException w:name="Bibliography" w:uiPriority="37"/>
+    <w:lsdException w:name="TOC Heading" w:uiPriority="39" w:qFormat="1"/>
   </w:latentStyles>
   <w:style w:type="paragraph" w:default="1" w:styleId="Normal">
     <w:name w:val="Normal"/>
@@ -22984,7 +23595,7 @@
 </file>
 
 <file path=customXml/itemProps1.xml><?xml version="1.0" encoding="utf-8"?>
-<ds:datastoreItem xmlns:ds="http://schemas.openxmlformats.org/officeDocument/2006/customXml" ds:itemID="{42441823-46A6-4210-80BA-FBF98900F414}">
+<ds:datastoreItem xmlns:ds="http://schemas.openxmlformats.org/officeDocument/2006/customXml" ds:itemID="{C9462895-BB59-4F80-93DB-815898BD1056}">
   <ds:schemaRefs>
     <ds:schemaRef ds:uri="http://schemas.openxmlformats.org/officeDocument/2006/bibliography"/>
   </ds:schemaRefs>

</xml_diff>